<commit_message>
Towards reconciling Gilmore 1923 and McIntosh 2005
</commit_message>
<xml_diff>
--- a/TaylorEtAl-mounted-barosaurus.docx
+++ b/TaylorEtAl-mounted-barosaurus.docx
@@ -1705,7 +1705,7 @@
       </w:pPr>
       <w:r>
         <w:rPr/>
-        <w:t xml:space="preserve">Earl Douglass had first discovered dinosaur fossils at Dinosaur National Monument in 1909 (Gilmore 1932:2), and so had been working the area for a full decade by 1919, when the expedition sponsor Andrew Carnegie died at the age of 83. It was apparent that work at the quarry would soon end without his funding, and Douglass joined the staff of the University of Utah. Beginning in 1922, two fine diplodocine skeletons were partially excavated from the easternmost part of the quarry (McIntosh 2005:42). One of these, designated #355 in the field, was a </w:t>
+        <w:t xml:space="preserve">Earl Douglass had first discovered dinosaur fossils at Dinosaur National Monument in 1909 (Gilmore 1932:2), and so had been working the area for a full decade by 1919, when the expedition sponsor Andrew Carnegie died at the age of 83. It was apparent that work at the quarry would soon end without his funding, and Douglass joined the staff of the University of Utah. Charles W. Gilmore arrived at the quarry on 14 May 1923 to work it for the USNM and was shown around by Douglass, who was about to leave for Colorado (Gilmore 1923). Gilmore inherited two partially uncovered skeletons, both thought to be </w:t>
       </w:r>
       <w:r>
         <w:rPr>
@@ -1716,7 +1716,37 @@
       </w:r>
       <w:r>
         <w:rPr/>
-        <w:t xml:space="preserve"> that was collected by Charles W. Gilmore for the National Museum of Natural History in Washington, D.C. (USNM 10865),. The other, designated #340 and thought at that time also to be </w:t>
+        <w:t>: #355 (the most complete) and #340.</w:t>
+      </w:r>
+    </w:p>
+    <w:p>
+      <w:pPr>
+        <w:pStyle w:val="BodyText"/>
+        <w:rPr/>
+      </w:pPr>
+      <w:r>
+        <w:rPr/>
+        <w:t>It was Gilmore’s intention to extract #355 for the USNM, then secure the parts of #340 necessary to complete the skeleton (Gilmore 1923). (#355 was subsequently accessioned as USNM 10865 and mounted in Washington D.C, where it remains in the public gallery to this day.). Douglass handed over to Gilmore four large blocks and several smaller ones containing much of the neck of #340.</w:t>
+      </w:r>
+    </w:p>
+    <w:p>
+      <w:pPr>
+        <w:pStyle w:val="BodyText"/>
+        <w:rPr/>
+      </w:pPr>
+      <w:r>
+        <w:rPr/>
+        <w:t>XXXXX segue into next bit</w:t>
+      </w:r>
+    </w:p>
+    <w:p>
+      <w:pPr>
+        <w:pStyle w:val="BodyText"/>
+        <w:rPr/>
+      </w:pPr>
+      <w:r>
+        <w:rPr/>
+        <w:t xml:space="preserve">The other, designated #340 and thought at that time also to be </w:t>
       </w:r>
       <w:r>
         <w:rPr>
@@ -2249,7 +2279,7 @@
     </w:p>
     <w:p>
       <w:pPr>
-        <w:pStyle w:val="BlockQuotation"/>
+        <w:pStyle w:val="BlockQuotationuser"/>
         <w:rPr/>
       </w:pPr>
       <w:r>
@@ -2807,12 +2837,12 @@
       </w:r>
       <w:r>
         <w:rPr/>
-        <w:t xml:space="preserve"> (Lindsay 1992) in their Dinosaur Spotter’s Guides series, as part of a broader contract to photograph dinosaurs at the AMNH and the Smithsonian. Gardiner recalls (pers. comm. 2022):</w:t>
-      </w:r>
-    </w:p>
-    <w:p>
-      <w:pPr>
-        <w:pStyle w:val="BlockQuotation"/>
+        <w:t xml:space="preserve"> (Lindsay 1992) in their Dinosaur Spotter’s Guides series, as part of a broader contract to photograph dinosaurs at the AMNH and the USNM. Gardiner recalls (pers. comm. 2022):</w:t>
+      </w:r>
+    </w:p>
+    <w:p>
+      <w:pPr>
+        <w:pStyle w:val="BlockQuotationuser"/>
         <w:rPr/>
       </w:pPr>
       <w:r>
@@ -2878,15 +2908,7 @@
       </w:r>
       <w:r>
         <w:rPr/>
-        <w:t xml:space="preserve">.” However, this account did not specify which elements were included in that missing fifth,  and it has not been possible to recover this information from the McIntosh archives. Norell el al. (1991) also seems to be in error regarding numerous elements being modeled from scratch. A certain amount of detective work is therefore required. To summarise: a complete list of the elements of AMNH 6341 itself can be assembled from the published works and notes of McIntosh; Peter May recalls that with some exceptions discussed below, the missing bones were filled in with casts taken from </w:t>
-      </w:r>
-      <w:r>
-        <w:rPr/>
-        <w:t xml:space="preserve">molds made from </w:t>
-      </w:r>
-      <w:r>
-        <w:rPr/>
-        <w:t xml:space="preserve">the Utah Field House’s copy of the Carnegie </w:t>
+        <w:t xml:space="preserve">.” However, this account did not specify which elements were included in that missing fifth,  and it has not been possible to recover this information from the McIntosh archives. Norell el al. (1991) also seems to be in error regarding numerous elements being modeled from scratch. A certain amount of detective work is therefore required. To summarise: a complete list of the elements of AMNH 6341 itself can be assembled from the published works and notes of McIntosh; Peter May recalls that with some exceptions discussed below, the missing bones were filled in with casts taken from molds made from the Utah Field House’s copy of the Carnegie </w:t>
       </w:r>
       <w:r>
         <w:rPr>
@@ -2897,15 +2919,7 @@
       </w:r>
       <w:r>
         <w:rPr/>
-        <w:t xml:space="preserve">; that copy was made from the original Carnegie molds (Taylor et al. 2023), and the composition of the elements from which those molds were taken is well understood (Taylor et al. </w:t>
-      </w:r>
-      <w:r>
-        <w:rPr/>
-        <w:t>2025</w:t>
-      </w:r>
-      <w:r>
-        <w:rPr/>
-        <w:t xml:space="preserve">), so it is possible to determine the sources of most of the bones in the </w:t>
+        <w:t xml:space="preserve">; that copy was made from the original Carnegie molds (Taylor et al. 2023), and the composition of the elements from which those molds were taken is well understood (Taylor et al. 2025), so it is possible to determine the sources of most of the bones in the </w:t>
       </w:r>
       <w:r>
         <w:rPr>
@@ -3269,11 +3283,7 @@
       </w:r>
       <w:r>
         <w:rPr/>
-        <w:t xml:space="preserve"> casts. </w:t>
-      </w:r>
-      <w:r>
-        <w:rPr/>
-        <w:t xml:space="preserve">Jack McIntosh inventoried the AMNH 6341 </w:t>
+        <w:t xml:space="preserve"> casts. Jack McIntosh inventoried the AMNH 6341 </w:t>
       </w:r>
       <w:r>
         <w:rPr>
@@ -3360,23 +3370,7 @@
       </w:r>
       <w:r>
         <w:rPr/>
-        <w:t>. However, CM 84, the specimen from which the Carnegie mount is mostly assembled, does not itself include a skull. As documented in Taylor et al. (</w:t>
-      </w:r>
-      <w:r>
-        <w:rPr/>
-        <w:t>2025:69</w:t>
-      </w:r>
-      <w:r>
-        <w:rPr/>
-        <w:t>), Holland (1906:227) explain</w:t>
-      </w:r>
-      <w:r>
-        <w:rPr/>
-        <w:t>ed</w:t>
-      </w:r>
-      <w:r>
-        <w:rPr/>
-        <w:t xml:space="preserve"> that the skull supplied to British Museum (now the Natural History Museum) as part of the </w:t>
+        <w:t xml:space="preserve">. However, CM 84, the specimen from which the Carnegie mount is mostly assembled, does not itself include a skull. As documented in Taylor et al. (2025:69), Holland (1906:227) explained that the skull supplied to British Museum (now the Natural History Museum) as part of the </w:t>
       </w:r>
       <w:r>
         <w:rPr>
@@ -3555,15 +3549,7 @@
       </w:pPr>
       <w:r>
         <w:rPr/>
-        <w:t>CM 84, the specimen that forms most of the Carnegie mount, includes C2–7, but not the atlas (C1). As discussed by Taylor et al. (</w:t>
-      </w:r>
-      <w:r>
-        <w:rPr/>
-        <w:t>2025:71–72</w:t>
-      </w:r>
-      <w:r>
-        <w:rPr/>
-        <w:t>), it is not clear which specimen supplied the atlas in the Carnegie mount, and it seems most likely that this element was a sculpture not based on any specific fossil specimen.</w:t>
+        <w:t>CM 84, the specimen that forms most of the Carnegie mount, includes C2–7, but not the atlas (C1). As discussed by Taylor et al. (2025:71–72), it is not clear which specimen supplied the atlas in the Carnegie mount, and it seems most likely that this element was a sculpture not based on any specific fossil specimen.</w:t>
       </w:r>
     </w:p>
     <w:p>
@@ -3659,35 +3645,7 @@
       </w:pPr>
       <w:r>
         <w:rPr/>
-        <w:t>The bones of the forelimb are not only absent from CM 84 (as noted by Hatcher 1901:45) but were completely unknown in the Carnegie collection at the time the mount was constructed. Holland (1906) made no comment on how the forelimbs were obtained for the skeletal mount sent to England. As detailed by Taylor et al. (</w:t>
-      </w:r>
-      <w:r>
-        <w:rPr/>
-        <w:t>2025:84</w:t>
-      </w:r>
-      <w:r>
-        <w:rPr/>
-        <w:t xml:space="preserve">), both humeri, radii and ulnae of the casts produced by the Carnegie Museum were sculpted based on the slightly smaller diplodocine individual CM 662 (now HMNS 175), which also provided the rear part of the skull (see above). The forefeet however were sculpted from those of AMNH 965, now recognized as camarasaurid, and were given three manual unguals as well as too many phalanges. </w:t>
-      </w:r>
-      <w:r>
-        <w:rPr/>
-        <w:t>T</w:t>
-      </w:r>
-      <w:r>
-        <w:rPr/>
-        <w:t>hese error</w:t>
-      </w:r>
-      <w:r>
-        <w:rPr/>
-        <w:t xml:space="preserve">s </w:t>
-      </w:r>
-      <w:r>
-        <w:rPr/>
-        <w:t xml:space="preserve">were well understood by the 1990s: </w:t>
-      </w:r>
-      <w:r>
-        <w:rPr/>
-        <w:t xml:space="preserve">to address them in the </w:t>
+        <w:t xml:space="preserve">The bones of the forelimb are not only absent from CM 84 (as noted by Hatcher 1901:45) but were completely unknown in the Carnegie collection at the time the mount was constructed. Holland (1906) made no comment on how the forelimbs were obtained for the skeletal mount sent to England. As detailed by Taylor et al. (2025:84), both humeri, radii and ulnae of the casts produced by the Carnegie Museum were sculpted based on the slightly smaller diplodocine individual CM 662 (now HMNS 175), which also provided the rear part of the skull (see above). The forefeet however were sculpted from those of AMNH 965, now recognized as camarasaurid, and were given three manual unguals as well as too many phalanges. These errors were well understood by the 1990s: to address them in the </w:t>
       </w:r>
       <w:r>
         <w:rPr>
@@ -3698,35 +3656,7 @@
       </w:r>
       <w:r>
         <w:rPr/>
-        <w:t xml:space="preserve"> mount,</w:t>
-      </w:r>
-      <w:r>
-        <w:rPr/>
-        <w:t xml:space="preserve"> a set of metacarpals (DMN 2568) was loaned from Dinosaur National Monument, cast and returned. Corresponding sculptures were created for the metacarpals of the other manus </w:t>
-      </w:r>
-      <w:r>
-        <w:rPr/>
-        <w:t>(</w:t>
-      </w:r>
-      <w:r>
-        <w:rPr/>
-        <w:t xml:space="preserve">this predated the use of scanning and 3D printing, </w:t>
-      </w:r>
-      <w:r>
-        <w:rPr/>
-        <w:t>which would have allowed a perfect reflection)</w:t>
-      </w:r>
-      <w:r>
-        <w:rPr/>
-        <w:t xml:space="preserve">, and the </w:t>
-      </w:r>
-      <w:r>
-        <w:rPr/>
-        <w:t>cast and sculptures</w:t>
-      </w:r>
-      <w:r>
-        <w:rPr/>
-        <w:t xml:space="preserve"> were used in place of the camarasaurid metacarpals. Other elements of the forefeet were taken from the Carnegie </w:t>
+        <w:t xml:space="preserve"> mount, a set of metacarpals from a left manus assigned to </w:t>
       </w:r>
       <w:r>
         <w:rPr>
@@ -3737,11 +3667,18 @@
       </w:r>
       <w:r>
         <w:rPr/>
-        <w:t xml:space="preserve">, but the unguals were removed from digits II and III to correctly leave a single manual ungual. </w:t>
-      </w:r>
-      <w:r>
-        <w:rPr/>
-        <w:t xml:space="preserve">It follows that a small amount of camarasurid-derived material (the phalanges and surviving unguals) remains in the AMNH </w:t>
+        <w:t xml:space="preserve"> (DINO 2568) was loaned from Dinosaur National Monument, cast and returned. Corresponding sculptures were created for the metacarpals of the right manus (this predated the use of scanning and 3D printing, which would have allowed a perfect reflection), and the cast and sculptures were used in place of the camarasaurid metacarpals. Other elements of the forefeet were taken from the Carnegie </w:t>
+      </w:r>
+      <w:r>
+        <w:rPr>
+          <w:i/>
+          <w:iCs/>
+        </w:rPr>
+        <w:t>Diplodocus</w:t>
+      </w:r>
+      <w:r>
+        <w:rPr/>
+        <w:t xml:space="preserve">, but the unguals were removed from digits II and III to correctly leave a single manual ungual. It follows that a small amount of camarasurid-derived material (the phalanges and surviving unguals) remains in the AMNH </w:t>
       </w:r>
       <w:r>
         <w:rPr>
@@ -3772,15 +3709,7 @@
       </w:pPr>
       <w:r>
         <w:rPr/>
-        <w:t>As noted by Taylor et al. (</w:t>
-      </w:r>
-      <w:r>
-        <w:rPr/>
-        <w:t>2025:84–85</w:t>
-      </w:r>
-      <w:r>
-        <w:rPr/>
-        <w:t xml:space="preserve">), the Carnegie Museum’s own mounted </w:t>
+        <w:t xml:space="preserve">As noted by Taylor et al. (2025:84–85), the Carnegie Museum’s own mounted </w:t>
       </w:r>
       <w:r>
         <w:rPr>
@@ -4025,27 +3954,7 @@
       </w:r>
       <w:r>
         <w:rPr/>
-        <w:t xml:space="preserve"> heart to perfuse an erect neck would have meant that it beat very slowly. Check valves would therefore have been necessary in the neck arteries to prevent the column of blood from falling back to the heart during diastole. They suggested that these valves may have been active pumps — three pairs of “secondary hearts — though they admitted that in the absence of soft-tissue fossils this is pure conjecture. Millard et al. (1992) dismissed this proposal as unsupported by evidence, noted the absence of check valves in the neck of the giraffe, and argued that the multiple-heart scheme would probably create non-continuous blood flow at the brain. They considered amphibious habits a more likely adaptation for supporting the neck, despite the discrediting of that notion (e.g. Coombs 1975). </w:t>
-      </w:r>
-      <w:r>
-        <w:rPr/>
-        <w:t>In a letter published simultaneously, Rewell (1992) noted based on dissection that while there are no valves in the giraffe jugular vein, “</w:t>
-      </w:r>
-      <w:r>
-        <w:rPr/>
-        <w:t xml:space="preserve">specialised seried valves prevented reflux into tributaries running from below into large veins”, </w:t>
-      </w:r>
-      <w:r>
-        <w:rPr/>
-        <w:t xml:space="preserve">a system also </w:t>
-      </w:r>
-      <w:r>
-        <w:rPr/>
-        <w:t xml:space="preserve">seen in the Bactrian camel </w:t>
-      </w:r>
-      <w:r>
-        <w:rPr/>
-        <w:t>and by implication also possible in sauropods.</w:t>
+        <w:t xml:space="preserve"> heart to perfuse an erect neck would have meant that it beat very slowly. Check valves would therefore have been necessary in the neck arteries to prevent the column of blood from falling back to the heart during diastole. They suggested that these valves may have been active pumps — three pairs of “secondary hearts — though they admitted that in the absence of soft-tissue fossils this is pure conjecture. Millard et al. (1992) dismissed this proposal as unsupported by evidence, noted the absence of check valves in the neck of the giraffe, and argued that the multiple-heart scheme would probably create non-continuous blood flow at the brain. They considered amphibious habits a more likely adaptation for supporting the neck, despite the discrediting of that notion (e.g. Coombs 1975). In a letter published simultaneously, Rewell (1992) noted based on dissection that while there are no valves in the giraffe jugular vein, “specialised seried valves prevented reflux into tributaries running from below into large veins”, a system also seen in the Bactrian camel and by implication also possible in sauropods.</w:t>
       </w:r>
     </w:p>
     <w:p>
@@ -4118,15 +4027,7 @@
       </w:pPr>
       <w:r>
         <w:rPr/>
-        <w:t xml:space="preserve">All discussion </w:t>
-      </w:r>
-      <w:r>
-        <w:rPr/>
-        <w:t xml:space="preserve">of this nature </w:t>
-      </w:r>
-      <w:r>
-        <w:rPr/>
-        <w:t>was welcome to the AMNH team. As noted above, the most important purpose of the mount as originally conceived was not to argue in favour of rearing as a habitual behaviour, but to set out the issue of what we can and cannot know. Dingus (1996:28) noted that he actively welcomed the controversy — not only because all publicity is good publicity, but because the skeleton’s critics were encouraging the public to think about the controversy for themselves.</w:t>
+        <w:t>All discussion of this nature was welcome to the AMNH team. As noted above, the most important purpose of the mount as originally conceived was not to argue in favour of rearing as a habitual behaviour, but to set out the issue of what we can and cannot know. Dingus (1996:28) noted that he actively welcomed the controversy — not only because all publicity is good publicity, but because the skeleton’s critics were encouraging the public to think about the controversy for themselves.</w:t>
       </w:r>
     </w:p>
     <w:p>
@@ -4887,7 +4788,7 @@
       </w:pPr>
       <w:r>
         <w:rPr/>
-        <w:t xml:space="preserve">The Dinosaur World part in Plant City, Florida, contains a life-sized sculpture of a rearing </w:t>
+        <w:t xml:space="preserve">The Dinosaur World park in Plant City, Florida, contains a life-sized sculpture of a rearing </w:t>
       </w:r>
       <w:r>
         <w:rPr>
@@ -5915,6 +5816,16 @@
       </w:pPr>
       <w:r>
         <w:rPr/>
+        <w:t>Gilmore, Charles W. 1923. Letter to William de Chastignier Ravenel, “I herewith submit my report on the expedition to the Dinosaur National Monument”. 30 August 1923.</w:t>
+      </w:r>
+    </w:p>
+    <w:p>
+      <w:pPr>
+        <w:pStyle w:val="Reference"/>
+        <w:rPr/>
+      </w:pPr>
+      <w:r>
+        <w:rPr/>
         <w:t xml:space="preserve">Gilmore, Charles W. 1932. On a newly mounted skeleton of </w:t>
       </w:r>
       <w:r>
@@ -7084,7 +6995,7 @@
       </w:pPr>
       <w:r>
         <w:rPr/>
-        <w:t xml:space="preserve">XXX NOT YET CITED. Rewell, R. E. 1992. Cardiovascular system design and </w:t>
+        <w:t xml:space="preserve">Rewell, R. E. 1992. Cardiovascular system design and </w:t>
       </w:r>
       <w:r>
         <w:rPr>
@@ -7102,14 +7013,7 @@
           <w:i/>
           <w:iCs/>
         </w:rPr>
-        <w:t xml:space="preserve">The </w:t>
-      </w:r>
-      <w:r>
-        <w:rPr>
-          <w:i/>
-          <w:iCs/>
-        </w:rPr>
-        <w:t xml:space="preserve">Lancet </w:t>
+        <w:t xml:space="preserve">The Lancet </w:t>
       </w:r>
       <w:r>
         <w:rPr>
@@ -7316,15 +7220,7 @@
       </w:pPr>
       <w:r>
         <w:rPr/>
-        <w:t>Taylor, Michael P., Matthew C. Lamanna, Amy Henrici, Linsly Church and Ilja Nieuwland. 202</w:t>
-      </w:r>
-      <w:r>
-        <w:rPr/>
-        <w:t>5</w:t>
-      </w:r>
-      <w:r>
-        <w:rPr/>
-        <w:t xml:space="preserve">. The history and composition of the Carnegie </w:t>
+        <w:t xml:space="preserve">Taylor, Michael P., Matthew C. Lamanna, Amy Henrici, Linsly Church and Ilja Nieuwland. 2025. The history and composition of the Carnegie </w:t>
       </w:r>
       <w:r>
         <w:rPr>
@@ -7368,21 +7264,7 @@
           <w:i w:val="false"/>
           <w:iCs w:val="false"/>
         </w:rPr>
-        <w:t xml:space="preserve">:55–91. </w:t>
-      </w:r>
-      <w:r>
-        <w:rPr>
-          <w:i w:val="false"/>
-          <w:iCs w:val="false"/>
-        </w:rPr>
-        <w:t>doi:</w:t>
-      </w:r>
-      <w:r>
-        <w:rPr>
-          <w:i w:val="false"/>
-          <w:iCs w:val="false"/>
-        </w:rPr>
-        <w:t>10.2992/007.091.0104</w:t>
+        <w:t>:55–91. doi:10.2992/007.091.0104</w:t>
       </w:r>
     </w:p>
     <w:p>
@@ -8028,7 +7910,7 @@
     </w:p>
     <w:p>
       <w:pPr>
-        <w:pStyle w:val="BlockQuotation"/>
+        <w:pStyle w:val="BlockQuotationuser"/>
         <w:rPr/>
       </w:pPr>
       <w:r>
@@ -8061,7 +7943,7 @@
         <w:pStyle w:val="FigureCaption"/>
         <w:widowControl/>
         <w:suppressAutoHyphens w:val="true"/>
-        <w:overflowPunct w:val="false"/>
+        <w:overflowPunct w:val="true"/>
         <w:bidi w:val="0"/>
         <w:spacing w:lineRule="auto" w:line="276" w:before="0" w:after="142"/>
         <w:ind w:hanging="0" w:left="283" w:right="0"/>
@@ -8410,15 +8292,7 @@
       </w:r>
       <w:r>
         <w:rPr/>
-        <w:t xml:space="preserve"> and the </w:t>
-      </w:r>
-      <w:r>
-        <w:rPr/>
-        <w:t xml:space="preserve">rearing skeleton </w:t>
-      </w:r>
-      <w:r>
-        <w:rPr/>
-        <w:t>mount AMNH 6341.</w:t>
+        <w:t xml:space="preserve"> and the rearing skeleton mount AMNH 6341.</w:t>
       </w:r>
     </w:p>
     <w:tbl>
@@ -8435,8 +8309,8 @@
         </w:tblCellMar>
       </w:tblPr>
       <w:tblGrid>
-        <w:gridCol w:w="2210"/>
-        <w:gridCol w:w="7428"/>
+        <w:gridCol w:w="2209"/>
+        <w:gridCol w:w="7429"/>
       </w:tblGrid>
       <w:tr>
         <w:trPr>
@@ -8444,7 +8318,7 @@
         </w:trPr>
         <w:tc>
           <w:tcPr>
-            <w:tcW w:w="2210" w:type="dxa"/>
+            <w:tcW w:w="2209" w:type="dxa"/>
             <w:tcBorders/>
           </w:tcPr>
           <w:p>
@@ -8461,7 +8335,7 @@
         </w:tc>
         <w:tc>
           <w:tcPr>
-            <w:tcW w:w="7428" w:type="dxa"/>
+            <w:tcW w:w="7429" w:type="dxa"/>
             <w:tcBorders/>
           </w:tcPr>
           <w:p>
@@ -8483,7 +8357,7 @@
         </w:trPr>
         <w:tc>
           <w:tcPr>
-            <w:tcW w:w="2210" w:type="dxa"/>
+            <w:tcW w:w="2209" w:type="dxa"/>
             <w:tcBorders/>
           </w:tcPr>
           <w:p>
@@ -8500,7 +8374,7 @@
         </w:tc>
         <w:tc>
           <w:tcPr>
-            <w:tcW w:w="7428" w:type="dxa"/>
+            <w:tcW w:w="7429" w:type="dxa"/>
             <w:tcBorders/>
           </w:tcPr>
           <w:p>
@@ -8535,7 +8409,7 @@
         </w:trPr>
         <w:tc>
           <w:tcPr>
-            <w:tcW w:w="2210" w:type="dxa"/>
+            <w:tcW w:w="2209" w:type="dxa"/>
             <w:tcBorders/>
           </w:tcPr>
           <w:p>
@@ -8552,7 +8426,7 @@
         </w:tc>
         <w:tc>
           <w:tcPr>
-            <w:tcW w:w="7428" w:type="dxa"/>
+            <w:tcW w:w="7429" w:type="dxa"/>
             <w:tcBorders/>
           </w:tcPr>
           <w:p>
@@ -8576,7 +8450,7 @@
         </w:trPr>
         <w:tc>
           <w:tcPr>
-            <w:tcW w:w="2210" w:type="dxa"/>
+            <w:tcW w:w="2209" w:type="dxa"/>
             <w:tcBorders/>
           </w:tcPr>
           <w:p>
@@ -8593,7 +8467,7 @@
         </w:tc>
         <w:tc>
           <w:tcPr>
-            <w:tcW w:w="7428" w:type="dxa"/>
+            <w:tcW w:w="7429" w:type="dxa"/>
             <w:tcBorders/>
           </w:tcPr>
           <w:p>
@@ -8626,7 +8500,7 @@
         </w:trPr>
         <w:tc>
           <w:tcPr>
-            <w:tcW w:w="2210" w:type="dxa"/>
+            <w:tcW w:w="2209" w:type="dxa"/>
             <w:tcBorders/>
           </w:tcPr>
           <w:p>
@@ -8643,7 +8517,7 @@
         </w:tc>
         <w:tc>
           <w:tcPr>
-            <w:tcW w:w="7428" w:type="dxa"/>
+            <w:tcW w:w="7429" w:type="dxa"/>
             <w:tcBorders/>
           </w:tcPr>
           <w:p>
@@ -8665,7 +8539,7 @@
         </w:trPr>
         <w:tc>
           <w:tcPr>
-            <w:tcW w:w="2210" w:type="dxa"/>
+            <w:tcW w:w="2209" w:type="dxa"/>
             <w:tcBorders/>
           </w:tcPr>
           <w:p>
@@ -8682,7 +8556,7 @@
         </w:tc>
         <w:tc>
           <w:tcPr>
-            <w:tcW w:w="7428" w:type="dxa"/>
+            <w:tcW w:w="7429" w:type="dxa"/>
             <w:tcBorders/>
           </w:tcPr>
           <w:p>
@@ -8715,7 +8589,7 @@
         </w:trPr>
         <w:tc>
           <w:tcPr>
-            <w:tcW w:w="2210" w:type="dxa"/>
+            <w:tcW w:w="2209" w:type="dxa"/>
             <w:tcBorders/>
           </w:tcPr>
           <w:p>
@@ -8732,7 +8606,7 @@
         </w:tc>
         <w:tc>
           <w:tcPr>
-            <w:tcW w:w="7428" w:type="dxa"/>
+            <w:tcW w:w="7429" w:type="dxa"/>
             <w:tcBorders/>
           </w:tcPr>
           <w:p>
@@ -8765,7 +8639,7 @@
         </w:trPr>
         <w:tc>
           <w:tcPr>
-            <w:tcW w:w="2210" w:type="dxa"/>
+            <w:tcW w:w="2209" w:type="dxa"/>
             <w:tcBorders/>
           </w:tcPr>
           <w:p>
@@ -8782,7 +8656,7 @@
         </w:tc>
         <w:tc>
           <w:tcPr>
-            <w:tcW w:w="7428" w:type="dxa"/>
+            <w:tcW w:w="7429" w:type="dxa"/>
             <w:tcBorders/>
           </w:tcPr>
           <w:p>
@@ -8815,7 +8689,7 @@
         </w:trPr>
         <w:tc>
           <w:tcPr>
-            <w:tcW w:w="2210" w:type="dxa"/>
+            <w:tcW w:w="2209" w:type="dxa"/>
             <w:tcBorders/>
           </w:tcPr>
           <w:p>
@@ -8832,7 +8706,7 @@
         </w:tc>
         <w:tc>
           <w:tcPr>
-            <w:tcW w:w="7428" w:type="dxa"/>
+            <w:tcW w:w="7429" w:type="dxa"/>
             <w:tcBorders/>
           </w:tcPr>
           <w:p>
@@ -8843,15 +8717,7 @@
             </w:pPr>
             <w:r>
               <w:rPr/>
-              <w:t>Lull’s published abstract very briefly describe</w:t>
-            </w:r>
-            <w:r>
-              <w:rPr/>
-              <w:t>d</w:t>
-            </w:r>
-            <w:r>
-              <w:rPr/>
-              <w:t xml:space="preserve"> the type specimen.</w:t>
+              <w:t>Lull’s published abstract very briefly described the type specimen.</w:t>
             </w:r>
           </w:p>
         </w:tc>
@@ -8862,7 +8728,7 @@
         </w:trPr>
         <w:tc>
           <w:tcPr>
-            <w:tcW w:w="2210" w:type="dxa"/>
+            <w:tcW w:w="2209" w:type="dxa"/>
             <w:tcBorders/>
           </w:tcPr>
           <w:p>
@@ -8879,7 +8745,7 @@
         </w:tc>
         <w:tc>
           <w:tcPr>
-            <w:tcW w:w="7428" w:type="dxa"/>
+            <w:tcW w:w="7429" w:type="dxa"/>
             <w:tcBorders/>
           </w:tcPr>
           <w:p>
@@ -8901,7 +8767,7 @@
         </w:trPr>
         <w:tc>
           <w:tcPr>
-            <w:tcW w:w="2210" w:type="dxa"/>
+            <w:tcW w:w="2209" w:type="dxa"/>
             <w:tcBorders/>
           </w:tcPr>
           <w:p>
@@ -8918,7 +8784,7 @@
         </w:tc>
         <w:tc>
           <w:tcPr>
-            <w:tcW w:w="7428" w:type="dxa"/>
+            <w:tcW w:w="7429" w:type="dxa"/>
             <w:tcBorders/>
           </w:tcPr>
           <w:p>
@@ -8984,7 +8850,7 @@
         </w:trPr>
         <w:tc>
           <w:tcPr>
-            <w:tcW w:w="2210" w:type="dxa"/>
+            <w:tcW w:w="2209" w:type="dxa"/>
             <w:tcBorders/>
           </w:tcPr>
           <w:p>
@@ -8995,13 +8861,13 @@
             </w:pPr>
             <w:r>
               <w:rPr/>
-              <w:t>1922</w:t>
+              <w:t>1922–1923</w:t>
             </w:r>
           </w:p>
         </w:tc>
         <w:tc>
           <w:tcPr>
-            <w:tcW w:w="7428" w:type="dxa"/>
+            <w:tcW w:w="7429" w:type="dxa"/>
             <w:tcBorders/>
           </w:tcPr>
           <w:p>
@@ -9034,7 +8900,7 @@
         </w:trPr>
         <w:tc>
           <w:tcPr>
-            <w:tcW w:w="2210" w:type="dxa"/>
+            <w:tcW w:w="2209" w:type="dxa"/>
             <w:tcBorders/>
           </w:tcPr>
           <w:p>
@@ -9051,7 +8917,7 @@
         </w:tc>
         <w:tc>
           <w:tcPr>
-            <w:tcW w:w="7428" w:type="dxa"/>
+            <w:tcW w:w="7429" w:type="dxa"/>
             <w:tcBorders/>
           </w:tcPr>
           <w:p>
@@ -9062,7 +8928,7 @@
             </w:pPr>
             <w:r>
               <w:rPr/>
-              <w:t xml:space="preserve">The neck of #340 was sent to the Smithsonian to provide material for a </w:t>
+              <w:t xml:space="preserve">The neck of #340 was sent to the USNM to provide material for a </w:t>
             </w:r>
             <w:r>
               <w:rPr>
@@ -9073,7 +8939,7 @@
             </w:r>
             <w:r>
               <w:rPr/>
-              <w:t xml:space="preserve"> skeletal mount based on USNM 10865. When prepared, the neck sent to the Smithsonian proved to belong not to </w:t>
+              <w:t xml:space="preserve"> skeletal mount based on USNM 10865. When prepared, the neck sent to the USNM proved to belong not to </w:t>
             </w:r>
             <w:r>
               <w:rPr>
@@ -9106,7 +8972,7 @@
         </w:trPr>
         <w:tc>
           <w:tcPr>
-            <w:tcW w:w="2210" w:type="dxa"/>
+            <w:tcW w:w="2209" w:type="dxa"/>
             <w:tcBorders/>
           </w:tcPr>
           <w:p>
@@ -9123,7 +8989,7 @@
         </w:tc>
         <w:tc>
           <w:tcPr>
-            <w:tcW w:w="7428" w:type="dxa"/>
+            <w:tcW w:w="7429" w:type="dxa"/>
             <w:tcBorders/>
           </w:tcPr>
           <w:p>
@@ -9134,15 +9000,7 @@
             </w:pPr>
             <w:r>
               <w:rPr/>
-              <w:t xml:space="preserve">Barnum Brown realised that the Smithsonian neck and the Carnegie tail belonged to the same individual as the partial skeleton at the University of Utah. He acquired all three three portions of this skeleton and reunited them </w:t>
-            </w:r>
-            <w:r>
-              <w:rPr/>
-              <w:t>at</w:t>
-            </w:r>
-            <w:r>
-              <w:rPr/>
-              <w:t xml:space="preserve"> the American Museum of Natural History (AMNH) in New York. The reunited skeleton was given the specimen number AMNH 6341.</w:t>
+              <w:t>Barnum Brown realised that the USNM neck and the Carnegie tail belonged to the same individual as the partial skeleton at the University of Utah. He acquired all three three portions of this skeleton and reunited them at the American Museum of Natural History (AMNH) in New York. The reunited skeleton was given the specimen number AMNH 6341.</w:t>
             </w:r>
           </w:p>
         </w:tc>
@@ -9153,7 +9011,7 @@
         </w:trPr>
         <w:tc>
           <w:tcPr>
-            <w:tcW w:w="2210" w:type="dxa"/>
+            <w:tcW w:w="2209" w:type="dxa"/>
             <w:tcBorders/>
           </w:tcPr>
           <w:p>
@@ -9170,7 +9028,7 @@
         </w:tc>
         <w:tc>
           <w:tcPr>
-            <w:tcW w:w="7428" w:type="dxa"/>
+            <w:tcW w:w="7429" w:type="dxa"/>
             <w:tcBorders/>
           </w:tcPr>
           <w:p>
@@ -9192,7 +9050,7 @@
         </w:trPr>
         <w:tc>
           <w:tcPr>
-            <w:tcW w:w="2210" w:type="dxa"/>
+            <w:tcW w:w="2209" w:type="dxa"/>
             <w:tcBorders/>
           </w:tcPr>
           <w:p>
@@ -9209,7 +9067,7 @@
         </w:tc>
         <w:tc>
           <w:tcPr>
-            <w:tcW w:w="7428" w:type="dxa"/>
+            <w:tcW w:w="7429" w:type="dxa"/>
             <w:tcBorders/>
           </w:tcPr>
           <w:p>
@@ -9231,7 +9089,7 @@
         </w:trPr>
         <w:tc>
           <w:tcPr>
-            <w:tcW w:w="2210" w:type="dxa"/>
+            <w:tcW w:w="2209" w:type="dxa"/>
             <w:tcBorders/>
           </w:tcPr>
           <w:p>
@@ -9248,7 +9106,7 @@
         </w:tc>
         <w:tc>
           <w:tcPr>
-            <w:tcW w:w="7428" w:type="dxa"/>
+            <w:tcW w:w="7429" w:type="dxa"/>
             <w:tcBorders/>
           </w:tcPr>
           <w:p>
@@ -9270,7 +9128,7 @@
         </w:trPr>
         <w:tc>
           <w:tcPr>
-            <w:tcW w:w="2210" w:type="dxa"/>
+            <w:tcW w:w="2209" w:type="dxa"/>
             <w:tcBorders/>
           </w:tcPr>
           <w:p>
@@ -9287,7 +9145,7 @@
         </w:tc>
         <w:tc>
           <w:tcPr>
-            <w:tcW w:w="7428" w:type="dxa"/>
+            <w:tcW w:w="7429" w:type="dxa"/>
             <w:tcBorders/>
           </w:tcPr>
           <w:p>
@@ -9320,7 +9178,7 @@
         </w:trPr>
         <w:tc>
           <w:tcPr>
-            <w:tcW w:w="2210" w:type="dxa"/>
+            <w:tcW w:w="2209" w:type="dxa"/>
             <w:tcBorders/>
           </w:tcPr>
           <w:p>
@@ -9337,7 +9195,7 @@
         </w:tc>
         <w:tc>
           <w:tcPr>
-            <w:tcW w:w="7428" w:type="dxa"/>
+            <w:tcW w:w="7429" w:type="dxa"/>
             <w:tcBorders/>
           </w:tcPr>
           <w:p>
@@ -9359,15 +9217,7 @@
             </w:r>
             <w:r>
               <w:rPr/>
-              <w:t xml:space="preserve"> cast made from these molds </w:t>
-            </w:r>
-            <w:r>
-              <w:rPr/>
-              <w:t>wa</w:t>
-            </w:r>
-            <w:r>
-              <w:rPr/>
-              <w:t>s unveiled outside the Utah Field House.</w:t>
+              <w:t xml:space="preserve"> cast made from these molds was unveiled outside the Utah Field House.</w:t>
             </w:r>
           </w:p>
         </w:tc>
@@ -9378,7 +9228,7 @@
         </w:trPr>
         <w:tc>
           <w:tcPr>
-            <w:tcW w:w="2210" w:type="dxa"/>
+            <w:tcW w:w="2209" w:type="dxa"/>
             <w:tcBorders/>
           </w:tcPr>
           <w:p>
@@ -9395,7 +9245,7 @@
         </w:tc>
         <w:tc>
           <w:tcPr>
-            <w:tcW w:w="7428" w:type="dxa"/>
+            <w:tcW w:w="7429" w:type="dxa"/>
             <w:tcBorders/>
           </w:tcPr>
           <w:p>
@@ -9417,7 +9267,7 @@
         </w:trPr>
         <w:tc>
           <w:tcPr>
-            <w:tcW w:w="2210" w:type="dxa"/>
+            <w:tcW w:w="2209" w:type="dxa"/>
             <w:tcBorders/>
           </w:tcPr>
           <w:p>
@@ -9434,7 +9284,7 @@
         </w:tc>
         <w:tc>
           <w:tcPr>
-            <w:tcW w:w="7428" w:type="dxa"/>
+            <w:tcW w:w="7429" w:type="dxa"/>
             <w:tcBorders/>
           </w:tcPr>
           <w:p>
@@ -9456,7 +9306,7 @@
         </w:trPr>
         <w:tc>
           <w:tcPr>
-            <w:tcW w:w="2210" w:type="dxa"/>
+            <w:tcW w:w="2209" w:type="dxa"/>
             <w:tcBorders/>
           </w:tcPr>
           <w:p>
@@ -9473,7 +9323,7 @@
         </w:tc>
         <w:tc>
           <w:tcPr>
-            <w:tcW w:w="7428" w:type="dxa"/>
+            <w:tcW w:w="7429" w:type="dxa"/>
             <w:tcBorders/>
           </w:tcPr>
           <w:p>
@@ -9528,7 +9378,7 @@
         </w:trPr>
         <w:tc>
           <w:tcPr>
-            <w:tcW w:w="2210" w:type="dxa"/>
+            <w:tcW w:w="2209" w:type="dxa"/>
             <w:tcBorders/>
           </w:tcPr>
           <w:p>
@@ -9545,7 +9395,7 @@
         </w:tc>
         <w:tc>
           <w:tcPr>
-            <w:tcW w:w="7428" w:type="dxa"/>
+            <w:tcW w:w="7429" w:type="dxa"/>
             <w:tcBorders/>
           </w:tcPr>
           <w:p>
@@ -9567,7 +9417,7 @@
         </w:trPr>
         <w:tc>
           <w:tcPr>
-            <w:tcW w:w="2210" w:type="dxa"/>
+            <w:tcW w:w="2209" w:type="dxa"/>
             <w:tcBorders/>
           </w:tcPr>
           <w:p>
@@ -9584,7 +9434,7 @@
         </w:tc>
         <w:tc>
           <w:tcPr>
-            <w:tcW w:w="7428" w:type="dxa"/>
+            <w:tcW w:w="7429" w:type="dxa"/>
             <w:tcBorders/>
           </w:tcPr>
           <w:p>
@@ -9595,15 +9445,7 @@
             </w:pPr>
             <w:r>
               <w:rPr/>
-              <w:t xml:space="preserve">Jim Madsen’s company Dinolab unmounted </w:t>
-            </w:r>
-            <w:r>
-              <w:rPr/>
-              <w:t xml:space="preserve">the </w:t>
-            </w:r>
-            <w:r>
-              <w:rPr/>
-              <w:t xml:space="preserve">concrete </w:t>
+              <w:t xml:space="preserve">Jim Madsen’s company Dinolab unmounted the concrete </w:t>
             </w:r>
             <w:r>
               <w:rPr>
@@ -9614,15 +9456,7 @@
             </w:r>
             <w:r>
               <w:rPr/>
-              <w:t xml:space="preserve"> of Vernal, used it to create second-generation molds, and created a new, lightweight cast for the </w:t>
-            </w:r>
-            <w:r>
-              <w:rPr/>
-              <w:t xml:space="preserve">Utah </w:t>
-            </w:r>
-            <w:r>
-              <w:rPr/>
-              <w:t>Field House’s new building.</w:t>
+              <w:t xml:space="preserve"> of Vernal, used it to create second-generation molds, and created a new, lightweight cast for the Utah Field House’s new building.</w:t>
             </w:r>
           </w:p>
         </w:tc>
@@ -9633,7 +9467,7 @@
         </w:trPr>
         <w:tc>
           <w:tcPr>
-            <w:tcW w:w="2210" w:type="dxa"/>
+            <w:tcW w:w="2209" w:type="dxa"/>
             <w:tcBorders/>
           </w:tcPr>
           <w:p>
@@ -9650,7 +9484,7 @@
         </w:tc>
         <w:tc>
           <w:tcPr>
-            <w:tcW w:w="7428" w:type="dxa"/>
+            <w:tcW w:w="7429" w:type="dxa"/>
             <w:tcBorders/>
           </w:tcPr>
           <w:p>
@@ -9672,7 +9506,7 @@
         </w:trPr>
         <w:tc>
           <w:tcPr>
-            <w:tcW w:w="2210" w:type="dxa"/>
+            <w:tcW w:w="2209" w:type="dxa"/>
             <w:tcBorders/>
           </w:tcPr>
           <w:p>
@@ -9689,7 +9523,7 @@
         </w:tc>
         <w:tc>
           <w:tcPr>
-            <w:tcW w:w="7428" w:type="dxa"/>
+            <w:tcW w:w="7429" w:type="dxa"/>
             <w:tcBorders/>
           </w:tcPr>
           <w:p>
@@ -9722,7 +9556,7 @@
         </w:trPr>
         <w:tc>
           <w:tcPr>
-            <w:tcW w:w="2210" w:type="dxa"/>
+            <w:tcW w:w="2209" w:type="dxa"/>
             <w:tcBorders/>
           </w:tcPr>
           <w:p>
@@ -9739,7 +9573,7 @@
         </w:tc>
         <w:tc>
           <w:tcPr>
-            <w:tcW w:w="7428" w:type="dxa"/>
+            <w:tcW w:w="7429" w:type="dxa"/>
             <w:tcBorders/>
           </w:tcPr>
           <w:p>
@@ -9772,7 +9606,7 @@
         </w:trPr>
         <w:tc>
           <w:tcPr>
-            <w:tcW w:w="2210" w:type="dxa"/>
+            <w:tcW w:w="2209" w:type="dxa"/>
             <w:tcBorders/>
           </w:tcPr>
           <w:p>
@@ -9789,7 +9623,7 @@
         </w:tc>
         <w:tc>
           <w:tcPr>
-            <w:tcW w:w="7428" w:type="dxa"/>
+            <w:tcW w:w="7429" w:type="dxa"/>
             <w:tcBorders/>
           </w:tcPr>
           <w:p>
@@ -9833,7 +9667,7 @@
         </w:trPr>
         <w:tc>
           <w:tcPr>
-            <w:tcW w:w="2210" w:type="dxa"/>
+            <w:tcW w:w="2209" w:type="dxa"/>
             <w:tcBorders/>
           </w:tcPr>
           <w:p>
@@ -9850,7 +9684,7 @@
         </w:tc>
         <w:tc>
           <w:tcPr>
-            <w:tcW w:w="7428" w:type="dxa"/>
+            <w:tcW w:w="7429" w:type="dxa"/>
             <w:tcBorders/>
           </w:tcPr>
           <w:p>
@@ -9872,15 +9706,7 @@
             </w:r>
             <w:r>
               <w:rPr/>
-              <w:t xml:space="preserve"> mount was carried out </w:t>
-            </w:r>
-            <w:r>
-              <w:rPr/>
-              <w:t>i</w:t>
-            </w:r>
-            <w:r>
-              <w:rPr/>
-              <w:t>n Toronto.</w:t>
+              <w:t xml:space="preserve"> mount was carried out in Toronto.</w:t>
             </w:r>
           </w:p>
         </w:tc>
@@ -9891,7 +9717,7 @@
         </w:trPr>
         <w:tc>
           <w:tcPr>
-            <w:tcW w:w="2210" w:type="dxa"/>
+            <w:tcW w:w="2209" w:type="dxa"/>
             <w:tcBorders/>
           </w:tcPr>
           <w:p>
@@ -9908,7 +9734,7 @@
         </w:tc>
         <w:tc>
           <w:tcPr>
-            <w:tcW w:w="7428" w:type="dxa"/>
+            <w:tcW w:w="7429" w:type="dxa"/>
             <w:tcBorders/>
           </w:tcPr>
           <w:p>
@@ -9919,23 +9745,7 @@
             </w:pPr>
             <w:r>
               <w:rPr/>
-              <w:t xml:space="preserve">Gene Gaffney and Peter May found a site in northeastern Montana that could be molded and cast to provide </w:t>
-            </w:r>
-            <w:r>
-              <w:rPr/>
-              <w:t>a</w:t>
-            </w:r>
-            <w:r>
-              <w:rPr/>
-              <w:t xml:space="preserve"> base </w:t>
-            </w:r>
-            <w:r>
-              <w:rPr/>
-              <w:t xml:space="preserve">for </w:t>
-            </w:r>
-            <w:r>
-              <w:rPr/>
-              <w:t>the skeletons.</w:t>
+              <w:t>Gene Gaffney and Peter May found a site in northeastern Montana that could be molded and cast to provide a base for the skeletons.</w:t>
             </w:r>
           </w:p>
         </w:tc>
@@ -9946,7 +9756,7 @@
         </w:trPr>
         <w:tc>
           <w:tcPr>
-            <w:tcW w:w="2210" w:type="dxa"/>
+            <w:tcW w:w="2209" w:type="dxa"/>
             <w:tcBorders/>
           </w:tcPr>
           <w:p>
@@ -9963,7 +9773,7 @@
         </w:tc>
         <w:tc>
           <w:tcPr>
-            <w:tcW w:w="7428" w:type="dxa"/>
+            <w:tcW w:w="7429" w:type="dxa"/>
             <w:tcBorders/>
           </w:tcPr>
           <w:p>
@@ -9985,7 +9795,7 @@
         </w:trPr>
         <w:tc>
           <w:tcPr>
-            <w:tcW w:w="2210" w:type="dxa"/>
+            <w:tcW w:w="2209" w:type="dxa"/>
             <w:tcBorders/>
           </w:tcPr>
           <w:p>
@@ -10002,7 +9812,7 @@
         </w:tc>
         <w:tc>
           <w:tcPr>
-            <w:tcW w:w="7428" w:type="dxa"/>
+            <w:tcW w:w="7429" w:type="dxa"/>
             <w:tcBorders/>
           </w:tcPr>
           <w:p>
@@ -10013,11 +9823,7 @@
             </w:pPr>
             <w:r>
               <w:rPr/>
-              <w:t xml:space="preserve">The John Gurche painting </w:t>
-            </w:r>
-            <w:r>
-              <w:rPr/>
-              <w:t xml:space="preserve">of a rearing </w:t>
+              <w:t xml:space="preserve">The John Gurche painting of a rearing </w:t>
             </w:r>
             <w:r>
               <w:rPr>
@@ -10028,11 +9834,7 @@
             </w:r>
             <w:r>
               <w:rPr/>
-              <w:t xml:space="preserve">, </w:t>
-            </w:r>
-            <w:r>
-              <w:rPr/>
-              <w:t xml:space="preserve">prepared for the exhibit, appeared on the front cover of </w:t>
+              <w:t xml:space="preserve">, prepared for the exhibit, appeared on the front cover of </w:t>
             </w:r>
             <w:r>
               <w:rPr>
@@ -10054,7 +9856,7 @@
         </w:trPr>
         <w:tc>
           <w:tcPr>
-            <w:tcW w:w="2210" w:type="dxa"/>
+            <w:tcW w:w="2209" w:type="dxa"/>
             <w:tcBorders/>
           </w:tcPr>
           <w:p>
@@ -10071,7 +9873,7 @@
         </w:tc>
         <w:tc>
           <w:tcPr>
-            <w:tcW w:w="7428" w:type="dxa"/>
+            <w:tcW w:w="7429" w:type="dxa"/>
             <w:tcBorders/>
           </w:tcPr>
           <w:p>
@@ -10115,7 +9917,7 @@
         </w:trPr>
         <w:tc>
           <w:tcPr>
-            <w:tcW w:w="2210" w:type="dxa"/>
+            <w:tcW w:w="2209" w:type="dxa"/>
             <w:tcBorders/>
           </w:tcPr>
           <w:p>
@@ -10132,7 +9934,7 @@
         </w:tc>
         <w:tc>
           <w:tcPr>
-            <w:tcW w:w="7428" w:type="dxa"/>
+            <w:tcW w:w="7429" w:type="dxa"/>
             <w:tcBorders/>
           </w:tcPr>
           <w:p>
@@ -10154,7 +9956,7 @@
         </w:trPr>
         <w:tc>
           <w:tcPr>
-            <w:tcW w:w="2210" w:type="dxa"/>
+            <w:tcW w:w="2209" w:type="dxa"/>
             <w:tcBorders/>
           </w:tcPr>
           <w:p>
@@ -10171,7 +9973,7 @@
         </w:tc>
         <w:tc>
           <w:tcPr>
-            <w:tcW w:w="7428" w:type="dxa"/>
+            <w:tcW w:w="7429" w:type="dxa"/>
             <w:tcBorders/>
           </w:tcPr>
           <w:p>
@@ -10204,7 +10006,7 @@
         </w:trPr>
         <w:tc>
           <w:tcPr>
-            <w:tcW w:w="2210" w:type="dxa"/>
+            <w:tcW w:w="2209" w:type="dxa"/>
             <w:tcBorders/>
           </w:tcPr>
           <w:p>
@@ -10221,7 +10023,7 @@
         </w:tc>
         <w:tc>
           <w:tcPr>
-            <w:tcW w:w="7428" w:type="dxa"/>
+            <w:tcW w:w="7429" w:type="dxa"/>
             <w:tcBorders/>
           </w:tcPr>
           <w:p>
@@ -10265,7 +10067,7 @@
         </w:trPr>
         <w:tc>
           <w:tcPr>
-            <w:tcW w:w="2210" w:type="dxa"/>
+            <w:tcW w:w="2209" w:type="dxa"/>
             <w:tcBorders/>
           </w:tcPr>
           <w:p>
@@ -10282,7 +10084,7 @@
         </w:tc>
         <w:tc>
           <w:tcPr>
-            <w:tcW w:w="7428" w:type="dxa"/>
+            <w:tcW w:w="7429" w:type="dxa"/>
             <w:tcBorders/>
           </w:tcPr>
           <w:p>
@@ -11538,7 +11340,7 @@
     <w:pPr>
       <w:widowControl/>
       <w:suppressAutoHyphens w:val="true"/>
-      <w:overflowPunct w:val="false"/>
+      <w:overflowPunct w:val="true"/>
       <w:bidi w:val="0"/>
       <w:spacing w:before="0" w:after="0"/>
       <w:ind w:hanging="0" w:left="0" w:right="0"/>
@@ -11645,8 +11447,8 @@
     <w:qFormat/>
     <w:rPr/>
   </w:style>
-  <w:style w:type="character" w:styleId="Bullets">
-    <w:name w:val="Bullets"/>
+  <w:style w:type="character" w:styleId="Bulletsuser">
+    <w:name w:val="Bullets (user)"/>
     <w:qFormat/>
     <w:rPr>
       <w:rFonts w:ascii="OpenSymbol" w:hAnsi="OpenSymbol" w:eastAsia="OpenSymbol" w:cs="OpenSymbol"/>
@@ -11763,8 +11565,8 @@
       <w:i/>
     </w:rPr>
   </w:style>
-  <w:style w:type="paragraph" w:styleId="BlockQuotation">
-    <w:name w:val="Block Quotation"/>
+  <w:style w:type="paragraph" w:styleId="BlockQuotationuser">
+    <w:name w:val="Block Quotation (user)"/>
     <w:basedOn w:val="Normal"/>
     <w:qFormat/>
     <w:pPr>

</xml_diff>

<commit_message>
Integrate information from refs/Douglass1922_Field_Report.pdf
</commit_message>
<xml_diff>
--- a/TaylorEtAl-mounted-barosaurus.docx
+++ b/TaylorEtAl-mounted-barosaurus.docx
@@ -1705,7 +1705,11 @@
       </w:pPr>
       <w:r>
         <w:rPr/>
-        <w:t xml:space="preserve">Earl Douglass had first discovered dinosaur fossils at Dinosaur National Monument in 1909 (Gilmore 1932:2), and so had been working the area for a full decade by 1919, when the expedition sponsor Andrew Carnegie died at the age of 83. It was apparent that work at the quarry would soon end without his funding, and Douglass joined the staff of the University of Utah. Charles W. Gilmore arrived at the quarry on 14 May 1923 to work it for the USNM and was shown around by Douglass, who was about to leave for Colorado (Gilmore 1923). Gilmore inherited two partially uncovered skeletons, both thought to be </w:t>
+        <w:t xml:space="preserve">Earl Douglass had first discovered dinosaur fossils at Dinosaur National Monument in 1909 (Gilmore 1932:2), and so had been working the area for a full decade by 1919, when the expedition sponsor Andrew Carnegie died at the age of 83. It was apparent that work at the quarry would soon end without his funding, and Douglass joined the staff of the University of Utah. </w:t>
+      </w:r>
+      <w:r>
+        <w:rPr/>
+        <w:t xml:space="preserve">By the end of the 1922 season, “all but two skeletons — those of </w:t>
       </w:r>
       <w:r>
         <w:rPr>
@@ -1716,7 +1720,42 @@
       </w:r>
       <w:r>
         <w:rPr/>
-        <w:t>: #355 (the most complete) and #340.</w:t>
+        <w:t xml:space="preserve"> — were removed” (Douglass 1922). Douglass listed 10 skeletons that had been partly or completely taken out during the year. Among those listed was “No. 340 — </w:t>
+      </w:r>
+      <w:r>
+        <w:rPr>
+          <w:i/>
+          <w:iCs/>
+        </w:rPr>
+        <w:t>Diplodocus</w:t>
+      </w:r>
+      <w:r>
+        <w:rPr/>
+        <w:t>. Apparently neerly complete skele</w:t>
+      </w:r>
+      <w:r>
+        <w:rPr/>
+        <w:t>ton but only ne</w:t>
+      </w:r>
+      <w:r>
+        <w:rPr/>
+        <w:t>c</w:t>
+      </w:r>
+      <w:r>
+        <w:rPr/>
+        <w:t>k taken out. The rem</w:t>
+      </w:r>
+      <w:r>
+        <w:rPr/>
+        <w:t>a</w:t>
+      </w:r>
+      <w:r>
+        <w:rPr/>
+        <w:t xml:space="preserve">inder still in the ledge” </w:t>
+      </w:r>
+      <w:r>
+        <w:rPr/>
+        <w:t>(Douglass 1922).</w:t>
       </w:r>
     </w:p>
     <w:p>
@@ -1726,7 +1765,49 @@
       </w:pPr>
       <w:r>
         <w:rPr/>
-        <w:t>It was Gilmore’s intention to extract #355 for the USNM, then secure the parts of #340 necessary to complete the skeleton (Gilmore 1923). (#355 was subsequently accessioned as USNM 10865 and mounted in Washington D.C, where it remains in the public gallery to this day.). Douglass handed over to Gilmore four large blocks and several smaller ones containing much of the neck of #340.</w:t>
+        <w:t xml:space="preserve">Charles W. Gilmore arrived at the quarry on 14 May 1923 to work it for the USNM and was shown around by Douglass, who was about to leave for Colorado (Gilmore 1923). Gilmore inherited two partially uncovered skeletons, both </w:t>
+      </w:r>
+      <w:r>
+        <w:rPr/>
+        <w:t xml:space="preserve">then </w:t>
+      </w:r>
+      <w:r>
+        <w:rPr/>
+        <w:t xml:space="preserve">thought to be </w:t>
+      </w:r>
+      <w:r>
+        <w:rPr>
+          <w:i/>
+          <w:iCs/>
+        </w:rPr>
+        <w:t>Diplodocus</w:t>
+      </w:r>
+      <w:r>
+        <w:rPr/>
+        <w:t>: #</w:t>
+      </w:r>
+      <w:r>
+        <w:rPr/>
+        <w:t>340, as mentioned in Douglass’s report, and #</w:t>
+      </w:r>
+      <w:r>
+        <w:rPr/>
+        <w:t xml:space="preserve">355, </w:t>
+      </w:r>
+      <w:r>
+        <w:rPr/>
+        <w:t xml:space="preserve">presumably one of the two </w:t>
+      </w:r>
+      <w:r>
+        <w:rPr>
+          <w:i/>
+          <w:iCs/>
+        </w:rPr>
+        <w:t>Diplodocus</w:t>
+      </w:r>
+      <w:r>
+        <w:rPr/>
+        <w:t xml:space="preserve"> skeletons that Douglass had referred to as not having been removed.</w:t>
       </w:r>
     </w:p>
     <w:p>
@@ -1736,11 +1817,29 @@
       </w:pPr>
       <w:r>
         <w:rPr/>
-        <w:t xml:space="preserve">XXXXX segue into next bit. </w:t>
-      </w:r>
-      <w:r>
-        <w:rPr/>
-        <w:t>Reconcile McIntosh 2005 with Gilmore 1923 and Brown 1929 quoted in Dingus 1996.</w:t>
+        <w:t xml:space="preserve">It was Gilmore’s intention to extract #355 (the most complete </w:t>
+      </w:r>
+      <w:r>
+        <w:rPr/>
+        <w:t>of the two</w:t>
+      </w:r>
+      <w:r>
+        <w:rPr/>
+        <w:t xml:space="preserve">) for the USNM, then secure the parts of #340 necessary to complete the skeleton (Gilmore 1923). (#355 was subsequently accessioned as USNM 10865 and mounted in Washington D.C, where it remains in the public gallery to this day.). Douglass handed over to Gilmore four large blocks and several smaller ones containing much of the neck of #340, </w:t>
+      </w:r>
+      <w:r>
+        <w:rPr/>
+        <w:t>which has been extracted from the quarry as noted above but not prepared out.</w:t>
+      </w:r>
+    </w:p>
+    <w:p>
+      <w:pPr>
+        <w:pStyle w:val="BodyText"/>
+        <w:rPr/>
+      </w:pPr>
+      <w:r>
+        <w:rPr/>
+        <w:t>XXXXX segue into next bit. Reconcile McIntosh 2005 with Gilmore 1923 and Brown 1929 quoted in Dingus 1996.</w:t>
       </w:r>
     </w:p>
     <w:p>
@@ -2283,7 +2382,7 @@
     </w:p>
     <w:p>
       <w:pPr>
-        <w:pStyle w:val="BlockQuotation"/>
+        <w:pStyle w:val="BlockQuotationuser"/>
         <w:rPr/>
       </w:pPr>
       <w:r>
@@ -2846,7 +2945,7 @@
     </w:p>
     <w:p>
       <w:pPr>
-        <w:pStyle w:val="BlockQuotation"/>
+        <w:pStyle w:val="BlockQuotationuser"/>
         <w:rPr/>
       </w:pPr>
       <w:r>
@@ -5820,7 +5919,37 @@
       </w:pPr>
       <w:r>
         <w:rPr/>
-        <w:t>Gilmore, Charles W. 1923. Letter to William de Chastignier Ravenel, “I herewith submit my report on the expedition to the Dinosaur National Monument”. 30 August 1923.</w:t>
+        <w:t>Douglass, Earl, 1922. Report of Work Done by the Carnegie Museum at the Dinosaur Nation</w:t>
+      </w:r>
+      <w:r>
+        <w:rPr/>
+        <w:t>a</w:t>
+      </w:r>
+      <w:r>
+        <w:rPr/>
+        <w:t>l Monument in Uinta County, Ut</w:t>
+      </w:r>
+      <w:r>
+        <w:rPr/>
+        <w:t>a</w:t>
+      </w:r>
+      <w:r>
+        <w:rPr/>
+        <w:t>h, under the Supervision of Earl Dougless, in the year 1922. 2 pages.</w:t>
+      </w:r>
+    </w:p>
+    <w:p>
+      <w:pPr>
+        <w:pStyle w:val="Reference"/>
+        <w:rPr/>
+      </w:pPr>
+      <w:r>
+        <w:rPr/>
+        <w:t xml:space="preserve">Gilmore, Charles W. 1923. Letter to William de Chastignier Ravenel, “I herewith submit my report on the expedition to the Dinosaur National Monument”. 30 August 1923. </w:t>
+      </w:r>
+      <w:r>
+        <w:rPr/>
+        <w:t>3 pages.</w:t>
       </w:r>
     </w:p>
     <w:p>
@@ -7914,7 +8043,7 @@
     </w:p>
     <w:p>
       <w:pPr>
-        <w:pStyle w:val="BlockQuotation"/>
+        <w:pStyle w:val="BlockQuotationuser"/>
         <w:rPr/>
       </w:pPr>
       <w:r>
@@ -7947,7 +8076,7 @@
         <w:pStyle w:val="FigureCaption"/>
         <w:widowControl/>
         <w:suppressAutoHyphens w:val="true"/>
-        <w:overflowPunct w:val="false"/>
+        <w:overflowPunct w:val="true"/>
         <w:bidi w:val="0"/>
         <w:spacing w:lineRule="auto" w:line="276" w:before="0" w:after="142"/>
         <w:ind w:hanging="0" w:left="283" w:right="0"/>
@@ -11344,7 +11473,7 @@
     <w:pPr>
       <w:widowControl/>
       <w:suppressAutoHyphens w:val="true"/>
-      <w:overflowPunct w:val="false"/>
+      <w:overflowPunct w:val="true"/>
       <w:bidi w:val="0"/>
       <w:spacing w:before="0" w:after="0"/>
       <w:ind w:hanging="0" w:left="0" w:right="0"/>
@@ -11451,8 +11580,8 @@
     <w:qFormat/>
     <w:rPr/>
   </w:style>
-  <w:style w:type="character" w:styleId="Bullets">
-    <w:name w:val="Bullets"/>
+  <w:style w:type="character" w:styleId="Bulletsuser">
+    <w:name w:val="Bullets (user)"/>
     <w:qFormat/>
     <w:rPr>
       <w:rFonts w:ascii="OpenSymbol" w:hAnsi="OpenSymbol" w:eastAsia="OpenSymbol" w:cs="OpenSymbol"/>
@@ -11569,8 +11698,8 @@
       <w:i/>
     </w:rPr>
   </w:style>
-  <w:style w:type="paragraph" w:styleId="BlockQuotation">
-    <w:name w:val="Block Quotation"/>
+  <w:style w:type="paragraph" w:styleId="BlockQuotationuser">
+    <w:name w:val="Block Quotation (user)"/>
     <w:basedOn w:val="Normal"/>
     <w:qFormat/>
     <w:pPr>

</xml_diff>

<commit_message>
More of the DNM story
</commit_message>
<xml_diff>
--- a/TaylorEtAl-mounted-barosaurus.docx
+++ b/TaylorEtAl-mounted-barosaurus.docx
@@ -1676,7 +1676,15 @@
       </w:r>
       <w:r>
         <w:rPr/>
-        <w:t>, but has yet to be described in monographic detail. For the remainder of this paper, we will focus on this specimen.</w:t>
+        <w:t xml:space="preserve">, but has yet to be described in monographic detail </w:t>
+      </w:r>
+      <w:r>
+        <w:rPr/>
+        <w:t>(and will not be so described herein)</w:t>
+      </w:r>
+      <w:r>
+        <w:rPr/>
+        <w:t>. For the remainder of this paper, we will focus on this specimen.</w:t>
       </w:r>
     </w:p>
     <w:p>
@@ -1705,8 +1713,407 @@
       </w:pPr>
       <w:r>
         <w:rPr/>
-        <w:t xml:space="preserve">Earl Douglass had first discovered dinosaur fossils at Dinosaur National Monument in 1909 (Gilmore 1932:2), and so had been working the area for a full decade by 1919, when the expedition sponsor Andrew Carnegie died at the age of 83. It was apparent that work at the quarry would soon end without his funding, and Douglass joined the staff of the University of Utah. </w:t>
-      </w:r>
+        <w:t xml:space="preserve">The fossil material of AMNH 6341 comes from the Carnegie Quarry at Dinosaur National Monument, in the north-east corner of Utah. Earl Douglass, a fossil hunter employed by the Carnegie Museum, received a letter on 6 August 1909 from the museum Director William J. Holland saying that “he wished me to dig up Dinosaur bones east of Vernal”. (This and other quotes </w:t>
+      </w:r>
+      <w:r>
+        <w:rPr/>
+        <w:t xml:space="preserve">in this section </w:t>
+      </w:r>
+      <w:r>
+        <w:rPr/>
+        <w:t xml:space="preserve">are from Douglass 1879–1953.) </w:t>
+      </w:r>
+      <w:r>
+        <w:rPr/>
+        <w:t xml:space="preserve">He and Holland had seen a good </w:t>
+      </w:r>
+      <w:r>
+        <w:rPr>
+          <w:i/>
+          <w:iCs/>
+        </w:rPr>
+        <w:t>Diplodocus</w:t>
+      </w:r>
+      <w:r>
+        <w:rPr/>
+        <w:t xml:space="preserve"> femur </w:t>
+      </w:r>
+      <w:r>
+        <w:rPr/>
+        <w:t xml:space="preserve">on an earlier visit to the area </w:t>
+      </w:r>
+      <w:r>
+        <w:rPr/>
+        <w:t>but, a</w:t>
+      </w:r>
+      <w:r>
+        <w:rPr/>
+        <w:t>rriving on 10 August, he found that “</w:t>
+      </w:r>
+      <w:r>
+        <w:rPr/>
+        <w:t>someone had taken the best of the bones that were exposed”</w:t>
+      </w:r>
+      <w:r>
+        <w:rPr/>
+        <w:t>.</w:t>
+      </w:r>
+      <w:r>
+        <w:rPr/>
+        <w:t xml:space="preserve"> On August 1</w:t>
+      </w:r>
+      <w:r>
+        <w:rPr/>
+        <w:t>6</w:t>
+      </w:r>
+      <w:r>
+        <w:rPr/>
+        <w:t xml:space="preserve"> </w:t>
+      </w:r>
+      <w:r>
+        <w:rPr/>
+        <w:t>he wrote “</w:t>
+      </w:r>
+      <w:r>
+        <w:rPr/>
+        <w:t>The bones were terribly broken up and it seemed as if they had been churned up … Felt rather discouraged.”</w:t>
+      </w:r>
+    </w:p>
+    <w:p>
+      <w:pPr>
+        <w:pStyle w:val="BodyText"/>
+        <w:rPr/>
+      </w:pPr>
+      <w:r>
+        <w:rPr/>
+        <w:t>However, the very next day — the 17th and not the 19th as stated by Gilmore (1936:178) — Douglass switched to another area and made an important find: “</w:t>
+      </w:r>
+      <w:r>
+        <w:rPr/>
+        <w:t xml:space="preserve">At last, in the top of the ledge where the softer overlying beds form a divide, a kind of saddle, I saw eight of the tail bones of </w:t>
+      </w:r>
+      <w:r>
+        <w:rPr/>
+        <w:t xml:space="preserve">a </w:t>
+      </w:r>
+      <w:r>
+        <w:rPr>
+          <w:i/>
+          <w:iCs/>
+        </w:rPr>
+        <w:t>Brontosaurus</w:t>
+      </w:r>
+      <w:r>
+        <w:rPr/>
+        <w:t xml:space="preserve"> </w:t>
+      </w:r>
+      <w:r>
+        <w:rPr/>
+        <w:t>in exact position. It was a beautiful sight … several of the vertebra</w:t>
+      </w:r>
+      <w:r>
+        <w:rPr/>
+        <w:t>e</w:t>
+      </w:r>
+      <w:r>
+        <w:rPr/>
+        <w:t xml:space="preserve"> had weathered out and the beautifully petr</w:t>
+      </w:r>
+      <w:r>
+        <w:rPr/>
+        <w:t>i</w:t>
+      </w:r>
+      <w:r>
+        <w:rPr/>
+        <w:t xml:space="preserve">fied centra lay on the ground. It is by far the best looking Dinosaur prospect I have ever found.” </w:t>
+      </w:r>
+      <w:r>
+        <w:rPr/>
+        <w:t xml:space="preserve">[This skeleton, when excavated, would be described by Holland (1915) as </w:t>
+      </w:r>
+      <w:r>
+        <w:rPr/>
+        <w:t xml:space="preserve">CM 3018, </w:t>
+      </w:r>
+      <w:r>
+        <w:rPr/>
+        <w:t xml:space="preserve">the holotype of the new species </w:t>
+      </w:r>
+      <w:r>
+        <w:rPr>
+          <w:i/>
+          <w:iCs/>
+        </w:rPr>
+        <w:t>Apatosaurus</w:t>
+      </w:r>
+      <w:r>
+        <w:rPr/>
+        <w:t xml:space="preserve"> (= </w:t>
+      </w:r>
+      <w:r>
+        <w:rPr>
+          <w:i/>
+          <w:iCs/>
+        </w:rPr>
+        <w:t>Brontosaurus</w:t>
+      </w:r>
+      <w:r>
+        <w:rPr/>
+        <w:t xml:space="preserve"> of Douglass’s usage) </w:t>
+      </w:r>
+      <w:r>
+        <w:rPr>
+          <w:i/>
+          <w:iCs/>
+        </w:rPr>
+        <w:t>louisae</w:t>
+      </w:r>
+      <w:r>
+        <w:rPr/>
+        <w:t>. It would subsequently be mounted in the Carnegie Museum in 19</w:t>
+      </w:r>
+      <w:r>
+        <w:rPr/>
+        <w:t>1</w:t>
+      </w:r>
+      <w:r>
+        <w:rPr/>
+        <w:t>3, and described in detail by Gilmore (1936).]</w:t>
+      </w:r>
+    </w:p>
+    <w:p>
+      <w:pPr>
+        <w:pStyle w:val="BodyText"/>
+        <w:rPr/>
+      </w:pPr>
+      <w:r>
+        <w:rPr/>
+        <w:t xml:space="preserve">As </w:t>
+      </w:r>
+      <w:r>
+        <w:rPr/>
+        <w:t xml:space="preserve">Douglass </w:t>
+      </w:r>
+      <w:r>
+        <w:rPr/>
+        <w:t xml:space="preserve">and his colleagues </w:t>
+      </w:r>
+      <w:r>
+        <w:rPr/>
+        <w:t>excavat</w:t>
+      </w:r>
+      <w:r>
+        <w:rPr/>
+        <w:t xml:space="preserve">ion, it quickly became apparent that there were many more dinosaurs </w:t>
+      </w:r>
+      <w:r>
+        <w:rPr/>
+        <w:t>in the rock</w:t>
+      </w:r>
+      <w:r>
+        <w:rPr/>
+        <w:t xml:space="preserve">. Excavating these fossils now became Douglass’s full-time job </w:t>
+      </w:r>
+      <w:r>
+        <w:rPr/>
+        <w:t>(Figure Q)</w:t>
+      </w:r>
+      <w:r>
+        <w:rPr/>
+        <w:t>. T</w:t>
+      </w:r>
+      <w:r>
+        <w:rPr/>
+        <w:t xml:space="preserve">he Carnegie Quarry, </w:t>
+      </w:r>
+      <w:r>
+        <w:rPr/>
+        <w:t xml:space="preserve">as it was named, would become one of the most fruitful in palaeontological history. </w:t>
+      </w:r>
+      <w:r>
+        <w:rPr/>
+        <w:t xml:space="preserve">The </w:t>
+      </w:r>
+      <w:r>
+        <w:rPr/>
+        <w:t xml:space="preserve">Museum funded the excavations </w:t>
+      </w:r>
+      <w:r>
+        <w:rPr/>
+        <w:t>for 13 years, shipping 700,000 lb of material to Pittsburgh (Gilmore 1936:170) —  318 tonnes.</w:t>
+      </w:r>
+    </w:p>
+    <w:p>
+      <w:pPr>
+        <w:pStyle w:val="BodyText"/>
+        <w:rPr/>
+      </w:pPr>
+      <w:r>
+        <w:rPr/>
+        <w:t>XXX Add references for the following section</w:t>
+      </w:r>
+    </w:p>
+    <w:p>
+      <w:pPr>
+        <w:pStyle w:val="BodyText"/>
+        <w:rPr/>
+      </w:pPr>
+      <w:r>
+        <w:rPr/>
+        <w:t xml:space="preserve">By </w:t>
+      </w:r>
+      <w:r>
+        <w:rPr/>
+        <w:t xml:space="preserve">1922 </w:t>
+      </w:r>
+      <w:r>
+        <w:rPr/>
+        <w:t>the Museum had more fossils from this locality than it could use. Douglas Stewart, Holland’s successor as Director of the Carnegie Museum</w:t>
+      </w:r>
+      <w:r>
+        <w:rPr/>
+        <w:t xml:space="preserve">, evidently favoured turning the quarry over to the USNM, writing to Arthur S. Coggeshall on 6 September, 1922 to acknowledge the latter’s recommendation that Douglass finish the excavation of a Stegosaurus </w:t>
+      </w:r>
+      <w:r>
+        <w:rPr/>
+        <w:t xml:space="preserve">and a small dinosaur skeleton, but to leave two partially exposed specimens of </w:t>
+      </w:r>
+      <w:r>
+        <w:rPr>
+          <w:i/>
+          <w:iCs/>
+        </w:rPr>
+        <w:t>Diplodocus</w:t>
+      </w:r>
+      <w:r>
+        <w:rPr/>
+        <w:t xml:space="preserve"> to the Smithsonian to excavate (Stewart to Coggeshall, 6 September, 1922, </w:t>
+      </w:r>
+      <w:r>
+        <w:rPr/>
+        <w:t>cited by Carpenter 2018:13).</w:t>
+      </w:r>
+    </w:p>
+    <w:p>
+      <w:pPr>
+        <w:pStyle w:val="BodyText"/>
+        <w:rPr/>
+      </w:pPr>
+      <w:r>
+        <w:rPr/>
+        <w:t xml:space="preserve">George Perkins Merrill, Head Curator </w:t>
+      </w:r>
+      <w:r>
+        <w:rPr/>
+        <w:t>of the</w:t>
+      </w:r>
+      <w:r>
+        <w:rPr/>
+        <w:t xml:space="preserve"> Department of Geology </w:t>
+      </w:r>
+      <w:r>
+        <w:rPr/>
+        <w:t>at the USNM</w:t>
+      </w:r>
+      <w:r>
+        <w:rPr/>
+        <w:t xml:space="preserve">, </w:t>
+      </w:r>
+      <w:r>
+        <w:rPr/>
+        <w:t xml:space="preserve">learned from </w:t>
+      </w:r>
+      <w:r>
+        <w:rPr/>
+        <w:t>Stewart</w:t>
+      </w:r>
+      <w:r>
+        <w:rPr/>
+        <w:t xml:space="preserve"> that the Carnegie Museum was ready to relinquish its claim, and wrote on 6 November 1922 to William de Chastignier Ravenel, Secretary of the USNM, </w:t>
+      </w:r>
+      <w:r>
+        <w:rPr/>
+        <w:t xml:space="preserve">urging him to take on the quarry as “There are few </w:t>
+      </w:r>
+      <w:r>
+        <w:rPr/>
+        <w:t xml:space="preserve">objects that would yield greater attractiveness to the main hall of this department than the restored skeleton of one of the monsters of the dinosaur group that these beds yield” </w:t>
+      </w:r>
+      <w:r>
+        <w:rPr/>
+        <w:t xml:space="preserve">(Merrill 1922). </w:t>
+      </w:r>
+      <w:r>
+        <w:rPr/>
+        <w:t>[By coincidence, the next day Stewart wrote to Merrill to confirm the offer and provide details (Stewart 1922).]</w:t>
+      </w:r>
+    </w:p>
+    <w:p>
+      <w:pPr>
+        <w:pStyle w:val="BodyText"/>
+        <w:rPr/>
+      </w:pPr>
+      <w:r>
+        <w:rPr/>
+        <w:t xml:space="preserve">On 11 November, Merrill wrote to Earl Douglass requesting technical and logistical information and Douglass replied on 22 November (Douglass 1922b) </w:t>
+      </w:r>
+      <w:r>
+        <w:rPr/>
+        <w:t xml:space="preserve">with a long and helpful letter </w:t>
+      </w:r>
+      <w:r>
+        <w:rPr/>
+        <w:t xml:space="preserve">explaining how two </w:t>
+      </w:r>
+      <w:r>
+        <w:rPr/>
+        <w:t xml:space="preserve">sauropod </w:t>
+      </w:r>
+      <w:r>
+        <w:rPr/>
+        <w:t xml:space="preserve">skeletons, </w:t>
+      </w:r>
+      <w:r>
+        <w:rPr/>
+        <w:t xml:space="preserve">both thought to be </w:t>
+      </w:r>
+      <w:r>
+        <w:rPr>
+          <w:i/>
+          <w:iCs/>
+        </w:rPr>
+        <w:t>Diplodocus</w:t>
+      </w:r>
+      <w:r>
+        <w:rPr/>
+        <w:t xml:space="preserve">, were positioned — </w:t>
+      </w:r>
+      <w:r>
+        <w:rPr/>
+        <w:t>#</w:t>
+      </w:r>
+      <w:r>
+        <w:rPr/>
+        <w:t xml:space="preserve">355 and </w:t>
+      </w:r>
+      <w:r>
+        <w:rPr/>
+        <w:t>#</w:t>
+      </w:r>
+      <w:r>
+        <w:rPr/>
+        <w:t xml:space="preserve">340, the former lying partly above the latter (Figure P); </w:t>
+      </w:r>
+      <w:r>
+        <w:rPr/>
+        <w:t xml:space="preserve">and stating that blocks containing most of the neck of #340 had been taken out of the quarry. </w:t>
+      </w:r>
+    </w:p>
+    <w:p>
+      <w:pPr>
+        <w:pStyle w:val="BodyText"/>
+        <w:rPr/>
+      </w:pPr>
       <w:r>
         <w:rPr/>
         <w:t xml:space="preserve">By the end of the 1922 season, “all but two skeletons — those of </w:t>
@@ -1720,7 +2127,15 @@
       </w:r>
       <w:r>
         <w:rPr/>
-        <w:t xml:space="preserve"> — were removed” (Douglass 1922). Douglass listed 10 skeletons that had been partly or completely taken out during the year. Among those listed was “No. 340 — </w:t>
+        <w:t xml:space="preserve"> — were removed” (Douglass 192</w:t>
+      </w:r>
+      <w:r>
+        <w:rPr/>
+        <w:t>3</w:t>
+      </w:r>
+      <w:r>
+        <w:rPr/>
+        <w:t>). Douglass listed 10 skeletons that had been partly or completely taken out during the year. Among those listed was “No. 340 — </w:t>
       </w:r>
       <w:r>
         <w:rPr>
@@ -1731,11 +2146,15 @@
       </w:r>
       <w:r>
         <w:rPr/>
-        <w:t>. Apparently neerly complete skele</w:t>
-      </w:r>
-      <w:r>
-        <w:rPr/>
-        <w:t>ton but only ne</w:t>
+        <w:t>. Apparently ne</w:t>
+      </w:r>
+      <w:r>
+        <w:rPr/>
+        <w:t>a</w:t>
+      </w:r>
+      <w:r>
+        <w:rPr/>
+        <w:t>rly complete skeleton but only neck taken out. The remainder still in the ledge” (Douglass 1922</w:t>
       </w:r>
       <w:r>
         <w:rPr/>
@@ -1743,19 +2162,7 @@
       </w:r>
       <w:r>
         <w:rPr/>
-        <w:t>k taken out. The rem</w:t>
-      </w:r>
-      <w:r>
-        <w:rPr/>
-        <w:t>a</w:t>
-      </w:r>
-      <w:r>
-        <w:rPr/>
-        <w:t xml:space="preserve">inder still in the ledge” </w:t>
-      </w:r>
-      <w:r>
-        <w:rPr/>
-        <w:t>(Douglass 1922).</w:t>
+        <w:t>).</w:t>
       </w:r>
     </w:p>
     <w:p>
@@ -1765,15 +2172,7 @@
       </w:pPr>
       <w:r>
         <w:rPr/>
-        <w:t xml:space="preserve">Charles W. Gilmore arrived at the quarry on 14 May 1923 to work it for the USNM and was shown around by Douglass, who was about to leave for Colorado (Gilmore 1923). Gilmore inherited two partially uncovered skeletons, both </w:t>
-      </w:r>
-      <w:r>
-        <w:rPr/>
-        <w:t xml:space="preserve">then </w:t>
-      </w:r>
-      <w:r>
-        <w:rPr/>
-        <w:t xml:space="preserve">thought to be </w:t>
+        <w:t xml:space="preserve">Charles W. Gilmore arrived at the quarry on 14 May 1923 to work it for the USNM and was shown around by Douglass, who was about to leave for Colorado (Gilmore 1923). Gilmore inherited two partially uncovered skeletons, both then thought to be </w:t>
       </w:r>
       <w:r>
         <w:rPr>
@@ -1784,19 +2183,7 @@
       </w:r>
       <w:r>
         <w:rPr/>
-        <w:t>: #</w:t>
-      </w:r>
-      <w:r>
-        <w:rPr/>
-        <w:t>340, as mentioned in Douglass’s report, and #</w:t>
-      </w:r>
-      <w:r>
-        <w:rPr/>
-        <w:t xml:space="preserve">355, </w:t>
-      </w:r>
-      <w:r>
-        <w:rPr/>
-        <w:t xml:space="preserve">presumably one of the two </w:t>
+        <w:t xml:space="preserve">: #340, as mentioned in Douglass’s report, and #355, presumably one of the two </w:t>
       </w:r>
       <w:r>
         <w:rPr>
@@ -1817,19 +2204,37 @@
       </w:pPr>
       <w:r>
         <w:rPr/>
-        <w:t xml:space="preserve">It was Gilmore’s intention to extract #355 (the most complete </w:t>
-      </w:r>
-      <w:r>
-        <w:rPr/>
-        <w:t>of the two</w:t>
-      </w:r>
-      <w:r>
-        <w:rPr/>
-        <w:t xml:space="preserve">) for the USNM, then secure the parts of #340 necessary to complete the skeleton (Gilmore 1923). (#355 was subsequently accessioned as USNM 10865 and mounted in Washington D.C, where it remains in the public gallery to this day.). Douglass handed over to Gilmore four large blocks and several smaller ones containing much of the neck of #340, </w:t>
-      </w:r>
-      <w:r>
-        <w:rPr/>
-        <w:t>which has been extracted from the quarry as noted above but not prepared out.</w:t>
+        <w:t>Douglass handed over to Gilmore four large blocks and several smaller ones containing much of the neck of #340, which ha</w:t>
+      </w:r>
+      <w:r>
+        <w:rPr/>
+        <w:t>d</w:t>
+      </w:r>
+      <w:r>
+        <w:rPr/>
+        <w:t xml:space="preserve"> been extracted from the quarry as noted above but not prepared out. It was Gilmore’s intention to extract #355 (the most complete of the two) for the USNM, then secure the parts of #340 necessary to complete the skeleton (Gilmore 1923). (#355 was subsequently accessioned as USNM 10865 and mounted in Washington D.C, where it remains in the public gallery to this day; </w:t>
+      </w:r>
+      <w:r>
+        <w:rPr/>
+        <w:t>missing elements were supplied as plaster casts by the Carnegie Museum</w:t>
+      </w:r>
+      <w:r>
+        <w:rPr/>
+        <w:t xml:space="preserve">). </w:t>
+      </w:r>
+    </w:p>
+    <w:p>
+      <w:pPr>
+        <w:pStyle w:val="BodyText"/>
+        <w:rPr/>
+      </w:pPr>
+      <w:r>
+        <w:rPr/>
+        <w:t xml:space="preserve">On 8 August 1923, Gilmore wrote briefly to Ravenel to say that work in the quarry was complete and the extracted blocks would be shipped to the USNM soon after 19 August (Gilmore 1923a), and send a more comprehensive report in 30 August (Gilmore 1923b). </w:t>
+      </w:r>
+      <w:r>
+        <w:rPr/>
+        <w:t>In 1924, all excavation at the quarry ended.</w:t>
       </w:r>
     </w:p>
     <w:p>
@@ -2382,7 +2787,7 @@
     </w:p>
     <w:p>
       <w:pPr>
-        <w:pStyle w:val="BlockQuotationuser"/>
+        <w:pStyle w:val="BlockQuotation"/>
         <w:rPr/>
       </w:pPr>
       <w:r>
@@ -2945,7 +3350,7 @@
     </w:p>
     <w:p>
       <w:pPr>
-        <w:pStyle w:val="BlockQuotationuser"/>
+        <w:pStyle w:val="BlockQuotation"/>
         <w:rPr/>
       </w:pPr>
       <w:r>
@@ -5919,23 +6324,19 @@
       </w:pPr>
       <w:r>
         <w:rPr/>
-        <w:t>Douglass, Earl, 1922. Report of Work Done by the Carnegie Museum at the Dinosaur Nation</w:t>
-      </w:r>
-      <w:r>
-        <w:rPr/>
-        <w:t>a</w:t>
-      </w:r>
-      <w:r>
-        <w:rPr/>
-        <w:t>l Monument in Uinta County, Ut</w:t>
-      </w:r>
-      <w:r>
-        <w:rPr/>
-        <w:t>a</w:t>
-      </w:r>
-      <w:r>
-        <w:rPr/>
-        <w:t>h, under the Supervision of Earl Dougless, in the year 1922. 2 pages.</w:t>
+        <w:t xml:space="preserve">Douglass, Earl. 1879–1953. Earl Douglass papers, 1879–1953. Collected by University of Utah Libraries, Special Collections; Excepted by Archives West. </w:t>
+      </w:r>
+      <w:hyperlink r:id="rId8">
+        <w:r>
+          <w:rPr>
+            <w:rStyle w:val="Hyperlink"/>
+          </w:rPr>
+          <w:t>https://archiveswest.orbiscascade.org/ark:80444/xv14910</w:t>
+        </w:r>
+      </w:hyperlink>
+      <w:r>
+        <w:rPr/>
+        <w:t xml:space="preserve"> </w:t>
       </w:r>
     </w:p>
     <w:p>
@@ -5945,11 +6346,33 @@
       </w:pPr>
       <w:r>
         <w:rPr/>
-        <w:t xml:space="preserve">Gilmore, Charles W. 1923. Letter to William de Chastignier Ravenel, “I herewith submit my report on the expedition to the Dinosaur National Monument”. 30 August 1923. </w:t>
-      </w:r>
-      <w:r>
-        <w:rPr/>
-        <w:t>3 pages.</w:t>
+        <w:t>Douglass, Earl, 192</w:t>
+      </w:r>
+      <w:r>
+        <w:rPr/>
+        <w:t>3</w:t>
+      </w:r>
+      <w:r>
+        <w:rPr/>
+        <w:t xml:space="preserve">. Report of Work Done by the Carnegie Museum at the Dinosaur National Monument in Uinta County, Utah, under the Supervision of Earl Dougless, in the year 1922. </w:t>
+      </w:r>
+      <w:r>
+        <w:rPr/>
+        <w:t xml:space="preserve">24 March 1923. </w:t>
+      </w:r>
+      <w:r>
+        <w:rPr/>
+        <w:t>2 pages.</w:t>
+      </w:r>
+    </w:p>
+    <w:p>
+      <w:pPr>
+        <w:pStyle w:val="Reference"/>
+        <w:rPr/>
+      </w:pPr>
+      <w:r>
+        <w:rPr/>
+        <w:t>Gilmore, Charles W. 1923. Letter to William de Chastignier Ravenel, “I herewith submit my report on the expedition to the Dinosaur National Monument”. 30 August 1923. 3 pages.</w:t>
       </w:r>
     </w:p>
     <w:p>
@@ -6004,14 +6427,25 @@
       </w:pPr>
       <w:r>
         <w:rPr/>
-        <w:t xml:space="preserve">Gordy, Molly. Dinosaur’s Last Stand? Exhibit’s pose is all wrong, experts assert. 1991. </w:t>
-      </w:r>
-      <w:r>
-        <w:rPr>
-          <w:i/>
-          <w:iCs/>
-        </w:rPr>
-        <w:t>New York Newsday</w:t>
+        <w:t xml:space="preserve">Gilmore, Charles W. 1936. Osteology of </w:t>
+      </w:r>
+      <w:r>
+        <w:rPr>
+          <w:i/>
+          <w:iCs/>
+        </w:rPr>
+        <w:t>Apatosaurus</w:t>
+      </w:r>
+      <w:r>
+        <w:rPr/>
+        <w:t xml:space="preserve"> with special reference to specimens in the Carnegie Museum. </w:t>
+      </w:r>
+      <w:r>
+        <w:rPr>
+          <w:i/>
+          <w:iCs/>
+        </w:rPr>
+        <w:t>Memoirs of the Carnegie Museum</w:t>
       </w:r>
       <w:r>
         <w:rPr/>
@@ -6022,11 +6456,11 @@
           <w:b/>
           <w:bCs/>
         </w:rPr>
-        <w:t>52(88)</w:t>
-      </w:r>
-      <w:r>
-        <w:rPr/>
-        <w:t xml:space="preserve"> for 29 November 1991:3, 27.</w:t>
+        <w:t>11</w:t>
+      </w:r>
+      <w:r>
+        <w:rPr/>
+        <w:t>:175–300 and plates XXI–XXXIV.</w:t>
       </w:r>
     </w:p>
     <w:p>
@@ -6036,25 +6470,14 @@
       </w:pPr>
       <w:r>
         <w:rPr/>
-        <w:t xml:space="preserve">Hatcher, John B. 1901. </w:t>
-      </w:r>
-      <w:r>
-        <w:rPr>
-          <w:i/>
-          <w:iCs/>
-        </w:rPr>
-        <w:t>Diplodocus</w:t>
-      </w:r>
-      <w:r>
-        <w:rPr/>
-        <w:t xml:space="preserve"> (Marsh): its osteology, taxonomy and probable habits, with a restoration of the skeleton. </w:t>
-      </w:r>
-      <w:r>
-        <w:rPr>
-          <w:i/>
-          <w:iCs/>
-        </w:rPr>
-        <w:t>Memoirs of the Carnegie Museum</w:t>
+        <w:t xml:space="preserve">Gordy, Molly. Dinosaur’s Last Stand? Exhibit’s pose is all wrong, experts assert. 1991. </w:t>
+      </w:r>
+      <w:r>
+        <w:rPr>
+          <w:i/>
+          <w:iCs/>
+        </w:rPr>
+        <w:t>New York Newsday</w:t>
       </w:r>
       <w:r>
         <w:rPr/>
@@ -6065,11 +6488,11 @@
           <w:b/>
           <w:bCs/>
         </w:rPr>
-        <w:t>1</w:t>
-      </w:r>
-      <w:r>
-        <w:rPr/>
-        <w:t>:1–63 and plates I–XIII.</w:t>
+        <w:t>52(88)</w:t>
+      </w:r>
+      <w:r>
+        <w:rPr/>
+        <w:t xml:space="preserve"> for 29 November 1991:3, 27.</w:t>
       </w:r>
     </w:p>
     <w:p>
@@ -6079,7 +6502,7 @@
       </w:pPr>
       <w:r>
         <w:rPr/>
-        <w:t xml:space="preserve">Hay, Oliver P. 1908. On the habits and the pose of the sauropodous dinosaurs, especially of </w:t>
+        <w:t xml:space="preserve">Hatcher, John B. 1901. </w:t>
       </w:r>
       <w:r>
         <w:rPr>
@@ -6090,14 +6513,14 @@
       </w:r>
       <w:r>
         <w:rPr/>
-        <w:t xml:space="preserve">. </w:t>
-      </w:r>
-      <w:r>
-        <w:rPr>
-          <w:i/>
-          <w:iCs/>
-        </w:rPr>
-        <w:t>The American Naturalist</w:t>
+        <w:t xml:space="preserve"> (Marsh): its osteology, taxonomy and probable habits, with a restoration of the skeleton. </w:t>
+      </w:r>
+      <w:r>
+        <w:rPr>
+          <w:i/>
+          <w:iCs/>
+        </w:rPr>
+        <w:t>Memoirs of the Carnegie Museum</w:t>
       </w:r>
       <w:r>
         <w:rPr/>
@@ -6108,11 +6531,11 @@
           <w:b/>
           <w:bCs/>
         </w:rPr>
-        <w:t>42</w:t>
-      </w:r>
-      <w:r>
-        <w:rPr/>
-        <w:t>:672–681.</w:t>
+        <w:t>1</w:t>
+      </w:r>
+      <w:r>
+        <w:rPr/>
+        <w:t>:1–63 and plates I–XIII.</w:t>
       </w:r>
     </w:p>
     <w:p>
@@ -6122,7 +6545,7 @@
       </w:pPr>
       <w:r>
         <w:rPr/>
-        <w:t xml:space="preserve">Hay, Oliver P. 1910. On the manner of locomotion of the dinosaurs, especially </w:t>
+        <w:t xml:space="preserve">Hay, Oliver P. 1908. On the habits and the pose of the sauropodous dinosaurs, especially of </w:t>
       </w:r>
       <w:r>
         <w:rPr>
@@ -6133,14 +6556,14 @@
       </w:r>
       <w:r>
         <w:rPr/>
-        <w:t xml:space="preserve">, with remarks on the origin of birds. </w:t>
-      </w:r>
-      <w:r>
-        <w:rPr>
-          <w:i/>
-          <w:iCs/>
-        </w:rPr>
-        <w:t>Proceedings of the Washington Academy of Sciences</w:t>
+        <w:t xml:space="preserve">. </w:t>
+      </w:r>
+      <w:r>
+        <w:rPr>
+          <w:i/>
+          <w:iCs/>
+        </w:rPr>
+        <w:t>The American Naturalist</w:t>
       </w:r>
       <w:r>
         <w:rPr/>
@@ -6151,11 +6574,11 @@
           <w:b/>
           <w:bCs/>
         </w:rPr>
-        <w:t>12</w:t>
-      </w:r>
-      <w:r>
-        <w:rPr/>
-        <w:t>:1–25.</w:t>
+        <w:t>42</w:t>
+      </w:r>
+      <w:r>
+        <w:rPr/>
+        <w:t>:672–681.</w:t>
       </w:r>
     </w:p>
     <w:p>
@@ -6165,25 +6588,25 @@
       </w:pPr>
       <w:r>
         <w:rPr/>
-        <w:t xml:space="preserve">Hicks, James W., and Henry S. Badeer. 1992. </w:t>
-      </w:r>
-      <w:r>
-        <w:rPr>
-          <w:i/>
-          <w:iCs/>
-        </w:rPr>
-        <w:t>Barosaurus</w:t>
-      </w:r>
-      <w:r>
-        <w:rPr/>
-        <w:t xml:space="preserve"> and its circulation. </w:t>
-      </w:r>
-      <w:r>
-        <w:rPr>
-          <w:i/>
-          <w:iCs/>
-        </w:rPr>
-        <w:t>The Lancet</w:t>
+        <w:t xml:space="preserve">Hay, Oliver P. 1910. On the manner of locomotion of the dinosaurs, especially </w:t>
+      </w:r>
+      <w:r>
+        <w:rPr>
+          <w:i/>
+          <w:iCs/>
+        </w:rPr>
+        <w:t>Diplodocus</w:t>
+      </w:r>
+      <w:r>
+        <w:rPr/>
+        <w:t xml:space="preserve">, with remarks on the origin of birds. </w:t>
+      </w:r>
+      <w:r>
+        <w:rPr>
+          <w:i/>
+          <w:iCs/>
+        </w:rPr>
+        <w:t>Proceedings of the Washington Academy of Sciences</w:t>
       </w:r>
       <w:r>
         <w:rPr/>
@@ -6194,11 +6617,11 @@
           <w:b/>
           <w:bCs/>
         </w:rPr>
-        <w:t>340</w:t>
-      </w:r>
-      <w:r>
-        <w:rPr/>
-        <w:t>:1229.</w:t>
+        <w:t>12</w:t>
+      </w:r>
+      <w:r>
+        <w:rPr/>
+        <w:t>:1–25.</w:t>
       </w:r>
     </w:p>
     <w:p>
@@ -6208,36 +6631,25 @@
       </w:pPr>
       <w:r>
         <w:rPr/>
-        <w:t xml:space="preserve">Holland, William J. 1906. Osteology of </w:t>
-      </w:r>
-      <w:r>
-        <w:rPr>
-          <w:i/>
-          <w:iCs/>
-        </w:rPr>
-        <w:t>Diplodocus</w:t>
-      </w:r>
-      <w:r>
-        <w:rPr/>
-        <w:t xml:space="preserve"> Marsh with special reference to the restoration of the skeleton of </w:t>
-      </w:r>
-      <w:r>
-        <w:rPr>
-          <w:i/>
-          <w:iCs/>
-        </w:rPr>
-        <w:t>Diplodocus carnegiei</w:t>
-      </w:r>
-      <w:r>
-        <w:rPr/>
-        <w:t xml:space="preserve"> [sic] Hatcher presented by Mr. Andrew Carnegie to the British Museum, May 12 1905. </w:t>
-      </w:r>
-      <w:r>
-        <w:rPr>
-          <w:i/>
-          <w:iCs/>
-        </w:rPr>
-        <w:t>Memoirs of the Carnegie Museum</w:t>
+        <w:t xml:space="preserve">Hicks, James W., and Henry S. Badeer. 1992. </w:t>
+      </w:r>
+      <w:r>
+        <w:rPr>
+          <w:i/>
+          <w:iCs/>
+        </w:rPr>
+        <w:t>Barosaurus</w:t>
+      </w:r>
+      <w:r>
+        <w:rPr/>
+        <w:t xml:space="preserve"> and its circulation. </w:t>
+      </w:r>
+      <w:r>
+        <w:rPr>
+          <w:i/>
+          <w:iCs/>
+        </w:rPr>
+        <w:t>The Lancet</w:t>
       </w:r>
       <w:r>
         <w:rPr/>
@@ -6248,11 +6660,108 @@
           <w:b/>
           <w:bCs/>
         </w:rPr>
+        <w:t>340</w:t>
+      </w:r>
+      <w:r>
+        <w:rPr/>
+        <w:t>:1229.</w:t>
+      </w:r>
+    </w:p>
+    <w:p>
+      <w:pPr>
+        <w:pStyle w:val="Reference"/>
+        <w:rPr/>
+      </w:pPr>
+      <w:r>
+        <w:rPr/>
+        <w:t xml:space="preserve">Holland, William J. 1906. Osteology of </w:t>
+      </w:r>
+      <w:r>
+        <w:rPr>
+          <w:i/>
+          <w:iCs/>
+        </w:rPr>
+        <w:t>Diplodocus</w:t>
+      </w:r>
+      <w:r>
+        <w:rPr/>
+        <w:t xml:space="preserve"> Marsh with special reference to the restoration of the skeleton of </w:t>
+      </w:r>
+      <w:r>
+        <w:rPr>
+          <w:i/>
+          <w:iCs/>
+        </w:rPr>
+        <w:t>Diplodocus carnegiei</w:t>
+      </w:r>
+      <w:r>
+        <w:rPr/>
+        <w:t xml:space="preserve"> [sic] Hatcher presented by Mr. Andrew Carnegie to the British Museum, May 12 1905. </w:t>
+      </w:r>
+      <w:r>
+        <w:rPr>
+          <w:i/>
+          <w:iCs/>
+        </w:rPr>
+        <w:t>Memoirs of the Carnegie Museum</w:t>
+      </w:r>
+      <w:r>
+        <w:rPr/>
+        <w:t xml:space="preserve"> </w:t>
+      </w:r>
+      <w:r>
+        <w:rPr>
+          <w:b/>
+          <w:bCs/>
+        </w:rPr>
         <w:t>2(6)</w:t>
       </w:r>
       <w:r>
         <w:rPr/>
         <w:t>:225–278.</w:t>
+      </w:r>
+    </w:p>
+    <w:p>
+      <w:pPr>
+        <w:pStyle w:val="Reference"/>
+        <w:rPr/>
+      </w:pPr>
+      <w:r>
+        <w:rPr/>
+        <w:t xml:space="preserve">Holland, William. J. 1915. A new species of </w:t>
+      </w:r>
+      <w:r>
+        <w:rPr>
+          <w:i/>
+          <w:iCs/>
+        </w:rPr>
+        <w:t>Apatosaurus</w:t>
+      </w:r>
+      <w:r>
+        <w:rPr/>
+        <w:t xml:space="preserve">. </w:t>
+      </w:r>
+      <w:r>
+        <w:rPr>
+          <w:i/>
+          <w:iCs/>
+        </w:rPr>
+        <w:t>Annals of the Carnegie Museum</w:t>
+      </w:r>
+      <w:r>
+        <w:rPr/>
+        <w:t xml:space="preserve"> </w:t>
+      </w:r>
+      <w:r>
+        <w:rPr>
+          <w:b/>
+          <w:bCs/>
+        </w:rPr>
+        <w:t>10</w:t>
+      </w:r>
+      <w:r>
+        <w:rPr/>
+        <w:t>:143–145.</w:t>
       </w:r>
     </w:p>
     <w:p>
@@ -6920,7 +7429,7 @@
         <w:rPr/>
         <w:t xml:space="preserve">:36-41. </w:t>
       </w:r>
-      <w:hyperlink r:id="rId8">
+      <w:hyperlink r:id="rId9">
         <w:r>
           <w:rPr>
             <w:rStyle w:val="Hyperlink"/>
@@ -7201,7 +7710,7 @@
         <w:rPr/>
         <w:t xml:space="preserve">Smith, Adam S. (with contributions from 20 other authors). 2007. Dinosaur Toy Blog. </w:t>
       </w:r>
-      <w:hyperlink r:id="rId9">
+      <w:hyperlink r:id="rId10">
         <w:r>
           <w:rPr>
             <w:rStyle w:val="Hyperlink"/>
@@ -7294,7 +7803,7 @@
         <w:rPr/>
         <w:t xml:space="preserve"> from Utah and Colorado, USA. </w:t>
       </w:r>
-      <w:hyperlink r:id="rId10">
+      <w:hyperlink r:id="rId11">
         <w:r>
           <w:rPr>
             <w:rStyle w:val="Hyperlink"/>
@@ -7409,7 +7918,7 @@
         <w:rPr/>
         <w:t xml:space="preserve">Preprint doi:10.5281/zenodo.13732377 — available at </w:t>
       </w:r>
-      <w:hyperlink r:id="rId11">
+      <w:hyperlink r:id="rId12">
         <w:r>
           <w:rPr>
             <w:rStyle w:val="Hyperlink"/>
@@ -7492,7 +8001,7 @@
         <w:rPr/>
         <w:t xml:space="preserve">:e857. </w:t>
       </w:r>
-      <w:hyperlink r:id="rId12">
+      <w:hyperlink r:id="rId13">
         <w:r>
           <w:rPr>
             <w:rStyle w:val="Hyperlink"/>
@@ -8043,7 +8552,7 @@
     </w:p>
     <w:p>
       <w:pPr>
-        <w:pStyle w:val="BlockQuotationuser"/>
+        <w:pStyle w:val="BlockQuotation"/>
         <w:rPr/>
       </w:pPr>
       <w:r>
@@ -8076,7 +8585,7 @@
         <w:pStyle w:val="FigureCaption"/>
         <w:widowControl/>
         <w:suppressAutoHyphens w:val="true"/>
-        <w:overflowPunct w:val="true"/>
+        <w:overflowPunct w:val="false"/>
         <w:bidi w:val="0"/>
         <w:spacing w:lineRule="auto" w:line="276" w:before="0" w:after="142"/>
         <w:ind w:hanging="0" w:left="283" w:right="0"/>
@@ -8371,20 +8880,243 @@
     </w:p>
     <w:p>
       <w:pPr>
-        <w:pStyle w:val="Heading1"/>
-        <w:rPr/>
-      </w:pPr>
-      <w:r>
-        <w:rPr/>
-      </w:r>
-    </w:p>
-    <w:p>
-      <w:pPr>
-        <w:pStyle w:val="Heading1"/>
-        <w:rPr/>
-      </w:pPr>
-      <w:r>
-        <w:rPr/>
+        <w:pStyle w:val="FigureCaption"/>
+        <w:bidi w:val="0"/>
+        <w:spacing w:before="0" w:after="142"/>
+        <w:jc w:val="left"/>
+        <w:rPr/>
+      </w:pPr>
+      <w:r>
+        <w:rPr>
+          <w:b/>
+          <w:bCs/>
+        </w:rPr>
+        <w:t>Figure P.</w:t>
+      </w:r>
+      <w:r>
+        <w:rPr>
+          <w:b w:val="false"/>
+          <w:bCs w:val="false"/>
+          <w:i w:val="false"/>
+          <w:iCs w:val="false"/>
+        </w:rPr>
+        <w:t xml:space="preserve"> Carnegie Quarry map showing the relative positions of </w:t>
+      </w:r>
+      <w:r>
+        <w:rPr>
+          <w:b w:val="false"/>
+          <w:bCs w:val="false"/>
+          <w:i w:val="false"/>
+          <w:iCs w:val="false"/>
+        </w:rPr>
+        <w:t>two iconic sauropod specimens:</w:t>
+      </w:r>
+      <w:r>
+        <w:rPr>
+          <w:b w:val="false"/>
+          <w:bCs w:val="false"/>
+          <w:i w:val="false"/>
+          <w:iCs w:val="false"/>
+        </w:rPr>
+        <w:t xml:space="preserve"> #355 (</w:t>
+      </w:r>
+      <w:r>
+        <w:rPr>
+          <w:b w:val="false"/>
+          <w:bCs w:val="false"/>
+          <w:i/>
+          <w:iCs/>
+        </w:rPr>
+        <w:t>Diplodocus</w:t>
+      </w:r>
+      <w:r>
+        <w:rPr>
+          <w:b w:val="false"/>
+          <w:bCs w:val="false"/>
+          <w:i w:val="false"/>
+          <w:iCs w:val="false"/>
+        </w:rPr>
+        <w:t>, right) and #340 (</w:t>
+      </w:r>
+      <w:r>
+        <w:rPr>
+          <w:b w:val="false"/>
+          <w:bCs w:val="false"/>
+          <w:i/>
+          <w:iCs/>
+        </w:rPr>
+        <w:t>Barosaurus</w:t>
+      </w:r>
+      <w:r>
+        <w:rPr>
+          <w:b w:val="false"/>
+          <w:bCs w:val="false"/>
+          <w:i w:val="false"/>
+          <w:iCs w:val="false"/>
+        </w:rPr>
+        <w:t xml:space="preserve">, left, highlighted in pink, initially thought to be be a second </w:t>
+      </w:r>
+      <w:r>
+        <w:rPr>
+          <w:b w:val="false"/>
+          <w:bCs w:val="false"/>
+          <w:i/>
+          <w:iCs/>
+        </w:rPr>
+        <w:t>Diplodocus</w:t>
+      </w:r>
+      <w:r>
+        <w:rPr>
+          <w:b w:val="false"/>
+          <w:bCs w:val="false"/>
+          <w:i w:val="false"/>
+          <w:iCs w:val="false"/>
+        </w:rPr>
+        <w:t xml:space="preserve">). Modified from Gilmore (1932:figure 1). The </w:t>
+      </w:r>
+      <w:r>
+        <w:rPr>
+          <w:b w:val="false"/>
+          <w:bCs w:val="false"/>
+          <w:i/>
+          <w:iCs/>
+        </w:rPr>
+        <w:t>Diplodocus</w:t>
+      </w:r>
+      <w:r>
+        <w:rPr>
+          <w:b w:val="false"/>
+          <w:bCs w:val="false"/>
+          <w:i w:val="false"/>
+          <w:iCs w:val="false"/>
+        </w:rPr>
+        <w:t xml:space="preserve"> specimen would become USNM 10865, and the </w:t>
+      </w:r>
+      <w:r>
+        <w:rPr>
+          <w:b w:val="false"/>
+          <w:bCs w:val="false"/>
+          <w:i/>
+          <w:iCs/>
+        </w:rPr>
+        <w:t>Barosaurus</w:t>
+      </w:r>
+      <w:r>
+        <w:rPr>
+          <w:b w:val="false"/>
+          <w:bCs w:val="false"/>
+          <w:i w:val="false"/>
+          <w:iCs w:val="false"/>
+        </w:rPr>
+        <w:t xml:space="preserve"> </w:t>
+      </w:r>
+      <w:r>
+        <w:rPr>
+          <w:b w:val="false"/>
+          <w:bCs w:val="false"/>
+          <w:i w:val="false"/>
+          <w:iCs w:val="false"/>
+        </w:rPr>
+        <w:t xml:space="preserve">would become </w:t>
+      </w:r>
+      <w:r>
+        <w:rPr>
+          <w:b w:val="false"/>
+          <w:bCs w:val="false"/>
+          <w:i w:val="false"/>
+          <w:iCs w:val="false"/>
+        </w:rPr>
+        <w:t>AMNH 6341.</w:t>
+      </w:r>
+    </w:p>
+    <w:p>
+      <w:pPr>
+        <w:pStyle w:val="FigureCaption"/>
+        <w:bidi w:val="0"/>
+        <w:spacing w:before="0" w:after="142"/>
+        <w:jc w:val="left"/>
+        <w:rPr>
+          <w:b w:val="false"/>
+          <w:bCs w:val="false"/>
+          <w:i w:val="false"/>
+          <w:iCs w:val="false"/>
+        </w:rPr>
+      </w:pPr>
+      <w:r>
+        <w:rPr>
+          <w:b/>
+          <w:bCs/>
+          <w:i w:val="false"/>
+          <w:iCs w:val="false"/>
+        </w:rPr>
+        <w:t>Figure Q.</w:t>
+      </w:r>
+      <w:r>
+        <w:rPr>
+          <w:b w:val="false"/>
+          <w:bCs w:val="false"/>
+          <w:i w:val="false"/>
+          <w:iCs w:val="false"/>
+        </w:rPr>
+        <w:t xml:space="preserve"> Earl Douglass, aged 60, at the Carnegie Quarry in August 1922. He is seen here standing in front of the left femur of </w:t>
+      </w:r>
+      <w:r>
+        <w:rPr>
+          <w:b w:val="false"/>
+          <w:bCs w:val="false"/>
+          <w:i/>
+          <w:iCs/>
+        </w:rPr>
+        <w:t>Diplodocus</w:t>
+      </w:r>
+      <w:r>
+        <w:rPr>
+          <w:b w:val="false"/>
+          <w:bCs w:val="false"/>
+          <w:i w:val="false"/>
+          <w:iCs w:val="false"/>
+        </w:rPr>
+        <w:t xml:space="preserve"> specimen #355, with the sacrum, partial left ilium last five dorsal vertebral centra and some ribs also in view (compare Figure P). The </w:t>
+      </w:r>
+      <w:r>
+        <w:rPr>
+          <w:b w:val="false"/>
+          <w:bCs w:val="false"/>
+          <w:i/>
+          <w:iCs/>
+        </w:rPr>
+        <w:t>Diplodocus</w:t>
+      </w:r>
+      <w:r>
+        <w:rPr>
+          <w:b w:val="false"/>
+          <w:bCs w:val="false"/>
+          <w:i w:val="false"/>
+          <w:iCs w:val="false"/>
+        </w:rPr>
+        <w:t xml:space="preserve"> is seen in ventral view with anterior to the top. Photograph uploaded to Wikimedia Commons by Ken Carpenter.</w:t>
+      </w:r>
+    </w:p>
+    <w:p>
+      <w:pPr>
+        <w:pStyle w:val="FigureCaption"/>
+        <w:bidi w:val="0"/>
+        <w:spacing w:before="0" w:after="142"/>
+        <w:jc w:val="left"/>
+        <w:rPr>
+          <w:b w:val="false"/>
+          <w:bCs w:val="false"/>
+          <w:i w:val="false"/>
+          <w:iCs w:val="false"/>
+        </w:rPr>
+      </w:pPr>
+      <w:r>
+        <w:rPr>
+          <w:b w:val="false"/>
+          <w:bCs w:val="false"/>
+          <w:i w:val="false"/>
+          <w:iCs w:val="false"/>
+        </w:rPr>
       </w:r>
     </w:p>
     <w:p>
@@ -11473,7 +12205,7 @@
     <w:pPr>
       <w:widowControl/>
       <w:suppressAutoHyphens w:val="true"/>
-      <w:overflowPunct w:val="true"/>
+      <w:overflowPunct w:val="false"/>
       <w:bidi w:val="0"/>
       <w:spacing w:before="0" w:after="0"/>
       <w:ind w:hanging="0" w:left="0" w:right="0"/>
@@ -11580,8 +12312,8 @@
     <w:qFormat/>
     <w:rPr/>
   </w:style>
-  <w:style w:type="character" w:styleId="Bulletsuser">
-    <w:name w:val="Bullets (user)"/>
+  <w:style w:type="character" w:styleId="Bullets">
+    <w:name w:val="Bullets"/>
     <w:qFormat/>
     <w:rPr>
       <w:rFonts w:ascii="OpenSymbol" w:hAnsi="OpenSymbol" w:eastAsia="OpenSymbol" w:cs="OpenSymbol"/>
@@ -11604,6 +12336,14 @@
     <w:rPr>
       <w:i/>
       <w:iCs/>
+    </w:rPr>
+  </w:style>
+  <w:style w:type="character" w:styleId="Strong">
+    <w:name w:val="Strong"/>
+    <w:qFormat/>
+    <w:rPr>
+      <w:b/>
+      <w:bCs/>
     </w:rPr>
   </w:style>
   <w:style w:type="paragraph" w:styleId="Heading">
@@ -11698,8 +12438,8 @@
       <w:i/>
     </w:rPr>
   </w:style>
-  <w:style w:type="paragraph" w:styleId="BlockQuotationuser">
-    <w:name w:val="Block Quotation (user)"/>
+  <w:style w:type="paragraph" w:styleId="BlockQuotation">
+    <w:name w:val="Block Quotation"/>
     <w:basedOn w:val="Normal"/>
     <w:qFormat/>
     <w:pPr>

</xml_diff>

<commit_message>
Add and cite Stewart1922-letter-to-coggeshall.pdf
</commit_message>
<xml_diff>
--- a/TaylorEtAl-mounted-barosaurus.docx
+++ b/TaylorEtAl-mounted-barosaurus.docx
@@ -1811,17 +1811,33 @@
       </w:r>
       <w:r>
         <w:rPr/>
-        <w:t xml:space="preserve"> to the Smithsonian to excavate (Stewart to Coggeshall, 6 September, 1922, cited by Carpenter 2018:13).</w:t>
-      </w:r>
-    </w:p>
-    <w:p>
-      <w:pPr>
-        <w:pStyle w:val="BodyText"/>
-        <w:rPr/>
-      </w:pPr>
-      <w:r>
-        <w:rPr/>
-        <w:t>George Perkins Merrill, Head Curator of the Department of Geology at the USNM, learned from Stewart that the Carnegie Museum was ready to relinquish its claim, and wrote on 6 November 1922 to William de Chastignier Ravenel, Secretary of the USNM, urging him to take on the quarry as “There are few objects that would yield greater attractiveness to the main hall of this department than the restored skeleton of one of the monsters of the dinosaur group that these beds yield” (Merrill 1922). [By coincidence, the next day Stewart wrote to Merrill to confirm the offer and provide details (Stewart 1922).]</w:t>
+        <w:t xml:space="preserve"> to the Smithsonian to excavate (Stewart </w:t>
+      </w:r>
+      <w:r>
+        <w:rPr/>
+        <w:t>1922a</w:t>
+      </w:r>
+      <w:r>
+        <w:rPr/>
+        <w:t>).</w:t>
+      </w:r>
+    </w:p>
+    <w:p>
+      <w:pPr>
+        <w:pStyle w:val="BodyText"/>
+        <w:rPr/>
+      </w:pPr>
+      <w:r>
+        <w:rPr/>
+        <w:t>George Perkins Merrill, Head Curator of the Department of Geology at the USNM, learned from Stewart that the Carnegie Museum was ready to relinquish its claim, and wrote on 6 November 1922 to William de Chastignier Ravenel, Secretary of the USNM, urging him to take on the quarry as “There are few objects that would yield greater attractiveness to the main hall of this department than the restored skeleton of one of the monsters of the dinosaur group that these beds yield” (Merrill 1922). [By coincidence, the next day Stewart wrote to Merrill to confirm the offer and provide details (Stewart 1922</w:t>
+      </w:r>
+      <w:r>
+        <w:rPr/>
+        <w:t>b</w:t>
+      </w:r>
+      <w:r>
+        <w:rPr/>
+        <w:t>).]</w:t>
       </w:r>
     </w:p>
     <w:p>
@@ -1874,11 +1890,7 @@
       </w:r>
       <w:r>
         <w:rPr/>
-        <w:t xml:space="preserve">. Apparently nearly complete skeleton but only neck taken out. The remainder still in the ledge” (Douglass 1922c). </w:t>
-      </w:r>
-      <w:r>
-        <w:rPr/>
-        <w:t>Work by the Carnegie crew finished on 1 January 1923 (Osborn 1923).</w:t>
+        <w:t>. Apparently nearly complete skeleton but only neck taken out. The remainder still in the ledge” (Douglass 1922c). Work by the Carnegie crew finished on 1 January 1923 (Osborn 1923).</w:t>
       </w:r>
     </w:p>
     <w:p>
@@ -1940,109 +1952,17 @@
       </w:pPr>
       <w:r>
         <w:rPr/>
-        <w:t xml:space="preserve">USNM’s only interest in #340 was apparently in using </w:t>
-      </w:r>
-      <w:r>
-        <w:rPr/>
-        <w:t>elements of the skeleton</w:t>
-      </w:r>
-      <w:r>
-        <w:rPr/>
-        <w:t xml:space="preserve"> to complete #355 for a gallery mount </w:t>
-      </w:r>
-      <w:r>
-        <w:rPr/>
-        <w:t>(Gilmore 1923b:1)</w:t>
-      </w:r>
-      <w:r>
-        <w:rPr/>
-        <w:t xml:space="preserve">, so only the cervical, </w:t>
-      </w:r>
-      <w:r>
-        <w:rPr/>
-        <w:t xml:space="preserve">three anterior dorsals, left scapulocoracoid and humerus </w:t>
-      </w:r>
-      <w:r>
-        <w:rPr/>
-        <w:t xml:space="preserve">were sent there </w:t>
-      </w:r>
-      <w:r>
-        <w:rPr/>
-        <w:t>(Brown 1929)</w:t>
-      </w:r>
-      <w:r>
-        <w:rPr/>
-        <w:t xml:space="preserve">. </w:t>
-      </w:r>
-      <w:r>
-        <w:rPr/>
-        <w:t xml:space="preserve">XXX though contrast with Gilmore’s (1923b:3) list. </w:t>
-      </w:r>
-      <w:r>
-        <w:rPr/>
-        <w:t xml:space="preserve">Another block belonging to this specimen was shipped to </w:t>
-      </w:r>
-      <w:r>
-        <w:rPr/>
-        <w:t xml:space="preserve">the Carnegie Museum with the intention that it would be </w:t>
-      </w:r>
-      <w:r>
-        <w:rPr/>
-        <w:t xml:space="preserve">turned over to the </w:t>
-      </w:r>
-      <w:r>
-        <w:rPr/>
-        <w:t>USNM</w:t>
-      </w:r>
-      <w:r>
-        <w:rPr/>
-        <w:t xml:space="preserve"> </w:t>
-      </w:r>
-      <w:r>
-        <w:rPr/>
-        <w:t xml:space="preserve">once </w:t>
-      </w:r>
-      <w:r>
-        <w:rPr/>
-        <w:t xml:space="preserve">bones of another individual </w:t>
-      </w:r>
-      <w:r>
-        <w:rPr/>
-        <w:t xml:space="preserve">were </w:t>
-      </w:r>
-      <w:r>
-        <w:rPr/>
-        <w:t xml:space="preserve">extracted from it. </w:t>
-      </w:r>
-      <w:r>
-        <w:rPr/>
-        <w:t>(</w:t>
-      </w:r>
-      <w:r>
-        <w:rPr/>
-        <w:t>Gilmore 1923b:1</w:t>
-      </w:r>
-      <w:r>
-        <w:rPr/>
-        <w:t>). This block probably contained the “nine or ten vertebrae” of the tail mentioned by Brown (1929) as being part of this specimen.</w:t>
-      </w:r>
-    </w:p>
-    <w:p>
-      <w:pPr>
-        <w:pStyle w:val="BodyText"/>
-        <w:rPr/>
-      </w:pPr>
-      <w:r>
-        <w:rPr/>
-        <w:t>XXXXX segue into next bit. Reconcile McIntosh 2005 with Gilmore 1923</w:t>
-      </w:r>
-      <w:r>
-        <w:rPr/>
-        <w:t>b</w:t>
-      </w:r>
-      <w:r>
-        <w:rPr/>
-        <w:t xml:space="preserve"> and Brown 1929 quoted in Dingus 1996.</w:t>
+        <w:t>USNM’s only interest in #340 was apparently in using elements of the skeleton to complete #355 for a gallery mount (Gilmore 1923b:1), so only the cervical, three anterior dorsals, left scapulocoracoid and humerus were sent there (Brown 1929). XXX though contrast with Gilmore’s (1923b:3) list. Another block belonging to this specimen was shipped to the Carnegie Museum with the intention that it would be turned over to the USNM once bones of another individual were extracted from it. (Gilmore 1923b:1). This block probably contained the “nine or ten vertebrae” of the tail mentioned by Brown (1929) as being part of this specimen.</w:t>
+      </w:r>
+    </w:p>
+    <w:p>
+      <w:pPr>
+        <w:pStyle w:val="BodyText"/>
+        <w:rPr/>
+      </w:pPr>
+      <w:r>
+        <w:rPr/>
+        <w:t>XXXXX segue into next bit. Reconcile McIntosh 2005 with Gilmore 1923b and Brown 1929 quoted in Dingus 1996.</w:t>
       </w:r>
     </w:p>
     <w:p>
@@ -2605,7 +2525,7 @@
     </w:p>
     <w:p>
       <w:pPr>
-        <w:pStyle w:val="BlockQuotationuser"/>
+        <w:pStyle w:val="BlockQuotation"/>
         <w:rPr/>
       </w:pPr>
       <w:r>
@@ -3168,7 +3088,7 @@
     </w:p>
     <w:p>
       <w:pPr>
-        <w:pStyle w:val="BlockQuotationuser"/>
+        <w:pStyle w:val="BlockQuotation"/>
         <w:rPr/>
       </w:pPr>
       <w:r>
@@ -7528,6 +7448,26 @@
       </w:pPr>
       <w:r>
         <w:rPr/>
+        <w:t>Stewart, Douglas. 1922a. Letter to Arthur S. Coggeshall offering to turn over the two Diplodocus skeletons at Dinosaur National Monument quarry to USNM. 6 September 1922.</w:t>
+      </w:r>
+    </w:p>
+    <w:p>
+      <w:pPr>
+        <w:pStyle w:val="Reference"/>
+        <w:rPr/>
+      </w:pPr>
+      <w:r>
+        <w:rPr/>
+        <w:t>Stewart, Douglas. 1922b. Letter to George P. Merrill offering to turn over the Dinosaur National Monument quarry to USNM. 7 November 1922.</w:t>
+      </w:r>
+    </w:p>
+    <w:p>
+      <w:pPr>
+        <w:pStyle w:val="Reference"/>
+        <w:rPr/>
+      </w:pPr>
+      <w:r>
+        <w:rPr/>
         <w:t xml:space="preserve">Taylor, Michael A. 1992. </w:t>
       </w:r>
       <w:r>
@@ -8354,7 +8294,7 @@
     </w:p>
     <w:p>
       <w:pPr>
-        <w:pStyle w:val="BlockQuotationuser"/>
+        <w:pStyle w:val="BlockQuotation"/>
         <w:rPr/>
       </w:pPr>
       <w:r>
@@ -8387,7 +8327,7 @@
         <w:pStyle w:val="FigureCaption"/>
         <w:widowControl/>
         <w:suppressAutoHyphens w:val="true"/>
-        <w:overflowPunct w:val="true"/>
+        <w:overflowPunct w:val="false"/>
         <w:bidi w:val="0"/>
         <w:spacing w:lineRule="auto" w:line="276" w:before="0" w:after="142"/>
         <w:ind w:hanging="0" w:left="283" w:right="0"/>
@@ -11971,7 +11911,7 @@
     <w:pPr>
       <w:widowControl/>
       <w:suppressAutoHyphens w:val="true"/>
-      <w:overflowPunct w:val="true"/>
+      <w:overflowPunct w:val="false"/>
       <w:bidi w:val="0"/>
       <w:spacing w:before="0" w:after="0"/>
       <w:ind w:hanging="0" w:left="0" w:right="0"/>
@@ -12078,8 +12018,8 @@
     <w:qFormat/>
     <w:rPr/>
   </w:style>
-  <w:style w:type="character" w:styleId="Bulletsuser">
-    <w:name w:val="Bullets (user)"/>
+  <w:style w:type="character" w:styleId="Bullets">
+    <w:name w:val="Bullets"/>
     <w:qFormat/>
     <w:rPr>
       <w:rFonts w:ascii="OpenSymbol" w:hAnsi="OpenSymbol" w:eastAsia="OpenSymbol" w:cs="OpenSymbol"/>
@@ -12204,8 +12144,8 @@
       <w:i/>
     </w:rPr>
   </w:style>
-  <w:style w:type="paragraph" w:styleId="BlockQuotationuser">
-    <w:name w:val="Block Quotation (user)"/>
+  <w:style w:type="paragraph" w:styleId="BlockQuotation">
+    <w:name w:val="Block Quotation"/>
     <w:basedOn w:val="Normal"/>
     <w:qFormat/>
     <w:pPr>

</xml_diff>

<commit_message>
More prose on reuniting the skeleton
</commit_message>
<xml_diff>
--- a/TaylorEtAl-mounted-barosaurus.docx
+++ b/TaylorEtAl-mounted-barosaurus.docx
@@ -389,17 +389,12 @@
             </w:rPr>
             <w:fldChar w:fldCharType="separate"/>
           </w:r>
-          <w:hyperlink w:anchor="__RefHeading___Toc3784_1986291683">
+          <w:hyperlink w:anchor="__RefHeading___Toc3784_1986291683" w:tooltip="Introduction">
             <w:r>
               <w:rPr>
                 <w:rStyle w:val="IndexLink"/>
               </w:rPr>
               <w:t>Introduction</w:t>
-            </w:r>
-            <w:r>
-              <w:rPr>
-                <w:rStyle w:val="IndexLink"/>
-              </w:rPr>
               <w:tab/>
               <w:t>2</w:t>
             </w:r>
@@ -414,7 +409,7 @@
             </w:tabs>
             <w:rPr/>
           </w:pPr>
-          <w:hyperlink w:anchor="__RefHeading___Toc3323_2187837281">
+          <w:hyperlink w:anchor="__RefHeading___Toc3323_2187837281" w:tooltip="Anatomical nomenclature">
             <w:r>
               <w:rPr>
                 <w:rStyle w:val="IndexLink"/>
@@ -434,7 +429,7 @@
             </w:tabs>
             <w:rPr/>
           </w:pPr>
-          <w:hyperlink w:anchor="__RefHeading___Toc5349_68767826">
+          <w:hyperlink w:anchor="__RefHeading___Toc5349_68767826" w:tooltip="Institutional abbreviations">
             <w:r>
               <w:rPr>
                 <w:rStyle w:val="IndexLink"/>
@@ -454,7 +449,7 @@
             </w:tabs>
             <w:rPr/>
           </w:pPr>
-          <w:hyperlink w:anchor="__RefHeading___Toc4316_68767826">
+          <w:hyperlink w:anchor="__RefHeading___Toc4316_68767826" w:tooltip="Historical background">
             <w:r>
               <w:rPr>
                 <w:rStyle w:val="IndexLink"/>
@@ -474,7 +469,7 @@
             </w:tabs>
             <w:rPr/>
           </w:pPr>
-          <w:hyperlink w:anchor="__RefHeading___Toc12350_68767826">
+          <w:hyperlink w:anchor="__RefHeading___Toc12350_68767826" w:tooltip="Early discoveries of Barosaurus">
             <w:r>
               <w:rPr>
                 <w:rStyle w:val="IndexLink"/>
@@ -507,7 +502,7 @@
             </w:tabs>
             <w:rPr/>
           </w:pPr>
-          <w:hyperlink w:anchor="__RefHeading___Toc12352_68767826">
+          <w:hyperlink w:anchor="__RefHeading___Toc12352_68767826" w:tooltip="The AMNH specimen of Barosaurus">
             <w:r>
               <w:rPr>
                 <w:rStyle w:val="IndexLink"/>
@@ -528,6 +523,66 @@
               </w:rPr>
               <w:tab/>
               <w:t>4</w:t>
+            </w:r>
+          </w:hyperlink>
+        </w:p>
+        <w:p>
+          <w:pPr>
+            <w:pStyle w:val="TOC3"/>
+            <w:tabs>
+              <w:tab w:val="clear" w:pos="9072"/>
+              <w:tab w:val="right" w:pos="9637" w:leader="dot"/>
+            </w:tabs>
+            <w:rPr/>
+          </w:pPr>
+          <w:hyperlink w:anchor="__RefHeading___Toc25848_1820571732" w:tooltip="The Carnegie Quarry at Dinosaur National Monument">
+            <w:r>
+              <w:rPr>
+                <w:rStyle w:val="IndexLink"/>
+              </w:rPr>
+              <w:t>The Carnegie Quarry at Dinosaur National Monument</w:t>
+              <w:tab/>
+              <w:t>4</w:t>
+            </w:r>
+          </w:hyperlink>
+        </w:p>
+        <w:p>
+          <w:pPr>
+            <w:pStyle w:val="TOC3"/>
+            <w:tabs>
+              <w:tab w:val="clear" w:pos="9072"/>
+              <w:tab w:val="right" w:pos="9637" w:leader="dot"/>
+            </w:tabs>
+            <w:rPr/>
+          </w:pPr>
+          <w:hyperlink w:anchor="__RefHeading___Toc25850_1820571732" w:tooltip="USNM work at Dinosaur National Monument">
+            <w:r>
+              <w:rPr>
+                <w:rStyle w:val="IndexLink"/>
+              </w:rPr>
+              <w:t>USNM work at Dinosaur National Monument</w:t>
+              <w:tab/>
+              <w:t>5</w:t>
+            </w:r>
+          </w:hyperlink>
+        </w:p>
+        <w:p>
+          <w:pPr>
+            <w:pStyle w:val="TOC3"/>
+            <w:tabs>
+              <w:tab w:val="clear" w:pos="9072"/>
+              <w:tab w:val="right" w:pos="9637" w:leader="dot"/>
+            </w:tabs>
+            <w:rPr/>
+          </w:pPr>
+          <w:hyperlink w:anchor="__RefHeading___Toc25852_1820571732" w:tooltip="The skeleton reunited">
+            <w:r>
+              <w:rPr>
+                <w:rStyle w:val="IndexLink"/>
+              </w:rPr>
+              <w:t>The skeleton reunited</w:t>
+              <w:tab/>
+              <w:t>6</w:t>
             </w:r>
           </w:hyperlink>
         </w:p>
@@ -540,7 +595,7 @@
             </w:tabs>
             <w:rPr/>
           </w:pPr>
-          <w:hyperlink w:anchor="__RefHeading___Toc5351_68767826">
+          <w:hyperlink w:anchor="__RefHeading___Toc5351_68767826" w:tooltip="The AMNH mounted Barosaurus">
             <w:r>
               <w:rPr>
                 <w:rStyle w:val="IndexLink"/>
@@ -560,7 +615,7 @@
                 <w:rStyle w:val="IndexLink"/>
               </w:rPr>
               <w:tab/>
-              <w:t>5</w:t>
+              <w:t>7</w:t>
             </w:r>
           </w:hyperlink>
         </w:p>
@@ -573,14 +628,14 @@
             </w:tabs>
             <w:rPr/>
           </w:pPr>
-          <w:hyperlink w:anchor="__RefHeading___Toc5354_68767826">
+          <w:hyperlink w:anchor="__RefHeading___Toc5354_68767826" w:tooltip="The conception of the mount">
             <w:r>
               <w:rPr>
                 <w:rStyle w:val="IndexLink"/>
               </w:rPr>
               <w:t>The conception of the mount</w:t>
               <w:tab/>
-              <w:t>5</w:t>
+              <w:t>7</w:t>
             </w:r>
           </w:hyperlink>
         </w:p>
@@ -593,7 +648,7 @@
             </w:tabs>
             <w:rPr/>
           </w:pPr>
-          <w:hyperlink w:anchor="__RefHeading___Toc1099_1709072779">
+          <w:hyperlink w:anchor="__RefHeading___Toc1099_1709072779" w:tooltip="The purpose of the mount">
             <w:r>
               <w:rPr>
                 <w:rStyle w:val="IndexLink"/>
@@ -607,7 +662,7 @@
                 <w:rStyle w:val="IndexLink"/>
               </w:rPr>
               <w:tab/>
-              <w:t>7</w:t>
+              <w:t>9</w:t>
             </w:r>
           </w:hyperlink>
         </w:p>
@@ -620,14 +675,14 @@
             </w:tabs>
             <w:rPr/>
           </w:pPr>
-          <w:hyperlink w:anchor="__RefHeading___Toc18297_68767826">
+          <w:hyperlink w:anchor="__RefHeading___Toc18297_68767826" w:tooltip="The creation of the mount">
             <w:r>
               <w:rPr>
                 <w:rStyle w:val="IndexLink"/>
               </w:rPr>
               <w:t>The creation of the mount</w:t>
               <w:tab/>
-              <w:t>7</w:t>
+              <w:t>9</w:t>
             </w:r>
           </w:hyperlink>
         </w:p>
@@ -640,14 +695,14 @@
             </w:tabs>
             <w:rPr/>
           </w:pPr>
-          <w:hyperlink w:anchor="__RefHeading___Toc5632_2187837281">
+          <w:hyperlink w:anchor="__RefHeading___Toc5632_2187837281" w:tooltip="Photography of the mount">
             <w:r>
               <w:rPr>
                 <w:rStyle w:val="IndexLink"/>
               </w:rPr>
               <w:t>Photography of the mount</w:t>
               <w:tab/>
-              <w:t>10</w:t>
+              <w:t>12</w:t>
             </w:r>
           </w:hyperlink>
         </w:p>
@@ -660,14 +715,14 @@
             </w:tabs>
             <w:rPr/>
           </w:pPr>
-          <w:hyperlink w:anchor="__RefHeading___Toc5356_68767826">
+          <w:hyperlink w:anchor="__RefHeading___Toc5356_68767826" w:tooltip="The composition of the mount">
             <w:r>
               <w:rPr>
                 <w:rStyle w:val="IndexLink"/>
               </w:rPr>
               <w:t>The composition of the mount</w:t>
               <w:tab/>
-              <w:t>10</w:t>
+              <w:t>12</w:t>
             </w:r>
           </w:hyperlink>
         </w:p>
@@ -680,14 +735,14 @@
             </w:tabs>
             <w:rPr/>
           </w:pPr>
-          <w:hyperlink w:anchor="__RefHeading___Toc16585_68767826">
+          <w:hyperlink w:anchor="__RefHeading___Toc16585_68767826" w:tooltip="Overview">
             <w:r>
               <w:rPr>
                 <w:rStyle w:val="IndexLink"/>
               </w:rPr>
               <w:t>Overview</w:t>
               <w:tab/>
-              <w:t>10</w:t>
+              <w:t>12</w:t>
             </w:r>
           </w:hyperlink>
         </w:p>
@@ -700,7 +755,7 @@
             </w:tabs>
             <w:rPr/>
           </w:pPr>
-          <w:hyperlink w:anchor="__RefHeading___Toc4995_537823704">
+          <w:hyperlink w:anchor="__RefHeading___Toc4995_537823704" w:tooltip="Barosaurus material in the mount">
             <w:r>
               <w:rPr>
                 <w:rStyle w:val="IndexLink"/>
@@ -715,7 +770,7 @@
               </w:rPr>
               <w:t xml:space="preserve"> material in the mount</w:t>
               <w:tab/>
-              <w:t>10</w:t>
+              <w:t>13</w:t>
             </w:r>
           </w:hyperlink>
         </w:p>
@@ -728,14 +783,14 @@
             </w:tabs>
             <w:rPr/>
           </w:pPr>
-          <w:hyperlink w:anchor="__RefHeading___Toc16587_68767826">
+          <w:hyperlink w:anchor="__RefHeading___Toc25854_1820571732" w:tooltip="Non-Barosaurus material in the mount">
             <w:r>
               <w:rPr>
                 <w:rStyle w:val="IndexLink"/>
               </w:rPr>
-              <w:t>Skull</w:t>
+              <w:t>Non-Barosaurus material in the mount</w:t>
               <w:tab/>
-              <w:t>12</w:t>
+              <w:t>14</w:t>
             </w:r>
           </w:hyperlink>
         </w:p>
@@ -748,14 +803,14 @@
             </w:tabs>
             <w:rPr/>
           </w:pPr>
-          <w:hyperlink w:anchor="__RefHeading___Toc16589_68767826">
+          <w:hyperlink w:anchor="__RefHeading___Toc16587_68767826" w:tooltip="Skull">
             <w:r>
               <w:rPr>
                 <w:rStyle w:val="IndexLink"/>
               </w:rPr>
-              <w:t>Neck</w:t>
+              <w:t>Skull</w:t>
               <w:tab/>
-              <w:t>12</w:t>
+              <w:t>14</w:t>
             </w:r>
           </w:hyperlink>
         </w:p>
@@ -768,14 +823,14 @@
             </w:tabs>
             <w:rPr/>
           </w:pPr>
-          <w:hyperlink w:anchor="__RefHeading___Toc2466_2187837281">
+          <w:hyperlink w:anchor="__RefHeading___Toc16589_68767826" w:tooltip="Neck">
             <w:r>
               <w:rPr>
                 <w:rStyle w:val="IndexLink"/>
               </w:rPr>
-              <w:t>Torso, sacrum and tail</w:t>
+              <w:t>Neck</w:t>
               <w:tab/>
-              <w:t>13</w:t>
+              <w:t>15</w:t>
             </w:r>
           </w:hyperlink>
         </w:p>
@@ -788,14 +843,14 @@
             </w:tabs>
             <w:rPr/>
           </w:pPr>
-          <w:hyperlink w:anchor="__RefHeading___Toc2470_2187837281">
+          <w:hyperlink w:anchor="__RefHeading___Toc2466_2187837281" w:tooltip="Torso, sacrum and tail">
             <w:r>
               <w:rPr>
                 <w:rStyle w:val="IndexLink"/>
               </w:rPr>
-              <w:t>Forelimbs and girdles</w:t>
+              <w:t>Torso, sacrum and tail</w:t>
               <w:tab/>
-              <w:t>13</w:t>
+              <w:t>15</w:t>
             </w:r>
           </w:hyperlink>
         </w:p>
@@ -808,14 +863,34 @@
             </w:tabs>
             <w:rPr/>
           </w:pPr>
-          <w:hyperlink w:anchor="__RefHeading___Toc2472_2187837281">
+          <w:hyperlink w:anchor="__RefHeading___Toc2470_2187837281" w:tooltip="Forelimbs and girdles">
+            <w:r>
+              <w:rPr>
+                <w:rStyle w:val="IndexLink"/>
+              </w:rPr>
+              <w:t>Forelimbs and girdles</w:t>
+              <w:tab/>
+              <w:t>15</w:t>
+            </w:r>
+          </w:hyperlink>
+        </w:p>
+        <w:p>
+          <w:pPr>
+            <w:pStyle w:val="TOC3"/>
+            <w:tabs>
+              <w:tab w:val="clear" w:pos="9072"/>
+              <w:tab w:val="right" w:pos="9637" w:leader="dot"/>
+            </w:tabs>
+            <w:rPr/>
+          </w:pPr>
+          <w:hyperlink w:anchor="__RefHeading___Toc25856_1820571732" w:tooltip="Hindlimbs and girdles">
             <w:r>
               <w:rPr>
                 <w:rStyle w:val="IndexLink"/>
               </w:rPr>
               <w:t>Hindlimbs and girdles</w:t>
               <w:tab/>
-              <w:t>13</w:t>
+              <w:t>16</w:t>
             </w:r>
           </w:hyperlink>
         </w:p>
@@ -828,14 +903,14 @@
             </w:tabs>
             <w:rPr/>
           </w:pPr>
-          <w:hyperlink w:anchor="__RefHeading___Toc3401_68767826">
+          <w:hyperlink w:anchor="__RefHeading___Toc3401_68767826" w:tooltip="Discussion">
             <w:r>
               <w:rPr>
                 <w:rStyle w:val="IndexLink"/>
               </w:rPr>
               <w:t>Discussion</w:t>
               <w:tab/>
-              <w:t>14</w:t>
+              <w:t>16</w:t>
             </w:r>
           </w:hyperlink>
         </w:p>
@@ -848,14 +923,14 @@
             </w:tabs>
             <w:rPr/>
           </w:pPr>
-          <w:hyperlink w:anchor="__RefHeading___Toc2476_2187837281">
+          <w:hyperlink w:anchor="__RefHeading___Toc2476_2187837281" w:tooltip="Rearing pose">
             <w:r>
               <w:rPr>
                 <w:rStyle w:val="IndexLink"/>
               </w:rPr>
               <w:t>Rearing pose</w:t>
               <w:tab/>
-              <w:t>14</w:t>
+              <w:t>16</w:t>
             </w:r>
           </w:hyperlink>
         </w:p>
@@ -868,14 +943,14 @@
             </w:tabs>
             <w:rPr/>
           </w:pPr>
-          <w:hyperlink w:anchor="__RefHeading___Toc3786_1986291683">
+          <w:hyperlink w:anchor="__RefHeading___Toc3786_1986291683" w:tooltip="A short history of rearing sauropods">
             <w:r>
               <w:rPr>
                 <w:rStyle w:val="IndexLink"/>
               </w:rPr>
-              <w:t>A short history of a rearing sauropods</w:t>
+              <w:t>A short history of rearing sauropods</w:t>
               <w:tab/>
-              <w:t>15</w:t>
+              <w:t>18</w:t>
             </w:r>
           </w:hyperlink>
         </w:p>
@@ -888,14 +963,14 @@
             </w:tabs>
             <w:rPr/>
           </w:pPr>
-          <w:hyperlink w:anchor="__RefHeading___Toc11689_675290491">
+          <w:hyperlink w:anchor="__RefHeading___Toc11689_675290491" w:tooltip="Cultural impact">
             <w:r>
               <w:rPr>
                 <w:rStyle w:val="IndexLink"/>
               </w:rPr>
               <w:t>Cultural impact</w:t>
               <w:tab/>
-              <w:t>17</w:t>
+              <w:t>19</w:t>
             </w:r>
           </w:hyperlink>
         </w:p>
@@ -908,14 +983,14 @@
             </w:tabs>
             <w:rPr/>
           </w:pPr>
-          <w:hyperlink w:anchor="__RefHeading___Toc21934_68767826">
+          <w:hyperlink w:anchor="__RefHeading___Toc21934_68767826" w:tooltip="Size of the AMNH 6341 animal">
             <w:r>
               <w:rPr>
                 <w:rStyle w:val="IndexLink"/>
               </w:rPr>
               <w:t>Size of the AMNH 6341 animal</w:t>
               <w:tab/>
-              <w:t>17</w:t>
+              <w:t>20</w:t>
             </w:r>
           </w:hyperlink>
         </w:p>
@@ -928,14 +1003,14 @@
             </w:tabs>
             <w:rPr/>
           </w:pPr>
-          <w:hyperlink w:anchor="__RefHeading___Toc3403_68767826">
+          <w:hyperlink w:anchor="__RefHeading___Toc3403_68767826" w:tooltip="Acknowledgements">
             <w:r>
               <w:rPr>
                 <w:rStyle w:val="IndexLink"/>
               </w:rPr>
               <w:t>Acknowledgements</w:t>
               <w:tab/>
-              <w:t>18</w:t>
+              <w:t>20</w:t>
             </w:r>
           </w:hyperlink>
         </w:p>
@@ -948,14 +1023,14 @@
             </w:tabs>
             <w:rPr/>
           </w:pPr>
-          <w:hyperlink w:anchor="__RefHeading___Toc3405_68767826">
+          <w:hyperlink w:anchor="__RefHeading___Toc3405_68767826" w:tooltip="References">
             <w:r>
               <w:rPr>
                 <w:rStyle w:val="IndexLink"/>
               </w:rPr>
               <w:t>References</w:t>
               <w:tab/>
-              <w:t>18</w:t>
+              <w:t>21</w:t>
             </w:r>
           </w:hyperlink>
         </w:p>
@@ -968,14 +1043,54 @@
             </w:tabs>
             <w:rPr/>
           </w:pPr>
-          <w:hyperlink w:anchor="__RefHeading___Toc3407_68767826">
+          <w:hyperlink w:anchor="__RefHeading___Toc3407_68767826" w:tooltip="Figure Captions">
             <w:r>
               <w:rPr>
                 <w:rStyle w:val="IndexLink"/>
               </w:rPr>
               <w:t>Figure Captions</w:t>
               <w:tab/>
-              <w:t>22</w:t>
+              <w:t>26</w:t>
+            </w:r>
+          </w:hyperlink>
+        </w:p>
+        <w:p>
+          <w:pPr>
+            <w:pStyle w:val="TOC1"/>
+            <w:tabs>
+              <w:tab w:val="clear" w:pos="9638"/>
+              <w:tab w:val="right" w:pos="9637" w:leader="dot"/>
+            </w:tabs>
+            <w:rPr/>
+          </w:pPr>
+          <w:hyperlink w:anchor="__RefHeading___Toc25858_1820571732" w:tooltip="Tables">
+            <w:r>
+              <w:rPr>
+                <w:rStyle w:val="IndexLink"/>
+              </w:rPr>
+              <w:t>Tables</w:t>
+              <w:tab/>
+              <w:t>28</w:t>
+            </w:r>
+          </w:hyperlink>
+        </w:p>
+        <w:p>
+          <w:pPr>
+            <w:pStyle w:val="TOC2"/>
+            <w:tabs>
+              <w:tab w:val="clear" w:pos="9355"/>
+              <w:tab w:val="right" w:pos="9637" w:leader="dot"/>
+            </w:tabs>
+            <w:rPr/>
+          </w:pPr>
+          <w:hyperlink w:anchor="__RefHeading___Toc25860_1820571732" w:tooltip="Table 1">
+            <w:r>
+              <w:rPr>
+                <w:rStyle w:val="IndexLink"/>
+              </w:rPr>
+              <w:t>Table 1</w:t>
+              <w:tab/>
+              <w:t>28</w:t>
             </w:r>
           </w:hyperlink>
           <w:r>
@@ -1700,6 +1815,18 @@
     </w:p>
     <w:p>
       <w:pPr>
+        <w:pStyle w:val="Heading3"/>
+        <w:rPr/>
+      </w:pPr>
+      <w:bookmarkStart w:id="7" w:name="__RefHeading___Toc25848_1820571732"/>
+      <w:bookmarkEnd w:id="7"/>
+      <w:r>
+        <w:rPr/>
+        <w:t>The Carnegie Quarry at Dinosaur National Monument</w:t>
+      </w:r>
+    </w:p>
+    <w:p>
+      <w:pPr>
         <w:pStyle w:val="BodyText"/>
         <w:rPr/>
       </w:pPr>
@@ -1785,12 +1912,40 @@
     </w:p>
     <w:p>
       <w:pPr>
+        <w:pStyle w:val="Heading3"/>
+        <w:rPr/>
+      </w:pPr>
+      <w:bookmarkStart w:id="8" w:name="__RefHeading___Toc25850_1820571732"/>
+      <w:bookmarkEnd w:id="8"/>
+      <w:r>
+        <w:rPr/>
+        <w:t>USNM work at Dinosaur National Monument</w:t>
+      </w:r>
+    </w:p>
+    <w:p>
+      <w:pPr>
         <w:pStyle w:val="BodyText"/>
         <w:rPr/>
       </w:pPr>
       <w:r>
         <w:rPr/>
-        <w:t xml:space="preserve">By 1922 the Museum had more fossils from this locality than it could use. Douglas Stewart, Holland’s successor as Director of the Carnegie Museum, evidently favoured turning the quarry over to the USNM, writing to Arthur S. Coggeshall on 6 September, 1922 to acknowledge the latter’s recommendation that Douglass finish the excavation of a Stegosaurus and a small dinosaur skeleton, but to leave two partially exposed specimens of </w:t>
+        <w:t xml:space="preserve">By 1922 the </w:t>
+      </w:r>
+      <w:r>
+        <w:rPr/>
+        <w:t xml:space="preserve">Carnegie </w:t>
+      </w:r>
+      <w:r>
+        <w:rPr/>
+        <w:t xml:space="preserve">Museum had more fossils from this locality than it could use. Douglas Stewart, Holland’s successor as Director of the </w:t>
+      </w:r>
+      <w:r>
+        <w:rPr/>
+        <w:t>m</w:t>
+      </w:r>
+      <w:r>
+        <w:rPr/>
+        <w:t xml:space="preserve">useum, evidently favoured turning the quarry over to the USNM, writing to Arthur S. Coggeshall on 6 September, 1922 to acknowledge the latter’s recommendation that Douglass finish the excavation of a Stegosaurus and a small dinosaur skeleton, but to leave two partially exposed specimens of </w:t>
       </w:r>
       <w:r>
         <w:rPr>
@@ -1992,7 +2147,31 @@
       </w:pPr>
       <w:r>
         <w:rPr/>
-        <w:t>XXXXX segue into next bit. Reconcile McIntosh 2005 with Gilmore 1923b and Brown 1929 quoted in Dingus 1996.</w:t>
+        <w:t xml:space="preserve">In April 1924, Earl Douglass was offered a position at the University of Utah and resigned his position with Carnegie Museum (Douglass 1879–1953). </w:t>
+      </w:r>
+      <w:r>
+        <w:rPr/>
+        <w:t xml:space="preserve">He excavated the remainder of #340 and sent it to </w:t>
+      </w:r>
+      <w:r>
+        <w:rPr/>
+        <w:t>the University of Utah. This left the skeleton now spread across three institutions in Salt Lake City, Pittsburgh, and Washington, D.C. It is perhaps for this reason that, although t</w:t>
+      </w:r>
+      <w:r>
+        <w:rPr/>
+        <w:t xml:space="preserve">he portion of the skeleton at </w:t>
+      </w:r>
+      <w:r>
+        <w:rPr/>
+        <w:t xml:space="preserve">the University of Utah </w:t>
+      </w:r>
+      <w:r>
+        <w:rPr/>
+        <w:t xml:space="preserve">was </w:t>
+      </w:r>
+      <w:r>
+        <w:rPr/>
+        <w:t>prepared, it was never mounted.</w:t>
       </w:r>
     </w:p>
     <w:p>
@@ -2002,18 +2181,43 @@
       </w:pPr>
       <w:r>
         <w:rPr/>
-        <w:t xml:space="preserve">The other, designated #340 and thought at that time also to be </w:t>
-      </w:r>
-      <w:r>
-        <w:rPr>
-          <w:i/>
-          <w:iCs/>
-        </w:rPr>
-        <w:t>Diplodocus,</w:t>
-      </w:r>
-      <w:r>
-        <w:rPr/>
-        <w:t xml:space="preserve"> was destined to go with Douglass to the University of Utah, though to further complicate matters nine or ten caudal vertebrae were sent to the Carnegie Museum. However, when it became clear that the USNM </w:t>
+        <w:t xml:space="preserve">The material in Washington was accessioned as USNM 11647 on 11 April 1927 (Abby Telfer, pers. comm., 2025). When it was </w:t>
+      </w:r>
+      <w:r>
+        <w:rPr/>
+        <w:t xml:space="preserve">prepared, </w:t>
+      </w:r>
+      <w:r>
+        <w:rPr/>
+        <w:t xml:space="preserve">what </w:t>
+      </w:r>
+      <w:r>
+        <w:rPr/>
+        <w:t xml:space="preserve">had been thought in the field to be two cervicals </w:t>
+      </w:r>
+      <w:r>
+        <w:rPr/>
+        <w:t xml:space="preserve">proved to be a single </w:t>
+      </w:r>
+      <w:r>
+        <w:rPr/>
+        <w:t>long cervica</w:t>
+      </w:r>
+      <w:r>
+        <w:rPr/>
+        <w:t>l (McIntosh 2005:43)</w:t>
+      </w:r>
+      <w:r>
+        <w:rPr/>
+        <w:t xml:space="preserve">. </w:t>
+      </w:r>
+      <w:r>
+        <w:rPr/>
+        <w:t xml:space="preserve">It was then apparent that they (and the rest of #340) did </w:t>
+      </w:r>
+      <w:r>
+        <w:rPr/>
+        <w:t xml:space="preserve">not belong to </w:t>
       </w:r>
       <w:r>
         <w:rPr>
@@ -2024,7 +2228,34 @@
       </w:r>
       <w:r>
         <w:rPr/>
-        <w:t xml:space="preserve"> lacked a neck, it was arranged to supplement this material with the neck, anterior dorsals and scapulocoracoid and humerus from the University of Utah specimen. This left the skeleton now spread across three institutions in Salt Lake City, Pittsburgh, and Washington, D.C. It is perhaps for this reason that, although the rest of this specimen was excavated, sent to the University of Utah and prepared, it was never mounted. Meanwhile, the neck that had been sent to Washington, D.C. proved when prepared not to belong to </w:t>
+        <w:t xml:space="preserve"> after all but to </w:t>
+      </w:r>
+      <w:r>
+        <w:rPr>
+          <w:i/>
+          <w:iCs/>
+        </w:rPr>
+        <w:t>Barosaurus</w:t>
+      </w:r>
+      <w:r>
+        <w:rPr/>
+        <w:t xml:space="preserve"> (Gilmore 1932:4). </w:t>
+      </w:r>
+      <w:r>
+        <w:rPr/>
+        <w:t xml:space="preserve">This material could </w:t>
+      </w:r>
+      <w:r>
+        <w:rPr/>
+        <w:t xml:space="preserve">therefore </w:t>
+      </w:r>
+      <w:r>
+        <w:rPr/>
+        <w:t xml:space="preserve">not be </w:t>
+      </w:r>
+      <w:r>
+        <w:rPr/>
+        <w:t xml:space="preserve">used in the mount of USNM 10865, which was instead completed with casts of the Carnegie </w:t>
       </w:r>
       <w:r>
         <w:rPr>
@@ -2035,7 +2266,37 @@
       </w:r>
       <w:r>
         <w:rPr/>
-        <w:t xml:space="preserve"> after all but to </w:t>
+        <w:t xml:space="preserve"> CM 84 and unveiled in 1932 (Gilmore 1932).</w:t>
+      </w:r>
+    </w:p>
+    <w:p>
+      <w:pPr>
+        <w:pStyle w:val="Heading3"/>
+        <w:rPr/>
+      </w:pPr>
+      <w:bookmarkStart w:id="9" w:name="__RefHeading___Toc25852_1820571732"/>
+      <w:bookmarkEnd w:id="9"/>
+      <w:r>
+        <w:rPr/>
+        <w:t>The skeleton reunited</w:t>
+      </w:r>
+    </w:p>
+    <w:p>
+      <w:pPr>
+        <w:pStyle w:val="BodyText"/>
+        <w:rPr/>
+      </w:pPr>
+      <w:r>
+        <w:rPr/>
+        <w:t xml:space="preserve">In 1929, Barnum Brown, acting for the American Museum of Natural History, visited most of the nation’s major natural history museums to assess their collections. He realised that the neck, anterior torso </w:t>
+      </w:r>
+      <w:r>
+        <w:rPr/>
+        <w:t xml:space="preserve">and forelimb material </w:t>
+      </w:r>
+      <w:r>
+        <w:rPr/>
+        <w:t xml:space="preserve">at the USNM, and the tail segment at the Carnegie, belonged to the same individual as the partial skeleton at the University of Utah. Brown negotiated separately with representatives of all three museums to acquire the three portions of this skeleton, and was able to reunite the whole of Douglass’s skeleton in New York at the AMNH, a museum that had had no part in its excavation or early history. Brown arranged complex multipart deals: while the USNM accepted a straight swap for their part of the </w:t>
       </w:r>
       <w:r>
         <w:rPr>
@@ -2046,18 +2307,18 @@
       </w:r>
       <w:r>
         <w:rPr/>
-        <w:t xml:space="preserve"> (Gilmore 1932:4). It was therefore not used after all in the mount of USNM 10865, which was instead completed with casts of the Carnegie </w:t>
-      </w:r>
-      <w:r>
-        <w:rPr>
-          <w:i/>
-          <w:iCs/>
-        </w:rPr>
-        <w:t>Diplodocus</w:t>
-      </w:r>
-      <w:r>
-        <w:rPr/>
-        <w:t xml:space="preserve"> CM 84 and unveiled in 1932 (Gilmore 1932).</w:t>
+        <w:t xml:space="preserve"> with a skeleton of the tyrannosaurid </w:t>
+      </w:r>
+      <w:r>
+        <w:rPr>
+          <w:i/>
+          <w:iCs/>
+        </w:rPr>
+        <w:t>Gorgosaurus</w:t>
+      </w:r>
+      <w:r>
+        <w:rPr/>
+        <w:t>, the University of Utah made a cash-plus-fossils deal in which they were paid $2,500 cash plus the equivalent value in fossil mammal specimens (Brown 1929). The reunited skeleton was given the specimen number AMNH 6341. (See Norell et al. 1991:36–38, Dingus 1996:21–22, McIntosh 2005:42–43).</w:t>
       </w:r>
     </w:p>
     <w:p>
@@ -2067,7 +2328,19 @@
       </w:pPr>
       <w:r>
         <w:rPr/>
-        <w:t xml:space="preserve">In 1929, Barnum Brown, acting for the American Museum of Natural History, visited most of the nation’s major natural history museums to assess their collections. He realised that the neck, anterior torso, scapulocoracoid and humerus at the USNM, and the tail segment at the Carnegie, belonged to the same individual as the partial skeleton at the University of Utah. Brown negotiated separately with representatives of all three museums to acquire the three portions of this skeleton, and was able to reunite the whole of Douglass’s skeleton in New York at the AMNH, a museum that had had no part in its excavation or early history. Brown arranged complex multipart deals: while the USNM accepted a straight swap for their part of the </w:t>
+        <w:t xml:space="preserve">Brown’s </w:t>
+      </w:r>
+      <w:r>
+        <w:rPr/>
+        <w:t>(1</w:t>
+      </w:r>
+      <w:r>
+        <w:rPr/>
+        <w:t>929</w:t>
+      </w:r>
+      <w:r>
+        <w:rPr/>
+        <w:t xml:space="preserve">) memorandum on the trading he did for fossils has a rather different list of </w:t>
       </w:r>
       <w:r>
         <w:rPr>
@@ -2078,18 +2351,15 @@
       </w:r>
       <w:r>
         <w:rPr/>
-        <w:t xml:space="preserve"> with a skeleton of the tyrannosaurid </w:t>
-      </w:r>
-      <w:r>
-        <w:rPr>
-          <w:i/>
-          <w:iCs/>
-        </w:rPr>
-        <w:t>Gorgosaurus</w:t>
-      </w:r>
-      <w:r>
-        <w:rPr/>
-        <w:t>, the University of Utah made a cash-plus-fossils deal in which they were paid $2,500 cash plus the equivalent value in fossil mammal specimens (Brown 1929). The reunited skeleton was given the specimen number AMNH 6341. (See Norell et al. 1991:36–38, Dingus 1996:21–22, McIntosh 2005:42–43).</w:t>
+        <w:t xml:space="preserve"> material at the USNM than that which </w:t>
+      </w:r>
+      <w:r>
+        <w:rPr/>
+        <w:t xml:space="preserve">Gilmore (1923b:3) </w:t>
+      </w:r>
+      <w:r>
+        <w:rPr/>
+        <w:t>specified when sending the fossils there. Where Gilmore had listed 13 cervicals, three dorsals, right scapula, humerus and radius and a sternal plate, Brown listed 10 cervicals, three anterior dorsals, left scapula and humerus. These discrepancies are significant. The difference in the number of cervicals can be explained as a consequence of supposed pairs turning out to be single long vertebrae, but the left/right differences for the appendicular material are harder to account for. The radius and sternal plate mentioned by Gilmore seem to have gone missing: they are not included in the material list below. It is possible that they still lurk unrecognised in the USNM collections.</w:t>
       </w:r>
     </w:p>
     <w:p>
@@ -2099,7 +2369,7 @@
       </w:pPr>
       <w:r>
         <w:rPr/>
-        <w:t>XXX though contrast with Brown’s 1929 material list with that of Gilmore (1923b:3).</w:t>
+        <w:t>XXX “The skull and two or three of the anterior cervicals of no. 340 had been detached and were not in place” — Douglass 1922b:3.</w:t>
       </w:r>
     </w:p>
     <w:p>
@@ -2109,7 +2379,7 @@
       </w:pPr>
       <w:r>
         <w:rPr/>
-        <w:t>XXX “The skull and two or three of the anterior cervicals of no. 340 had been detached and were not in place” — Douglass 1922b:3.</w:t>
+        <w:t>XXX “13 cervical vertebrae” reported in #340 — Gilmore 1923b:3.</w:t>
       </w:r>
     </w:p>
     <w:p>
@@ -2119,7 +2389,7 @@
       </w:pPr>
       <w:r>
         <w:rPr/>
-        <w:t>XXX “13 cervical vertebrae” reported in #340 — Gilmore 1923b:3.</w:t>
+        <w:t>XXX Cite all documents sent by Abby Telfer.</w:t>
       </w:r>
     </w:p>
     <w:p>
@@ -2153,8 +2423,8 @@
         <w:ind w:hanging="0" w:left="0" w:right="0"/>
         <w:rPr/>
       </w:pPr>
-      <w:bookmarkStart w:id="7" w:name="__RefHeading___Toc5351_68767826"/>
-      <w:bookmarkEnd w:id="7"/>
+      <w:bookmarkStart w:id="10" w:name="__RefHeading___Toc5351_68767826"/>
+      <w:bookmarkEnd w:id="10"/>
       <w:r>
         <w:rPr/>
         <w:t xml:space="preserve">The AMNH mounted </w:t>
@@ -2172,8 +2442,8 @@
         <w:pStyle w:val="Heading2"/>
         <w:rPr/>
       </w:pPr>
-      <w:bookmarkStart w:id="8" w:name="__RefHeading___Toc5354_68767826"/>
-      <w:bookmarkEnd w:id="8"/>
+      <w:bookmarkStart w:id="11" w:name="__RefHeading___Toc5354_68767826"/>
+      <w:bookmarkEnd w:id="11"/>
       <w:r>
         <w:rPr/>
         <w:t>The conception of the mount</w:t>
@@ -2500,8 +2770,8 @@
         <w:pStyle w:val="Heading2"/>
         <w:rPr/>
       </w:pPr>
-      <w:bookmarkStart w:id="9" w:name="__RefHeading___Toc1099_1709072779"/>
-      <w:bookmarkEnd w:id="9"/>
+      <w:bookmarkStart w:id="12" w:name="__RefHeading___Toc1099_1709072779"/>
+      <w:bookmarkEnd w:id="12"/>
       <w:r>
         <w:rPr>
           <w:i w:val="false"/>
@@ -2637,8 +2907,8 @@
         <w:pStyle w:val="Heading2"/>
         <w:rPr/>
       </w:pPr>
-      <w:bookmarkStart w:id="10" w:name="__RefHeading___Toc18297_68767826"/>
-      <w:bookmarkEnd w:id="10"/>
+      <w:bookmarkStart w:id="13" w:name="__RefHeading___Toc18297_68767826"/>
+      <w:bookmarkEnd w:id="13"/>
       <w:r>
         <w:rPr/>
         <w:t>The creation of the mount</w:t>
@@ -3098,8 +3368,8 @@
         <w:pStyle w:val="Heading2"/>
         <w:rPr/>
       </w:pPr>
-      <w:bookmarkStart w:id="11" w:name="__RefHeading___Toc5632_2187837281"/>
-      <w:bookmarkEnd w:id="11"/>
+      <w:bookmarkStart w:id="14" w:name="__RefHeading___Toc5632_2187837281"/>
+      <w:bookmarkEnd w:id="14"/>
       <w:r>
         <w:rPr/>
         <w:t>Photography of the mount</w:t>
@@ -3141,8 +3411,8 @@
         <w:pStyle w:val="Heading2"/>
         <w:rPr/>
       </w:pPr>
-      <w:bookmarkStart w:id="12" w:name="__RefHeading___Toc5356_68767826"/>
-      <w:bookmarkEnd w:id="12"/>
+      <w:bookmarkStart w:id="15" w:name="__RefHeading___Toc5356_68767826"/>
+      <w:bookmarkEnd w:id="15"/>
       <w:r>
         <w:rPr/>
         <w:t>The composition of the mount</w:t>
@@ -3158,8 +3428,8 @@
         <w:ind w:hanging="0" w:left="0" w:right="0"/>
         <w:rPr/>
       </w:pPr>
-      <w:bookmarkStart w:id="13" w:name="__RefHeading___Toc16585_68767826"/>
-      <w:bookmarkEnd w:id="13"/>
+      <w:bookmarkStart w:id="16" w:name="__RefHeading___Toc16585_68767826"/>
+      <w:bookmarkEnd w:id="16"/>
       <w:r>
         <w:rPr/>
         <w:t>Overview</w:t>
@@ -3224,8 +3494,8 @@
         <w:pStyle w:val="Heading3"/>
         <w:rPr/>
       </w:pPr>
-      <w:bookmarkStart w:id="14" w:name="__RefHeading___Toc4995_537823704"/>
-      <w:bookmarkEnd w:id="14"/>
+      <w:bookmarkStart w:id="17" w:name="__RefHeading___Toc4995_537823704"/>
+      <w:bookmarkEnd w:id="17"/>
       <w:r>
         <w:rPr>
           <w:i/>
@@ -3318,12 +3588,12 @@
         <w:ind w:hanging="360" w:left="720" w:right="0"/>
         <w:rPr/>
       </w:pPr>
-      <w:bookmarkStart w:id="15" w:name="__DdeLink__31298_802501007"/>
+      <w:bookmarkStart w:id="18" w:name="__DdeLink__31298_802501007"/>
       <w:r>
         <w:rPr/>
         <w:t>six partial ribs, of which one is the first or possibly second on the left side, and another is probably its counterpart</w:t>
       </w:r>
-      <w:bookmarkEnd w:id="15"/>
+      <w:bookmarkEnd w:id="18"/>
     </w:p>
     <w:p>
       <w:pPr>
@@ -3512,6 +3782,8 @@
         <w:pStyle w:val="Heading3"/>
         <w:rPr/>
       </w:pPr>
+      <w:bookmarkStart w:id="19" w:name="__RefHeading___Toc25854_1820571732"/>
+      <w:bookmarkEnd w:id="19"/>
       <w:r>
         <w:rPr/>
         <w:t>Non-Barosaurus material in the mount</w:t>
@@ -3620,8 +3892,8 @@
         <w:ind w:hanging="0" w:left="0" w:right="0"/>
         <w:rPr/>
       </w:pPr>
-      <w:bookmarkStart w:id="16" w:name="__RefHeading___Toc16587_68767826"/>
-      <w:bookmarkEnd w:id="16"/>
+      <w:bookmarkStart w:id="20" w:name="__RefHeading___Toc16587_68767826"/>
+      <w:bookmarkEnd w:id="20"/>
       <w:r>
         <w:rPr/>
         <w:t>Skull</w:t>
@@ -3724,8 +3996,8 @@
         <w:ind w:hanging="0" w:left="0" w:right="0"/>
         <w:rPr/>
       </w:pPr>
-      <w:bookmarkStart w:id="17" w:name="__RefHeading___Toc16589_68767826"/>
-      <w:bookmarkEnd w:id="17"/>
+      <w:bookmarkStart w:id="21" w:name="__RefHeading___Toc16589_68767826"/>
+      <w:bookmarkEnd w:id="21"/>
       <w:r>
         <w:rPr/>
         <w:t>Neck</w:t>
@@ -3880,8 +4152,8 @@
         <w:ind w:hanging="0" w:left="0" w:right="0"/>
         <w:rPr/>
       </w:pPr>
-      <w:bookmarkStart w:id="18" w:name="__RefHeading___Toc2466_2187837281"/>
-      <w:bookmarkEnd w:id="18"/>
+      <w:bookmarkStart w:id="22" w:name="__RefHeading___Toc2466_2187837281"/>
+      <w:bookmarkEnd w:id="22"/>
       <w:r>
         <w:rPr/>
         <w:t>Torso, sacrum and tail</w:t>
@@ -3917,8 +4189,8 @@
         <w:ind w:hanging="0" w:left="0" w:right="0"/>
         <w:rPr/>
       </w:pPr>
-      <w:bookmarkStart w:id="19" w:name="__RefHeading___Toc2470_2187837281"/>
-      <w:bookmarkEnd w:id="19"/>
+      <w:bookmarkStart w:id="23" w:name="__RefHeading___Toc2470_2187837281"/>
+      <w:bookmarkEnd w:id="23"/>
       <w:r>
         <w:rPr/>
         <w:t>Forelimbs and girdles</w:t>
@@ -3983,6 +4255,8 @@
         <w:pStyle w:val="Heading3"/>
         <w:rPr/>
       </w:pPr>
+      <w:bookmarkStart w:id="24" w:name="__RefHeading___Toc25856_1820571732"/>
+      <w:bookmarkEnd w:id="24"/>
       <w:r>
         <w:rPr/>
         <w:t>Hindlimbs and girdles</w:t>
@@ -4052,8 +4326,8 @@
         <w:ind w:hanging="0" w:left="0" w:right="0"/>
         <w:rPr/>
       </w:pPr>
-      <w:bookmarkStart w:id="20" w:name="__RefHeading___Toc3401_68767826"/>
-      <w:bookmarkEnd w:id="20"/>
+      <w:bookmarkStart w:id="25" w:name="__RefHeading___Toc3401_68767826"/>
+      <w:bookmarkEnd w:id="25"/>
       <w:r>
         <w:rPr/>
         <w:t>Discussion</w:t>
@@ -4064,8 +4338,8 @@
         <w:pStyle w:val="Heading2"/>
         <w:rPr/>
       </w:pPr>
-      <w:bookmarkStart w:id="21" w:name="__RefHeading___Toc2476_2187837281"/>
-      <w:bookmarkEnd w:id="21"/>
+      <w:bookmarkStart w:id="26" w:name="__RefHeading___Toc2476_2187837281"/>
+      <w:bookmarkEnd w:id="26"/>
       <w:r>
         <w:rPr/>
         <w:t>Rearing pose</w:t>
@@ -4321,8 +4595,8 @@
         <w:pStyle w:val="Heading2"/>
         <w:rPr/>
       </w:pPr>
-      <w:bookmarkStart w:id="22" w:name="__RefHeading___Toc3786_1986291683"/>
-      <w:bookmarkEnd w:id="22"/>
+      <w:bookmarkStart w:id="27" w:name="__RefHeading___Toc3786_1986291683"/>
+      <w:bookmarkEnd w:id="27"/>
       <w:r>
         <w:rPr/>
         <w:t>A short history of rearing sauropods</w:t>
@@ -4821,8 +5095,8 @@
         <w:pStyle w:val="Heading2"/>
         <w:rPr/>
       </w:pPr>
-      <w:bookmarkStart w:id="23" w:name="__RefHeading___Toc11689_675290491"/>
-      <w:bookmarkEnd w:id="23"/>
+      <w:bookmarkStart w:id="28" w:name="__RefHeading___Toc11689_675290491"/>
+      <w:bookmarkEnd w:id="28"/>
       <w:r>
         <w:rPr/>
         <w:t>Cultural impact</w:t>
@@ -5218,8 +5492,8 @@
         <w:pStyle w:val="Heading2"/>
         <w:rPr/>
       </w:pPr>
-      <w:bookmarkStart w:id="24" w:name="__RefHeading___Toc21934_68767826"/>
-      <w:bookmarkEnd w:id="24"/>
+      <w:bookmarkStart w:id="29" w:name="__RefHeading___Toc21934_68767826"/>
+      <w:bookmarkEnd w:id="29"/>
       <w:r>
         <w:rPr/>
         <w:t>Size of the AMNH 6341 animal</w:t>
@@ -5310,8 +5584,8 @@
         <w:ind w:hanging="0" w:left="0" w:right="0"/>
         <w:rPr/>
       </w:pPr>
-      <w:bookmarkStart w:id="25" w:name="__RefHeading___Toc3403_68767826"/>
-      <w:bookmarkEnd w:id="25"/>
+      <w:bookmarkStart w:id="30" w:name="__RefHeading___Toc3403_68767826"/>
+      <w:bookmarkEnd w:id="30"/>
       <w:r>
         <w:rPr/>
         <w:t>Acknowledgements</w:t>
@@ -5413,8 +5687,8 @@
         <w:ind w:hanging="0" w:left="0" w:right="0"/>
         <w:rPr/>
       </w:pPr>
-      <w:bookmarkStart w:id="26" w:name="__RefHeading___Toc3405_68767826"/>
-      <w:bookmarkEnd w:id="26"/>
+      <w:bookmarkStart w:id="31" w:name="__RefHeading___Toc3405_68767826"/>
+      <w:bookmarkEnd w:id="31"/>
       <w:r>
         <w:rPr/>
         <w:t>References</w:t>
@@ -6203,7 +6477,7 @@
         <w:rPr/>
         <w:t xml:space="preserve"> in the United States National Museum. </w:t>
       </w:r>
-      <w:bookmarkStart w:id="27" w:name="__DdeLink__2788_55120580"/>
+      <w:bookmarkStart w:id="32" w:name="__DdeLink__2788_55120580"/>
       <w:r>
         <w:rPr>
           <w:i/>
@@ -6211,7 +6485,7 @@
         </w:rPr>
         <w:t>Proceedings of the United States National Museum</w:t>
       </w:r>
-      <w:bookmarkEnd w:id="27"/>
+      <w:bookmarkEnd w:id="32"/>
       <w:r>
         <w:rPr/>
         <w:t xml:space="preserve"> </w:t>
@@ -7176,12 +7450,12 @@
         <w:pStyle w:val="Reference"/>
         <w:rPr/>
       </w:pPr>
-      <w:bookmarkStart w:id="28" w:name="__DdeLink__16582_68767826"/>
+      <w:bookmarkStart w:id="33" w:name="__DdeLink__16582_68767826"/>
       <w:r>
         <w:rPr/>
         <w:t>Nieuwland</w:t>
       </w:r>
-      <w:bookmarkEnd w:id="28"/>
+      <w:bookmarkEnd w:id="33"/>
       <w:r>
         <w:rPr/>
         <w:t xml:space="preserve">, Ilja. 2019. </w:t>
@@ -8004,8 +8278,8 @@
         <w:ind w:hanging="0" w:left="0" w:right="0"/>
         <w:rPr/>
       </w:pPr>
-      <w:bookmarkStart w:id="29" w:name="__RefHeading___Toc3407_68767826"/>
-      <w:bookmarkEnd w:id="29"/>
+      <w:bookmarkStart w:id="34" w:name="__RefHeading___Toc3407_68767826"/>
+      <w:bookmarkEnd w:id="34"/>
       <w:r>
         <w:rPr/>
         <w:t>Figure Captions</w:t>
@@ -8944,6 +9218,8 @@
         <w:pStyle w:val="Heading1"/>
         <w:rPr/>
       </w:pPr>
+      <w:bookmarkStart w:id="35" w:name="__RefHeading___Toc25858_1820571732"/>
+      <w:bookmarkEnd w:id="35"/>
       <w:r>
         <w:rPr/>
         <w:t>Tables</w:t>
@@ -8954,6 +9230,8 @@
         <w:pStyle w:val="Heading2"/>
         <w:rPr/>
       </w:pPr>
+      <w:bookmarkStart w:id="36" w:name="__RefHeading___Toc25860_1820571732"/>
+      <w:bookmarkEnd w:id="36"/>
       <w:r>
         <w:rPr/>
         <w:t>Table 1</w:t>

</xml_diff>

<commit_message>
Remove comment on arterial peristalsis
</commit_message>
<xml_diff>
--- a/TaylorEtAl-mounted-barosaurus.docx
+++ b/TaylorEtAl-mounted-barosaurus.docx
@@ -1925,63 +1925,7 @@
       </w:pPr>
       <w:r>
         <w:rPr/>
-        <w:t xml:space="preserve">USNM’s only interest in #340 was apparently in using elements of the skeleton to complete #355 for a gallery mount (Gilmore 1923b:1), so only the cervicals, three anterior dorsals, right scapula, humerus and radius </w:t>
-      </w:r>
-      <w:r>
-        <w:rPr/>
-        <w:t xml:space="preserve">and a sternal plate </w:t>
-      </w:r>
-      <w:r>
-        <w:rPr/>
-        <w:t xml:space="preserve">were sent there (Gilmore 1923b:3). </w:t>
-      </w:r>
-      <w:r>
-        <w:rPr/>
-        <w:t xml:space="preserve">Some material of #340 went to the Carnegie Museum:  (Gilmore 1923b:1) </w:t>
-      </w:r>
-      <w:r>
-        <w:rPr/>
-        <w:t>wrote that</w:t>
-      </w:r>
-      <w:r>
-        <w:rPr/>
-        <w:t xml:space="preserve"> “</w:t>
-      </w:r>
-      <w:r>
-        <w:rPr/>
-        <w:t xml:space="preserve">One block belonging to this specimen was shipped to Pittsburgh, but will, I understand, be turned over to the National Museum as soon as certain bones of another individual are extracted from it”. </w:t>
-      </w:r>
-      <w:r>
-        <w:rPr/>
-        <w:t xml:space="preserve">It seems however that at least </w:t>
-      </w:r>
-      <w:r>
-        <w:rPr/>
-        <w:t>three</w:t>
-      </w:r>
-      <w:r>
-        <w:rPr/>
-        <w:t xml:space="preserve"> blocks went to Pittsburgh. One, containing part of the neck, was shipped from there to the USNM in October 1924 (Coggeshall 1924); but there </w:t>
-      </w:r>
-      <w:r>
-        <w:rPr/>
-        <w:t xml:space="preserve">were </w:t>
-      </w:r>
-      <w:r>
-        <w:rPr/>
-        <w:t xml:space="preserve">also </w:t>
-      </w:r>
-      <w:r>
-        <w:rPr/>
-        <w:t xml:space="preserve">caudals, which would still be at the Carnegie at the end of 1929: </w:t>
-      </w:r>
-      <w:r>
-        <w:rPr/>
-        <w:t>“</w:t>
-      </w:r>
-      <w:r>
-        <w:rPr/>
-        <w:t>nine or ten vertebrae in the Carnegie Museum are preserved  in two blocks 348/A and 348/B” (Brown 1929).</w:t>
+        <w:t>USNM’s only interest in #340 was apparently in using elements of the skeleton to complete #355 for a gallery mount (Gilmore 1923b:1), so only the cervicals, three anterior dorsals, right scapula, humerus and radius and a sternal plate were sent there (Gilmore 1923b:3). Some material of #340 went to the Carnegie Museum:  (Gilmore 1923b:1) wrote that “One block belonging to this specimen was shipped to Pittsburgh, but will, I understand, be turned over to the National Museum as soon as certain bones of another individual are extracted from it”. It seems however that at least three blocks went to Pittsburgh. One, containing part of the neck, was shipped from there to the USNM in October 1924 (Coggeshall 1924); but there were also caudals, which would still be at the Carnegie at the end of 1929: “nine or ten vertebrae in the Carnegie Museum are preserved  in two blocks 348/A and 348/B” (Brown 1929).</w:t>
       </w:r>
     </w:p>
     <w:p>
@@ -2001,15 +1945,7 @@
       </w:pPr>
       <w:r>
         <w:rPr/>
-        <w:t xml:space="preserve">The material in Washington was accessioned as USNM 11647 on 11 April 1927 (Abby Telfer, pers. comm., 2025). When it was prepared, what had been thought in the field to be two cervicals proved to be a single long cervical (McIntosh 2005:43). It was then apparent that the </w:t>
-      </w:r>
-      <w:r>
-        <w:rPr/>
-        <w:t xml:space="preserve">cervicals </w:t>
-      </w:r>
-      <w:r>
-        <w:rPr/>
-        <w:t xml:space="preserve">(and the rest of #340) did not belong to </w:t>
+        <w:t xml:space="preserve">The material in Washington was accessioned as USNM 11647 on 11 April 1927 (Abby Telfer, pers. comm., 2025). When it was prepared, what had been thought in the field to be two cervicals proved to be a single long cervical (McIntosh 2005:43). It was then apparent that the cervicals (and the rest of #340) did not belong to </w:t>
       </w:r>
       <w:r>
         <w:rPr>
@@ -2064,19 +2000,7 @@
       </w:pPr>
       <w:r>
         <w:rPr/>
-        <w:t>l</w:t>
-      </w:r>
-      <w:r>
-        <w:rPr/>
-        <w:t xml:space="preserve">In 1929, Barnum Brown, acting for the American Museum of Natural History, visited most of the nation’s major natural history museums to assess their collections. He realised that the neck, anterior torso and forelimb material at the USNM, and the tail segment </w:t>
-      </w:r>
-      <w:r>
-        <w:rPr/>
-        <w:t xml:space="preserve">still </w:t>
-      </w:r>
-      <w:r>
-        <w:rPr/>
-        <w:t xml:space="preserve">at the Carnegie, belonged to the same individual as the partial skeleton at the University of Utah. Brown negotiated separately with representatives of all three museums to acquire the three portions of this skeleton, and was able to reunite the whole of Douglass’s skeleton in New York at the AMNH, a museum that had had no part in its excavation or early history. Brown arranged complex multipart deals: while the USNM accepted a straight swap for their part of the </w:t>
+        <w:t xml:space="preserve">lIn 1929, Barnum Brown, acting for the American Museum of Natural History, visited most of the nation’s major natural history museums to assess their collections. He realised that the neck, anterior torso and forelimb material at the USNM, and the tail segment still at the Carnegie, belonged to the same individual as the partial skeleton at the University of Utah. Brown negotiated separately with representatives of all three museums to acquire the three portions of this skeleton, and was able to reunite the whole of Douglass’s skeleton in New York at the AMNH, a museum that had had no part in its excavation or early history. Brown arranged complex multipart deals: while the USNM accepted a straight swap for their part of the </w:t>
       </w:r>
       <w:r>
         <w:rPr>
@@ -2098,31 +2022,7 @@
       </w:r>
       <w:r>
         <w:rPr/>
-        <w:t xml:space="preserve">, the University of Utah made a cash-plus-fossils deal in which they were paid $2,500 cash plus the equivalent value in fossil mammal specimens (Brown 1929). </w:t>
-      </w:r>
-      <w:r>
-        <w:rPr/>
-        <w:t>The process of bringing the skeleton back together dragged on: the thirteen crates of material at the USNM w</w:t>
-      </w:r>
-      <w:r>
-        <w:rPr/>
-        <w:t>ere</w:t>
-      </w:r>
-      <w:r>
-        <w:rPr/>
-        <w:t xml:space="preserve"> transported to the AMNH </w:t>
-      </w:r>
-      <w:r>
-        <w:rPr/>
-        <w:t xml:space="preserve">only in </w:t>
-      </w:r>
-      <w:r>
-        <w:rPr/>
-        <w:t xml:space="preserve">February 1933 (Wetmore 1933), </w:t>
-      </w:r>
-      <w:r>
-        <w:rPr/>
-        <w:t xml:space="preserve">perhaps because Wetmore himself — Secretary of the USNM — did “not favour disposal of this </w:t>
+        <w:t xml:space="preserve">, the University of Utah made a cash-plus-fossils deal in which they were paid $2,500 cash plus the equivalent value in fossil mammal specimens (Brown 1929). The process of bringing the skeleton back together dragged on: the thirteen crates of material at the USNM were transported to the AMNH only in February 1933 (Wetmore 1933), perhaps because Wetmore himself — Secretary of the USNM — did “not favour disposal of this </w:t>
       </w:r>
       <w:r>
         <w:rPr>
@@ -2133,23 +2033,7 @@
       </w:r>
       <w:r>
         <w:rPr/>
-        <w:t xml:space="preserve"> neck” (Gilmore, reported in Brown 1929)</w:t>
-      </w:r>
-      <w:r>
-        <w:rPr/>
-        <w:t xml:space="preserve">. </w:t>
-      </w:r>
-      <w:r>
-        <w:rPr/>
-        <w:t>The reunited s</w:t>
-      </w:r>
-      <w:r>
-        <w:rPr/>
-        <w:t xml:space="preserve">pecimen </w:t>
-      </w:r>
-      <w:r>
-        <w:rPr/>
-        <w:t>was given the specimen number AMNH 6341. (See Norell et al. 1991:36–38, Dingus 1996:21–22, McIntosh 2005:42–43).</w:t>
+        <w:t xml:space="preserve"> neck” (Gilmore, reported in Brown 1929). The reunited specimen was given the specimen number AMNH 6341. (See Norell et al. 1991:36–38, Dingus 1996:21–22, McIntosh 2005:42–43).</w:t>
       </w:r>
     </w:p>
     <w:p>
@@ -2159,15 +2043,7 @@
       </w:pPr>
       <w:r>
         <w:rPr/>
-        <w:t xml:space="preserve">Brown’s (1929) memorandum on the trading he did for fossils </w:t>
-      </w:r>
-      <w:r>
-        <w:rPr/>
-        <w:t xml:space="preserve">provided </w:t>
-      </w:r>
-      <w:r>
-        <w:rPr/>
-        <w:t xml:space="preserve">a list of </w:t>
+        <w:t xml:space="preserve">Brown’s (1929) memorandum on the trading he did for fossils provided a list of </w:t>
       </w:r>
       <w:r>
         <w:rPr>
@@ -2178,31 +2054,7 @@
       </w:r>
       <w:r>
         <w:rPr/>
-        <w:t xml:space="preserve"> material at the USNM rather different than that which Gilmore (1923b:3) </w:t>
-      </w:r>
-      <w:r>
-        <w:rPr/>
-        <w:t xml:space="preserve">had </w:t>
-      </w:r>
-      <w:r>
-        <w:rPr/>
-        <w:t xml:space="preserve">specified when sending the fossils there. Where Gilmore had listed 13 cervicals, three dorsals, right scapula, humerus and radius and a sternal plate, Brown listed 10 cervicals, three anterior dorsals, left scapula and humerus. </w:t>
-      </w:r>
-      <w:r>
-        <w:rPr/>
-        <w:t>T</w:t>
-      </w:r>
-      <w:r>
-        <w:rPr/>
-        <w:t xml:space="preserve">he left/right differences for the appendicular material are </w:t>
-      </w:r>
-      <w:r>
-        <w:rPr/>
-        <w:t>simply errors on Brown’s part (see below)</w:t>
-      </w:r>
-      <w:r>
-        <w:rPr/>
-        <w:t>. The radius and sternal plate mentioned by Gilmore seem to have gone missing: they are not included in the material list below. It is possible that they still lurk unrecognised in the USNM collections.</w:t>
+        <w:t xml:space="preserve"> material at the USNM rather different than that which Gilmore (1923b:3) had specified when sending the fossils there. Where Gilmore had listed 13 cervicals, three dorsals, right scapula, humerus and radius and a sternal plate, Brown listed 10 cervicals, three anterior dorsals, left scapula and humerus. The left/right differences for the appendicular material are simply errors on Brown’s part (see below). The radius and sternal plate mentioned by Gilmore seem to have gone missing: they are not included in the material list below. It is possible that they still lurk unrecognised in the USNM collections.</w:t>
       </w:r>
     </w:p>
     <w:p>
@@ -2212,51 +2064,7 @@
       </w:pPr>
       <w:r>
         <w:rPr/>
-        <w:t xml:space="preserve">The issue of the number of cervicals is complex. Gilmore’s count of 13 cervicals is compatible with Douglass’s (1922b:3) report that </w:t>
-      </w:r>
-      <w:r>
-        <w:rPr/>
-        <w:t>“</w:t>
-      </w:r>
-      <w:r>
-        <w:rPr/>
-        <w:t>t</w:t>
-      </w:r>
-      <w:r>
-        <w:rPr/>
-        <w:t xml:space="preserve">he skull and two or three of the anterior cervicals of no. 340 had been detached and were not in place” — </w:t>
-      </w:r>
-      <w:r>
-        <w:rPr/>
-        <w:t xml:space="preserve">an absence that would leave 13 cervicals remaining in an animal with 15 of 16 </w:t>
-      </w:r>
-      <w:r>
-        <w:rPr/>
-        <w:t> </w:t>
-      </w:r>
-      <w:r>
-        <w:rPr/>
-        <w:t xml:space="preserve">neck vertebrae. The reduction to 10 in Brown’s list, made after the material had been prepared at USNM, </w:t>
-      </w:r>
-      <w:r>
-        <w:rPr/>
-        <w:t xml:space="preserve">can be explained as a consequence of supposed pairs turning out to be single long vertebrae. </w:t>
-      </w:r>
-      <w:r>
-        <w:rPr/>
-        <w:t xml:space="preserve">This count is also in accord with </w:t>
-      </w:r>
-      <w:r>
-        <w:rPr/>
-        <w:t xml:space="preserve">the quarry map of Gilmore (1932:figure 1; </w:t>
-      </w:r>
-      <w:r>
-        <w:rPr/>
-        <w:t>Figure P). This</w:t>
-      </w:r>
-      <w:r>
-        <w:rPr/>
-        <w:t xml:space="preserve"> shows nine dorsals and ten cervicals belonging to the </w:t>
+        <w:t xml:space="preserve">The issue of the number of cervicals is complex. Gilmore’s count of 13 cervicals is compatible with Douglass’s (1922b:3) report that “the skull and two or three of the anterior cervicals of no. 340 had been detached and were not in place” — an absence that would leave 13 cervicals remaining in an animal with 15 of 16  neck vertebrae. The reduction to 10 in Brown’s list, made after the material had been prepared at USNM, can be explained as a consequence of supposed pairs turning out to be single long vertebrae. This count is also in accord with the quarry map of Gilmore (1932:figure 1; Figure P). This shows nine dorsals and ten cervicals belonging to the </w:t>
       </w:r>
       <w:r>
         <w:rPr>
@@ -2267,39 +2075,7 @@
       </w:r>
       <w:r>
         <w:rPr/>
-        <w:t xml:space="preserve"> skeleton </w:t>
-      </w:r>
-      <w:r>
-        <w:rPr/>
-        <w:t>(although the line-drawings of the cervicals do not at all resemble the actual vertebrae: compare Figure R)</w:t>
-      </w:r>
-      <w:r>
-        <w:rPr/>
-        <w:t>. If th</w:t>
-      </w:r>
-      <w:r>
-        <w:rPr/>
-        <w:t>e cervical count of ten in the quarry map and Brown’s memo</w:t>
-      </w:r>
-      <w:r>
-        <w:rPr/>
-        <w:t xml:space="preserve"> is correct, the most anterior of the </w:t>
-      </w:r>
-      <w:r>
-        <w:rPr/>
-        <w:t>cervicals</w:t>
-      </w:r>
-      <w:r>
-        <w:rPr/>
-        <w:t xml:space="preserve"> (C7) seems to have been lost or destroyed, </w:t>
-      </w:r>
-      <w:r>
-        <w:rPr/>
-        <w:t>since</w:t>
-      </w:r>
-      <w:r>
-        <w:rPr/>
-        <w:t xml:space="preserve"> McIntosh’s unpublished 1962 notes, his published account (McIntosh 2005) and the present fossil holdings at the AMNH all include only nine cervical vertebrae, C8–16. Carl Mehling (pers. comm., 2022) has searched in collections for the missing C7 and been unable to locate it. In fact, the C7, if it ever existed, was likely lost or destroyed prior to the 1939 renovation: contemporary photographs (Figure D.B) show the anteriormost cervical vertebra on display, and it is recognizable as the C8 that is the anteriormost currently preserved vertebra.</w:t>
+        <w:t xml:space="preserve"> skeleton (although the line-drawings of the cervicals do not at all resemble the actual vertebrae: compare Figure R). If the cervical count of ten in the quarry map and Brown’s memo is correct, the most anterior of the cervicals (C7) seems to have been lost or destroyed, since McIntosh’s unpublished 1962 notes, his published account (McIntosh 2005) and the present fossil holdings at the AMNH all include only nine cervical vertebrae, C8–16. Carl Mehling (pers. comm., 2022) has searched in collections for the missing C7 and been unable to locate it. In fact, the C7, if it ever existed, was likely lost or destroyed prior to the 1939 renovation: contemporary photographs (Figure D.B) show the anteriormost cervical vertebra on display, and it is recognizable as the C8 that is the anteriormost currently preserved vertebra.</w:t>
       </w:r>
     </w:p>
     <w:p>
@@ -2724,7 +2500,7 @@
     </w:p>
     <w:p>
       <w:pPr>
-        <w:pStyle w:val="BlockQuotation"/>
+        <w:pStyle w:val="BlockQuotationuser"/>
         <w:rPr/>
       </w:pPr>
       <w:r>
@@ -3287,7 +3063,7 @@
     </w:p>
     <w:p>
       <w:pPr>
-        <w:pStyle w:val="BlockQuotation"/>
+        <w:pStyle w:val="BlockQuotationuser"/>
         <w:rPr/>
       </w:pPr>
       <w:r>
@@ -4434,16 +4210,6 @@
       </w:pPr>
       <w:r>
         <w:rPr/>
-        <w:t>XXX discuss the possibility of arterial peristalsis.</w:t>
-      </w:r>
-    </w:p>
-    <w:p>
-      <w:pPr>
-        <w:pStyle w:val="BodyText"/>
-        <w:rPr/>
-      </w:pPr>
-      <w:r>
-        <w:rPr/>
         <w:t xml:space="preserve">Separately from the </w:t>
       </w:r>
       <w:r>
@@ -5563,11 +5329,7 @@
       </w:pPr>
       <w:r>
         <w:rPr/>
-        <w:t xml:space="preserve">XXX Acknowledge archives people at AMNH and contact at USNM </w:t>
-      </w:r>
-      <w:r>
-        <w:rPr/>
-        <w:t>and everyone in directory</w:t>
+        <w:t>XXX Acknowledge archives people at AMNH and contact at USNM and everyone in directory</w:t>
       </w:r>
     </w:p>
     <w:p>
@@ -8120,15 +7882,7 @@
       </w:r>
       <w:r>
         <w:rPr/>
-        <w:t xml:space="preserve"> material ha</w:t>
-      </w:r>
-      <w:r>
-        <w:rPr/>
-        <w:t>d</w:t>
-      </w:r>
-      <w:r>
-        <w:rPr/>
-        <w:t xml:space="preserve"> been sent to the AMNH.</w:t>
+        <w:t xml:space="preserve"> material had been sent to the AMNH.</w:t>
       </w:r>
     </w:p>
     <w:p>
@@ -8588,7 +8342,7 @@
     </w:p>
     <w:p>
       <w:pPr>
-        <w:pStyle w:val="BlockQuotation"/>
+        <w:pStyle w:val="BlockQuotationuser"/>
         <w:rPr/>
       </w:pPr>
       <w:r>
@@ -8621,7 +8375,7 @@
         <w:pStyle w:val="FigureCaption"/>
         <w:widowControl/>
         <w:suppressAutoHyphens w:val="true"/>
-        <w:overflowPunct w:val="false"/>
+        <w:overflowPunct w:val="true"/>
         <w:bidi w:val="0"/>
         <w:spacing w:lineRule="auto" w:line="276" w:before="0" w:after="142"/>
         <w:ind w:hanging="0" w:left="283" w:right="0"/>
@@ -9206,8 +8960,8 @@
         </w:tblCellMar>
       </w:tblPr>
       <w:tblGrid>
-        <w:gridCol w:w="2293"/>
-        <w:gridCol w:w="7719"/>
+        <w:gridCol w:w="2207"/>
+        <w:gridCol w:w="7431"/>
       </w:tblGrid>
       <w:tr>
         <w:trPr>
@@ -9215,7 +8969,7 @@
         </w:trPr>
         <w:tc>
           <w:tcPr>
-            <w:tcW w:w="2293" w:type="dxa"/>
+            <w:tcW w:w="2207" w:type="dxa"/>
             <w:tcBorders/>
           </w:tcPr>
           <w:p>
@@ -9232,7 +8986,7 @@
         </w:tc>
         <w:tc>
           <w:tcPr>
-            <w:tcW w:w="7719" w:type="dxa"/>
+            <w:tcW w:w="7431" w:type="dxa"/>
             <w:tcBorders/>
           </w:tcPr>
           <w:p>
@@ -9254,7 +9008,7 @@
         </w:trPr>
         <w:tc>
           <w:tcPr>
-            <w:tcW w:w="2293" w:type="dxa"/>
+            <w:tcW w:w="2207" w:type="dxa"/>
             <w:tcBorders/>
           </w:tcPr>
           <w:p>
@@ -9271,7 +9025,7 @@
         </w:tc>
         <w:tc>
           <w:tcPr>
-            <w:tcW w:w="7719" w:type="dxa"/>
+            <w:tcW w:w="7431" w:type="dxa"/>
             <w:tcBorders/>
           </w:tcPr>
           <w:p>
@@ -9306,7 +9060,7 @@
         </w:trPr>
         <w:tc>
           <w:tcPr>
-            <w:tcW w:w="2293" w:type="dxa"/>
+            <w:tcW w:w="2207" w:type="dxa"/>
             <w:tcBorders/>
           </w:tcPr>
           <w:p>
@@ -9323,7 +9077,7 @@
         </w:tc>
         <w:tc>
           <w:tcPr>
-            <w:tcW w:w="7719" w:type="dxa"/>
+            <w:tcW w:w="7431" w:type="dxa"/>
             <w:tcBorders/>
           </w:tcPr>
           <w:p>
@@ -9347,7 +9101,7 @@
         </w:trPr>
         <w:tc>
           <w:tcPr>
-            <w:tcW w:w="2293" w:type="dxa"/>
+            <w:tcW w:w="2207" w:type="dxa"/>
             <w:tcBorders/>
           </w:tcPr>
           <w:p>
@@ -9364,7 +9118,7 @@
         </w:tc>
         <w:tc>
           <w:tcPr>
-            <w:tcW w:w="7719" w:type="dxa"/>
+            <w:tcW w:w="7431" w:type="dxa"/>
             <w:tcBorders/>
           </w:tcPr>
           <w:p>
@@ -9397,7 +9151,7 @@
         </w:trPr>
         <w:tc>
           <w:tcPr>
-            <w:tcW w:w="2293" w:type="dxa"/>
+            <w:tcW w:w="2207" w:type="dxa"/>
             <w:tcBorders/>
           </w:tcPr>
           <w:p>
@@ -9414,7 +9168,7 @@
         </w:tc>
         <w:tc>
           <w:tcPr>
-            <w:tcW w:w="7719" w:type="dxa"/>
+            <w:tcW w:w="7431" w:type="dxa"/>
             <w:tcBorders/>
           </w:tcPr>
           <w:p>
@@ -9436,7 +9190,7 @@
         </w:trPr>
         <w:tc>
           <w:tcPr>
-            <w:tcW w:w="2293" w:type="dxa"/>
+            <w:tcW w:w="2207" w:type="dxa"/>
             <w:tcBorders/>
           </w:tcPr>
           <w:p>
@@ -9453,7 +9207,7 @@
         </w:tc>
         <w:tc>
           <w:tcPr>
-            <w:tcW w:w="7719" w:type="dxa"/>
+            <w:tcW w:w="7431" w:type="dxa"/>
             <w:tcBorders/>
           </w:tcPr>
           <w:p>
@@ -9486,7 +9240,7 @@
         </w:trPr>
         <w:tc>
           <w:tcPr>
-            <w:tcW w:w="2293" w:type="dxa"/>
+            <w:tcW w:w="2207" w:type="dxa"/>
             <w:tcBorders/>
           </w:tcPr>
           <w:p>
@@ -9503,7 +9257,7 @@
         </w:tc>
         <w:tc>
           <w:tcPr>
-            <w:tcW w:w="7719" w:type="dxa"/>
+            <w:tcW w:w="7431" w:type="dxa"/>
             <w:tcBorders/>
           </w:tcPr>
           <w:p>
@@ -9536,7 +9290,7 @@
         </w:trPr>
         <w:tc>
           <w:tcPr>
-            <w:tcW w:w="2293" w:type="dxa"/>
+            <w:tcW w:w="2207" w:type="dxa"/>
             <w:tcBorders/>
           </w:tcPr>
           <w:p>
@@ -9553,7 +9307,7 @@
         </w:tc>
         <w:tc>
           <w:tcPr>
-            <w:tcW w:w="7719" w:type="dxa"/>
+            <w:tcW w:w="7431" w:type="dxa"/>
             <w:tcBorders/>
           </w:tcPr>
           <w:p>
@@ -9586,7 +9340,7 @@
         </w:trPr>
         <w:tc>
           <w:tcPr>
-            <w:tcW w:w="2293" w:type="dxa"/>
+            <w:tcW w:w="2207" w:type="dxa"/>
             <w:tcBorders/>
           </w:tcPr>
           <w:p>
@@ -9603,7 +9357,7 @@
         </w:tc>
         <w:tc>
           <w:tcPr>
-            <w:tcW w:w="7719" w:type="dxa"/>
+            <w:tcW w:w="7431" w:type="dxa"/>
             <w:tcBorders/>
           </w:tcPr>
           <w:p>
@@ -9625,7 +9379,7 @@
         </w:trPr>
         <w:tc>
           <w:tcPr>
-            <w:tcW w:w="2293" w:type="dxa"/>
+            <w:tcW w:w="2207" w:type="dxa"/>
             <w:tcBorders/>
           </w:tcPr>
           <w:p>
@@ -9642,7 +9396,7 @@
         </w:tc>
         <w:tc>
           <w:tcPr>
-            <w:tcW w:w="7719" w:type="dxa"/>
+            <w:tcW w:w="7431" w:type="dxa"/>
             <w:tcBorders/>
           </w:tcPr>
           <w:p>
@@ -9664,7 +9418,7 @@
         </w:trPr>
         <w:tc>
           <w:tcPr>
-            <w:tcW w:w="2293" w:type="dxa"/>
+            <w:tcW w:w="2207" w:type="dxa"/>
             <w:tcBorders/>
           </w:tcPr>
           <w:p>
@@ -9681,7 +9435,7 @@
         </w:tc>
         <w:tc>
           <w:tcPr>
-            <w:tcW w:w="7719" w:type="dxa"/>
+            <w:tcW w:w="7431" w:type="dxa"/>
             <w:tcBorders/>
           </w:tcPr>
           <w:p>
@@ -9747,7 +9501,7 @@
         </w:trPr>
         <w:tc>
           <w:tcPr>
-            <w:tcW w:w="2293" w:type="dxa"/>
+            <w:tcW w:w="2207" w:type="dxa"/>
             <w:tcBorders/>
           </w:tcPr>
           <w:p>
@@ -9764,7 +9518,7 @@
         </w:tc>
         <w:tc>
           <w:tcPr>
-            <w:tcW w:w="7719" w:type="dxa"/>
+            <w:tcW w:w="7431" w:type="dxa"/>
             <w:tcBorders/>
           </w:tcPr>
           <w:p>
@@ -9797,7 +9551,7 @@
         </w:trPr>
         <w:tc>
           <w:tcPr>
-            <w:tcW w:w="2293" w:type="dxa"/>
+            <w:tcW w:w="2207" w:type="dxa"/>
             <w:tcBorders/>
           </w:tcPr>
           <w:p>
@@ -9808,17 +9562,13 @@
             </w:pPr>
             <w:r>
               <w:rPr/>
-              <w:t>192</w:t>
-            </w:r>
-            <w:r>
-              <w:rPr/>
-              <w:t>3</w:t>
+              <w:t>1923</w:t>
             </w:r>
           </w:p>
         </w:tc>
         <w:tc>
           <w:tcPr>
-            <w:tcW w:w="7719" w:type="dxa"/>
+            <w:tcW w:w="7431" w:type="dxa"/>
             <w:tcBorders/>
           </w:tcPr>
           <w:p>
@@ -9840,15 +9590,7 @@
             </w:r>
             <w:r>
               <w:rPr/>
-              <w:t xml:space="preserve"> skeletal mount based on USNM 10865 </w:t>
-            </w:r>
-            <w:r>
-              <w:rPr/>
-              <w:t>(#355)</w:t>
-            </w:r>
-            <w:r>
-              <w:rPr/>
-              <w:t xml:space="preserve">. When prepared, the neck sent to the USNM proved to belong not to </w:t>
+              <w:t xml:space="preserve"> skeletal mount based on USNM 10865 (#355). When prepared, the neck sent to the USNM proved to belong not to </w:t>
             </w:r>
             <w:r>
               <w:rPr>
@@ -9881,7 +9623,7 @@
         </w:trPr>
         <w:tc>
           <w:tcPr>
-            <w:tcW w:w="2293" w:type="dxa"/>
+            <w:tcW w:w="2207" w:type="dxa"/>
             <w:tcBorders/>
           </w:tcPr>
           <w:p>
@@ -9898,7 +9640,7 @@
         </w:tc>
         <w:tc>
           <w:tcPr>
-            <w:tcW w:w="7719" w:type="dxa"/>
+            <w:tcW w:w="7431" w:type="dxa"/>
             <w:tcBorders/>
           </w:tcPr>
           <w:p>
@@ -9909,23 +9651,7 @@
             </w:pPr>
             <w:r>
               <w:rPr/>
-              <w:t xml:space="preserve">Barnum Brown realised that the USNM neck and the Carnegie tail belonged to the same individual as the partial skeleton at the University of Utah. He </w:t>
-            </w:r>
-            <w:r>
-              <w:rPr/>
-              <w:t xml:space="preserve">negotiated to </w:t>
-            </w:r>
-            <w:r>
-              <w:rPr/>
-              <w:t xml:space="preserve">acquire all three three portions of this skeleton </w:t>
-            </w:r>
-            <w:r>
-              <w:rPr/>
-              <w:t xml:space="preserve">for </w:t>
-            </w:r>
-            <w:r>
-              <w:rPr/>
-              <w:t>the American Museum of Natural History (AMNH) in New York.</w:t>
+              <w:t>Barnum Brown realised that the USNM neck and the Carnegie tail belonged to the same individual as the partial skeleton at the University of Utah. He negotiated to acquire all three three portions of this skeleton for the American Museum of Natural History (AMNH) in New York.</w:t>
             </w:r>
           </w:p>
         </w:tc>
@@ -9936,7 +9662,7 @@
         </w:trPr>
         <w:tc>
           <w:tcPr>
-            <w:tcW w:w="2293" w:type="dxa"/>
+            <w:tcW w:w="2207" w:type="dxa"/>
             <w:tcBorders/>
           </w:tcPr>
           <w:p>
@@ -9953,7 +9679,7 @@
         </w:tc>
         <w:tc>
           <w:tcPr>
-            <w:tcW w:w="7719" w:type="dxa"/>
+            <w:tcW w:w="7431" w:type="dxa"/>
             <w:tcBorders/>
           </w:tcPr>
           <w:p>
@@ -9975,7 +9701,7 @@
         </w:trPr>
         <w:tc>
           <w:tcPr>
-            <w:tcW w:w="2293" w:type="dxa"/>
+            <w:tcW w:w="2207" w:type="dxa"/>
             <w:tcBorders/>
           </w:tcPr>
           <w:p>
@@ -9992,7 +9718,7 @@
         </w:tc>
         <w:tc>
           <w:tcPr>
-            <w:tcW w:w="7719" w:type="dxa"/>
+            <w:tcW w:w="7431" w:type="dxa"/>
             <w:tcBorders/>
           </w:tcPr>
           <w:p>
@@ -10014,7 +9740,7 @@
         </w:trPr>
         <w:tc>
           <w:tcPr>
-            <w:tcW w:w="2293" w:type="dxa"/>
+            <w:tcW w:w="2207" w:type="dxa"/>
             <w:tcBorders/>
           </w:tcPr>
           <w:p>
@@ -10031,7 +9757,7 @@
         </w:tc>
         <w:tc>
           <w:tcPr>
-            <w:tcW w:w="7719" w:type="dxa"/>
+            <w:tcW w:w="7431" w:type="dxa"/>
             <w:tcBorders/>
           </w:tcPr>
           <w:p>
@@ -10053,7 +9779,7 @@
         </w:trPr>
         <w:tc>
           <w:tcPr>
-            <w:tcW w:w="2293" w:type="dxa"/>
+            <w:tcW w:w="2207" w:type="dxa"/>
             <w:tcBorders/>
           </w:tcPr>
           <w:p>
@@ -10070,7 +9796,7 @@
         </w:tc>
         <w:tc>
           <w:tcPr>
-            <w:tcW w:w="7719" w:type="dxa"/>
+            <w:tcW w:w="7431" w:type="dxa"/>
             <w:tcBorders/>
           </w:tcPr>
           <w:p>
@@ -10092,7 +9818,7 @@
         </w:trPr>
         <w:tc>
           <w:tcPr>
-            <w:tcW w:w="2293" w:type="dxa"/>
+            <w:tcW w:w="2207" w:type="dxa"/>
             <w:tcBorders/>
           </w:tcPr>
           <w:p>
@@ -10109,7 +9835,7 @@
         </w:tc>
         <w:tc>
           <w:tcPr>
-            <w:tcW w:w="7719" w:type="dxa"/>
+            <w:tcW w:w="7431" w:type="dxa"/>
             <w:tcBorders/>
           </w:tcPr>
           <w:p>
@@ -10142,7 +9868,7 @@
         </w:trPr>
         <w:tc>
           <w:tcPr>
-            <w:tcW w:w="2293" w:type="dxa"/>
+            <w:tcW w:w="2207" w:type="dxa"/>
             <w:tcBorders/>
           </w:tcPr>
           <w:p>
@@ -10159,7 +9885,7 @@
         </w:tc>
         <w:tc>
           <w:tcPr>
-            <w:tcW w:w="7719" w:type="dxa"/>
+            <w:tcW w:w="7431" w:type="dxa"/>
             <w:tcBorders/>
           </w:tcPr>
           <w:p>
@@ -10192,7 +9918,7 @@
         </w:trPr>
         <w:tc>
           <w:tcPr>
-            <w:tcW w:w="2293" w:type="dxa"/>
+            <w:tcW w:w="2207" w:type="dxa"/>
             <w:tcBorders/>
           </w:tcPr>
           <w:p>
@@ -10209,7 +9935,7 @@
         </w:tc>
         <w:tc>
           <w:tcPr>
-            <w:tcW w:w="7719" w:type="dxa"/>
+            <w:tcW w:w="7431" w:type="dxa"/>
             <w:tcBorders/>
           </w:tcPr>
           <w:p>
@@ -10231,7 +9957,7 @@
         </w:trPr>
         <w:tc>
           <w:tcPr>
-            <w:tcW w:w="2293" w:type="dxa"/>
+            <w:tcW w:w="2207" w:type="dxa"/>
             <w:tcBorders/>
           </w:tcPr>
           <w:p>
@@ -10248,7 +9974,7 @@
         </w:tc>
         <w:tc>
           <w:tcPr>
-            <w:tcW w:w="7719" w:type="dxa"/>
+            <w:tcW w:w="7431" w:type="dxa"/>
             <w:tcBorders/>
           </w:tcPr>
           <w:p>
@@ -10270,7 +9996,7 @@
         </w:trPr>
         <w:tc>
           <w:tcPr>
-            <w:tcW w:w="2293" w:type="dxa"/>
+            <w:tcW w:w="2207" w:type="dxa"/>
             <w:tcBorders/>
           </w:tcPr>
           <w:p>
@@ -10287,7 +10013,7 @@
         </w:tc>
         <w:tc>
           <w:tcPr>
-            <w:tcW w:w="7719" w:type="dxa"/>
+            <w:tcW w:w="7431" w:type="dxa"/>
             <w:tcBorders/>
           </w:tcPr>
           <w:p>
@@ -10342,7 +10068,7 @@
         </w:trPr>
         <w:tc>
           <w:tcPr>
-            <w:tcW w:w="2293" w:type="dxa"/>
+            <w:tcW w:w="2207" w:type="dxa"/>
             <w:tcBorders/>
           </w:tcPr>
           <w:p>
@@ -10359,7 +10085,7 @@
         </w:tc>
         <w:tc>
           <w:tcPr>
-            <w:tcW w:w="7719" w:type="dxa"/>
+            <w:tcW w:w="7431" w:type="dxa"/>
             <w:tcBorders/>
           </w:tcPr>
           <w:p>
@@ -10381,7 +10107,7 @@
         </w:trPr>
         <w:tc>
           <w:tcPr>
-            <w:tcW w:w="2293" w:type="dxa"/>
+            <w:tcW w:w="2207" w:type="dxa"/>
             <w:tcBorders/>
           </w:tcPr>
           <w:p>
@@ -10398,7 +10124,7 @@
         </w:tc>
         <w:tc>
           <w:tcPr>
-            <w:tcW w:w="7719" w:type="dxa"/>
+            <w:tcW w:w="7431" w:type="dxa"/>
             <w:tcBorders/>
           </w:tcPr>
           <w:p>
@@ -10431,7 +10157,7 @@
         </w:trPr>
         <w:tc>
           <w:tcPr>
-            <w:tcW w:w="2293" w:type="dxa"/>
+            <w:tcW w:w="2207" w:type="dxa"/>
             <w:tcBorders/>
           </w:tcPr>
           <w:p>
@@ -10448,7 +10174,7 @@
         </w:tc>
         <w:tc>
           <w:tcPr>
-            <w:tcW w:w="7719" w:type="dxa"/>
+            <w:tcW w:w="7431" w:type="dxa"/>
             <w:tcBorders/>
           </w:tcPr>
           <w:p>
@@ -10470,7 +10196,7 @@
         </w:trPr>
         <w:tc>
           <w:tcPr>
-            <w:tcW w:w="2293" w:type="dxa"/>
+            <w:tcW w:w="2207" w:type="dxa"/>
             <w:tcBorders/>
           </w:tcPr>
           <w:p>
@@ -10487,7 +10213,7 @@
         </w:tc>
         <w:tc>
           <w:tcPr>
-            <w:tcW w:w="7719" w:type="dxa"/>
+            <w:tcW w:w="7431" w:type="dxa"/>
             <w:tcBorders/>
           </w:tcPr>
           <w:p>
@@ -10520,7 +10246,7 @@
         </w:trPr>
         <w:tc>
           <w:tcPr>
-            <w:tcW w:w="2293" w:type="dxa"/>
+            <w:tcW w:w="2207" w:type="dxa"/>
             <w:tcBorders/>
           </w:tcPr>
           <w:p>
@@ -10537,7 +10263,7 @@
         </w:tc>
         <w:tc>
           <w:tcPr>
-            <w:tcW w:w="7719" w:type="dxa"/>
+            <w:tcW w:w="7431" w:type="dxa"/>
             <w:tcBorders/>
           </w:tcPr>
           <w:p>
@@ -10570,7 +10296,7 @@
         </w:trPr>
         <w:tc>
           <w:tcPr>
-            <w:tcW w:w="2293" w:type="dxa"/>
+            <w:tcW w:w="2207" w:type="dxa"/>
             <w:tcBorders/>
           </w:tcPr>
           <w:p>
@@ -10587,7 +10313,7 @@
         </w:tc>
         <w:tc>
           <w:tcPr>
-            <w:tcW w:w="7719" w:type="dxa"/>
+            <w:tcW w:w="7431" w:type="dxa"/>
             <w:tcBorders/>
           </w:tcPr>
           <w:p>
@@ -10631,7 +10357,7 @@
         </w:trPr>
         <w:tc>
           <w:tcPr>
-            <w:tcW w:w="2293" w:type="dxa"/>
+            <w:tcW w:w="2207" w:type="dxa"/>
             <w:tcBorders/>
           </w:tcPr>
           <w:p>
@@ -10648,7 +10374,7 @@
         </w:tc>
         <w:tc>
           <w:tcPr>
-            <w:tcW w:w="7719" w:type="dxa"/>
+            <w:tcW w:w="7431" w:type="dxa"/>
             <w:tcBorders/>
           </w:tcPr>
           <w:p>
@@ -10681,7 +10407,7 @@
         </w:trPr>
         <w:tc>
           <w:tcPr>
-            <w:tcW w:w="2293" w:type="dxa"/>
+            <w:tcW w:w="2207" w:type="dxa"/>
             <w:tcBorders/>
           </w:tcPr>
           <w:p>
@@ -10698,7 +10424,7 @@
         </w:tc>
         <w:tc>
           <w:tcPr>
-            <w:tcW w:w="7719" w:type="dxa"/>
+            <w:tcW w:w="7431" w:type="dxa"/>
             <w:tcBorders/>
           </w:tcPr>
           <w:p>
@@ -10720,7 +10446,7 @@
         </w:trPr>
         <w:tc>
           <w:tcPr>
-            <w:tcW w:w="2293" w:type="dxa"/>
+            <w:tcW w:w="2207" w:type="dxa"/>
             <w:tcBorders/>
           </w:tcPr>
           <w:p>
@@ -10737,7 +10463,7 @@
         </w:tc>
         <w:tc>
           <w:tcPr>
-            <w:tcW w:w="7719" w:type="dxa"/>
+            <w:tcW w:w="7431" w:type="dxa"/>
             <w:tcBorders/>
           </w:tcPr>
           <w:p>
@@ -10759,7 +10485,7 @@
         </w:trPr>
         <w:tc>
           <w:tcPr>
-            <w:tcW w:w="2293" w:type="dxa"/>
+            <w:tcW w:w="2207" w:type="dxa"/>
             <w:tcBorders/>
           </w:tcPr>
           <w:p>
@@ -10776,7 +10502,7 @@
         </w:tc>
         <w:tc>
           <w:tcPr>
-            <w:tcW w:w="7719" w:type="dxa"/>
+            <w:tcW w:w="7431" w:type="dxa"/>
             <w:tcBorders/>
           </w:tcPr>
           <w:p>
@@ -10820,7 +10546,7 @@
         </w:trPr>
         <w:tc>
           <w:tcPr>
-            <w:tcW w:w="2293" w:type="dxa"/>
+            <w:tcW w:w="2207" w:type="dxa"/>
             <w:tcBorders/>
           </w:tcPr>
           <w:p>
@@ -10837,7 +10563,7 @@
         </w:tc>
         <w:tc>
           <w:tcPr>
-            <w:tcW w:w="7719" w:type="dxa"/>
+            <w:tcW w:w="7431" w:type="dxa"/>
             <w:tcBorders/>
           </w:tcPr>
           <w:p>
@@ -10881,7 +10607,7 @@
         </w:trPr>
         <w:tc>
           <w:tcPr>
-            <w:tcW w:w="2293" w:type="dxa"/>
+            <w:tcW w:w="2207" w:type="dxa"/>
             <w:tcBorders/>
           </w:tcPr>
           <w:p>
@@ -10898,7 +10624,7 @@
         </w:tc>
         <w:tc>
           <w:tcPr>
-            <w:tcW w:w="7719" w:type="dxa"/>
+            <w:tcW w:w="7431" w:type="dxa"/>
             <w:tcBorders/>
           </w:tcPr>
           <w:p>
@@ -10920,7 +10646,7 @@
         </w:trPr>
         <w:tc>
           <w:tcPr>
-            <w:tcW w:w="2293" w:type="dxa"/>
+            <w:tcW w:w="2207" w:type="dxa"/>
             <w:tcBorders/>
           </w:tcPr>
           <w:p>
@@ -10937,7 +10663,7 @@
         </w:tc>
         <w:tc>
           <w:tcPr>
-            <w:tcW w:w="7719" w:type="dxa"/>
+            <w:tcW w:w="7431" w:type="dxa"/>
             <w:tcBorders/>
           </w:tcPr>
           <w:p>
@@ -10970,7 +10696,7 @@
         </w:trPr>
         <w:tc>
           <w:tcPr>
-            <w:tcW w:w="2293" w:type="dxa"/>
+            <w:tcW w:w="2207" w:type="dxa"/>
             <w:tcBorders/>
           </w:tcPr>
           <w:p>
@@ -10987,7 +10713,7 @@
         </w:tc>
         <w:tc>
           <w:tcPr>
-            <w:tcW w:w="7719" w:type="dxa"/>
+            <w:tcW w:w="7431" w:type="dxa"/>
             <w:tcBorders/>
           </w:tcPr>
           <w:p>
@@ -11031,7 +10757,7 @@
         </w:trPr>
         <w:tc>
           <w:tcPr>
-            <w:tcW w:w="2293" w:type="dxa"/>
+            <w:tcW w:w="2207" w:type="dxa"/>
             <w:tcBorders/>
           </w:tcPr>
           <w:p>
@@ -11048,7 +10774,7 @@
         </w:tc>
         <w:tc>
           <w:tcPr>
-            <w:tcW w:w="7719" w:type="dxa"/>
+            <w:tcW w:w="7431" w:type="dxa"/>
             <w:tcBorders/>
           </w:tcPr>
           <w:p>
@@ -12304,7 +12030,7 @@
     <w:pPr>
       <w:widowControl/>
       <w:suppressAutoHyphens w:val="true"/>
-      <w:overflowPunct w:val="false"/>
+      <w:overflowPunct w:val="true"/>
       <w:bidi w:val="0"/>
       <w:spacing w:before="0" w:after="0"/>
       <w:ind w:hanging="0" w:left="0" w:right="0"/>
@@ -12411,8 +12137,8 @@
     <w:qFormat/>
     <w:rPr/>
   </w:style>
-  <w:style w:type="character" w:styleId="Bullets">
-    <w:name w:val="Bullets"/>
+  <w:style w:type="character" w:styleId="Bulletsuser">
+    <w:name w:val="Bullets (user)"/>
     <w:qFormat/>
     <w:rPr>
       <w:rFonts w:ascii="OpenSymbol" w:hAnsi="OpenSymbol" w:eastAsia="OpenSymbol" w:cs="OpenSymbol"/>
@@ -12537,8 +12263,8 @@
       <w:i/>
     </w:rPr>
   </w:style>
-  <w:style w:type="paragraph" w:styleId="BlockQuotation">
-    <w:name w:val="Block Quotation"/>
+  <w:style w:type="paragraph" w:styleId="BlockQuotationuser">
+    <w:name w:val="Block Quotation (user)"/>
     <w:basedOn w:val="Normal"/>
     <w:qFormat/>
     <w:pPr>

</xml_diff>

<commit_message>
Tweak caption of Figure O
</commit_message>
<xml_diff>
--- a/TaylorEtAl-mounted-barosaurus.docx
+++ b/TaylorEtAl-mounted-barosaurus.docx
@@ -2500,7 +2500,7 @@
     </w:p>
     <w:p>
       <w:pPr>
-        <w:pStyle w:val="BlockQuotationuser"/>
+        <w:pStyle w:val="BlockQuotation"/>
         <w:rPr/>
       </w:pPr>
       <w:r>
@@ -3063,7 +3063,7 @@
     </w:p>
     <w:p>
       <w:pPr>
-        <w:pStyle w:val="BlockQuotationuser"/>
+        <w:pStyle w:val="BlockQuotation"/>
         <w:rPr/>
       </w:pPr>
       <w:r>
@@ -8342,7 +8342,7 @@
     </w:p>
     <w:p>
       <w:pPr>
-        <w:pStyle w:val="BlockQuotationuser"/>
+        <w:pStyle w:val="BlockQuotation"/>
         <w:rPr/>
       </w:pPr>
       <w:r>
@@ -8375,7 +8375,7 @@
         <w:pStyle w:val="FigureCaption"/>
         <w:widowControl/>
         <w:suppressAutoHyphens w:val="true"/>
-        <w:overflowPunct w:val="true"/>
+        <w:overflowPunct w:val="false"/>
         <w:bidi w:val="0"/>
         <w:spacing w:lineRule="auto" w:line="276" w:before="0" w:after="142"/>
         <w:ind w:hanging="0" w:left="283" w:right="0"/>
@@ -8632,7 +8632,47 @@
       </w:r>
       <w:r>
         <w:rPr/>
-        <w:t xml:space="preserve"> skeleton on the floor of the Roosevelt Memorial Hall of the American Museum of Natural History before mounting. Centrally, the skull and cervical vertebrae 2–16, all articulated in a single piece. By the wall to the left are two further vertebrae — probably anterior dorsals, although the presence of what looks like a cervical rib loop in the vertebra closest to the camera suggests possibly a spare copy of a posterior cervical. Between these and the neck is the distal (whiplash) portion of a tail: possibly that of the main </w:t>
+        <w:t xml:space="preserve"> skeleton on the floor of the Roosevelt Memorial Hall of the American Museum of Natural History before mounting. Centrally, the skull and cervical vertebrae 2–1</w:t>
+      </w:r>
+      <w:r>
+        <w:rPr/>
+        <w:t>5</w:t>
+      </w:r>
+      <w:r>
+        <w:rPr/>
+        <w:t xml:space="preserve">, all articulated in a single piece. By the wall to the left are two further vertebrae — the presence of a cervical rib loop in the vertebra closest to the camera suggests </w:t>
+      </w:r>
+      <w:r>
+        <w:rPr/>
+        <w:t xml:space="preserve">it is the last </w:t>
+      </w:r>
+      <w:r>
+        <w:rPr/>
+        <w:t xml:space="preserve">cervical, </w:t>
+      </w:r>
+      <w:r>
+        <w:rPr/>
+        <w:t>and the other</w:t>
+      </w:r>
+      <w:r>
+        <w:rPr/>
+        <w:t xml:space="preserve"> </w:t>
+      </w:r>
+      <w:r>
+        <w:rPr/>
+        <w:t xml:space="preserve">is </w:t>
+      </w:r>
+      <w:r>
+        <w:rPr/>
+        <w:t xml:space="preserve">probably </w:t>
+      </w:r>
+      <w:r>
+        <w:rPr/>
+        <w:t xml:space="preserve">an </w:t>
+      </w:r>
+      <w:r>
+        <w:rPr/>
+        <w:t xml:space="preserve">anterior dorsal. Between these and the neck is the distal (whiplash) portion of a tail: possibly that of the main </w:t>
       </w:r>
       <w:r>
         <w:rPr>
@@ -12030,7 +12070,7 @@
     <w:pPr>
       <w:widowControl/>
       <w:suppressAutoHyphens w:val="true"/>
-      <w:overflowPunct w:val="true"/>
+      <w:overflowPunct w:val="false"/>
       <w:bidi w:val="0"/>
       <w:spacing w:before="0" w:after="0"/>
       <w:ind w:hanging="0" w:left="0" w:right="0"/>
@@ -12137,8 +12177,8 @@
     <w:qFormat/>
     <w:rPr/>
   </w:style>
-  <w:style w:type="character" w:styleId="Bulletsuser">
-    <w:name w:val="Bullets (user)"/>
+  <w:style w:type="character" w:styleId="Bullets">
+    <w:name w:val="Bullets"/>
     <w:qFormat/>
     <w:rPr>
       <w:rFonts w:ascii="OpenSymbol" w:hAnsi="OpenSymbol" w:eastAsia="OpenSymbol" w:cs="OpenSymbol"/>
@@ -12263,8 +12303,8 @@
       <w:i/>
     </w:rPr>
   </w:style>
-  <w:style w:type="paragraph" w:styleId="BlockQuotationuser">
-    <w:name w:val="Block Quotation (user)"/>
+  <w:style w:type="paragraph" w:styleId="BlockQuotation">
+    <w:name w:val="Block Quotation"/>
     <w:basedOn w:val="Normal"/>
     <w:qFormat/>
     <w:pPr>

</xml_diff>

<commit_message>
Minor notes on Ralph Appelbaum and RCI
</commit_message>
<xml_diff>
--- a/TaylorEtAl-mounted-barosaurus.docx
+++ b/TaylorEtAl-mounted-barosaurus.docx
@@ -2187,7 +2187,11 @@
       </w:pPr>
       <w:r>
         <w:rPr/>
-        <w:t>In 1986, the museum began planning what would become an extensive renovation of its fossil halls, which had become significantly outdated since the previous update more than thirty years previously. The initial plan was to renovate only the Osborn Hall of Late Mammals, but a change of museum leadership meant that by 1988 the project had become much more extensive, now encompassing all four existing vertebrate fossil halls covering 65,000 square feet, and expanding into new spaces at a total cost of $38 million.</w:t>
+        <w:t xml:space="preserve">In 1986, the museum began planning what would become an extensive renovation of its fossil halls, which had become significantly outdated since the previous update more than thirty years previously. The initial plan was to renovate only the Osborn Hall of Late Mammals, but a change of museum leadership meant that by 1988 the project had become much more extensive, now encompassing all four existing vertebrate fossil halls covering 65,000 square feet, and expanding into new spaces at a total cost of $38 million. </w:t>
+      </w:r>
+      <w:r>
+        <w:rPr/>
+        <w:t>Ralph Appelbaum Associates were hired as the designers.</w:t>
       </w:r>
     </w:p>
     <w:p>
@@ -2692,7 +2696,23 @@
       </w:r>
       <w:r>
         <w:rPr/>
-        <w:t xml:space="preserve"> was to become their most important early commission.</w:t>
+        <w:t xml:space="preserve"> was to become their most important early commission. </w:t>
+      </w:r>
+      <w:r>
+        <w:rPr/>
+        <w:t>May’s</w:t>
+      </w:r>
+      <w:r>
+        <w:rPr/>
+        <w:t xml:space="preserve"> first meeting with Lowell Dingus, Gene Gaffney, Jack MacIntosh and Phil Currie was on </w:t>
+      </w:r>
+      <w:r>
+        <w:rPr/>
+        <w:t xml:space="preserve">30 </w:t>
+      </w:r>
+      <w:r>
+        <w:rPr/>
+        <w:t>January 30 1990 at the AMNH.</w:t>
       </w:r>
     </w:p>
     <w:p>
@@ -8839,7 +8859,31 @@
       </w:r>
       <w:r>
         <w:rPr/>
-        <w:t xml:space="preserve"> Two views of the final mounting in the Roosevelt Memorial Hall of the American Museum of Natural History., both showing the use of two frighteningly unstable-looking cherry-picker crane. The RCI employee in the higher crane are moving the head-and-neck assembly into place, while the two in the lower crane attempt to fit it to the anterior torso.</w:t>
+        <w:t xml:space="preserve"> Two views of the final mounting in the Roosevelt Memorial Hall of the American Museum of Natural History, both showing the use of </w:t>
+      </w:r>
+      <w:r>
+        <w:rPr/>
+        <w:t>two</w:t>
+      </w:r>
+      <w:r>
+        <w:rPr/>
+        <w:t xml:space="preserve"> frighteningly unstable-looking cherry-picker crane</w:t>
+      </w:r>
+      <w:r>
+        <w:rPr/>
+        <w:t>s</w:t>
+      </w:r>
+      <w:r>
+        <w:rPr/>
+        <w:t>. The RCI employee</w:t>
+      </w:r>
+      <w:r>
+        <w:rPr/>
+        <w:t>s</w:t>
+      </w:r>
+      <w:r>
+        <w:rPr/>
+        <w:t xml:space="preserve"> in the higher crane are moving the head-and-neck assembly into place, while the two in the lower crane attempt to fit it to the anterior torso.</w:t>
       </w:r>
     </w:p>
     <w:p>
@@ -8890,7 +8934,23 @@
       </w:r>
       <w:r>
         <w:rPr/>
-        <w:t xml:space="preserve"> Part way through the trial mounting process in the parking lot behind the RCI workshop in Spring 1991. In the lift platform, Peter May sets the humerus in place while Jack McIntosh advises on its articulation; and Rick Eyre (back to the camera) looks on. At ground level, Gene Gaffney, Lowell Dingus and Mark Norell observe.</w:t>
+        <w:t xml:space="preserve"> Part way through the trial mounting process in the parking lot behind the RCI workshop in Spring 1991. In the lift platform, Peter May sets the humerus in place while Jack McIntosh advises on its articulation; and Rick Eyre (back to the camera) looks on. At ground level, Gene Gaffney, Mark Norell </w:t>
+      </w:r>
+      <w:r>
+        <w:rPr/>
+        <w:t xml:space="preserve">and </w:t>
+      </w:r>
+      <w:r>
+        <w:rPr/>
+        <w:t xml:space="preserve">Lowell Dingus </w:t>
+      </w:r>
+      <w:r>
+        <w:rPr/>
+        <w:t xml:space="preserve">(left to right) </w:t>
+      </w:r>
+      <w:r>
+        <w:rPr/>
+        <w:t>observe.</w:t>
       </w:r>
     </w:p>
     <w:p>

</xml_diff>

<commit_message>
More on 17th cervical
</commit_message>
<xml_diff>
--- a/TaylorEtAl-mounted-barosaurus.docx
+++ b/TaylorEtAl-mounted-barosaurus.docx
@@ -2187,11 +2187,7 @@
       </w:pPr>
       <w:r>
         <w:rPr/>
-        <w:t xml:space="preserve">In 1986, the museum began planning what would become an extensive renovation of its fossil halls, which had become significantly outdated since the previous update more than thirty years previously. The initial plan was to renovate only the Osborn Hall of Late Mammals, but a change of museum leadership meant that by 1988 the project had become much more extensive, now encompassing all four existing vertebrate fossil halls covering 65,000 square feet, and expanding into new spaces at a total cost of $38 million. </w:t>
-      </w:r>
-      <w:r>
-        <w:rPr/>
-        <w:t>Ralph Appelbaum Associates were hired as the designers.</w:t>
+        <w:t>In 1986, the museum began planning what would become an extensive renovation of its fossil halls, which had become significantly outdated since the previous update more than thirty years previously. The initial plan was to renovate only the Osborn Hall of Late Mammals, but a change of museum leadership meant that by 1988 the project had become much more extensive, now encompassing all four existing vertebrate fossil halls covering 65,000 square feet, and expanding into new spaces at a total cost of $38 million. Ralph Appelbaum Associates were hired as the designers.</w:t>
       </w:r>
     </w:p>
     <w:p>
@@ -2504,7 +2500,7 @@
     </w:p>
     <w:p>
       <w:pPr>
-        <w:pStyle w:val="BlockQuotation"/>
+        <w:pStyle w:val="BlockQuotationuser"/>
         <w:rPr/>
       </w:pPr>
       <w:r>
@@ -2696,23 +2692,7 @@
       </w:r>
       <w:r>
         <w:rPr/>
-        <w:t xml:space="preserve"> was to become their most important early commission. </w:t>
-      </w:r>
-      <w:r>
-        <w:rPr/>
-        <w:t>May’s</w:t>
-      </w:r>
-      <w:r>
-        <w:rPr/>
-        <w:t xml:space="preserve"> first meeting with Lowell Dingus, Gene Gaffney, Jack MacIntosh and Phil Currie was on </w:t>
-      </w:r>
-      <w:r>
-        <w:rPr/>
-        <w:t xml:space="preserve">30 </w:t>
-      </w:r>
-      <w:r>
-        <w:rPr/>
-        <w:t>January 30 1990 at the AMNH.</w:t>
+        <w:t xml:space="preserve"> was to become their most important early commission. May’s first meeting with Lowell Dingus, Gene Gaffney, Jack MacIntosh and Phil Currie was on 30 January 30 1990 at the AMNH.</w:t>
       </w:r>
     </w:p>
     <w:p>
@@ -3083,7 +3063,7 @@
     </w:p>
     <w:p>
       <w:pPr>
-        <w:pStyle w:val="BlockQuotation"/>
+        <w:pStyle w:val="BlockQuotationuser"/>
         <w:rPr/>
       </w:pPr>
       <w:r>
@@ -3728,7 +3708,15 @@
       </w:r>
       <w:r>
         <w:rPr/>
-        <w:t>. (The earliest mention of the sixteen-cervicals hypothesis in print appears in a caption in a children’s book, Lindsay 1992:20.) Whether or not the AMNH 6341 material may at some point have included a tenth cervical vertebra (C7), at present it preserves the last nine cervical vertebrae. These are therefore considered to be C8–C16.</w:t>
+        <w:t>. (The earliest mention of the sixteen-cervicals hypothesis in print appears in a caption in a children’s book, Lindsay 1992:20.) Whether or not the AMNH 6341 material may at some point have included a</w:t>
+      </w:r>
+      <w:r>
+        <w:rPr/>
+        <w:t>n additional</w:t>
+      </w:r>
+      <w:r>
+        <w:rPr/>
+        <w:t xml:space="preserve"> cervical vertebra (C7), at present it preserves the last nine cervical vertebrae. These are therefore considered to be C8–C16.</w:t>
       </w:r>
     </w:p>
     <w:p>
@@ -3738,7 +3726,15 @@
       </w:pPr>
       <w:r>
         <w:rPr/>
-        <w:t xml:space="preserve">The anterior part of neck of the mount was completed using seven casts of anterior vertebrae from the Carnegie </w:t>
+        <w:t xml:space="preserve">The anterior part of </w:t>
+      </w:r>
+      <w:r>
+        <w:rPr/>
+        <w:t xml:space="preserve">the </w:t>
+      </w:r>
+      <w:r>
+        <w:rPr/>
+        <w:t xml:space="preserve">neck of the mount was completed using seven casts of anterior vertebrae from the Carnegie </w:t>
       </w:r>
       <w:r>
         <w:rPr>
@@ -3760,11 +3756,145 @@
       </w:r>
       <w:r>
         <w:rPr/>
+        <w:t xml:space="preserve"> cervicals were not used as that would have resulted in an abrupt transition in length between the </w:t>
+      </w:r>
+      <w:r>
+        <w:rPr>
+          <w:i/>
+          <w:iCs/>
+        </w:rPr>
+        <w:t>Diplodocus</w:t>
+      </w:r>
+      <w:r>
+        <w:rPr/>
+        <w:t xml:space="preserve"> C7 (485 mm, Hatcher 1901:38) and the </w:t>
+      </w:r>
+      <w:r>
+        <w:rPr>
+          <w:i/>
+          <w:iCs/>
+        </w:rPr>
+        <w:t>Barosaurus</w:t>
+      </w:r>
+      <w:r>
+        <w:rPr/>
+        <w:t xml:space="preserve"> C8 (618 mm, McIntosh 2005:46). Instead, a non-contiguous sequence of Carnegie-</w:t>
+      </w:r>
+      <w:r>
+        <w:rPr>
+          <w:i/>
+          <w:iCs/>
+        </w:rPr>
+        <w:t>Diplodocus</w:t>
+      </w:r>
+      <w:r>
+        <w:rPr/>
+        <w:t xml:space="preserve"> cervicals was used to obtain a smooth</w:t>
+      </w:r>
+      <w:r>
+        <w:rPr/>
+        <w:t>er</w:t>
+      </w:r>
+      <w:r>
+        <w:rPr/>
+        <w:t xml:space="preserve"> transition: one of us (May) believes they were probably cervicals 10 (595 mm), 8 (512 mm), 6 (442 mm) and 4–1, and the relative sizes of the vertebrae corroborate this identification. </w:t>
+      </w:r>
+      <w:r>
+        <w:rPr/>
+        <w:t>XXX check this in photos.</w:t>
+      </w:r>
+    </w:p>
+    <w:p>
+      <w:pPr>
+        <w:pStyle w:val="BodyText"/>
+        <w:rPr/>
+      </w:pPr>
+      <w:r>
+        <w:rPr/>
+        <w:t xml:space="preserve">To make matters more complicated, photographs show that the completed mount actually has 17 cervicals rather than 16 (e.g. Figure 1; Lindsay 1992:20–21; Taylor and Wedel 2016:figure 1). McIntosh (2005:45) implicitly left open the possibility that </w:t>
+      </w:r>
+      <w:r>
+        <w:rPr>
+          <w:i/>
+          <w:iCs/>
+        </w:rPr>
+        <w:t>Barosaurus</w:t>
+      </w:r>
+      <w:r>
+        <w:rPr/>
+        <w:t xml:space="preserve"> had 17 cervicals, due to his uncertainty about the correct </w:t>
+      </w:r>
+      <w:r>
+        <w:rPr/>
+        <w:t>interpretation</w:t>
+      </w:r>
+      <w:r>
+        <w:rPr/>
+        <w:t xml:space="preserve"> of the 9th</w:t>
+      </w:r>
+      <w:r>
+        <w:rPr>
+          <w:vertAlign w:val="superscript"/>
+        </w:rPr>
         <w:t xml:space="preserve"> </w:t>
       </w:r>
       <w:r>
         <w:rPr/>
-        <w:t xml:space="preserve">cervicals were not used as that would have resulted in an abrupt transition in length between the </w:t>
+        <w:t xml:space="preserve">presacral, which he </w:t>
+      </w:r>
+      <w:r>
+        <w:rPr/>
+        <w:t xml:space="preserve">tentatively </w:t>
+      </w:r>
+      <w:r>
+        <w:rPr/>
+        <w:t xml:space="preserve">designated as the first dorsal vertebra, but considered possibly the last cervical. However, the existence of a 17th cervical </w:t>
+      </w:r>
+      <w:r>
+        <w:rPr/>
+        <w:t xml:space="preserve">on this basis is </w:t>
+      </w:r>
+      <w:r>
+        <w:rPr/>
+        <w:t>predicated on a reduced dorsal count of eight, and the mounted skeleton has nine dorsals with free ribs. The additional cervical therefore appears to be an insert not warranted by the evidence available at the time of mounting.</w:t>
+      </w:r>
+    </w:p>
+    <w:p>
+      <w:pPr>
+        <w:pStyle w:val="BodyText"/>
+        <w:rPr/>
+      </w:pPr>
+      <w:r>
+        <w:rPr/>
+        <w:t>However, photos of the mounting process in the AMNH (e.g. Figure O) show that the neck section used in the mount had only 1</w:t>
+      </w:r>
+      <w:r>
+        <w:rPr/>
+        <w:t>4</w:t>
+      </w:r>
+      <w:r>
+        <w:rPr/>
+        <w:t xml:space="preserve"> cervical vertebrae — </w:t>
+      </w:r>
+      <w:r>
+        <w:rPr/>
+        <w:t>C3–16</w:t>
+      </w:r>
+      <w:r>
+        <w:rPr/>
+        <w:t xml:space="preserve">, not counting the altas and axis which were not in place at that time. The assembly process was complex. The neck section containing the head and </w:t>
+      </w:r>
+      <w:r>
+        <w:rPr/>
+        <w:t>C1–</w:t>
+      </w:r>
+      <w:r>
+        <w:rPr/>
+        <w:t xml:space="preserve">16 was welded to the torso leaving a stretch of bare armature. The two halves of the seventeenth vertebra (visible on the left side of Figure O) </w:t>
+      </w:r>
+      <w:r>
+        <w:rPr/>
+        <w:t xml:space="preserve">were then glued together around the armature and bridging the gap between the bones of the neck section and the torso. The special 17th vertebra can be seen in Figure K.B, distinctly darker than the cervicals above it and the dorsals below. Since there are no duplicate vertebrae in the neck, the special C17 must have come from elsewhere. Careful comparisons suggest it is a cast of C14 of the Carnegie </w:t>
       </w:r>
       <w:r>
         <w:rPr>
@@ -3775,7 +3905,18 @@
       </w:r>
       <w:r>
         <w:rPr/>
-        <w:t xml:space="preserve"> C7 (485 mm, Hatcher 1901:38) and the </w:t>
+        <w:t xml:space="preserve"> (see e.g. Hatcher 1901:plate III), supplied by DinoLab. The selection of C14 rather then C15, the last dorsal in </w:t>
+      </w:r>
+      <w:r>
+        <w:rPr>
+          <w:i/>
+          <w:iCs/>
+        </w:rPr>
+        <w:t>Diplodocus</w:t>
+      </w:r>
+      <w:r>
+        <w:rPr/>
+        <w:t xml:space="preserve">, makes sense as C14 is more elongate and so a better morphological match than the </w:t>
       </w:r>
       <w:r>
         <w:rPr>
@@ -3786,18 +3927,7 @@
       </w:r>
       <w:r>
         <w:rPr/>
-        <w:t xml:space="preserve"> C8 (618 mm, McIntosh 2005:46). Instead, a non-contiguous sequence of Carnegie-</w:t>
-      </w:r>
-      <w:r>
-        <w:rPr>
-          <w:i/>
-          <w:iCs/>
-        </w:rPr>
-        <w:t>Diplodocus</w:t>
-      </w:r>
-      <w:r>
-        <w:rPr/>
-        <w:t xml:space="preserve"> cervicals was used to obtain a smooth transition: one of us (May) believes they were probably cervicals 10 (595 mm), 8 (512 mm), 6 (442 mm) and 4–1, and the relative sizes of the vertebrae corroborate this identification.</w:t>
+        <w:t xml:space="preserve"> vertebrae that precede and follow it in the mounted skeleton.</w:t>
       </w:r>
     </w:p>
     <w:p>
@@ -3807,7 +3937,7 @@
       </w:pPr>
       <w:r>
         <w:rPr/>
-        <w:t xml:space="preserve">To make matters more complicated, photographs show that the completed mount actually has 17 cervicals rather than 16 (e.g. Figure 1; Lindsay 1992:20–21; Taylor and Wedel 2016:figure 1). McIntosh (2005:45) implicitly left open the possibility that </w:t>
+        <w:t xml:space="preserve">(Note: it is quite possible that </w:t>
       </w:r>
       <w:r>
         <w:rPr>
@@ -3818,48 +3948,41 @@
       </w:r>
       <w:r>
         <w:rPr/>
-        <w:t xml:space="preserve"> had 17 cervicals, due to his uncertainty about the correct designation of the </w:t>
-      </w:r>
-      <w:r>
-        <w:rPr/>
-        <w:t>9th</w:t>
-      </w:r>
-      <w:r>
-        <w:rPr>
-          <w:vertAlign w:val="superscript"/>
-        </w:rPr>
+        <w:t xml:space="preserve"> did have 17 cervicals, or even more, as in </w:t>
+      </w:r>
+      <w:r>
+        <w:rPr/>
+        <w:t>the 18 of</w:t>
+      </w:r>
+      <w:r>
+        <w:rPr/>
         <w:t xml:space="preserve"> </w:t>
       </w:r>
       <w:r>
-        <w:rPr/>
-        <w:t xml:space="preserve">presacral, which he designated as the first dorsal vertebra, but considered possibly the last cervical. However, the existence of a </w:t>
-      </w:r>
-      <w:r>
-        <w:rPr/>
-        <w:t>17th</w:t>
-      </w:r>
-      <w:r>
-        <w:rPr/>
-        <w:t xml:space="preserve"> cervical is here predicated on a reduced dorsal count of eight, and the mounted skeleton has nine dorsals with free ribs. The additional cervical therefore appears to be an insert not warranted by the evidence available at the time of mounting — perhaps a cast of C5 from the Carnegie </w:t>
-      </w:r>
-      <w:r>
-        <w:rPr>
-          <w:i/>
-          <w:iCs/>
-        </w:rPr>
-        <w:t>Diplodocus</w:t>
-      </w:r>
-      <w:r>
-        <w:rPr/>
-        <w:t>. As no records seem to have survived and the relevant vertebra</w:t>
-      </w:r>
-      <w:r>
-        <w:rPr/>
-        <w:t>e</w:t>
-      </w:r>
-      <w:r>
-        <w:rPr/>
-        <w:t xml:space="preserve"> are currently 15 meters above ground, there is little likelihood of resolving this point. (Note: it is quite possible that </w:t>
+        <w:rPr>
+          <w:i/>
+          <w:iCs/>
+        </w:rPr>
+        <w:t>Mamenchisaurus youngi</w:t>
+      </w:r>
+      <w:r>
+        <w:rPr/>
+        <w:t xml:space="preserve"> (Ouyang and Ye 2002:24–30) or </w:t>
+      </w:r>
+      <w:r>
+        <w:rPr/>
+        <w:t xml:space="preserve">the 19 of </w:t>
+      </w:r>
+      <w:r>
+        <w:rPr>
+          <w:i/>
+          <w:iCs/>
+        </w:rPr>
+        <w:t>Mamenchisaurus hochuanensis</w:t>
+      </w:r>
+      <w:r>
+        <w:rPr/>
+        <w:t xml:space="preserve"> (Young and Zhao 1972). Currently available </w:t>
       </w:r>
       <w:r>
         <w:rPr>
@@ -3870,94 +3993,7 @@
       </w:r>
       <w:r>
         <w:rPr/>
-        <w:t xml:space="preserve"> did nevertheless have 17 cervicals, or even more, as in </w:t>
-      </w:r>
-      <w:r>
-        <w:rPr>
-          <w:i/>
-          <w:iCs/>
-        </w:rPr>
-        <w:t>Mamenchisaurus</w:t>
-      </w:r>
-      <w:r>
-        <w:rPr>
-          <w:i/>
-          <w:iCs/>
-        </w:rPr>
-        <w:t xml:space="preserve"> </w:t>
-      </w:r>
-      <w:r>
-        <w:rPr>
-          <w:i/>
-          <w:iCs/>
-        </w:rPr>
-        <w:t>youngi</w:t>
-      </w:r>
-      <w:r>
-        <w:rPr/>
-        <w:t xml:space="preserve"> (18; </w:t>
-      </w:r>
-      <w:r>
-        <w:rPr/>
-        <w:t>Ouyang and Ye 2002:24–30</w:t>
-      </w:r>
-      <w:r>
-        <w:rPr/>
-        <w:t xml:space="preserve">) or </w:t>
-      </w:r>
-      <w:r>
-        <w:rPr>
-          <w:i/>
-          <w:iCs/>
-        </w:rPr>
-        <w:t>Mamenchisaurus hochuanensis</w:t>
-      </w:r>
-      <w:r>
-        <w:rPr/>
-        <w:t xml:space="preserve"> (1</w:t>
-      </w:r>
-      <w:r>
-        <w:rPr/>
-        <w:t>9</w:t>
-      </w:r>
-      <w:r>
-        <w:rPr/>
-        <w:t xml:space="preserve">; </w:t>
-      </w:r>
-      <w:r>
-        <w:rPr/>
-        <w:t>Young and Zhao 1972).</w:t>
-      </w:r>
-      <w:r>
-        <w:rPr/>
-        <w:t xml:space="preserve"> </w:t>
-      </w:r>
-      <w:r>
-        <w:rPr/>
-        <w:t>C</w:t>
-      </w:r>
-      <w:r>
-        <w:rPr/>
-        <w:t xml:space="preserve">urrently available </w:t>
-      </w:r>
-      <w:r>
-        <w:rPr>
-          <w:i/>
-          <w:iCs/>
-        </w:rPr>
-        <w:t>Barosaurus</w:t>
-      </w:r>
-      <w:r>
-        <w:rPr/>
-        <w:t xml:space="preserve"> </w:t>
-      </w:r>
-      <w:r>
-        <w:rPr/>
-        <w:t xml:space="preserve">fossils are not </w:t>
-      </w:r>
-      <w:r>
-        <w:rPr/>
-        <w:t>complete enough to determine the point.)</w:t>
+        <w:t xml:space="preserve"> fossils are not complete enough to determine the point.)</w:t>
       </w:r>
     </w:p>
     <w:p>
@@ -8651,7 +8687,7 @@
     </w:p>
     <w:p>
       <w:pPr>
-        <w:pStyle w:val="BlockQuotation"/>
+        <w:pStyle w:val="BlockQuotationuser"/>
         <w:rPr/>
       </w:pPr>
       <w:r>
@@ -8684,7 +8720,7 @@
         <w:pStyle w:val="FigureCaption"/>
         <w:widowControl/>
         <w:suppressAutoHyphens w:val="true"/>
-        <w:overflowPunct w:val="false"/>
+        <w:overflowPunct w:val="true"/>
         <w:bidi w:val="0"/>
         <w:spacing w:lineRule="auto" w:line="276" w:before="0" w:after="142"/>
         <w:ind w:hanging="0" w:left="283" w:right="0"/>
@@ -8859,31 +8895,7 @@
       </w:r>
       <w:r>
         <w:rPr/>
-        <w:t xml:space="preserve"> Two views of the final mounting in the Roosevelt Memorial Hall of the American Museum of Natural History, both showing the use of </w:t>
-      </w:r>
-      <w:r>
-        <w:rPr/>
-        <w:t>two</w:t>
-      </w:r>
-      <w:r>
-        <w:rPr/>
-        <w:t xml:space="preserve"> frighteningly unstable-looking cherry-picker crane</w:t>
-      </w:r>
-      <w:r>
-        <w:rPr/>
-        <w:t>s</w:t>
-      </w:r>
-      <w:r>
-        <w:rPr/>
-        <w:t>. The RCI employee</w:t>
-      </w:r>
-      <w:r>
-        <w:rPr/>
-        <w:t>s</w:t>
-      </w:r>
-      <w:r>
-        <w:rPr/>
-        <w:t xml:space="preserve"> in the higher crane are moving the head-and-neck assembly into place, while the two in the lower crane attempt to fit it to the anterior torso.</w:t>
+        <w:t xml:space="preserve"> Two views of the final mounting in the Roosevelt Memorial Hall of the American Museum of Natural History, both showing the use of two frighteningly unstable-looking cherry-picker cranes. The RCI employees in the higher crane are moving the head-and-neck assembly into place, while the two in the lower crane attempt to fit it to the anterior torso.</w:t>
       </w:r>
     </w:p>
     <w:p>
@@ -8934,23 +8946,7 @@
       </w:r>
       <w:r>
         <w:rPr/>
-        <w:t xml:space="preserve"> Part way through the trial mounting process in the parking lot behind the RCI workshop in Spring 1991. In the lift platform, Peter May sets the humerus in place while Jack McIntosh advises on its articulation; and Rick Eyre (back to the camera) looks on. At ground level, Gene Gaffney, Mark Norell </w:t>
-      </w:r>
-      <w:r>
-        <w:rPr/>
-        <w:t xml:space="preserve">and </w:t>
-      </w:r>
-      <w:r>
-        <w:rPr/>
-        <w:t xml:space="preserve">Lowell Dingus </w:t>
-      </w:r>
-      <w:r>
-        <w:rPr/>
-        <w:t xml:space="preserve">(left to right) </w:t>
-      </w:r>
-      <w:r>
-        <w:rPr/>
-        <w:t>observe.</w:t>
+        <w:t xml:space="preserve"> Part way through the trial mounting process in the parking lot behind the RCI workshop in Spring 1991. In the lift platform, Peter May sets the humerus in place while Jack McIntosh advises on its articulation; and Rick Eyre (back to the camera) looks on. At ground level, Gene Gaffney, Mark Norell and Lowell Dingus (left to right) observe.</w:t>
       </w:r>
     </w:p>
     <w:p>
@@ -12379,7 +12375,7 @@
     <w:pPr>
       <w:widowControl/>
       <w:suppressAutoHyphens w:val="true"/>
-      <w:overflowPunct w:val="false"/>
+      <w:overflowPunct w:val="true"/>
       <w:bidi w:val="0"/>
       <w:spacing w:before="0" w:after="0"/>
       <w:ind w:hanging="0" w:left="0" w:right="0"/>
@@ -12486,8 +12482,8 @@
     <w:qFormat/>
     <w:rPr/>
   </w:style>
-  <w:style w:type="character" w:styleId="Bullets">
-    <w:name w:val="Bullets"/>
+  <w:style w:type="character" w:styleId="Bulletsuser">
+    <w:name w:val="Bullets (user)"/>
     <w:qFormat/>
     <w:rPr>
       <w:rFonts w:ascii="OpenSymbol" w:hAnsi="OpenSymbol" w:eastAsia="OpenSymbol" w:cs="OpenSymbol"/>
@@ -12612,8 +12608,8 @@
       <w:i/>
     </w:rPr>
   </w:style>
-  <w:style w:type="paragraph" w:styleId="BlockQuotation">
-    <w:name w:val="Block Quotation"/>
+  <w:style w:type="paragraph" w:styleId="BlockQuotationuser">
+    <w:name w:val="Block Quotation (user)"/>
     <w:basedOn w:val="Normal"/>
     <w:qFormat/>
     <w:pPr>

</xml_diff>

<commit_message>
Add and reference Figure S, expand caption R.
</commit_message>
<xml_diff>
--- a/TaylorEtAl-mounted-barosaurus.docx
+++ b/TaylorEtAl-mounted-barosaurus.docx
@@ -1676,6 +1676,12 @@
     <w:p>
       <w:pPr>
         <w:pStyle w:val="Heading3"/>
+        <w:numPr>
+          <w:ilvl w:val="2"/>
+          <w:numId w:val="5"/>
+        </w:numPr>
+        <w:spacing w:before="142" w:after="142"/>
+        <w:ind w:hanging="0" w:left="0" w:right="0"/>
         <w:rPr/>
       </w:pPr>
       <w:bookmarkStart w:id="7" w:name="__RefHeading___Toc25848_1820571732"/>
@@ -1773,6 +1779,12 @@
     <w:p>
       <w:pPr>
         <w:pStyle w:val="Heading3"/>
+        <w:numPr>
+          <w:ilvl w:val="2"/>
+          <w:numId w:val="5"/>
+        </w:numPr>
+        <w:spacing w:before="142" w:after="142"/>
+        <w:ind w:hanging="0" w:left="0" w:right="0"/>
         <w:rPr/>
       </w:pPr>
       <w:bookmarkStart w:id="8" w:name="__RefHeading___Toc25850_1820571732"/>
@@ -1984,6 +1996,12 @@
     <w:p>
       <w:pPr>
         <w:pStyle w:val="Heading3"/>
+        <w:numPr>
+          <w:ilvl w:val="2"/>
+          <w:numId w:val="5"/>
+        </w:numPr>
+        <w:spacing w:before="142" w:after="142"/>
+        <w:ind w:hanging="0" w:left="0" w:right="0"/>
         <w:rPr/>
       </w:pPr>
       <w:bookmarkStart w:id="9" w:name="__RefHeading___Toc25852_1820571732"/>
@@ -3090,7 +3108,6 @@
           <w:ilvl w:val="2"/>
           <w:numId w:val="5"/>
         </w:numPr>
-        <w:ind w:hanging="0" w:left="0" w:right="0"/>
         <w:rPr/>
       </w:pPr>
       <w:bookmarkStart w:id="16" w:name="__RefHeading___Toc16585_68767826"/>
@@ -3157,6 +3174,12 @@
     <w:p>
       <w:pPr>
         <w:pStyle w:val="Heading3"/>
+        <w:numPr>
+          <w:ilvl w:val="2"/>
+          <w:numId w:val="5"/>
+        </w:numPr>
+        <w:spacing w:before="142" w:after="142"/>
+        <w:ind w:hanging="0" w:left="0" w:right="0"/>
         <w:rPr/>
       </w:pPr>
       <w:bookmarkStart w:id="17" w:name="__RefHeading___Toc4995_537823704"/>
@@ -3445,6 +3468,12 @@
     <w:p>
       <w:pPr>
         <w:pStyle w:val="Heading3"/>
+        <w:numPr>
+          <w:ilvl w:val="2"/>
+          <w:numId w:val="5"/>
+        </w:numPr>
+        <w:spacing w:before="142" w:after="142"/>
+        <w:ind w:hanging="0" w:left="0" w:right="0"/>
         <w:rPr/>
       </w:pPr>
       <w:bookmarkStart w:id="19" w:name="__RefHeading___Toc25854_1820571732"/>
@@ -3797,11 +3826,44 @@
       </w:r>
       <w:r>
         <w:rPr/>
-        <w:t xml:space="preserve"> transition: one of us (May) believes they were probably cervicals 10 (595 mm), 8 (512 mm), 6 (442 mm) and 4–1, and the relative sizes of the vertebrae corroborate this identification. </w:t>
-      </w:r>
-      <w:r>
-        <w:rPr/>
-        <w:t>XXX check this in photos.</w:t>
+        <w:t xml:space="preserve"> transition. </w:t>
+      </w:r>
+      <w:r>
+        <w:rPr/>
+        <w:t xml:space="preserve">By comparison of </w:t>
+      </w:r>
+      <w:r>
+        <w:rPr>
+          <w:i/>
+          <w:iCs/>
+        </w:rPr>
+        <w:t>Barosaurus</w:t>
+      </w:r>
+      <w:r>
+        <w:rPr/>
+        <w:t xml:space="preserve">-mounting photos (Figure S) with Hatcher (1901:plate III) and photographs of various Carnegie </w:t>
+      </w:r>
+      <w:r>
+        <w:rPr>
+          <w:i/>
+          <w:iCs/>
+        </w:rPr>
+        <w:t>Diplodocus</w:t>
+      </w:r>
+      <w:r>
+        <w:rPr/>
+        <w:t xml:space="preserve"> mounts, the anterior cervicals cast from </w:t>
+      </w:r>
+      <w:r>
+        <w:rPr>
+          <w:i/>
+          <w:iCs/>
+        </w:rPr>
+        <w:t>Diplodocus</w:t>
+      </w:r>
+      <w:r>
+        <w:rPr/>
+        <w:t xml:space="preserve"> can be seen to be C3–6 and C8 (and presumably the atlas and axis).</w:t>
       </w:r>
     </w:p>
     <w:p>
@@ -4149,6 +4211,12 @@
     <w:p>
       <w:pPr>
         <w:pStyle w:val="Heading3"/>
+        <w:numPr>
+          <w:ilvl w:val="2"/>
+          <w:numId w:val="5"/>
+        </w:numPr>
+        <w:spacing w:before="142" w:after="142"/>
+        <w:ind w:hanging="0" w:left="0" w:right="0"/>
         <w:rPr/>
       </w:pPr>
       <w:bookmarkStart w:id="24" w:name="__RefHeading___Toc25856_1820571732"/>
@@ -9243,7 +9311,192 @@
           <w:i w:val="false"/>
           <w:iCs w:val="false"/>
         </w:rPr>
-        <w:t xml:space="preserve"> AMNH 6341, cervical vertebrae C8–C16 in dorsal (where available) and lateral views, to scale. Lateral views except C13 from McIntosh (2005: fig. 2.1).</w:t>
+        <w:t xml:space="preserve"> AMNH 6341, cervical vertebrae C8–C16 in dorsal (where available) and lateral views, to scale. Lateral views from McIntosh (2005: fig. 2.1) </w:t>
+      </w:r>
+      <w:r>
+        <w:rPr>
+          <w:b w:val="false"/>
+          <w:bCs w:val="false"/>
+          <w:i w:val="false"/>
+          <w:iCs w:val="false"/>
+        </w:rPr>
+        <w:t>except except C13, which we were able to photograph in collections</w:t>
+      </w:r>
+      <w:r>
+        <w:rPr>
+          <w:b w:val="false"/>
+          <w:bCs w:val="false"/>
+          <w:i w:val="false"/>
+          <w:iCs w:val="false"/>
+        </w:rPr>
+        <w:t xml:space="preserve">. </w:t>
+      </w:r>
+      <w:r>
+        <w:rPr>
+          <w:b w:val="false"/>
+          <w:bCs w:val="false"/>
+          <w:i w:val="false"/>
+          <w:iCs w:val="false"/>
+        </w:rPr>
+        <w:t>Extensive image manipulation was necessary to bring out the information in the dorsal view photographs, due to to poor photography conditions. C16 is sheered to the right, so the aspect is slightly left dorsolateral rather than true dorsal. C8 is on display in the gallery with these vertebrae, but the structure of the display makes it impossible to photograph in dorsal view. C13 is on a shelf in collections, apart from the other cervicals, and we were not able to photograph it in dorsal view.</w:t>
+      </w:r>
+    </w:p>
+    <w:p>
+      <w:pPr>
+        <w:pStyle w:val="FigureCaption"/>
+        <w:bidi w:val="0"/>
+        <w:spacing w:before="0" w:after="142"/>
+        <w:jc w:val="left"/>
+        <w:rPr>
+          <w:b w:val="false"/>
+          <w:bCs w:val="false"/>
+          <w:i w:val="false"/>
+          <w:iCs w:val="false"/>
+        </w:rPr>
+      </w:pPr>
+      <w:r>
+        <w:rPr>
+          <w:b/>
+          <w:bCs/>
+          <w:i w:val="false"/>
+          <w:iCs w:val="false"/>
+        </w:rPr>
+        <w:t>Figure S.</w:t>
+      </w:r>
+      <w:r>
+        <w:rPr>
+          <w:b w:val="false"/>
+          <w:bCs w:val="false"/>
+          <w:i w:val="false"/>
+          <w:iCs w:val="false"/>
+        </w:rPr>
+        <w:t xml:space="preserve"> The anterior part of the AMNH </w:t>
+      </w:r>
+      <w:r>
+        <w:rPr>
+          <w:b w:val="false"/>
+          <w:bCs w:val="false"/>
+          <w:i/>
+          <w:iCs/>
+        </w:rPr>
+        <w:t>Barosaurus</w:t>
+      </w:r>
+      <w:r>
+        <w:rPr>
+          <w:b w:val="false"/>
+          <w:bCs w:val="false"/>
+          <w:i w:val="false"/>
+          <w:iCs w:val="false"/>
+        </w:rPr>
+        <w:t xml:space="preserve"> neck (skull and first eight cervicals, though the atlas and axis are absent at this point) during the mounting process. </w:t>
+      </w:r>
+      <w:r>
+        <w:rPr>
+          <w:b/>
+          <w:bCs/>
+          <w:i w:val="false"/>
+          <w:iCs w:val="false"/>
+        </w:rPr>
+        <w:t>A.</w:t>
+      </w:r>
+      <w:r>
+        <w:rPr>
+          <w:b w:val="false"/>
+          <w:bCs w:val="false"/>
+          <w:i w:val="false"/>
+          <w:iCs w:val="false"/>
+        </w:rPr>
+        <w:t xml:space="preserve"> lying on the floor, seen in roughly dorsal view. </w:t>
+      </w:r>
+      <w:r>
+        <w:rPr>
+          <w:b/>
+          <w:bCs/>
+          <w:i w:val="false"/>
+          <w:iCs w:val="false"/>
+        </w:rPr>
+        <w:t>B.</w:t>
+      </w:r>
+      <w:r>
+        <w:rPr>
+          <w:b w:val="false"/>
+          <w:bCs w:val="false"/>
+          <w:i w:val="false"/>
+          <w:iCs w:val="false"/>
+        </w:rPr>
+        <w:t xml:space="preserve"> held upright, seen in right lateral view. Note that the vertebra in positions 3–7 are those of </w:t>
+      </w:r>
+      <w:r>
+        <w:rPr>
+          <w:b w:val="false"/>
+          <w:bCs w:val="false"/>
+          <w:i/>
+          <w:iCs/>
+        </w:rPr>
+        <w:t>Diplodocus</w:t>
+      </w:r>
+      <w:r>
+        <w:rPr>
+          <w:b w:val="false"/>
+          <w:bCs w:val="false"/>
+          <w:i w:val="false"/>
+          <w:iCs w:val="false"/>
+        </w:rPr>
+        <w:t xml:space="preserve">, with relatively high bifurcated neural spines, while the vertebra in position 8 is that of </w:t>
+      </w:r>
+      <w:r>
+        <w:rPr>
+          <w:b w:val="false"/>
+          <w:bCs w:val="false"/>
+          <w:i/>
+          <w:iCs/>
+        </w:rPr>
+        <w:t>Barosaurus</w:t>
+      </w:r>
+      <w:r>
+        <w:rPr>
+          <w:b w:val="false"/>
+          <w:bCs w:val="false"/>
+          <w:i w:val="false"/>
+          <w:iCs w:val="false"/>
+        </w:rPr>
+        <w:t xml:space="preserve">, with a low and unbifurcated spine. Comparison with the Carnegie </w:t>
+      </w:r>
+      <w:r>
+        <w:rPr>
+          <w:b w:val="false"/>
+          <w:bCs w:val="false"/>
+          <w:i/>
+          <w:iCs/>
+        </w:rPr>
+        <w:t>Diplodocus</w:t>
+      </w:r>
+      <w:r>
+        <w:rPr>
+          <w:b w:val="false"/>
+          <w:bCs w:val="false"/>
+          <w:i w:val="false"/>
+          <w:iCs w:val="false"/>
+        </w:rPr>
+        <w:t xml:space="preserve"> shows that those in positions 3–6 are C3–C6 of </w:t>
+      </w:r>
+      <w:r>
+        <w:rPr>
+          <w:b w:val="false"/>
+          <w:bCs w:val="false"/>
+          <w:i/>
+          <w:iCs/>
+        </w:rPr>
+        <w:t>Diplodocus</w:t>
+      </w:r>
+      <w:r>
+        <w:rPr>
+          <w:b w:val="false"/>
+          <w:bCs w:val="false"/>
+          <w:i w:val="false"/>
+          <w:iCs w:val="false"/>
+        </w:rPr>
+        <w:t>, but that the 8th cervical vertebra of Diplodocus is used in position 7 to give a more even progression of increasing length.</w:t>
       </w:r>
     </w:p>
     <w:p>
@@ -12422,8 +12675,8 @@
       <w:rFonts w:ascii="Gill Sans" w:hAnsi="Gill Sans" w:eastAsia="Songti SC" w:cs="Arial Unicode MS"/>
       <w:b/>
       <w:bCs/>
-      <w:sz w:val="24"/>
-      <w:szCs w:val="36"/>
+      <w:sz w:val="26"/>
+      <w:szCs w:val="26"/>
     </w:rPr>
   </w:style>
   <w:style w:type="paragraph" w:styleId="Heading3">
@@ -12432,15 +12685,19 @@
     <w:next w:val="BodyText"/>
     <w:qFormat/>
     <w:pPr>
+      <w:numPr>
+        <w:ilvl w:val="2"/>
+        <w:numId w:val="5"/>
+      </w:numPr>
       <w:spacing w:before="142" w:after="142"/>
       <w:ind w:hanging="0" w:left="0" w:right="0"/>
       <w:outlineLvl w:val="2"/>
     </w:pPr>
     <w:rPr>
-      <w:b w:val="false"/>
+      <w:b/>
       <w:bCs/>
-      <w:sz w:val="22"/>
-      <w:szCs w:val="28"/>
+      <w:sz w:val="20"/>
+      <w:szCs w:val="20"/>
     </w:rPr>
   </w:style>
   <w:style w:type="paragraph" w:styleId="Heading4">

</xml_diff>

<commit_message>
Remove Norell and McIntosh from authorship
</commit_message>
<xml_diff>
--- a/TaylorEtAl-mounted-barosaurus.docx
+++ b/TaylorEtAl-mounted-barosaurus.docx
@@ -185,62 +185,6 @@
         </w:r>
       </w:hyperlink>
       <w:bookmarkEnd w:id="0"/>
-    </w:p>
-    <w:p>
-      <w:pPr>
-        <w:pStyle w:val="Author"/>
-        <w:rPr/>
-      </w:pPr>
-      <w:r>
-        <w:rPr>
-          <w:b/>
-          <w:bCs/>
-          <w:i w:val="false"/>
-          <w:iCs w:val="false"/>
-        </w:rPr>
-        <w:t xml:space="preserve">Mark A. Norell. </w:t>
-      </w:r>
-      <w:r>
-        <w:rPr>
-          <w:b w:val="false"/>
-          <w:bCs w:val="false"/>
-          <w:i w:val="false"/>
-          <w:iCs w:val="false"/>
-        </w:rPr>
-        <w:t>Division of Paleontology, American Museum of Natural History, New York, New York, USA.</w:t>
-      </w:r>
-    </w:p>
-    <w:p>
-      <w:pPr>
-        <w:pStyle w:val="Author"/>
-        <w:rPr/>
-      </w:pPr>
-      <w:r>
-        <w:rPr>
-          <w:b/>
-          <w:bCs/>
-          <w:i w:val="false"/>
-          <w:iCs w:val="false"/>
-        </w:rPr>
-        <w:t>John S. McIntosh</w:t>
-      </w:r>
-      <w:r>
-        <w:rPr>
-          <w:rFonts w:eastAsia="Baskerville" w:cs="Baskerville"/>
-          <w:b/>
-          <w:bCs/>
-          <w:i w:val="false"/>
-          <w:iCs w:val="false"/>
-        </w:rPr>
-        <w:t>†.</w:t>
-      </w:r>
-      <w:r>
-        <w:rPr>
-          <w:i w:val="false"/>
-          <w:iCs w:val="false"/>
-        </w:rPr>
-        <w:t xml:space="preserve"> Foss Professor of Physics, emeritus, Wesleyan University, Middletown, Connecticut, USA (deceased, December 13, 2015).</w:t>
-      </w:r>
     </w:p>
     <w:p>
       <w:pPr>
@@ -3863,7 +3807,7 @@
       </w:r>
       <w:r>
         <w:rPr/>
-        <w:t xml:space="preserve"> can be seen to be C3–6 and C8 (and presumably the atlas and axis).</w:t>
+        <w:t xml:space="preserve"> can be seen to be C3–6 and C8 (512 mm) — and presumably the atlas and axis.</w:t>
       </w:r>
     </w:p>
     <w:p>

</xml_diff>

<commit_message>
Integrate documents from archive
</commit_message>
<xml_diff>
--- a/TaylorEtAl-mounted-barosaurus.docx
+++ b/TaylorEtAl-mounted-barosaurus.docx
@@ -2462,7 +2462,7 @@
     </w:p>
     <w:p>
       <w:pPr>
-        <w:pStyle w:val="BlockQuotationuser"/>
+        <w:pStyle w:val="BlockQuotation"/>
         <w:rPr/>
       </w:pPr>
       <w:r>
@@ -2548,7 +2548,11 @@
       </w:pPr>
       <w:r>
         <w:rPr/>
-        <w:t>At the time of the casting-and-mounting project, it was well documented with contracts, architectural drawings, inventories, shipping notes and other documents. But with the passage of more than three decades, nearly all this paperwork has been lost. The retirement of key individuals at the AMNH, including several authors of the present work, resulted in records being moved between offices and ultimately misplaced; and an extensive search of RCI’s archives has turned up little. As a result, nearly all that follows has been assembled from the memories of the individuals involved, supplemented by information from contemporary and near-contemporary accounts such as those of Norell et al. (1991) and Dingus (1996).</w:t>
+        <w:t xml:space="preserve">At the time of the casting-and-mounting project, it was well documented with contracts, architectural drawings, inventories, shipping notes and other documents. But with the passage of more than three decades, nearly all this paperwork has been lost. The retirement of key individuals at the AMNH, including several authors of the present work, resulted in records being moved between offices and ultimately misplaced; and an extensive search of RCI’s archives has turned up little. As a result, nearly all that follows has been assembled from the memories of the individuals involved, supplemented by information from contemporary and near-contemporary accounts such as those of Norell et al. (1991) and Dingus (1996), </w:t>
+      </w:r>
+      <w:r>
+        <w:rPr/>
+        <w:t>and what few documents were recovered from AMNH archives.</w:t>
       </w:r>
     </w:p>
     <w:p>
@@ -2558,7 +2562,31 @@
       </w:pPr>
       <w:r>
         <w:rPr/>
-        <w:t xml:space="preserve">Early in the process, a prototype model was made at around 1/16 full size to allow the scene to be created and manipulated at a workable scale (Figure H). This was created by a model-maker at </w:t>
+        <w:t xml:space="preserve">Early in the process, </w:t>
+      </w:r>
+      <w:r>
+        <w:rPr/>
+        <w:t xml:space="preserve">around March 1990, </w:t>
+      </w:r>
+      <w:r>
+        <w:rPr/>
+        <w:t xml:space="preserve">a prototype model at </w:t>
+      </w:r>
+      <w:r>
+        <w:rPr/>
+        <w:t xml:space="preserve">about </w:t>
+      </w:r>
+      <w:r>
+        <w:rPr/>
+        <w:t xml:space="preserve">1/16 full size was </w:t>
+      </w:r>
+      <w:r>
+        <w:rPr/>
+        <w:t>commissioned at a cost of $3,980 (Galiano 1990)</w:t>
+      </w:r>
+      <w:r>
+        <w:rPr/>
+        <w:t xml:space="preserve">, to allow the scene to be created and manipulated at a workable scale (Figure H). This was created by a model-maker at </w:t>
       </w:r>
       <w:r>
         <w:rPr>
@@ -2579,6 +2607,103 @@
       </w:pPr>
       <w:r>
         <w:rPr/>
+        <w:t xml:space="preserve">On 28 March 1990, an agreement was made between Lowell Dingus, acting for the AMNH, and Peter May and Andrew Leitch, acting for Research Casting International (RCI), to provide the fully mounted and painted cast skeletons of a rearing adult </w:t>
+      </w:r>
+      <w:r>
+        <w:rPr>
+          <w:i/>
+          <w:iCs/>
+        </w:rPr>
+        <w:t>Barosaurus</w:t>
+      </w:r>
+      <w:r>
+        <w:rPr/>
+        <w:t xml:space="preserve">, a juvenile, and an </w:t>
+      </w:r>
+      <w:r>
+        <w:rPr>
+          <w:i/>
+          <w:iCs/>
+        </w:rPr>
+        <w:t>Allosaurus</w:t>
+      </w:r>
+      <w:r>
+        <w:rPr/>
+        <w:t xml:space="preserve"> (Dingus 1990). The total agreed cost was $184,675 </w:t>
+      </w:r>
+      <w:r>
+        <w:rPr/>
+        <w:t>(equivalent to $472,000 in 2026 according to usinflationcalculator.com.)</w:t>
+      </w:r>
+      <w:r>
+        <w:rPr/>
+        <w:t xml:space="preserve"> </w:t>
+      </w:r>
+      <w:r>
+        <w:rPr/>
+        <w:t xml:space="preserve">This amount was </w:t>
+      </w:r>
+      <w:r>
+        <w:rPr/>
+        <w:t xml:space="preserve">made up of $72,721 for the adult </w:t>
+      </w:r>
+      <w:r>
+        <w:rPr>
+          <w:i/>
+          <w:iCs/>
+        </w:rPr>
+        <w:t>Barosaurus</w:t>
+      </w:r>
+      <w:r>
+        <w:rPr/>
+        <w:t xml:space="preserve">, $75,136 for the juvenile, $16,660 for the </w:t>
+      </w:r>
+      <w:r>
+        <w:rPr>
+          <w:i/>
+          <w:iCs/>
+        </w:rPr>
+        <w:t>Allosaurus</w:t>
+      </w:r>
+      <w:r>
+        <w:rPr/>
+        <w:t xml:space="preserve">, $15,411 for a duplicate model of the juvenile </w:t>
+      </w:r>
+      <w:r>
+        <w:rPr>
+          <w:i/>
+          <w:iCs/>
+        </w:rPr>
+        <w:t>Barosaurus</w:t>
+      </w:r>
+      <w:r>
+        <w:rPr/>
+        <w:t xml:space="preserve"> for Dinosaur National Monument, </w:t>
+      </w:r>
+      <w:r>
+        <w:rPr/>
+        <w:t xml:space="preserve">and $4,748 for travel and transport. (Surprisingly, the small juvenile cost more than than adult!). </w:t>
+      </w:r>
+      <w:r>
+        <w:rPr/>
+        <w:t>Th</w:t>
+      </w:r>
+      <w:r>
+        <w:rPr/>
+        <w:t>e</w:t>
+      </w:r>
+      <w:r>
+        <w:rPr/>
+        <w:t xml:space="preserve"> agreement was signed by Dingus on 28 March, by May and Leitch on 30 March, and by AMNH director William J,. Moynihan on 3 April.</w:t>
+      </w:r>
+    </w:p>
+    <w:p>
+      <w:pPr>
+        <w:pStyle w:val="BodyText"/>
+        <w:rPr/>
+      </w:pPr>
+      <w:r>
+        <w:rPr/>
         <w:t xml:space="preserve">Individual fossilized cervical vertebrae of </w:t>
       </w:r>
       <w:r>
@@ -2643,7 +2768,31 @@
       </w:pPr>
       <w:r>
         <w:rPr/>
-        <w:t xml:space="preserve">All casting and sculpting was done by Research Casting International (RCI), an organization specializing in mounting prehistoric animals that had then only recently been established. Founder Peter May had started working with fossil mounts at the Royal Ontario Museum, beginning in 1977, where he learned the techniques from paleontology technician Gordon Gyrmov and former WW2 Luftwaffe test pilot Rudy Zimmermann. He rose to became the head technician at the ROM. Having worked for a while at the Royal Tyrrell Paleontology Museum in Alberta, he found on returning to the ROM that his expertise was in demand from other museums. Initially fitting this outside work into his spare time under the banner of RCI, he went full time with his company in 1990, and the AMNH </w:t>
+        <w:t xml:space="preserve">All casting and sculpting was done by </w:t>
+      </w:r>
+      <w:r>
+        <w:rPr/>
+        <w:t>RCI</w:t>
+      </w:r>
+      <w:r>
+        <w:rPr/>
+        <w:t xml:space="preserve">, an organization specializing in mounting prehistoric animals that had then only recently been established. Founder Peter May had started working with fossil mounts at the Royal Ontario Museum, beginning in 1977, where he learned the techniques from paleontology technician Gordon Gyrmov and former WW2 Luftwaffe </w:t>
+      </w:r>
+      <w:r>
+        <w:rPr/>
+        <w:t xml:space="preserve">rocket-plane </w:t>
+      </w:r>
+      <w:r>
+        <w:rPr/>
+        <w:t xml:space="preserve">test pilot Rudy Zimmermann. </w:t>
+      </w:r>
+      <w:r>
+        <w:rPr/>
+        <w:t>May</w:t>
+      </w:r>
+      <w:r>
+        <w:rPr/>
+        <w:t xml:space="preserve"> rose to became the head technician at the ROM. Having worked for a while at the Royal Tyrrell Paleontology Museum in Alberta, he found on returning to the ROM that his expertise was in demand from other museums. Initially fitting this outside work into his spare time under the banner of RCI, he went full time with his company in 1990, and the AMNH </w:t>
       </w:r>
       <w:r>
         <w:rPr>
@@ -2804,7 +2953,23 @@
       </w:pPr>
       <w:r>
         <w:rPr/>
-        <w:t>In November 1991, the work in Toronto was complete, and the completed exhibit was transported to New York in sections for mounting (Figure O). Unlike the trial mounting in Toronto, when the head and neck were attached in three sections, in New York the three sections were first joined together and then fitted as a unit. This large unit, about nine meters in length, proved awkward to manoeuvre, and it was difficult to raise it to a sufficient height to slide into its slot (Figure L). It took nearly two hours to wrestle it into place at the front of the rearing torso. Worse, when the mount was finally completed it was imperfect because, when the whole neck had been hanging horizontally, it had bent in the middle at the point of suspension. The resulting kink in the neck can be seen between C10 and C11 in Figure A and in other contemporary photos such as those of Dingus (1996:26) and Lindsay (1992:18–20). It was soon corrected, however, in a near-disastrous but ultimately successful late-night operation (Dingus 1996:28), and the line of the neck is smooth and elegant in the mount as it is today.</w:t>
+        <w:t xml:space="preserve">In November 1991, the work in Toronto was complete, and Blakelock Moving </w:t>
+      </w:r>
+      <w:r>
+        <w:rPr/>
+        <w:t xml:space="preserve">were contracted to ship the </w:t>
+      </w:r>
+      <w:r>
+        <w:rPr/>
+        <w:t xml:space="preserve">completed exhibit to New York </w:t>
+      </w:r>
+      <w:r>
+        <w:rPr/>
+        <w:t xml:space="preserve">on 7 November (Clark 1991), </w:t>
+      </w:r>
+      <w:r>
+        <w:rPr/>
+        <w:t>in sections for mounting (Figure O). Unlike the trial mounting in Toronto, when the head and neck were attached in three sections, in New York the three sections were first joined together and then fitted as a unit. This large unit, about nine meters in length, proved awkward to manoeuvre, and it was difficult to raise it to a sufficient height to slide into its slot (Figure L). It took nearly two hours to wrestle it into place at the front of the rearing torso. Worse, when the mount was finally completed it was imperfect because, when the whole neck had been hanging horizontally, it had bent in the middle at the point of suspension. The resulting kink in the neck can be seen between C10 and C11 in Figure A and in other contemporary photos such as those of Dingus (1996:26) and Lindsay (1992:18–20). It was soon corrected, however, in a near-disastrous but ultimately successful late-night operation (Dingus 1996:28), and the line of the neck is smooth and elegant in the mount as it is today.</w:t>
       </w:r>
     </w:p>
     <w:p>
@@ -3025,7 +3190,7 @@
     </w:p>
     <w:p>
       <w:pPr>
-        <w:pStyle w:val="BlockQuotationuser"/>
+        <w:pStyle w:val="BlockQuotation"/>
         <w:rPr/>
       </w:pPr>
       <w:r>
@@ -3052,6 +3217,7 @@
           <w:ilvl w:val="2"/>
           <w:numId w:val="5"/>
         </w:numPr>
+        <w:ind w:hanging="0" w:left="0" w:right="0"/>
         <w:rPr/>
       </w:pPr>
       <w:bookmarkStart w:id="16" w:name="__RefHeading___Toc16585_68767826"/>
@@ -3681,15 +3847,7 @@
       </w:r>
       <w:r>
         <w:rPr/>
-        <w:t>. (The earliest mention of the sixteen-cervicals hypothesis in print appears in a caption in a children’s book, Lindsay 1992:20.) Whether or not the AMNH 6341 material may at some point have included a</w:t>
-      </w:r>
-      <w:r>
-        <w:rPr/>
-        <w:t>n additional</w:t>
-      </w:r>
-      <w:r>
-        <w:rPr/>
-        <w:t xml:space="preserve"> cervical vertebra (C7), at present it preserves the last nine cervical vertebrae. These are therefore considered to be C8–C16.</w:t>
+        <w:t>. (The earliest mention of the sixteen-cervicals hypothesis in print appears in a caption in a children’s book, Lindsay 1992:20.) Whether or not the AMNH 6341 material may at some point have included an additional cervical vertebra (C7), at present it preserves the last nine cervical vertebrae. These are therefore considered to be C8–C16.</w:t>
       </w:r>
     </w:p>
     <w:p>
@@ -3699,15 +3857,7 @@
       </w:pPr>
       <w:r>
         <w:rPr/>
-        <w:t xml:space="preserve">The anterior part of </w:t>
-      </w:r>
-      <w:r>
-        <w:rPr/>
-        <w:t xml:space="preserve">the </w:t>
-      </w:r>
-      <w:r>
-        <w:rPr/>
-        <w:t xml:space="preserve">neck of the mount was completed using seven casts of anterior vertebrae from the Carnegie </w:t>
+        <w:t xml:space="preserve">The anterior part of the neck of the mount was completed using seven casts of anterior vertebrae from the Carnegie </w:t>
       </w:r>
       <w:r>
         <w:rPr>
@@ -3762,19 +3912,7 @@
       </w:r>
       <w:r>
         <w:rPr/>
-        <w:t xml:space="preserve"> cervicals was used to obtain a smooth</w:t>
-      </w:r>
-      <w:r>
-        <w:rPr/>
-        <w:t>er</w:t>
-      </w:r>
-      <w:r>
-        <w:rPr/>
-        <w:t xml:space="preserve"> transition. </w:t>
-      </w:r>
-      <w:r>
-        <w:rPr/>
-        <w:t xml:space="preserve">By comparison of </w:t>
+        <w:t xml:space="preserve"> cervicals was used to obtain a smoother transition. By comparison of </w:t>
       </w:r>
       <w:r>
         <w:rPr>
@@ -3828,15 +3966,7 @@
       </w:r>
       <w:r>
         <w:rPr/>
-        <w:t xml:space="preserve"> had 17 cervicals, due to his uncertainty about the correct </w:t>
-      </w:r>
-      <w:r>
-        <w:rPr/>
-        <w:t>interpretation</w:t>
-      </w:r>
-      <w:r>
-        <w:rPr/>
-        <w:t xml:space="preserve"> of the 9th</w:t>
+        <w:t xml:space="preserve"> had 17 cervicals, due to his uncertainty about the correct interpretation of the 9th</w:t>
       </w:r>
       <w:r>
         <w:rPr>
@@ -3846,23 +3976,7 @@
       </w:r>
       <w:r>
         <w:rPr/>
-        <w:t xml:space="preserve">presacral, which he </w:t>
-      </w:r>
-      <w:r>
-        <w:rPr/>
-        <w:t xml:space="preserve">tentatively </w:t>
-      </w:r>
-      <w:r>
-        <w:rPr/>
-        <w:t xml:space="preserve">designated as the first dorsal vertebra, but considered possibly the last cervical. However, the existence of a 17th cervical </w:t>
-      </w:r>
-      <w:r>
-        <w:rPr/>
-        <w:t xml:space="preserve">on this basis is </w:t>
-      </w:r>
-      <w:r>
-        <w:rPr/>
-        <w:t>predicated on a reduced dorsal count of eight, and the mounted skeleton has nine dorsals with free ribs. The additional cervical therefore appears to be an insert not warranted by the evidence available at the time of mounting.</w:t>
+        <w:t>presacral, which he tentatively designated as the first dorsal vertebra, but considered possibly the last cervical. However, the existence of a 17th cervical on this basis is predicated on a reduced dorsal count of eight, and the mounted skeleton has nine dorsals with free ribs. The additional cervical therefore appears to be an insert not warranted by the evidence available at the time of mounting.</w:t>
       </w:r>
     </w:p>
     <w:p>
@@ -3872,35 +3986,7 @@
       </w:pPr>
       <w:r>
         <w:rPr/>
-        <w:t>However, photos of the mounting process in the AMNH (e.g. Figure O) show that the neck section used in the mount had only 1</w:t>
-      </w:r>
-      <w:r>
-        <w:rPr/>
-        <w:t>4</w:t>
-      </w:r>
-      <w:r>
-        <w:rPr/>
-        <w:t xml:space="preserve"> cervical vertebrae — </w:t>
-      </w:r>
-      <w:r>
-        <w:rPr/>
-        <w:t>C3–16</w:t>
-      </w:r>
-      <w:r>
-        <w:rPr/>
-        <w:t xml:space="preserve">, not counting the altas and axis which were not in place at that time. The assembly process was complex. The neck section containing the head and </w:t>
-      </w:r>
-      <w:r>
-        <w:rPr/>
-        <w:t>C1–</w:t>
-      </w:r>
-      <w:r>
-        <w:rPr/>
-        <w:t xml:space="preserve">16 was welded to the torso leaving a stretch of bare armature. The two halves of the seventeenth vertebra (visible on the left side of Figure O) </w:t>
-      </w:r>
-      <w:r>
-        <w:rPr/>
-        <w:t xml:space="preserve">were then glued together around the armature and bridging the gap between the bones of the neck section and the torso. The special 17th vertebra can be seen in Figure K.B, distinctly darker than the cervicals above it and the dorsals below. Since there are no duplicate vertebrae in the neck, the special C17 must have come from elsewhere. Careful comparisons suggest it is a cast of C14 of the Carnegie </w:t>
+        <w:t xml:space="preserve">However, photos of the mounting process in the AMNH (e.g. Figure O) show that the neck section used in the mount had only 14 cervical vertebrae — C3–16, not counting the altas and axis which were not in place at that time. The assembly process was complex. The neck section containing the head and C1–16 was welded to the torso leaving a stretch of bare armature. The two halves of the seventeenth vertebra (visible on the left side of Figure O) were then glued together around the armature and bridging the gap between the bones of the neck section and the torso. The special 17th vertebra can be seen in Figure K.B, distinctly darker than the cervicals above it and the dorsals below. Since there are no duplicate vertebrae in the neck, the special C17 must have come from elsewhere. Careful comparisons suggest it is a cast of C14 of the Carnegie </w:t>
       </w:r>
       <w:r>
         <w:rPr>
@@ -3954,15 +4040,7 @@
       </w:r>
       <w:r>
         <w:rPr/>
-        <w:t xml:space="preserve"> did have 17 cervicals, or even more, as in </w:t>
-      </w:r>
-      <w:r>
-        <w:rPr/>
-        <w:t>the 18 of</w:t>
-      </w:r>
-      <w:r>
-        <w:rPr/>
-        <w:t xml:space="preserve"> </w:t>
+        <w:t xml:space="preserve"> did have 17 cervicals, or even more, as in the 18 of </w:t>
       </w:r>
       <w:r>
         <w:rPr>
@@ -3973,11 +4051,7 @@
       </w:r>
       <w:r>
         <w:rPr/>
-        <w:t xml:space="preserve"> (Ouyang and Ye 2002:24–30) or </w:t>
-      </w:r>
-      <w:r>
-        <w:rPr/>
-        <w:t xml:space="preserve">the 19 of </w:t>
+        <w:t xml:space="preserve"> (Ouyang and Ye 2002:24–30) or the 19 of </w:t>
       </w:r>
       <w:r>
         <w:rPr>
@@ -6093,6 +6167,16 @@
       </w:pPr>
       <w:r>
         <w:rPr/>
+        <w:t>Clark, Robert J. 1991. Letter to Peter May, Research Casting International. 28 October 1991.</w:t>
+      </w:r>
+    </w:p>
+    <w:p>
+      <w:pPr>
+        <w:pStyle w:val="Reference"/>
+        <w:rPr/>
+      </w:pPr>
+      <w:r>
+        <w:rPr/>
         <w:t>Coggeshall, Arthur S. 1924. Letter to Charles W. Gilmore reporting that neck section is ready to be shipped from Caregie Museum to USNM. About 21 October 1924.</w:t>
       </w:r>
     </w:p>
@@ -6254,6 +6338,16 @@
       <w:r>
         <w:rPr/>
         <w:t>:1228.</w:t>
+      </w:r>
+    </w:p>
+    <w:p>
+      <w:pPr>
+        <w:pStyle w:val="Reference"/>
+        <w:rPr/>
+      </w:pPr>
+      <w:r>
+        <w:rPr/>
+        <w:t>Dingus, Lowell. 1990. Letter of agreement to Peter May and Andrew Leitch, Research Casting International. 28 March 1990.</w:t>
       </w:r>
     </w:p>
     <w:p>
@@ -6336,6 +6430,16 @@
       </w:pPr>
       <w:r>
         <w:rPr/>
+        <w:t>Galiano, Henry. 1990. Letter to James “Chip” Jeffries, Ralph Appelbaum Associates. 22 March 1990.</w:t>
+      </w:r>
+    </w:p>
+    <w:p>
+      <w:pPr>
+        <w:pStyle w:val="Reference"/>
+        <w:rPr/>
+      </w:pPr>
+      <w:r>
+        <w:rPr/>
         <w:t>Gilmore, Charles w. 1923a. Handwritten letter to William de C. Ravenel briefly summarising the outcome of the field season at the Dinosaur National Monument quarry. 8 August 1923.</w:t>
       </w:r>
     </w:p>
@@ -8699,7 +8803,7 @@
     </w:p>
     <w:p>
       <w:pPr>
-        <w:pStyle w:val="BlockQuotationuser"/>
+        <w:pStyle w:val="BlockQuotation"/>
         <w:rPr/>
       </w:pPr>
       <w:r>
@@ -8732,7 +8836,7 @@
         <w:pStyle w:val="FigureCaption"/>
         <w:widowControl/>
         <w:suppressAutoHyphens w:val="true"/>
-        <w:overflowPunct w:val="true"/>
+        <w:overflowPunct w:val="false"/>
         <w:bidi w:val="0"/>
         <w:spacing w:lineRule="auto" w:line="276" w:before="0" w:after="142"/>
         <w:ind w:hanging="0" w:left="283" w:right="0"/>
@@ -8783,7 +8887,15 @@
       </w:r>
       <w:r>
         <w:rPr/>
-        <w:t>, and the base is 44 inches (112 cm) long. Despite some notable differences — for example, the model has a much more strongly S-curved neck than the full-size mount, and its forefeet lack digits — the model seems to have been followed fairly closely in composing the final mount, and remains a beautiful object in its own right. Photograph by Mick Ellison (AMNH).</w:t>
+        <w:t xml:space="preserve">, and the base is 44 inches (112 cm) long </w:t>
+      </w:r>
+      <w:r>
+        <w:rPr/>
+        <w:t>(Mick Ellison, pers. comm, 2022</w:t>
+      </w:r>
+      <w:r>
+        <w:rPr/>
+        <w:t>. Despite some notable differences — for example, the model has a much more strongly S-curved neck than the full-size mount, and its forefeet lack digits — the model seems to have been followed fairly closely in composing the final mount, and remains a beautiful object in its own right. Photograph by Mick Ellison (AMNH).</w:t>
       </w:r>
     </w:p>
     <w:p>
@@ -9255,34 +9367,7 @@
           <w:i w:val="false"/>
           <w:iCs w:val="false"/>
         </w:rPr>
-        <w:t xml:space="preserve"> AMNH 6341, cervical vertebrae C8–C16 in dorsal (where available) and lateral views, to scale. Lateral views from McIntosh (2005: fig. 2.1) </w:t>
-      </w:r>
-      <w:r>
-        <w:rPr>
-          <w:b w:val="false"/>
-          <w:bCs w:val="false"/>
-          <w:i w:val="false"/>
-          <w:iCs w:val="false"/>
-        </w:rPr>
-        <w:t>except except C13, which we were able to photograph in collections</w:t>
-      </w:r>
-      <w:r>
-        <w:rPr>
-          <w:b w:val="false"/>
-          <w:bCs w:val="false"/>
-          <w:i w:val="false"/>
-          <w:iCs w:val="false"/>
-        </w:rPr>
-        <w:t xml:space="preserve">. </w:t>
-      </w:r>
-      <w:r>
-        <w:rPr>
-          <w:b w:val="false"/>
-          <w:bCs w:val="false"/>
-          <w:i w:val="false"/>
-          <w:iCs w:val="false"/>
-        </w:rPr>
-        <w:t>Extensive image manipulation was necessary to bring out the information in the dorsal view photographs, due to to poor photography conditions. C16 is sheered to the right, so the aspect is slightly left dorsolateral rather than true dorsal. C8 is on display in the gallery with these vertebrae, but the structure of the display makes it impossible to photograph in dorsal view. C13 is on a shelf in collections, apart from the other cervicals, and we were not able to photograph it in dorsal view.</w:t>
+        <w:t xml:space="preserve"> AMNH 6341, cervical vertebrae C8–C16 in dorsal (where available) and lateral views, to scale. Lateral views from McIntosh (2005: fig. 2.1) except except C13, which we were able to photograph in collections. Extensive image manipulation was necessary to bring out the information in the dorsal view photographs, due to to poor photography conditions. C16 is sheered to the right, so the aspect is slightly left dorsolateral rather than true dorsal. C8 is on display in the gallery with these vertebrae, but the structure of the display makes it impossible to photograph in dorsal view. C13 is on a shelf in collections, apart from the other cervicals, and we were not able to photograph it in dorsal view.</w:t>
       </w:r>
     </w:p>
     <w:p>
@@ -12572,7 +12657,7 @@
     <w:pPr>
       <w:widowControl/>
       <w:suppressAutoHyphens w:val="true"/>
-      <w:overflowPunct w:val="true"/>
+      <w:overflowPunct w:val="false"/>
       <w:bidi w:val="0"/>
       <w:spacing w:before="0" w:after="0"/>
       <w:ind w:hanging="0" w:left="0" w:right="0"/>
@@ -12683,8 +12768,8 @@
     <w:qFormat/>
     <w:rPr/>
   </w:style>
-  <w:style w:type="character" w:styleId="Bulletsuser">
-    <w:name w:val="Bullets (user)"/>
+  <w:style w:type="character" w:styleId="Bullets">
+    <w:name w:val="Bullets"/>
     <w:qFormat/>
     <w:rPr>
       <w:rFonts w:ascii="OpenSymbol" w:hAnsi="OpenSymbol" w:eastAsia="OpenSymbol" w:cs="OpenSymbol"/>
@@ -12809,8 +12894,8 @@
       <w:i/>
     </w:rPr>
   </w:style>
-  <w:style w:type="paragraph" w:styleId="BlockQuotationuser">
-    <w:name w:val="Block Quotation (user)"/>
+  <w:style w:type="paragraph" w:styleId="BlockQuotation">
+    <w:name w:val="Block Quotation"/>
     <w:basedOn w:val="Normal"/>
     <w:qFormat/>
     <w:pPr>

</xml_diff>

<commit_message>
Acknowledge archive documents in requested format
</commit_message>
<xml_diff>
--- a/TaylorEtAl-mounted-barosaurus.docx
+++ b/TaylorEtAl-mounted-barosaurus.docx
@@ -6568,7 +6568,11 @@
       </w:pPr>
       <w:r>
         <w:rPr/>
-        <w:t>Clark, Robert J. 1991. Letter to Peter May, Research Casting International. 28 October 1991.</w:t>
+        <w:t xml:space="preserve">Clark, Robert J. 1991. Letter to Peter May, Research Casting International. 28 October 1991. </w:t>
+      </w:r>
+      <w:r>
+        <w:rPr/>
+        <w:t>Department of Vertebrate Paleontology building and exhibit records, VPA 100, Series 3, Box 28, Folder 35, American Museum of Natural History Vertebrate Paleontology Archive.</w:t>
       </w:r>
     </w:p>
     <w:p>
@@ -6748,7 +6752,11 @@
       </w:pPr>
       <w:r>
         <w:rPr/>
-        <w:t>Dingus, Lowell. 1990. Letter of agreement to Peter May and Andrew Leitch, Research Casting International. 28 March 1990.</w:t>
+        <w:t xml:space="preserve">Dingus, Lowell. 1990. Letter of agreement to Peter May and Andrew Leitch, Research Casting International. 28 March 1990. </w:t>
+      </w:r>
+      <w:r>
+        <w:rPr/>
+        <w:t>Department of Vertebrate Paleontology building and exhibit records, VPA 100, Series 3, Box 28, Folder 35, American Museum of Natural History Vertebrate Paleontology Archive.</w:t>
       </w:r>
     </w:p>
     <w:p>
@@ -6831,7 +6839,7 @@
       </w:pPr>
       <w:r>
         <w:rPr/>
-        <w:t>Galiano, Henry. 1990. Letter to James “Chip” Jeffries, Ralph Appelbaum Associates. 22 March 1990.</w:t>
+        <w:t>Galiano, Henry. 1990. Letter to James “Chip” Jeffries, Ralph Appelbaum Associates. 22 March 1990. Department of Vertebrate Paleontology building and exhibit records, VPA 100, Series 3, Box 28, Folder 35, American Museum of Natural History Vertebrate Paleontology Archive.</w:t>
       </w:r>
     </w:p>
     <w:p>

</xml_diff>

<commit_message>
Fix sorting of references
</commit_message>
<xml_diff>
--- a/TaylorEtAl-mounted-barosaurus.docx
+++ b/TaylorEtAl-mounted-barosaurus.docx
@@ -6230,6 +6230,131 @@
       </w:pPr>
       <w:r>
         <w:rPr/>
+        <w:t xml:space="preserve">Badeer, Henry S., and James W. Hicks, 1996. Circulation to the head of </w:t>
+      </w:r>
+      <w:r>
+        <w:rPr>
+          <w:i/>
+          <w:iCs/>
+        </w:rPr>
+        <w:t>Barosaurus</w:t>
+      </w:r>
+      <w:r>
+        <w:rPr/>
+        <w:t xml:space="preserve"> revisited: theoretical considerations. </w:t>
+      </w:r>
+      <w:r>
+        <w:rPr>
+          <w:i/>
+          <w:iCs/>
+        </w:rPr>
+        <w:t>Comparative Biochemistry &amp; Physiology</w:t>
+      </w:r>
+      <w:r>
+        <w:rPr/>
+        <w:t xml:space="preserve"> </w:t>
+      </w:r>
+      <w:r>
+        <w:rPr>
+          <w:b/>
+          <w:bCs/>
+        </w:rPr>
+        <w:t>A114</w:t>
+      </w:r>
+      <w:r>
+        <w:rPr/>
+        <w:t>:197–203.</w:t>
+      </w:r>
+    </w:p>
+    <w:p>
+      <w:pPr>
+        <w:pStyle w:val="Reference"/>
+        <w:rPr/>
+      </w:pPr>
+      <w:r>
+        <w:rPr/>
+        <w:t xml:space="preserve">Bakker, Robert T. 1971. Brontosaurs. pp. 178–181 in: </w:t>
+      </w:r>
+      <w:r>
+        <w:rPr>
+          <w:i/>
+          <w:iCs/>
+        </w:rPr>
+        <w:t>McGraw-Hill Yearbook of Science and Technology</w:t>
+      </w:r>
+      <w:r>
+        <w:rPr/>
+        <w:t>, 1971. McGraw-Hill, New York, New York.</w:t>
+      </w:r>
+    </w:p>
+    <w:p>
+      <w:pPr>
+        <w:pStyle w:val="Reference"/>
+        <w:rPr/>
+      </w:pPr>
+      <w:r>
+        <w:rPr/>
+        <w:t xml:space="preserve">Bakker, Robert </w:t>
+      </w:r>
+      <w:r>
+        <w:rPr/>
+        <w:t>T</w:t>
+      </w:r>
+      <w:r>
+        <w:rPr/>
+        <w:t xml:space="preserve">. 1978. Dinosaur feeding behaviour and the origin of flowering plants. </w:t>
+      </w:r>
+      <w:r>
+        <w:rPr>
+          <w:i/>
+          <w:iCs/>
+        </w:rPr>
+        <w:t>Nature</w:t>
+      </w:r>
+      <w:r>
+        <w:rPr/>
+        <w:t xml:space="preserve"> </w:t>
+      </w:r>
+      <w:r>
+        <w:rPr>
+          <w:b/>
+          <w:bCs/>
+        </w:rPr>
+        <w:t>274</w:t>
+      </w:r>
+      <w:r>
+        <w:rPr/>
+        <w:t>:661–663.</w:t>
+      </w:r>
+    </w:p>
+    <w:p>
+      <w:pPr>
+        <w:pStyle w:val="Reference"/>
+        <w:rPr/>
+      </w:pPr>
+      <w:r>
+        <w:rPr/>
+        <w:t xml:space="preserve">Bakker, Robert T. 1986. </w:t>
+      </w:r>
+      <w:r>
+        <w:rPr>
+          <w:i/>
+          <w:iCs/>
+        </w:rPr>
+        <w:t>The Dinosaur Heresies: New Theories Unlocking The Mystery of the Dinosaurs and Their Extinction</w:t>
+      </w:r>
+      <w:r>
+        <w:rPr/>
+        <w:t>. Morrow, New York. 481 pages.</w:t>
+      </w:r>
+    </w:p>
+    <w:p>
+      <w:pPr>
+        <w:pStyle w:val="Reference"/>
+        <w:rPr/>
+      </w:pPr>
+      <w:r>
+        <w:rPr/>
         <w:t xml:space="preserve">Ballou, William H. 1897. Strange creatures of the past: gigantic saurians of the reptilian age. </w:t>
       </w:r>
       <w:r>
@@ -6270,123 +6395,6 @@
       </w:pPr>
       <w:r>
         <w:rPr/>
-        <w:t xml:space="preserve">Badeer, Henry S., and James W. Hicks, 1996. Circulation to the head of </w:t>
-      </w:r>
-      <w:r>
-        <w:rPr>
-          <w:i/>
-          <w:iCs/>
-        </w:rPr>
-        <w:t>Barosaurus</w:t>
-      </w:r>
-      <w:r>
-        <w:rPr/>
-        <w:t xml:space="preserve"> revisited: theoretical considerations. </w:t>
-      </w:r>
-      <w:r>
-        <w:rPr>
-          <w:i/>
-          <w:iCs/>
-        </w:rPr>
-        <w:t>Comparative Biochemistry &amp; Physiology</w:t>
-      </w:r>
-      <w:r>
-        <w:rPr/>
-        <w:t xml:space="preserve"> </w:t>
-      </w:r>
-      <w:r>
-        <w:rPr>
-          <w:b/>
-          <w:bCs/>
-        </w:rPr>
-        <w:t>A114</w:t>
-      </w:r>
-      <w:r>
-        <w:rPr/>
-        <w:t>:197–203.</w:t>
-      </w:r>
-    </w:p>
-    <w:p>
-      <w:pPr>
-        <w:pStyle w:val="Reference"/>
-        <w:rPr/>
-      </w:pPr>
-      <w:r>
-        <w:rPr/>
-        <w:t xml:space="preserve">Bakker, Robert T. 1971. Brontosaurs. pp. 178–181 in: </w:t>
-      </w:r>
-      <w:r>
-        <w:rPr>
-          <w:i/>
-          <w:iCs/>
-        </w:rPr>
-        <w:t>McGraw-Hill Yearbook of Science and Technology</w:t>
-      </w:r>
-      <w:r>
-        <w:rPr/>
-        <w:t>, 1971. McGraw-Hill, New York, New York.</w:t>
-      </w:r>
-    </w:p>
-    <w:p>
-      <w:pPr>
-        <w:pStyle w:val="Reference"/>
-        <w:rPr/>
-      </w:pPr>
-      <w:r>
-        <w:rPr/>
-        <w:t xml:space="preserve">Bakker, Robert. 1978. Dinosaur feeding behaviour and the origin of flowering plants. </w:t>
-      </w:r>
-      <w:r>
-        <w:rPr>
-          <w:i/>
-          <w:iCs/>
-        </w:rPr>
-        <w:t>Nature</w:t>
-      </w:r>
-      <w:r>
-        <w:rPr/>
-        <w:t xml:space="preserve"> </w:t>
-      </w:r>
-      <w:r>
-        <w:rPr>
-          <w:b/>
-          <w:bCs/>
-        </w:rPr>
-        <w:t>274</w:t>
-      </w:r>
-      <w:r>
-        <w:rPr/>
-        <w:t>:661–663.</w:t>
-      </w:r>
-    </w:p>
-    <w:p>
-      <w:pPr>
-        <w:pStyle w:val="Reference"/>
-        <w:rPr/>
-      </w:pPr>
-      <w:r>
-        <w:rPr/>
-        <w:t xml:space="preserve">Bakker, Robert T. 1986. </w:t>
-      </w:r>
-      <w:r>
-        <w:rPr>
-          <w:i/>
-          <w:iCs/>
-        </w:rPr>
-        <w:t>The Dinosaur Heresies: New Theories Unlocking The Mystery of the Dinosaurs and Their Extinction</w:t>
-      </w:r>
-      <w:r>
-        <w:rPr/>
-        <w:t>. Morrow, New York. 481 pages.</w:t>
-      </w:r>
-    </w:p>
-    <w:p>
-      <w:pPr>
-        <w:pStyle w:val="Reference"/>
-        <w:rPr/>
-      </w:pPr>
-      <w:r>
-        <w:rPr/>
         <w:t xml:space="preserve">Bartram, Alan, B. Booth, M. Chinery, E. N. K. Clarkson, B. Cox, D. Edwards, C. Maynard and W. D. I. Rolfe. 1983. </w:t>
       </w:r>
       <w:r>
@@ -6829,7 +6837,7 @@
       </w:pPr>
       <w:r>
         <w:rPr/>
-        <w:t>Douglass, Earl, 1923. Report of Work Done by the Carnegie Museum at the Dinosaur National Monument in Uinta County, Utah, under the Supervision of Earl Dougless, in the year 1922. 24 March 1923. 2 pages.</w:t>
+        <w:t>Douglass, Earl. 1923. Report of Work Done by the Carnegie Museum at the Dinosaur National Monument in Uinta County, Utah, under the Supervision of Earl Dougless, in the year 1922. 24 March 1923. 2 pages.</w:t>
       </w:r>
     </w:p>
     <w:p>
@@ -6849,7 +6857,15 @@
       </w:pPr>
       <w:r>
         <w:rPr/>
-        <w:t>Gilmore, Charles w. 1923a. Handwritten letter to William de C. Ravenel briefly summarising the outcome of the field season at the Dinosaur National Monument quarry. 8 August 1923.</w:t>
+        <w:t xml:space="preserve">Gilmore, Charles </w:t>
+      </w:r>
+      <w:r>
+        <w:rPr/>
+        <w:t>W</w:t>
+      </w:r>
+      <w:r>
+        <w:rPr/>
+        <w:t>. 1923a. Handwritten letter to William de C. Ravenel briefly summarising the outcome of the field season at the Dinosaur National Monument quarry. 8 August 1923.</w:t>
       </w:r>
     </w:p>
     <w:p>
@@ -7215,25 +7231,25 @@
       </w:pPr>
       <w:r>
         <w:rPr/>
-        <w:t xml:space="preserve">Holland, William. J. 1915. A new species of </w:t>
-      </w:r>
-      <w:r>
-        <w:rPr>
-          <w:i/>
-          <w:iCs/>
-        </w:rPr>
-        <w:t>Apatosaurus</w:t>
-      </w:r>
-      <w:r>
-        <w:rPr/>
-        <w:t xml:space="preserve">. </w:t>
-      </w:r>
-      <w:r>
-        <w:rPr>
-          <w:i/>
-          <w:iCs/>
-        </w:rPr>
-        <w:t>Annals of the Carnegie Museum</w:t>
+        <w:t xml:space="preserve">Holland, William J. 1910. A review of some recent criticisms of the restorations of sauropod dinosaurs existing in the museums of the United States, with special reference to that of </w:t>
+      </w:r>
+      <w:r>
+        <w:rPr>
+          <w:i/>
+          <w:iCs/>
+        </w:rPr>
+        <w:t>Diplodocus carnegiei</w:t>
+      </w:r>
+      <w:r>
+        <w:rPr/>
+        <w:t xml:space="preserve"> [sic] in the Carnegie museum. </w:t>
+      </w:r>
+      <w:r>
+        <w:rPr>
+          <w:i/>
+          <w:iCs/>
+        </w:rPr>
+        <w:t>American Naturalist</w:t>
       </w:r>
       <w:r>
         <w:rPr/>
@@ -7244,11 +7260,11 @@
           <w:b/>
           <w:bCs/>
         </w:rPr>
-        <w:t>10</w:t>
-      </w:r>
-      <w:r>
-        <w:rPr/>
-        <w:t>:143–145.</w:t>
+        <w:t>44</w:t>
+      </w:r>
+      <w:r>
+        <w:rPr/>
+        <w:t>:259–283.</w:t>
       </w:r>
     </w:p>
     <w:p>
@@ -7258,14 +7274,14 @@
       </w:pPr>
       <w:r>
         <w:rPr/>
-        <w:t xml:space="preserve">Holland, William J. 1924. The skull of </w:t>
-      </w:r>
-      <w:r>
-        <w:rPr>
-          <w:i/>
-          <w:iCs/>
-        </w:rPr>
-        <w:t>Diplodocus</w:t>
+        <w:t xml:space="preserve">Holland, William J. 1915. A new species of </w:t>
+      </w:r>
+      <w:r>
+        <w:rPr>
+          <w:i/>
+          <w:iCs/>
+        </w:rPr>
+        <w:t>Apatosaurus</w:t>
       </w:r>
       <w:r>
         <w:rPr/>
@@ -7276,7 +7292,7 @@
           <w:i/>
           <w:iCs/>
         </w:rPr>
-        <w:t>Memoirs of the Carnegie Museum</w:t>
+        <w:t>Annals of the Carnegie Museum</w:t>
       </w:r>
       <w:r>
         <w:rPr/>
@@ -7287,11 +7303,11 @@
           <w:b/>
           <w:bCs/>
         </w:rPr>
-        <w:t>9(3)</w:t>
-      </w:r>
-      <w:r>
-        <w:rPr/>
-        <w:t>:379–403.</w:t>
+        <w:t>10</w:t>
+      </w:r>
+      <w:r>
+        <w:rPr/>
+        <w:t>:143–145.</w:t>
       </w:r>
     </w:p>
     <w:p>
@@ -7301,25 +7317,25 @@
       </w:pPr>
       <w:r>
         <w:rPr/>
-        <w:t xml:space="preserve">Holland, William J. 1910. A review of some recent criticisms of the restorations of sauropod dinosaurs existing in the museums of the United States, with special reference to that of </w:t>
-      </w:r>
-      <w:r>
-        <w:rPr>
-          <w:i/>
-          <w:iCs/>
-        </w:rPr>
-        <w:t>Diplodocus carnegiei</w:t>
-      </w:r>
-      <w:r>
-        <w:rPr/>
-        <w:t xml:space="preserve"> [sic] in the Carnegie museum. </w:t>
-      </w:r>
-      <w:r>
-        <w:rPr>
-          <w:i/>
-          <w:iCs/>
-        </w:rPr>
-        <w:t>American Naturalist</w:t>
+        <w:t xml:space="preserve">Holland, William J. 1924. The skull of </w:t>
+      </w:r>
+      <w:r>
+        <w:rPr>
+          <w:i/>
+          <w:iCs/>
+        </w:rPr>
+        <w:t>Diplodocus</w:t>
+      </w:r>
+      <w:r>
+        <w:rPr/>
+        <w:t xml:space="preserve">. </w:t>
+      </w:r>
+      <w:r>
+        <w:rPr>
+          <w:i/>
+          <w:iCs/>
+        </w:rPr>
+        <w:t>Memoirs of the Carnegie Museum</w:t>
       </w:r>
       <w:r>
         <w:rPr/>
@@ -7330,11 +7346,11 @@
           <w:b/>
           <w:bCs/>
         </w:rPr>
-        <w:t>44</w:t>
-      </w:r>
-      <w:r>
-        <w:rPr/>
-        <w:t>:259–283.</w:t>
+        <w:t>9(3)</w:t>
+      </w:r>
+      <w:r>
+        <w:rPr/>
+        <w:t>:379–403.</w:t>
       </w:r>
     </w:p>
     <w:p>
@@ -7942,7 +7958,7 @@
       </w:pPr>
       <w:r>
         <w:rPr/>
-        <w:t xml:space="preserve">Osborn, Henry. F. 1899. A skeleton of </w:t>
+        <w:t xml:space="preserve">Osborn, Henry F. 1899. A skeleton of </w:t>
       </w:r>
       <w:r>
         <w:rPr>
@@ -7985,7 +8001,17 @@
       </w:pPr>
       <w:r>
         <w:rPr/>
-        <w:t xml:space="preserve">Osborn, Henry Fairfield, and Charles C. Mook. 1921. </w:t>
+        <w:t>Osborn, Henry F. 1923. Letter to Charles D. Walcott with vague but ominous contents. 14 April 1923.</w:t>
+      </w:r>
+    </w:p>
+    <w:p>
+      <w:pPr>
+        <w:pStyle w:val="Reference"/>
+        <w:rPr/>
+      </w:pPr>
+      <w:r>
+        <w:rPr/>
+        <w:t xml:space="preserve">Osborn, Henry F., and Charles C. Mook. 1921. </w:t>
       </w:r>
       <w:r>
         <w:rPr>
@@ -8039,16 +8065,6 @@
           <w:t>doi:10.1130/GSAB-30-379</w:t>
         </w:r>
       </w:hyperlink>
-    </w:p>
-    <w:p>
-      <w:pPr>
-        <w:pStyle w:val="Reference"/>
-        <w:rPr/>
-      </w:pPr>
-      <w:r>
-        <w:rPr/>
-        <w:t>Osborne, Henry F. 1923. Letter to Charles D. Walcott with vague but ominous contents. 14 April 1923.</w:t>
-      </w:r>
     </w:p>
     <w:p>
       <w:pPr>

</xml_diff>

<commit_message>
Fix references and citations
</commit_message>
<xml_diff>
--- a/TaylorEtAl-mounted-barosaurus.docx
+++ b/TaylorEtAl-mounted-barosaurus.docx
@@ -333,16 +333,17 @@
             </w:rPr>
             <w:fldChar w:fldCharType="separate"/>
           </w:r>
-          <w:hyperlink w:anchor="__RefHeading___Toc3784_1986291683" w:tooltip="Introduction">
-            <w:r>
-              <w:rPr>
-                <w:rStyle w:val="IndexLink"/>
-              </w:rPr>
-              <w:t>Introduction</w:t>
-              <w:tab/>
-              <w:t>2</w:t>
-            </w:r>
-          </w:hyperlink>
+          <w:r>
+            <w:rPr>
+              <w:rStyle w:val="IndexLink"/>
+            </w:rPr>
+            <w:t>Introduction</w:t>
+          </w:r>
+          <w:r>
+            <w:rPr/>
+            <w:tab/>
+            <w:t>2</w:t>
+          </w:r>
         </w:p>
         <w:p>
           <w:pPr>
@@ -353,16 +354,12 @@
             </w:tabs>
             <w:rPr/>
           </w:pPr>
-          <w:hyperlink w:anchor="__RefHeading___Toc3323_2187837281" w:tooltip="Anatomical nomenclature">
-            <w:r>
-              <w:rPr>
-                <w:rStyle w:val="IndexLink"/>
-              </w:rPr>
-              <w:t>Anatomical nomenclature</w:t>
-              <w:tab/>
-              <w:t>3</w:t>
-            </w:r>
-          </w:hyperlink>
+          <w:r>
+            <w:rPr/>
+            <w:t>Anatomical nomenclature</w:t>
+            <w:tab/>
+            <w:t>3</w:t>
+          </w:r>
         </w:p>
         <w:p>
           <w:pPr>
@@ -373,16 +370,12 @@
             </w:tabs>
             <w:rPr/>
           </w:pPr>
-          <w:hyperlink w:anchor="__RefHeading___Toc5349_68767826" w:tooltip="Institutional abbreviations">
-            <w:r>
-              <w:rPr>
-                <w:rStyle w:val="IndexLink"/>
-              </w:rPr>
-              <w:t>Institutional abbreviations</w:t>
-              <w:tab/>
-              <w:t>3</w:t>
-            </w:r>
-          </w:hyperlink>
+          <w:r>
+            <w:rPr/>
+            <w:t>Institutional abbreviations</w:t>
+            <w:tab/>
+            <w:t>3</w:t>
+          </w:r>
         </w:p>
         <w:p>
           <w:pPr>
@@ -393,16 +386,12 @@
             </w:tabs>
             <w:rPr/>
           </w:pPr>
-          <w:hyperlink w:anchor="__RefHeading___Toc4316_68767826" w:tooltip="Historical background">
-            <w:r>
-              <w:rPr>
-                <w:rStyle w:val="IndexLink"/>
-              </w:rPr>
-              <w:t>Historical background</w:t>
-              <w:tab/>
-              <w:t>3</w:t>
-            </w:r>
-          </w:hyperlink>
+          <w:r>
+            <w:rPr/>
+            <w:t>Historical background</w:t>
+            <w:tab/>
+            <w:t>3</w:t>
+          </w:r>
         </w:p>
         <w:p>
           <w:pPr>
@@ -413,29 +402,22 @@
             </w:tabs>
             <w:rPr/>
           </w:pPr>
-          <w:hyperlink w:anchor="__RefHeading___Toc12350_68767826" w:tooltip="Early discoveries of Barosaurus">
-            <w:r>
-              <w:rPr>
-                <w:rStyle w:val="IndexLink"/>
-              </w:rPr>
-              <w:t xml:space="preserve">Early discoveries of </w:t>
-            </w:r>
-            <w:r>
-              <w:rPr>
-                <w:rStyle w:val="IndexLink"/>
-                <w:i/>
-                <w:iCs/>
-              </w:rPr>
-              <w:t>Barosaurus</w:t>
-            </w:r>
-            <w:r>
-              <w:rPr>
-                <w:rStyle w:val="IndexLink"/>
-              </w:rPr>
-              <w:tab/>
-              <w:t>3</w:t>
-            </w:r>
-          </w:hyperlink>
+          <w:r>
+            <w:rPr/>
+            <w:t xml:space="preserve">Early discoveries of </w:t>
+          </w:r>
+          <w:r>
+            <w:rPr>
+              <w:i/>
+              <w:iCs/>
+            </w:rPr>
+            <w:t>Barosaurus</w:t>
+          </w:r>
+          <w:r>
+            <w:rPr/>
+            <w:tab/>
+            <w:t>3</w:t>
+          </w:r>
         </w:p>
         <w:p>
           <w:pPr>
@@ -446,29 +428,22 @@
             </w:tabs>
             <w:rPr/>
           </w:pPr>
-          <w:hyperlink w:anchor="__RefHeading___Toc12352_68767826" w:tooltip="The AMNH specimen of Barosaurus">
-            <w:r>
-              <w:rPr>
-                <w:rStyle w:val="IndexLink"/>
-              </w:rPr>
-              <w:t xml:space="preserve">The AMNH specimen of </w:t>
-            </w:r>
-            <w:r>
-              <w:rPr>
-                <w:rStyle w:val="IndexLink"/>
-                <w:i/>
-                <w:iCs/>
-              </w:rPr>
-              <w:t>Barosaurus</w:t>
-            </w:r>
-            <w:r>
-              <w:rPr>
-                <w:rStyle w:val="IndexLink"/>
-              </w:rPr>
-              <w:tab/>
-              <w:t>4</w:t>
-            </w:r>
-          </w:hyperlink>
+          <w:r>
+            <w:rPr/>
+            <w:t xml:space="preserve">The AMNH specimen of </w:t>
+          </w:r>
+          <w:r>
+            <w:rPr>
+              <w:i/>
+              <w:iCs/>
+            </w:rPr>
+            <w:t>Barosaurus</w:t>
+          </w:r>
+          <w:r>
+            <w:rPr/>
+            <w:tab/>
+            <w:t>4</w:t>
+          </w:r>
         </w:p>
         <w:p>
           <w:pPr>
@@ -479,16 +454,12 @@
             </w:tabs>
             <w:rPr/>
           </w:pPr>
-          <w:hyperlink w:anchor="__RefHeading___Toc25848_1820571732" w:tooltip="The Carnegie Quarry at Dinosaur National Monument">
-            <w:r>
-              <w:rPr>
-                <w:rStyle w:val="IndexLink"/>
-              </w:rPr>
-              <w:t>The Carnegie Quarry at Dinosaur National Monument</w:t>
-              <w:tab/>
-              <w:t>4</w:t>
-            </w:r>
-          </w:hyperlink>
+          <w:r>
+            <w:rPr/>
+            <w:t>The Carnegie Quarry at Dinosaur National Monument</w:t>
+            <w:tab/>
+            <w:t>4</w:t>
+          </w:r>
         </w:p>
         <w:p>
           <w:pPr>
@@ -499,16 +470,12 @@
             </w:tabs>
             <w:rPr/>
           </w:pPr>
-          <w:hyperlink w:anchor="__RefHeading___Toc25850_1820571732" w:tooltip="USNM work at Dinosaur National Monument">
-            <w:r>
-              <w:rPr>
-                <w:rStyle w:val="IndexLink"/>
-              </w:rPr>
-              <w:t>USNM work at Dinosaur National Monument</w:t>
-              <w:tab/>
-              <w:t>5</w:t>
-            </w:r>
-          </w:hyperlink>
+          <w:r>
+            <w:rPr/>
+            <w:t>USNM work at Dinosaur National Monument</w:t>
+            <w:tab/>
+            <w:t>5</w:t>
+          </w:r>
         </w:p>
         <w:p>
           <w:pPr>
@@ -519,16 +486,12 @@
             </w:tabs>
             <w:rPr/>
           </w:pPr>
-          <w:hyperlink w:anchor="__RefHeading___Toc25852_1820571732" w:tooltip="The skeleton reunited">
-            <w:r>
-              <w:rPr>
-                <w:rStyle w:val="IndexLink"/>
-              </w:rPr>
-              <w:t>The skeleton reunited</w:t>
-              <w:tab/>
-              <w:t>6</w:t>
-            </w:r>
-          </w:hyperlink>
+          <w:r>
+            <w:rPr/>
+            <w:t>The skeleton reunited</w:t>
+            <w:tab/>
+            <w:t>6</w:t>
+          </w:r>
         </w:p>
         <w:p>
           <w:pPr>
@@ -539,29 +502,22 @@
             </w:tabs>
             <w:rPr/>
           </w:pPr>
-          <w:hyperlink w:anchor="__RefHeading___Toc5351_68767826" w:tooltip="The AMNH mounted Barosaurus">
-            <w:r>
-              <w:rPr>
-                <w:rStyle w:val="IndexLink"/>
-              </w:rPr>
-              <w:t xml:space="preserve">The AMNH mounted </w:t>
-            </w:r>
-            <w:r>
-              <w:rPr>
-                <w:rStyle w:val="IndexLink"/>
-                <w:i/>
-                <w:iCs/>
-              </w:rPr>
-              <w:t>Barosaurus</w:t>
-            </w:r>
-            <w:r>
-              <w:rPr>
-                <w:rStyle w:val="IndexLink"/>
-              </w:rPr>
-              <w:tab/>
-              <w:t>7</w:t>
-            </w:r>
-          </w:hyperlink>
+          <w:r>
+            <w:rPr/>
+            <w:t xml:space="preserve">The AMNH mounted </w:t>
+          </w:r>
+          <w:r>
+            <w:rPr>
+              <w:i/>
+              <w:iCs/>
+            </w:rPr>
+            <w:t>Barosaurus</w:t>
+          </w:r>
+          <w:r>
+            <w:rPr/>
+            <w:tab/>
+            <w:t>7</w:t>
+          </w:r>
         </w:p>
         <w:p>
           <w:pPr>
@@ -572,16 +528,12 @@
             </w:tabs>
             <w:rPr/>
           </w:pPr>
-          <w:hyperlink w:anchor="__RefHeading___Toc5354_68767826" w:tooltip="The conception of the mount">
-            <w:r>
-              <w:rPr>
-                <w:rStyle w:val="IndexLink"/>
-              </w:rPr>
-              <w:t>The conception of the mount</w:t>
-              <w:tab/>
-              <w:t>7</w:t>
-            </w:r>
-          </w:hyperlink>
+          <w:r>
+            <w:rPr/>
+            <w:t>The conception of the mount</w:t>
+            <w:tab/>
+            <w:t>7</w:t>
+          </w:r>
         </w:p>
         <w:p>
           <w:pPr>
@@ -592,23 +544,18 @@
             </w:tabs>
             <w:rPr/>
           </w:pPr>
-          <w:hyperlink w:anchor="__RefHeading___Toc1099_1709072779" w:tooltip="The purpose of the mount">
-            <w:r>
-              <w:rPr>
-                <w:rStyle w:val="IndexLink"/>
-                <w:i w:val="false"/>
-                <w:iCs w:val="false"/>
-              </w:rPr>
-              <w:t>The purpose of the mount</w:t>
-            </w:r>
-            <w:r>
-              <w:rPr>
-                <w:rStyle w:val="IndexLink"/>
-              </w:rPr>
-              <w:tab/>
-              <w:t>9</w:t>
-            </w:r>
-          </w:hyperlink>
+          <w:r>
+            <w:rPr>
+              <w:i w:val="false"/>
+              <w:iCs w:val="false"/>
+            </w:rPr>
+            <w:t>The purpose of the mount</w:t>
+          </w:r>
+          <w:r>
+            <w:rPr/>
+            <w:tab/>
+            <w:t>9</w:t>
+          </w:r>
         </w:p>
         <w:p>
           <w:pPr>
@@ -619,16 +566,12 @@
             </w:tabs>
             <w:rPr/>
           </w:pPr>
-          <w:hyperlink w:anchor="__RefHeading___Toc18297_68767826" w:tooltip="The creation of the mount">
-            <w:r>
-              <w:rPr>
-                <w:rStyle w:val="IndexLink"/>
-              </w:rPr>
-              <w:t>The creation of the mount</w:t>
-              <w:tab/>
-              <w:t>9</w:t>
-            </w:r>
-          </w:hyperlink>
+          <w:r>
+            <w:rPr/>
+            <w:t>The creation of the mount</w:t>
+            <w:tab/>
+            <w:t>9</w:t>
+          </w:r>
         </w:p>
         <w:p>
           <w:pPr>
@@ -639,16 +582,12 @@
             </w:tabs>
             <w:rPr/>
           </w:pPr>
-          <w:hyperlink w:anchor="__RefHeading___Toc5632_2187837281" w:tooltip="Photography of the mount">
-            <w:r>
-              <w:rPr>
-                <w:rStyle w:val="IndexLink"/>
-              </w:rPr>
-              <w:t>Photography of the mount</w:t>
-              <w:tab/>
-              <w:t>12</w:t>
-            </w:r>
-          </w:hyperlink>
+          <w:r>
+            <w:rPr/>
+            <w:t>Photography of the mount</w:t>
+            <w:tab/>
+            <w:t>12</w:t>
+          </w:r>
         </w:p>
         <w:p>
           <w:pPr>
@@ -659,16 +598,12 @@
             </w:tabs>
             <w:rPr/>
           </w:pPr>
-          <w:hyperlink w:anchor="__RefHeading___Toc5356_68767826" w:tooltip="The composition of the mount">
-            <w:r>
-              <w:rPr>
-                <w:rStyle w:val="IndexLink"/>
-              </w:rPr>
-              <w:t>The composition of the mount</w:t>
-              <w:tab/>
-              <w:t>13</w:t>
-            </w:r>
-          </w:hyperlink>
+          <w:r>
+            <w:rPr/>
+            <w:t>The composition of the mount</w:t>
+            <w:tab/>
+            <w:t>13</w:t>
+          </w:r>
         </w:p>
         <w:p>
           <w:pPr>
@@ -679,16 +614,12 @@
             </w:tabs>
             <w:rPr/>
           </w:pPr>
-          <w:hyperlink w:anchor="__RefHeading___Toc16585_68767826" w:tooltip="Overview">
-            <w:r>
-              <w:rPr>
-                <w:rStyle w:val="IndexLink"/>
-              </w:rPr>
-              <w:t>Overview</w:t>
-              <w:tab/>
-              <w:t>13</w:t>
-            </w:r>
-          </w:hyperlink>
+          <w:r>
+            <w:rPr/>
+            <w:t>Overview</w:t>
+            <w:tab/>
+            <w:t>13</w:t>
+          </w:r>
         </w:p>
         <w:p>
           <w:pPr>
@@ -699,24 +630,19 @@
             </w:tabs>
             <w:rPr/>
           </w:pPr>
-          <w:hyperlink w:anchor="__RefHeading___Toc4995_537823704" w:tooltip="Barosaurus material in the mount">
-            <w:r>
-              <w:rPr>
-                <w:rStyle w:val="IndexLink"/>
-                <w:i/>
-                <w:iCs/>
-              </w:rPr>
-              <w:t>Barosaurus</w:t>
-            </w:r>
-            <w:r>
-              <w:rPr>
-                <w:rStyle w:val="IndexLink"/>
-              </w:rPr>
-              <w:t xml:space="preserve"> material in the mount</w:t>
-              <w:tab/>
-              <w:t>13</w:t>
-            </w:r>
-          </w:hyperlink>
+          <w:r>
+            <w:rPr>
+              <w:i/>
+              <w:iCs/>
+            </w:rPr>
+            <w:t>Barosaurus</w:t>
+          </w:r>
+          <w:r>
+            <w:rPr/>
+            <w:t xml:space="preserve"> material in the mount</w:t>
+            <w:tab/>
+            <w:t>13</w:t>
+          </w:r>
         </w:p>
         <w:p>
           <w:pPr>
@@ -727,16 +653,12 @@
             </w:tabs>
             <w:rPr/>
           </w:pPr>
-          <w:hyperlink w:anchor="__RefHeading___Toc25854_1820571732" w:tooltip="Non-Barosaurus material in the mount">
-            <w:r>
-              <w:rPr>
-                <w:rStyle w:val="IndexLink"/>
-              </w:rPr>
-              <w:t>Non-Barosaurus material in the mount</w:t>
-              <w:tab/>
-              <w:t>15</w:t>
-            </w:r>
-          </w:hyperlink>
+          <w:r>
+            <w:rPr/>
+            <w:t>Non-Barosaurus material in the mount</w:t>
+            <w:tab/>
+            <w:t>15</w:t>
+          </w:r>
         </w:p>
         <w:p>
           <w:pPr>
@@ -747,16 +669,12 @@
             </w:tabs>
             <w:rPr/>
           </w:pPr>
-          <w:hyperlink w:anchor="__RefHeading___Toc16587_68767826" w:tooltip="Skull">
-            <w:r>
-              <w:rPr>
-                <w:rStyle w:val="IndexLink"/>
-              </w:rPr>
-              <w:t>Skull</w:t>
-              <w:tab/>
-              <w:t>15</w:t>
-            </w:r>
-          </w:hyperlink>
+          <w:r>
+            <w:rPr/>
+            <w:t>Skull</w:t>
+            <w:tab/>
+            <w:t>15</w:t>
+          </w:r>
         </w:p>
         <w:p>
           <w:pPr>
@@ -767,16 +685,12 @@
             </w:tabs>
             <w:rPr/>
           </w:pPr>
-          <w:hyperlink w:anchor="__RefHeading___Toc16589_68767826" w:tooltip="Neck">
-            <w:r>
-              <w:rPr>
-                <w:rStyle w:val="IndexLink"/>
-              </w:rPr>
-              <w:t>Neck</w:t>
-              <w:tab/>
-              <w:t>15</w:t>
-            </w:r>
-          </w:hyperlink>
+          <w:r>
+            <w:rPr/>
+            <w:t>Neck</w:t>
+            <w:tab/>
+            <w:t>15</w:t>
+          </w:r>
         </w:p>
         <w:p>
           <w:pPr>
@@ -787,16 +701,12 @@
             </w:tabs>
             <w:rPr/>
           </w:pPr>
-          <w:hyperlink w:anchor="__RefHeading___Toc2466_2187837281" w:tooltip="Torso, sacrum and tail">
-            <w:r>
-              <w:rPr>
-                <w:rStyle w:val="IndexLink"/>
-              </w:rPr>
-              <w:t>Torso, sacrum and tail</w:t>
-              <w:tab/>
-              <w:t>16</w:t>
-            </w:r>
-          </w:hyperlink>
+          <w:r>
+            <w:rPr/>
+            <w:t>Torso, sacrum and tail</w:t>
+            <w:tab/>
+            <w:t>16</w:t>
+          </w:r>
         </w:p>
         <w:p>
           <w:pPr>
@@ -807,16 +717,12 @@
             </w:tabs>
             <w:rPr/>
           </w:pPr>
-          <w:hyperlink w:anchor="__RefHeading___Toc2470_2187837281" w:tooltip="Forelimbs and girdles">
-            <w:r>
-              <w:rPr>
-                <w:rStyle w:val="IndexLink"/>
-              </w:rPr>
-              <w:t>Forelimbs and girdles</w:t>
-              <w:tab/>
-              <w:t>17</w:t>
-            </w:r>
-          </w:hyperlink>
+          <w:r>
+            <w:rPr/>
+            <w:t>Forelimbs and girdles</w:t>
+            <w:tab/>
+            <w:t>17</w:t>
+          </w:r>
         </w:p>
         <w:p>
           <w:pPr>
@@ -827,16 +733,12 @@
             </w:tabs>
             <w:rPr/>
           </w:pPr>
-          <w:hyperlink w:anchor="__RefHeading___Toc25856_1820571732" w:tooltip="Hindlimbs and girdles">
-            <w:r>
-              <w:rPr>
-                <w:rStyle w:val="IndexLink"/>
-              </w:rPr>
-              <w:t>Hindlimbs and girdles</w:t>
-              <w:tab/>
-              <w:t>17</w:t>
-            </w:r>
-          </w:hyperlink>
+          <w:r>
+            <w:rPr/>
+            <w:t>Hindlimbs and girdles</w:t>
+            <w:tab/>
+            <w:t>17</w:t>
+          </w:r>
         </w:p>
         <w:p>
           <w:pPr>
@@ -847,16 +749,12 @@
             </w:tabs>
             <w:rPr/>
           </w:pPr>
-          <w:hyperlink w:anchor="__RefHeading___Toc3401_68767826" w:tooltip="Discussion">
-            <w:r>
-              <w:rPr>
-                <w:rStyle w:val="IndexLink"/>
-              </w:rPr>
-              <w:t>Discussion</w:t>
-              <w:tab/>
-              <w:t>17</w:t>
-            </w:r>
-          </w:hyperlink>
+          <w:r>
+            <w:rPr/>
+            <w:t>Discussion</w:t>
+            <w:tab/>
+            <w:t>17</w:t>
+          </w:r>
         </w:p>
         <w:p>
           <w:pPr>
@@ -867,16 +765,12 @@
             </w:tabs>
             <w:rPr/>
           </w:pPr>
-          <w:hyperlink w:anchor="__RefHeading___Toc2476_2187837281" w:tooltip="Rearing pose">
-            <w:r>
-              <w:rPr>
-                <w:rStyle w:val="IndexLink"/>
-              </w:rPr>
-              <w:t>Rearing pose</w:t>
-              <w:tab/>
-              <w:t>17</w:t>
-            </w:r>
-          </w:hyperlink>
+          <w:r>
+            <w:rPr/>
+            <w:t>Rearing pose</w:t>
+            <w:tab/>
+            <w:t>17</w:t>
+          </w:r>
         </w:p>
         <w:p>
           <w:pPr>
@@ -887,16 +781,12 @@
             </w:tabs>
             <w:rPr/>
           </w:pPr>
-          <w:hyperlink w:anchor="__RefHeading___Toc3786_1986291683" w:tooltip="A short history of rearing sauropods">
-            <w:r>
-              <w:rPr>
-                <w:rStyle w:val="IndexLink"/>
-              </w:rPr>
-              <w:t>A short history of rearing sauropods</w:t>
-              <w:tab/>
-              <w:t>19</w:t>
-            </w:r>
-          </w:hyperlink>
+          <w:r>
+            <w:rPr/>
+            <w:t>A short history of rearing sauropods</w:t>
+            <w:tab/>
+            <w:t>19</w:t>
+          </w:r>
         </w:p>
         <w:p>
           <w:pPr>
@@ -907,16 +797,12 @@
             </w:tabs>
             <w:rPr/>
           </w:pPr>
-          <w:hyperlink w:anchor="__RefHeading___Toc11689_675290491" w:tooltip="Cultural impact">
-            <w:r>
-              <w:rPr>
-                <w:rStyle w:val="IndexLink"/>
-              </w:rPr>
-              <w:t>Cultural impact</w:t>
-              <w:tab/>
-              <w:t>20</w:t>
-            </w:r>
-          </w:hyperlink>
+          <w:r>
+            <w:rPr/>
+            <w:t>Cultural impact</w:t>
+            <w:tab/>
+            <w:t>20</w:t>
+          </w:r>
         </w:p>
         <w:p>
           <w:pPr>
@@ -927,16 +813,12 @@
             </w:tabs>
             <w:rPr/>
           </w:pPr>
-          <w:hyperlink w:anchor="__RefHeading___Toc21934_68767826" w:tooltip="Size of the AMNH 6341 animal">
-            <w:r>
-              <w:rPr>
-                <w:rStyle w:val="IndexLink"/>
-              </w:rPr>
-              <w:t>Size of the AMNH 6341 animal</w:t>
-              <w:tab/>
-              <w:t>21</w:t>
-            </w:r>
-          </w:hyperlink>
+          <w:r>
+            <w:rPr/>
+            <w:t>Size of the AMNH 6341 animal</w:t>
+            <w:tab/>
+            <w:t>21</w:t>
+          </w:r>
         </w:p>
         <w:p>
           <w:pPr>
@@ -947,16 +829,12 @@
             </w:tabs>
             <w:rPr/>
           </w:pPr>
-          <w:hyperlink w:anchor="__RefHeading___Toc3403_68767826" w:tooltip="Acknowledgements">
-            <w:r>
-              <w:rPr>
-                <w:rStyle w:val="IndexLink"/>
-              </w:rPr>
-              <w:t>Acknowledgements</w:t>
-              <w:tab/>
-              <w:t>22</w:t>
-            </w:r>
-          </w:hyperlink>
+          <w:r>
+            <w:rPr/>
+            <w:t>Acknowledgements</w:t>
+            <w:tab/>
+            <w:t>22</w:t>
+          </w:r>
         </w:p>
         <w:p>
           <w:pPr>
@@ -967,16 +845,12 @@
             </w:tabs>
             <w:rPr/>
           </w:pPr>
-          <w:hyperlink w:anchor="__RefHeading___Toc3405_68767826" w:tooltip="References">
-            <w:r>
-              <w:rPr>
-                <w:rStyle w:val="IndexLink"/>
-              </w:rPr>
-              <w:t>References</w:t>
-              <w:tab/>
-              <w:t>23</w:t>
-            </w:r>
-          </w:hyperlink>
+          <w:r>
+            <w:rPr/>
+            <w:t>References</w:t>
+            <w:tab/>
+            <w:t>23</w:t>
+          </w:r>
         </w:p>
         <w:p>
           <w:pPr>
@@ -987,16 +861,12 @@
             </w:tabs>
             <w:rPr/>
           </w:pPr>
-          <w:hyperlink w:anchor="__RefHeading___Toc3407_68767826" w:tooltip="Figure Captions">
-            <w:r>
-              <w:rPr>
-                <w:rStyle w:val="IndexLink"/>
-              </w:rPr>
-              <w:t>Figure Captions</w:t>
-              <w:tab/>
-              <w:t>29</w:t>
-            </w:r>
-          </w:hyperlink>
+          <w:r>
+            <w:rPr/>
+            <w:t>Figure Captions</w:t>
+            <w:tab/>
+            <w:t>29</w:t>
+          </w:r>
         </w:p>
         <w:p>
           <w:pPr>
@@ -1007,16 +877,12 @@
             </w:tabs>
             <w:rPr/>
           </w:pPr>
-          <w:hyperlink w:anchor="__RefHeading___Toc25858_1820571732" w:tooltip="Tables">
-            <w:r>
-              <w:rPr>
-                <w:rStyle w:val="IndexLink"/>
-              </w:rPr>
-              <w:t>Tables</w:t>
-              <w:tab/>
-              <w:t>33</w:t>
-            </w:r>
-          </w:hyperlink>
+          <w:r>
+            <w:rPr/>
+            <w:t>Tables</w:t>
+            <w:tab/>
+            <w:t>33</w:t>
+          </w:r>
         </w:p>
         <w:p>
           <w:pPr>
@@ -1027,20 +893,14 @@
             </w:tabs>
             <w:rPr/>
           </w:pPr>
-          <w:hyperlink w:anchor="__RefHeading___Toc25860_1820571732" w:tooltip="Table 1">
-            <w:r>
-              <w:rPr>
-                <w:rStyle w:val="IndexLink"/>
-              </w:rPr>
-              <w:t>Table 1</w:t>
-              <w:tab/>
-              <w:t>33</w:t>
-            </w:r>
-          </w:hyperlink>
           <w:r>
-            <w:rPr>
-              <w:rStyle w:val="IndexLink"/>
-            </w:rPr>
+            <w:rPr/>
+            <w:t>Table 1</w:t>
+            <w:tab/>
+            <w:t>33</w:t>
+          </w:r>
+          <w:r>
+            <w:rPr/>
             <w:fldChar w:fldCharType="end"/>
           </w:r>
         </w:p>
@@ -1100,15 +960,7 @@
       </w:r>
       <w:r>
         <w:rPr/>
-        <w:t xml:space="preserve"> in most respects but is characterised by an extremely long neck, even by sauropod standards. In the popular imagination, it is typified by the iconic rearing mount in the Roosevelt Memorial Hall of the American Museum of Natural History (Figure </w:t>
-      </w:r>
-      <w:r>
-        <w:rPr/>
-        <w:t>1</w:t>
-      </w:r>
-      <w:r>
-        <w:rPr/>
-        <w:t>).</w:t>
+        <w:t xml:space="preserve"> in most respects but is characterised by an extremely long neck, even by sauropod standards. In the popular imagination, it is typified by the iconic rearing mount in the Roosevelt Memorial Hall of the American Museum of Natural History (Figure 1).</w:t>
       </w:r>
     </w:p>
     <w:p>
@@ -1924,7 +1776,11 @@
       </w:pPr>
       <w:r>
         <w:rPr/>
-        <w:t xml:space="preserve">On 11 November, Merrill wrote to Earl Douglass requesting technical and logistical information and Douglass replied on 22 November (Douglass 1922b) with a long and helpful letter explaining how two sauropod skeletons, both thought to be </w:t>
+        <w:t>Douglass briefly reported to Merrill the existence of two sauropods in the quarry, by telegram, on 10 November (Douglass 1922a). The next day</w:t>
+      </w:r>
+      <w:r>
+        <w:rPr/>
+        <w:t xml:space="preserve">, Merrill wrote to Earl Douglass requesting technical and logistical information. Douglass replied on 22 November (Douglass 1922b) with a long and helpful letter explaining how two sauropod skeletons, both thought to be </w:t>
       </w:r>
       <w:r>
         <w:rPr>
@@ -1967,7 +1823,15 @@
       </w:r>
       <w:r>
         <w:rPr/>
-        <w:t>. Apparently nearly complete skeleton but only neck taken out. The remainder still in the ledge” (Douglass 1922c). Work by the Carnegie crew finished on 1 January 1923 (Osborn 1923).</w:t>
+        <w:t>. Apparently nearly complete skeleton but only neck taken out. The remainder still in the ledge” (Douglass 1922</w:t>
+      </w:r>
+      <w:r>
+        <w:rPr/>
+        <w:t>c</w:t>
+      </w:r>
+      <w:r>
+        <w:rPr/>
+        <w:t>). Work by the Carnegie crew finished on 1 January 1923 (Osborn 1923).</w:t>
       </w:r>
     </w:p>
     <w:p>
@@ -2185,15 +2049,7 @@
       </w:r>
       <w:r>
         <w:rPr/>
-        <w:t xml:space="preserve"> skeleton (although the line-drawings of the cervicals do not at all resemble the actual vertebrae: compare Figure 4). If the cervical count of ten in the quarry map and Brown’s memo is correct, the most anterior of the cervicals (C7) seems to have been lost or destroyed, since McIntosh’s unpublished 1962 notes, his published account (McIntosh 2005) and the present fossil holdings at the AMNH all include only nine cervical vertebrae, C8–16. Carl Mehling (pers. comm., 2022) has searched in collections for the missing C7 and been unable to locate it. In fact, the C7, if it ever existed, was likely lost or destroyed prior to the 1939 renovation: contemporary photographs (Figure </w:t>
-      </w:r>
-      <w:r>
-        <w:rPr/>
-        <w:t>5</w:t>
-      </w:r>
-      <w:r>
-        <w:rPr/>
-        <w:t>B) show the anteriormost cervical vertebra on display, and it is recognizable as the C8 that is the anteriormost currently preserved vertebra.</w:t>
+        <w:t xml:space="preserve"> skeleton (although the line-drawings of the cervicals do not at all resemble the actual vertebrae: compare Figure 4). If the cervical count of ten in the quarry map and Brown’s memo is correct, the most anterior of the cervicals (C7) seems to have been lost or destroyed, since McIntosh’s unpublished 1962 notes, his published account (McIntosh 2005) and the present fossil holdings at the AMNH all include only nine cervical vertebrae, C8–16. Carl Mehling (pers. comm., 2022) has searched in collections for the missing C7 and been unable to locate it. In fact, the C7, if it ever existed, was likely lost or destroyed prior to the 1939 renovation: contemporary photographs (Figure 5B) show the anteriormost cervical vertebra on display, and it is recognizable as the C8 that is the anteriormost currently preserved vertebra.</w:t>
       </w:r>
     </w:p>
     <w:p>
@@ -2618,7 +2474,7 @@
     </w:p>
     <w:p>
       <w:pPr>
-        <w:pStyle w:val="BlockQuotation"/>
+        <w:pStyle w:val="BlockQuotationuser"/>
         <w:rPr/>
       </w:pPr>
       <w:r>
@@ -2704,11 +2560,7 @@
       </w:pPr>
       <w:r>
         <w:rPr/>
-        <w:t xml:space="preserve">At the time of the casting-and-mounting project, it was well documented with contracts, architectural drawings, inventories, shipping notes and other documents. But with the passage of more than three decades, nearly all this paperwork has been lost. The retirement of key individuals at the AMNH, including several authors of the present work, resulted in records being moved between offices and ultimately misplaced; and an extensive search of RCI’s archives has turned up little. As a result, nearly all that follows has been assembled from the memories of the individuals involved, supplemented by information from contemporary and near-contemporary accounts such as those of Norell et al. (1991) and Dingus (1996), </w:t>
-      </w:r>
-      <w:r>
-        <w:rPr/>
-        <w:t>and what few documents were recovered from AMNH archives.</w:t>
+        <w:t>At the time of the casting-and-mounting project, it was well documented with contracts, architectural drawings, inventories, shipping notes and other documents. But with the passage of more than three decades, nearly all this paperwork has been lost. The retirement of key individuals at the AMNH, including several authors of the present work, resulted in records being moved between offices and ultimately misplaced; and an extensive search of RCI’s archives has turned up little. As a result, nearly all that follows has been assembled from the memories of the individuals involved, supplemented by information from contemporary and near-contemporary accounts such as those of Norell et al. (1991) and Dingus (1996), and what few documents were recovered from AMNH archives.</w:t>
       </w:r>
     </w:p>
     <w:p>
@@ -2718,31 +2570,7 @@
       </w:pPr>
       <w:r>
         <w:rPr/>
-        <w:t xml:space="preserve">Early in the process, </w:t>
-      </w:r>
-      <w:r>
-        <w:rPr/>
-        <w:t xml:space="preserve">around March 1990, </w:t>
-      </w:r>
-      <w:r>
-        <w:rPr/>
-        <w:t xml:space="preserve">a prototype model at </w:t>
-      </w:r>
-      <w:r>
-        <w:rPr/>
-        <w:t xml:space="preserve">about </w:t>
-      </w:r>
-      <w:r>
-        <w:rPr/>
-        <w:t xml:space="preserve">1/16 full size was </w:t>
-      </w:r>
-      <w:r>
-        <w:rPr/>
-        <w:t>commissioned at a cost of $3,980 (Galiano 1990)</w:t>
-      </w:r>
-      <w:r>
-        <w:rPr/>
-        <w:t xml:space="preserve">, to allow the scene to be created and manipulated at a workable scale (Figure 9). This was created by a model-maker at </w:t>
+        <w:t xml:space="preserve">Early in the process, around March 1990, a prototype model at about 1/16 full size was commissioned at a cost of $3,980 (Galiano 1990), to allow the scene to be created and manipulated at a workable scale (Figure 9). This was created by a model-maker at </w:t>
       </w:r>
       <w:r>
         <w:rPr>
@@ -2785,23 +2613,7 @@
       </w:r>
       <w:r>
         <w:rPr/>
-        <w:t xml:space="preserve"> (Dingus 1990). The total agreed cost was $184,675 </w:t>
-      </w:r>
-      <w:r>
-        <w:rPr/>
-        <w:t>(equivalent to $472,000 in 2026 according to usinflationcalculator.com.)</w:t>
-      </w:r>
-      <w:r>
-        <w:rPr/>
-        <w:t xml:space="preserve"> </w:t>
-      </w:r>
-      <w:r>
-        <w:rPr/>
-        <w:t xml:space="preserve">This amount was </w:t>
-      </w:r>
-      <w:r>
-        <w:rPr/>
-        <w:t xml:space="preserve">made up of $72,721 for the adult </w:t>
+        <w:t xml:space="preserve"> (Dingus 1990). The total agreed cost was $184,675 (equivalent to $472,000 in 2026 according to usinflationcalculator.com.) This amount was made up of $72,721 for the adult </w:t>
       </w:r>
       <w:r>
         <w:rPr>
@@ -2834,23 +2646,7 @@
       </w:r>
       <w:r>
         <w:rPr/>
-        <w:t xml:space="preserve"> for Dinosaur National Monument, </w:t>
-      </w:r>
-      <w:r>
-        <w:rPr/>
-        <w:t xml:space="preserve">and $4,748 for travel and transport. (Surprisingly, the small juvenile cost more than than adult!). </w:t>
-      </w:r>
-      <w:r>
-        <w:rPr/>
-        <w:t>Th</w:t>
-      </w:r>
-      <w:r>
-        <w:rPr/>
-        <w:t>e</w:t>
-      </w:r>
-      <w:r>
-        <w:rPr/>
-        <w:t xml:space="preserve"> agreement was signed by Dingus on 28 March, by May and Leitch on 30 March, and by AMNH director William J,. Moynihan on 3 April.</w:t>
+        <w:t xml:space="preserve"> for Dinosaur National Monument, and $4,748 for travel and transport. (Surprisingly, the small juvenile cost more than than adult!). The agreement was signed by Dingus on 28 March, by May and Leitch on 30 March, and by AMNH director William J,. Moynihan on 3 April.</w:t>
       </w:r>
     </w:p>
     <w:p>
@@ -2924,31 +2720,7 @@
       </w:pPr>
       <w:r>
         <w:rPr/>
-        <w:t xml:space="preserve">All casting and sculpting was done by </w:t>
-      </w:r>
-      <w:r>
-        <w:rPr/>
-        <w:t>RCI</w:t>
-      </w:r>
-      <w:r>
-        <w:rPr/>
-        <w:t xml:space="preserve">, an organization specializing in mounting prehistoric animals that had then only recently been established. Founder Peter May had started working with fossil mounts at the Royal Ontario Museum, beginning in 1977, where he learned the techniques from paleontology technician Gordon Gyrmov and former WW2 Luftwaffe </w:t>
-      </w:r>
-      <w:r>
-        <w:rPr/>
-        <w:t xml:space="preserve">rocket-plane </w:t>
-      </w:r>
-      <w:r>
-        <w:rPr/>
-        <w:t xml:space="preserve">test pilot Rudy Zimmermann. </w:t>
-      </w:r>
-      <w:r>
-        <w:rPr/>
-        <w:t>May</w:t>
-      </w:r>
-      <w:r>
-        <w:rPr/>
-        <w:t xml:space="preserve"> rose to became the head technician at the ROM. Having worked for a while at the Royal Tyrrell Paleontology Museum in Alberta, he found on returning to the ROM that his expertise was in demand from other museums. Initially fitting this outside work into his spare time under the banner of RCI, he went full time with his company in 1990, and the AMNH </w:t>
+        <w:t xml:space="preserve">All casting and sculpting was done by RCI, an organization specializing in mounting prehistoric animals that had then only recently been established. Founder Peter May had started working with fossil mounts at the Royal Ontario Museum, beginning in 1977, where he learned the techniques from paleontology technician Gordon Gyrmov and former WW2 Luftwaffe rocket-plane test pilot Rudy Zimmermann. May rose to became the head technician at the ROM. Having worked for a while at the Royal Tyrrell Paleontology Museum in Alberta, he found on returning to the ROM that his expertise was in demand from other museums. Initially fitting this outside work into his spare time under the banner of RCI, he went full time with his company in 1990, and the AMNH </w:t>
       </w:r>
       <w:r>
         <w:rPr>
@@ -2980,7 +2752,7 @@
       </w:r>
       <w:r>
         <w:rPr/>
-        <w:t xml:space="preserve"> fossils in a semi-truck from New York to Toronto, where they remained for the best part of a year. There, the bones were duplicated. First, they were coated with latex, which was then cured to form rubber molds (Figure 10). The bones were then cast, first with a layer of gel coat inside the molds, and then in various materials. As noted by </w:t>
+        <w:t xml:space="preserve"> fossils in a semi truck from New York to Toronto, where they remained for the best part of a year. There, the bones were duplicated. First, they were coated with latex, which was then cured to form rubber molds (Figure 10). The bones were then cast, first with a layer of gel coat inside the molds, and then in various materials. As noted by </w:t>
       </w:r>
       <w:r>
         <w:rPr>
@@ -3109,31 +2881,7 @@
       </w:pPr>
       <w:r>
         <w:rPr/>
-        <w:t xml:space="preserve">In November 1991, the work in Toronto was complete, and Blakelock Moving </w:t>
-      </w:r>
-      <w:r>
-        <w:rPr/>
-        <w:t xml:space="preserve">were contracted to ship the </w:t>
-      </w:r>
-      <w:r>
-        <w:rPr/>
-        <w:t xml:space="preserve">completed exhibit to New York </w:t>
-      </w:r>
-      <w:r>
-        <w:rPr/>
-        <w:t xml:space="preserve">on 7 November (Clark 1991), </w:t>
-      </w:r>
-      <w:r>
-        <w:rPr/>
-        <w:t xml:space="preserve">in sections for mounting (Figure 13). Unlike the trial mounting in Toronto, when the head and neck were attached in three sections, in New York the three sections were first joined together and then fitted as a unit. This large unit, about nine meters in length, proved awkward to manoeuvre, and it was difficult to raise it to a sufficient height to slide into its slot (Figure 14). It took nearly two hours to wrestle it into place at the front of the rearing torso. Worse, when the mount was finally completed it was imperfect because, when the whole neck had been hanging horizontally, it had bent in the middle at the point of suspension. The resulting kink in the neck can be seen between C10 and C11 in Figure </w:t>
-      </w:r>
-      <w:r>
-        <w:rPr/>
-        <w:t>1</w:t>
-      </w:r>
-      <w:r>
-        <w:rPr/>
-        <w:t xml:space="preserve"> and in other contemporary photos such as those of Dingus (1996:26) and Lindsay (1992:18–20). It was soon corrected, however, in a near-disastrous but ultimately successful late-night operation (Dingus 1996:28), and the line of the neck is smooth and elegant in the mount as it is today.</w:t>
+        <w:t>In November 1991, the work in Toronto was complete, and Blakelock Moving were contracted to ship the completed exhibit to New York on 7 November (Clark 1991), in sections for mounting (Figure 13). Unlike the trial mounting in Toronto, when the head and neck were attached in three sections, in New York the three sections were first joined together and then fitted as a unit. This large unit, about nine meters in length, proved awkward to manoeuvre, and it was difficult to raise it to a sufficient height to slide into its slot (Figure 14). It took nearly two hours to wrestle it into place at the front of the rearing torso. Worse, when the mount was finally completed it was imperfect because, when the whole neck had been hanging horizontally, it had bent in the middle at the point of suspension. The resulting kink in the neck can be seen between C10 and C11 in Figure 1 and in other contemporary photos such as those of Dingus (1996:26) and Lindsay (1992:18–20). It was soon corrected, however, in a near-disastrous but ultimately successful late-night operation (Dingus 1996:28), and the line of the neck is smooth and elegant in the mount as it is today.</w:t>
       </w:r>
     </w:p>
     <w:p>
@@ -3349,20 +3097,12 @@
       </w:r>
       <w:r>
         <w:rPr/>
-        <w:t xml:space="preserve"> (Lindsay 1992) in their Dinosaur Spotter’s Guides series, as part of a broader contract to photograph dinosaurs at the AMNH and the USNM. Gardiner recalls (pers. </w:t>
-      </w:r>
-      <w:r>
-        <w:rPr/>
-        <w:t>c</w:t>
-      </w:r>
-      <w:r>
-        <w:rPr/>
-        <w:t>omm., 2022):</w:t>
-      </w:r>
-    </w:p>
-    <w:p>
-      <w:pPr>
-        <w:pStyle w:val="BlockQuotation"/>
+        <w:t xml:space="preserve"> (Lindsay 1992) in their Dinosaur Spotter’s Guides series, as part of a broader contract to photograph dinosaurs at the AMNH and the USNM. Gardiner recalls (pers. comm., 2022):</w:t>
+      </w:r>
+    </w:p>
+    <w:p>
+      <w:pPr>
+        <w:pStyle w:val="BlockQuotationuser"/>
         <w:rPr/>
       </w:pPr>
       <w:r>
@@ -3723,15 +3463,7 @@
       </w:pPr>
       <w:r>
         <w:rPr/>
-        <w:t xml:space="preserve">This list of material of AMNH 6341 is mostly a superset of that listed as belonging to what was then the USNM’s part of the specimen in Brown’s (1929) account of reuniting the parts of the skeleton. The only additional element in Brown’s account is his statement that “the last ten cervical vertebrae” (not just the last nine) were at that time present — see above. But Brown stated wrongly that the left rather than right scapulocoracoid and humerus are present (and the material list of McIntosh 2005:43 followed this error, contradicting his description and illustration later in the same chapter, McIntosh 2005:59–62). The girdle element that was on display in 1939 (Figure </w:t>
-      </w:r>
-      <w:r>
-        <w:rPr/>
-        <w:t>5</w:t>
-      </w:r>
-      <w:r>
-        <w:rPr/>
-        <w:t xml:space="preserve">B) is clearly a complete and well preserved </w:t>
+        <w:t xml:space="preserve">This list of material of AMNH 6341 is mostly a superset of that listed as belonging to what was then the USNM’s part of the specimen in Brown’s (1929) account of reuniting the parts of the skeleton. The only additional element in Brown’s account is his statement that “the last ten cervical vertebrae” (not just the last nine) were at that time present — see above. But Brown stated wrongly that the left rather than right scapulocoracoid and humerus are present (and the material list of McIntosh 2005:43 followed this error, contradicting his description and illustration later in the same chapter, McIntosh 2005:59–62). The girdle element that was on display in 1939 (Figure 5B) is clearly a complete and well preserved </w:t>
       </w:r>
       <w:r>
         <w:rPr>
@@ -3956,15 +3688,7 @@
       </w:r>
       <w:r>
         <w:rPr/>
-        <w:t xml:space="preserve"> mount, cast from molds taken from this composite, is shown in a 1991 photograph (Figure </w:t>
-      </w:r>
-      <w:r>
-        <w:rPr/>
-        <w:t>16</w:t>
-      </w:r>
-      <w:r>
-        <w:rPr/>
-        <w:t xml:space="preserve">A–B). It can be confidently confirmed as the same composite illustrated by Holland (1906:figure 1) “as placed in the restoration at the British Museum”, and by Nieuwland (2019:figure 5.3) in a photograph of a worker at the Muséum Nationale d’Histoire Naturelle, Paris, France, with the plaster skull of their </w:t>
+        <w:t xml:space="preserve"> mount, cast from molds taken from this composite, is shown in a 1991 photograph (Figure 16A–B). It can be confidently confirmed as the same composite illustrated by Holland (1906:figure 1) “as placed in the restoration at the British Museum”, and by Nieuwland (2019:figure 5.3) in a photograph of a worker at the Muséum Nationale d’Histoire Naturelle, Paris, France, with the plaster skull of their </w:t>
       </w:r>
       <w:r>
         <w:rPr>
@@ -3975,15 +3699,7 @@
       </w:r>
       <w:r>
         <w:rPr/>
-        <w:t xml:space="preserve"> cast in 1908 (Figure </w:t>
-      </w:r>
-      <w:r>
-        <w:rPr/>
-        <w:t>16</w:t>
-      </w:r>
-      <w:r>
-        <w:rPr/>
-        <w:t>C).</w:t>
+        <w:t xml:space="preserve"> cast in 1908 (Figure 16C).</w:t>
       </w:r>
     </w:p>
     <w:p>
@@ -4097,7 +3813,7 @@
       </w:r>
       <w:r>
         <w:rPr/>
-        <w:t xml:space="preserve"> C8 (618 mm, McIntosh 2005:46). Instead, a non-contiguous sequence of Carnegie-</w:t>
+        <w:t xml:space="preserve"> C8 (618 mm, McIntosh 2005:46). Instead, a non-contiguous sequence of Carnegie </w:t>
       </w:r>
       <w:r>
         <w:rPr>
@@ -4151,15 +3867,7 @@
       </w:pPr>
       <w:r>
         <w:rPr/>
-        <w:t xml:space="preserve">To make matters more complicated, photographs show that the completed mount actually has 17 cervicals rather than 16 (e.g. Figure </w:t>
-      </w:r>
-      <w:r>
-        <w:rPr/>
-        <w:t>1</w:t>
-      </w:r>
-      <w:r>
-        <w:rPr/>
-        <w:t xml:space="preserve">; Lindsay 1992:20–21; Taylor and Wedel 2016:figure 1). McIntosh (2005:45) implicitly left open the possibility that </w:t>
+        <w:t xml:space="preserve">To make matters more complicated, photographs show that the completed mount actually has 17 cervicals rather than 16 (e.g. Figure 1; Lindsay 1992:20–21; Taylor and Wedel 2016:figure 1). McIntosh (2005:45) implicitly left open the possibility that </w:t>
       </w:r>
       <w:r>
         <w:rPr>
@@ -4190,23 +3898,7 @@
       </w:pPr>
       <w:r>
         <w:rPr/>
-        <w:t xml:space="preserve">However, photos of the mounting process in the AMNH (e.g. Figure 13) show that the neck section used in the mount had only 14 cervical vertebrae — C3–16, not counting the altas and axis which were not in place at that time. The assembly process was complex. The neck section containing the head and C1–16 was welded to the torso leaving a stretch of bare armature. The two halves of the seventeenth vertebra (visible on the </w:t>
-      </w:r>
-      <w:r>
-        <w:rPr/>
-        <w:t>right</w:t>
-      </w:r>
-      <w:r>
-        <w:rPr/>
-        <w:t xml:space="preserve"> side of Figure 13) were then glued together around the armature and bridging the gap between the bones of the neck section and the torso. The special 17th vertebra can be seen in Figure </w:t>
-      </w:r>
-      <w:r>
-        <w:rPr/>
-        <w:t>11</w:t>
-      </w:r>
-      <w:r>
-        <w:rPr/>
-        <w:t xml:space="preserve">B, distinctly darker than the cervicals above it and the dorsals below. Since there are no duplicate vertebrae in the neck, the special C17 must have come from elsewhere. Careful comparisons suggest it is a cast of C14 of the Carnegie </w:t>
+        <w:t xml:space="preserve">However, photos of the mounting process in the AMNH (e.g. Figure 13) show that the neck section used in the mount had only 14 cervical vertebrae — C3–16, not counting the altas and axis which were not in place at that time. The assembly process was complex. The neck section containing the head and C1–16 was welded to the torso leaving a stretch of bare armature. The two halves of the seventeenth vertebra (visible on the right side of Figure 13) were then glued together around the armature and bridging the gap between the bones of the neck section and the torso. The special 17th vertebra can be seen in Figure 11B, distinctly darker than the cervicals above it and the dorsals below. Since there are no duplicate vertebrae in the neck, the special C17 must have come from elsewhere. Careful comparisons suggest it is a cast of C14 of the Carnegie </w:t>
       </w:r>
       <w:r>
         <w:rPr>
@@ -5084,7 +4776,7 @@
       </w:pPr>
       <w:r>
         <w:rPr/>
-        <w:t xml:space="preserve">Robert T. Bakker had been arguing for some time that at least some sauropods reared (e.g. Bakker 1971c, 1978). In his widely read popular-science book </w:t>
+        <w:t xml:space="preserve">Robert T. Bakker had been arguing for some time that at least some sauropods reared (e.g. Bakker 1971, 1978). In his widely read popular-science book </w:t>
       </w:r>
       <w:r>
         <w:rPr>
@@ -5583,31 +5275,7 @@
       </w:r>
       <w:r>
         <w:rPr/>
-        <w:t xml:space="preserve"> itself are for some reason extraordinarily rare. The Dinosaur Toy Blog (Smith 2007) has reviewed well over 2,500 dinosaur toys (</w:t>
-      </w:r>
-      <w:r>
-        <w:rPr/>
-        <w:t xml:space="preserve">Adam </w:t>
-      </w:r>
-      <w:r>
-        <w:rPr/>
-        <w:t xml:space="preserve">Smith, pers. </w:t>
-      </w:r>
-      <w:r>
-        <w:rPr/>
-        <w:t>c</w:t>
-      </w:r>
-      <w:r>
-        <w:rPr/>
-        <w:t xml:space="preserve">omm., </w:t>
-      </w:r>
-      <w:r>
-        <w:rPr/>
-        <w:t>2024</w:t>
-      </w:r>
-      <w:r>
-        <w:rPr/>
-        <w:t xml:space="preserve">), including 50 versions of </w:t>
+        <w:t xml:space="preserve"> itself are for some reason extraordinarily rare. The Dinosaur Toy Blog (Smith 2007) has reviewed well over 2,500 dinosaur toys (Adam Smith, pers. comm., 2024), including 50 versions of </w:t>
       </w:r>
       <w:r>
         <w:rPr>
@@ -5825,15 +5493,7 @@
       </w:r>
       <w:r>
         <w:rPr/>
-        <w:t xml:space="preserve"> skeletal reconstruction </w:t>
-      </w:r>
-      <w:r>
-        <w:rPr/>
-        <w:t>in Figure 15</w:t>
-      </w:r>
-      <w:r>
-        <w:rPr/>
-        <w:t xml:space="preserve">, to Gregory S. Paul for permission to reproduce his artwork </w:t>
+        <w:t xml:space="preserve"> skeletal reconstruction in Figure 15, to Gregory S. Paul for permission to reproduce his artwork </w:t>
       </w:r>
       <w:r>
         <w:rPr>
@@ -5844,15 +5504,7 @@
       </w:r>
       <w:r>
         <w:rPr/>
-        <w:t xml:space="preserve"> </w:t>
-      </w:r>
-      <w:r>
-        <w:rPr/>
-        <w:t>(Figure 7),</w:t>
-      </w:r>
-      <w:r>
-        <w:rPr/>
-        <w:t xml:space="preserve"> to John Gurche for permission to reproduce his life restoration of the rearing </w:t>
+        <w:t xml:space="preserve"> (Figure 7), to John Gurche for permission to reproduce his life restoration of the rearing </w:t>
       </w:r>
       <w:r>
         <w:rPr>
@@ -5863,15 +5515,7 @@
       </w:r>
       <w:r>
         <w:rPr/>
-        <w:t xml:space="preserve"> </w:t>
-      </w:r>
-      <w:r>
-        <w:rPr/>
-        <w:t>(Figure 18),</w:t>
-      </w:r>
-      <w:r>
-        <w:rPr/>
-        <w:t xml:space="preserve"> and to Ambrosino for permission to use a photograph of his Lego </w:t>
+        <w:t xml:space="preserve"> (Figure 18), and to Ambrosino for permission to use a photograph of his Lego </w:t>
       </w:r>
       <w:r>
         <w:rPr>
@@ -5893,23 +5537,7 @@
       </w:r>
       <w:r>
         <w:rPr/>
-        <w:t xml:space="preserve"> painting by combining several scans created by Mathew J. Wedel</w:t>
-      </w:r>
-      <w:r>
-        <w:rPr/>
-        <w:t xml:space="preserve"> (Western University of Health Sciences)</w:t>
-      </w:r>
-      <w:r>
-        <w:rPr/>
-        <w:t xml:space="preserve">; we thank them both. Carl Mehling (AMNH) searched collections for the missing C7 </w:t>
-      </w:r>
-      <w:r>
-        <w:rPr/>
-        <w:t>and concluded it was absent</w:t>
-      </w:r>
-      <w:r>
-        <w:rPr/>
-        <w:t>. Mick Ellison (AMNH) kindly photographed for us both the 1939 public gallery exhibit panel (Figure 6) and the prototype model (Figure 9), having had the model repaired. Photography of the model was courtesy of the AMNH Main Archives.</w:t>
+        <w:t xml:space="preserve"> painting by combining several scans created by Mathew J. Wedel (Western University of Health Sciences); we thank them both. Carl Mehling (AMNH) searched collections for the missing C7 and concluded it was absent. Mick Ellison (AMNH) kindly photographed for us both the 1939 public gallery exhibit panel (Figure 6) and the prototype model (Figure 9), having had the model repaired. Photography of the model was courtesy of the AMNH Main Archives.</w:t>
       </w:r>
     </w:p>
     <w:p>
@@ -5919,59 +5547,7 @@
       </w:pPr>
       <w:r>
         <w:rPr/>
-        <w:t xml:space="preserve">Mai Reitmeyer (Department of Library Services, AMNH) helped us to obtain historical photographs. Kiana Clark </w:t>
-      </w:r>
-      <w:r>
-        <w:rPr/>
-        <w:t>(</w:t>
-      </w:r>
-      <w:r>
-        <w:rPr/>
-        <w:t>AMNH Vertebrate Paleontology Archives</w:t>
-      </w:r>
-      <w:r>
-        <w:rPr/>
-        <w:t>)</w:t>
-      </w:r>
-      <w:r>
-        <w:rPr/>
-        <w:t xml:space="preserve">, </w:t>
-      </w:r>
-      <w:r>
-        <w:rPr/>
-        <w:t>provided numerous historical documents and photographs. Abby Telfer (</w:t>
-      </w:r>
-      <w:r>
-        <w:rPr/>
-        <w:t>U</w:t>
-      </w:r>
-      <w:r>
-        <w:rPr/>
-        <w:t xml:space="preserve">nited States </w:t>
-      </w:r>
-      <w:r>
-        <w:rPr/>
-        <w:t>N</w:t>
-      </w:r>
-      <w:r>
-        <w:rPr/>
-        <w:t xml:space="preserve">ational </w:t>
-      </w:r>
-      <w:r>
-        <w:rPr/>
-        <w:t>M</w:t>
-      </w:r>
-      <w:r>
-        <w:rPr/>
-        <w:t xml:space="preserve">useum), provided helpful documents in establish the early history of the AMNH 6341 material. ReBecca Hunt-Forster (Dinosaur National Monument) provided an invaluable archive of correspondence relating to the early years of the quarry. </w:t>
-      </w:r>
-      <w:r>
-        <w:rPr/>
-        <w:t xml:space="preserve">Amelia Zietlow (Richard Gilder Graduate School at the AMNH) provided helpful photographs and information about the present public exhibits (Figure 8). We thank Ray Wilhite (Auburn University College of Veterinary Medicine) and Brooks Britt and Rod Scheetz (both Brigham Young University) for help in accessing the archived notebooks of John S. McIntosh. </w:t>
-      </w:r>
-      <w:r>
-        <w:rPr/>
-        <w:t>Matt Wedel helped with the interpretation and identification of some vertebrae.</w:t>
+        <w:t>Mai Reitmeyer (Department of Library Services, AMNH) helped us to obtain historical photographs. Kiana Clark (AMNH Vertebrate Paleontology Archives), provided numerous historical documents and photographs. Abby Telfer (United States National Museum), provided helpful documents in establish the early history of the AMNH 6341 material. ReBecca Hunt-Forster (Dinosaur National Monument) provided an invaluable archive of correspondence relating to the early years of the quarry. Amelia Zietlow (Richard Gilder Graduate School at the AMNH) provided helpful photographs and information about the present public exhibits (Figure 8). We thank Ray Wilhite (Auburn University College of Veterinary Medicine) and Brooks Britt and Rod Scheetz (both Brigham Young University) for help in accessing the archived notebooks of John S. McIntosh. Matt Wedel helped with the interpretation and identification of some vertebrae.</w:t>
       </w:r>
     </w:p>
     <w:p>
@@ -5992,59 +5568,7 @@
       </w:r>
       <w:r>
         <w:rPr/>
-        <w:t xml:space="preserve"> </w:t>
-      </w:r>
-      <w:r>
-        <w:rPr/>
-        <w:t xml:space="preserve">mounting </w:t>
-      </w:r>
-      <w:r>
-        <w:rPr/>
-        <w:t xml:space="preserve">project, took most of the photographs of the initial assembly in Toronto. Denis Finnin, </w:t>
-      </w:r>
-      <w:r>
-        <w:rPr/>
-        <w:t xml:space="preserve">the Museum Photographer, took most of the photos of the assembly in the Rotunda. It is likely that their work is included in one or more of our illustrations. </w:t>
-      </w:r>
-      <w:r>
-        <w:rPr/>
-        <w:t>Mick Ellison, Lynton Gardiner, Jack Horner (</w:t>
-      </w:r>
-      <w:r>
-        <w:rPr/>
-        <w:t>Chapman University</w:t>
-      </w:r>
-      <w:r>
-        <w:rPr/>
-        <w:t xml:space="preserve">), Carl Mehling, </w:t>
-      </w:r>
-      <w:r>
-        <w:rPr/>
-        <w:t xml:space="preserve">Gregory S. Paul. </w:t>
-      </w:r>
-      <w:r>
-        <w:rPr/>
-        <w:t>Paul Sereno (University of Chicago), Adam Smith (</w:t>
-      </w:r>
-      <w:r>
-        <w:rPr/>
-        <w:t>Nottingham Natural History Museum</w:t>
-      </w:r>
-      <w:r>
-        <w:rPr/>
-        <w:t xml:space="preserve">) and Abby Telfer (USNM) </w:t>
-      </w:r>
-      <w:r>
-        <w:rPr/>
-        <w:t>allowed us to cite personal communication</w:t>
-      </w:r>
-      <w:r>
-        <w:rPr/>
-        <w:t>s</w:t>
-      </w:r>
-      <w:r>
-        <w:rPr/>
-        <w:t>.</w:t>
+        <w:t xml:space="preserve"> mounting project, took most of the photographs of the initial assembly in Toronto. Denis Finnin, the Museum Photographer, took most of the photos of the assembly in the Rotunda. It is likely that their work is included in one or more of our illustrations. Mick Ellison, Lynton Gardiner, Jack Horner (Chapman University), Carl Mehling, Gregory S. Paul. Paul Sereno (University of Chicago), Adam Smith (Nottingham Natural History Museum) and Abby Telfer (USNM) allowed us to cite personal communications.</w:t>
       </w:r>
       <w:r>
         <w:br w:type="page"/>
@@ -6057,6 +5581,7 @@
           <w:ilvl w:val="0"/>
           <w:numId w:val="3"/>
         </w:numPr>
+        <w:spacing w:before="0" w:after="142"/>
         <w:ind w:hanging="0" w:left="0" w:right="0"/>
         <w:rPr/>
       </w:pPr>
@@ -6065,6 +5590,38 @@
       <w:r>
         <w:rPr/>
         <w:t>References</w:t>
+      </w:r>
+    </w:p>
+    <w:p>
+      <w:pPr>
+        <w:pStyle w:val="Reference"/>
+        <w:rPr/>
+      </w:pPr>
+      <w:r>
+        <w:rPr/>
+        <w:t xml:space="preserve">Alexander, R. McNeill. 1985. Mechanics of posture and gait of some large dinosaurs: </w:t>
+      </w:r>
+      <w:r>
+        <w:rPr>
+          <w:i/>
+          <w:iCs/>
+        </w:rPr>
+        <w:t>Zoological Journal of the Linnean Society</w:t>
+      </w:r>
+      <w:r>
+        <w:rPr/>
+        <w:t xml:space="preserve"> </w:t>
+      </w:r>
+      <w:r>
+        <w:rPr>
+          <w:b/>
+          <w:bCs/>
+        </w:rPr>
+        <w:t>83</w:t>
+      </w:r>
+      <w:r>
+        <w:rPr/>
+        <w:t>:1–25.</w:t>
       </w:r>
     </w:p>
     <w:p>
@@ -6294,15 +5851,7 @@
       </w:pPr>
       <w:r>
         <w:rPr/>
-        <w:t xml:space="preserve">Bakker, Robert </w:t>
-      </w:r>
-      <w:r>
-        <w:rPr/>
-        <w:t>T</w:t>
-      </w:r>
-      <w:r>
-        <w:rPr/>
-        <w:t xml:space="preserve">. 1978. Dinosaur feeding behaviour and the origin of flowering plants. </w:t>
+        <w:t xml:space="preserve">Bakker, Robert T. 1978. Dinosaur feeding behaviour and the origin of flowering plants. </w:t>
       </w:r>
       <w:r>
         <w:rPr>
@@ -6576,11 +6125,7 @@
       </w:pPr>
       <w:r>
         <w:rPr/>
-        <w:t xml:space="preserve">Clark, Robert J. 1991. Letter to Peter May, Research Casting International. 28 October 1991. </w:t>
-      </w:r>
-      <w:r>
-        <w:rPr/>
-        <w:t>Department of Vertebrate Paleontology building and exhibit records, VPA 100, Series 3, Box 28, Folder 35, American Museum of Natural History Vertebrate Paleontology Archive.</w:t>
+        <w:t>Clark, Robert J. 1991. Letter to Peter May, Research Casting International. 28 October 1991. Department of Vertebrate Paleontology building and exhibit records, VPA 100, Series 3, Box 28, Folder 35, American Museum of Natural History Vertebrate Paleontology Archive.</w:t>
       </w:r>
     </w:p>
     <w:p>
@@ -6643,7 +6188,7 @@
       </w:r>
       <w:r>
         <w:rPr/>
-        <w:t>:1-33. doi:10.1016/0031-0182(75)90027-9</w:t>
+        <w:t>:1–33. doi:10.1016/0031-0182(75)90027-9</w:t>
       </w:r>
     </w:p>
     <w:p>
@@ -6760,11 +6305,7 @@
       </w:pPr>
       <w:r>
         <w:rPr/>
-        <w:t xml:space="preserve">Dingus, Lowell. 1990. Letter of agreement to Peter May and Andrew Leitch, Research Casting International. 28 March 1990. </w:t>
-      </w:r>
-      <w:r>
-        <w:rPr/>
-        <w:t>Department of Vertebrate Paleontology building and exhibit records, VPA 100, Series 3, Box 28, Folder 35, American Museum of Natural History Vertebrate Paleontology Archive.</w:t>
+        <w:t>Dingus, Lowell. 1990. Letter of agreement to Peter May and Andrew Leitch, Research Casting International. 28 March 1990. Department of Vertebrate Paleontology building and exhibit records, VPA 100, Series 3, Box 28, Folder 35, American Museum of Natural History Vertebrate Paleontology Archive.</w:t>
       </w:r>
     </w:p>
     <w:p>
@@ -6837,7 +6378,15 @@
       </w:pPr>
       <w:r>
         <w:rPr/>
-        <w:t>Douglass, Earl. 1923. Report of Work Done by the Carnegie Museum at the Dinosaur National Monument in Uinta County, Utah, under the Supervision of Earl Dougless, in the year 1922. 24 March 1923. 2 pages.</w:t>
+        <w:t>Douglass, Earl, 1922c. Report of Work Done by the Carnegie Museum at the Dinosaur National Monument in Uinta County, Utah, under the Supervision of Earl Dougl</w:t>
+      </w:r>
+      <w:r>
+        <w:rPr/>
+        <w:t>a</w:t>
+      </w:r>
+      <w:r>
+        <w:rPr/>
+        <w:t>ss, in the year 1922. 24 March 1923.</w:t>
       </w:r>
     </w:p>
     <w:p>
@@ -6847,6 +6396,24 @@
       </w:pPr>
       <w:r>
         <w:rPr/>
+        <w:t>Douglass, Earl. 1923. Report of Work Done by the Carnegie Museum at the Dinosaur National Monument in Uinta County, Utah, under the Supervision of Earl Dougl</w:t>
+      </w:r>
+      <w:r>
+        <w:rPr/>
+        <w:t>a</w:t>
+      </w:r>
+      <w:r>
+        <w:rPr/>
+        <w:t>ss, in the year 1922. 24 March 1923. 2 pages.</w:t>
+      </w:r>
+    </w:p>
+    <w:p>
+      <w:pPr>
+        <w:pStyle w:val="Reference"/>
+        <w:rPr/>
+      </w:pPr>
+      <w:r>
+        <w:rPr/>
         <w:t>Galiano, Henry. 1990. Letter to James “Chip” Jeffries, Ralph Appelbaum Associates. 22 March 1990. Department of Vertebrate Paleontology building and exhibit records, VPA 100, Series 3, Box 28, Folder 35, American Museum of Natural History Vertebrate Paleontology Archive.</w:t>
       </w:r>
     </w:p>
@@ -6857,15 +6424,7 @@
       </w:pPr>
       <w:r>
         <w:rPr/>
-        <w:t xml:space="preserve">Gilmore, Charles </w:t>
-      </w:r>
-      <w:r>
-        <w:rPr/>
-        <w:t>W</w:t>
-      </w:r>
-      <w:r>
-        <w:rPr/>
-        <w:t>. 1923a. Handwritten letter to William de C. Ravenel briefly summarising the outcome of the field season at the Dinosaur National Monument quarry. 8 August 1923.</w:t>
+        <w:t>Gilmore, Charles W. 1923a. Handwritten letter to William de C. Ravenel briefly summarising the outcome of the field season at the Dinosaur National Monument quarry. 8 August 1923.</w:t>
       </w:r>
     </w:p>
     <w:p>
@@ -7317,25 +6876,25 @@
       </w:pPr>
       <w:r>
         <w:rPr/>
-        <w:t xml:space="preserve">Holland, William J. 1924. The skull of </w:t>
-      </w:r>
-      <w:r>
-        <w:rPr>
-          <w:i/>
-          <w:iCs/>
-        </w:rPr>
-        <w:t>Diplodocus</w:t>
-      </w:r>
-      <w:r>
-        <w:rPr/>
-        <w:t xml:space="preserve">. </w:t>
-      </w:r>
-      <w:r>
-        <w:rPr>
-          <w:i/>
-          <w:iCs/>
-        </w:rPr>
-        <w:t>Memoirs of the Carnegie Museum</w:t>
+        <w:t xml:space="preserve">Huene, Friedrich von. </w:t>
+      </w:r>
+      <w:r>
+        <w:rPr/>
+        <w:t xml:space="preserve">1929. Die Besonderheit der Titanosaurier [The characteristics of titanosaurs]. </w:t>
+      </w:r>
+      <w:r>
+        <w:rPr>
+          <w:i/>
+          <w:iCs/>
+        </w:rPr>
+        <w:t xml:space="preserve">Centralblatt für </w:t>
+      </w:r>
+      <w:r>
+        <w:rPr>
+          <w:i/>
+          <w:iCs/>
+        </w:rPr>
+        <w:t>Mineralogie, Geologie und Palaontologie</w:t>
       </w:r>
       <w:r>
         <w:rPr/>
@@ -7346,65 +6905,119 @@
           <w:b/>
           <w:bCs/>
         </w:rPr>
-        <w:t>9(3)</w:t>
-      </w:r>
-      <w:r>
-        <w:rPr/>
-        <w:t>:379–403.</w:t>
-      </w:r>
-    </w:p>
-    <w:p>
-      <w:pPr>
-        <w:pStyle w:val="Reference"/>
-        <w:rPr/>
-      </w:pPr>
-      <w:r>
-        <w:rPr/>
-        <w:t xml:space="preserve">Janensch, Werner. 1922. Das Handskelett von </w:t>
-      </w:r>
-      <w:r>
-        <w:rPr>
-          <w:i/>
-          <w:iCs/>
-        </w:rPr>
-        <w:t>Gigantosaurus robustus</w:t>
-      </w:r>
-      <w:r>
-        <w:rPr/>
-        <w:t xml:space="preserve"> u. </w:t>
-      </w:r>
-      <w:r>
-        <w:rPr>
-          <w:i/>
-          <w:iCs/>
-        </w:rPr>
-        <w:t>Brachiosaurus brancai</w:t>
-      </w:r>
-      <w:r>
-        <w:rPr/>
-        <w:t xml:space="preserve"> aus den Tendaguru-Schichten Deutsch-Ostafrikas. </w:t>
-      </w:r>
-      <w:r>
-        <w:rPr>
-          <w:i/>
-          <w:iCs/>
-        </w:rPr>
-        <w:t>Centralblatt für Mineralogie, Geologie und Palaontologie</w:t>
-      </w:r>
-      <w:r>
-        <w:rPr/>
-        <w:t xml:space="preserve"> </w:t>
+        <w:t>192</w:t>
       </w:r>
       <w:r>
         <w:rPr>
           <w:b/>
           <w:bCs/>
         </w:rPr>
+        <w:t>9(B)</w:t>
+      </w:r>
+      <w:r>
+        <w:rPr/>
+        <w:t>:</w:t>
+      </w:r>
+      <w:r>
+        <w:rPr/>
+        <w:t>493–499.</w:t>
+      </w:r>
+    </w:p>
+    <w:p>
+      <w:pPr>
+        <w:pStyle w:val="Reference"/>
+        <w:rPr/>
+      </w:pPr>
+      <w:r>
+        <w:rPr/>
+        <w:t xml:space="preserve">Janensch, Werner. 1922. Das Handskelett von </w:t>
+      </w:r>
+      <w:r>
+        <w:rPr>
+          <w:i/>
+          <w:iCs/>
+        </w:rPr>
+        <w:t>Gigantosaurus robustus</w:t>
+      </w:r>
+      <w:r>
+        <w:rPr/>
+        <w:t xml:space="preserve"> u. </w:t>
+      </w:r>
+      <w:r>
+        <w:rPr>
+          <w:i/>
+          <w:iCs/>
+        </w:rPr>
+        <w:t>Brachiosaurus brancai</w:t>
+      </w:r>
+      <w:r>
+        <w:rPr/>
+        <w:t xml:space="preserve"> aus den Tendaguru-Schichten Deutsch-Ostafrikas. </w:t>
+      </w:r>
+      <w:r>
+        <w:rPr>
+          <w:i/>
+          <w:iCs/>
+        </w:rPr>
+        <w:t>Centralblatt für Mineralogie, Geologie und Palaontologie</w:t>
+      </w:r>
+      <w:r>
+        <w:rPr/>
+        <w:t xml:space="preserve"> </w:t>
+      </w:r>
+      <w:r>
+        <w:rPr>
+          <w:b/>
+          <w:bCs/>
+        </w:rPr>
         <w:t>1922(15)</w:t>
       </w:r>
       <w:r>
         <w:rPr/>
         <w:t>: 464–480.</w:t>
+      </w:r>
+    </w:p>
+    <w:p>
+      <w:pPr>
+        <w:pStyle w:val="Reference"/>
+        <w:rPr/>
+      </w:pPr>
+      <w:r>
+        <w:rPr/>
+        <w:t xml:space="preserve">Janensch, Werner. 1950. Die Skelettrekonstruktion von </w:t>
+      </w:r>
+      <w:r>
+        <w:rPr>
+          <w:i/>
+          <w:iCs/>
+        </w:rPr>
+        <w:t>Brachiosaurus brancai</w:t>
+      </w:r>
+      <w:r>
+        <w:rPr/>
+        <w:t xml:space="preserve">. </w:t>
+      </w:r>
+      <w:r>
+        <w:rPr>
+          <w:i/>
+          <w:iCs/>
+        </w:rPr>
+        <w:t>Palaeontographica</w:t>
+      </w:r>
+      <w:r>
+        <w:rPr/>
+        <w:t xml:space="preserve"> (Supplement 7) </w:t>
+      </w:r>
+      <w:r>
+        <w:rPr>
+          <w:b/>
+          <w:bCs/>
+        </w:rPr>
+        <w:t>3</w:t>
+      </w:r>
+      <w:r>
+        <w:rPr/>
+        <w:t>:97–103, and plates VI–VIII.</w:t>
       </w:r>
     </w:p>
     <w:p>
@@ -7682,7 +7295,7 @@
       </w:pPr>
       <w:r>
         <w:rPr/>
-        <w:t xml:space="preserve">Mallison, Heinrich. 2011. Rearing giants: kinetic-dynamic modeling of sauropod bipedal and tripodal poses. pp. 237-250 in: Nicole Klein, Kristian Remes, Carole T. Gee and Martin P. Sander (eds.), </w:t>
+        <w:t xml:space="preserve">Mallison, Heinrich. 2011. Rearing giants: kinetic-dynamic modeling of sauropod bipedal and tripodal poses. pp. 237–250 in: Nicole Klein, Kristian Remes, Carole T. Gee and Martin P. Sander (eds.), </w:t>
       </w:r>
       <w:r>
         <w:rPr>
@@ -7725,8 +7338,16 @@
       </w:r>
       <w:r>
         <w:rPr/>
-        <w:t>:81–86. doi:10.2475/ajs.s3-39.229.81</w:t>
-      </w:r>
+        <w:t xml:space="preserve">:81–86. </w:t>
+      </w:r>
+      <w:hyperlink r:id="rId9">
+        <w:r>
+          <w:rPr>
+            <w:rStyle w:val="Hyperlink"/>
+          </w:rPr>
+          <w:t>doi:10.2475/ajs.s3-39.229.81</w:t>
+        </w:r>
+      </w:hyperlink>
     </w:p>
     <w:p>
       <w:pPr>
@@ -7735,82 +7356,48 @@
       </w:pPr>
       <w:r>
         <w:rPr/>
-        <w:t>Marsh, Othniel C. 1896. The dinosaurs of North America. Extract from the 16th annual report of the U. S. Geological Survey, 1894-95, part I. doi:10.5962/bhl.title.60562</w:t>
-      </w:r>
-    </w:p>
-    <w:p>
-      <w:pPr>
-        <w:pStyle w:val="Reference"/>
-        <w:rPr/>
-      </w:pPr>
-      <w:r>
-        <w:rPr/>
-        <w:t xml:space="preserve">McIntosh, John S. 2005. The Genus </w:t>
-      </w:r>
-      <w:r>
-        <w:rPr>
-          <w:i/>
-          <w:iCs/>
-        </w:rPr>
-        <w:t>Barosaurus</w:t>
-      </w:r>
-      <w:r>
-        <w:rPr/>
-        <w:t xml:space="preserve"> Marsh (Sauropoda, Diplodocidae). pp. 38–77 in Virginia Tidwell and Ken Carpenter (eds.), </w:t>
-      </w:r>
-      <w:r>
-        <w:rPr>
-          <w:i/>
-          <w:iCs/>
-        </w:rPr>
-        <w:t>Thunder Lizards: the Sauropodomorph Dinosaurs</w:t>
-      </w:r>
-      <w:r>
-        <w:rPr/>
-        <w:t>. Indiana University Press, Bloomington, Indiana. 495 pp.</w:t>
-      </w:r>
-    </w:p>
-    <w:p>
-      <w:pPr>
-        <w:pStyle w:val="Reference"/>
-        <w:rPr/>
-      </w:pPr>
-      <w:r>
-        <w:rPr/>
-        <w:t xml:space="preserve">McIntosh, John S, Wade E. Miller, Kenneth L. Stadtman and David D. Gillette. 1996. The osteology of </w:t>
-      </w:r>
-      <w:r>
-        <w:rPr>
-          <w:i/>
-          <w:iCs/>
-        </w:rPr>
-        <w:t>Camarasaurus lewisi</w:t>
-      </w:r>
-      <w:r>
-        <w:rPr/>
-        <w:t xml:space="preserve"> (Jensen, 1988). </w:t>
-      </w:r>
-      <w:r>
-        <w:rPr>
-          <w:i/>
-          <w:iCs/>
-        </w:rPr>
-        <w:t>Brigham Young University Geology Studies</w:t>
-      </w:r>
-      <w:r>
-        <w:rPr/>
-        <w:t xml:space="preserve"> </w:t>
+        <w:t>Marsh, O</w:t>
+      </w:r>
+      <w:r>
+        <w:rPr/>
+        <w:t>thniel</w:t>
+      </w:r>
+      <w:r>
+        <w:rPr/>
+        <w:t xml:space="preserve"> C. 1891. Restoration of </w:t>
+      </w:r>
+      <w:r>
+        <w:rPr>
+          <w:i/>
+          <w:iCs/>
+        </w:rPr>
+        <w:t>Triceratops</w:t>
+      </w:r>
+      <w:r>
+        <w:rPr/>
+        <w:t xml:space="preserve"> (with plates XV and XVI). </w:t>
+      </w:r>
+      <w:r>
+        <w:rPr>
+          <w:i/>
+          <w:iCs/>
+        </w:rPr>
+        <w:t>American Journal of Science</w:t>
+      </w:r>
+      <w:r>
+        <w:rPr/>
+        <w:t xml:space="preserve">, 3rd series, </w:t>
       </w:r>
       <w:r>
         <w:rPr>
           <w:b/>
           <w:bCs/>
         </w:rPr>
-        <w:t>41</w:t>
-      </w:r>
-      <w:r>
-        <w:rPr/>
-        <w:t>:73–115.</w:t>
+        <w:t>41(244)</w:t>
+      </w:r>
+      <w:r>
+        <w:rPr/>
+        <w:t>:339–342.</w:t>
       </w:r>
     </w:p>
     <w:p>
@@ -7820,7 +7407,7 @@
       </w:pPr>
       <w:r>
         <w:rPr/>
-        <w:t>Merrill, George P. 1922. Letter to William de C. Ravenel on the Carnegie Museum's readiness to release the Dinosaur National Monument quarry. 6 November 1922.</w:t>
+        <w:t>Marsh, Othniel C. 1896. The dinosaurs of North America. Extract from the 16th annual report of the U. S. Geological Survey, 1894–95, part I. doi:10.5962/bhl.title.60562</w:t>
       </w:r>
     </w:p>
     <w:p>
@@ -7830,7 +7417,7 @@
       </w:pPr>
       <w:r>
         <w:rPr/>
-        <w:t xml:space="preserve">Millard, Ronald W., Harvey B. Lillywhite and Alan R. Hargens. 1992. Cardiovascular system design and </w:t>
+        <w:t xml:space="preserve">McIntosh, John S. 2005. The Genus </w:t>
       </w:r>
       <w:r>
         <w:rPr>
@@ -7841,14 +7428,46 @@
       </w:r>
       <w:r>
         <w:rPr/>
-        <w:t xml:space="preserve">. </w:t>
-      </w:r>
-      <w:r>
-        <w:rPr>
-          <w:i/>
-          <w:iCs/>
-        </w:rPr>
-        <w:t>The Lancet</w:t>
+        <w:t xml:space="preserve"> Marsh (Sauropoda, Diplodocidae). pp. 38–77 in Virginia Tidwell and Ken Carpenter (eds.), </w:t>
+      </w:r>
+      <w:r>
+        <w:rPr>
+          <w:i/>
+          <w:iCs/>
+        </w:rPr>
+        <w:t>Thunder Lizards: the Sauropodomorph Dinosaurs</w:t>
+      </w:r>
+      <w:r>
+        <w:rPr/>
+        <w:t>. Indiana University Press, Bloomington, Indiana. 495 pp.</w:t>
+      </w:r>
+    </w:p>
+    <w:p>
+      <w:pPr>
+        <w:pStyle w:val="Reference"/>
+        <w:rPr/>
+      </w:pPr>
+      <w:r>
+        <w:rPr/>
+        <w:t xml:space="preserve">McIntosh, John S, Wade E. Miller, Kenneth L. Stadtman and David D. Gillette. 1996. The osteology of </w:t>
+      </w:r>
+      <w:r>
+        <w:rPr>
+          <w:i/>
+          <w:iCs/>
+        </w:rPr>
+        <w:t>Camarasaurus lewisi</w:t>
+      </w:r>
+      <w:r>
+        <w:rPr/>
+        <w:t xml:space="preserve"> (Jensen, 1988). </w:t>
+      </w:r>
+      <w:r>
+        <w:rPr>
+          <w:i/>
+          <w:iCs/>
+        </w:rPr>
+        <w:t>Brigham Young University Geology Studies</w:t>
       </w:r>
       <w:r>
         <w:rPr/>
@@ -7859,6 +7478,59 @@
           <w:b/>
           <w:bCs/>
         </w:rPr>
+        <w:t>41</w:t>
+      </w:r>
+      <w:r>
+        <w:rPr/>
+        <w:t>:73–115.</w:t>
+      </w:r>
+    </w:p>
+    <w:p>
+      <w:pPr>
+        <w:pStyle w:val="Reference"/>
+        <w:rPr/>
+      </w:pPr>
+      <w:r>
+        <w:rPr/>
+        <w:t>Merrill, George P. 1922. Letter to William de C. Ravenel on the Carnegie Museum's readiness to release the Dinosaur National Monument quarry. 6 November 1922.</w:t>
+      </w:r>
+    </w:p>
+    <w:p>
+      <w:pPr>
+        <w:pStyle w:val="Reference"/>
+        <w:rPr/>
+      </w:pPr>
+      <w:r>
+        <w:rPr/>
+        <w:t xml:space="preserve">Millard, Ronald W., Harvey B. Lillywhite and Alan R. Hargens. 1992. Cardiovascular system design and </w:t>
+      </w:r>
+      <w:r>
+        <w:rPr>
+          <w:i/>
+          <w:iCs/>
+        </w:rPr>
+        <w:t>Barosaurus</w:t>
+      </w:r>
+      <w:r>
+        <w:rPr/>
+        <w:t xml:space="preserve">. </w:t>
+      </w:r>
+      <w:r>
+        <w:rPr>
+          <w:i/>
+          <w:iCs/>
+        </w:rPr>
+        <w:t>The Lancet</w:t>
+      </w:r>
+      <w:r>
+        <w:rPr/>
+        <w:t xml:space="preserve"> </w:t>
+      </w:r>
+      <w:r>
+        <w:rPr>
+          <w:b/>
+          <w:bCs/>
+        </w:rPr>
         <w:t>340</w:t>
       </w:r>
       <w:r>
@@ -7940,9 +7612,9 @@
       </w:r>
       <w:r>
         <w:rPr/>
-        <w:t xml:space="preserve">:36-41. </w:t>
-      </w:r>
-      <w:hyperlink r:id="rId9">
+        <w:t xml:space="preserve">:36–41. </w:t>
+      </w:r>
+      <w:hyperlink r:id="rId10">
         <w:r>
           <w:rPr>
             <w:rStyle w:val="Hyperlink"/>
@@ -8055,9 +7727,9 @@
       </w:r>
       <w:r>
         <w:rPr/>
-        <w:t xml:space="preserve">:247-387 and plates LX–LXXXV. </w:t>
-      </w:r>
-      <w:hyperlink r:id="rId10">
+        <w:t xml:space="preserve">:247–387 and plates LX–LXXXV. </w:t>
+      </w:r>
+      <w:hyperlink r:id="rId11">
         <w:r>
           <w:rPr>
             <w:rStyle w:val="Hyperlink"/>
@@ -8175,7 +7847,7 @@
       </w:r>
       <w:r>
         <w:rPr/>
-        <w:t xml:space="preserve"> in the Museum für Naturkunde, Berlin: summarizing 70 years of sauropod research. pp. 305-316 in: Nicole Klein, Kristian Remes, Carole T. Gee and Martin P. Sander (eds.), </w:t>
+        <w:t xml:space="preserve"> in the Museum für Naturkunde, Berlin: summarizing 70 years of sauropod research. pp. 305–316 in: Nicole Klein, Kristian Remes, Carole T. Gee and Martin P. Sander (eds.), </w:t>
       </w:r>
       <w:r>
         <w:rPr>
@@ -8269,7 +7941,7 @@
         <w:rPr/>
         <w:t xml:space="preserve">Smith, Adam S. (with contributions from 20 other authors). 2007. Dinosaur Toy Blog. </w:t>
       </w:r>
-      <w:hyperlink r:id="rId11">
+      <w:hyperlink r:id="rId12">
         <w:r>
           <w:rPr>
             <w:rStyle w:val="Hyperlink"/>
@@ -8348,7 +8020,7 @@
       </w:pPr>
       <w:r>
         <w:rPr/>
-        <w:t xml:space="preserve">Taylor, Michael P. 2010. Sauropod dinosaur research: a historical review. pp. 361-386 in: Richard T. J. Moody, Eric Buffetaut, Darren Naish and David M. Martill (eds.), </w:t>
+        <w:t xml:space="preserve">Taylor, Michael P. 2010. Sauropod dinosaur research: a historical review. pp. 361–386 in: Richard T. J. Moody, Eric Buffetaut, Darren Naish and David M. Martill (eds.), </w:t>
       </w:r>
       <w:r>
         <w:rPr>
@@ -8425,7 +8097,7 @@
         <w:rPr/>
         <w:t xml:space="preserve"> from Utah and Colorado, USA. </w:t>
       </w:r>
-      <w:hyperlink r:id="rId12">
+      <w:hyperlink r:id="rId13">
         <w:r>
           <w:rPr>
             <w:rStyle w:val="Hyperlink"/>
@@ -8474,7 +8146,7 @@
       </w:r>
       <w:r>
         <w:rPr/>
-        <w:t>:65-91. doi: 10.31711/giw.v10.pp65-91.</w:t>
+        <w:t>:65–91. doi: 10.31711/giw.v10.pp65-91.</w:t>
       </w:r>
     </w:p>
     <w:p>
@@ -8605,7 +8277,7 @@
         <w:rPr/>
         <w:t xml:space="preserve">:e857. </w:t>
       </w:r>
-      <w:hyperlink r:id="rId13">
+      <w:hyperlink r:id="rId14">
         <w:r>
           <w:rPr>
             <w:rStyle w:val="Hyperlink"/>
@@ -8632,7 +8304,11 @@
       </w:r>
       <w:r>
         <w:rPr/>
-        <w:t xml:space="preserve"> (Dinosauria, Sauropoda) and a revision of camarasaurid taxonomy. 74th Annual Meeting of the Society of Vertebrate Paleontology, Program and Abstracts, 241.</w:t>
+        <w:t xml:space="preserve"> (Dinosauria, Sauropoda) and a revision of camarasaurid taxonomy. 74th Annual Meeting of the Society of Vertebrate Paleontology, Program and Abstracts, 241. </w:t>
+      </w:r>
+      <w:r>
+        <w:rPr/>
+        <w:t>XXXXX is this right?</w:t>
       </w:r>
     </w:p>
     <w:p>
@@ -8783,7 +8459,7 @@
         <w:rPr/>
         <w:t xml:space="preserve">]. Institute of Vertebrate Paleontology and Paleoanthropology Monograph Series I, No. 8:1–30. English translation by W. Downs. </w:t>
       </w:r>
-      <w:hyperlink r:id="rId14">
+      <w:hyperlink r:id="rId15">
         <w:r>
           <w:rPr>
             <w:rStyle w:val="Hyperlink"/>
@@ -8806,6 +8482,7 @@
           <w:ilvl w:val="0"/>
           <w:numId w:val="3"/>
         </w:numPr>
+        <w:spacing w:before="0" w:after="142"/>
         <w:ind w:hanging="0" w:left="0" w:right="0"/>
         <w:rPr/>
       </w:pPr>
@@ -8826,21 +8503,7 @@
           <w:b/>
           <w:bCs/>
         </w:rPr>
-        <w:t xml:space="preserve">Figure </w:t>
-      </w:r>
-      <w:r>
-        <w:rPr>
-          <w:b/>
-          <w:bCs/>
-        </w:rPr>
-        <w:t>1</w:t>
-      </w:r>
-      <w:r>
-        <w:rPr>
-          <w:b/>
-          <w:bCs/>
-        </w:rPr>
-        <w:t>.</w:t>
+        <w:t>Figure 1.</w:t>
       </w:r>
       <w:r>
         <w:rPr>
@@ -8863,35 +8526,7 @@
           <w:b w:val="false"/>
           <w:bCs w:val="false"/>
         </w:rPr>
-        <w:t xml:space="preserve"> AMNH 6341 in the Theodore Roosevelt Rotunda of the American Museum of Natural History, New York, as it appeared after the initial mounting and before repairs to the middle of the neck. </w:t>
-      </w:r>
-      <w:r>
-        <w:rPr>
-          <w:b w:val="false"/>
-          <w:bCs w:val="false"/>
-        </w:rPr>
-        <w:t xml:space="preserve">Photograph provided by </w:t>
-      </w:r>
-      <w:r>
-        <w:rPr>
-          <w:b w:val="false"/>
-          <w:bCs w:val="false"/>
-        </w:rPr>
-        <w:t xml:space="preserve">Department of Vertebrate Paleontology Archive, </w:t>
-      </w:r>
-      <w:r>
-        <w:rPr>
-          <w:b w:val="false"/>
-          <w:bCs w:val="false"/>
-        </w:rPr>
-        <w:t xml:space="preserve">Copyright </w:t>
-      </w:r>
-      <w:r>
-        <w:rPr>
-          <w:b w:val="false"/>
-          <w:bCs w:val="false"/>
-        </w:rPr>
-        <w:t>© AMNH.</w:t>
+        <w:t xml:space="preserve"> AMNH 6341 in the Theodore Roosevelt Rotunda of the American Museum of Natural History, New York, as it appeared after the initial mounting and before repairs to the middle of the neck. Photograph provided by Department of Vertebrate Paleontology Archive, Copyright © AMNH.</w:t>
       </w:r>
     </w:p>
     <w:p>
@@ -9197,7 +8832,23 @@
       </w:r>
       <w:r>
         <w:rPr/>
-        <w:t xml:space="preserve"> mount has only thirteen cervicals, perhaps following Marsh’s (1991) skeletal reconstruction. </w:t>
+        <w:t xml:space="preserve"> mount has only thirteen cervicals, perhaps following Marsh’s (1</w:t>
+      </w:r>
+      <w:r>
+        <w:rPr/>
+        <w:t>8</w:t>
+      </w:r>
+      <w:r>
+        <w:rPr/>
+        <w:t xml:space="preserve">91: </w:t>
+      </w:r>
+      <w:r>
+        <w:rPr/>
+        <w:t>plate XVI</w:t>
+      </w:r>
+      <w:r>
+        <w:rPr/>
+        <w:t xml:space="preserve">) skeletal reconstruction. </w:t>
       </w:r>
       <w:r>
         <w:rPr>
@@ -9231,7 +8882,7 @@
     </w:p>
     <w:p>
       <w:pPr>
-        <w:pStyle w:val="BlockQuotation"/>
+        <w:pStyle w:val="BlockQuotationuser"/>
         <w:rPr/>
       </w:pPr>
       <w:r>
@@ -9264,7 +8915,7 @@
         <w:pStyle w:val="FigureCaption"/>
         <w:widowControl/>
         <w:suppressAutoHyphens w:val="true"/>
-        <w:overflowPunct w:val="false"/>
+        <w:overflowPunct w:val="true"/>
         <w:bidi w:val="0"/>
         <w:spacing w:lineRule="auto" w:line="276" w:before="0" w:after="142"/>
         <w:ind w:hanging="0" w:left="283" w:right="0"/>
@@ -9408,15 +9059,7 @@
       </w:r>
       <w:r>
         <w:rPr/>
-        <w:t xml:space="preserve">, and the base is 44 inches (112 cm) long </w:t>
-      </w:r>
-      <w:r>
-        <w:rPr/>
-        <w:t>(Mick Ellison, pers. comm, 2022</w:t>
-      </w:r>
-      <w:r>
-        <w:rPr/>
-        <w:t>. Despite some notable differences — for example, the model has a much more strongly S-curved neck than the full-size mount, and its forefeet lack digits — the model seems to have been followed fairly closely in composing the final mount, and remains a beautiful object in its own right. Photograph by Mick Ellison (AMNH).</w:t>
+        <w:t>, and the base is 44 inches (112 cm) long (Mick Ellison, pers. comm, 2022. Despite some notable differences — for example, the model has a much more strongly S-curved neck than the full-size mount, and its forefeet lack digits — the model seems to have been followed fairly closely in composing the final mount, and remains a beautiful object in its own right. Photograph by Mick Ellison (AMNH).</w:t>
       </w:r>
     </w:p>
     <w:p>
@@ -9447,23 +9090,7 @@
       </w:r>
       <w:r>
         <w:rPr/>
-        <w:t xml:space="preserve"> AMNH 6341, here seen upside-down in right ventrolateral view. The separator on the mold wall allows the rubber latex for the next mold section to be applied without adhering to the first mold section, so that the mold sections will separate easily. </w:t>
-      </w:r>
-      <w:r>
-        <w:rPr/>
-        <w:t xml:space="preserve">Photograph provided by </w:t>
-      </w:r>
-      <w:r>
-        <w:rPr/>
-        <w:t xml:space="preserve">Department of Vertebrate Paleontology Archive, </w:t>
-      </w:r>
-      <w:r>
-        <w:rPr/>
-        <w:t xml:space="preserve">Copyright </w:t>
-      </w:r>
-      <w:r>
-        <w:rPr/>
-        <w:t>© AMNH.</w:t>
+        <w:t xml:space="preserve"> AMNH 6341, here seen upside-down in right ventrolateral view. The separator on the mold wall allows the rubber latex for the next mold section to be applied without adhering to the first mold section, so that the mold sections will separate easily. Photograph provided by Department of Vertebrate Paleontology Archive, Copyright © AMNH.</w:t>
       </w:r>
     </w:p>
     <w:p>
@@ -9505,15 +9132,7 @@
       </w:r>
       <w:r>
         <w:rPr/>
-        <w:t xml:space="preserve"> left anterolateral view, with three RCI employees working on the anterior part of the neck: one in a cherry-picker, the other two on a scissor lift. That that the two missing cervical vertebra have been added, and that the posterior one is a different colour from the others. The ribs are a noticeably lighter colour than the rest of the skeleton, presumably because they had not been painted at this point. Photograph</w:t>
-      </w:r>
-      <w:r>
-        <w:rPr/>
-        <w:t>s</w:t>
-      </w:r>
-      <w:r>
-        <w:rPr/>
-        <w:t xml:space="preserve"> provided by Department of Vertebrate Paleontology Archive, Copyright © AMNH.</w:t>
+        <w:t xml:space="preserve"> left anterolateral view, with three RCI employees working on the anterior part of the neck: one in a cherry-picker, the other two on a scissor lift. That that the two missing cervical vertebra have been added, and that the posterior one is a different colour from the others. The ribs are a noticeably lighter colour than the rest of the skeleton, presumably because they had not been painted at this point. Photographs provided by Department of Vertebrate Paleontology Archive, Copyright © AMNH.</w:t>
       </w:r>
     </w:p>
     <w:p>
@@ -9533,23 +9152,7 @@
       </w:r>
       <w:r>
         <w:rPr/>
-        <w:t xml:space="preserve"> Part way through the trial mounting process in the parking lot behind the RCI workshop in Spring 1991. In the lift platform, Peter May sets the humerus in place while Jack McIntosh advises on its articulation; and Rick Eyre (back to the camera) looks on. At ground level, Gene Gaffney, Mark Norell and Lowell Dingus (left to right) observe. </w:t>
-      </w:r>
-      <w:r>
-        <w:rPr/>
-        <w:t xml:space="preserve">Photographs provided by </w:t>
-      </w:r>
-      <w:r>
-        <w:rPr/>
-        <w:t xml:space="preserve">Department of Vertebrate Paleontology Archive, </w:t>
-      </w:r>
-      <w:r>
-        <w:rPr/>
-        <w:t xml:space="preserve">Copyright </w:t>
-      </w:r>
-      <w:r>
-        <w:rPr/>
-        <w:t>© AMNH.</w:t>
+        <w:t xml:space="preserve"> Part way through the trial mounting process in the parking lot behind the RCI workshop in Spring 1991. In the lift platform, Peter May sets the humerus in place while Jack McIntosh advises on its articulation; and Rick Eyre (back to the camera) looks on. At ground level, Gene Gaffney, Mark Norell and Lowell Dingus (left to right) observe. Photographs provided by Department of Vertebrate Paleontology Archive, Copyright © AMNH.</w:t>
       </w:r>
     </w:p>
     <w:p>
@@ -9588,195 +9191,55 @@
           <w:b w:val="false"/>
           <w:bCs w:val="false"/>
         </w:rPr>
-        <w:t xml:space="preserve"> skeleton on the floor of the Roosevelt Memorial Hall of the American Museum of Natural History before mounting. Centrally, the skull and cervical vertebrae </w:t>
+        <w:t xml:space="preserve"> skeleton on the floor of the Roosevelt Memorial Hall of the American Museum of Natural History before mounting. Centrally, the skull and cervical vertebrae 3–16, all articulated in a single piece, with the atlas an axis still to be fitted. By the wall to the right are the two halves of the 17th cervical vertebrae: the left half, highlighted in red, with anterior towards the camera; and the right half, highlighted in blue, with anterior facing away. Between these and the neck is the distal (whiplash) portion of a tail: possibly that of the main </w:t>
       </w:r>
       <w:r>
         <w:rPr>
           <w:b w:val="false"/>
           <w:bCs w:val="false"/>
-        </w:rPr>
-        <w:t>3</w:t>
+          <w:i/>
+          <w:iCs/>
+        </w:rPr>
+        <w:t>Barosaurus</w:t>
       </w:r>
       <w:r>
         <w:rPr>
           <w:b w:val="false"/>
           <w:bCs w:val="false"/>
         </w:rPr>
-        <w:t>–1</w:t>
+        <w:t xml:space="preserve">, but more likely that of the juvenile based on the small size of the most proximal caudals. Between this and the neck is section that is probably the proximal part of the </w:t>
       </w:r>
       <w:r>
         <w:rPr>
           <w:b w:val="false"/>
           <w:bCs w:val="false"/>
-        </w:rPr>
-        <w:t>6</w:t>
+          <w:i/>
+          <w:iCs/>
+        </w:rPr>
+        <w:t>Allosaurus</w:t>
       </w:r>
       <w:r>
         <w:rPr>
           <w:b w:val="false"/>
           <w:bCs w:val="false"/>
         </w:rPr>
-        <w:t xml:space="preserve">, all articulated in a single piece, </w:t>
+        <w:t xml:space="preserve"> tail. Finally, intruding on the image from the left is the distal part (whiplash) portion of the other </w:t>
       </w:r>
       <w:r>
         <w:rPr>
           <w:b w:val="false"/>
           <w:bCs w:val="false"/>
-        </w:rPr>
-        <w:t>with the atlas an axis still to be fitted</w:t>
+          <w:i/>
+          <w:iCs/>
+        </w:rPr>
+        <w:t>Barosaurus</w:t>
       </w:r>
       <w:r>
         <w:rPr>
           <w:b w:val="false"/>
           <w:bCs w:val="false"/>
         </w:rPr>
-        <w:t xml:space="preserve">. By the wall to the </w:t>
-      </w:r>
-      <w:r>
-        <w:rPr>
-          <w:b w:val="false"/>
-          <w:bCs w:val="false"/>
-        </w:rPr>
-        <w:t>right</w:t>
-      </w:r>
-      <w:r>
-        <w:rPr>
-          <w:b w:val="false"/>
-          <w:bCs w:val="false"/>
-        </w:rPr>
-        <w:t xml:space="preserve"> are </w:t>
-      </w:r>
-      <w:r>
-        <w:rPr>
-          <w:b w:val="false"/>
-          <w:bCs w:val="false"/>
-        </w:rPr>
-        <w:t xml:space="preserve">the </w:t>
-      </w:r>
-      <w:r>
-        <w:rPr>
-          <w:b w:val="false"/>
-          <w:bCs w:val="false"/>
-        </w:rPr>
-        <w:t xml:space="preserve">two </w:t>
-      </w:r>
-      <w:r>
-        <w:rPr>
-          <w:b w:val="false"/>
-          <w:bCs w:val="false"/>
-        </w:rPr>
-        <w:t xml:space="preserve">halves of the 17th cervical </w:t>
-      </w:r>
-      <w:r>
-        <w:rPr>
-          <w:b w:val="false"/>
-          <w:bCs w:val="false"/>
-        </w:rPr>
-        <w:t xml:space="preserve">vertebrae: </w:t>
-      </w:r>
-      <w:r>
-        <w:rPr>
-          <w:b w:val="false"/>
-          <w:bCs w:val="false"/>
-        </w:rPr>
-        <w:t>the left half, highlighted in red, with anterior towards the camera; and the right half, highlighted in blue, with anterior facing away.</w:t>
-      </w:r>
-      <w:r>
-        <w:rPr>
-          <w:b w:val="false"/>
-          <w:bCs w:val="false"/>
-        </w:rPr>
-        <w:t xml:space="preserve"> Between these and the neck is the distal (whiplash) portion of a tail: possibly that of the main </w:t>
-      </w:r>
-      <w:r>
-        <w:rPr>
-          <w:b w:val="false"/>
-          <w:bCs w:val="false"/>
-          <w:i/>
-          <w:iCs/>
-        </w:rPr>
-        <w:t>Barosaurus</w:t>
-      </w:r>
-      <w:r>
-        <w:rPr>
-          <w:b w:val="false"/>
-          <w:bCs w:val="false"/>
-        </w:rPr>
-        <w:t xml:space="preserve">, but more likely that of the juvenile based on the small size of the most proximal caudals. Between this and the neck is section that is probably the proximal part of the </w:t>
-      </w:r>
-      <w:r>
-        <w:rPr>
-          <w:b w:val="false"/>
-          <w:bCs w:val="false"/>
-          <w:i/>
-          <w:iCs/>
-        </w:rPr>
-        <w:t>Allosaurus</w:t>
-      </w:r>
-      <w:r>
-        <w:rPr>
-          <w:b w:val="false"/>
-          <w:bCs w:val="false"/>
-        </w:rPr>
-        <w:t xml:space="preserve"> tail. Finally, intruding on the image from the </w:t>
-      </w:r>
-      <w:r>
-        <w:rPr>
-          <w:b w:val="false"/>
-          <w:bCs w:val="false"/>
-        </w:rPr>
-        <w:t>left</w:t>
-      </w:r>
-      <w:r>
-        <w:rPr>
-          <w:b w:val="false"/>
-          <w:bCs w:val="false"/>
-        </w:rPr>
-        <w:t xml:space="preserve"> is the distal part (whiplash) portion of the other </w:t>
-      </w:r>
-      <w:r>
-        <w:rPr>
-          <w:b w:val="false"/>
-          <w:bCs w:val="false"/>
-          <w:i/>
-          <w:iCs/>
-        </w:rPr>
-        <w:t>Barosaurus</w:t>
-      </w:r>
-      <w:r>
-        <w:rPr>
-          <w:b w:val="false"/>
-          <w:bCs w:val="false"/>
-        </w:rPr>
-        <w:t xml:space="preserve"> tail, probably that of the adult. </w:t>
-      </w:r>
-      <w:r>
-        <w:rPr>
-          <w:b w:val="false"/>
-          <w:bCs w:val="false"/>
-        </w:rPr>
-        <w:t xml:space="preserve">Photograph provided by </w:t>
-      </w:r>
-      <w:r>
-        <w:rPr>
-          <w:b w:val="false"/>
-          <w:bCs w:val="false"/>
-        </w:rPr>
-        <w:t xml:space="preserve">Department of Vertebrate Paleontology Archive, </w:t>
-      </w:r>
-      <w:r>
-        <w:rPr>
-          <w:b w:val="false"/>
-          <w:bCs w:val="false"/>
-        </w:rPr>
-        <w:t xml:space="preserve">Copyright </w:t>
-      </w:r>
-      <w:r>
-        <w:rPr>
-          <w:b w:val="false"/>
-          <w:bCs w:val="false"/>
-        </w:rPr>
-        <w:t>© AMNH.</w:t>
+        <w:t xml:space="preserve"> tail, probably that of the adult. Photograph provided by Department of Vertebrate Paleontology Archive, Copyright © AMNH.</w:t>
       </w:r>
     </w:p>
     <w:p>
@@ -9796,23 +9259,7 @@
       </w:r>
       <w:r>
         <w:rPr/>
-        <w:t xml:space="preserve"> Two views of the final mounting in the Roosevelt Memorial Hall of the American Museum of Natural History, both showing the use of two frighteningly unstable-looking cherry-picker cranes. The RCI employees in the higher crane are moving the head-and-neck assembly into place, while the two in the lower crane attempt to fit it to the anterior torso. </w:t>
-      </w:r>
-      <w:r>
-        <w:rPr/>
-        <w:t xml:space="preserve">Photograph provided by </w:t>
-      </w:r>
-      <w:r>
-        <w:rPr/>
-        <w:t xml:space="preserve">Department of Vertebrate Paleontology Archive, </w:t>
-      </w:r>
-      <w:r>
-        <w:rPr/>
-        <w:t xml:space="preserve">Copyright </w:t>
-      </w:r>
-      <w:r>
-        <w:rPr/>
-        <w:t>© AMNH.</w:t>
+        <w:t xml:space="preserve"> Two views of the final mounting in the Roosevelt Memorial Hall of the American Museum of Natural History, both showing the use of two frighteningly unstable-looking cherry-picker cranes. The RCI employees in the higher crane are moving the head-and-neck assembly into place, while the two in the lower crane attempt to fit it to the anterior torso. Photograph provided by Department of Vertebrate Paleontology Archive, Copyright © AMNH.</w:t>
       </w:r>
     </w:p>
     <w:p>
@@ -10085,25 +9532,7 @@
           <w:i w:val="false"/>
           <w:iCs w:val="false"/>
         </w:rPr>
-        <w:t>, but that the 8th cervical vertebra of Diplodocus is used in position 7 to give a more even progression of increasing length. Photograph</w:t>
-      </w:r>
-      <w:r>
-        <w:rPr>
-          <w:b w:val="false"/>
-          <w:bCs w:val="false"/>
-          <w:i w:val="false"/>
-          <w:iCs w:val="false"/>
-        </w:rPr>
-        <w:t>s</w:t>
-      </w:r>
-      <w:r>
-        <w:rPr>
-          <w:b w:val="false"/>
-          <w:bCs w:val="false"/>
-          <w:i w:val="false"/>
-          <w:iCs w:val="false"/>
-        </w:rPr>
-        <w:t xml:space="preserve"> provided by Department of Vertebrate Paleontology Archive, Copyright © AMNH.</w:t>
+        <w:t>, but that the 8th cervical vertebra of Diplodocus is used in position 7 to give a more even progression of increasing length. Photographs provided by Department of Vertebrate Paleontology Archive, Copyright © AMNH.</w:t>
       </w:r>
     </w:p>
     <w:p>
@@ -10216,6 +9645,7 @@
     <w:p>
       <w:pPr>
         <w:pStyle w:val="Heading1"/>
+        <w:spacing w:before="0" w:after="142"/>
         <w:rPr/>
       </w:pPr>
       <w:bookmarkStart w:id="35" w:name="__RefHeading___Toc25858_1820571732"/>
@@ -13342,7 +12772,7 @@
     <w:pPr>
       <w:widowControl/>
       <w:suppressAutoHyphens w:val="true"/>
-      <w:overflowPunct w:val="false"/>
+      <w:overflowPunct w:val="true"/>
       <w:bidi w:val="0"/>
       <w:spacing w:before="0" w:after="0"/>
       <w:ind w:hanging="0" w:left="0" w:right="0"/>
@@ -13453,8 +12883,8 @@
     <w:qFormat/>
     <w:rPr/>
   </w:style>
-  <w:style w:type="character" w:styleId="Bullets">
-    <w:name w:val="Bullets"/>
+  <w:style w:type="character" w:styleId="Bulletsuser">
+    <w:name w:val="Bullets (user)"/>
     <w:qFormat/>
     <w:rPr>
       <w:rFonts w:ascii="OpenSymbol" w:hAnsi="OpenSymbol" w:eastAsia="OpenSymbol" w:cs="OpenSymbol"/>
@@ -13579,8 +13009,8 @@
       <w:i/>
     </w:rPr>
   </w:style>
-  <w:style w:type="paragraph" w:styleId="BlockQuotation">
-    <w:name w:val="Block Quotation"/>
+  <w:style w:type="paragraph" w:styleId="BlockQuotationuser">
+    <w:name w:val="Block Quotation (user)"/>
     <w:basedOn w:val="Normal"/>
     <w:qFormat/>
     <w:pPr>

</xml_diff>

<commit_message>
Integrate some but not all proofreading changes
</commit_message>
<xml_diff>
--- a/TaylorEtAl-mounted-barosaurus.docx
+++ b/TaylorEtAl-mounted-barosaurus.docx
@@ -240,21 +240,21 @@
           <w:i w:val="false"/>
           <w:iCs w:val="false"/>
         </w:rPr>
-        <w:t xml:space="preserve">The rearing mount </w:t>
+        <w:t>The rearing mount</w:t>
       </w:r>
       <w:r>
         <w:rPr>
           <w:i w:val="false"/>
           <w:iCs w:val="false"/>
         </w:rPr>
-        <w:t xml:space="preserve">skeleton </w:t>
+        <w:t>ed</w:t>
       </w:r>
       <w:r>
         <w:rPr>
           <w:i w:val="false"/>
           <w:iCs w:val="false"/>
         </w:rPr>
-        <w:t xml:space="preserve">of </w:t>
+        <w:t xml:space="preserve"> skeleton of </w:t>
       </w:r>
       <w:r>
         <w:rPr>
@@ -268,332 +268,119 @@
           <w:i w:val="false"/>
           <w:iCs w:val="false"/>
         </w:rPr>
-        <w:t xml:space="preserve"> in the Roosevelt Memorial Hall of the American Museum of Natural History </w:t>
+        <w:t xml:space="preserve"> in the Roosevelt Memorial Hall of the American Museum of Natural History (AMNH) is among the most culturally influential of all dinosaur exhibits. We review the history of the genus and of AMNH 6341, the specimen on which the mount is principally based. Excavated by Earl Douglass from the Carnegie Quarry at what is now Dinosaur National Monument, this skeleton was di</w:t>
       </w:r>
       <w:r>
         <w:rPr>
           <w:i w:val="false"/>
           <w:iCs w:val="false"/>
         </w:rPr>
-        <w:t xml:space="preserve">(AMNH) </w:t>
+        <w:t xml:space="preserve">vided </w:t>
       </w:r>
       <w:r>
         <w:rPr>
           <w:i w:val="false"/>
           <w:iCs w:val="false"/>
         </w:rPr>
-        <w:t xml:space="preserve">is among the most culturally influential of all dinosaur exhibits. We review the history of the genus and of AMNH 6341, the specimen on which the mount is principally based. Excavated by Earl Douglass from the Carnegie Quarry at what is now Dinosaur National Monument, this skeleton was dispersed between three institutions before Barnum Brown reunited it at the AMNH around 1930. </w:t>
+        <w:t xml:space="preserve">between three institutions before Barnum Brown reunited it at the AMNH around 1930. It was then largely neglected for six decades. We document the conception of the </w:t>
       </w:r>
       <w:r>
         <w:rPr>
           <w:i w:val="false"/>
           <w:iCs w:val="false"/>
         </w:rPr>
-        <w:t>I</w:t>
+        <w:t xml:space="preserve">rearing </w:t>
       </w:r>
       <w:r>
         <w:rPr>
           <w:i w:val="false"/>
           <w:iCs w:val="false"/>
         </w:rPr>
-        <w:t xml:space="preserve">t </w:t>
+        <w:t xml:space="preserve">mount during the 1986–1991 renovation of the fossil halls, when Lowell Dingus and Eugene Gaffney independently arrived at the idea of a rearing sauropod inspired in part by Gregory S. Paul’s painting </w:t>
+      </w:r>
+      <w:r>
+        <w:rPr>
+          <w:i/>
+          <w:iCs/>
+        </w:rPr>
+        <w:t>Ambush at Como Creek</w:t>
       </w:r>
       <w:r>
         <w:rPr>
           <w:i w:val="false"/>
           <w:iCs w:val="false"/>
         </w:rPr>
-        <w:t xml:space="preserve">was then </w:t>
+        <w:t xml:space="preserve">, and the construction of the cast by Research Casting International. At about 15 m, it is the tallest free-standing mounted skeleton in the world. Crucially, the mount’s purpose was not to assert that </w:t>
+      </w:r>
+      <w:r>
+        <w:rPr>
+          <w:i/>
+          <w:iCs/>
+        </w:rPr>
+        <w:t>Barosaurus</w:t>
       </w:r>
       <w:r>
         <w:rPr>
           <w:i w:val="false"/>
           <w:iCs w:val="false"/>
         </w:rPr>
-        <w:t xml:space="preserve">largely </w:t>
+        <w:t xml:space="preserve"> habitually reared, but to provoke visitors to think about what fossils can and cannot tell us about extinct animals. About 80% of the material in the mount </w:t>
       </w:r>
       <w:r>
         <w:rPr>
           <w:i w:val="false"/>
           <w:iCs w:val="false"/>
         </w:rPr>
-        <w:t>neglected</w:t>
+        <w:t>wa</w:t>
       </w:r>
       <w:r>
         <w:rPr>
           <w:i w:val="false"/>
           <w:iCs w:val="false"/>
         </w:rPr>
-        <w:t xml:space="preserve"> for six decades. We document the conception of the mount during the 198</w:t>
+        <w:t xml:space="preserve">s cast from AMNH 6341. </w:t>
       </w:r>
       <w:r>
         <w:rPr>
           <w:i w:val="false"/>
           <w:iCs w:val="false"/>
         </w:rPr>
-        <w:t>6</w:t>
+        <w:t>M</w:t>
       </w:r>
       <w:r>
         <w:rPr>
           <w:i w:val="false"/>
           <w:iCs w:val="false"/>
         </w:rPr>
-        <w:t xml:space="preserve">–1991 renovation </w:t>
+        <w:t xml:space="preserve">ost of the rest cast from second-generation moulds of the Carnegie </w:t>
+      </w:r>
+      <w:r>
+        <w:rPr>
+          <w:i/>
+          <w:iCs/>
+        </w:rPr>
+        <w:t>Diplodocus</w:t>
       </w:r>
       <w:r>
         <w:rPr>
           <w:i w:val="false"/>
           <w:iCs w:val="false"/>
         </w:rPr>
-        <w:t>of the fossil halls</w:t>
+        <w:t xml:space="preserve">, including a third of the neck and </w:t>
       </w:r>
       <w:r>
         <w:rPr>
           <w:i w:val="false"/>
           <w:iCs w:val="false"/>
         </w:rPr>
-        <w:t xml:space="preserve">, when Lowell Dingus and Eugene Gaffney independently arrived at the idea of a rearing sauropod inspired in part by Gregory S. Paul’s painting </w:t>
-      </w:r>
-      <w:r>
-        <w:rPr>
-          <w:i/>
-          <w:iCs/>
-        </w:rPr>
-        <w:t>Ambush at Como Creek</w:t>
+        <w:t xml:space="preserve">some </w:t>
       </w:r>
       <w:r>
         <w:rPr>
           <w:i w:val="false"/>
           <w:iCs w:val="false"/>
         </w:rPr>
-        <w:t xml:space="preserve">, and </w:t>
-      </w:r>
-      <w:r>
-        <w:rPr>
-          <w:i w:val="false"/>
-          <w:iCs w:val="false"/>
-        </w:rPr>
-        <w:t xml:space="preserve">the </w:t>
-      </w:r>
-      <w:r>
-        <w:rPr>
-          <w:i w:val="false"/>
-          <w:iCs w:val="false"/>
-        </w:rPr>
-        <w:t xml:space="preserve">construction </w:t>
-      </w:r>
-      <w:r>
-        <w:rPr>
-          <w:i w:val="false"/>
-          <w:iCs w:val="false"/>
-        </w:rPr>
-        <w:t xml:space="preserve">of </w:t>
-      </w:r>
-      <w:r>
-        <w:rPr>
-          <w:i w:val="false"/>
-          <w:iCs w:val="false"/>
-        </w:rPr>
-        <w:t>the</w:t>
-      </w:r>
-      <w:r>
-        <w:rPr>
-          <w:i w:val="false"/>
-          <w:iCs w:val="false"/>
-        </w:rPr>
-        <w:t xml:space="preserve"> rearing </w:t>
-      </w:r>
-      <w:r>
-        <w:rPr>
-          <w:i w:val="false"/>
-          <w:iCs w:val="false"/>
-        </w:rPr>
-        <w:t xml:space="preserve">cast by Research Casting International. </w:t>
-      </w:r>
-      <w:r>
-        <w:rPr>
-          <w:i w:val="false"/>
-          <w:iCs w:val="false"/>
-        </w:rPr>
-        <w:t>A</w:t>
-      </w:r>
-      <w:r>
-        <w:rPr>
-          <w:i w:val="false"/>
-          <w:iCs w:val="false"/>
-        </w:rPr>
-        <w:t xml:space="preserve">t about 15 m, </w:t>
-      </w:r>
-      <w:r>
-        <w:rPr>
-          <w:i w:val="false"/>
-          <w:iCs w:val="false"/>
-        </w:rPr>
-        <w:t xml:space="preserve">it </w:t>
-      </w:r>
-      <w:r>
-        <w:rPr>
-          <w:i w:val="false"/>
-          <w:iCs w:val="false"/>
-        </w:rPr>
-        <w:t xml:space="preserve">is the tallest free-standing mounted skeleton </w:t>
-      </w:r>
-      <w:r>
-        <w:rPr>
-          <w:i w:val="false"/>
-          <w:iCs w:val="false"/>
-        </w:rPr>
-        <w:t>in the world</w:t>
-      </w:r>
-      <w:r>
-        <w:rPr>
-          <w:i w:val="false"/>
-          <w:iCs w:val="false"/>
-        </w:rPr>
-        <w:t xml:space="preserve">. Crucially, the mount’s purpose was not to assert that </w:t>
-      </w:r>
-      <w:r>
-        <w:rPr>
-          <w:i/>
-          <w:iCs/>
-        </w:rPr>
-        <w:t>Barosaurus</w:t>
-      </w:r>
-      <w:r>
-        <w:rPr>
-          <w:i w:val="false"/>
-          <w:iCs w:val="false"/>
-        </w:rPr>
-        <w:t xml:space="preserve"> habitually reared, but to </w:t>
-      </w:r>
-      <w:r>
-        <w:rPr>
-          <w:i w:val="false"/>
-          <w:iCs w:val="false"/>
-        </w:rPr>
-        <w:t xml:space="preserve">provoke </w:t>
-      </w:r>
-      <w:r>
-        <w:rPr>
-          <w:i w:val="false"/>
-          <w:iCs w:val="false"/>
-        </w:rPr>
-        <w:t xml:space="preserve">visitors </w:t>
-      </w:r>
-      <w:r>
-        <w:rPr>
-          <w:i w:val="false"/>
-          <w:iCs w:val="false"/>
-        </w:rPr>
-        <w:t xml:space="preserve">to think about </w:t>
-      </w:r>
-      <w:r>
-        <w:rPr>
-          <w:i w:val="false"/>
-          <w:iCs w:val="false"/>
-        </w:rPr>
-        <w:t xml:space="preserve">what fossils can and cannot tell us about extinct animals. </w:t>
-      </w:r>
-      <w:r>
-        <w:rPr>
-          <w:i w:val="false"/>
-          <w:iCs w:val="false"/>
-        </w:rPr>
-        <w:t xml:space="preserve">About </w:t>
-      </w:r>
-      <w:r>
-        <w:rPr>
-          <w:i w:val="false"/>
-          <w:iCs w:val="false"/>
-        </w:rPr>
-        <w:t xml:space="preserve">about 80% </w:t>
-      </w:r>
-      <w:r>
-        <w:rPr>
-          <w:i w:val="false"/>
-          <w:iCs w:val="false"/>
-        </w:rPr>
-        <w:t xml:space="preserve">of the material in the mount is cast from </w:t>
-      </w:r>
-      <w:r>
-        <w:rPr>
-          <w:i w:val="false"/>
-          <w:iCs w:val="false"/>
-        </w:rPr>
-        <w:t xml:space="preserve">AMNH 6341, with most of the </w:t>
-      </w:r>
-      <w:r>
-        <w:rPr>
-          <w:i w:val="false"/>
-          <w:iCs w:val="false"/>
-        </w:rPr>
-        <w:t xml:space="preserve">rest </w:t>
-      </w:r>
-      <w:r>
-        <w:rPr>
-          <w:i w:val="false"/>
-          <w:iCs w:val="false"/>
-        </w:rPr>
-        <w:t xml:space="preserve">cast from second-generation moulds of the Carnegie </w:t>
-      </w:r>
-      <w:r>
-        <w:rPr>
-          <w:i/>
-          <w:iCs/>
-        </w:rPr>
-        <w:t>Diplodocus</w:t>
-      </w:r>
-      <w:r>
-        <w:rPr>
-          <w:i w:val="false"/>
-          <w:iCs w:val="false"/>
-        </w:rPr>
-        <w:t xml:space="preserve">, including </w:t>
-      </w:r>
-      <w:r>
-        <w:rPr>
-          <w:i w:val="false"/>
-          <w:iCs w:val="false"/>
-        </w:rPr>
-        <w:t>a third of the neck</w:t>
-      </w:r>
-      <w:r>
-        <w:rPr>
-          <w:i w:val="false"/>
-          <w:iCs w:val="false"/>
-        </w:rPr>
-        <w:t xml:space="preserve"> and residual camarasaurid material in the manus. We summarise the controversy the pose provoked, trace the longer history of rearing sauropods in science and art, and assess the mount’s substantial impact on popular culture.</w:t>
-      </w:r>
-    </w:p>
-    <w:p>
-      <w:pPr>
-        <w:pStyle w:val="Abstract"/>
-        <w:rPr>
-          <w:i w:val="false"/>
-          <w:iCs w:val="false"/>
-        </w:rPr>
-      </w:pPr>
-      <w:r>
-        <w:rPr>
-          <w:i w:val="false"/>
-          <w:iCs w:val="false"/>
-        </w:rPr>
-      </w:r>
-    </w:p>
-    <w:p>
-      <w:pPr>
-        <w:pStyle w:val="Abstract"/>
-        <w:rPr>
-          <w:i w:val="false"/>
-          <w:iCs w:val="false"/>
-        </w:rPr>
-      </w:pPr>
-      <w:r>
-        <w:rPr>
-          <w:i w:val="false"/>
-          <w:iCs w:val="false"/>
-        </w:rPr>
-        <w:t xml:space="preserve">### "", 8.5 m neck estimate. </w:t>
+        <w:t>residual camarasaurid material in the manus. We summarise the controversy the pose provoked, trace the longer history of rearing sauropods in science and art, and assess the mount’s substantial impact on popular culture.</w:t>
       </w:r>
     </w:p>
     <w:p>
@@ -629,7 +416,14 @@
           <w:i w:val="false"/>
           <w:iCs w:val="false"/>
         </w:rPr>
-        <w:t>, sauropod, neck, rearing, skeletal mount</w:t>
+        <w:t xml:space="preserve">, sauropod, neck, rearing, skeletal mount, </w:t>
+      </w:r>
+      <w:r>
+        <w:rPr>
+          <w:i w:val="false"/>
+          <w:iCs w:val="false"/>
+        </w:rPr>
+        <w:t>cast</w:t>
       </w:r>
     </w:p>
     <w:p>
@@ -689,17 +483,16 @@
             </w:rPr>
             <w:fldChar w:fldCharType="separate"/>
           </w:r>
-          <w:r>
-            <w:rPr>
-              <w:rStyle w:val="IndexLink"/>
-            </w:rPr>
-            <w:t>Introduction</w:t>
-          </w:r>
-          <w:r>
-            <w:rPr/>
-            <w:tab/>
-            <w:t>2</w:t>
-          </w:r>
+          <w:hyperlink w:anchor="__RefHeading___Toc3784_1986291683" w:tooltip="Introduction">
+            <w:r>
+              <w:rPr>
+                <w:rStyle w:val="IndexLink"/>
+              </w:rPr>
+              <w:t>Introduction</w:t>
+              <w:tab/>
+              <w:t>2</w:t>
+            </w:r>
+          </w:hyperlink>
         </w:p>
         <w:p>
           <w:pPr>
@@ -710,12 +503,16 @@
             </w:tabs>
             <w:rPr/>
           </w:pPr>
-          <w:r>
-            <w:rPr/>
-            <w:t>Anatomical nomenclature</w:t>
-            <w:tab/>
-            <w:t>3</w:t>
-          </w:r>
+          <w:hyperlink w:anchor="__RefHeading___Toc3323_2187837281" w:tooltip="Anatomical nomenclature">
+            <w:r>
+              <w:rPr>
+                <w:rStyle w:val="IndexLink"/>
+              </w:rPr>
+              <w:t>Anatomical nomenclature</w:t>
+              <w:tab/>
+              <w:t>3</w:t>
+            </w:r>
+          </w:hyperlink>
         </w:p>
         <w:p>
           <w:pPr>
@@ -726,12 +523,16 @@
             </w:tabs>
             <w:rPr/>
           </w:pPr>
-          <w:r>
-            <w:rPr/>
-            <w:t>Institutional abbreviations</w:t>
-            <w:tab/>
-            <w:t>3</w:t>
-          </w:r>
+          <w:hyperlink w:anchor="__RefHeading___Toc5349_68767826" w:tooltip="Institutional abbreviations">
+            <w:r>
+              <w:rPr>
+                <w:rStyle w:val="IndexLink"/>
+              </w:rPr>
+              <w:t>Institutional abbreviations</w:t>
+              <w:tab/>
+              <w:t>3</w:t>
+            </w:r>
+          </w:hyperlink>
         </w:p>
         <w:p>
           <w:pPr>
@@ -742,12 +543,16 @@
             </w:tabs>
             <w:rPr/>
           </w:pPr>
-          <w:r>
-            <w:rPr/>
-            <w:t>Historical background</w:t>
-            <w:tab/>
-            <w:t>3</w:t>
-          </w:r>
+          <w:hyperlink w:anchor="__RefHeading___Toc4316_68767826" w:tooltip="Historical background">
+            <w:r>
+              <w:rPr>
+                <w:rStyle w:val="IndexLink"/>
+              </w:rPr>
+              <w:t>Historical background</w:t>
+              <w:tab/>
+              <w:t>3</w:t>
+            </w:r>
+          </w:hyperlink>
         </w:p>
         <w:p>
           <w:pPr>
@@ -758,22 +563,29 @@
             </w:tabs>
             <w:rPr/>
           </w:pPr>
-          <w:r>
-            <w:rPr/>
-            <w:t xml:space="preserve">Early discoveries of </w:t>
-          </w:r>
-          <w:r>
-            <w:rPr>
-              <w:i/>
-              <w:iCs/>
-            </w:rPr>
-            <w:t>Barosaurus</w:t>
-          </w:r>
-          <w:r>
-            <w:rPr/>
-            <w:tab/>
-            <w:t>3</w:t>
-          </w:r>
+          <w:hyperlink w:anchor="__RefHeading___Toc12350_68767826" w:tooltip="Early discoveries of Barosaurus">
+            <w:r>
+              <w:rPr>
+                <w:rStyle w:val="IndexLink"/>
+              </w:rPr>
+              <w:t xml:space="preserve">Early discoveries of </w:t>
+            </w:r>
+            <w:r>
+              <w:rPr>
+                <w:rStyle w:val="IndexLink"/>
+                <w:i/>
+                <w:iCs/>
+              </w:rPr>
+              <w:t>Barosaurus</w:t>
+            </w:r>
+            <w:r>
+              <w:rPr>
+                <w:rStyle w:val="IndexLink"/>
+              </w:rPr>
+              <w:tab/>
+              <w:t>3</w:t>
+            </w:r>
+          </w:hyperlink>
         </w:p>
         <w:p>
           <w:pPr>
@@ -784,22 +596,29 @@
             </w:tabs>
             <w:rPr/>
           </w:pPr>
-          <w:r>
-            <w:rPr/>
-            <w:t xml:space="preserve">The AMNH specimen of </w:t>
-          </w:r>
-          <w:r>
-            <w:rPr>
-              <w:i/>
-              <w:iCs/>
-            </w:rPr>
-            <w:t>Barosaurus</w:t>
-          </w:r>
-          <w:r>
-            <w:rPr/>
-            <w:tab/>
-            <w:t>4</w:t>
-          </w:r>
+          <w:hyperlink w:anchor="__RefHeading___Toc12352_68767826" w:tooltip="The AMNH specimen of Barosaurus">
+            <w:r>
+              <w:rPr>
+                <w:rStyle w:val="IndexLink"/>
+              </w:rPr>
+              <w:t xml:space="preserve">The AMNH specimen of </w:t>
+            </w:r>
+            <w:r>
+              <w:rPr>
+                <w:rStyle w:val="IndexLink"/>
+                <w:i/>
+                <w:iCs/>
+              </w:rPr>
+              <w:t>Barosaurus</w:t>
+            </w:r>
+            <w:r>
+              <w:rPr>
+                <w:rStyle w:val="IndexLink"/>
+              </w:rPr>
+              <w:tab/>
+              <w:t>4</w:t>
+            </w:r>
+          </w:hyperlink>
         </w:p>
         <w:p>
           <w:pPr>
@@ -810,12 +629,16 @@
             </w:tabs>
             <w:rPr/>
           </w:pPr>
-          <w:r>
-            <w:rPr/>
-            <w:t>The Carnegie Quarry at Dinosaur National Monument</w:t>
-            <w:tab/>
-            <w:t>4</w:t>
-          </w:r>
+          <w:hyperlink w:anchor="__RefHeading___Toc25848_1820571732" w:tooltip="The Carnegie Quarry at Dinosaur National Monument">
+            <w:r>
+              <w:rPr>
+                <w:rStyle w:val="IndexLink"/>
+              </w:rPr>
+              <w:t>The Carnegie Quarry at Dinosaur National Monument</w:t>
+              <w:tab/>
+              <w:t>4</w:t>
+            </w:r>
+          </w:hyperlink>
         </w:p>
         <w:p>
           <w:pPr>
@@ -826,12 +649,16 @@
             </w:tabs>
             <w:rPr/>
           </w:pPr>
-          <w:r>
-            <w:rPr/>
-            <w:t>USNM work at Dinosaur National Monument</w:t>
-            <w:tab/>
-            <w:t>5</w:t>
-          </w:r>
+          <w:hyperlink w:anchor="__RefHeading___Toc25850_1820571732" w:tooltip="USNM work at Dinosaur National Monument">
+            <w:r>
+              <w:rPr>
+                <w:rStyle w:val="IndexLink"/>
+              </w:rPr>
+              <w:t>USNM work at Dinosaur National Monument</w:t>
+              <w:tab/>
+              <w:t>5</w:t>
+            </w:r>
+          </w:hyperlink>
         </w:p>
         <w:p>
           <w:pPr>
@@ -842,12 +669,16 @@
             </w:tabs>
             <w:rPr/>
           </w:pPr>
-          <w:r>
-            <w:rPr/>
-            <w:t>The skeleton reunited</w:t>
-            <w:tab/>
-            <w:t>6</w:t>
-          </w:r>
+          <w:hyperlink w:anchor="__RefHeading___Toc25852_1820571732" w:tooltip="The skeleton reunited">
+            <w:r>
+              <w:rPr>
+                <w:rStyle w:val="IndexLink"/>
+              </w:rPr>
+              <w:t>The skeleton reunited</w:t>
+              <w:tab/>
+              <w:t>6</w:t>
+            </w:r>
+          </w:hyperlink>
         </w:p>
         <w:p>
           <w:pPr>
@@ -858,22 +689,29 @@
             </w:tabs>
             <w:rPr/>
           </w:pPr>
-          <w:r>
-            <w:rPr/>
-            <w:t xml:space="preserve">The AMNH mounted </w:t>
-          </w:r>
-          <w:r>
-            <w:rPr>
-              <w:i/>
-              <w:iCs/>
-            </w:rPr>
-            <w:t>Barosaurus</w:t>
-          </w:r>
-          <w:r>
-            <w:rPr/>
-            <w:tab/>
-            <w:t>7</w:t>
-          </w:r>
+          <w:hyperlink w:anchor="__RefHeading___Toc5351_68767826" w:tooltip="The AMNH mounted Barosaurus">
+            <w:r>
+              <w:rPr>
+                <w:rStyle w:val="IndexLink"/>
+              </w:rPr>
+              <w:t xml:space="preserve">The AMNH mounted </w:t>
+            </w:r>
+            <w:r>
+              <w:rPr>
+                <w:rStyle w:val="IndexLink"/>
+                <w:i/>
+                <w:iCs/>
+              </w:rPr>
+              <w:t>Barosaurus</w:t>
+            </w:r>
+            <w:r>
+              <w:rPr>
+                <w:rStyle w:val="IndexLink"/>
+              </w:rPr>
+              <w:tab/>
+              <w:t>7</w:t>
+            </w:r>
+          </w:hyperlink>
         </w:p>
         <w:p>
           <w:pPr>
@@ -884,12 +722,16 @@
             </w:tabs>
             <w:rPr/>
           </w:pPr>
-          <w:r>
-            <w:rPr/>
-            <w:t>The conception of the mount</w:t>
-            <w:tab/>
-            <w:t>7</w:t>
-          </w:r>
+          <w:hyperlink w:anchor="__RefHeading___Toc5354_68767826" w:tooltip="The conception of the mount">
+            <w:r>
+              <w:rPr>
+                <w:rStyle w:val="IndexLink"/>
+              </w:rPr>
+              <w:t>The conception of the mount</w:t>
+              <w:tab/>
+              <w:t>7</w:t>
+            </w:r>
+          </w:hyperlink>
         </w:p>
         <w:p>
           <w:pPr>
@@ -900,18 +742,23 @@
             </w:tabs>
             <w:rPr/>
           </w:pPr>
-          <w:r>
-            <w:rPr>
-              <w:i w:val="false"/>
-              <w:iCs w:val="false"/>
-            </w:rPr>
-            <w:t>The purpose of the mount</w:t>
-          </w:r>
-          <w:r>
-            <w:rPr/>
-            <w:tab/>
-            <w:t>9</w:t>
-          </w:r>
+          <w:hyperlink w:anchor="__RefHeading___Toc1099_1709072779" w:tooltip="The purpose of the mount">
+            <w:r>
+              <w:rPr>
+                <w:rStyle w:val="IndexLink"/>
+                <w:i w:val="false"/>
+                <w:iCs w:val="false"/>
+              </w:rPr>
+              <w:t>The purpose of the mount</w:t>
+            </w:r>
+            <w:r>
+              <w:rPr>
+                <w:rStyle w:val="IndexLink"/>
+              </w:rPr>
+              <w:tab/>
+              <w:t>9</w:t>
+            </w:r>
+          </w:hyperlink>
         </w:p>
         <w:p>
           <w:pPr>
@@ -922,12 +769,16 @@
             </w:tabs>
             <w:rPr/>
           </w:pPr>
-          <w:r>
-            <w:rPr/>
-            <w:t>The creation of the mount</w:t>
-            <w:tab/>
-            <w:t>9</w:t>
-          </w:r>
+          <w:hyperlink w:anchor="__RefHeading___Toc18297_68767826" w:tooltip="The creation of the mount">
+            <w:r>
+              <w:rPr>
+                <w:rStyle w:val="IndexLink"/>
+              </w:rPr>
+              <w:t>The creation of the mount</w:t>
+              <w:tab/>
+              <w:t>9</w:t>
+            </w:r>
+          </w:hyperlink>
         </w:p>
         <w:p>
           <w:pPr>
@@ -938,12 +789,16 @@
             </w:tabs>
             <w:rPr/>
           </w:pPr>
-          <w:r>
-            <w:rPr/>
-            <w:t>Photography of the mount</w:t>
-            <w:tab/>
-            <w:t>12</w:t>
-          </w:r>
+          <w:hyperlink w:anchor="__RefHeading___Toc5632_2187837281" w:tooltip="Photography of the mount">
+            <w:r>
+              <w:rPr>
+                <w:rStyle w:val="IndexLink"/>
+              </w:rPr>
+              <w:t>Photography of the mount</w:t>
+              <w:tab/>
+              <w:t>12</w:t>
+            </w:r>
+          </w:hyperlink>
         </w:p>
         <w:p>
           <w:pPr>
@@ -954,12 +809,16 @@
             </w:tabs>
             <w:rPr/>
           </w:pPr>
-          <w:r>
-            <w:rPr/>
-            <w:t>The composition of the mount</w:t>
-            <w:tab/>
-            <w:t>13</w:t>
-          </w:r>
+          <w:hyperlink w:anchor="__RefHeading___Toc5356_68767826" w:tooltip="The composition of the mount">
+            <w:r>
+              <w:rPr>
+                <w:rStyle w:val="IndexLink"/>
+              </w:rPr>
+              <w:t>The composition of the mount</w:t>
+              <w:tab/>
+              <w:t>13</w:t>
+            </w:r>
+          </w:hyperlink>
         </w:p>
         <w:p>
           <w:pPr>
@@ -970,12 +829,16 @@
             </w:tabs>
             <w:rPr/>
           </w:pPr>
-          <w:r>
-            <w:rPr/>
-            <w:t>Overview</w:t>
-            <w:tab/>
-            <w:t>13</w:t>
-          </w:r>
+          <w:hyperlink w:anchor="__RefHeading___Toc16585_68767826" w:tooltip="Overview">
+            <w:r>
+              <w:rPr>
+                <w:rStyle w:val="IndexLink"/>
+              </w:rPr>
+              <w:t>Overview</w:t>
+              <w:tab/>
+              <w:t>13</w:t>
+            </w:r>
+          </w:hyperlink>
         </w:p>
         <w:p>
           <w:pPr>
@@ -986,19 +849,24 @@
             </w:tabs>
             <w:rPr/>
           </w:pPr>
-          <w:r>
-            <w:rPr>
-              <w:i/>
-              <w:iCs/>
-            </w:rPr>
-            <w:t>Barosaurus</w:t>
-          </w:r>
-          <w:r>
-            <w:rPr/>
-            <w:t xml:space="preserve"> material in the mount</w:t>
-            <w:tab/>
-            <w:t>13</w:t>
-          </w:r>
+          <w:hyperlink w:anchor="__RefHeading___Toc4995_537823704" w:tooltip="Barosaurus material in the mount">
+            <w:r>
+              <w:rPr>
+                <w:rStyle w:val="IndexLink"/>
+                <w:i/>
+                <w:iCs/>
+              </w:rPr>
+              <w:t>Barosaurus</w:t>
+            </w:r>
+            <w:r>
+              <w:rPr>
+                <w:rStyle w:val="IndexLink"/>
+              </w:rPr>
+              <w:t xml:space="preserve"> material in the mount</w:t>
+              <w:tab/>
+              <w:t>13</w:t>
+            </w:r>
+          </w:hyperlink>
         </w:p>
         <w:p>
           <w:pPr>
@@ -1009,12 +877,30 @@
             </w:tabs>
             <w:rPr/>
           </w:pPr>
-          <w:r>
-            <w:rPr/>
-            <w:t>Non-Barosaurus material in the mount</w:t>
-            <w:tab/>
-            <w:t>15</w:t>
-          </w:r>
+          <w:hyperlink w:anchor="__RefHeading___Toc25854_1820571732" w:tooltip="Non-Barosaurus material in the mount">
+            <w:r>
+              <w:rPr>
+                <w:rStyle w:val="IndexLink"/>
+              </w:rPr>
+              <w:t>Non-</w:t>
+            </w:r>
+            <w:r>
+              <w:rPr>
+                <w:rStyle w:val="IndexLink"/>
+                <w:i/>
+                <w:iCs/>
+              </w:rPr>
+              <w:t>Barosaurus</w:t>
+            </w:r>
+            <w:r>
+              <w:rPr>
+                <w:rStyle w:val="IndexLink"/>
+              </w:rPr>
+              <w:t xml:space="preserve"> material in the mount</w:t>
+              <w:tab/>
+              <w:t>15</w:t>
+            </w:r>
+          </w:hyperlink>
         </w:p>
         <w:p>
           <w:pPr>
@@ -1025,12 +911,16 @@
             </w:tabs>
             <w:rPr/>
           </w:pPr>
-          <w:r>
-            <w:rPr/>
-            <w:t>Skull</w:t>
-            <w:tab/>
-            <w:t>15</w:t>
-          </w:r>
+          <w:hyperlink w:anchor="__RefHeading___Toc16587_68767826" w:tooltip="Skull">
+            <w:r>
+              <w:rPr>
+                <w:rStyle w:val="IndexLink"/>
+              </w:rPr>
+              <w:t>Skull</w:t>
+              <w:tab/>
+              <w:t>15</w:t>
+            </w:r>
+          </w:hyperlink>
         </w:p>
         <w:p>
           <w:pPr>
@@ -1041,12 +931,16 @@
             </w:tabs>
             <w:rPr/>
           </w:pPr>
-          <w:r>
-            <w:rPr/>
-            <w:t>Neck</w:t>
-            <w:tab/>
-            <w:t>15</w:t>
-          </w:r>
+          <w:hyperlink w:anchor="__RefHeading___Toc16589_68767826" w:tooltip="Neck">
+            <w:r>
+              <w:rPr>
+                <w:rStyle w:val="IndexLink"/>
+              </w:rPr>
+              <w:t>Neck</w:t>
+              <w:tab/>
+              <w:t>15</w:t>
+            </w:r>
+          </w:hyperlink>
         </w:p>
         <w:p>
           <w:pPr>
@@ -1057,12 +951,16 @@
             </w:tabs>
             <w:rPr/>
           </w:pPr>
-          <w:r>
-            <w:rPr/>
-            <w:t>Torso, sacrum and tail</w:t>
-            <w:tab/>
-            <w:t>16</w:t>
-          </w:r>
+          <w:hyperlink w:anchor="__RefHeading___Toc2466_2187837281" w:tooltip="Torso, sacrum and tail">
+            <w:r>
+              <w:rPr>
+                <w:rStyle w:val="IndexLink"/>
+              </w:rPr>
+              <w:t>Torso, sacrum and tail</w:t>
+              <w:tab/>
+              <w:t>16</w:t>
+            </w:r>
+          </w:hyperlink>
         </w:p>
         <w:p>
           <w:pPr>
@@ -1073,12 +971,16 @@
             </w:tabs>
             <w:rPr/>
           </w:pPr>
-          <w:r>
-            <w:rPr/>
-            <w:t>Forelimbs and girdles</w:t>
-            <w:tab/>
-            <w:t>17</w:t>
-          </w:r>
+          <w:hyperlink w:anchor="__RefHeading___Toc2470_2187837281" w:tooltip="Forelimbs and girdles">
+            <w:r>
+              <w:rPr>
+                <w:rStyle w:val="IndexLink"/>
+              </w:rPr>
+              <w:t>Forelimbs and girdles</w:t>
+              <w:tab/>
+              <w:t>17</w:t>
+            </w:r>
+          </w:hyperlink>
         </w:p>
         <w:p>
           <w:pPr>
@@ -1089,12 +991,16 @@
             </w:tabs>
             <w:rPr/>
           </w:pPr>
-          <w:r>
-            <w:rPr/>
-            <w:t>Hindlimbs and girdles</w:t>
-            <w:tab/>
-            <w:t>17</w:t>
-          </w:r>
+          <w:hyperlink w:anchor="__RefHeading___Toc25856_1820571732" w:tooltip="Hindlimbs and girdles">
+            <w:r>
+              <w:rPr>
+                <w:rStyle w:val="IndexLink"/>
+              </w:rPr>
+              <w:t>Hindlimbs and girdles</w:t>
+              <w:tab/>
+              <w:t>17</w:t>
+            </w:r>
+          </w:hyperlink>
         </w:p>
         <w:p>
           <w:pPr>
@@ -1105,12 +1011,16 @@
             </w:tabs>
             <w:rPr/>
           </w:pPr>
-          <w:r>
-            <w:rPr/>
-            <w:t>Discussion</w:t>
-            <w:tab/>
-            <w:t>17</w:t>
-          </w:r>
+          <w:hyperlink w:anchor="__RefHeading___Toc3401_68767826" w:tooltip="Discussion">
+            <w:r>
+              <w:rPr>
+                <w:rStyle w:val="IndexLink"/>
+              </w:rPr>
+              <w:t>Discussion</w:t>
+              <w:tab/>
+              <w:t>17</w:t>
+            </w:r>
+          </w:hyperlink>
         </w:p>
         <w:p>
           <w:pPr>
@@ -1121,12 +1031,16 @@
             </w:tabs>
             <w:rPr/>
           </w:pPr>
-          <w:r>
-            <w:rPr/>
-            <w:t>Rearing pose</w:t>
-            <w:tab/>
-            <w:t>17</w:t>
-          </w:r>
+          <w:hyperlink w:anchor="__RefHeading___Toc2476_2187837281" w:tooltip="Rearing pose">
+            <w:r>
+              <w:rPr>
+                <w:rStyle w:val="IndexLink"/>
+              </w:rPr>
+              <w:t>Rearing pose</w:t>
+              <w:tab/>
+              <w:t>17</w:t>
+            </w:r>
+          </w:hyperlink>
         </w:p>
         <w:p>
           <w:pPr>
@@ -1137,12 +1051,16 @@
             </w:tabs>
             <w:rPr/>
           </w:pPr>
-          <w:r>
-            <w:rPr/>
-            <w:t>A short history of rearing sauropods</w:t>
-            <w:tab/>
-            <w:t>19</w:t>
-          </w:r>
+          <w:hyperlink w:anchor="__RefHeading___Toc3786_1986291683" w:tooltip="A short history of rearing sauropods">
+            <w:r>
+              <w:rPr>
+                <w:rStyle w:val="IndexLink"/>
+              </w:rPr>
+              <w:t>A short history of rearing sauropods</w:t>
+              <w:tab/>
+              <w:t>19</w:t>
+            </w:r>
+          </w:hyperlink>
         </w:p>
         <w:p>
           <w:pPr>
@@ -1153,12 +1071,16 @@
             </w:tabs>
             <w:rPr/>
           </w:pPr>
-          <w:r>
-            <w:rPr/>
-            <w:t>Cultural impact</w:t>
-            <w:tab/>
-            <w:t>20</w:t>
-          </w:r>
+          <w:hyperlink w:anchor="__RefHeading___Toc11689_675290491" w:tooltip="Cultural impact">
+            <w:r>
+              <w:rPr>
+                <w:rStyle w:val="IndexLink"/>
+              </w:rPr>
+              <w:t>Cultural impact</w:t>
+              <w:tab/>
+              <w:t>20</w:t>
+            </w:r>
+          </w:hyperlink>
         </w:p>
         <w:p>
           <w:pPr>
@@ -1169,12 +1091,16 @@
             </w:tabs>
             <w:rPr/>
           </w:pPr>
-          <w:r>
-            <w:rPr/>
-            <w:t>Size of the AMNH 6341 animal</w:t>
-            <w:tab/>
-            <w:t>21</w:t>
-          </w:r>
+          <w:hyperlink w:anchor="__RefHeading___Toc21934_68767826" w:tooltip="Size of the AMNH 6341 animal">
+            <w:r>
+              <w:rPr>
+                <w:rStyle w:val="IndexLink"/>
+              </w:rPr>
+              <w:t>Size of the AMNH 6341 animal</w:t>
+              <w:tab/>
+              <w:t>21</w:t>
+            </w:r>
+          </w:hyperlink>
         </w:p>
         <w:p>
           <w:pPr>
@@ -1185,12 +1111,16 @@
             </w:tabs>
             <w:rPr/>
           </w:pPr>
-          <w:r>
-            <w:rPr/>
-            <w:t>Acknowledgements</w:t>
-            <w:tab/>
-            <w:t>22</w:t>
-          </w:r>
+          <w:hyperlink w:anchor="__RefHeading___Toc3403_68767826" w:tooltip="Acknowledgements">
+            <w:r>
+              <w:rPr>
+                <w:rStyle w:val="IndexLink"/>
+              </w:rPr>
+              <w:t>Acknowledgements</w:t>
+              <w:tab/>
+              <w:t>22</w:t>
+            </w:r>
+          </w:hyperlink>
         </w:p>
         <w:p>
           <w:pPr>
@@ -1201,12 +1131,16 @@
             </w:tabs>
             <w:rPr/>
           </w:pPr>
-          <w:r>
-            <w:rPr/>
-            <w:t>References</w:t>
-            <w:tab/>
-            <w:t>23</w:t>
-          </w:r>
+          <w:hyperlink w:anchor="__RefHeading___Toc3405_68767826" w:tooltip="References">
+            <w:r>
+              <w:rPr>
+                <w:rStyle w:val="IndexLink"/>
+              </w:rPr>
+              <w:t>References</w:t>
+              <w:tab/>
+              <w:t>23</w:t>
+            </w:r>
+          </w:hyperlink>
         </w:p>
         <w:p>
           <w:pPr>
@@ -1217,12 +1151,16 @@
             </w:tabs>
             <w:rPr/>
           </w:pPr>
-          <w:r>
-            <w:rPr/>
-            <w:t>Figure Captions</w:t>
-            <w:tab/>
-            <w:t>29</w:t>
-          </w:r>
+          <w:hyperlink w:anchor="__RefHeading___Toc3407_68767826" w:tooltip="Figure Captions">
+            <w:r>
+              <w:rPr>
+                <w:rStyle w:val="IndexLink"/>
+              </w:rPr>
+              <w:t>Figure Captions</w:t>
+              <w:tab/>
+              <w:t>29</w:t>
+            </w:r>
+          </w:hyperlink>
         </w:p>
         <w:p>
           <w:pPr>
@@ -1233,12 +1171,16 @@
             </w:tabs>
             <w:rPr/>
           </w:pPr>
-          <w:r>
-            <w:rPr/>
-            <w:t>Tables</w:t>
-            <w:tab/>
-            <w:t>33</w:t>
-          </w:r>
+          <w:hyperlink w:anchor="__RefHeading___Toc25858_1820571732" w:tooltip="Tables">
+            <w:r>
+              <w:rPr>
+                <w:rStyle w:val="IndexLink"/>
+              </w:rPr>
+              <w:t>Tables</w:t>
+              <w:tab/>
+              <w:t>33</w:t>
+            </w:r>
+          </w:hyperlink>
         </w:p>
         <w:p>
           <w:pPr>
@@ -1249,14 +1191,20 @@
             </w:tabs>
             <w:rPr/>
           </w:pPr>
+          <w:hyperlink w:anchor="__RefHeading___Toc25860_1820571732" w:tooltip="Table 1">
+            <w:r>
+              <w:rPr>
+                <w:rStyle w:val="IndexLink"/>
+              </w:rPr>
+              <w:t>Table 1</w:t>
+              <w:tab/>
+              <w:t>33</w:t>
+            </w:r>
+          </w:hyperlink>
           <w:r>
-            <w:rPr/>
-            <w:t>Table 1</w:t>
-            <w:tab/>
-            <w:t>33</w:t>
-          </w:r>
-          <w:r>
-            <w:rPr/>
+            <w:rPr>
+              <w:rStyle w:val="IndexLink"/>
+            </w:rPr>
             <w:fldChar w:fldCharType="end"/>
           </w:r>
         </w:p>
@@ -1402,7 +1350,15 @@
       </w:r>
       <w:r>
         <w:rPr/>
-        <w:t xml:space="preserve"> (Table 1), and consider the composition of the mounted </w:t>
+        <w:t xml:space="preserve"> (Table 1). </w:t>
+      </w:r>
+      <w:r>
+        <w:rPr/>
+        <w:t>We will</w:t>
+      </w:r>
+      <w:r>
+        <w:rPr/>
+        <w:t xml:space="preserve"> consider the composition of the mounted </w:t>
       </w:r>
       <w:r>
         <w:rPr>
@@ -1446,7 +1402,11 @@
       </w:r>
       <w:r>
         <w:rPr/>
-        <w:t>. We will determine which parts are cast from the main specimen AMNH 6341, and which from other specimens. We will discuss how scaling was calculated and how the pose was decided on, and summarize the controversy generated by the mount.</w:t>
+        <w:t xml:space="preserve">. We will determine which parts are cast from the main specimen AMNH 6341, and which from other specimens. We will discuss how the pose was decided on, summarize the controversy generated by the mount, </w:t>
+      </w:r>
+      <w:r>
+        <w:rPr/>
+        <w:t>survey the history of rearing sauropods, and consider the cultural impact of the AMNH exhibit.</w:t>
       </w:r>
     </w:p>
     <w:p>
@@ -1553,20 +1513,7 @@
           <w:szCs w:val="24"/>
           <w:lang w:val="en-GB" w:eastAsia="zh-CN" w:bidi="hi-IN"/>
         </w:rPr>
-        <w:t xml:space="preserve"> consisting of 16 cervicals and nine dorsals, rather then 15 and 10 as in </w:t>
-      </w:r>
-      <w:r>
-        <w:rPr>
-          <w:rFonts w:eastAsia="Songti SC" w:cs="Arial Unicode MS"/>
-          <w:i/>
-          <w:iCs/>
-          <w:color w:val="auto"/>
-          <w:kern w:val="2"/>
-          <w:sz w:val="24"/>
-          <w:szCs w:val="24"/>
-          <w:lang w:val="en-GB" w:eastAsia="zh-CN" w:bidi="hi-IN"/>
-        </w:rPr>
-        <w:t>Diplodocus</w:t>
+        <w:t xml:space="preserve"> consisting of 16 cervicals and nine dorsals, rather th</w:t>
       </w:r>
       <w:r>
         <w:rPr>
@@ -1577,7 +1524,64 @@
           <w:szCs w:val="24"/>
           <w:lang w:val="en-GB" w:eastAsia="zh-CN" w:bidi="hi-IN"/>
         </w:rPr>
-        <w:t>.</w:t>
+        <w:t>a</w:t>
+      </w:r>
+      <w:r>
+        <w:rPr>
+          <w:rFonts w:eastAsia="Songti SC" w:cs="Arial Unicode MS"/>
+          <w:color w:val="auto"/>
+          <w:kern w:val="2"/>
+          <w:sz w:val="24"/>
+          <w:szCs w:val="24"/>
+          <w:lang w:val="en-GB" w:eastAsia="zh-CN" w:bidi="hi-IN"/>
+        </w:rPr>
+        <w:t xml:space="preserve">n 15 and 10 as in </w:t>
+      </w:r>
+      <w:r>
+        <w:rPr>
+          <w:rFonts w:eastAsia="Songti SC" w:cs="Arial Unicode MS"/>
+          <w:i/>
+          <w:iCs/>
+          <w:color w:val="auto"/>
+          <w:kern w:val="2"/>
+          <w:sz w:val="24"/>
+          <w:szCs w:val="24"/>
+          <w:lang w:val="en-GB" w:eastAsia="zh-CN" w:bidi="hi-IN"/>
+        </w:rPr>
+        <w:t>Diplodocus</w:t>
+      </w:r>
+      <w:r>
+        <w:rPr>
+          <w:rFonts w:eastAsia="Songti SC" w:cs="Arial Unicode MS"/>
+          <w:color w:val="auto"/>
+          <w:kern w:val="2"/>
+          <w:sz w:val="24"/>
+          <w:szCs w:val="24"/>
+          <w:lang w:val="en-GB" w:eastAsia="zh-CN" w:bidi="hi-IN"/>
+        </w:rPr>
+        <w:t xml:space="preserve"> </w:t>
+      </w:r>
+      <w:r>
+        <w:rPr>
+          <w:rFonts w:eastAsia="Songti SC" w:cs="Arial Unicode MS"/>
+          <w:color w:val="auto"/>
+          <w:kern w:val="2"/>
+          <w:sz w:val="24"/>
+          <w:szCs w:val="24"/>
+          <w:lang w:val="en-GB" w:eastAsia="zh-CN" w:bidi="hi-IN"/>
+        </w:rPr>
+        <w:t>(</w:t>
+      </w:r>
+      <w:r>
+        <w:rPr>
+          <w:rFonts w:eastAsia="Songti SC" w:cs="Arial Unicode MS"/>
+          <w:color w:val="auto"/>
+          <w:kern w:val="2"/>
+          <w:sz w:val="24"/>
+          <w:szCs w:val="24"/>
+          <w:lang w:val="en-GB" w:eastAsia="zh-CN" w:bidi="hi-IN"/>
+        </w:rPr>
+        <w:t>although see discussion below).</w:t>
       </w:r>
     </w:p>
     <w:p>
@@ -1649,7 +1653,11 @@
       </w:pPr>
       <w:r>
         <w:rPr/>
-        <w:t>MfN — Museum für Naturkunde Berlin, Berlin, Germany; specimen numbers for fossil reptiles take the form MB.R.</w:t>
+        <w:t>MB</w:t>
+      </w:r>
+      <w:r>
+        <w:rPr/>
+        <w:t xml:space="preserve"> — Museum für Naturkunde Berlin, Berlin, Germany; specimen numbers for fossil reptiles take the form MB.R.</w:t>
       </w:r>
       <w:r>
         <w:rPr>
@@ -1675,7 +1683,7 @@
       </w:pPr>
       <w:r>
         <w:rPr/>
-        <w:t>USNM – United States National Museum, Washington, D.C., USA.</w:t>
+        <w:t>ROM — Royal Ontario Museum, Toronto, Ontario, Canada.</w:t>
       </w:r>
     </w:p>
     <w:p>
@@ -1690,6 +1698,21 @@
       </w:pPr>
       <w:r>
         <w:rPr/>
+        <w:t>USNM – United States National Museum, Washington, D.C., USA.</w:t>
+      </w:r>
+    </w:p>
+    <w:p>
+      <w:pPr>
+        <w:pStyle w:val="BodyText"/>
+        <w:numPr>
+          <w:ilvl w:val="0"/>
+          <w:numId w:val="4"/>
+        </w:numPr>
+        <w:ind w:hanging="360" w:left="720" w:right="0"/>
+        <w:rPr/>
+      </w:pPr>
+      <w:r>
+        <w:rPr/>
         <w:t>YPM — Yale Peabody Museum, New Haven, Connecticut, USA.</w:t>
       </w:r>
     </w:p>
@@ -1844,7 +1867,15 @@
       </w:pPr>
       <w:r>
         <w:rPr/>
-        <w:t xml:space="preserve">However, Marsh died the next year, and work on the specimen stalled. Almost two further decades passed before YPM 429 was fully prepared and Richard S. Lull was able to make a presentation of the specimen at the end of 1916 at the eighth annual meeting of the Paleontological Society in Albany, NY. Unfortunately, his abstract (Lull 1917), at only 74 words in length, is largely uninformative. Subsequently he described the specimen in detail in a significant monograph (Lull 1919), which remained the definitive publication on </w:t>
+        <w:t>However, Marsh died the next year, and work on the specimen stalled. Almost two further decades passed before YPM 429 was fully prepared and Richard S. Lull was able to make a presentation o</w:t>
+      </w:r>
+      <w:r>
+        <w:rPr/>
+        <w:t>n</w:t>
+      </w:r>
+      <w:r>
+        <w:rPr/>
+        <w:t xml:space="preserve"> the specimen at the end of 1916 at the eighth annual meeting of the Paleontological Society in Albany, NY. Unfortunately, his abstract (Lull 1917), at only 74 words in length, is largely uninformative. Subsequently he described the specimen in detail in a significant monograph (Lull 1919), which remained the definitive publication on </w:t>
       </w:r>
       <w:r>
         <w:rPr>
@@ -1897,7 +1928,7 @@
       </w:r>
       <w:r>
         <w:rPr/>
-        <w:t xml:space="preserve"> by Janensch (1922:464), but the complex nomenclatural history of this species can be ignored for our present purposes as it is now regarded as belonging to the separate diplodocine genus </w:t>
+        <w:t xml:space="preserve"> by Janensch (1922:464), but the complex nomenclatural history of this species can be ignored for our present purposes, as it is now regarded as belonging to the separate diplodocine genus </w:t>
       </w:r>
       <w:r>
         <w:rPr>
@@ -2063,7 +2094,7 @@
       </w:r>
       <w:r>
         <w:rPr/>
-        <w:t>. It would subsequently be mounted in the Carnegie Museum in 1913, and described in detail by Gilmore (1936).]</w:t>
+        <w:t>. It would be mounted in the Carnegie Museum in 1913, and described in detail by Gilmore (1936).]</w:t>
       </w:r>
     </w:p>
     <w:p>
@@ -2073,7 +2104,15 @@
       </w:pPr>
       <w:r>
         <w:rPr/>
-        <w:t>As Douglass and his colleagues excavation, it quickly became apparent that there were many more dinosaurs in the rock. Excavating these fossils now became Douglass’s full-time job (Figure 2). The Carnegie Quarry, as it was named, would become one of the most fruitful in palaeontological history. The Museum funded the excavations for 13 years, shipping 700,000 lb of material to Pittsburgh (Gilmore 1936:170) —  318 tonnes.</w:t>
+        <w:t>As Douglass and his colleagues excavat</w:t>
+      </w:r>
+      <w:r>
+        <w:rPr/>
+        <w:t>ed</w:t>
+      </w:r>
+      <w:r>
+        <w:rPr/>
+        <w:t>, it quickly became apparent that there were many more dinosaurs in the rock. Excavating these fossils now became Douglass’s full-time job (Figure 2). The Carnegie Quarry, as it was named, would become one of the most fruitful in palaeontological history. The Museum funded the excavations for 13 years, shipping 700,000 lb of material to Pittsburgh (Gilmore 1936:170) —  318 tonnes.</w:t>
       </w:r>
     </w:p>
     <w:p>
@@ -2112,7 +2151,15 @@
       </w:r>
       <w:r>
         <w:rPr/>
-        <w:t xml:space="preserve"> to the Smithsonian to excavate (Stewart 1922a).</w:t>
+        <w:t xml:space="preserve"> to the </w:t>
+      </w:r>
+      <w:r>
+        <w:rPr/>
+        <w:t>USNM</w:t>
+      </w:r>
+      <w:r>
+        <w:rPr/>
+        <w:t xml:space="preserve"> to excavate (Stewart 1922a).</w:t>
       </w:r>
     </w:p>
     <w:p>
@@ -2132,11 +2179,19 @@
       </w:pPr>
       <w:r>
         <w:rPr/>
-        <w:t>Douglass briefly reported to Merrill the existence of two sauropods in the quarry, by telegram, on 10 November (Douglass 1922a). The next day</w:t>
-      </w:r>
-      <w:r>
-        <w:rPr/>
-        <w:t xml:space="preserve">, Merrill wrote to Earl Douglass requesting technical and logistical information. Douglass replied on 22 November (Douglass 1922b) with a long and helpful letter explaining how two sauropod skeletons, both thought to be </w:t>
+        <w:t xml:space="preserve">In a brief telegram on 10 November, </w:t>
+      </w:r>
+      <w:r>
+        <w:rPr/>
+        <w:t xml:space="preserve">Douglass reported to Merrill the existence of two sauropods in the quarry (Douglass 1922a). The next day, Merrill wrote to Douglass requesting technical and logistical information. Douglass replied on 22 November (Douglass 1922b) with a long and helpful letter explaining how </w:t>
+      </w:r>
+      <w:r>
+        <w:rPr/>
+        <w:t xml:space="preserve">the </w:t>
+      </w:r>
+      <w:r>
+        <w:rPr/>
+        <w:t xml:space="preserve">two sauropod skeletons, both thought to be </w:t>
       </w:r>
       <w:r>
         <w:rPr>
@@ -2147,7 +2202,7 @@
       </w:r>
       <w:r>
         <w:rPr/>
-        <w:t xml:space="preserve">, were positioned — #355 and #340, the former lying partly above the latter (Figure 3); and stating that blocks containing most of the neck of #340 had been taken out of the quarry. </w:t>
+        <w:t xml:space="preserve">, were positioned — #355 and #340, the former lying partly above the latter (Figure 3) — and stating that blocks containing most of the neck of #340 had been taken out of the quarry. </w:t>
       </w:r>
     </w:p>
     <w:p>
@@ -2157,7 +2212,7 @@
       </w:pPr>
       <w:r>
         <w:rPr/>
-        <w:t xml:space="preserve">By the end of the 1922 season, “all but two skeletons — those of </w:t>
+        <w:t>Douglass listed 10 skeletons that had been partly or completely taken out during the year. Among those listed was “No. 340 — </w:t>
       </w:r>
       <w:r>
         <w:rPr>
@@ -2168,7 +2223,7 @@
       </w:r>
       <w:r>
         <w:rPr/>
-        <w:t xml:space="preserve"> — were removed” (Douglass 1923). Douglass listed 10 skeletons that had been partly or completely taken out during the year. Among those listed was “No. 340 — </w:t>
+        <w:t xml:space="preserve">. Apparently nearly complete skeleton but only neck taken out. The remainder still in the ledge” (Douglass 1922c). By the end of the 1922 season, “all but two skeletons — those of </w:t>
       </w:r>
       <w:r>
         <w:rPr>
@@ -2179,15 +2234,7 @@
       </w:r>
       <w:r>
         <w:rPr/>
-        <w:t>. Apparently nearly complete skeleton but only neck taken out. The remainder still in the ledge” (Douglass 1922</w:t>
-      </w:r>
-      <w:r>
-        <w:rPr/>
-        <w:t>c</w:t>
-      </w:r>
-      <w:r>
-        <w:rPr/>
-        <w:t>). Work by the Carnegie crew finished on 1 January 1923 (Osborn 1923).</w:t>
+        <w:t xml:space="preserve"> — were removed” (Douglass 1923). Work by the Carnegie crew finished on 1 January 1923 (Osborn 1923).</w:t>
       </w:r>
     </w:p>
     <w:p>
@@ -2197,7 +2244,15 @@
       </w:pPr>
       <w:r>
         <w:rPr/>
-        <w:t xml:space="preserve">Charles W. Gilmore arrived at the quarry on 14 May 1923 to work it for the USNM and was shown around by Douglass, who was about to leave for Colorado (Gilmore 1923b). Gilmore inherited two partially uncovered skeletons, both then thought to be </w:t>
+        <w:t xml:space="preserve">Charles W. Gilmore arrived at the quarry on 14 May 1923 to work it for the USNM and was shown around by Douglass, who was about to leave for Colorado (Gilmore 1923b). Gilmore inherited </w:t>
+      </w:r>
+      <w:r>
+        <w:rPr/>
+        <w:t xml:space="preserve">the </w:t>
+      </w:r>
+      <w:r>
+        <w:rPr/>
+        <w:t xml:space="preserve">two partially uncovered skeletons, both then thought to be </w:t>
       </w:r>
       <w:r>
         <w:rPr>
@@ -2229,7 +2284,23 @@
       </w:pPr>
       <w:r>
         <w:rPr/>
-        <w:t xml:space="preserve">Douglass handed over to Gilmore four large blocks and several smaller ones containing much of the neck of #340, which had been extracted from the quarry as noted above but not prepared out. It was Gilmore’s intention to extract #355 (the most complete of the two) for the USNM, then secure the parts of #340 necessary to complete the skeleton (Gilmore 1923b). (#355 was subsequently accessioned as USNM 10865 and mounted in Washington D.C, where it remains in the public gallery to this day; missing elements were supplied as plaster casts by the Carnegie Museum). </w:t>
+        <w:t xml:space="preserve">Douglass </w:t>
+      </w:r>
+      <w:r>
+        <w:rPr/>
+        <w:t xml:space="preserve">also </w:t>
+      </w:r>
+      <w:r>
+        <w:rPr/>
+        <w:t>handed over to Gilmore four large blocks and several smaller ones containing much of the neck of #340, which as noted above had been extracted from the quarry but not prepared out. It was Gilmore’s intention to extract #355 (the mo</w:t>
+      </w:r>
+      <w:r>
+        <w:rPr/>
+        <w:t>re</w:t>
+      </w:r>
+      <w:r>
+        <w:rPr/>
+        <w:t xml:space="preserve"> complete of the two) for the USNM, then secure the parts of #340 necessary to complete the skeleton (Gilmore 1923b). (#355 was subsequently accessioned as USNM 10865 and mounted in Washington D.C, where it remains in the public gallery to this day.</w:t>
       </w:r>
     </w:p>
     <w:p>
@@ -2239,7 +2310,15 @@
       </w:pPr>
       <w:r>
         <w:rPr/>
-        <w:t>On 8 August 1923, Gilmore wrote briefly to Ravenel to say that work in the quarry was complete and the extracted blocks would be shipped to the USNM soon after 19 August (Gilmore 1923a), and send a more comprehensive report in 30 August (Gilmore 1923b). In 1924, all excavation at the quarry ended.</w:t>
+        <w:t>On 8 August 1923, Gilmore wrote briefly to Ravenel to say that work in the quarry was complete and the extracted blocks would be shipped to the USNM soon after 19 August (Gilmore 1923a), and sen</w:t>
+      </w:r>
+      <w:r>
+        <w:rPr/>
+        <w:t>t</w:t>
+      </w:r>
+      <w:r>
+        <w:rPr/>
+        <w:t xml:space="preserve"> a more comprehensive report in 30 August (Gilmore 1923b). In 1924, all excavation at the quarry ended.</w:t>
       </w:r>
     </w:p>
     <w:p>
@@ -2249,7 +2328,26 @@
       </w:pPr>
       <w:r>
         <w:rPr/>
-        <w:t>USNM’s only interest in #340 was apparently in using elements of the skeleton to complete #355 for a gallery mount (Gilmore 1923b:1), so only the cervicals, three anterior dorsals, right scapula, humerus and radius and a sternal plate were sent there (Gilmore 1923b:3). Some material of #340 went to the Carnegie Museum:  (Gilmore 1923b:1) wrote that “One block belonging to this specimen was shipped to Pittsburgh, but will, I understand, be turned over to the National Museum as soon as certain bones of another individual are extracted from it”. It seems however that at least three blocks went to Pittsburgh. One, containing part of the neck, was shipped from there to the USNM in October 1924 (Coggeshall 1924); but there were also caudals, which would still be at the Carnegie at the end of 1929: “nine or ten vertebrae in the Carnegie Museum are preserved  in two blocks 348/A and 348/B” (Brown 1929).</w:t>
+        <w:t xml:space="preserve">USNM’s only interest in #340 was apparently in using elements of the skeleton to complete #355 for a gallery mount (Gilmore 1923b:1), so only the cervicals, three anterior dorsals, right scapula, humerus and radius and a sternal plate were sent there (Gilmore 1923b:3). Some material of #340 went to the Carnegie Museum:  Gilmore </w:t>
+      </w:r>
+      <w:r>
+        <w:rPr/>
+        <w:t>(</w:t>
+      </w:r>
+      <w:r>
+        <w:rPr/>
+        <w:t xml:space="preserve">1923b:1) wrote that “One block belonging to this specimen was shipped to Pittsburgh, but will, I understand, be turned over to the National Museum as soon as certain bones of another individual are extracted from it”. It seems however that at least </w:t>
+      </w:r>
+      <w:r>
+        <w:rPr>
+          <w:i/>
+          <w:iCs/>
+        </w:rPr>
+        <w:t>three</w:t>
+      </w:r>
+      <w:r>
+        <w:rPr/>
+        <w:t xml:space="preserve"> blocks went to Pittsburgh. One, containing part of the neck, was shipped from there to the USNM in October 1924 (Coggeshall 1924); but there were also caudals, which would still be at the Carnegie at the end of 1929: “nine or ten vertebrae in the Carnegie Museum are preserved  in two blocks 348/A and 348/B” (Brown 1929).</w:t>
       </w:r>
     </w:p>
     <w:p>
@@ -2259,7 +2357,15 @@
       </w:pPr>
       <w:r>
         <w:rPr/>
-        <w:t>In April 1924, Earl Douglass was offered a position at the University of Utah and resigned his position with Carnegie Museum (Douglass 1879–1953). He excavated the remainder of #340 and sent it to the University of Utah. This left the skeleton now spread across three institutions in Salt Lake City, Pittsburgh, and Washington, D.C. It is perhaps for this reason that, although the portion of the skeleton at the University of Utah was prepared, it was never mounted.</w:t>
+        <w:t xml:space="preserve">In April 1924, Earl Douglass was offered a position at the University of Utah and resigned his position with Carnegie Museum (Douglass 1879–1953). He excavated the remainder of #340 </w:t>
+      </w:r>
+      <w:r>
+        <w:rPr/>
+        <w:t xml:space="preserve">(XXX list material) </w:t>
+      </w:r>
+      <w:r>
+        <w:rPr/>
+        <w:t>and sent it to the University of Utah. This left the skeleton now spread across three institutions in Salt Lake City, Pittsburgh, and Washington, D.C. It is perhaps for this reason that, although the portion of the skeleton at the University of Utah was prepared, it was never mounted.</w:t>
       </w:r>
     </w:p>
     <w:p>
@@ -2269,7 +2375,15 @@
       </w:pPr>
       <w:r>
         <w:rPr/>
-        <w:t xml:space="preserve">The material in Washington was accessioned as USNM 11647 on 11 April 1927 (Abby Telfer, pers. comm., 2025). When it was prepared, what had been thought in the field to be two cervicals proved to be a single long cervical (McIntosh 2005:43). It was then apparent that the cervicals (and the rest of #340) did not belong to </w:t>
+        <w:t xml:space="preserve">The material </w:t>
+      </w:r>
+      <w:r>
+        <w:rPr/>
+        <w:t xml:space="preserve">of #340 </w:t>
+      </w:r>
+      <w:r>
+        <w:rPr/>
+        <w:t xml:space="preserve">in Washington was accessioned as USNM 11647 on 11 April 1927 (Abby Telfer, pers. comm., 2025). When it was prepared, what had been thought in the field to be two cervicals proved to be a single long cervical (McIntosh 2005:43). It was then apparent that the cervicals (and the rest of #340) did not belong to </w:t>
       </w:r>
       <w:r>
         <w:rPr>
@@ -2352,7 +2466,15 @@
       </w:r>
       <w:r>
         <w:rPr/>
-        <w:t xml:space="preserve">, the University of Utah made a cash-plus-fossils deal in which they were paid $2,500 cash plus the equivalent value in fossil mammal specimens (Brown 1929). The process of bringing the skeleton back together dragged on: the thirteen crates of material at the USNM were transported to the AMNH only in February 1933 (Wetmore 1933), perhaps because Wetmore himself — Secretary of the USNM — did “not favour disposal of this </w:t>
+        <w:t xml:space="preserve"> </w:t>
+      </w:r>
+      <w:r>
+        <w:rPr/>
+        <w:t>(AMNH 5428, now USNM 12814),</w:t>
+      </w:r>
+      <w:r>
+        <w:rPr/>
+        <w:t xml:space="preserve"> the University of Utah made a cash-plus-fossils deal in which they were paid $2,500 cash plus the equivalent value in fossil mammal specimens (Brown 1929). The process of bringing the skeleton back together dragged on: the thirteen crates of material at the USNM were transported to the AMNH only in February 1933 (Wetmore 1933), perhaps because Wetmore himself — Secretary of the USNM — did “not favour disposal of this </w:t>
       </w:r>
       <w:r>
         <w:rPr>
@@ -2394,7 +2516,15 @@
       </w:pPr>
       <w:r>
         <w:rPr/>
-        <w:t xml:space="preserve">The issue of the number of cervicals is complex. Gilmore’s count of 13 cervicals is compatible with Douglass’s (1922b:3) report that “the skull and two or three of the anterior cervicals of no. 340 had been detached and were not in place” — an absence that would leave 13 cervicals remaining in an animal with 15 of 16  neck vertebrae. The reduction to 10 in Brown’s list, made after the material had been prepared at USNM, can be explained as a consequence of supposed pairs turning out to be single long vertebrae. This count is also in accord with the quarry map of Gilmore (1932:figure 1; Figure 3). This shows nine dorsals and ten cervicals belonging to the </w:t>
+        <w:t xml:space="preserve">The issue of the number of cervicals is complex. Gilmore’s count of 13 cervicals is compatible with Douglass’s (1922b:3) report that “the skull and two or three of the anterior cervicals of no. 340 had been detached and were not in place” — an absence that would leave 13 cervicals remaining in an animal with 15 of 16  neck vertebrae. The reduction to 10 in Brown’s list, made after the material had been prepared at USNM, can be explained as a consequence of supposed pairs turning out to be single long vertebrae. This </w:t>
+      </w:r>
+      <w:r>
+        <w:rPr/>
+        <w:t xml:space="preserve">lower </w:t>
+      </w:r>
+      <w:r>
+        <w:rPr/>
+        <w:t xml:space="preserve">count is also in accord with the quarry map of Gilmore (1932:figure 1; Figure 3). This shows nine dorsals and ten cervicals belonging to the </w:t>
       </w:r>
       <w:r>
         <w:rPr>
@@ -2405,7 +2535,27 @@
       </w:r>
       <w:r>
         <w:rPr/>
-        <w:t xml:space="preserve"> skeleton (although the line-drawings of the cervicals do not at all resemble the actual vertebrae: compare Figure 4). If the cervical count of ten in the quarry map and Brown’s memo is correct, the most anterior of the cervicals (C7) seems to have been lost or destroyed, since McIntosh’s unpublished 1962 notes, his published account (McIntosh 2005) and the present fossil holdings at the AMNH all include only nine cervical vertebrae, C8–16. Carl Mehling (pers. comm., 2022) has searched in collections for the missing C7 and been unable to locate it. In fact, the C7, if it ever existed, was likely lost or destroyed prior to the 1939 renovation: contemporary photographs (Figure 5B) show the anteriormost cervical vertebra on display, and it is recognizable as the C8 that is the anteriormost currently preserved vertebra.</w:t>
+        <w:t xml:space="preserve"> skeleton (although the line-drawings of the cervicals do not at all resemble the actual vertebrae: compare Figure 4). If the cervical count of ten in the quarry map and Brown’s memo is correct, the most anterior of the cervicals (C7) seems to have been lost or destroyed </w:t>
+      </w:r>
+      <w:r>
+        <w:rPr/>
+        <w:t>some time in the next 30 years</w:t>
+      </w:r>
+      <w:r>
+        <w:rPr/>
+        <w:t xml:space="preserve">, since McIntosh’s unpublished 1962 notes, his published account (McIntosh 2005) and the present fossil holdings at the AMNH all include only nine cervical vertebrae, C8–16. Carl Mehling (pers. comm., 2022) has searched in collections for the missing C7 and been unable to locate it. In fact, the C7, if it ever existed, was likely lost or destroyed prior to the 1939 renovation: photographs </w:t>
+      </w:r>
+      <w:r>
+        <w:rPr/>
+        <w:t xml:space="preserve">from that time </w:t>
+      </w:r>
+      <w:r>
+        <w:rPr/>
+        <w:t xml:space="preserve">(Figure 5B) show the anteriormost cervical vertebra on display, and it is recognizable as the C8 that is the anteriormost currently preserved vertebra; </w:t>
+      </w:r>
+      <w:r>
+        <w:rPr/>
+        <w:t>and the signage that accompanied the exhibit (Figure 6) indicates that nine cervicals were present.</w:t>
       </w:r>
     </w:p>
     <w:p>
@@ -2451,7 +2601,15 @@
       </w:pPr>
       <w:r>
         <w:rPr/>
-        <w:t xml:space="preserve">The three parts of AMNH 6341 had been reunited from their layovers in the USNM, Utah University and Carnegie Museum by 1930 or shortly thereafter. However, having acquired their </w:t>
+        <w:t>The three parts of AMNH 6341 had been reunited from their layovers in the USNM, Utah University and Carnegie Museum by 193</w:t>
+      </w:r>
+      <w:r>
+        <w:rPr/>
+        <w:t>3</w:t>
+      </w:r>
+      <w:r>
+        <w:rPr/>
+        <w:t xml:space="preserve"> or shortly thereafter. However, having acquired their </w:t>
       </w:r>
       <w:r>
         <w:rPr>
@@ -2548,7 +2706,15 @@
       </w:pPr>
       <w:r>
         <w:rPr/>
-        <w:t xml:space="preserve">It occurred to Lowell Dingus, then project director of the fossil halls renovation project, that the most spectacular exhibit would be a gigantic sauropod rearing up on its hind legs. Jack McIntosh told Dingus about the non-neglected </w:t>
+        <w:t xml:space="preserve">It occurred to Lowell Dingus, then project director of the fossil halls renovation project, that the most spectacular exhibit would be a gigantic sauropod rearing up on its hind legs. Jack McIntosh told Dingus about the </w:t>
+      </w:r>
+      <w:r>
+        <w:rPr/>
+        <w:t>long</w:t>
+      </w:r>
+      <w:r>
+        <w:rPr/>
+        <w:t xml:space="preserve">-neglected </w:t>
       </w:r>
       <w:r>
         <w:rPr>
@@ -2636,7 +2802,15 @@
       </w:r>
       <w:r>
         <w:rPr/>
-        <w:t xml:space="preserve"> provides cover for its retreating allies by facing down the pack in a rearing threat display. This initial version of the painting was reproduced in Bird (1985:59), but Paul became dissatisfied with it and painted over parts of the original in 1983 and 1985 to produce the better known final version (Figure 7) in which the attack is by a whole pack of </w:t>
+        <w:t xml:space="preserve"> provides cover for its retreating allies by facing down the </w:t>
+      </w:r>
+      <w:r>
+        <w:rPr/>
+        <w:t>predator</w:t>
+      </w:r>
+      <w:r>
+        <w:rPr/>
+        <w:t xml:space="preserve"> in a rearing threat display. This initial version of the painting was reproduced in Bird (1985:59), but Paul became dissatisfied with it and painted over parts of the original in 1983 and 1985 to produce the better known final version (Figure 7) in which the attack is by a whole pack of </w:t>
       </w:r>
       <w:r>
         <w:rPr>
@@ -2732,7 +2906,15 @@
       </w:pPr>
       <w:r>
         <w:rPr/>
-        <w:t xml:space="preserve">Dr. John (Jack) S. McIntosh, a professor of theoretical physics at Wesleyan University in Connecticut, was an avocational paleontologist specialising in sauropods, and through work done in his spare time became the world’s leading expert on the group. Gaffney knew him from his undergraduate days and when he succeeded Colbert as curator of the AMNH fossil reptile collection in 1970, McIntosh had provided a great deal of information about the AMNH dinosaurs. He told Gaffney that the museum had one of the best known sauropod skeletons in its collection and that he thought it was the then poorly known </w:t>
+        <w:t xml:space="preserve">Dr. John (Jack) S. McIntosh, a professor of theoretical physics at Wesleyan University in Connecticut, was an avocational paleontologist specialising in sauropods, and through work done in his spare time became the world’s leading expert on the group. Gaffney knew him from his undergraduate days and when he succeeded Colbert as curator of the AMNH fossil reptile collection in 1970, McIntosh had provided a great deal of information about the AMNH dinosaurs. He </w:t>
+      </w:r>
+      <w:r>
+        <w:rPr/>
+        <w:t xml:space="preserve">had </w:t>
+      </w:r>
+      <w:r>
+        <w:rPr/>
+        <w:t xml:space="preserve">told Gaffney that the museum had one of the best known sauropod skeletons in its collection and that he thought it was the then poorly known </w:t>
       </w:r>
       <w:r>
         <w:rPr>
@@ -2785,7 +2967,21 @@
           <w:i w:val="false"/>
           <w:iCs w:val="false"/>
         </w:rPr>
-        <w:t xml:space="preserve">While providing a breathtaking first impression of the museum for new visitors, the purpose of the mount extended well beyond the visual power of viewing the tallest free-standing dinosaur mount ever constructed. More importantly, the mount would introduce a major scientific theme that would be integrated into all the fossil halls encompassed in the renovation project: what can we actually know about these long-extinct icons of evolution, and what can’t we know based on the limited kinds of data preserved in their fossils? The exhibition label for the mount clearly stated this conundrum in a section entitled </w:t>
+        <w:t xml:space="preserve">While providing a breathtaking first impression of the museum for new visitors, the purpose of the mount extended well beyond the visual power of viewing the tallest free-standing dinosaur mount ever constructed. More importantly, the mount would introduce a major scientific theme that would be integrated into all the fossil halls encompassed in the renovation project: what can we actually know about extinct </w:t>
+      </w:r>
+      <w:r>
+        <w:rPr>
+          <w:i w:val="false"/>
+          <w:iCs w:val="false"/>
+        </w:rPr>
+        <w:t>animals</w:t>
+      </w:r>
+      <w:r>
+        <w:rPr>
+          <w:i w:val="false"/>
+          <w:iCs w:val="false"/>
+        </w:rPr>
+        <w:t xml:space="preserve">, and what can’t we know based on the limited kinds of data preserved in their fossils? The exhibition label for the mount clearly stated this conundrum in a section entitled </w:t>
       </w:r>
       <w:r>
         <w:rPr>
@@ -2830,7 +3026,7 @@
     </w:p>
     <w:p>
       <w:pPr>
-        <w:pStyle w:val="BlockQuotationuser"/>
+        <w:pStyle w:val="BlockQuotation"/>
         <w:rPr/>
       </w:pPr>
       <w:r>
@@ -2916,7 +3112,31 @@
       </w:pPr>
       <w:r>
         <w:rPr/>
-        <w:t>At the time of the casting-and-mounting project, it was well documented with contracts, architectural drawings, inventories, shipping notes and other documents. But with the passage of more than three decades, nearly all this paperwork has been lost. The retirement of key individuals at the AMNH, including several authors of the present work, resulted in records being moved between offices and ultimately misplaced; and an extensive search of RCI’s archives has turned up little. As a result, nearly all that follows has been assembled from the memories of the individuals involved, supplemented by information from contemporary and near-contemporary accounts such as those of Norell et al. (1991) and Dingus (1996), and what few documents were recovered from AMNH archives.</w:t>
+        <w:t xml:space="preserve">At the time of the casting-and-mounting project, </w:t>
+      </w:r>
+      <w:r>
+        <w:rPr/>
+        <w:t>the process</w:t>
+      </w:r>
+      <w:r>
+        <w:rPr/>
+        <w:t xml:space="preserve"> was well documented with contracts, architectural drawings, inventories, shipping notes and other documents. But with the passage of more than three decades, nearly all this paperwork has been lost. The retirement of key individuals at the AMNH, including several authors of the present work, resulted in records being moved between offices and ultimately misplaced; and an extensive search of RCI’s archives has turned up little. As a result, nearly all that follows has been assembled from the memories of the individuals involved, supplemented by information from contemporary and near-contemporary accounts such as those of Norell et al. (1991) and Dingus (1996), and </w:t>
+      </w:r>
+      <w:r>
+        <w:rPr/>
+        <w:t>the relatively</w:t>
+      </w:r>
+      <w:r>
+        <w:rPr/>
+        <w:t xml:space="preserve"> few documents </w:t>
+      </w:r>
+      <w:r>
+        <w:rPr/>
+        <w:t xml:space="preserve">that </w:t>
+      </w:r>
+      <w:r>
+        <w:rPr/>
+        <w:t>were recovered from AMNH archives.</w:t>
       </w:r>
     </w:p>
     <w:p>
@@ -2947,7 +3167,7 @@
       </w:pPr>
       <w:r>
         <w:rPr/>
-        <w:t xml:space="preserve">On 28 March 1990, an agreement was made between Lowell Dingus, acting for the AMNH, and Peter May and Andrew Leitch, acting for Research Casting International (RCI), to provide the fully mounted and painted cast skeletons of a rearing adult </w:t>
+        <w:t xml:space="preserve">Individual fossilized cervical vertebrae of </w:t>
       </w:r>
       <w:r>
         <w:rPr>
@@ -2958,6 +3178,139 @@
       </w:r>
       <w:r>
         <w:rPr/>
+        <w:t xml:space="preserve"> can mass well over 100 kg, and supporting them in the rearing pose would have required a prohibitively strong armature. Furthermore, permanently mounting these scientifically significant fossils 10 m above ground level, even if logistically feasible, would effectively make them unavailable for study. For these reasons, while the mounted skeletons in the main Fossil Halls of the AMNH are mostly real bone, the Roosevelt Memorial Hall display consists entirely of </w:t>
+      </w:r>
+      <w:r>
+        <w:rPr/>
+        <w:t>replicas</w:t>
+      </w:r>
+      <w:r>
+        <w:rPr/>
+        <w:t>.</w:t>
+      </w:r>
+    </w:p>
+    <w:p>
+      <w:pPr>
+        <w:pStyle w:val="BodyText"/>
+        <w:rPr/>
+      </w:pPr>
+      <w:r>
+        <w:rPr/>
+        <w:t xml:space="preserve">The bones of AMNH 6341, the </w:t>
+      </w:r>
+      <w:r>
+        <w:rPr>
+          <w:i/>
+          <w:iCs/>
+        </w:rPr>
+        <w:t>Barosaurus</w:t>
+      </w:r>
+      <w:r>
+        <w:rPr/>
+        <w:t xml:space="preserve"> specimen that was to provide most of the mount, were in </w:t>
+      </w:r>
+      <w:r>
+        <w:rPr/>
+        <w:t>poor</w:t>
+      </w:r>
+      <w:r>
+        <w:rPr/>
+        <w:t xml:space="preserve"> condition by 1990. The presacral vertebrae, </w:t>
+      </w:r>
+      <w:r>
+        <w:rPr/>
+        <w:t>scapulocoracoid and humerus</w:t>
+      </w:r>
+      <w:r>
+        <w:rPr/>
+        <w:t xml:space="preserve"> had been in collections for the best part of 40 years, since Colbert’s early-1950s renovation; the rest of the bones had been there for 60 years, </w:t>
+      </w:r>
+      <w:r>
+        <w:rPr/>
+        <w:t xml:space="preserve">ever </w:t>
+      </w:r>
+      <w:r>
+        <w:rPr/>
+        <w:t xml:space="preserve">since being reunited by Barnum Brown in 1930. Bones in collections can degrade with time, especially the complex and delicate presacral vertebrae, and it is not unknown for broken-off parts to become separated from the elements they belong to. A program of repair and cleaning was required. As outlined below, about 80% of the skeleton was present. These available </w:t>
+      </w:r>
+      <w:r>
+        <w:rPr>
+          <w:i/>
+          <w:iCs/>
+        </w:rPr>
+        <w:t>Barosaurus</w:t>
+      </w:r>
+      <w:r>
+        <w:rPr/>
+        <w:t xml:space="preserve"> elements were cast, and most of the remainder of the skeleton was taken from a cast of the closely related </w:t>
+      </w:r>
+      <w:r>
+        <w:rPr>
+          <w:i/>
+          <w:iCs/>
+        </w:rPr>
+        <w:t>Diplodocus carnegii</w:t>
+      </w:r>
+      <w:r>
+        <w:rPr/>
+        <w:t xml:space="preserve"> with a few elements sculpted (details below).</w:t>
+      </w:r>
+    </w:p>
+    <w:p>
+      <w:pPr>
+        <w:pStyle w:val="BodyText"/>
+        <w:rPr/>
+      </w:pPr>
+      <w:r>
+        <w:rPr/>
+        <w:t xml:space="preserve">All casting and sculpting was done by Research Casting International </w:t>
+      </w:r>
+      <w:r>
+        <w:rPr/>
+        <w:t>(</w:t>
+      </w:r>
+      <w:r>
+        <w:rPr/>
+        <w:t>RCI</w:t>
+      </w:r>
+      <w:r>
+        <w:rPr/>
+        <w:t>)</w:t>
+      </w:r>
+      <w:r>
+        <w:rPr/>
+        <w:t xml:space="preserve">, an organization specializing in mounting prehistoric animals that had then only recently been established. Founder Peter May had started working with fossil mounts at the Royal Ontario Museum, beginning in 1977, where he learned the techniques from paleontology technician Gordon Gyrmov and former WW2 Luftwaffe rocket-plane test pilot Rudy Zimmermann. May rose to became the head technician at the ROM. Having worked for a while at the Royal Tyrrell Paleontology Museum in Alberta, he found on returning to the ROM that his expertise was in demand from other museums. Initially fitting this outside work into his spare time under the banner of RCI, he went full time with his company in 1990, and the AMNH </w:t>
+      </w:r>
+      <w:r>
+        <w:rPr>
+          <w:i/>
+          <w:iCs/>
+        </w:rPr>
+        <w:t>Barosaurus</w:t>
+      </w:r>
+      <w:r>
+        <w:rPr/>
+        <w:t xml:space="preserve"> was to become their most important early commission. May’s first meeting with Lowell Dingus, Gene Gaffney, Jack MacIntosh and Phil Currie was on 30 January 30 1990 at the AMNH.</w:t>
+      </w:r>
+    </w:p>
+    <w:p>
+      <w:pPr>
+        <w:pStyle w:val="BodyText"/>
+        <w:rPr/>
+      </w:pPr>
+      <w:r>
+        <w:rPr/>
+        <w:t xml:space="preserve">On 28 March 1990, an agreement was made between Lowell Dingus, acting for the AMNH, and Peter May and Andrew Leitch, acting for RCI, to provide the fully mounted and painted cast skeletons of a rearing adult </w:t>
+      </w:r>
+      <w:r>
+        <w:rPr>
+          <w:i/>
+          <w:iCs/>
+        </w:rPr>
+        <w:t>Barosaurus</w:t>
+      </w:r>
+      <w:r>
+        <w:rPr/>
         <w:t xml:space="preserve">, a juvenile, and an </w:t>
       </w:r>
       <w:r>
@@ -3012,7 +3365,7 @@
       </w:pPr>
       <w:r>
         <w:rPr/>
-        <w:t xml:space="preserve">Individual fossilized cervical vertebrae of </w:t>
+        <w:t xml:space="preserve">In the fall 1990, the RCI crew took the repaired and cleaned </w:t>
       </w:r>
       <w:r>
         <w:rPr>
@@ -3023,7 +3376,13 @@
       </w:r>
       <w:r>
         <w:rPr/>
-        <w:t xml:space="preserve"> can mass well over 100 kg, and supporting them in the rearing pose would have required a prohibitively strong armature. Furthermore, permanently mounting these scientifically significant fossils 10 m above ground level, even if logistically feasible, would effectively make them unavailable for study. For these reasons, while the mounted skeletons in the main Fossil Halls of the AMNH are mostly real bone, the Roosevelt Memorial Hall display consists entirely of casts.</w:t>
+        <w:t xml:space="preserve"> fossils in a semi truck from New York to Toronto, where they remained for the best part of a year. There, the bones were duplicated. First, they were coated with latex, which was then cured to form rubber molds (Figure 10). The bones were then cast, first with a layer of gel coat inside the molds, and then in various materials. As noted by </w:t>
+      </w:r>
+      <w:r>
+        <w:rPr>
+          <w:shd w:fill="auto" w:val="clear"/>
+        </w:rPr>
+        <w:t>Norell et al. (1991:38), “Those that would stand near the ground were cast in higher-density and more durable materials, while those higher up were made of lighter substances.”  Specifically, the lower elements were cast in polyester resin and fiberglass with a substantial steel armature, while the dorsal series, ribs and cervicals were cast with a much lighter fiberglass matt and backfilled with polyurethane foam to keep the weight down as low as possible. (Due to the lightness of these elevated elements, the steel armature could be reduced too.)</w:t>
       </w:r>
     </w:p>
     <w:p>
@@ -3033,7 +3392,52 @@
       </w:pPr>
       <w:r>
         <w:rPr/>
-        <w:t xml:space="preserve">The bones of AMNH 6341, the </w:t>
+        <w:t>These accurate replicas of the original fossils, when painted, were indistinguishable from real bone but weighed only a twentieth as much as the fragile and irreplaceable originals. The casts were not “corrected” to account for distortion in the original bones: they are faithful reproductions of what is preserved.</w:t>
+      </w:r>
+    </w:p>
+    <w:p>
+      <w:pPr>
+        <w:pStyle w:val="BodyText"/>
+        <w:rPr/>
+      </w:pPr>
+      <w:r>
+        <w:rPr/>
+        <w:t xml:space="preserve">Most cervical ribs, however, were missing from the original cervical </w:t>
+      </w:r>
+      <w:r>
+        <w:rPr/>
+        <w:t>vertebrae</w:t>
+      </w:r>
+      <w:r>
+        <w:rPr/>
+        <w:t xml:space="preserve">. (These fragile projections are rarely preserved intact.) The missing parts of the skeleton were mostly replaced by elements cast from the Carnegie </w:t>
+      </w:r>
+      <w:r>
+        <w:rPr>
+          <w:i/>
+          <w:iCs/>
+        </w:rPr>
+        <w:t>Diplodocus</w:t>
+      </w:r>
+      <w:r>
+        <w:rPr/>
+        <w:t xml:space="preserve">, though some were fabricated in Toronto. Records do not show exactly which </w:t>
+      </w:r>
+      <w:r>
+        <w:rPr>
+          <w:shd w:fill="auto" w:val="clear"/>
+        </w:rPr>
+        <w:t>bones were sculpted but Peter May was the only sculptor at RCI at the time the skeleton was being prepared, and he does not recall sculpting any elements other than the metacarpals discussed below and possibly some cervical ribs.</w:t>
+      </w:r>
+    </w:p>
+    <w:p>
+      <w:pPr>
+        <w:pStyle w:val="BodyText"/>
+        <w:rPr/>
+      </w:pPr>
+      <w:r>
+        <w:rPr/>
+        <w:t xml:space="preserve">In spring of 1991, a test erection of the rearing </w:t>
       </w:r>
       <w:r>
         <w:rPr>
@@ -3044,7 +3448,7 @@
       </w:r>
       <w:r>
         <w:rPr/>
-        <w:t xml:space="preserve"> specimen that was to provide most of the mount, were not in the best condition by 1990. The presacral vertebrae had been in collections for the best part of 40 years, since Colbert’s early-1950s renovation; the rest of the bones had been there for 60 years, since being reunited by Barnum Brown in 1930. Bones in collections can degrade with time, especially the complex and delicate presacral vertebrae, and it is not unknown for broken-off parts to become separated from the elements they belong to. A program of repair and cleaning was required. As outlined below, about 80% of the skeleton was present. These available </w:t>
+        <w:t xml:space="preserve"> mount was carried out with the aid of a hired crane and 15 m scissor lift (Figure 11). This had to be done in the parking lot behind the RCI workshop, as the completed mount would be too tall to fit inside the workshop. The event was attended by a group from the AMNH, and Jack McIntosh, who had been brought in as a consultant to ensure that the bones were articulated correctly in the mount (Figure 12). Also present were photographers including National Geographic’s Louie Psihoyos, a television crew, at least one observer from another museum, and a crowd of local workers on their lunch-breaks. The skeleton was pieced together from prefabricated sections. The exercise began with the “tripod” of hindlimbs and tail, anchored together at the pelvis, providing a stable base. These were followed by the torso section, then the three sections of the neck and head, and finally the forelimbs. Dingus (1996:25–28) recalled that “the strangest thing was that the mount actually looked rather natural and graceful […] I had always been extremely skeptical about whether sauropods could rear up to such heights, but the grace of the mount almost erased my doubt”. Although the initial assembly of the rearing barosaur had proven successful, another six months would be required before the entire exhibit was ready to assemble in New York, as work was required not only on the main </w:t>
       </w:r>
       <w:r>
         <w:rPr>
@@ -3055,18 +3459,19 @@
       </w:r>
       <w:r>
         <w:rPr/>
-        <w:t xml:space="preserve"> elements were cast, and most of the remainder of the skeleton was taken from a cast of the closely related </w:t>
-      </w:r>
-      <w:r>
-        <w:rPr>
-          <w:i/>
-          <w:iCs/>
-        </w:rPr>
-        <w:t>Diplodocus carnegii</w:t>
-      </w:r>
-      <w:r>
-        <w:rPr/>
-        <w:t xml:space="preserve"> with a few elements sculpted (details below).</w:t>
+        <w:t xml:space="preserve">, but on the juvenile and the </w:t>
+      </w:r>
+      <w:r>
+        <w:rPr>
+          <w:i/>
+          <w:iCs/>
+          <w:u w:val="none"/>
+        </w:rPr>
+        <w:t>Allosaurus</w:t>
+      </w:r>
+      <w:r>
+        <w:rPr/>
+        <w:t>.</w:t>
       </w:r>
     </w:p>
     <w:p>
@@ -3076,7 +3481,7 @@
       </w:pPr>
       <w:r>
         <w:rPr/>
-        <w:t xml:space="preserve">All casting and sculpting was done by RCI, an organization specializing in mounting prehistoric animals that had then only recently been established. Founder Peter May had started working with fossil mounts at the Royal Ontario Museum, beginning in 1977, where he learned the techniques from paleontology technician Gordon Gyrmov and former WW2 Luftwaffe rocket-plane test pilot Rudy Zimmermann. May rose to became the head technician at the ROM. Having worked for a while at the Royal Tyrrell Paleontology Museum in Alberta, he found on returning to the ROM that his expertise was in demand from other museums. Initially fitting this outside work into his spare time under the banner of RCI, he went full time with his company in 1990, and the AMNH </w:t>
+        <w:t xml:space="preserve">To provide the base that the skeletons would be mounted on, fossil-bearing rock was considered appropriate. During the summer of 1991, Gene Gaffney and Peter May searched for a suitable site, finally finding an area that Gaffney was satisfied with by the road just outside the Fort Peck Reservation in northeastern Montana. May and his crew later returned to the site and created peels by spraying a thin layer of latex rubber across the rocks. They returned these to RCI, and used them to make and paint a cast. Ironically, the exposures in this area are from the early Paleocene Fort Union Formation (then the Tullock Formation) (about 65 Mya), meaning that the ground that the mounted </w:t>
       </w:r>
       <w:r>
         <w:rPr>
@@ -3087,7 +3492,18 @@
       </w:r>
       <w:r>
         <w:rPr/>
-        <w:t xml:space="preserve"> was to become their most important early commission. May’s first meeting with Lowell Dingus, Gene Gaffney, Jack MacIntosh and Phil Currie was on 30 January 30 1990 at the AMNH.</w:t>
+        <w:t xml:space="preserve"> stands on dates from after the extinction of the dinosaurs, about 90 million years after the time </w:t>
+      </w:r>
+      <w:r>
+        <w:rPr>
+          <w:i/>
+          <w:iCs/>
+        </w:rPr>
+        <w:t>Barosaurus</w:t>
+      </w:r>
+      <w:r>
+        <w:rPr/>
+        <w:t xml:space="preserve"> lived.</w:t>
       </w:r>
     </w:p>
     <w:p>
@@ -3097,7 +3513,67 @@
       </w:pPr>
       <w:r>
         <w:rPr/>
-        <w:t xml:space="preserve">In the fall 1990, the RCI crew took the repaired and cleaned </w:t>
+        <w:t xml:space="preserve">In November 1991, the work in Toronto was complete, and Blakelock Moving were contracted to ship the completed exhibit in sections for mounting </w:t>
+      </w:r>
+      <w:r>
+        <w:rPr/>
+        <w:t>t</w:t>
+      </w:r>
+      <w:r>
+        <w:rPr/>
+        <w:t>o New York on 7 November (Clark 1991; Figure 13). Unlike the trial mounting in Toronto, when the head and neck were attached in three sections, in New York the three sections were first joined together and then fitted as a unit. This large unit, about nine meters in length, proved awkward to manoeuvre, and it was difficult to raise it to a sufficient height to slide into its slot (Figure 14). It took nearly two hours to wrestle it into place at the front of the rearing torso. Worse, when the mount was finally completed it was imperfect because, when the whole neck had been hanging horizontally, it had bent in the middle at the point of suspension. The resulting kink in the neck can be seen between C1</w:t>
+      </w:r>
+      <w:r>
+        <w:rPr/>
+        <w:t>1</w:t>
+      </w:r>
+      <w:r>
+        <w:rPr/>
+        <w:t xml:space="preserve"> and C1</w:t>
+      </w:r>
+      <w:r>
+        <w:rPr/>
+        <w:t>3</w:t>
+      </w:r>
+      <w:r>
+        <w:rPr/>
+        <w:t xml:space="preserve"> in Figure</w:t>
+      </w:r>
+      <w:r>
+        <w:rPr/>
+        <w:t>s</w:t>
+      </w:r>
+      <w:r>
+        <w:rPr/>
+        <w:t xml:space="preserve"> 1 </w:t>
+      </w:r>
+      <w:r>
+        <w:rPr/>
+        <w:t>and 14B</w:t>
+      </w:r>
+      <w:r>
+        <w:rPr/>
+        <w:t xml:space="preserve"> and in other contemporary photos such as those of Dingus (1996:26) and Lindsay (1992:18–20). It was soon corrected, however, in a near-disastrous but ultimately successful late-night operation (Dingus 1996:28), and the line of the neck is smooth and elegant in the mount as it is today.</w:t>
+      </w:r>
+    </w:p>
+    <w:p>
+      <w:pPr>
+        <w:pStyle w:val="BodyText"/>
+        <w:rPr/>
+      </w:pPr>
+      <w:r>
+        <w:rPr/>
+        <w:t>Lindsay (1992:14–19) provides a vivid illustrated account of the molding, casting and mounting of the skeleton, with photographs by Lynton Gardiner (see below). This book also contains the best published photographs of some of the fossil material, e.g. a posterior cervical vertebra in left lateral view (p11), posterior cervical and posterior dorsal vertebrae in anterior views and right pubis in lateral view (p12), articulated sequence of cast dorsals and posterior cervicals in right lateral view (p18–19).</w:t>
+      </w:r>
+    </w:p>
+    <w:p>
+      <w:pPr>
+        <w:pStyle w:val="BodyText"/>
+        <w:rPr/>
+      </w:pPr>
+      <w:r>
+        <w:rPr/>
+        <w:t xml:space="preserve">The exhibit — rearing adult and hiding juvenile </w:t>
       </w:r>
       <w:r>
         <w:rPr>
@@ -3108,13 +3584,52 @@
       </w:r>
       <w:r>
         <w:rPr/>
-        <w:t xml:space="preserve"> fossils in a semi truck from New York to Toronto, where they remained for the best part of a year. There, the bones were duplicated. First, they were coated with latex, which was then cured to form rubber molds (Figure 10). The bones were then cast, first with a layer of gel coat inside the molds, and then in various materials. As noted by </w:t>
-      </w:r>
-      <w:r>
-        <w:rPr>
-          <w:shd w:fill="auto" w:val="clear"/>
-        </w:rPr>
-        <w:t>Norell et al. (1991:38), “Those that would stand near the ground were cast in higher-density and more durable materials, while those higher up were made of lighter substances.”  Specifically, the lower elements were cast in polyester resin and fiberglass with a substantial steel armature, while the dorsal series, ribs and cervicals were cast with a much lighter fiberglass matt and backfilled with polyurethane foam to keep the weight down as low as possible. (Due to the lightness of these elevated elements, the steel armature could be reduced too.)</w:t>
+        <w:t xml:space="preserve">, and running </w:t>
+      </w:r>
+      <w:r>
+        <w:rPr>
+          <w:i/>
+          <w:iCs/>
+        </w:rPr>
+        <w:t>Allosaurus</w:t>
+      </w:r>
+      <w:r>
+        <w:rPr/>
+        <w:t xml:space="preserve"> — was unveiled to select guests on Tuesday 3 December 1991 (Anonymous 1991) and opened to the public on Wednesday 4 December 1991 (Gordy 1991, Collins 1991). Press coverage was extensive, not only in local publications such as </w:t>
+      </w:r>
+      <w:r>
+        <w:rPr>
+          <w:i/>
+          <w:iCs/>
+        </w:rPr>
+        <w:t>New York Newsday</w:t>
+      </w:r>
+      <w:r>
+        <w:rPr/>
+        <w:t xml:space="preserve"> (Gordy 1991) but also in national publications such as the </w:t>
+      </w:r>
+      <w:r>
+        <w:rPr>
+          <w:i/>
+          <w:iCs/>
+          <w:u w:val="none"/>
+        </w:rPr>
+        <w:t>Washington Post</w:t>
+      </w:r>
+      <w:r>
+        <w:rPr/>
+        <w:t xml:space="preserve"> (Associated Press 1991) and </w:t>
+      </w:r>
+      <w:r>
+        <w:rPr>
+          <w:i/>
+          <w:iCs/>
+        </w:rPr>
+        <w:t>Newsweek</w:t>
+      </w:r>
+      <w:r>
+        <w:rPr/>
+        <w:t xml:space="preserve"> (Begley and Yoffe 1991), and abroad in countries including Germany and Japan.</w:t>
       </w:r>
     </w:p>
     <w:p>
@@ -3124,7 +3639,40 @@
       </w:pPr>
       <w:r>
         <w:rPr/>
-        <w:t>These accurate replicas of the original fossils, when painted, were indistinguishable from real bone but weighed only a twentieth as much as the fragile and irreplaceable originals. The casts were not “corrected” to account for distortion in the original bones: they are faithful reproductions of what is preserved.</w:t>
+        <w:t xml:space="preserve">It was at that time the only publicly exhibited </w:t>
+      </w:r>
+      <w:r>
+        <w:rPr>
+          <w:i/>
+          <w:iCs/>
+        </w:rPr>
+        <w:t>Barosaurus</w:t>
+      </w:r>
+      <w:r>
+        <w:rPr/>
+        <w:t xml:space="preserve"> in the world (Norell et al. 1991:36), although additional mounts have since been erected at the Royal Ontario Museum in Toronto, Canada, and the Natural History Museum of Utah in Salt Lake City. Also included in the exhibit, in a case next to the mounted skeletons, were the real 13th cervical of AMNH 6341, and the partial skull and neck AMNH 7530, which the juvenile mounted skeleton had been partially based on. (That skull and neck, thought in the 1990s to belong to </w:t>
+      </w:r>
+      <w:r>
+        <w:rPr>
+          <w:i/>
+          <w:iCs/>
+        </w:rPr>
+        <w:t>Barosaurus</w:t>
+      </w:r>
+      <w:r>
+        <w:rPr/>
+        <w:t xml:space="preserve">, were referred to the closely related diplodocine </w:t>
+      </w:r>
+      <w:r>
+        <w:rPr>
+          <w:i/>
+          <w:iCs/>
+        </w:rPr>
+        <w:t>Kaatedocus siberi</w:t>
+      </w:r>
+      <w:r>
+        <w:rPr/>
+        <w:t xml:space="preserve"> by Tschopp et al. (2015:220).) The juvenile skull and neck are, at the time of writing, on exhibit in the Miriam and Ira D. Wallach Orientation Hall.</w:t>
       </w:r>
     </w:p>
     <w:p>
@@ -3134,238 +3682,6 @@
       </w:pPr>
       <w:r>
         <w:rPr/>
-        <w:t xml:space="preserve">Most cervical ribs, however, were missing from the original cervical material. (These fragile projections are rarely preserved intact.) The missing parts of the skeleton were mostly replaced by elements cast from the Carnegie </w:t>
-      </w:r>
-      <w:r>
-        <w:rPr>
-          <w:i/>
-          <w:iCs/>
-        </w:rPr>
-        <w:t>Diplodocus</w:t>
-      </w:r>
-      <w:r>
-        <w:rPr/>
-        <w:t xml:space="preserve">, though some were fabricated in Toronto. Records do not show exactly which </w:t>
-      </w:r>
-      <w:r>
-        <w:rPr>
-          <w:shd w:fill="auto" w:val="clear"/>
-        </w:rPr>
-        <w:t>bones were sculpted but Peter May was the only sculptor at RCI at the time the skeleton was being prepared, and he does not recall sculpting any elements other than the metacarpals discussed below and possibly some cervical ribs.</w:t>
-      </w:r>
-    </w:p>
-    <w:p>
-      <w:pPr>
-        <w:pStyle w:val="BodyText"/>
-        <w:rPr/>
-      </w:pPr>
-      <w:r>
-        <w:rPr/>
-        <w:t xml:space="preserve">In spring of 1991, a test erection of the rearing </w:t>
-      </w:r>
-      <w:r>
-        <w:rPr>
-          <w:i/>
-          <w:iCs/>
-        </w:rPr>
-        <w:t>Barosaurus</w:t>
-      </w:r>
-      <w:r>
-        <w:rPr/>
-        <w:t xml:space="preserve"> mount was carried out with the aid of a hired crane and 15 m scissor lift (Figure 11). This had to be done in the parking lot behind the RCI workshop, as the completed mount would be too tall to fit inside the workshop. The event was attended by a group from the AMNH, and Jack McIntosh, who had been brought in as a consultant to ensure that the bones were articulated correctly in the mount (Figure 12). Also present were photographers including National Geographic’s Louie Psihoyos, a television crew, at least one observer from another museum, and a crowd of local workers on their lunch-breaks. The skeleton was pieced together from prefabricated sections. The exercise began with the “tripod” of hindlimbs and tail, anchored together at the pelvis, providing a stable base. These were followed by the torso section, then the three sections of the neck and head, and finally the forelimbs. Dingus (1996:25–28) recalled that “the strangest thing was that the mount actually looked rather natural and graceful […] I had always been extremely skeptical about whether sauropods could rear up to such heights, but the grace of the mount almost erased my doubt”. Although the initial assembly of the rearing barosaur had proven successful, another six months would be required before the entire exhibit was ready to assemble in New York, as work was required not only on the main </w:t>
-      </w:r>
-      <w:r>
-        <w:rPr>
-          <w:i/>
-          <w:iCs/>
-        </w:rPr>
-        <w:t>Barosaurus</w:t>
-      </w:r>
-      <w:r>
-        <w:rPr/>
-        <w:t xml:space="preserve">, but on the juvenile and the </w:t>
-      </w:r>
-      <w:r>
-        <w:rPr>
-          <w:i/>
-          <w:iCs/>
-          <w:u w:val="none"/>
-        </w:rPr>
-        <w:t>Allosaurus</w:t>
-      </w:r>
-      <w:r>
-        <w:rPr/>
-        <w:t>.</w:t>
-      </w:r>
-    </w:p>
-    <w:p>
-      <w:pPr>
-        <w:pStyle w:val="BodyText"/>
-        <w:rPr/>
-      </w:pPr>
-      <w:r>
-        <w:rPr/>
-        <w:t xml:space="preserve">To provide the base that the skeletons would be mounted on, fossil-bearing rock was considered appropriate. During the summer of 1991, Gene Gaffney and Peter May searched for a suitable site, finally finding an area that Gaffney was satisfied with by the road just outside the Fort Peck Reservation in northeastern Montana. May and his crew later returned to the site and created peels by spraying a thin layer of latex rubber across the rocks. They returned these to RCI, and used them to make and paint a cast. Ironically, the exposures in this area are from the early Paleocene Fort Union Formation (then the Tullock Formation) (about 65 Mya), meaning that the ground that the mounted </w:t>
-      </w:r>
-      <w:r>
-        <w:rPr>
-          <w:i/>
-          <w:iCs/>
-        </w:rPr>
-        <w:t>Barosaurus</w:t>
-      </w:r>
-      <w:r>
-        <w:rPr/>
-        <w:t xml:space="preserve"> stands on dates from after the extinction of the dinosaurs, about 90 million years after the time </w:t>
-      </w:r>
-      <w:r>
-        <w:rPr>
-          <w:i/>
-          <w:iCs/>
-        </w:rPr>
-        <w:t>Barosaurus</w:t>
-      </w:r>
-      <w:r>
-        <w:rPr/>
-        <w:t xml:space="preserve"> lived.</w:t>
-      </w:r>
-    </w:p>
-    <w:p>
-      <w:pPr>
-        <w:pStyle w:val="BodyText"/>
-        <w:rPr/>
-      </w:pPr>
-      <w:r>
-        <w:rPr/>
-        <w:t>In November 1991, the work in Toronto was complete, and Blakelock Moving were contracted to ship the completed exhibit to New York on 7 November (Clark 1991), in sections for mounting (Figure 13). Unlike the trial mounting in Toronto, when the head and neck were attached in three sections, in New York the three sections were first joined together and then fitted as a unit. This large unit, about nine meters in length, proved awkward to manoeuvre, and it was difficult to raise it to a sufficient height to slide into its slot (Figure 14). It took nearly two hours to wrestle it into place at the front of the rearing torso. Worse, when the mount was finally completed it was imperfect because, when the whole neck had been hanging horizontally, it had bent in the middle at the point of suspension. The resulting kink in the neck can be seen between C10 and C11 in Figure 1 and in other contemporary photos such as those of Dingus (1996:26) and Lindsay (1992:18–20). It was soon corrected, however, in a near-disastrous but ultimately successful late-night operation (Dingus 1996:28), and the line of the neck is smooth and elegant in the mount as it is today.</w:t>
-      </w:r>
-    </w:p>
-    <w:p>
-      <w:pPr>
-        <w:pStyle w:val="BodyText"/>
-        <w:rPr/>
-      </w:pPr>
-      <w:r>
-        <w:rPr/>
-        <w:t>Lindsay (1992:14–19) provides a vivid illustrated account of the molding, casting and mounting of the skeleton, with photographs by Lynton Gardiner (see below). This book also contains the best published photographs of some of the fossil material, e.g. a posterior cervical vertebra in left lateral view (p11), posterior cervical and posterior dorsal vertebrae in anterior views and right pubis in lateral view (p12), articulated sequence of cast dorsals and posterior cervicals in right lateral view (p18–19).</w:t>
-      </w:r>
-    </w:p>
-    <w:p>
-      <w:pPr>
-        <w:pStyle w:val="BodyText"/>
-        <w:rPr/>
-      </w:pPr>
-      <w:r>
-        <w:rPr/>
-        <w:t xml:space="preserve">The exhibit — rearing adult and hiding juvenile </w:t>
-      </w:r>
-      <w:r>
-        <w:rPr>
-          <w:i/>
-          <w:iCs/>
-        </w:rPr>
-        <w:t>Barosaurus</w:t>
-      </w:r>
-      <w:r>
-        <w:rPr/>
-        <w:t xml:space="preserve">, and running </w:t>
-      </w:r>
-      <w:r>
-        <w:rPr>
-          <w:i/>
-          <w:iCs/>
-        </w:rPr>
-        <w:t>Allosaurus</w:t>
-      </w:r>
-      <w:r>
-        <w:rPr/>
-        <w:t xml:space="preserve"> — was unveiled to select guests on Tuesday 3 December 1991 (Anonymous 1991) and opened to the public on Wednesday 4 December 1991 (Gordy 1991, Collins 1991). Press coverage was extensive, not only in local publications such as </w:t>
-      </w:r>
-      <w:r>
-        <w:rPr>
-          <w:i/>
-          <w:iCs/>
-        </w:rPr>
-        <w:t>New York Newsday</w:t>
-      </w:r>
-      <w:r>
-        <w:rPr/>
-        <w:t xml:space="preserve"> (Gordy 1991) but also in national publications such as the </w:t>
-      </w:r>
-      <w:r>
-        <w:rPr>
-          <w:i/>
-          <w:iCs/>
-          <w:u w:val="none"/>
-        </w:rPr>
-        <w:t>Washington Post</w:t>
-      </w:r>
-      <w:r>
-        <w:rPr/>
-        <w:t xml:space="preserve"> (Associated Press 1991) and </w:t>
-      </w:r>
-      <w:r>
-        <w:rPr>
-          <w:i/>
-          <w:iCs/>
-        </w:rPr>
-        <w:t>Newsweek</w:t>
-      </w:r>
-      <w:r>
-        <w:rPr/>
-        <w:t xml:space="preserve"> (Begley and Yoffe 1991), and abroad in countries including Germany and Japan.</w:t>
-      </w:r>
-    </w:p>
-    <w:p>
-      <w:pPr>
-        <w:pStyle w:val="BodyText"/>
-        <w:rPr/>
-      </w:pPr>
-      <w:r>
-        <w:rPr/>
-        <w:t xml:space="preserve">It was at that time the only publicly exhibited </w:t>
-      </w:r>
-      <w:r>
-        <w:rPr>
-          <w:i/>
-          <w:iCs/>
-        </w:rPr>
-        <w:t>Barosaurus</w:t>
-      </w:r>
-      <w:r>
-        <w:rPr/>
-        <w:t xml:space="preserve"> in the world (Norell et al. 1991:36), although additional mounts have since been erected at the Royal Ontario Museum in Toronto, Canada, and the Natural History Museum of Utah in Salt Lake City. Also included in the exhibit, in a case next to the mounted skeletons, were the real 13th cervical of AMNH 6341, and the partial skull and neck AMNH 7530, which the juvenile mounted skeleton had been partially based on. (That skull and neck, thought in the 1990s to belong to </w:t>
-      </w:r>
-      <w:r>
-        <w:rPr>
-          <w:i/>
-          <w:iCs/>
-        </w:rPr>
-        <w:t>Barosaurus</w:t>
-      </w:r>
-      <w:r>
-        <w:rPr/>
-        <w:t xml:space="preserve">, were referred to the closely related diplodocine </w:t>
-      </w:r>
-      <w:r>
-        <w:rPr>
-          <w:i/>
-          <w:iCs/>
-        </w:rPr>
-        <w:t>Kaatedocus siberi</w:t>
-      </w:r>
-      <w:r>
-        <w:rPr/>
-        <w:t xml:space="preserve"> by Tschopp et al. (2015:220).) The juvenile skull and neck are, at the time of writing, on exhibit in the Miriam and Ira D. Wallach Orientation Hall.</w:t>
-      </w:r>
-    </w:p>
-    <w:p>
-      <w:pPr>
-        <w:pStyle w:val="BodyText"/>
-        <w:rPr/>
-      </w:pPr>
-      <w:r>
-        <w:rPr/>
         <w:t xml:space="preserve">Since the mount of </w:t>
       </w:r>
       <w:r>
@@ -3389,38 +3705,6 @@
       <w:r>
         <w:rPr/>
         <w:t>opened to the public, tens of millions of visitors have begun their visit to AMNH by sizing up this iconic, if somewhat controversial, skeletal scene.</w:t>
-      </w:r>
-    </w:p>
-    <w:p>
-      <w:pPr>
-        <w:pStyle w:val="BodyText"/>
-        <w:rPr/>
-      </w:pPr>
-      <w:r>
-        <w:rPr/>
-        <w:t xml:space="preserve">One of us (Dingus) recalls that the total budget for the mounting project was $250,000. Another of us (May) feels that, including the </w:t>
-      </w:r>
-      <w:r>
-        <w:rPr>
-          <w:i/>
-          <w:iCs/>
-        </w:rPr>
-        <w:t>Allosaurus</w:t>
-      </w:r>
-      <w:r>
-        <w:rPr/>
-        <w:t xml:space="preserve">, the baby </w:t>
-      </w:r>
-      <w:r>
-        <w:rPr>
-          <w:i/>
-          <w:iCs/>
-        </w:rPr>
-        <w:t>Barosaurus</w:t>
-      </w:r>
-      <w:r>
-        <w:rPr/>
-        <w:t xml:space="preserve"> and the mounting of the original fossil neck and skull of the baby diplodocine AMNH 7530, $250,000 seems a little light. We have not been able to locate official records to resolve this question.</w:t>
       </w:r>
     </w:p>
     <w:p>
@@ -3458,7 +3742,7 @@
     </w:p>
     <w:p>
       <w:pPr>
-        <w:pStyle w:val="BlockQuotationuser"/>
+        <w:pStyle w:val="BlockQuotation"/>
         <w:rPr/>
       </w:pPr>
       <w:r>
@@ -3524,7 +3808,31 @@
       </w:r>
       <w:r>
         <w:rPr/>
-        <w:t xml:space="preserve">.” However, this account did not specify which elements were included in that missing fifth,  and it has not been possible to recover this information from the McIntosh archives. Norell el al. (1991) also seems to be in error regarding numerous elements being modeled from scratch. A certain amount of detective work is therefore required. To summarise: a complete list of the elements of AMNH 6341 itself can be assembled from the published works and notes of McIntosh; Peter May recalls that with some exceptions discussed below, the missing bones were filled in with casts taken from molds made from the Utah Field House’s copy of the Carnegie </w:t>
+        <w:t xml:space="preserve">.” However, this account seems to be in error regarding numerous elements being modeled from scratch. </w:t>
+      </w:r>
+      <w:r>
+        <w:rPr/>
+        <w:t>A</w:t>
+      </w:r>
+      <w:r>
+        <w:rPr/>
+        <w:t xml:space="preserve"> complete list of the elements of AMNH 6341 itself can be assembled from the published works and notes of McIntosh, </w:t>
+      </w:r>
+      <w:r>
+        <w:rPr/>
+        <w:t>old signage, and letters between Gilmore and the USNM (see below).</w:t>
+      </w:r>
+      <w:r>
+        <w:rPr/>
+        <w:t xml:space="preserve"> Peter May recalls that with some exceptions discussed below, the missing bones were filled in with casts taken from molds made from the Utah Field House’s </w:t>
+      </w:r>
+      <w:r>
+        <w:rPr/>
+        <w:t xml:space="preserve">concrete </w:t>
+      </w:r>
+      <w:r>
+        <w:rPr/>
+        <w:t xml:space="preserve">copy of the Carnegie </w:t>
       </w:r>
       <w:r>
         <w:rPr>
@@ -3535,7 +3843,15 @@
       </w:r>
       <w:r>
         <w:rPr/>
-        <w:t xml:space="preserve">; that copy was made from the original Carnegie molds (Taylor et al. 2023), and the composition of the elements from which those molds were taken is well understood (Taylor et al. 2025), so it is possible to determine the sources of most of the bones in the </w:t>
+        <w:t xml:space="preserve">. </w:t>
+      </w:r>
+      <w:r>
+        <w:rPr/>
+        <w:t>T</w:t>
+      </w:r>
+      <w:r>
+        <w:rPr/>
+        <w:t xml:space="preserve">hat copy was made from the original Carnegie molds (Taylor et al. 2023), and the composition of the elements from which those molds were taken is well understood (Taylor et al. 2025), so it is possible to determine the sources of most of the bones in the </w:t>
       </w:r>
       <w:r>
         <w:rPr>
@@ -3581,7 +3897,15 @@
       </w:pPr>
       <w:r>
         <w:rPr/>
-        <w:t>McIntosh’s (2005:43) catalogue of elements in the referred specimen AMNH 6341 is incomplete and contains multiple errors. However, by reading it in context of the more detailed descriptions of the elements later in the same paper, and with his unpublished 1962 notes on the specimen, and with observations of materials on exhibition in the past and present, it is possible to arrive at a complete list of material as follows:</w:t>
+        <w:t xml:space="preserve">McIntosh’s (2005:43) catalogue of elements in the referred specimen AMNH 6341 is incomplete and contains multiple errors. However, by reading it in context of the more detailed descriptions of the elements later in the same paper, and with his unpublished 1962 notes on the specimen, with observations of materials on exhibition in the past and present, </w:t>
+      </w:r>
+      <w:r>
+        <w:rPr/>
+        <w:t xml:space="preserve">and in light of historical correspondence, </w:t>
+      </w:r>
+      <w:r>
+        <w:rPr/>
+        <w:t>it is possible to arrive at a complete list of material as follows:</w:t>
       </w:r>
     </w:p>
     <w:p>
@@ -3858,13 +4182,26 @@
       <w:bookmarkEnd w:id="19"/>
       <w:r>
         <w:rPr/>
-        <w:t>Non-Barosaurus material in the mount</w:t>
+        <w:t>Non-</w:t>
+      </w:r>
+      <w:r>
+        <w:rPr>
+          <w:i/>
+          <w:iCs/>
+        </w:rPr>
+        <w:t>Barosaurus</w:t>
+      </w:r>
+      <w:r>
+        <w:rPr/>
+        <w:t xml:space="preserve"> material in the mount</w:t>
       </w:r>
     </w:p>
     <w:p>
       <w:pPr>
         <w:pStyle w:val="BodyText"/>
-        <w:rPr/>
+        <w:rPr>
+          <w:lang w:val="en-US"/>
+        </w:rPr>
       </w:pPr>
       <w:r>
         <w:rPr/>
@@ -3901,7 +4238,7 @@
       </w:r>
       <w:r>
         <w:rPr/>
-        <w:t xml:space="preserve"> molds, having been used ten times by the Carnegie museum to create plaster casts from museums around the world, were donated in 1952 to the Utah Field House of Natural History in Vernal, Utah, and there used to create a concrete cast that was mounted outdoors (Untermann 1959). In 1989, Jim Madsen’s company Dinolab unmounted this concrete cast and used it to create second-generation molds with the immediate goal of providing the Field House with a new, lightweight cast to be exhibited indoors at its new building. These new molds were then used to create several additional </w:t>
+        <w:t xml:space="preserve"> molds, having been used ten times by the Carnegie museum to create plaster casts from museums around the world, were donated in 1952 to the Utah Field House of Natural History in Vernal, Utah, and there used to create a concrete cast that was mounted outdoors (Untermann 1959). In 1989, Jim Madsen’s company Dinolab unmounted this concrete cast and used it to create second-generation molds with the immediate goal of providing the Field House with a new, lightweight cast to be exhibited indoors. These new molds were then used to create several additional </w:t>
       </w:r>
       <w:r>
         <w:rPr>
@@ -3924,22 +4261,6 @@
       <w:r>
         <w:rPr/>
         <w:t xml:space="preserve"> material and ordered the missing bones from Dinolab, as casts made from these molds, but we have not been able to find details of this order in McIntosh's notes.</w:t>
-      </w:r>
-    </w:p>
-    <w:p>
-      <w:pPr>
-        <w:pStyle w:val="BodyText"/>
-        <w:rPr/>
-      </w:pPr>
-      <w:r>
-        <w:rPr/>
-        <w:t xml:space="preserve">Jack McIntosh, Lowell Dingus and Gene Gaffney all visited RCI multiple times during the modelling process </w:t>
-      </w:r>
-      <w:r>
-        <w:rPr>
-          <w:lang w:val="en-US"/>
-        </w:rPr>
-        <w:t>to provide guidance and monitor progress.</w:t>
       </w:r>
     </w:p>
     <w:p>
@@ -6734,15 +7055,7 @@
       </w:pPr>
       <w:r>
         <w:rPr/>
-        <w:t>Douglass, Earl. 1922c. Report of Work Done by the Carnegie Museum at the Dinosaur National Monument in Uinta County, Utah, under the Supervision of Earl Dougl</w:t>
-      </w:r>
-      <w:r>
-        <w:rPr/>
-        <w:t>a</w:t>
-      </w:r>
-      <w:r>
-        <w:rPr/>
-        <w:t>ss, in the year 1922. 24 March 1923.</w:t>
+        <w:t>Douglass, Earl. 1922c. Report of Work Done by the Carnegie Museum at the Dinosaur National Monument in Uinta County, Utah, under the Supervision of Earl Douglass, in the year 1922. 24 March 1923.</w:t>
       </w:r>
     </w:p>
     <w:p>
@@ -6752,15 +7065,7 @@
       </w:pPr>
       <w:r>
         <w:rPr/>
-        <w:t>Douglass, Earl. 1923. Report of Work Done by the Carnegie Museum at the Dinosaur National Monument in Uinta County, Utah, under the Supervision of Earl Dougl</w:t>
-      </w:r>
-      <w:r>
-        <w:rPr/>
-        <w:t>a</w:t>
-      </w:r>
-      <w:r>
-        <w:rPr/>
-        <w:t>ss, in the year 1922. 24 March 1923. 2 pages.</w:t>
+        <w:t>Douglass, Earl. 1923. Report of Work Done by the Carnegie Museum at the Dinosaur National Monument in Uinta County, Utah, under the Supervision of Earl Douglass, in the year 1922. 24 March 1923. 2 pages.</w:t>
       </w:r>
     </w:p>
     <w:p>
@@ -7232,25 +7537,14 @@
       </w:pPr>
       <w:r>
         <w:rPr/>
-        <w:t xml:space="preserve">Huene, Friedrich von. </w:t>
-      </w:r>
-      <w:r>
-        <w:rPr/>
-        <w:t xml:space="preserve">1929. Die Besonderheit der Titanosaurier [The characteristics of titanosaurs]. </w:t>
-      </w:r>
-      <w:r>
-        <w:rPr>
-          <w:i/>
-          <w:iCs/>
-        </w:rPr>
-        <w:t xml:space="preserve">Centralblatt für </w:t>
-      </w:r>
-      <w:r>
-        <w:rPr>
-          <w:i/>
-          <w:iCs/>
-        </w:rPr>
-        <w:t>Mineralogie, Geologie und Palaontologie</w:t>
+        <w:t xml:space="preserve">Huene, Friedrich von. 1929. Die Besonderheit der Titanosaurier [The characteristics of titanosaurs]. </w:t>
+      </w:r>
+      <w:r>
+        <w:rPr>
+          <w:i/>
+          <w:iCs/>
+        </w:rPr>
+        <w:t>Centralblatt für Mineralogie, Geologie und Palaontologie</w:t>
       </w:r>
       <w:r>
         <w:rPr/>
@@ -7261,22 +7555,11 @@
           <w:b/>
           <w:bCs/>
         </w:rPr>
-        <w:t>192</w:t>
-      </w:r>
-      <w:r>
-        <w:rPr>
-          <w:b/>
-          <w:bCs/>
-        </w:rPr>
-        <w:t>9(B)</w:t>
-      </w:r>
-      <w:r>
-        <w:rPr/>
-        <w:t>:</w:t>
-      </w:r>
-      <w:r>
-        <w:rPr/>
-        <w:t>493–499.</w:t>
+        <w:t>1929(B)</w:t>
+      </w:r>
+      <w:r>
+        <w:rPr/>
+        <w:t>:493–499.</w:t>
       </w:r>
     </w:p>
     <w:p>
@@ -7712,15 +7995,7 @@
       </w:pPr>
       <w:r>
         <w:rPr/>
-        <w:t>Marsh, O</w:t>
-      </w:r>
-      <w:r>
-        <w:rPr/>
-        <w:t>thniel</w:t>
-      </w:r>
-      <w:r>
-        <w:rPr/>
-        <w:t xml:space="preserve"> C. 1891. Restoration of </w:t>
+        <w:t xml:space="preserve">Marsh, Othniel C. 1891. Restoration of </w:t>
       </w:r>
       <w:r>
         <w:rPr>
@@ -8660,11 +8935,7 @@
       </w:r>
       <w:r>
         <w:rPr/>
-        <w:t xml:space="preserve"> (Dinosauria, Sauropoda) and a revision of camarasaurid taxonomy. 74th Annual Meeting of the Society of Vertebrate Paleontology, Program and Abstracts, 241. </w:t>
-      </w:r>
-      <w:r>
-        <w:rPr/>
-        <w:t>XXXXX is this right?</w:t>
+        <w:t xml:space="preserve"> (Dinosauria, Sauropoda) and a revision of camarasaurid taxonomy. 74th Annual Meeting of the Society of Vertebrate Paleontology, Program and Abstracts, 241. XXXXX is this right?</w:t>
       </w:r>
     </w:p>
     <w:p>
@@ -9188,23 +9459,7 @@
       </w:r>
       <w:r>
         <w:rPr/>
-        <w:t xml:space="preserve"> mount has only thirteen cervicals, perhaps following Marsh’s (1</w:t>
-      </w:r>
-      <w:r>
-        <w:rPr/>
-        <w:t>8</w:t>
-      </w:r>
-      <w:r>
-        <w:rPr/>
-        <w:t xml:space="preserve">91: </w:t>
-      </w:r>
-      <w:r>
-        <w:rPr/>
-        <w:t>plate XVI</w:t>
-      </w:r>
-      <w:r>
-        <w:rPr/>
-        <w:t xml:space="preserve">) skeletal reconstruction. </w:t>
+        <w:t xml:space="preserve"> mount has only thirteen cervicals, perhaps following Marsh’s (1891: plate XVI) skeletal reconstruction. </w:t>
       </w:r>
       <w:r>
         <w:rPr>
@@ -9238,7 +9493,7 @@
     </w:p>
     <w:p>
       <w:pPr>
-        <w:pStyle w:val="BlockQuotationuser"/>
+        <w:pStyle w:val="BlockQuotation"/>
         <w:rPr/>
       </w:pPr>
       <w:r>
@@ -9271,7 +9526,7 @@
         <w:pStyle w:val="FigureCaption"/>
         <w:widowControl/>
         <w:suppressAutoHyphens w:val="true"/>
-        <w:overflowPunct w:val="true"/>
+        <w:overflowPunct w:val="false"/>
         <w:bidi w:val="0"/>
         <w:spacing w:lineRule="auto" w:line="276" w:before="0" w:after="142"/>
         <w:ind w:hanging="0" w:left="283" w:right="0"/>
@@ -13128,7 +13383,7 @@
     <w:pPr>
       <w:widowControl/>
       <w:suppressAutoHyphens w:val="true"/>
-      <w:overflowPunct w:val="true"/>
+      <w:overflowPunct w:val="false"/>
       <w:bidi w:val="0"/>
       <w:spacing w:before="0" w:after="0"/>
       <w:ind w:hanging="0" w:left="0" w:right="0"/>
@@ -13239,8 +13494,8 @@
     <w:qFormat/>
     <w:rPr/>
   </w:style>
-  <w:style w:type="character" w:styleId="Bulletsuser">
-    <w:name w:val="Bullets (user)"/>
+  <w:style w:type="character" w:styleId="Bullets">
+    <w:name w:val="Bullets"/>
     <w:qFormat/>
     <w:rPr>
       <w:rFonts w:ascii="OpenSymbol" w:hAnsi="OpenSymbol" w:eastAsia="OpenSymbol" w:cs="OpenSymbol"/>
@@ -13365,8 +13620,8 @@
       <w:i/>
     </w:rPr>
   </w:style>
-  <w:style w:type="paragraph" w:styleId="BlockQuotationuser">
-    <w:name w:val="Block Quotation (user)"/>
+  <w:style w:type="paragraph" w:styleId="BlockQuotation">
+    <w:name w:val="Block Quotation"/>
     <w:basedOn w:val="Normal"/>
     <w:qFormat/>
     <w:pPr>

</xml_diff>

<commit_message>
Integrate changes from proofreading
</commit_message>
<xml_diff>
--- a/TaylorEtAl-mounted-barosaurus.docx
+++ b/TaylorEtAl-mounted-barosaurus.docx
@@ -240,147 +240,63 @@
           <w:i w:val="false"/>
           <w:iCs w:val="false"/>
         </w:rPr>
-        <w:t>The rearing mount</w:t>
+        <w:t xml:space="preserve">The rearing mounted skeleton of </w:t>
+      </w:r>
+      <w:r>
+        <w:rPr>
+          <w:i/>
+          <w:iCs/>
+        </w:rPr>
+        <w:t>Barosaurus lentus</w:t>
       </w:r>
       <w:r>
         <w:rPr>
           <w:i w:val="false"/>
           <w:iCs w:val="false"/>
         </w:rPr>
-        <w:t>ed</w:t>
+        <w:t xml:space="preserve"> in the Roosevelt Memorial Hall of the American Museum of Natural History (AMNH) is among the most culturally influential of all dinosaur exhibits. We review the history of the genus and of AMNH 6341, the specimen on which the mount is principally based. Excavated by Earl Douglass from the Carnegie Quarry at what is now Dinosaur National Monument, this skeleton was divided between three institutions before Barnum Brown reunited it at the AMNH around 1930. It was then largely neglected for six decades. We document the conception of the rearing mount during the 1986–1991 renovation of the fossil halls, when Lowell Dingus and Eugene Gaffney independently arrived at the idea of a rearing sauropod inspired in part by Gregory S. Paul’s painting </w:t>
+      </w:r>
+      <w:r>
+        <w:rPr>
+          <w:i/>
+          <w:iCs/>
+        </w:rPr>
+        <w:t>Ambush at Como Creek</w:t>
       </w:r>
       <w:r>
         <w:rPr>
           <w:i w:val="false"/>
           <w:iCs w:val="false"/>
         </w:rPr>
-        <w:t xml:space="preserve"> skeleton of </w:t>
-      </w:r>
-      <w:r>
-        <w:rPr>
-          <w:i/>
-          <w:iCs/>
-        </w:rPr>
-        <w:t>Barosaurus lentus</w:t>
+        <w:t xml:space="preserve">, and the construction of the cast by Research Casting International. At about 15 m, it is the tallest free-standing mounted skeleton in the world. Crucially, the mount’s purpose was not to assert that </w:t>
+      </w:r>
+      <w:r>
+        <w:rPr>
+          <w:i/>
+          <w:iCs/>
+        </w:rPr>
+        <w:t>Barosaurus</w:t>
       </w:r>
       <w:r>
         <w:rPr>
           <w:i w:val="false"/>
           <w:iCs w:val="false"/>
         </w:rPr>
-        <w:t xml:space="preserve"> in the Roosevelt Memorial Hall of the American Museum of Natural History (AMNH) is among the most culturally influential of all dinosaur exhibits. We review the history of the genus and of AMNH 6341, the specimen on which the mount is principally based. Excavated by Earl Douglass from the Carnegie Quarry at what is now Dinosaur National Monument, this skeleton was di</w:t>
+        <w:t xml:space="preserve"> habitually reared, but to provoke visitors to think about what fossils can and cannot tell us about extinct animals. About 80% of the material in the mount was cast from AMNH 6341. Most of the rest cast from second-generation moulds of the Carnegie </w:t>
+      </w:r>
+      <w:r>
+        <w:rPr>
+          <w:i/>
+          <w:iCs/>
+        </w:rPr>
+        <w:t>Diplodocus</w:t>
       </w:r>
       <w:r>
         <w:rPr>
           <w:i w:val="false"/>
           <w:iCs w:val="false"/>
         </w:rPr>
-        <w:t xml:space="preserve">vided </w:t>
-      </w:r>
-      <w:r>
-        <w:rPr>
-          <w:i w:val="false"/>
-          <w:iCs w:val="false"/>
-        </w:rPr>
-        <w:t xml:space="preserve">between three institutions before Barnum Brown reunited it at the AMNH around 1930. It was then largely neglected for six decades. We document the conception of the </w:t>
-      </w:r>
-      <w:r>
-        <w:rPr>
-          <w:i w:val="false"/>
-          <w:iCs w:val="false"/>
-        </w:rPr>
-        <w:t xml:space="preserve">rearing </w:t>
-      </w:r>
-      <w:r>
-        <w:rPr>
-          <w:i w:val="false"/>
-          <w:iCs w:val="false"/>
-        </w:rPr>
-        <w:t xml:space="preserve">mount during the 1986–1991 renovation of the fossil halls, when Lowell Dingus and Eugene Gaffney independently arrived at the idea of a rearing sauropod inspired in part by Gregory S. Paul’s painting </w:t>
-      </w:r>
-      <w:r>
-        <w:rPr>
-          <w:i/>
-          <w:iCs/>
-        </w:rPr>
-        <w:t>Ambush at Como Creek</w:t>
-      </w:r>
-      <w:r>
-        <w:rPr>
-          <w:i w:val="false"/>
-          <w:iCs w:val="false"/>
-        </w:rPr>
-        <w:t xml:space="preserve">, and the construction of the cast by Research Casting International. At about 15 m, it is the tallest free-standing mounted skeleton in the world. Crucially, the mount’s purpose was not to assert that </w:t>
-      </w:r>
-      <w:r>
-        <w:rPr>
-          <w:i/>
-          <w:iCs/>
-        </w:rPr>
-        <w:t>Barosaurus</w:t>
-      </w:r>
-      <w:r>
-        <w:rPr>
-          <w:i w:val="false"/>
-          <w:iCs w:val="false"/>
-        </w:rPr>
-        <w:t xml:space="preserve"> habitually reared, but to provoke visitors to think about what fossils can and cannot tell us about extinct animals. About 80% of the material in the mount </w:t>
-      </w:r>
-      <w:r>
-        <w:rPr>
-          <w:i w:val="false"/>
-          <w:iCs w:val="false"/>
-        </w:rPr>
-        <w:t>wa</w:t>
-      </w:r>
-      <w:r>
-        <w:rPr>
-          <w:i w:val="false"/>
-          <w:iCs w:val="false"/>
-        </w:rPr>
-        <w:t xml:space="preserve">s cast from AMNH 6341. </w:t>
-      </w:r>
-      <w:r>
-        <w:rPr>
-          <w:i w:val="false"/>
-          <w:iCs w:val="false"/>
-        </w:rPr>
-        <w:t>M</w:t>
-      </w:r>
-      <w:r>
-        <w:rPr>
-          <w:i w:val="false"/>
-          <w:iCs w:val="false"/>
-        </w:rPr>
-        <w:t xml:space="preserve">ost of the rest cast from second-generation moulds of the Carnegie </w:t>
-      </w:r>
-      <w:r>
-        <w:rPr>
-          <w:i/>
-          <w:iCs/>
-        </w:rPr>
-        <w:t>Diplodocus</w:t>
-      </w:r>
-      <w:r>
-        <w:rPr>
-          <w:i w:val="false"/>
-          <w:iCs w:val="false"/>
-        </w:rPr>
-        <w:t xml:space="preserve">, including a third of the neck and </w:t>
-      </w:r>
-      <w:r>
-        <w:rPr>
-          <w:i w:val="false"/>
-          <w:iCs w:val="false"/>
-        </w:rPr>
-        <w:t xml:space="preserve">some </w:t>
-      </w:r>
-      <w:r>
-        <w:rPr>
-          <w:i w:val="false"/>
-          <w:iCs w:val="false"/>
-        </w:rPr>
-        <w:t>residual camarasaurid material in the manus. We summarise the controversy the pose provoked, trace the longer history of rearing sauropods in science and art, and assess the mount’s substantial impact on popular culture.</w:t>
+        <w:t>, including a third of the neck and some residual camarasaurid material in the manus. We summarise the controversy the pose provoked, trace the longer history of rearing sauropods in science and art, and assess the mount’s substantial impact on popular culture.</w:t>
       </w:r>
     </w:p>
     <w:p>
@@ -416,14 +332,7 @@
           <w:i w:val="false"/>
           <w:iCs w:val="false"/>
         </w:rPr>
-        <w:t xml:space="preserve">, sauropod, neck, rearing, skeletal mount, </w:t>
-      </w:r>
-      <w:r>
-        <w:rPr>
-          <w:i w:val="false"/>
-          <w:iCs w:val="false"/>
-        </w:rPr>
-        <w:t>cast</w:t>
+        <w:t>, sauropod, neck, rearing, skeletal mount, cast</w:t>
       </w:r>
     </w:p>
     <w:p>
@@ -483,16 +392,17 @@
             </w:rPr>
             <w:fldChar w:fldCharType="separate"/>
           </w:r>
-          <w:hyperlink w:anchor="__RefHeading___Toc3784_1986291683" w:tooltip="Introduction">
-            <w:r>
-              <w:rPr>
-                <w:rStyle w:val="IndexLink"/>
-              </w:rPr>
-              <w:t>Introduction</w:t>
-              <w:tab/>
-              <w:t>2</w:t>
-            </w:r>
-          </w:hyperlink>
+          <w:r>
+            <w:rPr>
+              <w:rStyle w:val="IndexLink"/>
+            </w:rPr>
+            <w:t>Introduction</w:t>
+          </w:r>
+          <w:r>
+            <w:rPr/>
+            <w:tab/>
+            <w:t>2</w:t>
+          </w:r>
         </w:p>
         <w:p>
           <w:pPr>
@@ -503,16 +413,12 @@
             </w:tabs>
             <w:rPr/>
           </w:pPr>
-          <w:hyperlink w:anchor="__RefHeading___Toc3323_2187837281" w:tooltip="Anatomical nomenclature">
-            <w:r>
-              <w:rPr>
-                <w:rStyle w:val="IndexLink"/>
-              </w:rPr>
-              <w:t>Anatomical nomenclature</w:t>
-              <w:tab/>
-              <w:t>3</w:t>
-            </w:r>
-          </w:hyperlink>
+          <w:r>
+            <w:rPr/>
+            <w:t>Anatomical nomenclature</w:t>
+            <w:tab/>
+            <w:t>3</w:t>
+          </w:r>
         </w:p>
         <w:p>
           <w:pPr>
@@ -523,16 +429,12 @@
             </w:tabs>
             <w:rPr/>
           </w:pPr>
-          <w:hyperlink w:anchor="__RefHeading___Toc5349_68767826" w:tooltip="Institutional abbreviations">
-            <w:r>
-              <w:rPr>
-                <w:rStyle w:val="IndexLink"/>
-              </w:rPr>
-              <w:t>Institutional abbreviations</w:t>
-              <w:tab/>
-              <w:t>3</w:t>
-            </w:r>
-          </w:hyperlink>
+          <w:r>
+            <w:rPr/>
+            <w:t>Institutional abbreviations</w:t>
+            <w:tab/>
+            <w:t>3</w:t>
+          </w:r>
         </w:p>
         <w:p>
           <w:pPr>
@@ -543,16 +445,12 @@
             </w:tabs>
             <w:rPr/>
           </w:pPr>
-          <w:hyperlink w:anchor="__RefHeading___Toc4316_68767826" w:tooltip="Historical background">
-            <w:r>
-              <w:rPr>
-                <w:rStyle w:val="IndexLink"/>
-              </w:rPr>
-              <w:t>Historical background</w:t>
-              <w:tab/>
-              <w:t>3</w:t>
-            </w:r>
-          </w:hyperlink>
+          <w:r>
+            <w:rPr/>
+            <w:t>Historical background</w:t>
+            <w:tab/>
+            <w:t>3</w:t>
+          </w:r>
         </w:p>
         <w:p>
           <w:pPr>
@@ -563,29 +461,22 @@
             </w:tabs>
             <w:rPr/>
           </w:pPr>
-          <w:hyperlink w:anchor="__RefHeading___Toc12350_68767826" w:tooltip="Early discoveries of Barosaurus">
-            <w:r>
-              <w:rPr>
-                <w:rStyle w:val="IndexLink"/>
-              </w:rPr>
-              <w:t xml:space="preserve">Early discoveries of </w:t>
-            </w:r>
-            <w:r>
-              <w:rPr>
-                <w:rStyle w:val="IndexLink"/>
-                <w:i/>
-                <w:iCs/>
-              </w:rPr>
-              <w:t>Barosaurus</w:t>
-            </w:r>
-            <w:r>
-              <w:rPr>
-                <w:rStyle w:val="IndexLink"/>
-              </w:rPr>
-              <w:tab/>
-              <w:t>3</w:t>
-            </w:r>
-          </w:hyperlink>
+          <w:r>
+            <w:rPr/>
+            <w:t xml:space="preserve">Early discoveries of </w:t>
+          </w:r>
+          <w:r>
+            <w:rPr>
+              <w:i/>
+              <w:iCs/>
+            </w:rPr>
+            <w:t>Barosaurus</w:t>
+          </w:r>
+          <w:r>
+            <w:rPr/>
+            <w:tab/>
+            <w:t>3</w:t>
+          </w:r>
         </w:p>
         <w:p>
           <w:pPr>
@@ -596,29 +487,22 @@
             </w:tabs>
             <w:rPr/>
           </w:pPr>
-          <w:hyperlink w:anchor="__RefHeading___Toc12352_68767826" w:tooltip="The AMNH specimen of Barosaurus">
-            <w:r>
-              <w:rPr>
-                <w:rStyle w:val="IndexLink"/>
-              </w:rPr>
-              <w:t xml:space="preserve">The AMNH specimen of </w:t>
-            </w:r>
-            <w:r>
-              <w:rPr>
-                <w:rStyle w:val="IndexLink"/>
-                <w:i/>
-                <w:iCs/>
-              </w:rPr>
-              <w:t>Barosaurus</w:t>
-            </w:r>
-            <w:r>
-              <w:rPr>
-                <w:rStyle w:val="IndexLink"/>
-              </w:rPr>
-              <w:tab/>
-              <w:t>4</w:t>
-            </w:r>
-          </w:hyperlink>
+          <w:r>
+            <w:rPr/>
+            <w:t xml:space="preserve">The AMNH specimen of </w:t>
+          </w:r>
+          <w:r>
+            <w:rPr>
+              <w:i/>
+              <w:iCs/>
+            </w:rPr>
+            <w:t>Barosaurus</w:t>
+          </w:r>
+          <w:r>
+            <w:rPr/>
+            <w:tab/>
+            <w:t>4</w:t>
+          </w:r>
         </w:p>
         <w:p>
           <w:pPr>
@@ -629,16 +513,12 @@
             </w:tabs>
             <w:rPr/>
           </w:pPr>
-          <w:hyperlink w:anchor="__RefHeading___Toc25848_1820571732" w:tooltip="The Carnegie Quarry at Dinosaur National Monument">
-            <w:r>
-              <w:rPr>
-                <w:rStyle w:val="IndexLink"/>
-              </w:rPr>
-              <w:t>The Carnegie Quarry at Dinosaur National Monument</w:t>
-              <w:tab/>
-              <w:t>4</w:t>
-            </w:r>
-          </w:hyperlink>
+          <w:r>
+            <w:rPr/>
+            <w:t>The Carnegie Quarry at Dinosaur National Monument</w:t>
+            <w:tab/>
+            <w:t>4</w:t>
+          </w:r>
         </w:p>
         <w:p>
           <w:pPr>
@@ -649,16 +529,12 @@
             </w:tabs>
             <w:rPr/>
           </w:pPr>
-          <w:hyperlink w:anchor="__RefHeading___Toc25850_1820571732" w:tooltip="USNM work at Dinosaur National Monument">
-            <w:r>
-              <w:rPr>
-                <w:rStyle w:val="IndexLink"/>
-              </w:rPr>
-              <w:t>USNM work at Dinosaur National Monument</w:t>
-              <w:tab/>
-              <w:t>5</w:t>
-            </w:r>
-          </w:hyperlink>
+          <w:r>
+            <w:rPr/>
+            <w:t>USNM work at Dinosaur National Monument</w:t>
+            <w:tab/>
+            <w:t>5</w:t>
+          </w:r>
         </w:p>
         <w:p>
           <w:pPr>
@@ -669,16 +545,12 @@
             </w:tabs>
             <w:rPr/>
           </w:pPr>
-          <w:hyperlink w:anchor="__RefHeading___Toc25852_1820571732" w:tooltip="The skeleton reunited">
-            <w:r>
-              <w:rPr>
-                <w:rStyle w:val="IndexLink"/>
-              </w:rPr>
-              <w:t>The skeleton reunited</w:t>
-              <w:tab/>
-              <w:t>6</w:t>
-            </w:r>
-          </w:hyperlink>
+          <w:r>
+            <w:rPr/>
+            <w:t>The skeleton reunited</w:t>
+            <w:tab/>
+            <w:t>6</w:t>
+          </w:r>
         </w:p>
         <w:p>
           <w:pPr>
@@ -689,29 +561,22 @@
             </w:tabs>
             <w:rPr/>
           </w:pPr>
-          <w:hyperlink w:anchor="__RefHeading___Toc5351_68767826" w:tooltip="The AMNH mounted Barosaurus">
-            <w:r>
-              <w:rPr>
-                <w:rStyle w:val="IndexLink"/>
-              </w:rPr>
-              <w:t xml:space="preserve">The AMNH mounted </w:t>
-            </w:r>
-            <w:r>
-              <w:rPr>
-                <w:rStyle w:val="IndexLink"/>
-                <w:i/>
-                <w:iCs/>
-              </w:rPr>
-              <w:t>Barosaurus</w:t>
-            </w:r>
-            <w:r>
-              <w:rPr>
-                <w:rStyle w:val="IndexLink"/>
-              </w:rPr>
-              <w:tab/>
-              <w:t>7</w:t>
-            </w:r>
-          </w:hyperlink>
+          <w:r>
+            <w:rPr/>
+            <w:t xml:space="preserve">The AMNH mounted </w:t>
+          </w:r>
+          <w:r>
+            <w:rPr>
+              <w:i/>
+              <w:iCs/>
+            </w:rPr>
+            <w:t>Barosaurus</w:t>
+          </w:r>
+          <w:r>
+            <w:rPr/>
+            <w:tab/>
+            <w:t>7</w:t>
+          </w:r>
         </w:p>
         <w:p>
           <w:pPr>
@@ -722,16 +587,12 @@
             </w:tabs>
             <w:rPr/>
           </w:pPr>
-          <w:hyperlink w:anchor="__RefHeading___Toc5354_68767826" w:tooltip="The conception of the mount">
-            <w:r>
-              <w:rPr>
-                <w:rStyle w:val="IndexLink"/>
-              </w:rPr>
-              <w:t>The conception of the mount</w:t>
-              <w:tab/>
-              <w:t>7</w:t>
-            </w:r>
-          </w:hyperlink>
+          <w:r>
+            <w:rPr/>
+            <w:t>The conception of the mount</w:t>
+            <w:tab/>
+            <w:t>7</w:t>
+          </w:r>
         </w:p>
         <w:p>
           <w:pPr>
@@ -742,23 +603,18 @@
             </w:tabs>
             <w:rPr/>
           </w:pPr>
-          <w:hyperlink w:anchor="__RefHeading___Toc1099_1709072779" w:tooltip="The purpose of the mount">
-            <w:r>
-              <w:rPr>
-                <w:rStyle w:val="IndexLink"/>
-                <w:i w:val="false"/>
-                <w:iCs w:val="false"/>
-              </w:rPr>
-              <w:t>The purpose of the mount</w:t>
-            </w:r>
-            <w:r>
-              <w:rPr>
-                <w:rStyle w:val="IndexLink"/>
-              </w:rPr>
-              <w:tab/>
-              <w:t>9</w:t>
-            </w:r>
-          </w:hyperlink>
+          <w:r>
+            <w:rPr>
+              <w:i w:val="false"/>
+              <w:iCs w:val="false"/>
+            </w:rPr>
+            <w:t>The purpose of the mount</w:t>
+          </w:r>
+          <w:r>
+            <w:rPr/>
+            <w:tab/>
+            <w:t>9</w:t>
+          </w:r>
         </w:p>
         <w:p>
           <w:pPr>
@@ -769,16 +625,12 @@
             </w:tabs>
             <w:rPr/>
           </w:pPr>
-          <w:hyperlink w:anchor="__RefHeading___Toc18297_68767826" w:tooltip="The creation of the mount">
-            <w:r>
-              <w:rPr>
-                <w:rStyle w:val="IndexLink"/>
-              </w:rPr>
-              <w:t>The creation of the mount</w:t>
-              <w:tab/>
-              <w:t>9</w:t>
-            </w:r>
-          </w:hyperlink>
+          <w:r>
+            <w:rPr/>
+            <w:t>The creation of the mount</w:t>
+            <w:tab/>
+            <w:t>9</w:t>
+          </w:r>
         </w:p>
         <w:p>
           <w:pPr>
@@ -789,16 +641,12 @@
             </w:tabs>
             <w:rPr/>
           </w:pPr>
-          <w:hyperlink w:anchor="__RefHeading___Toc5632_2187837281" w:tooltip="Photography of the mount">
-            <w:r>
-              <w:rPr>
-                <w:rStyle w:val="IndexLink"/>
-              </w:rPr>
-              <w:t>Photography of the mount</w:t>
-              <w:tab/>
-              <w:t>12</w:t>
-            </w:r>
-          </w:hyperlink>
+          <w:r>
+            <w:rPr/>
+            <w:t>Photography of the mount</w:t>
+            <w:tab/>
+            <w:t>12</w:t>
+          </w:r>
         </w:p>
         <w:p>
           <w:pPr>
@@ -809,16 +657,12 @@
             </w:tabs>
             <w:rPr/>
           </w:pPr>
-          <w:hyperlink w:anchor="__RefHeading___Toc5356_68767826" w:tooltip="The composition of the mount">
-            <w:r>
-              <w:rPr>
-                <w:rStyle w:val="IndexLink"/>
-              </w:rPr>
-              <w:t>The composition of the mount</w:t>
-              <w:tab/>
-              <w:t>13</w:t>
-            </w:r>
-          </w:hyperlink>
+          <w:r>
+            <w:rPr/>
+            <w:t>The composition of the mount</w:t>
+            <w:tab/>
+            <w:t>13</w:t>
+          </w:r>
         </w:p>
         <w:p>
           <w:pPr>
@@ -829,16 +673,12 @@
             </w:tabs>
             <w:rPr/>
           </w:pPr>
-          <w:hyperlink w:anchor="__RefHeading___Toc16585_68767826" w:tooltip="Overview">
-            <w:r>
-              <w:rPr>
-                <w:rStyle w:val="IndexLink"/>
-              </w:rPr>
-              <w:t>Overview</w:t>
-              <w:tab/>
-              <w:t>13</w:t>
-            </w:r>
-          </w:hyperlink>
+          <w:r>
+            <w:rPr/>
+            <w:t>Overview</w:t>
+            <w:tab/>
+            <w:t>13</w:t>
+          </w:r>
         </w:p>
         <w:p>
           <w:pPr>
@@ -849,24 +689,19 @@
             </w:tabs>
             <w:rPr/>
           </w:pPr>
-          <w:hyperlink w:anchor="__RefHeading___Toc4995_537823704" w:tooltip="Barosaurus material in the mount">
-            <w:r>
-              <w:rPr>
-                <w:rStyle w:val="IndexLink"/>
-                <w:i/>
-                <w:iCs/>
-              </w:rPr>
-              <w:t>Barosaurus</w:t>
-            </w:r>
-            <w:r>
-              <w:rPr>
-                <w:rStyle w:val="IndexLink"/>
-              </w:rPr>
-              <w:t xml:space="preserve"> material in the mount</w:t>
-              <w:tab/>
-              <w:t>13</w:t>
-            </w:r>
-          </w:hyperlink>
+          <w:r>
+            <w:rPr>
+              <w:i/>
+              <w:iCs/>
+            </w:rPr>
+            <w:t>Barosaurus</w:t>
+          </w:r>
+          <w:r>
+            <w:rPr/>
+            <w:t xml:space="preserve"> material in the mount</w:t>
+            <w:tab/>
+            <w:t>13</w:t>
+          </w:r>
         </w:p>
         <w:p>
           <w:pPr>
@@ -877,30 +712,23 @@
             </w:tabs>
             <w:rPr/>
           </w:pPr>
-          <w:hyperlink w:anchor="__RefHeading___Toc25854_1820571732" w:tooltip="Non-Barosaurus material in the mount">
-            <w:r>
-              <w:rPr>
-                <w:rStyle w:val="IndexLink"/>
-              </w:rPr>
-              <w:t>Non-</w:t>
-            </w:r>
-            <w:r>
-              <w:rPr>
-                <w:rStyle w:val="IndexLink"/>
-                <w:i/>
-                <w:iCs/>
-              </w:rPr>
-              <w:t>Barosaurus</w:t>
-            </w:r>
-            <w:r>
-              <w:rPr>
-                <w:rStyle w:val="IndexLink"/>
-              </w:rPr>
-              <w:t xml:space="preserve"> material in the mount</w:t>
-              <w:tab/>
-              <w:t>15</w:t>
-            </w:r>
-          </w:hyperlink>
+          <w:r>
+            <w:rPr/>
+            <w:t>Non-</w:t>
+          </w:r>
+          <w:r>
+            <w:rPr>
+              <w:i/>
+              <w:iCs/>
+            </w:rPr>
+            <w:t>Barosaurus</w:t>
+          </w:r>
+          <w:r>
+            <w:rPr/>
+            <w:t xml:space="preserve"> material in the mount</w:t>
+            <w:tab/>
+            <w:t>15</w:t>
+          </w:r>
         </w:p>
         <w:p>
           <w:pPr>
@@ -911,16 +739,12 @@
             </w:tabs>
             <w:rPr/>
           </w:pPr>
-          <w:hyperlink w:anchor="__RefHeading___Toc16587_68767826" w:tooltip="Skull">
-            <w:r>
-              <w:rPr>
-                <w:rStyle w:val="IndexLink"/>
-              </w:rPr>
-              <w:t>Skull</w:t>
-              <w:tab/>
-              <w:t>15</w:t>
-            </w:r>
-          </w:hyperlink>
+          <w:r>
+            <w:rPr/>
+            <w:t>Skull</w:t>
+            <w:tab/>
+            <w:t>15</w:t>
+          </w:r>
         </w:p>
         <w:p>
           <w:pPr>
@@ -931,16 +755,12 @@
             </w:tabs>
             <w:rPr/>
           </w:pPr>
-          <w:hyperlink w:anchor="__RefHeading___Toc16589_68767826" w:tooltip="Neck">
-            <w:r>
-              <w:rPr>
-                <w:rStyle w:val="IndexLink"/>
-              </w:rPr>
-              <w:t>Neck</w:t>
-              <w:tab/>
-              <w:t>15</w:t>
-            </w:r>
-          </w:hyperlink>
+          <w:r>
+            <w:rPr/>
+            <w:t>Neck</w:t>
+            <w:tab/>
+            <w:t>15</w:t>
+          </w:r>
         </w:p>
         <w:p>
           <w:pPr>
@@ -951,16 +771,12 @@
             </w:tabs>
             <w:rPr/>
           </w:pPr>
-          <w:hyperlink w:anchor="__RefHeading___Toc2466_2187837281" w:tooltip="Torso, sacrum and tail">
-            <w:r>
-              <w:rPr>
-                <w:rStyle w:val="IndexLink"/>
-              </w:rPr>
-              <w:t>Torso, sacrum and tail</w:t>
-              <w:tab/>
-              <w:t>16</w:t>
-            </w:r>
-          </w:hyperlink>
+          <w:r>
+            <w:rPr/>
+            <w:t>Torso, sacrum and tail</w:t>
+            <w:tab/>
+            <w:t>16</w:t>
+          </w:r>
         </w:p>
         <w:p>
           <w:pPr>
@@ -971,16 +787,12 @@
             </w:tabs>
             <w:rPr/>
           </w:pPr>
-          <w:hyperlink w:anchor="__RefHeading___Toc2470_2187837281" w:tooltip="Forelimbs and girdles">
-            <w:r>
-              <w:rPr>
-                <w:rStyle w:val="IndexLink"/>
-              </w:rPr>
-              <w:t>Forelimbs and girdles</w:t>
-              <w:tab/>
-              <w:t>17</w:t>
-            </w:r>
-          </w:hyperlink>
+          <w:r>
+            <w:rPr/>
+            <w:t>Forelimbs and girdles</w:t>
+            <w:tab/>
+            <w:t>17</w:t>
+          </w:r>
         </w:p>
         <w:p>
           <w:pPr>
@@ -991,16 +803,12 @@
             </w:tabs>
             <w:rPr/>
           </w:pPr>
-          <w:hyperlink w:anchor="__RefHeading___Toc25856_1820571732" w:tooltip="Hindlimbs and girdles">
-            <w:r>
-              <w:rPr>
-                <w:rStyle w:val="IndexLink"/>
-              </w:rPr>
-              <w:t>Hindlimbs and girdles</w:t>
-              <w:tab/>
-              <w:t>17</w:t>
-            </w:r>
-          </w:hyperlink>
+          <w:r>
+            <w:rPr/>
+            <w:t>Hindlimbs and girdles</w:t>
+            <w:tab/>
+            <w:t>17</w:t>
+          </w:r>
         </w:p>
         <w:p>
           <w:pPr>
@@ -1011,16 +819,12 @@
             </w:tabs>
             <w:rPr/>
           </w:pPr>
-          <w:hyperlink w:anchor="__RefHeading___Toc3401_68767826" w:tooltip="Discussion">
-            <w:r>
-              <w:rPr>
-                <w:rStyle w:val="IndexLink"/>
-              </w:rPr>
-              <w:t>Discussion</w:t>
-              <w:tab/>
-              <w:t>17</w:t>
-            </w:r>
-          </w:hyperlink>
+          <w:r>
+            <w:rPr/>
+            <w:t>Discussion</w:t>
+            <w:tab/>
+            <w:t>17</w:t>
+          </w:r>
         </w:p>
         <w:p>
           <w:pPr>
@@ -1031,16 +835,12 @@
             </w:tabs>
             <w:rPr/>
           </w:pPr>
-          <w:hyperlink w:anchor="__RefHeading___Toc2476_2187837281" w:tooltip="Rearing pose">
-            <w:r>
-              <w:rPr>
-                <w:rStyle w:val="IndexLink"/>
-              </w:rPr>
-              <w:t>Rearing pose</w:t>
-              <w:tab/>
-              <w:t>17</w:t>
-            </w:r>
-          </w:hyperlink>
+          <w:r>
+            <w:rPr/>
+            <w:t>Rearing pose</w:t>
+            <w:tab/>
+            <w:t>17</w:t>
+          </w:r>
         </w:p>
         <w:p>
           <w:pPr>
@@ -1051,16 +851,12 @@
             </w:tabs>
             <w:rPr/>
           </w:pPr>
-          <w:hyperlink w:anchor="__RefHeading___Toc3786_1986291683" w:tooltip="A short history of rearing sauropods">
-            <w:r>
-              <w:rPr>
-                <w:rStyle w:val="IndexLink"/>
-              </w:rPr>
-              <w:t>A short history of rearing sauropods</w:t>
-              <w:tab/>
-              <w:t>19</w:t>
-            </w:r>
-          </w:hyperlink>
+          <w:r>
+            <w:rPr/>
+            <w:t>A short history of rearing sauropods</w:t>
+            <w:tab/>
+            <w:t>19</w:t>
+          </w:r>
         </w:p>
         <w:p>
           <w:pPr>
@@ -1071,16 +867,12 @@
             </w:tabs>
             <w:rPr/>
           </w:pPr>
-          <w:hyperlink w:anchor="__RefHeading___Toc11689_675290491" w:tooltip="Cultural impact">
-            <w:r>
-              <w:rPr>
-                <w:rStyle w:val="IndexLink"/>
-              </w:rPr>
-              <w:t>Cultural impact</w:t>
-              <w:tab/>
-              <w:t>20</w:t>
-            </w:r>
-          </w:hyperlink>
+          <w:r>
+            <w:rPr/>
+            <w:t>Cultural impact</w:t>
+            <w:tab/>
+            <w:t>20</w:t>
+          </w:r>
         </w:p>
         <w:p>
           <w:pPr>
@@ -1091,16 +883,12 @@
             </w:tabs>
             <w:rPr/>
           </w:pPr>
-          <w:hyperlink w:anchor="__RefHeading___Toc21934_68767826" w:tooltip="Size of the AMNH 6341 animal">
-            <w:r>
-              <w:rPr>
-                <w:rStyle w:val="IndexLink"/>
-              </w:rPr>
-              <w:t>Size of the AMNH 6341 animal</w:t>
-              <w:tab/>
-              <w:t>21</w:t>
-            </w:r>
-          </w:hyperlink>
+          <w:r>
+            <w:rPr/>
+            <w:t>Size of the AMNH 6341 animal</w:t>
+            <w:tab/>
+            <w:t>21</w:t>
+          </w:r>
         </w:p>
         <w:p>
           <w:pPr>
@@ -1111,16 +899,12 @@
             </w:tabs>
             <w:rPr/>
           </w:pPr>
-          <w:hyperlink w:anchor="__RefHeading___Toc3403_68767826" w:tooltip="Acknowledgements">
-            <w:r>
-              <w:rPr>
-                <w:rStyle w:val="IndexLink"/>
-              </w:rPr>
-              <w:t>Acknowledgements</w:t>
-              <w:tab/>
-              <w:t>22</w:t>
-            </w:r>
-          </w:hyperlink>
+          <w:r>
+            <w:rPr/>
+            <w:t>Acknowledgements</w:t>
+            <w:tab/>
+            <w:t>22</w:t>
+          </w:r>
         </w:p>
         <w:p>
           <w:pPr>
@@ -1131,16 +915,12 @@
             </w:tabs>
             <w:rPr/>
           </w:pPr>
-          <w:hyperlink w:anchor="__RefHeading___Toc3405_68767826" w:tooltip="References">
-            <w:r>
-              <w:rPr>
-                <w:rStyle w:val="IndexLink"/>
-              </w:rPr>
-              <w:t>References</w:t>
-              <w:tab/>
-              <w:t>23</w:t>
-            </w:r>
-          </w:hyperlink>
+          <w:r>
+            <w:rPr/>
+            <w:t>References</w:t>
+            <w:tab/>
+            <w:t>23</w:t>
+          </w:r>
         </w:p>
         <w:p>
           <w:pPr>
@@ -1151,16 +931,12 @@
             </w:tabs>
             <w:rPr/>
           </w:pPr>
-          <w:hyperlink w:anchor="__RefHeading___Toc3407_68767826" w:tooltip="Figure Captions">
-            <w:r>
-              <w:rPr>
-                <w:rStyle w:val="IndexLink"/>
-              </w:rPr>
-              <w:t>Figure Captions</w:t>
-              <w:tab/>
-              <w:t>29</w:t>
-            </w:r>
-          </w:hyperlink>
+          <w:r>
+            <w:rPr/>
+            <w:t>Figure Captions</w:t>
+            <w:tab/>
+            <w:t>29</w:t>
+          </w:r>
         </w:p>
         <w:p>
           <w:pPr>
@@ -1171,16 +947,12 @@
             </w:tabs>
             <w:rPr/>
           </w:pPr>
-          <w:hyperlink w:anchor="__RefHeading___Toc25858_1820571732" w:tooltip="Tables">
-            <w:r>
-              <w:rPr>
-                <w:rStyle w:val="IndexLink"/>
-              </w:rPr>
-              <w:t>Tables</w:t>
-              <w:tab/>
-              <w:t>33</w:t>
-            </w:r>
-          </w:hyperlink>
+          <w:r>
+            <w:rPr/>
+            <w:t>Tables</w:t>
+            <w:tab/>
+            <w:t>33</w:t>
+          </w:r>
         </w:p>
         <w:p>
           <w:pPr>
@@ -1191,20 +963,14 @@
             </w:tabs>
             <w:rPr/>
           </w:pPr>
-          <w:hyperlink w:anchor="__RefHeading___Toc25860_1820571732" w:tooltip="Table 1">
-            <w:r>
-              <w:rPr>
-                <w:rStyle w:val="IndexLink"/>
-              </w:rPr>
-              <w:t>Table 1</w:t>
-              <w:tab/>
-              <w:t>33</w:t>
-            </w:r>
-          </w:hyperlink>
           <w:r>
-            <w:rPr>
-              <w:rStyle w:val="IndexLink"/>
-            </w:rPr>
+            <w:rPr/>
+            <w:t>Table 1</w:t>
+            <w:tab/>
+            <w:t>33</w:t>
+          </w:r>
+          <w:r>
+            <w:rPr/>
             <w:fldChar w:fldCharType="end"/>
           </w:r>
         </w:p>
@@ -1350,15 +1116,7 @@
       </w:r>
       <w:r>
         <w:rPr/>
-        <w:t xml:space="preserve"> (Table 1). </w:t>
-      </w:r>
-      <w:r>
-        <w:rPr/>
-        <w:t>We will</w:t>
-      </w:r>
-      <w:r>
-        <w:rPr/>
-        <w:t xml:space="preserve"> consider the composition of the mounted </w:t>
+        <w:t xml:space="preserve"> (Table 1). We will consider the composition of the mounted </w:t>
       </w:r>
       <w:r>
         <w:rPr>
@@ -1402,11 +1160,7 @@
       </w:r>
       <w:r>
         <w:rPr/>
-        <w:t xml:space="preserve">. We will determine which parts are cast from the main specimen AMNH 6341, and which from other specimens. We will discuss how the pose was decided on, summarize the controversy generated by the mount, </w:t>
-      </w:r>
-      <w:r>
-        <w:rPr/>
-        <w:t>survey the history of rearing sauropods, and consider the cultural impact of the AMNH exhibit.</w:t>
+        <w:t>. We will determine which parts are cast from the main specimen AMNH 6341, and which from other specimens. We will discuss how the pose was decided on, summarize the controversy generated by the mount, survey the history of rearing sauropods, and consider the cultural impact of the AMNH exhibit.</w:t>
       </w:r>
     </w:p>
     <w:p>
@@ -1513,7 +1267,20 @@
           <w:szCs w:val="24"/>
           <w:lang w:val="en-GB" w:eastAsia="zh-CN" w:bidi="hi-IN"/>
         </w:rPr>
-        <w:t xml:space="preserve"> consisting of 16 cervicals and nine dorsals, rather th</w:t>
+        <w:t xml:space="preserve"> consisting of 16 cervicals and nine dorsals, rather than 15 and 10 as in </w:t>
+      </w:r>
+      <w:r>
+        <w:rPr>
+          <w:rFonts w:eastAsia="Songti SC" w:cs="Arial Unicode MS"/>
+          <w:i/>
+          <w:iCs/>
+          <w:color w:val="auto"/>
+          <w:kern w:val="2"/>
+          <w:sz w:val="24"/>
+          <w:szCs w:val="24"/>
+          <w:lang w:val="en-GB" w:eastAsia="zh-CN" w:bidi="hi-IN"/>
+        </w:rPr>
+        <w:t>Diplodocus</w:t>
       </w:r>
       <w:r>
         <w:rPr>
@@ -1524,64 +1291,7 @@
           <w:szCs w:val="24"/>
           <w:lang w:val="en-GB" w:eastAsia="zh-CN" w:bidi="hi-IN"/>
         </w:rPr>
-        <w:t>a</w:t>
-      </w:r>
-      <w:r>
-        <w:rPr>
-          <w:rFonts w:eastAsia="Songti SC" w:cs="Arial Unicode MS"/>
-          <w:color w:val="auto"/>
-          <w:kern w:val="2"/>
-          <w:sz w:val="24"/>
-          <w:szCs w:val="24"/>
-          <w:lang w:val="en-GB" w:eastAsia="zh-CN" w:bidi="hi-IN"/>
-        </w:rPr>
-        <w:t xml:space="preserve">n 15 and 10 as in </w:t>
-      </w:r>
-      <w:r>
-        <w:rPr>
-          <w:rFonts w:eastAsia="Songti SC" w:cs="Arial Unicode MS"/>
-          <w:i/>
-          <w:iCs/>
-          <w:color w:val="auto"/>
-          <w:kern w:val="2"/>
-          <w:sz w:val="24"/>
-          <w:szCs w:val="24"/>
-          <w:lang w:val="en-GB" w:eastAsia="zh-CN" w:bidi="hi-IN"/>
-        </w:rPr>
-        <w:t>Diplodocus</w:t>
-      </w:r>
-      <w:r>
-        <w:rPr>
-          <w:rFonts w:eastAsia="Songti SC" w:cs="Arial Unicode MS"/>
-          <w:color w:val="auto"/>
-          <w:kern w:val="2"/>
-          <w:sz w:val="24"/>
-          <w:szCs w:val="24"/>
-          <w:lang w:val="en-GB" w:eastAsia="zh-CN" w:bidi="hi-IN"/>
-        </w:rPr>
-        <w:t xml:space="preserve"> </w:t>
-      </w:r>
-      <w:r>
-        <w:rPr>
-          <w:rFonts w:eastAsia="Songti SC" w:cs="Arial Unicode MS"/>
-          <w:color w:val="auto"/>
-          <w:kern w:val="2"/>
-          <w:sz w:val="24"/>
-          <w:szCs w:val="24"/>
-          <w:lang w:val="en-GB" w:eastAsia="zh-CN" w:bidi="hi-IN"/>
-        </w:rPr>
-        <w:t>(</w:t>
-      </w:r>
-      <w:r>
-        <w:rPr>
-          <w:rFonts w:eastAsia="Songti SC" w:cs="Arial Unicode MS"/>
-          <w:color w:val="auto"/>
-          <w:kern w:val="2"/>
-          <w:sz w:val="24"/>
-          <w:szCs w:val="24"/>
-          <w:lang w:val="en-GB" w:eastAsia="zh-CN" w:bidi="hi-IN"/>
-        </w:rPr>
-        <w:t>although see discussion below).</w:t>
+        <w:t xml:space="preserve"> (although see discussion below).</w:t>
       </w:r>
     </w:p>
     <w:p>
@@ -1653,11 +1363,7 @@
       </w:pPr>
       <w:r>
         <w:rPr/>
-        <w:t>MB</w:t>
-      </w:r>
-      <w:r>
-        <w:rPr/>
-        <w:t xml:space="preserve"> — Museum für Naturkunde Berlin, Berlin, Germany; specimen numbers for fossil reptiles take the form MB.R.</w:t>
+        <w:t>MB — Museum für Naturkunde Berlin, Berlin, Germany; specimen numbers for fossil reptiles take the form MB.R.</w:t>
       </w:r>
       <w:r>
         <w:rPr>
@@ -1867,15 +1573,7 @@
       </w:pPr>
       <w:r>
         <w:rPr/>
-        <w:t>However, Marsh died the next year, and work on the specimen stalled. Almost two further decades passed before YPM 429 was fully prepared and Richard S. Lull was able to make a presentation o</w:t>
-      </w:r>
-      <w:r>
-        <w:rPr/>
-        <w:t>n</w:t>
-      </w:r>
-      <w:r>
-        <w:rPr/>
-        <w:t xml:space="preserve"> the specimen at the end of 1916 at the eighth annual meeting of the Paleontological Society in Albany, NY. Unfortunately, his abstract (Lull 1917), at only 74 words in length, is largely uninformative. Subsequently he described the specimen in detail in a significant monograph (Lull 1919), which remained the definitive publication on </w:t>
+        <w:t xml:space="preserve">However, Marsh died the next year, and work on the specimen stalled. Almost two further decades passed before YPM 429 was fully prepared and Richard S. Lull was able to make a presentation on the specimen at the end of 1916 at the eighth annual meeting of the Paleontological Society in Albany, NY. Unfortunately, his abstract (Lull 1917), at only 74 words in length, is largely uninformative. Subsequently he described the specimen in detail in a significant monograph (Lull 1919), which remained the definitive publication on </w:t>
       </w:r>
       <w:r>
         <w:rPr>
@@ -2104,15 +1802,7 @@
       </w:pPr>
       <w:r>
         <w:rPr/>
-        <w:t>As Douglass and his colleagues excavat</w:t>
-      </w:r>
-      <w:r>
-        <w:rPr/>
-        <w:t>ed</w:t>
-      </w:r>
-      <w:r>
-        <w:rPr/>
-        <w:t>, it quickly became apparent that there were many more dinosaurs in the rock. Excavating these fossils now became Douglass’s full-time job (Figure 2). The Carnegie Quarry, as it was named, would become one of the most fruitful in palaeontological history. The Museum funded the excavations for 13 years, shipping 700,000 lb of material to Pittsburgh (Gilmore 1936:170) —  318 tonnes.</w:t>
+        <w:t>As Douglass and his colleagues excavated, it quickly became apparent that there were many more dinosaurs in the rock. Excavating these fossils now became Douglass’s full-time job (Figure 2). The Carnegie Quarry, as it was named, would become one of the most fruitful in palaeontological history. The Museum funded the excavations for 13 years, shipping 700,000 lb of material to Pittsburgh (Gilmore 1936:170) — 318 tonnes.</w:t>
       </w:r>
     </w:p>
     <w:p>
@@ -2151,15 +1841,7 @@
       </w:r>
       <w:r>
         <w:rPr/>
-        <w:t xml:space="preserve"> to the </w:t>
-      </w:r>
-      <w:r>
-        <w:rPr/>
-        <w:t>USNM</w:t>
-      </w:r>
-      <w:r>
-        <w:rPr/>
-        <w:t xml:space="preserve"> to excavate (Stewart 1922a).</w:t>
+        <w:t xml:space="preserve"> to the USNM to excavate (Stewart 1922a).</w:t>
       </w:r>
     </w:p>
     <w:p>
@@ -2179,19 +1861,7 @@
       </w:pPr>
       <w:r>
         <w:rPr/>
-        <w:t xml:space="preserve">In a brief telegram on 10 November, </w:t>
-      </w:r>
-      <w:r>
-        <w:rPr/>
-        <w:t xml:space="preserve">Douglass reported to Merrill the existence of two sauropods in the quarry (Douglass 1922a). The next day, Merrill wrote to Douglass requesting technical and logistical information. Douglass replied on 22 November (Douglass 1922b) with a long and helpful letter explaining how </w:t>
-      </w:r>
-      <w:r>
-        <w:rPr/>
-        <w:t xml:space="preserve">the </w:t>
-      </w:r>
-      <w:r>
-        <w:rPr/>
-        <w:t xml:space="preserve">two sauropod skeletons, both thought to be </w:t>
+        <w:t xml:space="preserve">In a brief telegram on 10 November, Douglass reported to Merrill the existence of two sauropods in the quarry (Douglass 1922a). The next day, Merrill wrote to Douglass requesting technical and logistical information. Douglass replied on 22 November (Douglass 1922b) with a long and helpful letter explaining how the two sauropod skeletons, both thought to be </w:t>
       </w:r>
       <w:r>
         <w:rPr>
@@ -2244,15 +1914,7 @@
       </w:pPr>
       <w:r>
         <w:rPr/>
-        <w:t xml:space="preserve">Charles W. Gilmore arrived at the quarry on 14 May 1923 to work it for the USNM and was shown around by Douglass, who was about to leave for Colorado (Gilmore 1923b). Gilmore inherited </w:t>
-      </w:r>
-      <w:r>
-        <w:rPr/>
-        <w:t xml:space="preserve">the </w:t>
-      </w:r>
-      <w:r>
-        <w:rPr/>
-        <w:t xml:space="preserve">two partially uncovered skeletons, both then thought to be </w:t>
+        <w:t xml:space="preserve">Charles W. Gilmore arrived at the quarry on 14 May 1923 to work it for the USNM and was shown around by Douglass, who was about to leave for Colorado (Gilmore 1923b). Gilmore inherited the two partially uncovered skeletons, both then thought to be </w:t>
       </w:r>
       <w:r>
         <w:rPr>
@@ -2284,23 +1946,7 @@
       </w:pPr>
       <w:r>
         <w:rPr/>
-        <w:t xml:space="preserve">Douglass </w:t>
-      </w:r>
-      <w:r>
-        <w:rPr/>
-        <w:t xml:space="preserve">also </w:t>
-      </w:r>
-      <w:r>
-        <w:rPr/>
-        <w:t>handed over to Gilmore four large blocks and several smaller ones containing much of the neck of #340, which as noted above had been extracted from the quarry but not prepared out. It was Gilmore’s intention to extract #355 (the mo</w:t>
-      </w:r>
-      <w:r>
-        <w:rPr/>
-        <w:t>re</w:t>
-      </w:r>
-      <w:r>
-        <w:rPr/>
-        <w:t xml:space="preserve"> complete of the two) for the USNM, then secure the parts of #340 necessary to complete the skeleton (Gilmore 1923b). (#355 was subsequently accessioned as USNM 10865 and mounted in Washington D.C, where it remains in the public gallery to this day.</w:t>
+        <w:t>Douglass also handed over to Gilmore four large blocks and several smaller ones containing much of the neck of #340, which as noted above had been extracted from the quarry but not prepared out. It was Gilmore’s intention to extract #355 (the more complete of the two) for the USNM, then secure the parts of #340 necessary to complete the skeleton (Gilmore 1923b). (#355 was subsequently accessioned as USNM 10865 and mounted in Washington D.C, where it remains in the public gallery to this day.</w:t>
       </w:r>
     </w:p>
     <w:p>
@@ -2310,15 +1956,7 @@
       </w:pPr>
       <w:r>
         <w:rPr/>
-        <w:t>On 8 August 1923, Gilmore wrote briefly to Ravenel to say that work in the quarry was complete and the extracted blocks would be shipped to the USNM soon after 19 August (Gilmore 1923a), and sen</w:t>
-      </w:r>
-      <w:r>
-        <w:rPr/>
-        <w:t>t</w:t>
-      </w:r>
-      <w:r>
-        <w:rPr/>
-        <w:t xml:space="preserve"> a more comprehensive report in 30 August (Gilmore 1923b). In 1924, all excavation at the quarry ended.</w:t>
+        <w:t>On 8 August 1923, Gilmore wrote briefly to Ravenel to say that work in the quarry was complete and the extracted blocks would be shipped to the USNM soon after 19 August (Gilmore 1923a), and sent a more comprehensive report in 30 August (Gilmore 1923b). In 1924, all excavation at the quarry ended.</w:t>
       </w:r>
     </w:p>
     <w:p>
@@ -2328,15 +1966,7 @@
       </w:pPr>
       <w:r>
         <w:rPr/>
-        <w:t xml:space="preserve">USNM’s only interest in #340 was apparently in using elements of the skeleton to complete #355 for a gallery mount (Gilmore 1923b:1), so only the cervicals, three anterior dorsals, right scapula, humerus and radius and a sternal plate were sent there (Gilmore 1923b:3). Some material of #340 went to the Carnegie Museum:  Gilmore </w:t>
-      </w:r>
-      <w:r>
-        <w:rPr/>
-        <w:t>(</w:t>
-      </w:r>
-      <w:r>
-        <w:rPr/>
-        <w:t xml:space="preserve">1923b:1) wrote that “One block belonging to this specimen was shipped to Pittsburgh, but will, I understand, be turned over to the National Museum as soon as certain bones of another individual are extracted from it”. It seems however that at least </w:t>
+        <w:t xml:space="preserve">USNM’s only interest in #340 was apparently in using elements of the skeleton to complete #355 for a gallery mount (Gilmore 1923b:1), so only the cervicals, three anterior dorsals, right scapula, humerus and radius and a sternal plate were sent there (Gilmore 1923b:3). Some material of #340 went to the Carnegie Museum: Gilmore (1923b:1) wrote that “One block belonging to this specimen was shipped to Pittsburgh, but will, I understand, be turned over to the National Museum as soon as certain bones of another individual are extracted from it”. It seems however that at least </w:t>
       </w:r>
       <w:r>
         <w:rPr>
@@ -2347,7 +1977,7 @@
       </w:r>
       <w:r>
         <w:rPr/>
-        <w:t xml:space="preserve"> blocks went to Pittsburgh. One, containing part of the neck, was shipped from there to the USNM in October 1924 (Coggeshall 1924); but there were also caudals, which would still be at the Carnegie at the end of 1929: “nine or ten vertebrae in the Carnegie Museum are preserved  in two blocks 348/A and 348/B” (Brown 1929).</w:t>
+        <w:t xml:space="preserve"> blocks went to Pittsburgh. One, containing part of the neck, was shipped from there to the USNM in October 1924 (Coggeshall 1924); but there were also caudals, which would still be at the Carnegie at the end of 1929: “nine or ten vertebrae in the Carnegie Museum are preserved in two blocks 348/A and 348/B” (Brown 1929).</w:t>
       </w:r>
     </w:p>
     <w:p>
@@ -2357,15 +1987,7 @@
       </w:pPr>
       <w:r>
         <w:rPr/>
-        <w:t xml:space="preserve">In April 1924, Earl Douglass was offered a position at the University of Utah and resigned his position with Carnegie Museum (Douglass 1879–1953). He excavated the remainder of #340 </w:t>
-      </w:r>
-      <w:r>
-        <w:rPr/>
-        <w:t xml:space="preserve">(XXX list material) </w:t>
-      </w:r>
-      <w:r>
-        <w:rPr/>
-        <w:t>and sent it to the University of Utah. This left the skeleton now spread across three institutions in Salt Lake City, Pittsburgh, and Washington, D.C. It is perhaps for this reason that, although the portion of the skeleton at the University of Utah was prepared, it was never mounted.</w:t>
+        <w:t>In April 1924, Earl Douglass was offered a position at the University of Utah and resigned his position with Carnegie Museum (Douglass 1879–1953). He excavated the remainder of #340 and sent it to the University of Utah. This left the skeleton now spread across three institutions in Salt Lake City, Pittsburgh, and Washington, D.C. It is perhaps for this reason that, although the portion of the skeleton at the University of Utah was prepared, it was never mounted.</w:t>
       </w:r>
     </w:p>
     <w:p>
@@ -2375,15 +1997,7 @@
       </w:pPr>
       <w:r>
         <w:rPr/>
-        <w:t xml:space="preserve">The material </w:t>
-      </w:r>
-      <w:r>
-        <w:rPr/>
-        <w:t xml:space="preserve">of #340 </w:t>
-      </w:r>
-      <w:r>
-        <w:rPr/>
-        <w:t xml:space="preserve">in Washington was accessioned as USNM 11647 on 11 April 1927 (Abby Telfer, pers. comm., 2025). When it was prepared, what had been thought in the field to be two cervicals proved to be a single long cervical (McIntosh 2005:43). It was then apparent that the cervicals (and the rest of #340) did not belong to </w:t>
+        <w:t xml:space="preserve">The material of #340 in Washington was accessioned as USNM 11647 on 11 April 1927 (Abby Telfer, pers. comm., 2025). When it was prepared, what had been thought in the field to be two cervicals proved to be a single long cervical (McIntosh 2005:43). It was then apparent that the cervicals (and the rest of #340) did not belong to </w:t>
       </w:r>
       <w:r>
         <w:rPr>
@@ -2466,15 +2080,7 @@
       </w:r>
       <w:r>
         <w:rPr/>
-        <w:t xml:space="preserve"> </w:t>
-      </w:r>
-      <w:r>
-        <w:rPr/>
-        <w:t>(AMNH 5428, now USNM 12814),</w:t>
-      </w:r>
-      <w:r>
-        <w:rPr/>
-        <w:t xml:space="preserve"> the University of Utah made a cash-plus-fossils deal in which they were paid $2,500 cash plus the equivalent value in fossil mammal specimens (Brown 1929). The process of bringing the skeleton back together dragged on: the thirteen crates of material at the USNM were transported to the AMNH only in February 1933 (Wetmore 1933), perhaps because Wetmore himself — Secretary of the USNM — did “not favour disposal of this </w:t>
+        <w:t xml:space="preserve"> (AMNH 5428, now USNM 12814), the University of Utah made a cash-plus-fossils deal in which they were paid $2,500 cash plus the equivalent value in fossil mammal specimens (Brown 1929). The process of bringing the skeleton back together dragged on: the thirteen crates of material at the USNM were transported to the AMNH only in February 1933 (Wetmore 1933), perhaps because Wetmore himself — Secretary of the USNM — did “not favour disposal of this </w:t>
       </w:r>
       <w:r>
         <w:rPr>
@@ -2516,15 +2122,7 @@
       </w:pPr>
       <w:r>
         <w:rPr/>
-        <w:t xml:space="preserve">The issue of the number of cervicals is complex. Gilmore’s count of 13 cervicals is compatible with Douglass’s (1922b:3) report that “the skull and two or three of the anterior cervicals of no. 340 had been detached and were not in place” — an absence that would leave 13 cervicals remaining in an animal with 15 of 16  neck vertebrae. The reduction to 10 in Brown’s list, made after the material had been prepared at USNM, can be explained as a consequence of supposed pairs turning out to be single long vertebrae. This </w:t>
-      </w:r>
-      <w:r>
-        <w:rPr/>
-        <w:t xml:space="preserve">lower </w:t>
-      </w:r>
-      <w:r>
-        <w:rPr/>
-        <w:t xml:space="preserve">count is also in accord with the quarry map of Gilmore (1932:figure 1; Figure 3). This shows nine dorsals and ten cervicals belonging to the </w:t>
+        <w:t xml:space="preserve">The issue of the number of cervicals is complex. Gilmore’s count of 13 cervicals is compatible with Douglass’s (1922b:3) report that “the skull and two or three of the anterior cervicals of no. 340 had been detached and were not in place” — an absence that would leave 13 cervicals remaining in an animal with 15 of 16  neck vertebrae. The reduction to 10 in Brown’s list, made after the material had been prepared at USNM, can be explained as a consequence of supposed pairs turning out to be single long vertebrae. This lower count is also in accord with the quarry map of Gilmore (1932:figure 1; Figure 3). This shows nine dorsals and ten cervicals belonging to the </w:t>
       </w:r>
       <w:r>
         <w:rPr>
@@ -2535,27 +2133,7 @@
       </w:r>
       <w:r>
         <w:rPr/>
-        <w:t xml:space="preserve"> skeleton (although the line-drawings of the cervicals do not at all resemble the actual vertebrae: compare Figure 4). If the cervical count of ten in the quarry map and Brown’s memo is correct, the most anterior of the cervicals (C7) seems to have been lost or destroyed </w:t>
-      </w:r>
-      <w:r>
-        <w:rPr/>
-        <w:t>some time in the next 30 years</w:t>
-      </w:r>
-      <w:r>
-        <w:rPr/>
-        <w:t xml:space="preserve">, since McIntosh’s unpublished 1962 notes, his published account (McIntosh 2005) and the present fossil holdings at the AMNH all include only nine cervical vertebrae, C8–16. Carl Mehling (pers. comm., 2022) has searched in collections for the missing C7 and been unable to locate it. In fact, the C7, if it ever existed, was likely lost or destroyed prior to the 1939 renovation: photographs </w:t>
-      </w:r>
-      <w:r>
-        <w:rPr/>
-        <w:t xml:space="preserve">from that time </w:t>
-      </w:r>
-      <w:r>
-        <w:rPr/>
-        <w:t xml:space="preserve">(Figure 5B) show the anteriormost cervical vertebra on display, and it is recognizable as the C8 that is the anteriormost currently preserved vertebra; </w:t>
-      </w:r>
-      <w:r>
-        <w:rPr/>
-        <w:t>and the signage that accompanied the exhibit (Figure 6) indicates that nine cervicals were present.</w:t>
+        <w:t xml:space="preserve"> skeleton (although the line-drawings of the cervicals do not at all resemble the actual vertebrae: compare Figure 4). If the cervical count of ten in the quarry map and Brown’s memo is correct, the most anterior of the cervicals (C7) seems to have been lost or destroyed some time in the next 30 years, since McIntosh’s unpublished 1962 notes, his published account (McIntosh 2005) and the present fossil holdings at the AMNH all include only nine cervical vertebrae, C8–16. Carl Mehling (pers. comm., 2022) has searched in collections for the missing C7 and been unable to locate it. In fact, the C7, if it ever existed, was likely lost or destroyed prior to the 1939 renovation: photographs from that time (Figure 5B) show the anteriormost cervical vertebra on display, and it is recognizable as the C8 that is the anteriormost currently preserved vertebra; and the signage that accompanied the exhibit (Figure 6) indicates that nine cervicals were present.</w:t>
       </w:r>
     </w:p>
     <w:p>
@@ -2601,15 +2179,7 @@
       </w:pPr>
       <w:r>
         <w:rPr/>
-        <w:t>The three parts of AMNH 6341 had been reunited from their layovers in the USNM, Utah University and Carnegie Museum by 193</w:t>
-      </w:r>
-      <w:r>
-        <w:rPr/>
-        <w:t>3</w:t>
-      </w:r>
-      <w:r>
-        <w:rPr/>
-        <w:t xml:space="preserve"> or shortly thereafter. However, having acquired their </w:t>
+        <w:t xml:space="preserve">The three parts of AMNH 6341 had been reunited from their layovers in the USNM, Utah University and Carnegie Museum by 1933 or shortly thereafter. However, having acquired their </w:t>
       </w:r>
       <w:r>
         <w:rPr>
@@ -2706,15 +2276,7 @@
       </w:pPr>
       <w:r>
         <w:rPr/>
-        <w:t xml:space="preserve">It occurred to Lowell Dingus, then project director of the fossil halls renovation project, that the most spectacular exhibit would be a gigantic sauropod rearing up on its hind legs. Jack McIntosh told Dingus about the </w:t>
-      </w:r>
-      <w:r>
-        <w:rPr/>
-        <w:t>long</w:t>
-      </w:r>
-      <w:r>
-        <w:rPr/>
-        <w:t xml:space="preserve">-neglected </w:t>
+        <w:t xml:space="preserve">It occurred to Lowell Dingus, then project director of the fossil halls renovation project, that the most spectacular exhibit would be a gigantic sauropod rearing up on its hind legs. Jack McIntosh told Dingus about the long-neglected </w:t>
       </w:r>
       <w:r>
         <w:rPr>
@@ -2802,15 +2364,7 @@
       </w:r>
       <w:r>
         <w:rPr/>
-        <w:t xml:space="preserve"> provides cover for its retreating allies by facing down the </w:t>
-      </w:r>
-      <w:r>
-        <w:rPr/>
-        <w:t>predator</w:t>
-      </w:r>
-      <w:r>
-        <w:rPr/>
-        <w:t xml:space="preserve"> in a rearing threat display. This initial version of the painting was reproduced in Bird (1985:59), but Paul became dissatisfied with it and painted over parts of the original in 1983 and 1985 to produce the better known final version (Figure 7) in which the attack is by a whole pack of </w:t>
+        <w:t xml:space="preserve"> provides cover for its retreating allies by facing down the predator in a rearing threat display. This initial version of the painting was reproduced in Bird (1985:59), but Paul became dissatisfied with it and painted over parts of the original in 1983 and 1985 to produce the better known final version (Figure 7) in which the attack is by a whole pack of </w:t>
       </w:r>
       <w:r>
         <w:rPr>
@@ -2906,15 +2460,7 @@
       </w:pPr>
       <w:r>
         <w:rPr/>
-        <w:t xml:space="preserve">Dr. John (Jack) S. McIntosh, a professor of theoretical physics at Wesleyan University in Connecticut, was an avocational paleontologist specialising in sauropods, and through work done in his spare time became the world’s leading expert on the group. Gaffney knew him from his undergraduate days and when he succeeded Colbert as curator of the AMNH fossil reptile collection in 1970, McIntosh had provided a great deal of information about the AMNH dinosaurs. He </w:t>
-      </w:r>
-      <w:r>
-        <w:rPr/>
-        <w:t xml:space="preserve">had </w:t>
-      </w:r>
-      <w:r>
-        <w:rPr/>
-        <w:t xml:space="preserve">told Gaffney that the museum had one of the best known sauropod skeletons in its collection and that he thought it was the then poorly known </w:t>
+        <w:t xml:space="preserve">Dr. John (Jack) S. McIntosh, a professor of theoretical physics at Wesleyan University in Connecticut, was an avocational paleontologist specialising in sauropods, and through work done in his spare time became the world’s leading expert on the group. Gaffney knew him from his undergraduate days and when he succeeded Colbert as curator of the AMNH fossil reptile collection in 1970, McIntosh had provided a great deal of information about the AMNH dinosaurs. He had told Gaffney that the museum had one of the best known sauropod skeletons in its collection and that he thought it was the then poorly known </w:t>
       </w:r>
       <w:r>
         <w:rPr>
@@ -2967,21 +2513,7 @@
           <w:i w:val="false"/>
           <w:iCs w:val="false"/>
         </w:rPr>
-        <w:t xml:space="preserve">While providing a breathtaking first impression of the museum for new visitors, the purpose of the mount extended well beyond the visual power of viewing the tallest free-standing dinosaur mount ever constructed. More importantly, the mount would introduce a major scientific theme that would be integrated into all the fossil halls encompassed in the renovation project: what can we actually know about extinct </w:t>
-      </w:r>
-      <w:r>
-        <w:rPr>
-          <w:i w:val="false"/>
-          <w:iCs w:val="false"/>
-        </w:rPr>
-        <w:t>animals</w:t>
-      </w:r>
-      <w:r>
-        <w:rPr>
-          <w:i w:val="false"/>
-          <w:iCs w:val="false"/>
-        </w:rPr>
-        <w:t xml:space="preserve">, and what can’t we know based on the limited kinds of data preserved in their fossils? The exhibition label for the mount clearly stated this conundrum in a section entitled </w:t>
+        <w:t xml:space="preserve">While providing a breathtaking first impression of the museum for new visitors, the purpose of the mount extended well beyond the visual power of viewing the tallest free-standing dinosaur mount ever constructed. More importantly, the mount would introduce a major scientific theme that would be integrated into all the fossil halls encompassed in the renovation project: what can we actually know about extinct animals, and what can’t we know based on the limited kinds of data preserved in their fossils? The exhibition label for the mount clearly stated this conundrum in a section entitled </w:t>
       </w:r>
       <w:r>
         <w:rPr>
@@ -3026,7 +2558,7 @@
     </w:p>
     <w:p>
       <w:pPr>
-        <w:pStyle w:val="BlockQuotation"/>
+        <w:pStyle w:val="BlockQuotationuser"/>
         <w:rPr/>
       </w:pPr>
       <w:r>
@@ -3112,31 +2644,7 @@
       </w:pPr>
       <w:r>
         <w:rPr/>
-        <w:t xml:space="preserve">At the time of the casting-and-mounting project, </w:t>
-      </w:r>
-      <w:r>
-        <w:rPr/>
-        <w:t>the process</w:t>
-      </w:r>
-      <w:r>
-        <w:rPr/>
-        <w:t xml:space="preserve"> was well documented with contracts, architectural drawings, inventories, shipping notes and other documents. But with the passage of more than three decades, nearly all this paperwork has been lost. The retirement of key individuals at the AMNH, including several authors of the present work, resulted in records being moved between offices and ultimately misplaced; and an extensive search of RCI’s archives has turned up little. As a result, nearly all that follows has been assembled from the memories of the individuals involved, supplemented by information from contemporary and near-contemporary accounts such as those of Norell et al. (1991) and Dingus (1996), and </w:t>
-      </w:r>
-      <w:r>
-        <w:rPr/>
-        <w:t>the relatively</w:t>
-      </w:r>
-      <w:r>
-        <w:rPr/>
-        <w:t xml:space="preserve"> few documents </w:t>
-      </w:r>
-      <w:r>
-        <w:rPr/>
-        <w:t xml:space="preserve">that </w:t>
-      </w:r>
-      <w:r>
-        <w:rPr/>
-        <w:t>were recovered from AMNH archives.</w:t>
+        <w:t>At the time of the casting-and-mounting project, the process was well documented with contracts, architectural drawings, inventories, shipping notes and other documents. But with the passage of more than three decades, nearly all this paperwork has been lost. The retirement of key individuals at the AMNH, including several authors of the present work, resulted in records being moved between offices and ultimately misplaced; and an extensive search of RCI’s archives has turned up little. As a result, nearly all that follows has been assembled from the memories of the individuals involved, supplemented by information from contemporary and near-contemporary accounts such as those of Norell et al. (1991) and Dingus (1996), and the relatively few documents that were recovered from AMNH archives.</w:t>
       </w:r>
     </w:p>
     <w:p>
@@ -3178,11 +2686,240 @@
       </w:r>
       <w:r>
         <w:rPr/>
-        <w:t xml:space="preserve"> can mass well over 100 kg, and supporting them in the rearing pose would have required a prohibitively strong armature. Furthermore, permanently mounting these scientifically significant fossils 10 m above ground level, even if logistically feasible, would effectively make them unavailable for study. For these reasons, while the mounted skeletons in the main Fossil Halls of the AMNH are mostly real bone, the Roosevelt Memorial Hall display consists entirely of </w:t>
-      </w:r>
-      <w:r>
-        <w:rPr/>
-        <w:t>replicas</w:t>
+        <w:t xml:space="preserve"> can mass well over 100 kg, and supporting them in the rearing pose would have required a prohibitively strong armature. Furthermore, permanently mounting these scientifically significant fossils 10 m above ground level, even if logistically feasible, would effectively make them unavailable for study. For these reasons, while the mounted skeletons in the main Fossil Halls of the AMNH are mostly real bone, the Roosevelt Memorial Hall display consists entirely of replicas.</w:t>
+      </w:r>
+    </w:p>
+    <w:p>
+      <w:pPr>
+        <w:pStyle w:val="BodyText"/>
+        <w:rPr/>
+      </w:pPr>
+      <w:r>
+        <w:rPr/>
+        <w:t xml:space="preserve">The bones of AMNH 6341, the </w:t>
+      </w:r>
+      <w:r>
+        <w:rPr>
+          <w:i/>
+          <w:iCs/>
+        </w:rPr>
+        <w:t>Barosaurus</w:t>
+      </w:r>
+      <w:r>
+        <w:rPr/>
+        <w:t xml:space="preserve"> specimen that was to provide most of the mount, were in poor condition by 1990. The presacral vertebrae, scapulocoracoid and humerus had been in collections for the best part of 40 years, since Colbert’s early-1950s renovation; the rest of the bones had been there for 60 years, ever since being reunited by Barnum Brown in 1930. Bones in collections can degrade with time, especially the complex and delicate presacral vertebrae, and it is not unknown for broken-off parts to become separated from the elements they belong to. A program of repair and cleaning was required. As outlined below, about 80% of the skeleton was present. These available </w:t>
+      </w:r>
+      <w:r>
+        <w:rPr>
+          <w:i/>
+          <w:iCs/>
+        </w:rPr>
+        <w:t>Barosaurus</w:t>
+      </w:r>
+      <w:r>
+        <w:rPr/>
+        <w:t xml:space="preserve"> elements were cast, and most of the remainder of the skeleton was taken from a cast of the closely related </w:t>
+      </w:r>
+      <w:r>
+        <w:rPr>
+          <w:i/>
+          <w:iCs/>
+        </w:rPr>
+        <w:t>Diplodocus carnegii</w:t>
+      </w:r>
+      <w:r>
+        <w:rPr/>
+        <w:t xml:space="preserve"> with a few elements sculpted (details below).</w:t>
+      </w:r>
+    </w:p>
+    <w:p>
+      <w:pPr>
+        <w:pStyle w:val="BodyText"/>
+        <w:rPr/>
+      </w:pPr>
+      <w:r>
+        <w:rPr/>
+        <w:t xml:space="preserve">All casting and sculpting was done by Research Casting International (RCI), an organization specializing in mounting prehistoric animals that had then only recently been established. Founder Peter May had started working with fossil mounts at the Royal Ontario Museum, beginning in 1977, where he learned the techniques from paleontology technician Gordon Gyrmov and former WW2 Luftwaffe rocket-plane test pilot Rudy Zimmermann. May rose to became the head technician at the ROM. Having worked for a while at the Royal Tyrrell Paleontology Museum in Alberta, he found on returning to the ROM that his expertise was in demand from other museums. Initially fitting this outside work into his spare time under the banner of RCI, he went full time with his company in 1990, and the AMNH </w:t>
+      </w:r>
+      <w:r>
+        <w:rPr>
+          <w:i/>
+          <w:iCs/>
+        </w:rPr>
+        <w:t>Barosaurus</w:t>
+      </w:r>
+      <w:r>
+        <w:rPr/>
+        <w:t xml:space="preserve"> was to become their most important early commission. May’s first meeting with Lowell Dingus, Gene Gaffney, Jack MacIntosh and Phil Currie was on 30 January 30 1990 at the AMNH.</w:t>
+      </w:r>
+    </w:p>
+    <w:p>
+      <w:pPr>
+        <w:pStyle w:val="BodyText"/>
+        <w:rPr/>
+      </w:pPr>
+      <w:r>
+        <w:rPr/>
+        <w:t xml:space="preserve">On 28 March 1990, an agreement was made between Lowell Dingus, acting for the AMNH, and Peter May and Andrew Leitch, acting for RCI, to provide the fully mounted and painted cast skeletons of a rearing adult </w:t>
+      </w:r>
+      <w:r>
+        <w:rPr>
+          <w:i/>
+          <w:iCs/>
+        </w:rPr>
+        <w:t>Barosaurus</w:t>
+      </w:r>
+      <w:r>
+        <w:rPr/>
+        <w:t xml:space="preserve">, a juvenile, and an </w:t>
+      </w:r>
+      <w:r>
+        <w:rPr>
+          <w:i/>
+          <w:iCs/>
+        </w:rPr>
+        <w:t>Allosaurus</w:t>
+      </w:r>
+      <w:r>
+        <w:rPr/>
+        <w:t xml:space="preserve"> (Dingus 1990). The total agreed cost was $184,675 (equivalent to $472,000 in 2026 according to usinflationcalculator.com.) This amount was made up of $72,721 for the adult </w:t>
+      </w:r>
+      <w:r>
+        <w:rPr>
+          <w:i/>
+          <w:iCs/>
+        </w:rPr>
+        <w:t>Barosaurus</w:t>
+      </w:r>
+      <w:r>
+        <w:rPr/>
+        <w:t xml:space="preserve">, $75,136 for the juvenile, $16,660 for the </w:t>
+      </w:r>
+      <w:r>
+        <w:rPr>
+          <w:i/>
+          <w:iCs/>
+        </w:rPr>
+        <w:t>Allosaurus</w:t>
+      </w:r>
+      <w:r>
+        <w:rPr/>
+        <w:t xml:space="preserve">, $15,411 for a duplicate model of the juvenile </w:t>
+      </w:r>
+      <w:r>
+        <w:rPr>
+          <w:i/>
+          <w:iCs/>
+        </w:rPr>
+        <w:t>Barosaurus</w:t>
+      </w:r>
+      <w:r>
+        <w:rPr/>
+        <w:t xml:space="preserve"> for Dinosaur National Monument, and $4,748 for travel and transport. (Surprisingly, the small juvenile cost more than than adult!). The agreement was signed by Dingus on 28 March, by May and Leitch on 30 March, and by AMNH director William J,. Moynihan on 3 April.</w:t>
+      </w:r>
+    </w:p>
+    <w:p>
+      <w:pPr>
+        <w:pStyle w:val="BodyText"/>
+        <w:rPr/>
+      </w:pPr>
+      <w:r>
+        <w:rPr/>
+        <w:t xml:space="preserve">In the fall 1990, the RCI crew took the repaired and cleaned </w:t>
+      </w:r>
+      <w:r>
+        <w:rPr>
+          <w:i/>
+          <w:iCs/>
+        </w:rPr>
+        <w:t>Barosaurus</w:t>
+      </w:r>
+      <w:r>
+        <w:rPr/>
+        <w:t xml:space="preserve"> fossils in a semi truck from New York to Toronto, where they remained for the best part of a year. There, the bones were duplicated. First, they were coated with latex, which was then cured to form rubber molds (Figure 10). The bones were then cast, first with a layer of gel coat inside the molds, and then in various materials. As noted by </w:t>
+      </w:r>
+      <w:r>
+        <w:rPr>
+          <w:shd w:fill="auto" w:val="clear"/>
+        </w:rPr>
+        <w:t>Norell et al. (1991:38), “Those that would stand near the ground were cast in higher-density and more durable materials, while those higher up were made of lighter substances.” Specifically, the lower elements were cast in polyester resin and fiberglass with a substantial steel armature, while the dorsal series, ribs and cervicals were cast with a much lighter fiberglass matt and backfilled with polyurethane foam to keep the weight down as low as possible. (Due to the lightness of these elevated elements, the steel armature could be reduced too.)</w:t>
+      </w:r>
+    </w:p>
+    <w:p>
+      <w:pPr>
+        <w:pStyle w:val="BodyText"/>
+        <w:rPr/>
+      </w:pPr>
+      <w:r>
+        <w:rPr/>
+        <w:t>These accurate replicas of the original fossils, when painted, were indistinguishable from real bone but weighed only a twentieth as much as the fragile and irreplaceable originals. The casts were not “corrected” to account for distortion in the original bones: they are faithful reproductions of what is preserved.</w:t>
+      </w:r>
+    </w:p>
+    <w:p>
+      <w:pPr>
+        <w:pStyle w:val="BodyText"/>
+        <w:rPr/>
+      </w:pPr>
+      <w:r>
+        <w:rPr/>
+        <w:t xml:space="preserve">Most cervical ribs, however, were missing from the original cervical vertebrae. (These fragile projections are rarely preserved intact.) The missing parts of the skeleton were mostly replaced by elements cast from the Carnegie </w:t>
+      </w:r>
+      <w:r>
+        <w:rPr>
+          <w:i/>
+          <w:iCs/>
+        </w:rPr>
+        <w:t>Diplodocus</w:t>
+      </w:r>
+      <w:r>
+        <w:rPr/>
+        <w:t xml:space="preserve">, though some were fabricated in Toronto. Records do not show exactly which </w:t>
+      </w:r>
+      <w:r>
+        <w:rPr>
+          <w:shd w:fill="auto" w:val="clear"/>
+        </w:rPr>
+        <w:t>bones were sculpted but Peter May was the only sculptor at RCI at the time the skeleton was being prepared, and he does not recall sculpting any elements other than the metacarpals discussed below and possibly some cervical ribs.</w:t>
+      </w:r>
+    </w:p>
+    <w:p>
+      <w:pPr>
+        <w:pStyle w:val="BodyText"/>
+        <w:rPr/>
+      </w:pPr>
+      <w:r>
+        <w:rPr/>
+        <w:t xml:space="preserve">In spring of 1991, a test erection of the rearing </w:t>
+      </w:r>
+      <w:r>
+        <w:rPr>
+          <w:i/>
+          <w:iCs/>
+        </w:rPr>
+        <w:t>Barosaurus</w:t>
+      </w:r>
+      <w:r>
+        <w:rPr/>
+        <w:t xml:space="preserve"> mount was carried out with the aid of a hired crane and 15 m scissor lift (Figure 11). This had to be done in the parking lot behind the RCI workshop, as the completed mount would be too tall to fit inside the workshop. The event was attended by a group from the AMNH, and Jack McIntosh, who had been brought in as a consultant to ensure that the bones were articulated correctly in the mount (Figure 12). Also present were photographers including National Geographic’s Louie Psihoyos, a television crew, at least one observer from another museum, and a crowd of local workers on their lunch-breaks. The skeleton was pieced together from prefabricated sections. The exercise began with the “tripod” of hindlimbs and tail, anchored together at the pelvis, providing a stable base. These were followed by the torso section, then the three sections of the neck and head, and finally the forelimbs. Dingus (1996:25–28) recalled that “the strangest thing was that the mount actually looked rather natural and graceful […] I had always been extremely skeptical about whether sauropods could rear up to such heights, but the grace of the mount almost erased my doubt”. Although the initial assembly of the rearing barosaur had proven successful, another six months would be required before the entire exhibit was ready to assemble in New York, as work was required not only on the main </w:t>
+      </w:r>
+      <w:r>
+        <w:rPr>
+          <w:i/>
+          <w:iCs/>
+        </w:rPr>
+        <w:t>Barosaurus</w:t>
+      </w:r>
+      <w:r>
+        <w:rPr/>
+        <w:t xml:space="preserve">, but on the juvenile and the </w:t>
+      </w:r>
+      <w:r>
+        <w:rPr>
+          <w:i/>
+          <w:iCs/>
+          <w:u w:val="none"/>
+        </w:rPr>
+        <w:t>Allosaurus</w:t>
       </w:r>
       <w:r>
         <w:rPr/>
@@ -3196,7 +2933,7 @@
       </w:pPr>
       <w:r>
         <w:rPr/>
-        <w:t xml:space="preserve">The bones of AMNH 6341, the </w:t>
+        <w:t xml:space="preserve">To provide the base that the skeletons would be mounted on, fossil-bearing rock was considered appropriate. During the summer of 1991, Gene Gaffney and Peter May searched for a suitable site, finally finding an area that Gaffney was satisfied with by the road just outside the Fort Peck Reservation in northeastern Montana. May and his crew later returned to the site and created peels by spraying a thin layer of latex rubber across the rocks. They returned these to RCI, and used them to make and paint a cast. Ironically, the exposures in this area are from the early Paleocene Fort Union Formation (then the Tullock Formation) (about 65 Mya), meaning that the ground that the mounted </w:t>
       </w:r>
       <w:r>
         <w:rPr>
@@ -3207,31 +2944,7 @@
       </w:r>
       <w:r>
         <w:rPr/>
-        <w:t xml:space="preserve"> specimen that was to provide most of the mount, were in </w:t>
-      </w:r>
-      <w:r>
-        <w:rPr/>
-        <w:t>poor</w:t>
-      </w:r>
-      <w:r>
-        <w:rPr/>
-        <w:t xml:space="preserve"> condition by 1990. The presacral vertebrae, </w:t>
-      </w:r>
-      <w:r>
-        <w:rPr/>
-        <w:t>scapulocoracoid and humerus</w:t>
-      </w:r>
-      <w:r>
-        <w:rPr/>
-        <w:t xml:space="preserve"> had been in collections for the best part of 40 years, since Colbert’s early-1950s renovation; the rest of the bones had been there for 60 years, </w:t>
-      </w:r>
-      <w:r>
-        <w:rPr/>
-        <w:t xml:space="preserve">ever </w:t>
-      </w:r>
-      <w:r>
-        <w:rPr/>
-        <w:t xml:space="preserve">since being reunited by Barnum Brown in 1930. Bones in collections can degrade with time, especially the complex and delicate presacral vertebrae, and it is not unknown for broken-off parts to become separated from the elements they belong to. A program of repair and cleaning was required. As outlined below, about 80% of the skeleton was present. These available </w:t>
+        <w:t xml:space="preserve"> stands on dates from after the extinction of the dinosaurs, about 90 million years after the time </w:t>
       </w:r>
       <w:r>
         <w:rPr>
@@ -3242,18 +2955,7 @@
       </w:r>
       <w:r>
         <w:rPr/>
-        <w:t xml:space="preserve"> elements were cast, and most of the remainder of the skeleton was taken from a cast of the closely related </w:t>
-      </w:r>
-      <w:r>
-        <w:rPr>
-          <w:i/>
-          <w:iCs/>
-        </w:rPr>
-        <w:t>Diplodocus carnegii</w:t>
-      </w:r>
-      <w:r>
-        <w:rPr/>
-        <w:t xml:space="preserve"> with a few elements sculpted (details below).</w:t>
+        <w:t xml:space="preserve"> lived.</w:t>
       </w:r>
     </w:p>
     <w:p>
@@ -3263,297 +2965,7 @@
       </w:pPr>
       <w:r>
         <w:rPr/>
-        <w:t xml:space="preserve">All casting and sculpting was done by Research Casting International </w:t>
-      </w:r>
-      <w:r>
-        <w:rPr/>
-        <w:t>(</w:t>
-      </w:r>
-      <w:r>
-        <w:rPr/>
-        <w:t>RCI</w:t>
-      </w:r>
-      <w:r>
-        <w:rPr/>
-        <w:t>)</w:t>
-      </w:r>
-      <w:r>
-        <w:rPr/>
-        <w:t xml:space="preserve">, an organization specializing in mounting prehistoric animals that had then only recently been established. Founder Peter May had started working with fossil mounts at the Royal Ontario Museum, beginning in 1977, where he learned the techniques from paleontology technician Gordon Gyrmov and former WW2 Luftwaffe rocket-plane test pilot Rudy Zimmermann. May rose to became the head technician at the ROM. Having worked for a while at the Royal Tyrrell Paleontology Museum in Alberta, he found on returning to the ROM that his expertise was in demand from other museums. Initially fitting this outside work into his spare time under the banner of RCI, he went full time with his company in 1990, and the AMNH </w:t>
-      </w:r>
-      <w:r>
-        <w:rPr>
-          <w:i/>
-          <w:iCs/>
-        </w:rPr>
-        <w:t>Barosaurus</w:t>
-      </w:r>
-      <w:r>
-        <w:rPr/>
-        <w:t xml:space="preserve"> was to become their most important early commission. May’s first meeting with Lowell Dingus, Gene Gaffney, Jack MacIntosh and Phil Currie was on 30 January 30 1990 at the AMNH.</w:t>
-      </w:r>
-    </w:p>
-    <w:p>
-      <w:pPr>
-        <w:pStyle w:val="BodyText"/>
-        <w:rPr/>
-      </w:pPr>
-      <w:r>
-        <w:rPr/>
-        <w:t xml:space="preserve">On 28 March 1990, an agreement was made between Lowell Dingus, acting for the AMNH, and Peter May and Andrew Leitch, acting for RCI, to provide the fully mounted and painted cast skeletons of a rearing adult </w:t>
-      </w:r>
-      <w:r>
-        <w:rPr>
-          <w:i/>
-          <w:iCs/>
-        </w:rPr>
-        <w:t>Barosaurus</w:t>
-      </w:r>
-      <w:r>
-        <w:rPr/>
-        <w:t xml:space="preserve">, a juvenile, and an </w:t>
-      </w:r>
-      <w:r>
-        <w:rPr>
-          <w:i/>
-          <w:iCs/>
-        </w:rPr>
-        <w:t>Allosaurus</w:t>
-      </w:r>
-      <w:r>
-        <w:rPr/>
-        <w:t xml:space="preserve"> (Dingus 1990). The total agreed cost was $184,675 (equivalent to $472,000 in 2026 according to usinflationcalculator.com.) This amount was made up of $72,721 for the adult </w:t>
-      </w:r>
-      <w:r>
-        <w:rPr>
-          <w:i/>
-          <w:iCs/>
-        </w:rPr>
-        <w:t>Barosaurus</w:t>
-      </w:r>
-      <w:r>
-        <w:rPr/>
-        <w:t xml:space="preserve">, $75,136 for the juvenile, $16,660 for the </w:t>
-      </w:r>
-      <w:r>
-        <w:rPr>
-          <w:i/>
-          <w:iCs/>
-        </w:rPr>
-        <w:t>Allosaurus</w:t>
-      </w:r>
-      <w:r>
-        <w:rPr/>
-        <w:t xml:space="preserve">, $15,411 for a duplicate model of the juvenile </w:t>
-      </w:r>
-      <w:r>
-        <w:rPr>
-          <w:i/>
-          <w:iCs/>
-        </w:rPr>
-        <w:t>Barosaurus</w:t>
-      </w:r>
-      <w:r>
-        <w:rPr/>
-        <w:t xml:space="preserve"> for Dinosaur National Monument, and $4,748 for travel and transport. (Surprisingly, the small juvenile cost more than than adult!). The agreement was signed by Dingus on 28 March, by May and Leitch on 30 March, and by AMNH director William J,. Moynihan on 3 April.</w:t>
-      </w:r>
-    </w:p>
-    <w:p>
-      <w:pPr>
-        <w:pStyle w:val="BodyText"/>
-        <w:rPr/>
-      </w:pPr>
-      <w:r>
-        <w:rPr/>
-        <w:t xml:space="preserve">In the fall 1990, the RCI crew took the repaired and cleaned </w:t>
-      </w:r>
-      <w:r>
-        <w:rPr>
-          <w:i/>
-          <w:iCs/>
-        </w:rPr>
-        <w:t>Barosaurus</w:t>
-      </w:r>
-      <w:r>
-        <w:rPr/>
-        <w:t xml:space="preserve"> fossils in a semi truck from New York to Toronto, where they remained for the best part of a year. There, the bones were duplicated. First, they were coated with latex, which was then cured to form rubber molds (Figure 10). The bones were then cast, first with a layer of gel coat inside the molds, and then in various materials. As noted by </w:t>
-      </w:r>
-      <w:r>
-        <w:rPr>
-          <w:shd w:fill="auto" w:val="clear"/>
-        </w:rPr>
-        <w:t>Norell et al. (1991:38), “Those that would stand near the ground were cast in higher-density and more durable materials, while those higher up were made of lighter substances.”  Specifically, the lower elements were cast in polyester resin and fiberglass with a substantial steel armature, while the dorsal series, ribs and cervicals were cast with a much lighter fiberglass matt and backfilled with polyurethane foam to keep the weight down as low as possible. (Due to the lightness of these elevated elements, the steel armature could be reduced too.)</w:t>
-      </w:r>
-    </w:p>
-    <w:p>
-      <w:pPr>
-        <w:pStyle w:val="BodyText"/>
-        <w:rPr/>
-      </w:pPr>
-      <w:r>
-        <w:rPr/>
-        <w:t>These accurate replicas of the original fossils, when painted, were indistinguishable from real bone but weighed only a twentieth as much as the fragile and irreplaceable originals. The casts were not “corrected” to account for distortion in the original bones: they are faithful reproductions of what is preserved.</w:t>
-      </w:r>
-    </w:p>
-    <w:p>
-      <w:pPr>
-        <w:pStyle w:val="BodyText"/>
-        <w:rPr/>
-      </w:pPr>
-      <w:r>
-        <w:rPr/>
-        <w:t xml:space="preserve">Most cervical ribs, however, were missing from the original cervical </w:t>
-      </w:r>
-      <w:r>
-        <w:rPr/>
-        <w:t>vertebrae</w:t>
-      </w:r>
-      <w:r>
-        <w:rPr/>
-        <w:t xml:space="preserve">. (These fragile projections are rarely preserved intact.) The missing parts of the skeleton were mostly replaced by elements cast from the Carnegie </w:t>
-      </w:r>
-      <w:r>
-        <w:rPr>
-          <w:i/>
-          <w:iCs/>
-        </w:rPr>
-        <w:t>Diplodocus</w:t>
-      </w:r>
-      <w:r>
-        <w:rPr/>
-        <w:t xml:space="preserve">, though some were fabricated in Toronto. Records do not show exactly which </w:t>
-      </w:r>
-      <w:r>
-        <w:rPr>
-          <w:shd w:fill="auto" w:val="clear"/>
-        </w:rPr>
-        <w:t>bones were sculpted but Peter May was the only sculptor at RCI at the time the skeleton was being prepared, and he does not recall sculpting any elements other than the metacarpals discussed below and possibly some cervical ribs.</w:t>
-      </w:r>
-    </w:p>
-    <w:p>
-      <w:pPr>
-        <w:pStyle w:val="BodyText"/>
-        <w:rPr/>
-      </w:pPr>
-      <w:r>
-        <w:rPr/>
-        <w:t xml:space="preserve">In spring of 1991, a test erection of the rearing </w:t>
-      </w:r>
-      <w:r>
-        <w:rPr>
-          <w:i/>
-          <w:iCs/>
-        </w:rPr>
-        <w:t>Barosaurus</w:t>
-      </w:r>
-      <w:r>
-        <w:rPr/>
-        <w:t xml:space="preserve"> mount was carried out with the aid of a hired crane and 15 m scissor lift (Figure 11). This had to be done in the parking lot behind the RCI workshop, as the completed mount would be too tall to fit inside the workshop. The event was attended by a group from the AMNH, and Jack McIntosh, who had been brought in as a consultant to ensure that the bones were articulated correctly in the mount (Figure 12). Also present were photographers including National Geographic’s Louie Psihoyos, a television crew, at least one observer from another museum, and a crowd of local workers on their lunch-breaks. The skeleton was pieced together from prefabricated sections. The exercise began with the “tripod” of hindlimbs and tail, anchored together at the pelvis, providing a stable base. These were followed by the torso section, then the three sections of the neck and head, and finally the forelimbs. Dingus (1996:25–28) recalled that “the strangest thing was that the mount actually looked rather natural and graceful […] I had always been extremely skeptical about whether sauropods could rear up to such heights, but the grace of the mount almost erased my doubt”. Although the initial assembly of the rearing barosaur had proven successful, another six months would be required before the entire exhibit was ready to assemble in New York, as work was required not only on the main </w:t>
-      </w:r>
-      <w:r>
-        <w:rPr>
-          <w:i/>
-          <w:iCs/>
-        </w:rPr>
-        <w:t>Barosaurus</w:t>
-      </w:r>
-      <w:r>
-        <w:rPr/>
-        <w:t xml:space="preserve">, but on the juvenile and the </w:t>
-      </w:r>
-      <w:r>
-        <w:rPr>
-          <w:i/>
-          <w:iCs/>
-          <w:u w:val="none"/>
-        </w:rPr>
-        <w:t>Allosaurus</w:t>
-      </w:r>
-      <w:r>
-        <w:rPr/>
-        <w:t>.</w:t>
-      </w:r>
-    </w:p>
-    <w:p>
-      <w:pPr>
-        <w:pStyle w:val="BodyText"/>
-        <w:rPr/>
-      </w:pPr>
-      <w:r>
-        <w:rPr/>
-        <w:t xml:space="preserve">To provide the base that the skeletons would be mounted on, fossil-bearing rock was considered appropriate. During the summer of 1991, Gene Gaffney and Peter May searched for a suitable site, finally finding an area that Gaffney was satisfied with by the road just outside the Fort Peck Reservation in northeastern Montana. May and his crew later returned to the site and created peels by spraying a thin layer of latex rubber across the rocks. They returned these to RCI, and used them to make and paint a cast. Ironically, the exposures in this area are from the early Paleocene Fort Union Formation (then the Tullock Formation) (about 65 Mya), meaning that the ground that the mounted </w:t>
-      </w:r>
-      <w:r>
-        <w:rPr>
-          <w:i/>
-          <w:iCs/>
-        </w:rPr>
-        <w:t>Barosaurus</w:t>
-      </w:r>
-      <w:r>
-        <w:rPr/>
-        <w:t xml:space="preserve"> stands on dates from after the extinction of the dinosaurs, about 90 million years after the time </w:t>
-      </w:r>
-      <w:r>
-        <w:rPr>
-          <w:i/>
-          <w:iCs/>
-        </w:rPr>
-        <w:t>Barosaurus</w:t>
-      </w:r>
-      <w:r>
-        <w:rPr/>
-        <w:t xml:space="preserve"> lived.</w:t>
-      </w:r>
-    </w:p>
-    <w:p>
-      <w:pPr>
-        <w:pStyle w:val="BodyText"/>
-        <w:rPr/>
-      </w:pPr>
-      <w:r>
-        <w:rPr/>
-        <w:t xml:space="preserve">In November 1991, the work in Toronto was complete, and Blakelock Moving were contracted to ship the completed exhibit in sections for mounting </w:t>
-      </w:r>
-      <w:r>
-        <w:rPr/>
-        <w:t>t</w:t>
-      </w:r>
-      <w:r>
-        <w:rPr/>
-        <w:t>o New York on 7 November (Clark 1991; Figure 13). Unlike the trial mounting in Toronto, when the head and neck were attached in three sections, in New York the three sections were first joined together and then fitted as a unit. This large unit, about nine meters in length, proved awkward to manoeuvre, and it was difficult to raise it to a sufficient height to slide into its slot (Figure 14). It took nearly two hours to wrestle it into place at the front of the rearing torso. Worse, when the mount was finally completed it was imperfect because, when the whole neck had been hanging horizontally, it had bent in the middle at the point of suspension. The resulting kink in the neck can be seen between C1</w:t>
-      </w:r>
-      <w:r>
-        <w:rPr/>
-        <w:t>1</w:t>
-      </w:r>
-      <w:r>
-        <w:rPr/>
-        <w:t xml:space="preserve"> and C1</w:t>
-      </w:r>
-      <w:r>
-        <w:rPr/>
-        <w:t>3</w:t>
-      </w:r>
-      <w:r>
-        <w:rPr/>
-        <w:t xml:space="preserve"> in Figure</w:t>
-      </w:r>
-      <w:r>
-        <w:rPr/>
-        <w:t>s</w:t>
-      </w:r>
-      <w:r>
-        <w:rPr/>
-        <w:t xml:space="preserve"> 1 </w:t>
-      </w:r>
-      <w:r>
-        <w:rPr/>
-        <w:t>and 14B</w:t>
-      </w:r>
-      <w:r>
-        <w:rPr/>
-        <w:t xml:space="preserve"> and in other contemporary photos such as those of Dingus (1996:26) and Lindsay (1992:18–20). It was soon corrected, however, in a near-disastrous but ultimately successful late-night operation (Dingus 1996:28), and the line of the neck is smooth and elegant in the mount as it is today.</w:t>
+        <w:t>In November 1991, the work in Toronto was complete, and Blakelock Moving were contracted to ship the completed exhibit in sections for mounting to New York on 7 November (Clark 1991; Figure 13). Unlike the trial mounting in Toronto, when the head and neck were attached in three sections, in New York the three sections were first joined together and then fitted as a unit. This large unit, about nine meters in length, proved awkward to manoeuvre, and it was difficult to raise it to a sufficient height to slide into its slot (Figure 14). It took nearly two hours to wrestle it into place at the front of the rearing torso. Worse, when the mount was finally completed it was imperfect because, when the whole neck had been hanging horizontally, it had bent in the middle at the point of suspension. The resulting kink in the neck can be seen between C11 and C13 in Figures 1 and 14B and in other contemporary photos such as those of Dingus (1996:26) and Lindsay (1992:18–20). It was soon corrected, however, in a near-disastrous but ultimately successful late-night operation (Dingus 1996:28), and the line of the neck is smooth and elegant in the mount as it is today.</w:t>
       </w:r>
     </w:p>
     <w:p>
@@ -3742,7 +3154,7 @@
     </w:p>
     <w:p>
       <w:pPr>
-        <w:pStyle w:val="BlockQuotation"/>
+        <w:pStyle w:val="BlockQuotationuser"/>
         <w:rPr/>
       </w:pPr>
       <w:r>
@@ -3808,31 +3220,7 @@
       </w:r>
       <w:r>
         <w:rPr/>
-        <w:t xml:space="preserve">.” However, this account seems to be in error regarding numerous elements being modeled from scratch. </w:t>
-      </w:r>
-      <w:r>
-        <w:rPr/>
-        <w:t>A</w:t>
-      </w:r>
-      <w:r>
-        <w:rPr/>
-        <w:t xml:space="preserve"> complete list of the elements of AMNH 6341 itself can be assembled from the published works and notes of McIntosh, </w:t>
-      </w:r>
-      <w:r>
-        <w:rPr/>
-        <w:t>old signage, and letters between Gilmore and the USNM (see below).</w:t>
-      </w:r>
-      <w:r>
-        <w:rPr/>
-        <w:t xml:space="preserve"> Peter May recalls that with some exceptions discussed below, the missing bones were filled in with casts taken from molds made from the Utah Field House’s </w:t>
-      </w:r>
-      <w:r>
-        <w:rPr/>
-        <w:t xml:space="preserve">concrete </w:t>
-      </w:r>
-      <w:r>
-        <w:rPr/>
-        <w:t xml:space="preserve">copy of the Carnegie </w:t>
+        <w:t xml:space="preserve">.” However, this account seems to be in error regarding numerous elements being modeled from scratch. A complete list of the elements of AMNH 6341 itself can be assembled from the published works and notes of McIntosh, old signage, and letters between Gilmore and the USNM (see below). Peter May recalls that with some exceptions discussed below, the missing bones were filled in with casts taken from molds made from the Utah Field House’s concrete copy of the Carnegie </w:t>
       </w:r>
       <w:r>
         <w:rPr>
@@ -3843,15 +3231,7 @@
       </w:r>
       <w:r>
         <w:rPr/>
-        <w:t xml:space="preserve">. </w:t>
-      </w:r>
-      <w:r>
-        <w:rPr/>
-        <w:t>T</w:t>
-      </w:r>
-      <w:r>
-        <w:rPr/>
-        <w:t xml:space="preserve">hat copy was made from the original Carnegie molds (Taylor et al. 2023), and the composition of the elements from which those molds were taken is well understood (Taylor et al. 2025), so it is possible to determine the sources of most of the bones in the </w:t>
+        <w:t xml:space="preserve">. That copy was made from the original Carnegie molds (Taylor et al. 2023), and the composition of the elements from which those molds were taken is well understood (Taylor et al. 2025), so it is possible to determine the sources of most of the bones in the </w:t>
       </w:r>
       <w:r>
         <w:rPr>
@@ -3897,15 +3277,7 @@
       </w:pPr>
       <w:r>
         <w:rPr/>
-        <w:t xml:space="preserve">McIntosh’s (2005:43) catalogue of elements in the referred specimen AMNH 6341 is incomplete and contains multiple errors. However, by reading it in context of the more detailed descriptions of the elements later in the same paper, and with his unpublished 1962 notes on the specimen, with observations of materials on exhibition in the past and present, </w:t>
-      </w:r>
-      <w:r>
-        <w:rPr/>
-        <w:t xml:space="preserve">and in light of historical correspondence, </w:t>
-      </w:r>
-      <w:r>
-        <w:rPr/>
-        <w:t>it is possible to arrive at a complete list of material as follows:</w:t>
+        <w:t>McIntosh’s (2005:43) catalogue of elements in the referred specimen AMNH 6341 is incomplete and contains multiple errors. However, by reading it in context of the more detailed descriptions of the elements later in the same paper, and with his unpublished 1962 notes on the specimen, with observations of materials on exhibition in the past and present, and in light of historical correspondence, it is possible to arrive at a complete list of material as follows:</w:t>
       </w:r>
     </w:p>
     <w:p>
@@ -4534,7 +3906,15 @@
       </w:r>
       <w:r>
         <w:rPr/>
-        <w:t xml:space="preserve"> can be seen to be C3–6 and C8 (512 mm) — and presumably the atlas and axis.</w:t>
+        <w:t xml:space="preserve"> can be seen to be C3–6 and C8 (512 mm) — and presumably the atlas and axis, </w:t>
+      </w:r>
+      <w:r>
+        <w:rPr/>
+        <w:t>though these are not in place in Figures 13 and 17</w:t>
+      </w:r>
+      <w:r>
+        <w:rPr/>
+        <w:t>.</w:t>
       </w:r>
     </w:p>
     <w:p>
@@ -4565,7 +3945,7 @@
       </w:r>
       <w:r>
         <w:rPr/>
-        <w:t>presacral, which he tentatively designated as the first dorsal vertebra, but considered possibly the last cervical. However, the existence of a 17th cervical on this basis is predicated on a reduced dorsal count of eight, and the mounted skeleton has nine dorsals with free ribs. The additional cervical therefore appears to be an insert not warranted by the evidence available at the time of mounting.</w:t>
+        <w:t>presacral, which he tentatively designated as the first dorsal vertebra but considered possibly the last cervical. However, the existence of a 17th cervical on this basis is predicated on a reduced dorsal count of eight, and the mounted skeleton has nine dorsals with free ribs. The additional cervical therefore appears to be an insert not warranted by the evidence available at the time of mounting.</w:t>
       </w:r>
     </w:p>
     <w:p>
@@ -4575,7 +3955,15 @@
       </w:pPr>
       <w:r>
         <w:rPr/>
-        <w:t xml:space="preserve">However, photos of the mounting process in the AMNH (e.g. Figure 13) show that the neck section used in the mount had only 14 cervical vertebrae — C3–16, not counting the altas and axis which were not in place at that time. The assembly process was complex. The neck section containing the head and C1–16 was welded to the torso leaving a stretch of bare armature. The two halves of the seventeenth vertebra (visible on the right side of Figure 13) were then glued together around the armature and bridging the gap between the bones of the neck section and the torso. The special 17th vertebra can be seen in Figure 11B, distinctly darker than the cervicals above it and the dorsals below. Since there are no duplicate vertebrae in the neck, the special C17 must have come from elsewhere. Careful comparisons suggest it is a cast of C14 of the Carnegie </w:t>
+        <w:t xml:space="preserve">However, photos of the mounting process in the AMNH (e.g. Figure 13) show that the neck section used in the mount had only 14 cervical vertebrae — C3–16, not counting the altas and axis which were not in place at that time </w:t>
+      </w:r>
+      <w:r>
+        <w:rPr/>
+        <w:t>but which, when added, would bring the total to 16.</w:t>
+      </w:r>
+      <w:r>
+        <w:rPr/>
+        <w:t xml:space="preserve"> The assembly process was complex. The neck section containing the head and C1–16 was welded to the torso leaving a stretch of bare armature. The two halves of the seventeenth vertebra (visible on the right side of Figure 13) were then glued together around the armature, bridging the gap between the bones of the neck section and the torso. The special 17th vertebra can be seen in Figure 11B, distinctly darker than the cervicals above it and the dorsals below. Since there are no duplicate vertebrae in the neck, the special C17 must have come from elsewhere. Careful comparisons suggest it is a cast of C14 of the Carnegie </w:t>
       </w:r>
       <w:r>
         <w:rPr>
@@ -4597,7 +3985,15 @@
       </w:r>
       <w:r>
         <w:rPr/>
-        <w:t xml:space="preserve">, makes sense as C14 is more elongate and so a better morphological match than the </w:t>
+        <w:t xml:space="preserve">, makes sense as C14 is more elongate and so a better morphological match </w:t>
+      </w:r>
+      <w:r>
+        <w:rPr/>
+        <w:t>for</w:t>
+      </w:r>
+      <w:r>
+        <w:rPr/>
+        <w:t xml:space="preserve"> the </w:t>
       </w:r>
       <w:r>
         <w:rPr>
@@ -4629,7 +4025,15 @@
       </w:r>
       <w:r>
         <w:rPr/>
-        <w:t xml:space="preserve"> did have 17 cervicals, or even more, as in the 18 of </w:t>
+        <w:t xml:space="preserve"> did </w:t>
+      </w:r>
+      <w:r>
+        <w:rPr/>
+        <w:t xml:space="preserve">indeed </w:t>
+      </w:r>
+      <w:r>
+        <w:rPr/>
+        <w:t xml:space="preserve">have 17 cervicals — or even more, as in the 18 of </w:t>
       </w:r>
       <w:r>
         <w:rPr>
@@ -4672,39 +4076,19 @@
       </w:pPr>
       <w:r>
         <w:rPr/>
-        <w:t>CM 84, the specimen that forms most of the Carnegie mount, includes C2–7, but not the atlas (C1). As discussed by Taylor et al. (2025:71–72), it is not clear which specimen supplied the atlas in the Carnegie mount, and it seems most likely that this element was a sculpture not based on any specific fossil specimen.</w:t>
-      </w:r>
-    </w:p>
-    <w:p>
-      <w:pPr>
-        <w:pStyle w:val="BodyText"/>
-        <w:rPr/>
-      </w:pPr>
-      <w:r>
-        <w:rPr/>
-        <w:t xml:space="preserve">As noted above, the absent cervical ribs of some of the </w:t>
-      </w:r>
-      <w:r>
-        <w:rPr>
-          <w:i/>
-          <w:iCs/>
-        </w:rPr>
-        <w:t>Barosaurus</w:t>
-      </w:r>
-      <w:r>
-        <w:rPr/>
-        <w:t xml:space="preserve"> cervical casts were either supplied from the Carnegie </w:t>
-      </w:r>
-      <w:r>
-        <w:rPr>
-          <w:i/>
-          <w:iCs/>
-        </w:rPr>
-        <w:t>Diplodocus</w:t>
-      </w:r>
-      <w:r>
-        <w:rPr/>
-        <w:t xml:space="preserve"> or possibly sculpted.</w:t>
+        <w:t>CM 84, the specimen that forms most of the Carnegie mount, includes C2–</w:t>
+      </w:r>
+      <w:r>
+        <w:rPr/>
+        <w:t>8 (and the subsequent cervicals)</w:t>
+      </w:r>
+      <w:r>
+        <w:rPr/>
+        <w:t xml:space="preserve">, but not the atlas (C1). As discussed by Taylor et al. (2025:71–72), it is not clear which specimen supplied the atlas in the Carnegie mount, and it seems most likely that this element was a sculpture not based on any specific fossil specimen — </w:t>
+      </w:r>
+      <w:r>
+        <w:rPr/>
+        <w:t>and so the same would be true in the mounted Barosaurus.</w:t>
       </w:r>
     </w:p>
     <w:p>
@@ -4741,7 +4125,22 @@
       </w:pPr>
       <w:r>
         <w:rPr/>
-        <w:t>AMNH 6341 includes the first 29 caudals (or perhaps caudals 1–20 and 22–30, see above) but only one chevron.</w:t>
+        <w:t xml:space="preserve">AMNH 6341 includes the first 29 caudals (or perhaps caudals 1–20 and 22–30, see above) but only one chevron. </w:t>
+      </w:r>
+      <w:r>
+        <w:rPr/>
+        <w:t xml:space="preserve">The missing caudals and chevrons were most likely provided once more by casts of the Carnegie </w:t>
+      </w:r>
+      <w:r>
+        <w:rPr>
+          <w:i/>
+          <w:iCs/>
+        </w:rPr>
+        <w:t>Diplodocus</w:t>
+      </w:r>
+      <w:r>
+        <w:rPr/>
+        <w:t>.</w:t>
       </w:r>
     </w:p>
     <w:p>
@@ -4768,7 +4167,15 @@
       </w:pPr>
       <w:r>
         <w:rPr/>
-        <w:t xml:space="preserve">The bones of the forelimb are not only absent from CM 84 (as noted by Hatcher 1901:45) but were completely unknown in the Carnegie collection at the time the mount was constructed. Holland (1906) made no comment on how the forelimbs were obtained for the skeletal mount sent to England. As detailed by Taylor et al. (2025:84), both humeri, radii and ulnae of the casts produced by the Carnegie Museum were sculpted based on the slightly smaller diplodocine individual CM 662 (now HMNS 175), which also provided the rear part of the skull (see above). The forefeet however were sculpted from those of AMNH 965, now recognized as camarasaurid, and were given three manual unguals as well as too many phalanges. These errors were well understood by the 1990s: to address them in the </w:t>
+        <w:t xml:space="preserve">The bones of the forelimb are not only absent from CM 84 (as noted by Hatcher 1901:45) but were completely unknown in the Carnegie collection at the time the mount was constructed. Holland (1906) made no comment on how the forelimbs were obtained for the skeletal mount sent to England. As detailed by Taylor et al. (2025:84), both humeri, radii and ulnae of the casts produced by the Carnegie Museum were sculpted based on the slightly smaller diplodocine individual CM 662 (now HMNS 175), which also provided the rear part of the skull (see above). The forefeet however were sculpted from those of AMNH 965, now recognized as camarasaurid, and were given three manual unguals </w:t>
+      </w:r>
+      <w:r>
+        <w:rPr/>
+        <w:t xml:space="preserve">instead of one, </w:t>
+      </w:r>
+      <w:r>
+        <w:rPr/>
+        <w:t xml:space="preserve">as well as too many phalanges. These errors were well understood by the 1990s: to address them in the </w:t>
       </w:r>
       <w:r>
         <w:rPr>
@@ -4801,7 +4208,15 @@
       </w:r>
       <w:r>
         <w:rPr/>
-        <w:t xml:space="preserve">, but the unguals were removed from digits II and III to correctly leave a single manual ungual. It follows that a small amount of camarasurid-derived material (the phalanges and surviving unguals) remains in the AMNH </w:t>
+        <w:t xml:space="preserve"> </w:t>
+      </w:r>
+      <w:r>
+        <w:rPr/>
+        <w:t>molds,</w:t>
+      </w:r>
+      <w:r>
+        <w:rPr/>
+        <w:t xml:space="preserve"> but the unguals were removed from digits II and III to correctly leave a single manual ungual. It follows that a small amount of camarasurid-derived material (the phalanges and surviving unguals) remains in the AMNH </w:t>
       </w:r>
       <w:r>
         <w:rPr>
@@ -4923,7 +4338,11 @@
       </w:pPr>
       <w:r>
         <w:rPr/>
-        <w:t xml:space="preserve">As noted above, the mounted </w:t>
+        <w:t>T</w:t>
+      </w:r>
+      <w:r>
+        <w:rPr/>
+        <w:t xml:space="preserve">he mounted </w:t>
       </w:r>
       <w:r>
         <w:rPr>
@@ -5170,7 +4589,15 @@
       </w:pPr>
       <w:r>
         <w:rPr/>
-        <w:t xml:space="preserve">The notion of rearing sauropods has a long heritage. The one of earliest life restorations featuring sauropods is Charles R. Knight’s 1897 drawing, created under the supervision of E. D. Cope, appearing in Ballou (1897:20) and reproduced in Osborn and Mook (1921:figure 127). This shows several </w:t>
+        <w:t xml:space="preserve">The notion of rearing sauropods has a long heritage. </w:t>
+      </w:r>
+      <w:r>
+        <w:rPr/>
+        <w:t>O</w:t>
+      </w:r>
+      <w:r>
+        <w:rPr/>
+        <w:t xml:space="preserve">ne of earliest life restorations featuring sauropods is Charles R. Knight’s 1897 drawing, created under the supervision of E. D. Cope, appearing in Ballou (1897:20) and reproduced in Osborn and Mook (1921:figure 127). This shows several </w:t>
       </w:r>
       <w:r>
         <w:rPr>
@@ -5191,7 +4618,15 @@
       </w:pPr>
       <w:r>
         <w:rPr/>
-        <w:t xml:space="preserve">Scientific support for the plausibility of rearing goes back at least to Osborn (1899:213), who wrote that the tail of </w:t>
+        <w:t xml:space="preserve">Scientific support for the plausibility of rearing </w:t>
+      </w:r>
+      <w:r>
+        <w:rPr/>
+        <w:t xml:space="preserve">on land </w:t>
+      </w:r>
+      <w:r>
+        <w:rPr/>
+        <w:t xml:space="preserve">goes back at least to Osborn (1899:213), who wrote that the tail of </w:t>
       </w:r>
       <w:r>
         <w:rPr>
@@ -5497,7 +4932,7 @@
       </w:pPr>
       <w:r>
         <w:rPr/>
-        <w:t xml:space="preserve">Paul (1987:31), in the article containing his painting influential painting </w:t>
+        <w:t xml:space="preserve">Paul (1987:31), in the article containing his influential painting </w:t>
       </w:r>
       <w:r>
         <w:rPr>
@@ -5508,7 +4943,15 @@
       </w:r>
       <w:r>
         <w:rPr/>
-        <w:t xml:space="preserve"> (see above), argued the habitual rearing into tripodal stance is the only explanation for diplodocids’ massive hips and vertebrae, larger than those of otherwise bigger sauropods, and for their relatively straight necks, short forelimbs and sledlike chevrons. The next year, his book </w:t>
+        <w:t xml:space="preserve"> (see above), argued th</w:t>
+      </w:r>
+      <w:r>
+        <w:rPr/>
+        <w:t>at</w:t>
+      </w:r>
+      <w:r>
+        <w:rPr/>
+        <w:t xml:space="preserve"> habitual rearing into tripodal stance is the only explanation for diplodocids’ massive hips and vertebrae, larger than those of otherwise bigger sauropods, and for their relatively straight necks, short forelimbs and sledlike chevrons. The next year, his book </w:t>
       </w:r>
       <w:r>
         <w:rPr>
@@ -5616,7 +5059,31 @@
       </w:r>
       <w:r>
         <w:rPr/>
-        <w:t xml:space="preserve"> holotype BYU 9047 as specializations for rearing and bipedal locomotion: bifurcated neural spines through the entire presacral series, elongated chevrons, a strong system of ossified diagonal intervertebral ligaments in the dorsal vertebrae, suprapostal plates in the sacral vertebrae, and 20-degree forward rotation of the ilia relative to the sacrum. While some of these features do not seem directly related to rearing and others are likely age-related, the rotation of the ilium remains unique and difficult to interpret at anything other than a bipedalism adaptation.</w:t>
+        <w:t xml:space="preserve"> holotype BYU 9047 as specializations for rearing and bipedal locomotion: bifurcated neural spines through the entire presacral series, elongated chevrons, a strong system of ossified diagonal intervertebral ligaments in the dorsal vertebrae, supra</w:t>
+      </w:r>
+      <w:r>
+        <w:rPr/>
+        <w:t>c</w:t>
+      </w:r>
+      <w:r>
+        <w:rPr/>
+        <w:t xml:space="preserve">ostal plates in the sacral vertebrae, and 20-degree forward rotation of the ilia relative to the sacrum. While some of these features do not seem directly related to rearing and others are likely age-related, the rotation of the ilium remains unique and </w:t>
+      </w:r>
+      <w:r>
+        <w:rPr/>
+        <w:t xml:space="preserve">is </w:t>
+      </w:r>
+      <w:r>
+        <w:rPr/>
+        <w:t xml:space="preserve">difficult to interpret at anything other than a </w:t>
+      </w:r>
+      <w:r>
+        <w:rPr/>
+        <w:t xml:space="preserve">rearing </w:t>
+      </w:r>
+      <w:r>
+        <w:rPr/>
+        <w:t>adaptation.</w:t>
       </w:r>
     </w:p>
     <w:p>
@@ -5866,7 +5333,15 @@
       </w:r>
       <w:r>
         <w:rPr/>
-        <w:t xml:space="preserve">, </w:t>
+        <w:t xml:space="preserve"> </w:t>
+      </w:r>
+      <w:r>
+        <w:rPr/>
+        <w:t>in</w:t>
+      </w:r>
+      <w:r>
+        <w:rPr/>
+        <w:t xml:space="preserve"> </w:t>
       </w:r>
       <w:r>
         <w:rPr>
@@ -5974,7 +5449,15 @@
       </w:r>
       <w:r>
         <w:rPr/>
-        <w:t xml:space="preserve">, 22 of </w:t>
+        <w:t xml:space="preserve"> </w:t>
+      </w:r>
+      <w:r>
+        <w:rPr/>
+        <w:t>and</w:t>
+      </w:r>
+      <w:r>
+        <w:rPr/>
+        <w:t xml:space="preserve"> 22 of </w:t>
       </w:r>
       <w:r>
         <w:rPr>
@@ -5988,21 +5471,21 @@
           <w:i w:val="false"/>
           <w:iCs w:val="false"/>
         </w:rPr>
-        <w:t xml:space="preserve"> and nine of </w:t>
-      </w:r>
-      <w:r>
-        <w:rPr>
-          <w:i/>
-          <w:iCs/>
-        </w:rPr>
-        <w:t>Camarasaurus</w:t>
+        <w:t xml:space="preserve"> — but not a single </w:t>
+      </w:r>
+      <w:r>
+        <w:rPr>
+          <w:i/>
+          <w:iCs/>
+        </w:rPr>
+        <w:t>Barosaurus</w:t>
       </w:r>
       <w:r>
         <w:rPr>
           <w:i w:val="false"/>
           <w:iCs w:val="false"/>
         </w:rPr>
-        <w:t xml:space="preserve"> — but not a single </w:t>
+        <w:t xml:space="preserve"> toy. The only </w:t>
       </w:r>
       <w:r>
         <w:rPr>
@@ -6016,21 +5499,7 @@
           <w:i w:val="false"/>
           <w:iCs w:val="false"/>
         </w:rPr>
-        <w:t xml:space="preserve"> toy. The only </w:t>
-      </w:r>
-      <w:r>
-        <w:rPr>
-          <w:i/>
-          <w:iCs/>
-        </w:rPr>
-        <w:t>Barosaurus</w:t>
-      </w:r>
-      <w:r>
-        <w:rPr>
-          <w:i w:val="false"/>
-          <w:iCs w:val="false"/>
-        </w:rPr>
-        <w:t xml:space="preserve"> “toys”  on the market at the time of writing seem to be large museum-quality maquettes costing $500 or more. A </w:t>
+        <w:t xml:space="preserve"> “toys” on the market at the time of writing seem to be large museum-quality maquettes costing $500 or more. A </w:t>
       </w:r>
       <w:r>
         <w:rPr/>
@@ -6159,7 +5628,18 @@
       </w:pPr>
       <w:r>
         <w:rPr/>
-        <w:t xml:space="preserve">We are grateful to Scott Hartman (University of Wisconsin-Madison) for allowing us to use his </w:t>
+        <w:t xml:space="preserve">We are grateful to Gregory S. Paul for permission to reproduce his artwork </w:t>
+      </w:r>
+      <w:r>
+        <w:rPr>
+          <w:i/>
+          <w:iCs/>
+        </w:rPr>
+        <w:t>Ambush at Como Creek</w:t>
+      </w:r>
+      <w:r>
+        <w:rPr/>
+        <w:t xml:space="preserve"> (Figure 7), to Scott Hartman (University of Wisconsin-Madison) for allowing us to use his </w:t>
       </w:r>
       <w:r>
         <w:rPr>
@@ -6170,18 +5650,7 @@
       </w:r>
       <w:r>
         <w:rPr/>
-        <w:t xml:space="preserve"> skeletal reconstruction in Figure 15, to Gregory S. Paul for permission to reproduce his artwork </w:t>
-      </w:r>
-      <w:r>
-        <w:rPr>
-          <w:i/>
-          <w:iCs/>
-        </w:rPr>
-        <w:t>Ambush at Como Creek</w:t>
-      </w:r>
-      <w:r>
-        <w:rPr/>
-        <w:t xml:space="preserve"> (Figure 7), to John Gurche for permission to reproduce his life restoration of the rearing </w:t>
+        <w:t xml:space="preserve"> skeletal reconstruction in Figure 15, to John Gurche for permission to reproduce his life restoration of the rearing </w:t>
       </w:r>
       <w:r>
         <w:rPr>
@@ -6214,7 +5683,7 @@
       </w:r>
       <w:r>
         <w:rPr/>
-        <w:t xml:space="preserve"> painting by combining several scans created by Mathew J. Wedel (Western University of Health Sciences); we thank them both. Carl Mehling (AMNH) searched collections for the missing C7 and concluded it was absent. Mick Ellison (AMNH) kindly photographed for us both the 1939 public gallery exhibit panel (Figure 6) and the prototype model (Figure 9), having had the model repaired. Photography of the model was courtesy of the AMNH Main Archives.</w:t>
+        <w:t xml:space="preserve"> painting by combining several scans created by Mathew J. Wedel (Western University of Health Sciences); we thank them both. Mick Ellison (AMNH) kindly photographed for us both the 1939 public gallery exhibit panel (Figure 6) and the prototype model (Figure 9), having had the model repaired. Photography of the model was courtesy of the AMNH Main Archives.</w:t>
       </w:r>
     </w:p>
     <w:p>
@@ -6224,6 +5693,31 @@
       </w:pPr>
       <w:r>
         <w:rPr/>
+        <w:t xml:space="preserve">Melissa Posen, Dingus’s administrative assistant on the </w:t>
+      </w:r>
+      <w:r>
+        <w:rPr>
+          <w:i/>
+          <w:iCs/>
+        </w:rPr>
+        <w:t>Barosaurus</w:t>
+      </w:r>
+      <w:r>
+        <w:rPr/>
+        <w:t xml:space="preserve"> mounting project, took most of the photographs of the initial assembly in Toronto. Denis Finnin, the Museum Photographer, took most of the photos of the assembly in the Rotunda. It is likely that their work is included in one or more of our illustrations, </w:t>
+      </w:r>
+      <w:r>
+        <w:rPr/>
+        <w:t>but individual photo credits have been lost.</w:t>
+      </w:r>
+    </w:p>
+    <w:p>
+      <w:pPr>
+        <w:pStyle w:val="BodyText"/>
+        <w:rPr/>
+      </w:pPr>
+      <w:r>
+        <w:rPr/>
         <w:t>Mai Reitmeyer (Department of Library Services, AMNH) helped us to obtain historical photographs. Kiana Clark (AMNH Vertebrate Paleontology Archives), provided numerous historical documents and photographs. Abby Telfer (United States National Museum), provided helpful documents in establish the early history of the AMNH 6341 material. ReBecca Hunt-Forster (Dinosaur National Monument) provided an invaluable archive of correspondence relating to the early years of the quarry. Amelia Zietlow (Richard Gilder Graduate School at the AMNH) provided helpful photographs and information about the present public exhibits (Figure 8). We thank Ray Wilhite (Auburn University College of Veterinary Medicine) and Brooks Britt and Rod Scheetz (both Brigham Young University) for help in accessing the archived notebooks of John S. McIntosh. Matt Wedel helped with the interpretation and identification of some vertebrae.</w:t>
       </w:r>
     </w:p>
@@ -6234,18 +5728,7 @@
       </w:pPr>
       <w:r>
         <w:rPr/>
-        <w:t xml:space="preserve">Melissa Posen, Dingus’s administrative assistant on the </w:t>
-      </w:r>
-      <w:r>
-        <w:rPr>
-          <w:i/>
-          <w:iCs/>
-        </w:rPr>
-        <w:t>Barosaurus</w:t>
-      </w:r>
-      <w:r>
-        <w:rPr/>
-        <w:t xml:space="preserve"> mounting project, took most of the photographs of the initial assembly in Toronto. Denis Finnin, the Museum Photographer, took most of the photos of the assembly in the Rotunda. It is likely that their work is included in one or more of our illustrations. Mick Ellison, Lynton Gardiner, Jack Horner (Chapman University), Carl Mehling, Gregory S. Paul. Paul Sereno (University of Chicago), Adam Smith (Nottingham Natural History Museum) and Abby Telfer (USNM) allowed us to cite personal communications.</w:t>
+        <w:t>Carl Mehling (AMNH) searched collections for the missing C7 and concluded it was absent. Mick Ellison, Lynton Gardiner, Jack Horner (Chapman University), Carl Mehling, Gregory S. Paul. Paul Sereno (University of Chicago), Adam Smith (Nottingham Natural History Museum) and Abby Telfer (USNM) allowed us to cite personal communications.</w:t>
       </w:r>
       <w:r>
         <w:br w:type="page"/>
@@ -8755,7 +8238,15 @@
       </w:r>
       <w:r>
         <w:rPr/>
-        <w:t xml:space="preserve"> of Vernal:  — a Cultural Icon of Utah. </w:t>
+        <w:t xml:space="preserve"> of Verna</w:t>
+      </w:r>
+      <w:r>
+        <w:rPr/>
+        <w:t xml:space="preserve">l </w:t>
+      </w:r>
+      <w:r>
+        <w:rPr/>
+        <w:t xml:space="preserve">— a Cultural Icon of Utah. </w:t>
       </w:r>
       <w:r>
         <w:rPr>
@@ -9153,7 +8644,21 @@
           <w:b w:val="false"/>
           <w:bCs w:val="false"/>
         </w:rPr>
-        <w:t xml:space="preserve"> AMNH 6341 in the Theodore Roosevelt Rotunda of the American Museum of Natural History, New York, as it appeared after the initial mounting and before repairs to the middle of the neck. Photograph provided by Department of Vertebrate Paleontology Archive, Copyright © AMNH.</w:t>
+        <w:t xml:space="preserve"> AMNH 6341 in the Theodore Roosevelt Rotunda of the American Museum of Natural History, New York, as it appeared after the initial mounting and before repairs to the middle of the neck </w:t>
+      </w:r>
+      <w:r>
+        <w:rPr>
+          <w:b w:val="false"/>
+          <w:bCs w:val="false"/>
+        </w:rPr>
+        <w:t>(see text)</w:t>
+      </w:r>
+      <w:r>
+        <w:rPr>
+          <w:b w:val="false"/>
+          <w:bCs w:val="false"/>
+        </w:rPr>
+        <w:t>. Photograph provided by Department of Vertebrate Paleontology Archive, Copyright © AMNH.</w:t>
       </w:r>
     </w:p>
     <w:p>
@@ -9203,16 +8708,7 @@
           <w:i w:val="false"/>
           <w:iCs w:val="false"/>
         </w:rPr>
-        <w:t xml:space="preserve"> specimen #355, with the sacrum, partial left ilium last five dorsal vertebral centra and some ribs also in view (compare Figure 3). The </w:t>
-      </w:r>
-      <w:r>
-        <w:rPr>
-          <w:b w:val="false"/>
-          <w:bCs w:val="false"/>
-          <w:i/>
-          <w:iCs/>
-        </w:rPr>
-        <w:t>Diplodocus</w:t>
+        <w:t xml:space="preserve"> specimen #355 </w:t>
       </w:r>
       <w:r>
         <w:rPr>
@@ -9221,6 +8717,64 @@
           <w:i w:val="false"/>
           <w:iCs w:val="false"/>
         </w:rPr>
+        <w:t xml:space="preserve">(now USNM </w:t>
+      </w:r>
+      <w:r>
+        <w:rPr/>
+        <w:t>10865</w:t>
+      </w:r>
+      <w:r>
+        <w:rPr>
+          <w:b w:val="false"/>
+          <w:bCs w:val="false"/>
+          <w:i w:val="false"/>
+          <w:iCs w:val="false"/>
+        </w:rPr>
+        <w:t>)</w:t>
+      </w:r>
+      <w:r>
+        <w:rPr>
+          <w:b w:val="false"/>
+          <w:bCs w:val="false"/>
+          <w:i w:val="false"/>
+          <w:iCs w:val="false"/>
+        </w:rPr>
+        <w:t xml:space="preserve">, with the sacrum, partial left ilium, last five dorsal vertebral centra and some ribs also in view (compare Figure 3, </w:t>
+      </w:r>
+      <w:r>
+        <w:rPr>
+          <w:b w:val="false"/>
+          <w:bCs w:val="false"/>
+          <w:i w:val="false"/>
+          <w:iCs w:val="false"/>
+        </w:rPr>
+        <w:t>in which the femur is labelled 23, the ilium 24 and the last five dorsals 7–11</w:t>
+      </w:r>
+      <w:r>
+        <w:rPr>
+          <w:b w:val="false"/>
+          <w:bCs w:val="false"/>
+          <w:i w:val="false"/>
+          <w:iCs w:val="false"/>
+        </w:rPr>
+        <w:t xml:space="preserve">). The </w:t>
+      </w:r>
+      <w:r>
+        <w:rPr>
+          <w:b w:val="false"/>
+          <w:bCs w:val="false"/>
+          <w:i/>
+          <w:iCs/>
+        </w:rPr>
+        <w:t>Diplodocus</w:t>
+      </w:r>
+      <w:r>
+        <w:rPr>
+          <w:b w:val="false"/>
+          <w:bCs w:val="false"/>
+          <w:i w:val="false"/>
+          <w:iCs w:val="false"/>
+        </w:rPr>
         <w:t xml:space="preserve"> is seen in ventral view with anterior to the top. Photograph uploaded to Wikimedia Commons by Ken Carpenter.</w:t>
       </w:r>
     </w:p>
@@ -9336,7 +8890,52 @@
           <w:i w:val="false"/>
           <w:iCs w:val="false"/>
         </w:rPr>
-        <w:t xml:space="preserve"> would become AMNH 6341.</w:t>
+        <w:t xml:space="preserve"> would become AMNH 6341. </w:t>
+      </w:r>
+      <w:r>
+        <w:rPr>
+          <w:b w:val="false"/>
+          <w:bCs w:val="false"/>
+          <w:i w:val="false"/>
+          <w:iCs w:val="false"/>
+        </w:rPr>
+        <w:t xml:space="preserve">Note that in this map the cervical vertebrae of </w:t>
+      </w:r>
+      <w:r>
+        <w:rPr>
+          <w:b w:val="false"/>
+          <w:bCs w:val="false"/>
+          <w:i/>
+          <w:iCs/>
+        </w:rPr>
+        <w:t>Barosaurus</w:t>
+      </w:r>
+      <w:r>
+        <w:rPr>
+          <w:b w:val="false"/>
+          <w:bCs w:val="false"/>
+          <w:i w:val="false"/>
+          <w:iCs w:val="false"/>
+        </w:rPr>
+        <w:t xml:space="preserve"> #340 are drawn to look like those of </w:t>
+      </w:r>
+      <w:r>
+        <w:rPr>
+          <w:b w:val="false"/>
+          <w:bCs w:val="false"/>
+          <w:i/>
+          <w:iCs/>
+        </w:rPr>
+        <w:t>Diplodocus</w:t>
+      </w:r>
+      <w:r>
+        <w:rPr>
+          <w:b w:val="false"/>
+          <w:bCs w:val="false"/>
+          <w:i w:val="false"/>
+          <w:iCs w:val="false"/>
+        </w:rPr>
+        <w:t>, which they were originally assumed to represent. Note also that the number of cervical vertebrae illustrated is ten, compared with the preserved count of nine, weakly corroborating the possibility that there was originally an additional, more anterior vertebra (C7 of present usage).</w:t>
       </w:r>
     </w:p>
     <w:p>
@@ -9415,7 +9014,7 @@
       </w:r>
       <w:r>
         <w:rPr/>
-        <w:t xml:space="preserve"> The mounted skeleton of </w:t>
+        <w:t xml:space="preserve"> The mounted skeleton of “</w:t>
       </w:r>
       <w:r>
         <w:rPr>
@@ -9426,7 +9025,11 @@
       </w:r>
       <w:r>
         <w:rPr/>
-        <w:t xml:space="preserve"> (now thought to be </w:t>
+        <w:t xml:space="preserve">” </w:t>
+      </w:r>
+      <w:r>
+        <w:rPr/>
+        <w:t xml:space="preserve">(now thought to be </w:t>
       </w:r>
       <w:r>
         <w:rPr>
@@ -9493,7 +9096,7 @@
     </w:p>
     <w:p>
       <w:pPr>
-        <w:pStyle w:val="BlockQuotation"/>
+        <w:pStyle w:val="BlockQuotationuser"/>
         <w:rPr/>
       </w:pPr>
       <w:r>
@@ -9518,7 +9121,7 @@
       </w:r>
       <w:r>
         <w:rPr/>
-        <w:t xml:space="preserve"> and is characterized by extremely long cervical vertebrae which are more hollow than in other sauropods. Bones of skeleton, colored brown in restoration, are displayed below and in adjoining case; missing parts outlined. Restoration of skeleton, one-twelfth natural size. Dimensions of skeleton as restored – length 78 ft. height 19–1/2 ft. Acquired by purchase and exchange. Amer. Mus. No. 6341.</w:t>
+        <w:t xml:space="preserve"> and is characterized by extremely long cervical vertebrae which are more hollow than in other sauropods. Bones of skeleton, colored brown in restoration, are displayed below and in adjoining case; missing parts outlined. Restoration of skeleton, one-twelfth natural size. Dimensions of skeleton as restored — length 78 ft., height 19–1/2 ft. Acquired by purchase and exchange. Amer. Mus. No. 6341.</w:t>
       </w:r>
     </w:p>
     <w:p>
@@ -9526,7 +9129,7 @@
         <w:pStyle w:val="FigureCaption"/>
         <w:widowControl/>
         <w:suppressAutoHyphens w:val="true"/>
-        <w:overflowPunct w:val="false"/>
+        <w:overflowPunct w:val="true"/>
         <w:bidi w:val="0"/>
         <w:spacing w:lineRule="auto" w:line="276" w:before="0" w:after="142"/>
         <w:ind w:hanging="0" w:left="283" w:right="0"/>
@@ -9535,7 +9138,7 @@
       </w:pPr>
       <w:r>
         <w:rPr/>
-        <w:t xml:space="preserve">The representation of which bones are included in the specimen is a good match for our modern reconstruction (Figure 15), but there are some differences in the reconstruction. Most notably, only  14 cervical vertebrae are depicted, with the nine preserved cervicals interpreted as C6–C14. This is surprising as the closely related </w:t>
+        <w:t xml:space="preserve">The representation of which bones are included in the specimen is a good match for our modern reconstruction (Figure 15), but there are some differences in the reconstruction. Most notably, only 14 cervical vertebrae are depicted, with the nine preserved cervicals interpreted as C6–C14. This is surprising as the closely related </w:t>
       </w:r>
       <w:r>
         <w:rPr>
@@ -9546,7 +9149,30 @@
       </w:r>
       <w:r>
         <w:rPr/>
-        <w:t xml:space="preserve"> had been known with some confidence since Hatcher’s (1901) monograph to have 15 cervicals. Also surprisingly, the 1939 reconstruction shows only nine dorsal vertebrae, compared with the ten described by Holland (1905:251–252) when omitting the dorsosacral. This was likely done to correctly depict the total number of preserved presacrals as 18. While McIntosh’s catalogue of material indicates that the first 29 caudals are preserved, the 1939 diagram shows 30 caudals, of which the neural spines of Ca1–3 and Ca26–28 are absent and Ca21 is represented only by the anterior portion of its centrum. Finally, the 1939 diagram suggests that of the right dorsal ribs, only those of D7 and D8 are present, which contradicts McIntosh’s (2005:57) assessment that two of the six preserved ribs are the left and right ribs of D1 or D2.</w:t>
+        <w:t xml:space="preserve"> had been known with some confidence since Hatcher’s (1901) monograph to have 15 cervicals. Also surprisingly, the 1939 reconstruction shows only nine dorsal vertebrae, compared with the ten described by Holland (190</w:t>
+      </w:r>
+      <w:r>
+        <w:rPr/>
+        <w:t>6</w:t>
+      </w:r>
+      <w:r>
+        <w:rPr/>
+        <w:t xml:space="preserve">:251–252) </w:t>
+      </w:r>
+      <w:r>
+        <w:rPr/>
+        <w:t xml:space="preserve">for </w:t>
+      </w:r>
+      <w:r>
+        <w:rPr>
+          <w:i/>
+          <w:iCs/>
+        </w:rPr>
+        <w:t>Diplodocus</w:t>
+      </w:r>
+      <w:r>
+        <w:rPr/>
+        <w:t>. While McIntosh’s catalogue of material indicates that the first 29 caudals are preserved, the 1939 diagram shows 30 caudals, of which the neural spines of Ca1–3 and Ca26–28 are absent and Ca21 is represented only by the anterior portion of its centrum. Finally, the 1939 diagram suggests that of the right dorsal ribs, only those of D7 and D8 are present, which contradicts McIntosh’s (2005:57) assessment that two of the six preserved ribs are the left and right ribs of D1 or D2.</w:t>
       </w:r>
     </w:p>
     <w:p>
@@ -9575,7 +9201,15 @@
       </w:r>
       <w:r>
         <w:rPr/>
-        <w:t xml:space="preserve">, painted by Gregory S. Paul in the late 1970s or early 1980s. In this revised version, a pack of </w:t>
+        <w:t xml:space="preserve">, painted by Gregory S. Paul in the late 1970s or early 1980s. In this revised version, </w:t>
+      </w:r>
+      <w:r>
+        <w:rPr/>
+        <w:t xml:space="preserve">completed in 1985, </w:t>
+      </w:r>
+      <w:r>
+        <w:rPr/>
+        <w:t xml:space="preserve">a pack of </w:t>
       </w:r>
       <w:r>
         <w:rPr>
@@ -9670,7 +9304,15 @@
       </w:r>
       <w:r>
         <w:rPr/>
-        <w:t>, and the base is 44 inches (112 cm) long (Mick Ellison, pers. comm, 2022. Despite some notable differences — for example, the model has a much more strongly S-curved neck than the full-size mount, and its forefeet lack digits — the model seems to have been followed fairly closely in composing the final mount, and remains a beautiful object in its own right. Photograph by Mick Ellison (AMNH).</w:t>
+        <w:t>, and the base is 44 inches (112 cm) long (Mick Ellison, pers. comm, 2022</w:t>
+      </w:r>
+      <w:r>
+        <w:rPr/>
+        <w:t>)</w:t>
+      </w:r>
+      <w:r>
+        <w:rPr/>
+        <w:t>. Despite some notable differences — for example, the model has a much more strongly S-curved neck than the full-size mount, and its forefeet lack digits — the model seems to have been followed fairly closely in composing the final mount, and remains a beautiful object in its own right. Photograph by Mick Ellison (AMNH).</w:t>
       </w:r>
     </w:p>
     <w:p>
@@ -9701,7 +9343,15 @@
       </w:r>
       <w:r>
         <w:rPr/>
-        <w:t xml:space="preserve"> AMNH 6341, here seen upside-down in right ventrolateral view. The separator on the mold wall allows the rubber latex for the next mold section to be applied without adhering to the first mold section, so that the mold sections will separate easily. Photograph provided by Department of Vertebrate Paleontology Archive, Copyright © AMNH.</w:t>
+        <w:t xml:space="preserve"> AMNH 6341, here seen upside-down in right ventrolateral view </w:t>
+      </w:r>
+      <w:r>
+        <w:rPr/>
+        <w:t>with anterior to the left</w:t>
+      </w:r>
+      <w:r>
+        <w:rPr/>
+        <w:t>. The separator on the mold wall allows the rubber latex for the next mold section to be applied without adhering to the first mold section, so that the mold sections will separate easily. Photograph provided by Department of Vertebrate Paleontology Archive.</w:t>
       </w:r>
     </w:p>
     <w:p>
@@ -9743,7 +9393,15 @@
       </w:r>
       <w:r>
         <w:rPr/>
-        <w:t xml:space="preserve"> left anterolateral view, with three RCI employees working on the anterior part of the neck: one in a cherry-picker, the other two on a scissor lift. That that the two missing cervical vertebra have been added, and that the posterior one is a different colour from the others. The ribs are a noticeably lighter colour than the rest of the skeleton, presumably because they had not been painted at this point. Photographs provided by Department of Vertebrate Paleontology Archive, Copyright © AMNH.</w:t>
+        <w:t xml:space="preserve"> left anterolateral view, with three RCI employees working on the anterior part of the neck: one in a cherry-picker, the other two on a scissor lift. </w:t>
+      </w:r>
+      <w:r>
+        <w:rPr/>
+        <w:t>Note</w:t>
+      </w:r>
+      <w:r>
+        <w:rPr/>
+        <w:t xml:space="preserve"> that the two missing cervical vertebra have been added, and that the posterior one is a different colour from the others. The ribs are a noticeably lighter colour than the rest of the skeleton, presumably because they had not been painted at this point. Photographs provided by Department of Vertebrate Paleontology Archive.</w:t>
       </w:r>
     </w:p>
     <w:p>
@@ -9763,7 +9421,7 @@
       </w:r>
       <w:r>
         <w:rPr/>
-        <w:t xml:space="preserve"> Part way through the trial mounting process in the parking lot behind the RCI workshop in Spring 1991. In the lift platform, Peter May sets the humerus in place while Jack McIntosh advises on its articulation; and Rick Eyre (back to the camera) looks on. At ground level, Gene Gaffney, Mark Norell and Lowell Dingus (left to right) observe. Photographs provided by Department of Vertebrate Paleontology Archive, Copyright © AMNH.</w:t>
+        <w:t xml:space="preserve"> Part way through the trial mounting process in the parking lot behind the RCI workshop in Spring 1991. In the lift platform, Peter May sets the humerus in place while Jack McIntosh advises on its articulation and Rick Eyre (back to the camera) looks on. At ground level, Gene Gaffney, Mark Norell and Lowell Dingus (left to right) observe. Photographs provided by Department of Vertebrate Paleontology Archive.</w:t>
       </w:r>
     </w:p>
     <w:p>
@@ -9802,23 +9460,21 @@
           <w:b w:val="false"/>
           <w:bCs w:val="false"/>
         </w:rPr>
-        <w:t xml:space="preserve"> skeleton on the floor of the Roosevelt Memorial Hall of the American Museum of Natural History before mounting. Centrally, the skull and cervical vertebrae 3–16, all articulated in a single piece, with the atlas an axis still to be fitted. By the wall to the right are the two halves of the 17th cervical vertebrae: the left half, highlighted in red, with anterior towards the camera; and the right half, highlighted in blue, with anterior facing away. Between these and the neck is the distal (whiplash) portion of a tail: possibly that of the main </w:t>
+        <w:t xml:space="preserve"> skeleton on the floor of the Roosevelt Memorial Hall of the American Museum of Natural History before mounting. Centrally, the skull and cervical vertebrae 3–16, all articulated in a single piece, with the atlas an axis still to be fitted </w:t>
       </w:r>
       <w:r>
         <w:rPr>
           <w:b w:val="false"/>
           <w:bCs w:val="false"/>
-          <w:i/>
-          <w:iCs/>
-        </w:rPr>
-        <w:t>Barosaurus</w:t>
+        </w:rPr>
+        <w:t>behind the skull</w:t>
       </w:r>
       <w:r>
         <w:rPr>
           <w:b w:val="false"/>
           <w:bCs w:val="false"/>
         </w:rPr>
-        <w:t xml:space="preserve">, but more likely that of the juvenile based on the small size of the most proximal caudals. Between this and the neck is section that is probably the proximal part of the </w:t>
+        <w:t xml:space="preserve">. By the wall to the right are the two halves of the 17th cervical vertebrae: the left half, highlighted in red, with anterior towards the camera; and the right half, highlighted in blue, with anterior facing away. Between these and the neck is the distal (whiplash) portion of a tail: possibly that of the main </w:t>
       </w:r>
       <w:r>
         <w:rPr>
@@ -9827,14 +9483,44 @@
           <w:i/>
           <w:iCs/>
         </w:rPr>
-        <w:t>Allosaurus</w:t>
+        <w:t>Barosaurus</w:t>
       </w:r>
       <w:r>
         <w:rPr>
           <w:b w:val="false"/>
           <w:bCs w:val="false"/>
         </w:rPr>
-        <w:t xml:space="preserve"> tail. Finally, intruding on the image from the left is the distal part (whiplash) portion of the other </w:t>
+        <w:t xml:space="preserve">, but more likely that of the juvenile based on the small size of the most proximal caudals. Between this and the neck is </w:t>
+      </w:r>
+      <w:r>
+        <w:rPr>
+          <w:b w:val="false"/>
+          <w:bCs w:val="false"/>
+        </w:rPr>
+        <w:t xml:space="preserve">a </w:t>
+      </w:r>
+      <w:r>
+        <w:rPr>
+          <w:b w:val="false"/>
+          <w:bCs w:val="false"/>
+        </w:rPr>
+        <w:t xml:space="preserve">section that is probably the proximal part of the </w:t>
+      </w:r>
+      <w:r>
+        <w:rPr>
+          <w:b w:val="false"/>
+          <w:bCs w:val="false"/>
+          <w:i/>
+          <w:iCs/>
+        </w:rPr>
+        <w:t>Allosaurus</w:t>
+      </w:r>
+      <w:r>
+        <w:rPr>
+          <w:b w:val="false"/>
+          <w:bCs w:val="false"/>
+        </w:rPr>
+        <w:t xml:space="preserve"> tail. Finally, intruding on the image from the left is the distal (whiplash) portion of the other </w:t>
       </w:r>
       <w:r>
         <w:rPr>
@@ -9870,7 +9556,15 @@
       </w:r>
       <w:r>
         <w:rPr/>
-        <w:t xml:space="preserve"> Two views of the final mounting in the Roosevelt Memorial Hall of the American Museum of Natural History, both showing the use of two frighteningly unstable-looking cherry-picker cranes. The RCI employees in the higher crane are moving the head-and-neck assembly into place, while the two in the lower crane attempt to fit it to the anterior torso. Photograph provided by Department of Vertebrate Paleontology Archive, Copyright © AMNH.</w:t>
+        <w:t xml:space="preserve"> Two views of the final mounting in the Roosevelt Memorial Hall of the American Museum of Natural History, both showing the use of two frighteningly unstable-looking cherry-picker cranes. The RCI employees in the higher crane are moving the head-and-neck assembly into place, while the two in the lower crane attempt to fit it to the anterior torso. Photograph</w:t>
+      </w:r>
+      <w:r>
+        <w:rPr/>
+        <w:t>s</w:t>
+      </w:r>
+      <w:r>
+        <w:rPr/>
+        <w:t xml:space="preserve"> provided by Department of Vertebrate Paleontology Archive, Copyright © AMNH.</w:t>
       </w:r>
     </w:p>
     <w:p>
@@ -10071,7 +9765,25 @@
           <w:i w:val="false"/>
           <w:iCs w:val="false"/>
         </w:rPr>
-        <w:t xml:space="preserve"> held upright, seen in right lateral view. Note that the vertebra in positions 3–7 are those of </w:t>
+        <w:t xml:space="preserve"> held upright, seen in right lateral view. Note that the vertebra</w:t>
+      </w:r>
+      <w:r>
+        <w:rPr>
+          <w:b w:val="false"/>
+          <w:bCs w:val="false"/>
+          <w:i w:val="false"/>
+          <w:iCs w:val="false"/>
+        </w:rPr>
+        <w:t>e</w:t>
+      </w:r>
+      <w:r>
+        <w:rPr>
+          <w:b w:val="false"/>
+          <w:bCs w:val="false"/>
+          <w:i w:val="false"/>
+          <w:iCs w:val="false"/>
+        </w:rPr>
+        <w:t xml:space="preserve"> in positions 3–7 are those of </w:t>
       </w:r>
       <w:r>
         <w:rPr>
@@ -10391,7 +10103,11 @@
             </w:pPr>
             <w:r>
               <w:rPr/>
-              <w:t xml:space="preserve">the first fossils of what is now </w:t>
+              <w:t>T</w:t>
+            </w:r>
+            <w:r>
+              <w:rPr/>
+              <w:t xml:space="preserve">he first fossils of what is now </w:t>
             </w:r>
             <w:r>
               <w:rPr>
@@ -10943,7 +10659,23 @@
             </w:r>
             <w:r>
               <w:rPr/>
-              <w:t xml:space="preserve"> skeletal mount based on USNM 10865 (#355). When prepared, the neck sent to the USNM proved to belong not to </w:t>
+              <w:t xml:space="preserve"> skeletal mount based on </w:t>
+            </w:r>
+            <w:r>
+              <w:rPr/>
+              <w:t>the other diplodocine</w:t>
+            </w:r>
+            <w:r>
+              <w:rPr/>
+              <w:t xml:space="preserve"> #355 </w:t>
+            </w:r>
+            <w:r>
+              <w:rPr/>
+              <w:t>(USNM 10865</w:t>
+            </w:r>
+            <w:r>
+              <w:rPr/>
+              <w:t xml:space="preserve">). When prepared, the neck sent to the USNM proved to belong not to </w:t>
             </w:r>
             <w:r>
               <w:rPr>
@@ -11121,7 +10853,15 @@
             </w:pPr>
             <w:r>
               <w:rPr/>
-              <w:t>The presacral vertebrae and some limb bones of AMNH 6341 were exhibited in the Hall of Early Dinosaurs.</w:t>
+              <w:t xml:space="preserve">The presacral vertebrae, </w:t>
+            </w:r>
+            <w:r>
+              <w:rPr/>
+              <w:t xml:space="preserve">scapulocoracoid and humerus </w:t>
+            </w:r>
+            <w:r>
+              <w:rPr/>
+              <w:t>of AMNH 6341 were exhibited in the Hall of Early Dinosaurs.</w:t>
             </w:r>
           </w:p>
         </w:tc>
@@ -11499,7 +11239,7 @@
             </w:r>
             <w:r>
               <w:rPr/>
-              <w:t xml:space="preserve"> of Vernal, used it to create second-generation molds, and created a new, lightweight cast for the Utah Field House’s new building.</w:t>
+              <w:t xml:space="preserve"> of Vernal, used it to create second-generation molds, and created a new, lightweight cast for the Utah Field House.</w:t>
             </w:r>
           </w:p>
         </w:tc>
@@ -11588,7 +11328,33 @@
             </w:r>
             <w:r>
               <w:rPr/>
-              <w:t xml:space="preserve"> AMNH 6341.</w:t>
+              <w:t xml:space="preserve"> AMNH 6341 </w:t>
+            </w:r>
+            <w:r>
+              <w:rPr/>
+              <w:t xml:space="preserve">along with a juvenile </w:t>
+            </w:r>
+            <w:r>
+              <w:rPr>
+                <w:i/>
+                <w:iCs/>
+              </w:rPr>
+              <w:t>Barosaurus</w:t>
+            </w:r>
+            <w:r>
+              <w:rPr/>
+              <w:t xml:space="preserve"> and an </w:t>
+            </w:r>
+            <w:r>
+              <w:rPr>
+                <w:i/>
+                <w:iCs/>
+              </w:rPr>
+              <w:t>Allosaurus</w:t>
+            </w:r>
+            <w:r>
+              <w:rPr/>
+              <w:t>.</w:t>
             </w:r>
           </w:p>
         </w:tc>
@@ -11989,156 +11755,6 @@
             <w:r>
               <w:rPr/>
               <w:t>The exhibit was opened to the public.</w:t>
-            </w:r>
-          </w:p>
-        </w:tc>
-      </w:tr>
-      <w:tr>
-        <w:trPr>
-          <w:trHeight w:val="246" w:hRule="atLeast"/>
-        </w:trPr>
-        <w:tc>
-          <w:tcPr>
-            <w:tcW w:w="2207" w:type="dxa"/>
-            <w:tcBorders/>
-          </w:tcPr>
-          <w:p>
-            <w:pPr>
-              <w:pStyle w:val="TableContents"/>
-              <w:spacing w:before="0" w:after="113"/>
-              <w:rPr/>
-            </w:pPr>
-            <w:r>
-              <w:rPr/>
-              <w:t>2005</w:t>
-            </w:r>
-          </w:p>
-        </w:tc>
-        <w:tc>
-          <w:tcPr>
-            <w:tcW w:w="7431" w:type="dxa"/>
-            <w:tcBorders/>
-          </w:tcPr>
-          <w:p>
-            <w:pPr>
-              <w:pStyle w:val="TableContents"/>
-              <w:spacing w:before="0" w:after="113"/>
-              <w:rPr/>
-            </w:pPr>
-            <w:r>
-              <w:rPr/>
-              <w:t xml:space="preserve">McIntosh’s (2005) paper on </w:t>
-            </w:r>
-            <w:r>
-              <w:rPr>
-                <w:i/>
-                <w:iCs/>
-              </w:rPr>
-              <w:t>Barosaurus</w:t>
-            </w:r>
-            <w:r>
-              <w:rPr/>
-              <w:t xml:space="preserve"> included the first scientific description of AMNH 6341.</w:t>
-            </w:r>
-          </w:p>
-        </w:tc>
-      </w:tr>
-      <w:tr>
-        <w:trPr>
-          <w:trHeight w:val="246" w:hRule="atLeast"/>
-        </w:trPr>
-        <w:tc>
-          <w:tcPr>
-            <w:tcW w:w="2207" w:type="dxa"/>
-            <w:tcBorders/>
-          </w:tcPr>
-          <w:p>
-            <w:pPr>
-              <w:pStyle w:val="TableContents"/>
-              <w:spacing w:before="0" w:after="113"/>
-              <w:rPr/>
-            </w:pPr>
-            <w:r>
-              <w:rPr/>
-              <w:t>2007</w:t>
-            </w:r>
-          </w:p>
-        </w:tc>
-        <w:tc>
-          <w:tcPr>
-            <w:tcW w:w="7431" w:type="dxa"/>
-            <w:tcBorders/>
-          </w:tcPr>
-          <w:p>
-            <w:pPr>
-              <w:pStyle w:val="TableContents"/>
-              <w:spacing w:before="0" w:after="113"/>
-              <w:rPr/>
-            </w:pPr>
-            <w:r>
-              <w:rPr/>
-              <w:t>David Evans realised ROM 3670 (a “</w:t>
-            </w:r>
-            <w:r>
-              <w:rPr>
-                <w:i/>
-                <w:iCs/>
-              </w:rPr>
-              <w:t>Diplodocus</w:t>
-            </w:r>
-            <w:r>
-              <w:rPr/>
-              <w:t xml:space="preserve">” traded from the Carnegie Museum around 1962) was actually </w:t>
-            </w:r>
-            <w:r>
-              <w:rPr>
-                <w:i/>
-                <w:iCs/>
-              </w:rPr>
-              <w:t>Barosaurus</w:t>
-            </w:r>
-            <w:r>
-              <w:rPr/>
-              <w:t>.</w:t>
-            </w:r>
-          </w:p>
-        </w:tc>
-      </w:tr>
-      <w:tr>
-        <w:trPr>
-          <w:trHeight w:val="246" w:hRule="atLeast"/>
-        </w:trPr>
-        <w:tc>
-          <w:tcPr>
-            <w:tcW w:w="2207" w:type="dxa"/>
-            <w:tcBorders/>
-          </w:tcPr>
-          <w:p>
-            <w:pPr>
-              <w:pStyle w:val="TableContents"/>
-              <w:spacing w:before="0" w:after="113"/>
-              <w:rPr/>
-            </w:pPr>
-            <w:r>
-              <w:rPr/>
-              <w:t>5 December 2007</w:t>
-            </w:r>
-          </w:p>
-        </w:tc>
-        <w:tc>
-          <w:tcPr>
-            <w:tcW w:w="7431" w:type="dxa"/>
-            <w:tcBorders/>
-          </w:tcPr>
-          <w:p>
-            <w:pPr>
-              <w:pStyle w:val="TableContents"/>
-              <w:spacing w:before="0" w:after="113"/>
-              <w:rPr/>
-            </w:pPr>
-            <w:r>
-              <w:rPr/>
-              <w:t>ROM 3670 (“Gordo”) was unveiled in Toronto, having been mounted by RCI.</w:t>
             </w:r>
           </w:p>
         </w:tc>
@@ -13383,7 +12999,7 @@
     <w:pPr>
       <w:widowControl/>
       <w:suppressAutoHyphens w:val="true"/>
-      <w:overflowPunct w:val="false"/>
+      <w:overflowPunct w:val="true"/>
       <w:bidi w:val="0"/>
       <w:spacing w:before="0" w:after="0"/>
       <w:ind w:hanging="0" w:left="0" w:right="0"/>
@@ -13494,8 +13110,8 @@
     <w:qFormat/>
     <w:rPr/>
   </w:style>
-  <w:style w:type="character" w:styleId="Bullets">
-    <w:name w:val="Bullets"/>
+  <w:style w:type="character" w:styleId="Bulletsuser">
+    <w:name w:val="Bullets (user)"/>
     <w:qFormat/>
     <w:rPr>
       <w:rFonts w:ascii="OpenSymbol" w:hAnsi="OpenSymbol" w:eastAsia="OpenSymbol" w:cs="OpenSymbol"/>
@@ -13620,8 +13236,8 @@
       <w:i/>
     </w:rPr>
   </w:style>
-  <w:style w:type="paragraph" w:styleId="BlockQuotation">
-    <w:name w:val="Block Quotation"/>
+  <w:style w:type="paragraph" w:styleId="BlockQuotationuser">
+    <w:name w:val="Block Quotation (user)"/>
     <w:basedOn w:val="Normal"/>
     <w:qFormat/>
     <w:pPr>

</xml_diff>

<commit_message>
Put Norell and McIntosd back into authorship in actual ms
</commit_message>
<xml_diff>
--- a/TaylorEtAl-mounted-barosaurus.docx
+++ b/TaylorEtAl-mounted-barosaurus.docx
@@ -162,6 +162,56 @@
         </w:r>
       </w:hyperlink>
       <w:bookmarkEnd w:id="0"/>
+    </w:p>
+    <w:p>
+      <w:pPr>
+        <w:pStyle w:val="Author"/>
+        <w:rPr>
+          <w:i w:val="false"/>
+          <w:iCs w:val="false"/>
+        </w:rPr>
+      </w:pPr>
+      <w:r>
+        <w:rPr>
+          <w:b/>
+          <w:bCs/>
+          <w:i w:val="false"/>
+          <w:iCs w:val="false"/>
+        </w:rPr>
+        <w:t>John S. McIntosh</w:t>
+      </w:r>
+      <w:r>
+        <w:rPr>
+          <w:i w:val="false"/>
+          <w:iCs w:val="false"/>
+        </w:rPr>
+        <w:t>. Wesleyan University, Science Tower, Middle Town, Connecticut 06457, USA.  (Deceased 2015)</w:t>
+      </w:r>
+    </w:p>
+    <w:p>
+      <w:pPr>
+        <w:pStyle w:val="Author"/>
+        <w:rPr>
+          <w:i w:val="false"/>
+          <w:iCs w:val="false"/>
+        </w:rPr>
+      </w:pPr>
+      <w:r>
+        <w:rPr>
+          <w:b/>
+          <w:bCs/>
+          <w:i w:val="false"/>
+          <w:iCs w:val="false"/>
+        </w:rPr>
+        <w:t>Mark A. Norell.</w:t>
+      </w:r>
+      <w:r>
+        <w:rPr>
+          <w:i w:val="false"/>
+          <w:iCs w:val="false"/>
+        </w:rPr>
+        <w:t xml:space="preserve"> Division of Paleontology, American Museum of Natural History, New York, New York, USA. (Deceased 2025).</w:t>
+      </w:r>
     </w:p>
     <w:p>
       <w:pPr>
@@ -352,16 +402,17 @@
             </w:rPr>
             <w:fldChar w:fldCharType="separate"/>
           </w:r>
-          <w:hyperlink w:anchor="__RefHeading___Toc3784_1986291683" w:tooltip="Introduction">
-            <w:r>
-              <w:rPr>
-                <w:rStyle w:val="IndexLink"/>
-              </w:rPr>
-              <w:t>Introduction</w:t>
-              <w:tab/>
-              <w:t>2</w:t>
-            </w:r>
-          </w:hyperlink>
+          <w:r>
+            <w:rPr>
+              <w:rStyle w:val="IndexLink"/>
+            </w:rPr>
+            <w:t>Introduction</w:t>
+          </w:r>
+          <w:r>
+            <w:rPr/>
+            <w:tab/>
+            <w:t>2</w:t>
+          </w:r>
         </w:p>
         <w:p>
           <w:pPr>
@@ -372,16 +423,12 @@
             </w:tabs>
             <w:rPr/>
           </w:pPr>
-          <w:hyperlink w:anchor="__RefHeading___Toc3323_2187837281" w:tooltip="Anatomical nomenclature">
-            <w:r>
-              <w:rPr>
-                <w:rStyle w:val="IndexLink"/>
-              </w:rPr>
-              <w:t>Anatomical nomenclature</w:t>
-              <w:tab/>
-              <w:t>3</w:t>
-            </w:r>
-          </w:hyperlink>
+          <w:r>
+            <w:rPr/>
+            <w:t>Anatomical nomenclature</w:t>
+            <w:tab/>
+            <w:t>3</w:t>
+          </w:r>
         </w:p>
         <w:p>
           <w:pPr>
@@ -392,16 +439,12 @@
             </w:tabs>
             <w:rPr/>
           </w:pPr>
-          <w:hyperlink w:anchor="__RefHeading___Toc5349_68767826" w:tooltip="Institutional abbreviations">
-            <w:r>
-              <w:rPr>
-                <w:rStyle w:val="IndexLink"/>
-              </w:rPr>
-              <w:t>Institutional abbreviations</w:t>
-              <w:tab/>
-              <w:t>3</w:t>
-            </w:r>
-          </w:hyperlink>
+          <w:r>
+            <w:rPr/>
+            <w:t>Institutional abbreviations</w:t>
+            <w:tab/>
+            <w:t>3</w:t>
+          </w:r>
         </w:p>
         <w:p>
           <w:pPr>
@@ -412,16 +455,12 @@
             </w:tabs>
             <w:rPr/>
           </w:pPr>
-          <w:hyperlink w:anchor="__RefHeading___Toc4316_68767826" w:tooltip="Historical background">
-            <w:r>
-              <w:rPr>
-                <w:rStyle w:val="IndexLink"/>
-              </w:rPr>
-              <w:t>Historical background</w:t>
-              <w:tab/>
-              <w:t>3</w:t>
-            </w:r>
-          </w:hyperlink>
+          <w:r>
+            <w:rPr/>
+            <w:t>Historical background</w:t>
+            <w:tab/>
+            <w:t>3</w:t>
+          </w:r>
         </w:p>
         <w:p>
           <w:pPr>
@@ -432,29 +471,22 @@
             </w:tabs>
             <w:rPr/>
           </w:pPr>
-          <w:hyperlink w:anchor="__RefHeading___Toc12350_68767826" w:tooltip="Early discoveries of Barosaurus">
-            <w:r>
-              <w:rPr>
-                <w:rStyle w:val="IndexLink"/>
-              </w:rPr>
-              <w:t xml:space="preserve">Early discoveries of </w:t>
-            </w:r>
-            <w:r>
-              <w:rPr>
-                <w:rStyle w:val="IndexLink"/>
-                <w:i/>
-                <w:iCs/>
-              </w:rPr>
-              <w:t>Barosaurus</w:t>
-            </w:r>
-            <w:r>
-              <w:rPr>
-                <w:rStyle w:val="IndexLink"/>
-              </w:rPr>
-              <w:tab/>
-              <w:t>3</w:t>
-            </w:r>
-          </w:hyperlink>
+          <w:r>
+            <w:rPr/>
+            <w:t xml:space="preserve">Early discoveries of </w:t>
+          </w:r>
+          <w:r>
+            <w:rPr>
+              <w:i/>
+              <w:iCs/>
+            </w:rPr>
+            <w:t>Barosaurus</w:t>
+          </w:r>
+          <w:r>
+            <w:rPr/>
+            <w:tab/>
+            <w:t>3</w:t>
+          </w:r>
         </w:p>
         <w:p>
           <w:pPr>
@@ -465,29 +497,22 @@
             </w:tabs>
             <w:rPr/>
           </w:pPr>
-          <w:hyperlink w:anchor="__RefHeading___Toc12352_68767826" w:tooltip="The AMNH specimen of Barosaurus">
-            <w:r>
-              <w:rPr>
-                <w:rStyle w:val="IndexLink"/>
-              </w:rPr>
-              <w:t xml:space="preserve">The AMNH specimen of </w:t>
-            </w:r>
-            <w:r>
-              <w:rPr>
-                <w:rStyle w:val="IndexLink"/>
-                <w:i/>
-                <w:iCs/>
-              </w:rPr>
-              <w:t>Barosaurus</w:t>
-            </w:r>
-            <w:r>
-              <w:rPr>
-                <w:rStyle w:val="IndexLink"/>
-              </w:rPr>
-              <w:tab/>
-              <w:t>4</w:t>
-            </w:r>
-          </w:hyperlink>
+          <w:r>
+            <w:rPr/>
+            <w:t xml:space="preserve">The AMNH specimen of </w:t>
+          </w:r>
+          <w:r>
+            <w:rPr>
+              <w:i/>
+              <w:iCs/>
+            </w:rPr>
+            <w:t>Barosaurus</w:t>
+          </w:r>
+          <w:r>
+            <w:rPr/>
+            <w:tab/>
+            <w:t>4</w:t>
+          </w:r>
         </w:p>
         <w:p>
           <w:pPr>
@@ -498,16 +523,12 @@
             </w:tabs>
             <w:rPr/>
           </w:pPr>
-          <w:hyperlink w:anchor="__RefHeading___Toc25848_1820571732" w:tooltip="The Carnegie Quarry at Dinosaur National Monument">
-            <w:r>
-              <w:rPr>
-                <w:rStyle w:val="IndexLink"/>
-              </w:rPr>
-              <w:t>The Carnegie Quarry at Dinosaur National Monument</w:t>
-              <w:tab/>
-              <w:t>4</w:t>
-            </w:r>
-          </w:hyperlink>
+          <w:r>
+            <w:rPr/>
+            <w:t>The Carnegie Quarry at Dinosaur National Monument</w:t>
+            <w:tab/>
+            <w:t>4</w:t>
+          </w:r>
         </w:p>
         <w:p>
           <w:pPr>
@@ -518,16 +539,12 @@
             </w:tabs>
             <w:rPr/>
           </w:pPr>
-          <w:hyperlink w:anchor="__RefHeading___Toc25850_1820571732" w:tooltip="USNM work at Dinosaur National Monument">
-            <w:r>
-              <w:rPr>
-                <w:rStyle w:val="IndexLink"/>
-              </w:rPr>
-              <w:t>USNM work at Dinosaur National Monument</w:t>
-              <w:tab/>
-              <w:t>5</w:t>
-            </w:r>
-          </w:hyperlink>
+          <w:r>
+            <w:rPr/>
+            <w:t>USNM work at Dinosaur National Monument</w:t>
+            <w:tab/>
+            <w:t>5</w:t>
+          </w:r>
         </w:p>
         <w:p>
           <w:pPr>
@@ -538,16 +555,12 @@
             </w:tabs>
             <w:rPr/>
           </w:pPr>
-          <w:hyperlink w:anchor="__RefHeading___Toc25852_1820571732" w:tooltip="The skeleton reunited">
-            <w:r>
-              <w:rPr>
-                <w:rStyle w:val="IndexLink"/>
-              </w:rPr>
-              <w:t>The skeleton reunited</w:t>
-              <w:tab/>
-              <w:t>6</w:t>
-            </w:r>
-          </w:hyperlink>
+          <w:r>
+            <w:rPr/>
+            <w:t>The skeleton reunited</w:t>
+            <w:tab/>
+            <w:t>6</w:t>
+          </w:r>
         </w:p>
         <w:p>
           <w:pPr>
@@ -558,29 +571,22 @@
             </w:tabs>
             <w:rPr/>
           </w:pPr>
-          <w:hyperlink w:anchor="__RefHeading___Toc5351_68767826" w:tooltip="The AMNH mounted Barosaurus">
-            <w:r>
-              <w:rPr>
-                <w:rStyle w:val="IndexLink"/>
-              </w:rPr>
-              <w:t xml:space="preserve">The AMNH mounted </w:t>
-            </w:r>
-            <w:r>
-              <w:rPr>
-                <w:rStyle w:val="IndexLink"/>
-                <w:i/>
-                <w:iCs/>
-              </w:rPr>
-              <w:t>Barosaurus</w:t>
-            </w:r>
-            <w:r>
-              <w:rPr>
-                <w:rStyle w:val="IndexLink"/>
-              </w:rPr>
-              <w:tab/>
-              <w:t>8</w:t>
-            </w:r>
-          </w:hyperlink>
+          <w:r>
+            <w:rPr/>
+            <w:t xml:space="preserve">The AMNH mounted </w:t>
+          </w:r>
+          <w:r>
+            <w:rPr>
+              <w:i/>
+              <w:iCs/>
+            </w:rPr>
+            <w:t>Barosaurus</w:t>
+          </w:r>
+          <w:r>
+            <w:rPr/>
+            <w:tab/>
+            <w:t>8</w:t>
+          </w:r>
         </w:p>
         <w:p>
           <w:pPr>
@@ -591,16 +597,12 @@
             </w:tabs>
             <w:rPr/>
           </w:pPr>
-          <w:hyperlink w:anchor="__RefHeading___Toc5354_68767826" w:tooltip="The conception of the mount">
-            <w:r>
-              <w:rPr>
-                <w:rStyle w:val="IndexLink"/>
-              </w:rPr>
-              <w:t>The conception of the mount</w:t>
-              <w:tab/>
-              <w:t>8</w:t>
-            </w:r>
-          </w:hyperlink>
+          <w:r>
+            <w:rPr/>
+            <w:t>The conception of the mount</w:t>
+            <w:tab/>
+            <w:t>8</w:t>
+          </w:r>
         </w:p>
         <w:p>
           <w:pPr>
@@ -611,16 +613,12 @@
             </w:tabs>
             <w:rPr/>
           </w:pPr>
-          <w:hyperlink w:anchor="__RefHeading___Toc1099_1709072779" w:tooltip="The purpose of the mount">
-            <w:r>
-              <w:rPr>
-                <w:rStyle w:val="IndexLink"/>
-              </w:rPr>
-              <w:t>The purpose of the mount</w:t>
-              <w:tab/>
-              <w:t>9</w:t>
-            </w:r>
-          </w:hyperlink>
+          <w:r>
+            <w:rPr/>
+            <w:t>The purpose of the mount</w:t>
+            <w:tab/>
+            <w:t>9</w:t>
+          </w:r>
         </w:p>
         <w:p>
           <w:pPr>
@@ -631,16 +629,12 @@
             </w:tabs>
             <w:rPr/>
           </w:pPr>
-          <w:hyperlink w:anchor="__RefHeading___Toc18297_68767826" w:tooltip="The creation of the mount">
-            <w:r>
-              <w:rPr>
-                <w:rStyle w:val="IndexLink"/>
-              </w:rPr>
-              <w:t>The creation of the mount</w:t>
-              <w:tab/>
-              <w:t>10</w:t>
-            </w:r>
-          </w:hyperlink>
+          <w:r>
+            <w:rPr/>
+            <w:t>The creation of the mount</w:t>
+            <w:tab/>
+            <w:t>10</w:t>
+          </w:r>
         </w:p>
         <w:p>
           <w:pPr>
@@ -651,16 +645,12 @@
             </w:tabs>
             <w:rPr/>
           </w:pPr>
-          <w:hyperlink w:anchor="__RefHeading___Toc5632_2187837281" w:tooltip="Photography of the mount">
-            <w:r>
-              <w:rPr>
-                <w:rStyle w:val="IndexLink"/>
-              </w:rPr>
-              <w:t>Photography of the mount</w:t>
-              <w:tab/>
-              <w:t>13</w:t>
-            </w:r>
-          </w:hyperlink>
+          <w:r>
+            <w:rPr/>
+            <w:t>Photography of the mount</w:t>
+            <w:tab/>
+            <w:t>13</w:t>
+          </w:r>
         </w:p>
         <w:p>
           <w:pPr>
@@ -671,16 +661,12 @@
             </w:tabs>
             <w:rPr/>
           </w:pPr>
-          <w:hyperlink w:anchor="__RefHeading___Toc5356_68767826" w:tooltip="The composition of the mount">
-            <w:r>
-              <w:rPr>
-                <w:rStyle w:val="IndexLink"/>
-              </w:rPr>
-              <w:t>The composition of the mount</w:t>
-              <w:tab/>
-              <w:t>13</w:t>
-            </w:r>
-          </w:hyperlink>
+          <w:r>
+            <w:rPr/>
+            <w:t>The composition of the mount</w:t>
+            <w:tab/>
+            <w:t>13</w:t>
+          </w:r>
         </w:p>
         <w:p>
           <w:pPr>
@@ -691,16 +677,12 @@
             </w:tabs>
             <w:rPr/>
           </w:pPr>
-          <w:hyperlink w:anchor="__RefHeading___Toc16585_68767826" w:tooltip="Overview">
-            <w:r>
-              <w:rPr>
-                <w:rStyle w:val="IndexLink"/>
-              </w:rPr>
-              <w:t>Overview</w:t>
-              <w:tab/>
-              <w:t>13</w:t>
-            </w:r>
-          </w:hyperlink>
+          <w:r>
+            <w:rPr/>
+            <w:t>Overview</w:t>
+            <w:tab/>
+            <w:t>13</w:t>
+          </w:r>
         </w:p>
         <w:p>
           <w:pPr>
@@ -711,24 +693,19 @@
             </w:tabs>
             <w:rPr/>
           </w:pPr>
-          <w:hyperlink w:anchor="__RefHeading___Toc4995_537823704" w:tooltip="Barosaurus material in the mount">
-            <w:r>
-              <w:rPr>
-                <w:rStyle w:val="IndexLink"/>
-                <w:i/>
-                <w:iCs/>
-              </w:rPr>
-              <w:t>Barosaurus</w:t>
-            </w:r>
-            <w:r>
-              <w:rPr>
-                <w:rStyle w:val="IndexLink"/>
-              </w:rPr>
-              <w:t xml:space="preserve"> material in the mount</w:t>
-              <w:tab/>
-              <w:t>14</w:t>
-            </w:r>
-          </w:hyperlink>
+          <w:r>
+            <w:rPr>
+              <w:i/>
+              <w:iCs/>
+            </w:rPr>
+            <w:t>Barosaurus</w:t>
+          </w:r>
+          <w:r>
+            <w:rPr/>
+            <w:t xml:space="preserve"> material in the mount</w:t>
+            <w:tab/>
+            <w:t>14</w:t>
+          </w:r>
         </w:p>
         <w:p>
           <w:pPr>
@@ -739,30 +716,23 @@
             </w:tabs>
             <w:rPr/>
           </w:pPr>
-          <w:hyperlink w:anchor="__RefHeading___Toc25854_1820571732" w:tooltip="Non-Barosaurus material in the mount">
-            <w:r>
-              <w:rPr>
-                <w:rStyle w:val="IndexLink"/>
-              </w:rPr>
-              <w:t>Non-</w:t>
-            </w:r>
-            <w:r>
-              <w:rPr>
-                <w:rStyle w:val="IndexLink"/>
-                <w:i/>
-                <w:iCs/>
-              </w:rPr>
-              <w:t>Barosaurus</w:t>
-            </w:r>
-            <w:r>
-              <w:rPr>
-                <w:rStyle w:val="IndexLink"/>
-              </w:rPr>
-              <w:t xml:space="preserve"> material in the mount</w:t>
-              <w:tab/>
-              <w:t>15</w:t>
-            </w:r>
-          </w:hyperlink>
+          <w:r>
+            <w:rPr/>
+            <w:t>Non-</w:t>
+          </w:r>
+          <w:r>
+            <w:rPr>
+              <w:i/>
+              <w:iCs/>
+            </w:rPr>
+            <w:t>Barosaurus</w:t>
+          </w:r>
+          <w:r>
+            <w:rPr/>
+            <w:t xml:space="preserve"> material in the mount</w:t>
+            <w:tab/>
+            <w:t>15</w:t>
+          </w:r>
         </w:p>
         <w:p>
           <w:pPr>
@@ -773,16 +743,12 @@
             </w:tabs>
             <w:rPr/>
           </w:pPr>
-          <w:hyperlink w:anchor="__RefHeading___Toc16587_68767826" w:tooltip="Skull">
-            <w:r>
-              <w:rPr>
-                <w:rStyle w:val="IndexLink"/>
-              </w:rPr>
-              <w:t>Skull</w:t>
-              <w:tab/>
-              <w:t>16</w:t>
-            </w:r>
-          </w:hyperlink>
+          <w:r>
+            <w:rPr/>
+            <w:t>Skull</w:t>
+            <w:tab/>
+            <w:t>16</w:t>
+          </w:r>
         </w:p>
         <w:p>
           <w:pPr>
@@ -793,16 +759,12 @@
             </w:tabs>
             <w:rPr/>
           </w:pPr>
-          <w:hyperlink w:anchor="__RefHeading___Toc16589_68767826" w:tooltip="Neck">
-            <w:r>
-              <w:rPr>
-                <w:rStyle w:val="IndexLink"/>
-              </w:rPr>
-              <w:t>Neck</w:t>
-              <w:tab/>
-              <w:t>16</w:t>
-            </w:r>
-          </w:hyperlink>
+          <w:r>
+            <w:rPr/>
+            <w:t>Neck</w:t>
+            <w:tab/>
+            <w:t>16</w:t>
+          </w:r>
         </w:p>
         <w:p>
           <w:pPr>
@@ -813,16 +775,12 @@
             </w:tabs>
             <w:rPr/>
           </w:pPr>
-          <w:hyperlink w:anchor="__RefHeading___Toc2466_2187837281" w:tooltip="Torso, sacrum and tail">
-            <w:r>
-              <w:rPr>
-                <w:rStyle w:val="IndexLink"/>
-              </w:rPr>
-              <w:t>Torso, sacrum and tail</w:t>
-              <w:tab/>
-              <w:t>17</w:t>
-            </w:r>
-          </w:hyperlink>
+          <w:r>
+            <w:rPr/>
+            <w:t>Torso, sacrum and tail</w:t>
+            <w:tab/>
+            <w:t>17</w:t>
+          </w:r>
         </w:p>
         <w:p>
           <w:pPr>
@@ -833,16 +791,12 @@
             </w:tabs>
             <w:rPr/>
           </w:pPr>
-          <w:hyperlink w:anchor="__RefHeading___Toc2470_2187837281" w:tooltip="Forelimbs and girdles">
-            <w:r>
-              <w:rPr>
-                <w:rStyle w:val="IndexLink"/>
-              </w:rPr>
-              <w:t>Forelimbs and girdles</w:t>
-              <w:tab/>
-              <w:t>17</w:t>
-            </w:r>
-          </w:hyperlink>
+          <w:r>
+            <w:rPr/>
+            <w:t>Forelimbs and girdles</w:t>
+            <w:tab/>
+            <w:t>17</w:t>
+          </w:r>
         </w:p>
         <w:p>
           <w:pPr>
@@ -853,16 +807,12 @@
             </w:tabs>
             <w:rPr/>
           </w:pPr>
-          <w:hyperlink w:anchor="__RefHeading___Toc25856_1820571732" w:tooltip="Hindlimbs and girdles">
-            <w:r>
-              <w:rPr>
-                <w:rStyle w:val="IndexLink"/>
-              </w:rPr>
-              <w:t>Hindlimbs and girdles</w:t>
-              <w:tab/>
-              <w:t>18</w:t>
-            </w:r>
-          </w:hyperlink>
+          <w:r>
+            <w:rPr/>
+            <w:t>Hindlimbs and girdles</w:t>
+            <w:tab/>
+            <w:t>18</w:t>
+          </w:r>
         </w:p>
         <w:p>
           <w:pPr>
@@ -873,16 +823,12 @@
             </w:tabs>
             <w:rPr/>
           </w:pPr>
-          <w:hyperlink w:anchor="__RefHeading___Toc3401_68767826" w:tooltip="Discussion">
-            <w:r>
-              <w:rPr>
-                <w:rStyle w:val="IndexLink"/>
-              </w:rPr>
-              <w:t>Discussion</w:t>
-              <w:tab/>
-              <w:t>18</w:t>
-            </w:r>
-          </w:hyperlink>
+          <w:r>
+            <w:rPr/>
+            <w:t>Discussion</w:t>
+            <w:tab/>
+            <w:t>18</w:t>
+          </w:r>
         </w:p>
         <w:p>
           <w:pPr>
@@ -893,16 +839,12 @@
             </w:tabs>
             <w:rPr/>
           </w:pPr>
-          <w:hyperlink w:anchor="__RefHeading___Toc2476_2187837281" w:tooltip="Rearing pose">
-            <w:r>
-              <w:rPr>
-                <w:rStyle w:val="IndexLink"/>
-              </w:rPr>
-              <w:t>Rearing pose</w:t>
-              <w:tab/>
-              <w:t>18</w:t>
-            </w:r>
-          </w:hyperlink>
+          <w:r>
+            <w:rPr/>
+            <w:t>Rearing pose</w:t>
+            <w:tab/>
+            <w:t>18</w:t>
+          </w:r>
         </w:p>
         <w:p>
           <w:pPr>
@@ -913,16 +855,12 @@
             </w:tabs>
             <w:rPr/>
           </w:pPr>
-          <w:hyperlink w:anchor="__RefHeading___Toc3786_1986291683" w:tooltip="A short history of rearing sauropods">
-            <w:r>
-              <w:rPr>
-                <w:rStyle w:val="IndexLink"/>
-              </w:rPr>
-              <w:t>A short history of rearing sauropods</w:t>
-              <w:tab/>
-              <w:t>20</w:t>
-            </w:r>
-          </w:hyperlink>
+          <w:r>
+            <w:rPr/>
+            <w:t>A short history of rearing sauropods</w:t>
+            <w:tab/>
+            <w:t>20</w:t>
+          </w:r>
         </w:p>
         <w:p>
           <w:pPr>
@@ -933,16 +871,12 @@
             </w:tabs>
             <w:rPr/>
           </w:pPr>
-          <w:hyperlink w:anchor="__RefHeading___Toc11689_675290491" w:tooltip="Cultural impact">
-            <w:r>
-              <w:rPr>
-                <w:rStyle w:val="IndexLink"/>
-              </w:rPr>
-              <w:t>Cultural impact</w:t>
-              <w:tab/>
-              <w:t>21</w:t>
-            </w:r>
-          </w:hyperlink>
+          <w:r>
+            <w:rPr/>
+            <w:t>Cultural impact</w:t>
+            <w:tab/>
+            <w:t>21</w:t>
+          </w:r>
         </w:p>
         <w:p>
           <w:pPr>
@@ -953,16 +887,12 @@
             </w:tabs>
             <w:rPr/>
           </w:pPr>
-          <w:hyperlink w:anchor="__RefHeading___Toc21934_68767826" w:tooltip="Size of the AMNH 6341 animal">
-            <w:r>
-              <w:rPr>
-                <w:rStyle w:val="IndexLink"/>
-              </w:rPr>
-              <w:t>Size of the AMNH 6341 animal</w:t>
-              <w:tab/>
-              <w:t>22</w:t>
-            </w:r>
-          </w:hyperlink>
+          <w:r>
+            <w:rPr/>
+            <w:t>Size of the AMNH 6341 animal</w:t>
+            <w:tab/>
+            <w:t>22</w:t>
+          </w:r>
         </w:p>
         <w:p>
           <w:pPr>
@@ -973,16 +903,12 @@
             </w:tabs>
             <w:rPr/>
           </w:pPr>
-          <w:hyperlink w:anchor="__RefHeading___Toc3403_68767826" w:tooltip="Acknowledgements">
-            <w:r>
-              <w:rPr>
-                <w:rStyle w:val="IndexLink"/>
-              </w:rPr>
-              <w:t>Acknowledgements</w:t>
-              <w:tab/>
-              <w:t>22</w:t>
-            </w:r>
-          </w:hyperlink>
+          <w:r>
+            <w:rPr/>
+            <w:t>Acknowledgements</w:t>
+            <w:tab/>
+            <w:t>22</w:t>
+          </w:r>
         </w:p>
         <w:p>
           <w:pPr>
@@ -993,16 +919,12 @@
             </w:tabs>
             <w:rPr/>
           </w:pPr>
-          <w:hyperlink w:anchor="__RefHeading___Toc3405_68767826" w:tooltip="References">
-            <w:r>
-              <w:rPr>
-                <w:rStyle w:val="IndexLink"/>
-              </w:rPr>
-              <w:t>References</w:t>
-              <w:tab/>
-              <w:t>24</w:t>
-            </w:r>
-          </w:hyperlink>
+          <w:r>
+            <w:rPr/>
+            <w:t>References</w:t>
+            <w:tab/>
+            <w:t>24</w:t>
+          </w:r>
         </w:p>
         <w:p>
           <w:pPr>
@@ -1013,16 +935,12 @@
             </w:tabs>
             <w:rPr/>
           </w:pPr>
-          <w:hyperlink w:anchor="__RefHeading___Toc3407_68767826" w:tooltip="Figure Captions">
-            <w:r>
-              <w:rPr>
-                <w:rStyle w:val="IndexLink"/>
-              </w:rPr>
-              <w:t>Figure Captions</w:t>
-              <w:tab/>
-              <w:t>30</w:t>
-            </w:r>
-          </w:hyperlink>
+          <w:r>
+            <w:rPr/>
+            <w:t>Figure Captions</w:t>
+            <w:tab/>
+            <w:t>30</w:t>
+          </w:r>
         </w:p>
         <w:p>
           <w:pPr>
@@ -1033,16 +951,12 @@
             </w:tabs>
             <w:rPr/>
           </w:pPr>
-          <w:hyperlink w:anchor="__RefHeading___Toc25858_1820571732" w:tooltip="Tables">
-            <w:r>
-              <w:rPr>
-                <w:rStyle w:val="IndexLink"/>
-              </w:rPr>
-              <w:t>Tables</w:t>
-              <w:tab/>
-              <w:t>34</w:t>
-            </w:r>
-          </w:hyperlink>
+          <w:r>
+            <w:rPr/>
+            <w:t>Tables</w:t>
+            <w:tab/>
+            <w:t>34</w:t>
+          </w:r>
         </w:p>
         <w:p>
           <w:pPr>
@@ -1053,20 +967,14 @@
             </w:tabs>
             <w:rPr/>
           </w:pPr>
-          <w:hyperlink w:anchor="__RefHeading___Toc25860_1820571732" w:tooltip="Table 1">
-            <w:r>
-              <w:rPr>
-                <w:rStyle w:val="IndexLink"/>
-              </w:rPr>
-              <w:t>Table 1</w:t>
-              <w:tab/>
-              <w:t>34</w:t>
-            </w:r>
-          </w:hyperlink>
           <w:r>
-            <w:rPr>
-              <w:rStyle w:val="IndexLink"/>
-            </w:rPr>
+            <w:rPr/>
+            <w:t>Table 1</w:t>
+            <w:tab/>
+            <w:t>34</w:t>
+          </w:r>
+          <w:r>
+            <w:rPr/>
             <w:fldChar w:fldCharType="end"/>
           </w:r>
         </w:p>
@@ -1113,15 +1021,7 @@
       </w:r>
       <w:r>
         <w:rPr/>
-        <w:t xml:space="preserve"> is a diplodocid sauropod from the Late Jurassic of North America, found in the extensive Morrison Formation of the </w:t>
-      </w:r>
-      <w:r>
-        <w:rPr/>
-        <w:t>American West</w:t>
-      </w:r>
-      <w:r>
-        <w:rPr/>
-        <w:t xml:space="preserve">. It closely resembles its relative </w:t>
+        <w:t xml:space="preserve"> is a diplodocid sauropod from the Late Jurassic of North America, found in the extensive Morrison Formation of the American West. It closely resembles its relative </w:t>
       </w:r>
       <w:r>
         <w:rPr>
@@ -1786,15 +1686,7 @@
       </w:pPr>
       <w:r>
         <w:rPr/>
-        <w:t xml:space="preserve">The fossil material of AMNH 6341 comes from the Carnegie Quarry at Dinosaur National Monument, in the north-east corner of Utah. Earl Douglass, a fossil hunter employed by the Carnegie Museum, received a letter on 6 August 1909 from the museum Director William J. Holland saying that “he wished me to dig up Dinosaur bones east of Vernal”. (This and other quotes in this section are from </w:t>
-      </w:r>
-      <w:r>
-        <w:rPr/>
-        <w:t xml:space="preserve">correspondence collection </w:t>
-      </w:r>
-      <w:r>
-        <w:rPr/>
-        <w:t xml:space="preserve">Douglass 1879–1953.) He and Holland had seen a good </w:t>
+        <w:t xml:space="preserve">The fossil material of AMNH 6341 comes from the Carnegie Quarry at Dinosaur National Monument, in the north-east corner of Utah. Earl Douglass, a fossil hunter employed by the Carnegie Museum, received a letter on 6 August 1909 from the museum Director William J. Holland saying that “he wished me to dig up Dinosaur bones east of Vernal”. (This and other quotes in this section are from correspondence collection Douglass 1879–1953.) He and Holland had seen a good </w:t>
       </w:r>
       <w:r>
         <w:rPr>
@@ -1826,23 +1718,7 @@
       </w:r>
       <w:r>
         <w:rPr/>
-        <w:t xml:space="preserve"> in exact position. It was a beautiful sight … several of the vertebrae had weathered out and the beautifully petrified centra lay on the ground. It is by far the best looking Dinosaur prospect I have ever found.” This skeleton, </w:t>
-      </w:r>
-      <w:r>
-        <w:rPr/>
-        <w:t xml:space="preserve">once </w:t>
-      </w:r>
-      <w:r>
-        <w:rPr/>
-        <w:t xml:space="preserve">excavated, would be mounted in the Carnegie Museum in 1913. </w:t>
-      </w:r>
-      <w:r>
-        <w:rPr/>
-        <w:t xml:space="preserve">It would be </w:t>
-      </w:r>
-      <w:r>
-        <w:rPr/>
-        <w:t xml:space="preserve">described by Holland (1915) as CM 3018, the holotype of the new species </w:t>
+        <w:t xml:space="preserve"> in exact position. It was a beautiful sight … several of the vertebrae had weathered out and the beautifully petrified centra lay on the ground. It is by far the best looking Dinosaur prospect I have ever found.” This skeleton, once excavated, would be mounted in the Carnegie Museum in 1913. It would be described by Holland (1915) as CM 3018, the holotype of the new species </w:t>
       </w:r>
       <w:r>
         <w:rPr>
@@ -2027,23 +1903,7 @@
       </w:pPr>
       <w:r>
         <w:rPr/>
-        <w:t xml:space="preserve">Douglass also handed over to Gilmore four large blocks and several smaller ones containing much of the neck of #340, which as noted above had been extracted from the quarry but not prepared out. It was Gilmore’s intention to extract #355 (the more complete of the two) for the USNM, then secure the parts of #340 necessary to complete the skeleton (Gilmore 1923b). </w:t>
-      </w:r>
-      <w:r>
-        <w:rPr/>
-        <w:t xml:space="preserve">Skeleton </w:t>
-      </w:r>
-      <w:r>
-        <w:rPr/>
-        <w:t xml:space="preserve">#355 was subsequently accessioned as USNM 10865 and mounted in Washington D.C. </w:t>
-      </w:r>
-      <w:r>
-        <w:rPr/>
-        <w:t>(Gilmore 1932)</w:t>
-      </w:r>
-      <w:r>
-        <w:rPr/>
-        <w:t>, where it remains in the public gallery to this day.</w:t>
+        <w:t>Douglass also handed over to Gilmore four large blocks and several smaller ones containing much of the neck of #340, which as noted above had been extracted from the quarry but not prepared out. It was Gilmore’s intention to extract #355 (the more complete of the two) for the USNM, then secure the parts of #340 necessary to complete the skeleton (Gilmore 1923b). Skeleton #355 was subsequently accessioned as USNM 10865 and mounted in Washington D.C. (Gilmore 1932), where it remains in the public gallery to this day.</w:t>
       </w:r>
     </w:p>
     <w:p>
@@ -2541,15 +2401,7 @@
       </w:pPr>
       <w:r>
         <w:rPr/>
-        <w:t xml:space="preserve">Dr. John (Jack) S. McIntosh, a professor of theoretical physics at Wesleyan University in Connecticut, was an avocational palaeontologist specialising in sauropods, and through work done in his spare time became the world’s leading expert on the group. Gaffney knew him from his undergraduate days and when he succeeded Colbert as curator of the AMNH fossil reptile collection in 1970, McIntosh had provided a great deal of information about the AMNH dinosaurs. He had told Gaffney that the museum had one of the best </w:t>
-      </w:r>
-      <w:r>
-        <w:rPr/>
-        <w:t>preserved</w:t>
-      </w:r>
-      <w:r>
-        <w:rPr/>
-        <w:t xml:space="preserve"> sauropod skeletons in its collection and that he thought it was the then poorly known </w:t>
+        <w:t xml:space="preserve">Dr. John (Jack) S. McIntosh, a professor of theoretical physics at Wesleyan University in Connecticut, was an avocational palaeontologist specialising in sauropods, and through work done in his spare time became the world’s leading expert on the group. Gaffney knew him from his undergraduate days and when he succeeded Colbert as curator of the AMNH fossil reptile collection in 1970, McIntosh had provided a great deal of information about the AMNH dinosaurs. He had told Gaffney that the museum had one of the best preserved sauropod skeletons in its collection and that he thought it was the then poorly known </w:t>
       </w:r>
       <w:r>
         <w:rPr>
@@ -2598,7 +2450,7 @@
     </w:p>
     <w:p>
       <w:pPr>
-        <w:pStyle w:val="BlockQuotation"/>
+        <w:pStyle w:val="BlockQuotationuser"/>
         <w:rPr/>
       </w:pPr>
       <w:r>
@@ -2966,15 +2818,7 @@
       </w:pPr>
       <w:r>
         <w:rPr/>
-        <w:t xml:space="preserve">In November 1991, the work in Toronto was complete, and Blakelock Moving were contracted to ship the completed exhibit in sections for mounting to New York on 7 November (Clark 1991; Figure 13). Unlike the trial mounting in Toronto, when the head and neck were attached in three sections, in New York the three sections were first joined together and then fitted as a unit. This large unit, about nine meters in length, proved awkward to manoeuvre, and it was difficult to raise it to a sufficient height to slide into its slot (Figure 14). It took nearly two hours to wrestle it into place at the front of the rearing torso. Worse, when the mount was finally completed it was imperfect because, when the whole neck had been hanging horizontally, it had bent in the middle at the point of suspension. The resulting kink in the neck can be seen between C11 and C13 in Figures 1 and 14B and in other contemporary photos such as those of Dingus (1996:26) and Lindsay (1992:18–20). It was soon corrected, however, in a near-disastrous but ultimately successful late-night operation (Dingus 1996:28), and the resulting line of the neck </w:t>
-      </w:r>
-      <w:r>
-        <w:rPr/>
-        <w:t>is</w:t>
-      </w:r>
-      <w:r>
-        <w:rPr/>
-        <w:t xml:space="preserve"> smooth and elegant.</w:t>
+        <w:t>In November 1991, the work in Toronto was complete, and Blakelock Moving were contracted to ship the completed exhibit in sections for mounting to New York on 7 November (Clark 1991; Figure 13). Unlike the trial mounting in Toronto, when the head and neck were attached in three sections, in New York the three sections were first joined together and then fitted as a unit. This large unit, about nine meters in length, proved awkward to manoeuvre, and it was difficult to raise it to a sufficient height to slide into its slot (Figure 14). It took nearly two hours to wrestle it into place at the front of the rearing torso. Worse, when the mount was finally completed it was imperfect because, when the whole neck had been hanging horizontally, it had bent in the middle at the point of suspension. The resulting kink in the neck can be seen between C11 and C13 in Figures 1 and 14B and in other contemporary photos such as those of Dingus (1996:26) and Lindsay (1992:18–20). It was soon corrected, however, in a near-disastrous but ultimately successful late-night operation (Dingus 1996:28), and the resulting line of the neck is smooth and elegant.</w:t>
       </w:r>
     </w:p>
     <w:p>
@@ -3081,15 +2925,7 @@
       </w:r>
       <w:r>
         <w:rPr/>
-        <w:t xml:space="preserve"> in the world (Norell et al. 1991:36), although additional mounts have since been erected at the Royal Ontario Museum in Toronto, Canada, and the Natural History Museum of Utah in Salt Lake City. Also included in the exhibit, in a case next to the mounted skeletons, were the real 13th cervical of AMNH 6341, and the partial skull and neck AMNH 7530, which the juvenile mounted skeleton had been partially based on. </w:t>
-      </w:r>
-      <w:r>
-        <w:rPr/>
-        <w:t>(</w:t>
-      </w:r>
-      <w:r>
-        <w:rPr/>
-        <w:t xml:space="preserve">That skull and neck, thought in the 1990s to belong to </w:t>
+        <w:t xml:space="preserve"> in the world (Norell et al. 1991:36), although additional mounts have since been erected at the Royal Ontario Museum in Toronto, Canada, and the Natural History Museum of Utah in Salt Lake City. Also included in the exhibit, in a case next to the mounted skeletons, were the real 13th cervical of AMNH 6341, and the partial skull and neck AMNH 7530, which the juvenile mounted skeleton had been partially based on. (That skull and neck, thought in the 1990s to belong to </w:t>
       </w:r>
       <w:r>
         <w:rPr>
@@ -3181,7 +3017,7 @@
     </w:p>
     <w:p>
       <w:pPr>
-        <w:pStyle w:val="BlockQuotation"/>
+        <w:pStyle w:val="BlockQuotationuser"/>
         <w:rPr/>
       </w:pPr>
       <w:r>
@@ -4214,15 +4050,7 @@
       </w:r>
       <w:r>
         <w:rPr/>
-        <w:t xml:space="preserve">, uses the left fibula and partial pes of </w:t>
-      </w:r>
-      <w:r>
-        <w:rPr/>
-        <w:t xml:space="preserve">the </w:t>
-      </w:r>
-      <w:r>
-        <w:rPr/>
-        <w:t xml:space="preserve">referred specimen CM 33985, but for unknown reasons the casts do not use this material. No documentation survives indicating what material was used to create the left fibula and metatarsals III–V used in the casts. Most likely, these bones were mirror-imaged sculptures of the right-side elements preserved in the </w:t>
+        <w:t xml:space="preserve">, uses the left fibula and partial pes of the referred specimen CM 33985, but for unknown reasons the casts do not use this material. No documentation survives indicating what material was used to create the left fibula and metatarsals III–V used in the casts. Most likely, these bones were mirror-imaged sculptures of the right-side elements preserved in the </w:t>
       </w:r>
       <w:r>
         <w:rPr>
@@ -4244,11 +4072,7 @@
       </w:r>
       <w:r>
         <w:rPr/>
-        <w:t xml:space="preserve"> paratype CM 94 (which also furnished these bones on the right side </w:t>
-      </w:r>
-      <w:r>
-        <w:rPr/>
-        <w:t xml:space="preserve">on both the original mounted </w:t>
+        <w:t xml:space="preserve"> paratype CM 94 (which also furnished these bones on the right side on both the original mounted </w:t>
       </w:r>
       <w:r>
         <w:rPr>
@@ -4259,11 +4083,7 @@
       </w:r>
       <w:r>
         <w:rPr/>
-        <w:t xml:space="preserve"> and the casts</w:t>
-      </w:r>
-      <w:r>
-        <w:rPr/>
-        <w:t xml:space="preserve">). And the </w:t>
+        <w:t xml:space="preserve"> and the casts). And the </w:t>
       </w:r>
       <w:r>
         <w:rPr>
@@ -4409,15 +4229,7 @@
       </w:r>
       <w:r>
         <w:rPr/>
-        <w:t xml:space="preserve">, or any sauropod, practiced parental care </w:t>
-      </w:r>
-      <w:r>
-        <w:rPr/>
-        <w:t>(Sander et al. 2008)</w:t>
-      </w:r>
-      <w:r>
-        <w:rPr/>
-        <w:t>. However, it is well established from both trackways (e.g. Day et al. 2004) and death assemblages (e.g. Coria 1994) that sauropods did live and move in herds of different-sized individuals, whether genetically related or not. It is not unreasonable to assume that larger individuals defended the smaller from attack on occasion.</w:t>
+        <w:t>, or any sauropod, practiced parental care (Sander et al. 2008). However, it is well established from both trackways (e.g. Day et al. 2004) and death assemblages (e.g. Coria 1994) that sauropods did live and move in herds of different-sized individuals, whether genetically related or not. It is not unreasonable to assume that larger individuals defended the smaller from attack on occasion.</w:t>
       </w:r>
     </w:p>
     <w:p>
@@ -4544,15 +4356,7 @@
       </w:pPr>
       <w:r>
         <w:rPr/>
-        <w:t xml:space="preserve">All discussion of this nature was welcome to the AMNH team. As noted above, the most important purpose of the mount as originally conceived was not to argue in favour of rearing as a habitual behaviour, but to set out the issue of what we can and cannot know. Dingus (1996:28) noted that he actively welcomed the controversy — not only because all publicity is good publicity, but because the </w:t>
-      </w:r>
-      <w:r>
-        <w:rPr/>
-        <w:t>mount’s</w:t>
-      </w:r>
-      <w:r>
-        <w:rPr/>
-        <w:t xml:space="preserve"> critics were encouraging the public to think about the controversy for themselves.</w:t>
+        <w:t>All discussion of this nature was welcome to the AMNH team. As noted above, the most important purpose of the mount as originally conceived was not to argue in favour of rearing as a habitual behaviour, but to set out the issue of what we can and cannot know. Dingus (1996:28) noted that he actively welcomed the controversy — not only because all publicity is good publicity, but because the mount’s critics were encouraging the public to think about the controversy for themselves.</w:t>
       </w:r>
     </w:p>
     <w:p>
@@ -8780,7 +8584,7 @@
     </w:p>
     <w:p>
       <w:pPr>
-        <w:pStyle w:val="BlockQuotation"/>
+        <w:pStyle w:val="BlockQuotationuser"/>
         <w:rPr/>
       </w:pPr>
       <w:r>
@@ -11414,7 +11218,7 @@
     </w:r>
     <w:r>
       <w:rPr/>
-      <w:t>35</w:t>
+      <w:t>36</w:t>
     </w:r>
     <w:r>
       <w:rPr/>
@@ -11438,7 +11242,7 @@
     </w:r>
     <w:r>
       <w:rPr/>
-      <w:t>35</w:t>
+      <w:t>36</w:t>
     </w:r>
     <w:r>
       <w:rPr/>
@@ -11487,7 +11291,7 @@
     </w:r>
     <w:r>
       <w:rPr/>
-      <w:t>35</w:t>
+      <w:t>36</w:t>
     </w:r>
     <w:r>
       <w:rPr/>
@@ -11511,7 +11315,7 @@
     </w:r>
     <w:r>
       <w:rPr/>
-      <w:t>35</w:t>
+      <w:t>36</w:t>
     </w:r>
     <w:r>
       <w:rPr/>
@@ -13230,8 +13034,8 @@
     <w:qFormat/>
     <w:rPr/>
   </w:style>
-  <w:style w:type="character" w:styleId="Bullets" w:customStyle="1">
-    <w:name w:val="Bullets"/>
+  <w:style w:type="character" w:styleId="Bulletsuser" w:customStyle="1">
+    <w:name w:val="Bullets (user)"/>
     <w:qFormat/>
     <w:rPr>
       <w:rFonts w:ascii="OpenSymbol" w:hAnsi="OpenSymbol" w:eastAsia="OpenSymbol" w:cs="OpenSymbol"/>
@@ -13383,8 +13187,8 @@
       <w:i/>
     </w:rPr>
   </w:style>
-  <w:style w:type="paragraph" w:styleId="BlockQuotation" w:customStyle="1">
-    <w:name w:val="Block Quotation"/>
+  <w:style w:type="paragraph" w:styleId="BlockQuotationuser" w:customStyle="1">
+    <w:name w:val="Block Quotation (user)"/>
     <w:basedOn w:val="Normal"/>
     <w:qFormat/>
     <w:pPr>
@@ -13568,7 +13372,7 @@
       <w:jc w:val="start"/>
     </w:pPr>
     <w:rPr>
-      <w:rFonts w:ascii="Baskerville" w:hAnsi="Baskerville" w:cs="Mangal" w:eastAsia="Songti SC"/>
+      <w:rFonts w:ascii="Baskerville" w:hAnsi="Baskerville" w:eastAsia="Songti SC" w:cs="Mangal"/>
       <w:color w:val="auto"/>
       <w:kern w:val="2"/>
       <w:sz w:val="24"/>

</xml_diff>

<commit_message>
Note from 3D models that C17 is not Carnegie Diplo cast
</commit_message>
<xml_diff>
--- a/TaylorEtAl-mounted-barosaurus.docx
+++ b/TaylorEtAl-mounted-barosaurus.docx
@@ -3788,7 +3788,11 @@
       </w:pPr>
       <w:r>
         <w:rPr/>
-        <w:t xml:space="preserve">However, photos of the mounting process in the AMNH (e.g. Figure 13) show that the neck section used in the mount had only 14 cervical vertebrae — C3–16, not counting the atlas and axis which were not in place at that time but which, when added, would bring the total to 16. The assembly process was complex. The neck section containing the head and C1–16 was welded to the torso leaving a stretch of bare armature. The two halves of the seventeenth vertebra (visible on the right side of Figure 13) were then glued together around the armature, bridging the gap between the bones of the neck section and the torso. The special 17th vertebra can be seen in Figure 11B, distinctly darker than the cervicals above it and the dorsals below. Since there are no duplicate vertebrae in the neck, the special C17 must have come from elsewhere. Careful comparisons suggest it is a cast of C14 of the Carnegie </w:t>
+        <w:t xml:space="preserve">However, photos of the mounting process in the AMNH (e.g. Figure 13) show that the neck section used in the mount had only 14 cervical vertebrae — C3–16, not counting the atlas and axis which were not in place at that time but which, when added, would bring the total to 16. The assembly process was complex. The neck section containing the head and C1–16 was welded to the torso leaving a stretch of bare armature. The two halves of the seventeenth vertebra (visible on the right side of Figure 13) were then glued together around the armature, bridging the gap between the bones of the neck section and the torso. The special 17th vertebra can be seen in Figure 11B, distinctly darker than the cervicals above it and the dorsals below. Since there are no duplicate vertebrae in the neck, the special C17 must have come from elsewhere. Careful comparisons </w:t>
+      </w:r>
+      <w:r>
+        <w:rPr/>
+        <w:t xml:space="preserve">between photographs of the 17th cervical and 3D models of the Carnegie </w:t>
       </w:r>
       <w:r>
         <w:rPr>
@@ -3798,8 +3802,11 @@
         <w:t>Diplodocus</w:t>
       </w:r>
       <w:r>
-        <w:rPr/>
-        <w:t xml:space="preserve"> (see e.g. Hatcher 1901:plate III), supplied by DinoLab. The selection of C14 rather than C15, the last dorsal in </w:t>
+        <w:rPr>
+          <w:i w:val="false"/>
+          <w:iCs w:val="false"/>
+        </w:rPr>
+        <w:t xml:space="preserve"> provided by Heinrich Mallison (for the Berlin cast) and Paul Barrett (for the London cast) show that the former is not a replica of any of the posterior cervicals of the latter. Since the Carnegie </w:t>
       </w:r>
       <w:r>
         <w:rPr>
@@ -3809,19 +3816,11 @@
         <w:t>Diplodocus</w:t>
       </w:r>
       <w:r>
-        <w:rPr/>
-        <w:t xml:space="preserve">, makes sense as C14 is more elongate and so a better morphological match for the </w:t>
-      </w:r>
-      <w:r>
-        <w:rPr>
-          <w:i/>
-          <w:iCs/>
-        </w:rPr>
-        <w:t>Barosaurus</w:t>
-      </w:r>
-      <w:r>
-        <w:rPr/>
-        <w:t xml:space="preserve"> vertebrae that precede and follow it in the mounted skeleton.</w:t>
+        <w:rPr>
+          <w:i w:val="false"/>
+          <w:iCs w:val="false"/>
+        </w:rPr>
+        <w:t xml:space="preserve"> was the only source of cast elements (other than the metacarpals discussed below), the 17th cervical of the mounted skeleton must be a sculpture, crafted as an intermediate between C16 and D1.</w:t>
       </w:r>
     </w:p>
     <w:p>
@@ -5409,6 +5408,27 @@
       <w:r>
         <w:rPr/>
         <w:t>Mai Reitmeyer (Department of Library Services, AMNH) helped us to obtain historical photographs. Kiana Clark (AMNH Vertebrate Paleontology Archives), provided numerous historical documents and photographs. Abby Telfer (United States National Museum), provided helpful documents in establish the early history of the AMNH 6341 material. ReBecca Hunt-Forster (Dinosaur National Monument) provided an invaluable archive of correspondence relating to the early years of the quarry. Amelia Zietlow (Richard Gilder Graduate School at the AMNH) provided helpful photographs and information about the present public exhibits (Figure 8). We thank Ray Wilhite (Auburn University College of Veterinary Medicine) and Brooks Britt and Rod Scheetz (both Brigham Young University) for help in accessing the archived notebooks of John S. McIntosh. Matt Wedel helped with the interpretation and identification of some vertebrae.</w:t>
+      </w:r>
+    </w:p>
+    <w:p>
+      <w:pPr>
+        <w:pStyle w:val="BodyText"/>
+        <w:rPr/>
+      </w:pPr>
+      <w:r>
+        <w:rPr/>
+        <w:t xml:space="preserve">Heinrich Mallison (Palaeo3D) and Paul M. Barrett (Natural History Museum) provided 3D scans of two casts of the Carnegie </w:t>
+      </w:r>
+      <w:r>
+        <w:rPr>
+          <w:i/>
+          <w:iCs/>
+        </w:rPr>
+        <w:t>Diplodocus</w:t>
+      </w:r>
+      <w:r>
+        <w:rPr/>
+        <w:t>.</w:t>
       </w:r>
     </w:p>
     <w:p>

</xml_diff>

<commit_message>
Cite Matt Carrano pers. comm on radius and sternal plate
</commit_message>
<xml_diff>
--- a/TaylorEtAl-mounted-barosaurus.docx
+++ b/TaylorEtAl-mounted-barosaurus.docx
@@ -2067,7 +2067,27 @@
       </w:r>
       <w:r>
         <w:rPr/>
-        <w:t xml:space="preserve"> material at the USNM rather different than that which Gilmore (1923b:3) had specified when sending the fossils there. Where Gilmore had listed 13 cervicals, three dorsals, right scapula, humerus and radius and a sternal plate, Brown listed 10 cervicals, three anterior dorsals, left scapula and humerus. The left/right differences for the appendicular material are simply errors on Brown’s part (see below). The radius and sternal plate mentioned by Gilmore seem to have gone missing: they are not included in the material list below. It is possible that they still lurk unrecognised in the USNM collections.</w:t>
+        <w:t xml:space="preserve"> material at the USNM rather different than that which Gilmore (1923b:3) had specified when sending the fossils there. Where Gilmore had listed 13 cervicals, three dorsals, right scapula, humerus and radius and a sternal plate, Brown listed 10 cervicals, three anterior dorsals, left scapula and humerus. The left/right differences for the appendicular material are simply errors on Brown’s part (see below). The radius and sternal plate mentioned by Gilmore seem to have gone missing: they are not included in the material list below. </w:t>
+      </w:r>
+      <w:r>
+        <w:rPr/>
+        <w:t>T</w:t>
+      </w:r>
+      <w:r>
+        <w:rPr/>
+        <w:t xml:space="preserve">hey </w:t>
+      </w:r>
+      <w:r>
+        <w:rPr/>
+        <w:t xml:space="preserve">may </w:t>
+      </w:r>
+      <w:r>
+        <w:rPr/>
+        <w:t xml:space="preserve">still lurk unrecognised in the USNM collections. </w:t>
+      </w:r>
+      <w:r>
+        <w:rPr/>
+        <w:t>Matt Caranno (pers. comm., 2026) thinks it is possible they are in the oversized collection at the remote storage facility, but a detailed search would be laborious.</w:t>
       </w:r>
     </w:p>
     <w:p>
@@ -5446,7 +5466,15 @@
       </w:pPr>
       <w:r>
         <w:rPr/>
-        <w:t>Carl Mehling (AMNH) searched collections for the missing C7 and concluded it was absent. Mick Ellison, Lynton Gardiner, Jack Horner (Chapman University), Carl Mehling, Gregory S. Paul. Paul Sereno (University of Chicago), Adam Smith (Nottingham Natural History Museum) and Abby Telfer (USNM) allowed us to cite personal communications.</w:t>
+        <w:t xml:space="preserve">Carl Mehling (AMNH) searched collections for the missing C7 and concluded it was absent. Matt Caranno </w:t>
+      </w:r>
+      <w:r>
+        <w:rPr/>
+        <w:t xml:space="preserve">(USNM), </w:t>
+      </w:r>
+      <w:r>
+        <w:rPr/>
+        <w:t>Mick Ellison, Lynton Gardiner, Jack Horner (Chapman University), Carl Mehling, Gregory S. Paul. Paul Sereno (University of Chicago), Adam Smith (Nottingham Natural History Museum) and Abby Telfer (USNM) allowed us to cite personal communications.</w:t>
       </w:r>
       <w:r>
         <w:br w:type="page"/>

</xml_diff>

<commit_message>
Integrate all Matt Wedel's late comments
</commit_message>
<xml_diff>
--- a/TaylorEtAl-mounted-barosaurus.docx
+++ b/TaylorEtAl-mounted-barosaurus.docx
@@ -343,21 +343,6 @@
           <w:iCs w:val="false"/>
         </w:rPr>
         <w:t>, sauropod, neck, rearing, skeletal mount, cast</w:t>
-      </w:r>
-    </w:p>
-    <w:p>
-      <w:pPr>
-        <w:pStyle w:val="Abstract"/>
-        <w:rPr>
-          <w:i w:val="false"/>
-          <w:iCs w:val="false"/>
-        </w:rPr>
-      </w:pPr>
-      <w:r>
-        <w:rPr>
-          <w:i w:val="false"/>
-          <w:iCs w:val="false"/>
-        </w:rPr>
       </w:r>
     </w:p>
     <w:p>
@@ -402,17 +387,16 @@
             </w:rPr>
             <w:fldChar w:fldCharType="separate"/>
           </w:r>
-          <w:r>
-            <w:rPr>
-              <w:rStyle w:val="IndexLink"/>
-            </w:rPr>
-            <w:t>Introduction</w:t>
-          </w:r>
-          <w:r>
-            <w:rPr/>
-            <w:tab/>
-            <w:t>2</w:t>
-          </w:r>
+          <w:hyperlink w:anchor="__RefHeading___Toc3784_1986291683" w:tooltip="Introduction">
+            <w:r>
+              <w:rPr>
+                <w:rStyle w:val="IndexLink"/>
+              </w:rPr>
+              <w:t>Introduction</w:t>
+              <w:tab/>
+              <w:t>2</w:t>
+            </w:r>
+          </w:hyperlink>
         </w:p>
         <w:p>
           <w:pPr>
@@ -423,12 +407,16 @@
             </w:tabs>
             <w:rPr/>
           </w:pPr>
-          <w:r>
-            <w:rPr/>
-            <w:t>Anatomical nomenclature</w:t>
-            <w:tab/>
-            <w:t>3</w:t>
-          </w:r>
+          <w:hyperlink w:anchor="__RefHeading___Toc3323_2187837281" w:tooltip="Anatomical nomenclature">
+            <w:r>
+              <w:rPr>
+                <w:rStyle w:val="IndexLink"/>
+              </w:rPr>
+              <w:t>Anatomical nomenclature</w:t>
+              <w:tab/>
+              <w:t>3</w:t>
+            </w:r>
+          </w:hyperlink>
         </w:p>
         <w:p>
           <w:pPr>
@@ -439,12 +427,16 @@
             </w:tabs>
             <w:rPr/>
           </w:pPr>
-          <w:r>
-            <w:rPr/>
-            <w:t>Institutional abbreviations</w:t>
-            <w:tab/>
-            <w:t>3</w:t>
-          </w:r>
+          <w:hyperlink w:anchor="__RefHeading___Toc5349_68767826" w:tooltip="Institutional abbreviations">
+            <w:r>
+              <w:rPr>
+                <w:rStyle w:val="IndexLink"/>
+              </w:rPr>
+              <w:t>Institutional abbreviations</w:t>
+              <w:tab/>
+              <w:t>3</w:t>
+            </w:r>
+          </w:hyperlink>
         </w:p>
         <w:p>
           <w:pPr>
@@ -455,12 +447,16 @@
             </w:tabs>
             <w:rPr/>
           </w:pPr>
-          <w:r>
-            <w:rPr/>
-            <w:t>Historical background</w:t>
-            <w:tab/>
-            <w:t>3</w:t>
-          </w:r>
+          <w:hyperlink w:anchor="__RefHeading___Toc4316_68767826" w:tooltip="Historical background">
+            <w:r>
+              <w:rPr>
+                <w:rStyle w:val="IndexLink"/>
+              </w:rPr>
+              <w:t>Historical background</w:t>
+              <w:tab/>
+              <w:t>3</w:t>
+            </w:r>
+          </w:hyperlink>
         </w:p>
         <w:p>
           <w:pPr>
@@ -471,22 +467,29 @@
             </w:tabs>
             <w:rPr/>
           </w:pPr>
-          <w:r>
-            <w:rPr/>
-            <w:t xml:space="preserve">Early discoveries of </w:t>
-          </w:r>
-          <w:r>
-            <w:rPr>
-              <w:i/>
-              <w:iCs/>
-            </w:rPr>
-            <w:t>Barosaurus</w:t>
-          </w:r>
-          <w:r>
-            <w:rPr/>
-            <w:tab/>
-            <w:t>3</w:t>
-          </w:r>
+          <w:hyperlink w:anchor="__RefHeading___Toc12350_68767826" w:tooltip="Early discoveries of Barosaurus">
+            <w:r>
+              <w:rPr>
+                <w:rStyle w:val="IndexLink"/>
+              </w:rPr>
+              <w:t xml:space="preserve">Early discoveries of </w:t>
+            </w:r>
+            <w:r>
+              <w:rPr>
+                <w:rStyle w:val="IndexLink"/>
+                <w:i/>
+                <w:iCs/>
+              </w:rPr>
+              <w:t>Barosaurus</w:t>
+            </w:r>
+            <w:r>
+              <w:rPr>
+                <w:rStyle w:val="IndexLink"/>
+              </w:rPr>
+              <w:tab/>
+              <w:t>3</w:t>
+            </w:r>
+          </w:hyperlink>
         </w:p>
         <w:p>
           <w:pPr>
@@ -497,22 +500,29 @@
             </w:tabs>
             <w:rPr/>
           </w:pPr>
-          <w:r>
-            <w:rPr/>
-            <w:t xml:space="preserve">The AMNH specimen of </w:t>
-          </w:r>
-          <w:r>
-            <w:rPr>
-              <w:i/>
-              <w:iCs/>
-            </w:rPr>
-            <w:t>Barosaurus</w:t>
-          </w:r>
-          <w:r>
-            <w:rPr/>
-            <w:tab/>
-            <w:t>4</w:t>
-          </w:r>
+          <w:hyperlink w:anchor="__RefHeading___Toc12352_68767826" w:tooltip="The AMNH specimen of Barosaurus">
+            <w:r>
+              <w:rPr>
+                <w:rStyle w:val="IndexLink"/>
+              </w:rPr>
+              <w:t xml:space="preserve">The AMNH specimen of </w:t>
+            </w:r>
+            <w:r>
+              <w:rPr>
+                <w:rStyle w:val="IndexLink"/>
+                <w:i/>
+                <w:iCs/>
+              </w:rPr>
+              <w:t>Barosaurus</w:t>
+            </w:r>
+            <w:r>
+              <w:rPr>
+                <w:rStyle w:val="IndexLink"/>
+              </w:rPr>
+              <w:tab/>
+              <w:t>4</w:t>
+            </w:r>
+          </w:hyperlink>
         </w:p>
         <w:p>
           <w:pPr>
@@ -523,12 +533,16 @@
             </w:tabs>
             <w:rPr/>
           </w:pPr>
-          <w:r>
-            <w:rPr/>
-            <w:t>The Carnegie Quarry at Dinosaur National Monument</w:t>
-            <w:tab/>
-            <w:t>4</w:t>
-          </w:r>
+          <w:hyperlink w:anchor="__RefHeading___Toc25848_1820571732" w:tooltip="The Carnegie Quarry at Dinosaur National Monument">
+            <w:r>
+              <w:rPr>
+                <w:rStyle w:val="IndexLink"/>
+              </w:rPr>
+              <w:t>The Carnegie Quarry at Dinosaur National Monument</w:t>
+              <w:tab/>
+              <w:t>4</w:t>
+            </w:r>
+          </w:hyperlink>
         </w:p>
         <w:p>
           <w:pPr>
@@ -539,12 +553,16 @@
             </w:tabs>
             <w:rPr/>
           </w:pPr>
-          <w:r>
-            <w:rPr/>
-            <w:t>USNM work at Dinosaur National Monument</w:t>
-            <w:tab/>
-            <w:t>5</w:t>
-          </w:r>
+          <w:hyperlink w:anchor="__RefHeading___Toc25850_1820571732" w:tooltip="USNM work at Dinosaur National Monument">
+            <w:r>
+              <w:rPr>
+                <w:rStyle w:val="IndexLink"/>
+              </w:rPr>
+              <w:t>USNM work at Dinosaur National Monument</w:t>
+              <w:tab/>
+              <w:t>5</w:t>
+            </w:r>
+          </w:hyperlink>
         </w:p>
         <w:p>
           <w:pPr>
@@ -555,12 +573,16 @@
             </w:tabs>
             <w:rPr/>
           </w:pPr>
-          <w:r>
-            <w:rPr/>
-            <w:t>The skeleton reunited</w:t>
-            <w:tab/>
-            <w:t>6</w:t>
-          </w:r>
+          <w:hyperlink w:anchor="__RefHeading___Toc25852_1820571732" w:tooltip="The skeleton reunited">
+            <w:r>
+              <w:rPr>
+                <w:rStyle w:val="IndexLink"/>
+              </w:rPr>
+              <w:t>The skeleton reunited</w:t>
+              <w:tab/>
+              <w:t>6</w:t>
+            </w:r>
+          </w:hyperlink>
         </w:p>
         <w:p>
           <w:pPr>
@@ -571,22 +593,29 @@
             </w:tabs>
             <w:rPr/>
           </w:pPr>
-          <w:r>
-            <w:rPr/>
-            <w:t xml:space="preserve">The AMNH mounted </w:t>
-          </w:r>
-          <w:r>
-            <w:rPr>
-              <w:i/>
-              <w:iCs/>
-            </w:rPr>
-            <w:t>Barosaurus</w:t>
-          </w:r>
-          <w:r>
-            <w:rPr/>
-            <w:tab/>
-            <w:t>8</w:t>
-          </w:r>
+          <w:hyperlink w:anchor="__RefHeading___Toc5351_68767826" w:tooltip="The AMNH mounted Barosaurus">
+            <w:r>
+              <w:rPr>
+                <w:rStyle w:val="IndexLink"/>
+              </w:rPr>
+              <w:t xml:space="preserve">The AMNH mounted </w:t>
+            </w:r>
+            <w:r>
+              <w:rPr>
+                <w:rStyle w:val="IndexLink"/>
+                <w:i/>
+                <w:iCs/>
+              </w:rPr>
+              <w:t>Barosaurus</w:t>
+            </w:r>
+            <w:r>
+              <w:rPr>
+                <w:rStyle w:val="IndexLink"/>
+              </w:rPr>
+              <w:tab/>
+              <w:t>8</w:t>
+            </w:r>
+          </w:hyperlink>
         </w:p>
         <w:p>
           <w:pPr>
@@ -597,12 +626,16 @@
             </w:tabs>
             <w:rPr/>
           </w:pPr>
-          <w:r>
-            <w:rPr/>
-            <w:t>The conception of the mount</w:t>
-            <w:tab/>
-            <w:t>8</w:t>
-          </w:r>
+          <w:hyperlink w:anchor="__RefHeading___Toc5354_68767826" w:tooltip="The conception of the mount">
+            <w:r>
+              <w:rPr>
+                <w:rStyle w:val="IndexLink"/>
+              </w:rPr>
+              <w:t>The conception of the mount</w:t>
+              <w:tab/>
+              <w:t>8</w:t>
+            </w:r>
+          </w:hyperlink>
         </w:p>
         <w:p>
           <w:pPr>
@@ -613,12 +646,16 @@
             </w:tabs>
             <w:rPr/>
           </w:pPr>
-          <w:r>
-            <w:rPr/>
-            <w:t>The purpose of the mount</w:t>
-            <w:tab/>
-            <w:t>9</w:t>
-          </w:r>
+          <w:hyperlink w:anchor="__RefHeading___Toc1099_1709072779" w:tooltip="The purpose of the mount">
+            <w:r>
+              <w:rPr>
+                <w:rStyle w:val="IndexLink"/>
+              </w:rPr>
+              <w:t>The purpose of the mount</w:t>
+              <w:tab/>
+              <w:t>9</w:t>
+            </w:r>
+          </w:hyperlink>
         </w:p>
         <w:p>
           <w:pPr>
@@ -629,12 +666,16 @@
             </w:tabs>
             <w:rPr/>
           </w:pPr>
-          <w:r>
-            <w:rPr/>
-            <w:t>The creation of the mount</w:t>
-            <w:tab/>
-            <w:t>10</w:t>
-          </w:r>
+          <w:hyperlink w:anchor="__RefHeading___Toc18297_68767826" w:tooltip="The creation of the mount">
+            <w:r>
+              <w:rPr>
+                <w:rStyle w:val="IndexLink"/>
+              </w:rPr>
+              <w:t>The creation of the mount</w:t>
+              <w:tab/>
+              <w:t>10</w:t>
+            </w:r>
+          </w:hyperlink>
         </w:p>
         <w:p>
           <w:pPr>
@@ -645,12 +686,16 @@
             </w:tabs>
             <w:rPr/>
           </w:pPr>
-          <w:r>
-            <w:rPr/>
-            <w:t>Photography of the mount</w:t>
-            <w:tab/>
-            <w:t>13</w:t>
-          </w:r>
+          <w:hyperlink w:anchor="__RefHeading___Toc5632_2187837281" w:tooltip="Photography of the mount">
+            <w:r>
+              <w:rPr>
+                <w:rStyle w:val="IndexLink"/>
+              </w:rPr>
+              <w:t>Photography of the mount</w:t>
+              <w:tab/>
+              <w:t>13</w:t>
+            </w:r>
+          </w:hyperlink>
         </w:p>
         <w:p>
           <w:pPr>
@@ -661,12 +706,16 @@
             </w:tabs>
             <w:rPr/>
           </w:pPr>
-          <w:r>
-            <w:rPr/>
-            <w:t>The composition of the mount</w:t>
-            <w:tab/>
-            <w:t>13</w:t>
-          </w:r>
+          <w:hyperlink w:anchor="__RefHeading___Toc5356_68767826" w:tooltip="The composition of the mount">
+            <w:r>
+              <w:rPr>
+                <w:rStyle w:val="IndexLink"/>
+              </w:rPr>
+              <w:t>The composition of the mount</w:t>
+              <w:tab/>
+              <w:t>13</w:t>
+            </w:r>
+          </w:hyperlink>
         </w:p>
         <w:p>
           <w:pPr>
@@ -677,12 +726,16 @@
             </w:tabs>
             <w:rPr/>
           </w:pPr>
-          <w:r>
-            <w:rPr/>
-            <w:t>Overview</w:t>
-            <w:tab/>
-            <w:t>13</w:t>
-          </w:r>
+          <w:hyperlink w:anchor="__RefHeading___Toc16585_68767826" w:tooltip="Overview">
+            <w:r>
+              <w:rPr>
+                <w:rStyle w:val="IndexLink"/>
+              </w:rPr>
+              <w:t>Overview</w:t>
+              <w:tab/>
+              <w:t>13</w:t>
+            </w:r>
+          </w:hyperlink>
         </w:p>
         <w:p>
           <w:pPr>
@@ -693,19 +746,24 @@
             </w:tabs>
             <w:rPr/>
           </w:pPr>
-          <w:r>
-            <w:rPr>
-              <w:i/>
-              <w:iCs/>
-            </w:rPr>
-            <w:t>Barosaurus</w:t>
-          </w:r>
-          <w:r>
-            <w:rPr/>
-            <w:t xml:space="preserve"> material in the mount</w:t>
-            <w:tab/>
-            <w:t>14</w:t>
-          </w:r>
+          <w:hyperlink w:anchor="__RefHeading___Toc4995_537823704" w:tooltip="Barosaurus material in the mount">
+            <w:r>
+              <w:rPr>
+                <w:rStyle w:val="IndexLink"/>
+                <w:i/>
+                <w:iCs/>
+              </w:rPr>
+              <w:t>Barosaurus</w:t>
+            </w:r>
+            <w:r>
+              <w:rPr>
+                <w:rStyle w:val="IndexLink"/>
+              </w:rPr>
+              <w:t xml:space="preserve"> material in the mount</w:t>
+              <w:tab/>
+              <w:t>14</w:t>
+            </w:r>
+          </w:hyperlink>
         </w:p>
         <w:p>
           <w:pPr>
@@ -716,23 +774,30 @@
             </w:tabs>
             <w:rPr/>
           </w:pPr>
-          <w:r>
-            <w:rPr/>
-            <w:t>Non-</w:t>
-          </w:r>
-          <w:r>
-            <w:rPr>
-              <w:i/>
-              <w:iCs/>
-            </w:rPr>
-            <w:t>Barosaurus</w:t>
-          </w:r>
-          <w:r>
-            <w:rPr/>
-            <w:t xml:space="preserve"> material in the mount</w:t>
-            <w:tab/>
-            <w:t>15</w:t>
-          </w:r>
+          <w:hyperlink w:anchor="__RefHeading___Toc25854_1820571732" w:tooltip="Non-Barosaurus material in the mount">
+            <w:r>
+              <w:rPr>
+                <w:rStyle w:val="IndexLink"/>
+              </w:rPr>
+              <w:t>Non-</w:t>
+            </w:r>
+            <w:r>
+              <w:rPr>
+                <w:rStyle w:val="IndexLink"/>
+                <w:i/>
+                <w:iCs/>
+              </w:rPr>
+              <w:t>Barosaurus</w:t>
+            </w:r>
+            <w:r>
+              <w:rPr>
+                <w:rStyle w:val="IndexLink"/>
+              </w:rPr>
+              <w:t xml:space="preserve"> material in the mount</w:t>
+              <w:tab/>
+              <w:t>15</w:t>
+            </w:r>
+          </w:hyperlink>
         </w:p>
         <w:p>
           <w:pPr>
@@ -743,12 +808,16 @@
             </w:tabs>
             <w:rPr/>
           </w:pPr>
-          <w:r>
-            <w:rPr/>
-            <w:t>Skull</w:t>
-            <w:tab/>
-            <w:t>16</w:t>
-          </w:r>
+          <w:hyperlink w:anchor="__RefHeading___Toc16587_68767826" w:tooltip="Skull">
+            <w:r>
+              <w:rPr>
+                <w:rStyle w:val="IndexLink"/>
+              </w:rPr>
+              <w:t>Skull</w:t>
+              <w:tab/>
+              <w:t>16</w:t>
+            </w:r>
+          </w:hyperlink>
         </w:p>
         <w:p>
           <w:pPr>
@@ -759,12 +828,16 @@
             </w:tabs>
             <w:rPr/>
           </w:pPr>
-          <w:r>
-            <w:rPr/>
-            <w:t>Neck</w:t>
-            <w:tab/>
-            <w:t>16</w:t>
-          </w:r>
+          <w:hyperlink w:anchor="__RefHeading___Toc16589_68767826" w:tooltip="Neck">
+            <w:r>
+              <w:rPr>
+                <w:rStyle w:val="IndexLink"/>
+              </w:rPr>
+              <w:t>Neck</w:t>
+              <w:tab/>
+              <w:t>16</w:t>
+            </w:r>
+          </w:hyperlink>
         </w:p>
         <w:p>
           <w:pPr>
@@ -775,12 +848,16 @@
             </w:tabs>
             <w:rPr/>
           </w:pPr>
-          <w:r>
-            <w:rPr/>
-            <w:t>Torso, sacrum and tail</w:t>
-            <w:tab/>
-            <w:t>17</w:t>
-          </w:r>
+          <w:hyperlink w:anchor="__RefHeading___Toc2466_2187837281" w:tooltip="Torso, sacrum and tail">
+            <w:r>
+              <w:rPr>
+                <w:rStyle w:val="IndexLink"/>
+              </w:rPr>
+              <w:t>Torso, sacrum and tail</w:t>
+              <w:tab/>
+              <w:t>17</w:t>
+            </w:r>
+          </w:hyperlink>
         </w:p>
         <w:p>
           <w:pPr>
@@ -791,12 +868,16 @@
             </w:tabs>
             <w:rPr/>
           </w:pPr>
-          <w:r>
-            <w:rPr/>
-            <w:t>Forelimbs and girdles</w:t>
-            <w:tab/>
-            <w:t>17</w:t>
-          </w:r>
+          <w:hyperlink w:anchor="__RefHeading___Toc2470_2187837281" w:tooltip="Forelimbs and girdles">
+            <w:r>
+              <w:rPr>
+                <w:rStyle w:val="IndexLink"/>
+              </w:rPr>
+              <w:t>Forelimbs and girdles</w:t>
+              <w:tab/>
+              <w:t>17</w:t>
+            </w:r>
+          </w:hyperlink>
         </w:p>
         <w:p>
           <w:pPr>
@@ -807,12 +888,16 @@
             </w:tabs>
             <w:rPr/>
           </w:pPr>
-          <w:r>
-            <w:rPr/>
-            <w:t>Hindlimbs and girdles</w:t>
-            <w:tab/>
-            <w:t>18</w:t>
-          </w:r>
+          <w:hyperlink w:anchor="__RefHeading___Toc25856_1820571732" w:tooltip="Hindlimbs and girdles">
+            <w:r>
+              <w:rPr>
+                <w:rStyle w:val="IndexLink"/>
+              </w:rPr>
+              <w:t>Hindlimbs and girdles</w:t>
+              <w:tab/>
+              <w:t>18</w:t>
+            </w:r>
+          </w:hyperlink>
         </w:p>
         <w:p>
           <w:pPr>
@@ -823,12 +908,16 @@
             </w:tabs>
             <w:rPr/>
           </w:pPr>
-          <w:r>
-            <w:rPr/>
-            <w:t>Discussion</w:t>
-            <w:tab/>
-            <w:t>18</w:t>
-          </w:r>
+          <w:hyperlink w:anchor="__RefHeading___Toc3401_68767826" w:tooltip="Discussion">
+            <w:r>
+              <w:rPr>
+                <w:rStyle w:val="IndexLink"/>
+              </w:rPr>
+              <w:t>Discussion</w:t>
+              <w:tab/>
+              <w:t>18</w:t>
+            </w:r>
+          </w:hyperlink>
         </w:p>
         <w:p>
           <w:pPr>
@@ -839,12 +928,16 @@
             </w:tabs>
             <w:rPr/>
           </w:pPr>
-          <w:r>
-            <w:rPr/>
-            <w:t>Rearing pose</w:t>
-            <w:tab/>
-            <w:t>18</w:t>
-          </w:r>
+          <w:hyperlink w:anchor="__RefHeading___Toc21934_68767826" w:tooltip="Size of the AMNH 6341 animal">
+            <w:r>
+              <w:rPr>
+                <w:rStyle w:val="IndexLink"/>
+              </w:rPr>
+              <w:t>Size of the AMNH 6341 animal</w:t>
+              <w:tab/>
+              <w:t>18</w:t>
+            </w:r>
+          </w:hyperlink>
         </w:p>
         <w:p>
           <w:pPr>
@@ -855,12 +948,16 @@
             </w:tabs>
             <w:rPr/>
           </w:pPr>
-          <w:r>
-            <w:rPr/>
-            <w:t>A short history of rearing sauropods</w:t>
-            <w:tab/>
-            <w:t>20</w:t>
-          </w:r>
+          <w:hyperlink w:anchor="__RefHeading___Toc7947_4188845286" w:tooltip="Rearing pose">
+            <w:r>
+              <w:rPr>
+                <w:rStyle w:val="IndexLink"/>
+              </w:rPr>
+              <w:t>Rearing pose</w:t>
+              <w:tab/>
+              <w:t>19</w:t>
+            </w:r>
+          </w:hyperlink>
         </w:p>
         <w:p>
           <w:pPr>
@@ -871,12 +968,16 @@
             </w:tabs>
             <w:rPr/>
           </w:pPr>
-          <w:r>
-            <w:rPr/>
-            <w:t>Cultural impact</w:t>
-            <w:tab/>
-            <w:t>21</w:t>
-          </w:r>
+          <w:hyperlink w:anchor="__RefHeading___Toc3786_1986291683" w:tooltip="A short history of rearing sauropods">
+            <w:r>
+              <w:rPr>
+                <w:rStyle w:val="IndexLink"/>
+              </w:rPr>
+              <w:t>A short history of rearing sauropods</w:t>
+              <w:tab/>
+              <w:t>20</w:t>
+            </w:r>
+          </w:hyperlink>
         </w:p>
         <w:p>
           <w:pPr>
@@ -887,12 +988,16 @@
             </w:tabs>
             <w:rPr/>
           </w:pPr>
-          <w:r>
-            <w:rPr/>
-            <w:t>Size of the AMNH 6341 animal</w:t>
-            <w:tab/>
-            <w:t>22</w:t>
-          </w:r>
+          <w:hyperlink w:anchor="__RefHeading___Toc11689_675290491" w:tooltip="Cultural impact">
+            <w:r>
+              <w:rPr>
+                <w:rStyle w:val="IndexLink"/>
+              </w:rPr>
+              <w:t>Cultural impact</w:t>
+              <w:tab/>
+              <w:t>22</w:t>
+            </w:r>
+          </w:hyperlink>
         </w:p>
         <w:p>
           <w:pPr>
@@ -903,12 +1008,16 @@
             </w:tabs>
             <w:rPr/>
           </w:pPr>
-          <w:r>
-            <w:rPr/>
-            <w:t>Acknowledgements</w:t>
-            <w:tab/>
-            <w:t>22</w:t>
-          </w:r>
+          <w:hyperlink w:anchor="__RefHeading___Toc8168_4188845286" w:tooltip="Conclusion">
+            <w:r>
+              <w:rPr>
+                <w:rStyle w:val="IndexLink"/>
+              </w:rPr>
+              <w:t>Conclusion</w:t>
+              <w:tab/>
+              <w:t>23</w:t>
+            </w:r>
+          </w:hyperlink>
         </w:p>
         <w:p>
           <w:pPr>
@@ -919,12 +1028,16 @@
             </w:tabs>
             <w:rPr/>
           </w:pPr>
-          <w:r>
-            <w:rPr/>
-            <w:t>References</w:t>
-            <w:tab/>
-            <w:t>24</w:t>
-          </w:r>
+          <w:hyperlink w:anchor="__RefHeading___Toc3403_68767826" w:tooltip="Acknowledgements">
+            <w:r>
+              <w:rPr>
+                <w:rStyle w:val="IndexLink"/>
+              </w:rPr>
+              <w:t>Acknowledgements</w:t>
+              <w:tab/>
+              <w:t>23</w:t>
+            </w:r>
+          </w:hyperlink>
         </w:p>
         <w:p>
           <w:pPr>
@@ -935,12 +1048,16 @@
             </w:tabs>
             <w:rPr/>
           </w:pPr>
-          <w:r>
-            <w:rPr/>
-            <w:t>Figure Captions</w:t>
-            <w:tab/>
-            <w:t>30</w:t>
-          </w:r>
+          <w:hyperlink w:anchor="__RefHeading___Toc3405_68767826" w:tooltip="References">
+            <w:r>
+              <w:rPr>
+                <w:rStyle w:val="IndexLink"/>
+              </w:rPr>
+              <w:t>References</w:t>
+              <w:tab/>
+              <w:t>25</w:t>
+            </w:r>
+          </w:hyperlink>
         </w:p>
         <w:p>
           <w:pPr>
@@ -951,12 +1068,36 @@
             </w:tabs>
             <w:rPr/>
           </w:pPr>
-          <w:r>
+          <w:hyperlink w:anchor="__RefHeading___Toc3407_68767826" w:tooltip="Figure Captions">
+            <w:r>
+              <w:rPr>
+                <w:rStyle w:val="IndexLink"/>
+              </w:rPr>
+              <w:t>Figure Captions</w:t>
+              <w:tab/>
+              <w:t>32</w:t>
+            </w:r>
+          </w:hyperlink>
+        </w:p>
+        <w:p>
+          <w:pPr>
+            <w:pStyle w:val="TOC1"/>
+            <w:tabs>
+              <w:tab w:val="clear" w:pos="9638"/>
+              <w:tab w:val="right" w:pos="9637" w:leader="dot"/>
+            </w:tabs>
             <w:rPr/>
-            <w:t>Tables</w:t>
-            <w:tab/>
-            <w:t>34</w:t>
-          </w:r>
+          </w:pPr>
+          <w:hyperlink w:anchor="__RefHeading___Toc25858_1820571732" w:tooltip="Tables">
+            <w:r>
+              <w:rPr>
+                <w:rStyle w:val="IndexLink"/>
+              </w:rPr>
+              <w:t>Tables</w:t>
+              <w:tab/>
+              <w:t>36</w:t>
+            </w:r>
+          </w:hyperlink>
         </w:p>
         <w:p>
           <w:pPr>
@@ -967,14 +1108,20 @@
             </w:tabs>
             <w:rPr/>
           </w:pPr>
+          <w:hyperlink w:anchor="__RefHeading___Toc25860_1820571732" w:tooltip="Table 1">
+            <w:r>
+              <w:rPr>
+                <w:rStyle w:val="IndexLink"/>
+              </w:rPr>
+              <w:t>Table 1</w:t>
+              <w:tab/>
+              <w:t>36</w:t>
+            </w:r>
+          </w:hyperlink>
           <w:r>
-            <w:rPr/>
-            <w:t>Table 1</w:t>
-            <w:tab/>
-            <w:t>34</w:t>
-          </w:r>
-          <w:r>
-            <w:rPr/>
+            <w:rPr>
+              <w:rStyle w:val="IndexLink"/>
+            </w:rPr>
             <w:fldChar w:fldCharType="end"/>
           </w:r>
         </w:p>
@@ -2572,7 +2719,22 @@
       </w:r>
       <w:r>
         <w:rPr/>
-        <w:t xml:space="preserve"> can mass well over 100 kg, and supporting them in the rearing pose would have required a prohibitively strong armature. Furthermore, permanently mounting these scientifically significant fossils 10 m above ground level, even if logistically feasible, would effectively make them unavailable for study. For these reasons, while the mounted skeletons in the main Fossil Halls of the AMNH are mostly real bone, the Roosevelt Memorial Hall display consists entirely of replicas.</w:t>
+        <w:t xml:space="preserve"> can mass well over 100 kg, and supporting them in the rearing pose would have required a prohibitively strong armature. Furthermore, permanently mounting these scientifically significant fossils 10 m above ground level, even if logistically feasible, would effectively make them unavailable for study. For these reasons, while the mounted skeletons in the main Fossil Halls of the AMNH are mostly real bone, the Roosevelt Memorial Hall display consists entirely of replicas. </w:t>
+      </w:r>
+      <w:r>
+        <w:rPr/>
+        <w:t xml:space="preserve">(The real presacral vertebrae are on display under the glass walkway behind the mounted </w:t>
+      </w:r>
+      <w:r>
+        <w:rPr>
+          <w:i/>
+          <w:iCs/>
+        </w:rPr>
+        <w:t>Apatosaurus</w:t>
+      </w:r>
+      <w:r>
+        <w:rPr/>
+        <w:t xml:space="preserve"> in the Hall of Saurischian Dinosaurs, and have been since the Hall opened in June 1995: see the photo in Dingus 1996:71.)</w:t>
       </w:r>
     </w:p>
     <w:p>
@@ -4145,10 +4307,246 @@
         <w:pStyle w:val="Heading2"/>
         <w:rPr/>
       </w:pPr>
-      <w:bookmarkStart w:id="26" w:name="__RefHeading___Toc2476_2187837281"/>
+      <w:bookmarkStart w:id="26" w:name="__RefHeading___Toc21934_68767826"/>
       <w:bookmarkEnd w:id="26"/>
       <w:r>
         <w:rPr/>
+        <w:t>Size of the AMNH 6341 animal</w:t>
+      </w:r>
+    </w:p>
+    <w:p>
+      <w:pPr>
+        <w:pStyle w:val="BodyText"/>
+        <w:rPr/>
+      </w:pPr>
+      <w:r>
+        <w:rPr/>
+        <w:t xml:space="preserve">The exact length of the neck of </w:t>
+      </w:r>
+      <w:r>
+        <w:rPr>
+          <w:i/>
+          <w:iCs/>
+        </w:rPr>
+        <w:t>Barosaurus</w:t>
+      </w:r>
+      <w:r>
+        <w:rPr/>
+        <w:t xml:space="preserve"> is difficult to determine as no complete neck is known. Only one known specimen referred to </w:t>
+      </w:r>
+      <w:r>
+        <w:rPr>
+          <w:i/>
+          <w:iCs/>
+        </w:rPr>
+        <w:t>Barosaurus</w:t>
+      </w:r>
+      <w:r>
+        <w:rPr/>
+        <w:t xml:space="preserve"> preserves the anterior cervicals: AMNH 7535 is a juvenile, consisting of cervicals 2–8, referred by Tschopp et al. (2015:220) to </w:t>
+      </w:r>
+      <w:r>
+        <w:rPr>
+          <w:i/>
+          <w:iCs/>
+        </w:rPr>
+        <w:t>Barosaurus</w:t>
+      </w:r>
+      <w:r>
+        <w:rPr/>
+        <w:t xml:space="preserve"> sp. Wedel (2007:207) scaled these vertebrae up to match those of AMNH 6341 (C8 is preserved in both specimens), to arrive at his total neck length estimate of 8.5 m. It seems that someone performed a similar scaling operation using these vertebrae during the period of the mounting, as shown by notes hand-written around 1990 on a printed draft of what would become the table of measurements in McIntosh’s (2005) </w:t>
+      </w:r>
+      <w:r>
+        <w:rPr>
+          <w:i/>
+          <w:iCs/>
+        </w:rPr>
+        <w:t>Barosaurus</w:t>
+      </w:r>
+      <w:r>
+        <w:rPr/>
+        <w:t xml:space="preserve"> paper (Peter May, pers. comm. 2022). The identity of the note-taker is not known, but the handwriting does not match that of McIntosh himself. Summing the known centrum lengths of AMNH 6341 cervicals 8–16 from this table (McIntosh 2005:table 2.1) yield a total of 6993 mm. The scaled-up centrum lengths of AMNH 7535 cervicals 2–7 written onto the manuscript are 125, 174, 234, 299, 355 and 467, for a total of 1654 mm. Together these sums add to 8587 mm, a good match for Wedel’s (2007) estimate of 8.5 m, which is currently the generally accepted figure. However, see Taylor and Wedel (in prep.) for alternative estimates.</w:t>
+      </w:r>
+    </w:p>
+    <w:p>
+      <w:pPr>
+        <w:pStyle w:val="BodyText"/>
+        <w:rPr/>
+      </w:pPr>
+      <w:r>
+        <w:rPr/>
+        <w:t xml:space="preserve">The height of the mounted </w:t>
+      </w:r>
+      <w:r>
+        <w:rPr>
+          <w:i/>
+          <w:iCs/>
+        </w:rPr>
+        <w:t>Barosaurus</w:t>
+      </w:r>
+      <w:r>
+        <w:rPr/>
+        <w:t xml:space="preserve"> is usually given rather inexactly as “fifty feet above the Rotunda floor” (Norell et al. 1991:39), “almost fifty feet” (Dingus 1996:25), “five-storey-high” (Gordy 1991:3) or “over 50 feet (15 m) from ground to head-level” (Lindsay 1992:26). Although vague, these measurements are enough to establish it as the tallest mounted skeleton of any animal anywhere in the world, about two meters taller than the Berlin brachiosaur which has “a skull located more than 13 m above the level of the feet” (Remes et al. 2011:309). </w:t>
+      </w:r>
+      <w:r>
+        <w:rPr/>
+        <w:t>(The Berlin brachiosaur was also mounted by RCI — or rather, remounted in 2005–2007, following the original mounting in 1938 under the direction of Werner Janensch.)</w:t>
+      </w:r>
+    </w:p>
+    <w:p>
+      <w:pPr>
+        <w:pStyle w:val="BodyText"/>
+        <w:rPr/>
+      </w:pPr>
+      <w:r>
+        <w:rPr/>
+        <w:t xml:space="preserve">The mass of </w:t>
+      </w:r>
+      <w:r>
+        <w:rPr>
+          <w:i/>
+          <w:iCs/>
+          <w:u w:val="none"/>
+        </w:rPr>
+        <w:t>Barosaurus</w:t>
+      </w:r>
+      <w:r>
+        <w:rPr/>
+        <w:t xml:space="preserve"> </w:t>
+      </w:r>
+      <w:r>
+        <w:rPr/>
+        <w:t xml:space="preserve">AMNH 6341 </w:t>
+      </w:r>
+      <w:r>
+        <w:rPr/>
+        <w:t xml:space="preserve">is generally considered to be </w:t>
+      </w:r>
+      <w:r>
+        <w:rPr/>
+        <w:t>similar to</w:t>
+      </w:r>
+      <w:r>
+        <w:rPr/>
+        <w:t xml:space="preserve"> that of </w:t>
+      </w:r>
+      <w:r>
+        <w:rPr>
+          <w:i/>
+          <w:iCs/>
+        </w:rPr>
+        <w:t xml:space="preserve">Diplodocus </w:t>
+      </w:r>
+      <w:r>
+        <w:rPr>
+          <w:i/>
+          <w:iCs/>
+        </w:rPr>
+        <w:t>carnegii</w:t>
+      </w:r>
+      <w:r>
+        <w:rPr/>
+        <w:t xml:space="preserve">, as its torso is about the same size and the longer neck is balanced by </w:t>
+      </w:r>
+      <w:r>
+        <w:rPr>
+          <w:i/>
+          <w:iCs/>
+        </w:rPr>
+        <w:t>Diplodocus</w:t>
+      </w:r>
+      <w:r>
+        <w:rPr/>
+        <w:t xml:space="preserve">’s longer tail. Seebacher (2001) gave a </w:t>
+      </w:r>
+      <w:r>
+        <w:rPr/>
+        <w:t>mass</w:t>
+      </w:r>
+      <w:r>
+        <w:rPr/>
+        <w:t xml:space="preserve"> estimate of 20,040 kg based on graphic double integration (</w:t>
+      </w:r>
+      <w:r>
+        <w:rPr/>
+        <w:t xml:space="preserve">compared with 19,655 kg for </w:t>
+      </w:r>
+      <w:r>
+        <w:rPr>
+          <w:i/>
+          <w:iCs/>
+        </w:rPr>
+        <w:t>Diplodocus carnegii</w:t>
+      </w:r>
+      <w:r>
+        <w:rPr/>
+        <w:t xml:space="preserve">). Henderson (2013) estimated 15,800 kg by slicing a digital model </w:t>
+      </w:r>
+      <w:r>
+        <w:rPr/>
+        <w:t xml:space="preserve">(compared with 11,900 kg for </w:t>
+      </w:r>
+      <w:r>
+        <w:rPr>
+          <w:i/>
+          <w:iCs/>
+        </w:rPr>
+        <w:t>Diplodocus carnegii</w:t>
+      </w:r>
+      <w:r>
+        <w:rPr/>
+        <w:t>)</w:t>
+      </w:r>
+      <w:r>
+        <w:rPr/>
+        <w:t xml:space="preserve">. Benson et al. (2014), in supplementary information </w:t>
+      </w:r>
+      <w:r>
+        <w:rPr/>
+        <w:t>S1</w:t>
+      </w:r>
+      <w:r>
+        <w:rPr/>
+        <w:t>, gave an estimate of 13,16</w:t>
+      </w:r>
+      <w:r>
+        <w:rPr/>
+        <w:t>4</w:t>
+      </w:r>
+      <w:r>
+        <w:rPr/>
+        <w:t xml:space="preserve"> kg for AMNH 6341 based on limb-bone measurements </w:t>
+      </w:r>
+      <w:r>
+        <w:rPr/>
+        <w:t xml:space="preserve">(compared with 13,801 kg for </w:t>
+      </w:r>
+      <w:r>
+        <w:rPr>
+          <w:i/>
+          <w:iCs/>
+          <w:u w:val="none"/>
+        </w:rPr>
+        <w:t>Diplodocus carnegii</w:t>
+      </w:r>
+      <w:r>
+        <w:rPr/>
+        <w:t>)</w:t>
+      </w:r>
+      <w:r>
+        <w:rPr/>
+        <w:t>.</w:t>
+      </w:r>
+    </w:p>
+    <w:p>
+      <w:pPr>
+        <w:pStyle w:val="Heading2"/>
+        <w:rPr/>
+      </w:pPr>
+      <w:bookmarkStart w:id="27" w:name="__RefHeading___Toc7947_4188845286"/>
+      <w:bookmarkEnd w:id="27"/>
+      <w:r>
+        <w:rPr/>
         <w:t>Rearing pose</w:t>
       </w:r>
     </w:p>
@@ -4391,8 +4789,8 @@
         <w:pStyle w:val="Heading2"/>
         <w:rPr/>
       </w:pPr>
-      <w:bookmarkStart w:id="27" w:name="__RefHeading___Toc3786_1986291683"/>
-      <w:bookmarkEnd w:id="27"/>
+      <w:bookmarkStart w:id="28" w:name="__RefHeading___Toc3786_1986291683"/>
+      <w:bookmarkEnd w:id="28"/>
       <w:r>
         <w:rPr/>
         <w:t>A short history of rearing sauropods</w:t>
@@ -4874,8 +5272,8 @@
         <w:pStyle w:val="Heading2"/>
         <w:rPr/>
       </w:pPr>
-      <w:bookmarkStart w:id="28" w:name="__RefHeading___Toc11689_675290491"/>
-      <w:bookmarkEnd w:id="28"/>
+      <w:bookmarkStart w:id="29" w:name="__RefHeading___Toc11689_675290491"/>
+      <w:bookmarkEnd w:id="29"/>
       <w:r>
         <w:rPr/>
         <w:t>Cultural impact</w:t>
@@ -5241,14 +5639,14 @@
     </w:p>
     <w:p>
       <w:pPr>
-        <w:pStyle w:val="Heading2"/>
-        <w:rPr/>
-      </w:pPr>
-      <w:bookmarkStart w:id="29" w:name="__RefHeading___Toc21934_68767826"/>
-      <w:bookmarkEnd w:id="29"/>
-      <w:r>
-        <w:rPr/>
-        <w:t>Size of the AMNH 6341 animal</w:t>
+        <w:pStyle w:val="Heading1"/>
+        <w:rPr/>
+      </w:pPr>
+      <w:bookmarkStart w:id="30" w:name="__RefHeading___Toc8168_4188845286"/>
+      <w:bookmarkEnd w:id="30"/>
+      <w:r>
+        <w:rPr/>
+        <w:t>Conclusion</w:t>
       </w:r>
     </w:p>
     <w:p>
@@ -5258,7 +5656,7 @@
       </w:pPr>
       <w:r>
         <w:rPr/>
-        <w:t xml:space="preserve">The exact length of the neck of </w:t>
+        <w:t xml:space="preserve">It is ironic that the AMNH had no part in the excavation or preparation of what is arguably its most iconic fossil specimen, Barnum Brown having reunited it after a diaspora to three different museums. It doubly ironic that, having acquired the skeleton, the museum did not even display it for several years, then removed it from display after little more than a decade. Subsequent developments show the value of palaeoart as a hypothesis-generating machine: there would be no rearing </w:t>
       </w:r>
       <w:r>
         <w:rPr>
@@ -5269,61 +5667,18 @@
       </w:r>
       <w:r>
         <w:rPr/>
-        <w:t xml:space="preserve"> is difficult to determine as no complete neck is known. Only one known specimen referred to </w:t>
-      </w:r>
-      <w:r>
-        <w:rPr>
-          <w:i/>
-          <w:iCs/>
-        </w:rPr>
-        <w:t>Barosaurus</w:t>
-      </w:r>
-      <w:r>
-        <w:rPr/>
-        <w:t xml:space="preserve"> preserves the anterior cervicals: AMNH 7535 is a juvenile, consisting of cervicals 2–8, referred by Tschopp et al. (2015:220) to </w:t>
-      </w:r>
-      <w:r>
-        <w:rPr>
-          <w:i/>
-          <w:iCs/>
-        </w:rPr>
-        <w:t>Barosaurus</w:t>
-      </w:r>
-      <w:r>
-        <w:rPr/>
-        <w:t xml:space="preserve"> sp. Wedel (2007:207) scaled these vertebrae up to match those of AMNH 6341 (C8 is preserved in both specimens), to arrive at his total neck length estimate of 8.5 m. It seems that someone performed a similar scaling operation using these vertebrae during the period of the mounting, as shown by notes hand-written around 1990 on a printed draft of what would become the table of measurements in McIntosh’s (2005) </w:t>
-      </w:r>
-      <w:r>
-        <w:rPr>
-          <w:i/>
-          <w:iCs/>
-        </w:rPr>
-        <w:t>Barosaurus</w:t>
-      </w:r>
-      <w:r>
-        <w:rPr/>
-        <w:t xml:space="preserve"> paper (Peter May, pers. comm. 2022). The identity of the note-taker is not known, but the handwriting does not match that of McIntosh himself. Summing the known centrum lengths of AMNH 6341 cervicals 8–16 from this table (McIntosh 2005:table 2.1) yield a total of 6993 mm. The scaled-up centrum lengths of AMNH 7535 cervicals 2–7 written onto the manuscript are 125, 174, 234, 299, 355 and 467, for a total of 1654 mm. Together these sums add to 8587 mm, a good match for Wedel’s (2007) estimate of 8.5 m, which is currently the generally accepted figure. However, see Taylor and Wedel (in prep.) for alternative estimates.</w:t>
-      </w:r>
-    </w:p>
-    <w:p>
-      <w:pPr>
-        <w:pStyle w:val="BodyText"/>
-        <w:rPr/>
-      </w:pPr>
-      <w:r>
-        <w:rPr/>
-        <w:t xml:space="preserve">The height of the mounted </w:t>
-      </w:r>
-      <w:r>
-        <w:rPr>
-          <w:i/>
-          <w:iCs/>
-        </w:rPr>
-        <w:t>Barosaurus</w:t>
-      </w:r>
-      <w:r>
-        <w:rPr/>
-        <w:t xml:space="preserve"> is usually given rather inexactly as “fifty feet above the Rotunda floor” (Norell et al. 1991:39), “almost fifty feet” (Dingus 1996:25), “five-storey-high” (Gordy 1991:3) or “over 50 feet (15 m) from ground to head-level” (Lindsay 1992:26). Although vague, these measurements are enough to establish it as the tallest mounted skeleton of any animal anywhere in the world, about two meters taller than the remounted Berlin brachiosaur which has “a skull located more than 13 m above the level of the feet” (Remes et al. 2011:309).</w:t>
+        <w:t xml:space="preserve"> mount without Greg Paul’s painting </w:t>
+      </w:r>
+      <w:r>
+        <w:rPr>
+          <w:i/>
+          <w:iCs/>
+        </w:rPr>
+        <w:t>Ambush at Como Creek</w:t>
+      </w:r>
+      <w:r>
+        <w:rPr/>
+        <w:t>. It is striking that Dingus and Gaffney independently had the idea for a rearing mount, despite their distaste for speculative palaeobiology, each of them expecting the other to object — and that Norell, who they both expected to veto the idea, was also on board. And it is satisfying that the biomechanical feasibility of rearing diplodocines has subsequently been demonstrated mathematically. The mount certainly achieved its stated goals of provoking not just public discussion, but much further scientific work.</w:t>
       </w:r>
     </w:p>
     <w:p>
@@ -5335,8 +5690,8 @@
         </w:numPr>
         <w:rPr/>
       </w:pPr>
-      <w:bookmarkStart w:id="30" w:name="__RefHeading___Toc3403_68767826"/>
-      <w:bookmarkEnd w:id="30"/>
+      <w:bookmarkStart w:id="31" w:name="__RefHeading___Toc3403_68767826"/>
+      <w:bookmarkEnd w:id="31"/>
       <w:r>
         <w:rPr/>
         <w:t>Acknowledgements</w:t>
@@ -5435,7 +5790,15 @@
       </w:pPr>
       <w:r>
         <w:rPr/>
-        <w:t>Mai Reitmeyer (Department of Library Services, AMNH) helped us to obtain historical photographs. Kiana Clark (AMNH Vertebrate Paleontology Archives), provided numerous historical documents and photographs. Abby Telfer (United States National Museum), provided helpful documents in establish the early history of the AMNH 6341 material. ReBecca Hunt-Forster (Dinosaur National Monument) provided an invaluable archive of correspondence relating to the early years of the quarry. Amelia Zietlow (Richard Gilder Graduate School at the AMNH) provided helpful photographs and information about the present public exhibits (Figure 8). We thank Ray Wilhite (Auburn University College of Veterinary Medicine) and Brooks Britt and Rod Scheetz (both Brigham Young University) for help in accessing the archived notebooks of John S. McIntosh. Matt Wedel helped with the interpretation and identification of some vertebrae.</w:t>
+        <w:t xml:space="preserve">Mai Reitmeyer (Department of Library Services, AMNH) helped us to obtain historical photographs. Kiana Clark (AMNH Vertebrate Paleontology Archives), provided numerous historical documents and photographs. Abby Telfer (United States National Museum), provided helpful documents in establish the early history of the AMNH 6341 material. ReBecca Hunt-Forster (Dinosaur National Monument) provided an invaluable archive of correspondence relating to the early years of the quarry. Amelia Zietlow (Richard Gilder Graduate School at the AMNH) provided helpful photographs and information about the present public exhibits (Figure 8). We thank Ray Wilhite (Auburn University College of Veterinary Medicine) and Brooks Britt and Rod Scheetz (both Brigham Young University) for help in accessing the archived notebooks of John S. McIntosh. Matt Wedel helped with the interpretation and identification of some vertebrae, </w:t>
+      </w:r>
+      <w:r>
+        <w:rPr/>
+        <w:t>and provided valuable feedback on the manuscript</w:t>
+      </w:r>
+      <w:r>
+        <w:rPr/>
+        <w:t>.</w:t>
       </w:r>
     </w:p>
     <w:p>
@@ -5456,14 +5819,8 @@
       </w:r>
       <w:r>
         <w:rPr/>
-        <w:t>.</w:t>
-      </w:r>
-    </w:p>
-    <w:p>
-      <w:pPr>
-        <w:pStyle w:val="BodyText"/>
-        <w:rPr/>
-      </w:pPr>
+        <w:t xml:space="preserve">. </w:t>
+      </w:r>
       <w:r>
         <w:rPr/>
         <w:t xml:space="preserve">Carl Mehling (AMNH) searched collections for the missing C7 and concluded it was absent. Matt Caranno </w:t>
@@ -5490,8 +5847,8 @@
         <w:spacing w:before="0" w:after="142"/>
         <w:rPr/>
       </w:pPr>
-      <w:bookmarkStart w:id="31" w:name="__RefHeading___Toc3405_68767826"/>
-      <w:bookmarkEnd w:id="31"/>
+      <w:bookmarkStart w:id="32" w:name="__RefHeading___Toc3405_68767826"/>
+      <w:bookmarkEnd w:id="32"/>
       <w:r>
         <w:rPr/>
         <w:t>References</w:t>
@@ -5891,6 +6248,38 @@
       </w:pPr>
       <w:r>
         <w:rPr/>
+        <w:t xml:space="preserve">Benson Roger B. J., Nicolás E. Campione, Matthew T. Carrano, Philip D. Mannion, Corwin Sullivan, Paul Upchurch and David C. Evans. 2014. Rates of dinosaur body mass evolution indicate 170 million years of sustained ecological innovation on the avian stem lineage. </w:t>
+      </w:r>
+      <w:r>
+        <w:rPr>
+          <w:i/>
+          <w:iCs/>
+        </w:rPr>
+        <w:t>PLoS Biology</w:t>
+      </w:r>
+      <w:r>
+        <w:rPr/>
+        <w:t xml:space="preserve"> </w:t>
+      </w:r>
+      <w:r>
+        <w:rPr>
+          <w:b/>
+          <w:bCs/>
+        </w:rPr>
+        <w:t>12(5)</w:t>
+      </w:r>
+      <w:r>
+        <w:rPr/>
+        <w:t>:e1001853. doi:10.1371/journal.pbio.1001853</w:t>
+      </w:r>
+    </w:p>
+    <w:p>
+      <w:pPr>
+        <w:pStyle w:val="Reference"/>
+        <w:rPr/>
+      </w:pPr>
+      <w:r>
+        <w:rPr/>
         <w:t xml:space="preserve">Bird, Roland T. 1985. </w:t>
       </w:r>
       <w:r>
@@ -6346,7 +6735,7 @@
         <w:rPr/>
         <w:t xml:space="preserve"> in the United States National Museum. </w:t>
       </w:r>
-      <w:bookmarkStart w:id="32" w:name="__DdeLink__2788_55120580"/>
+      <w:bookmarkStart w:id="33" w:name="__DdeLink__2788_55120580"/>
       <w:r>
         <w:rPr>
           <w:i/>
@@ -6354,7 +6743,7 @@
         </w:rPr>
         <w:t>Proceedings of the United States National Museum</w:t>
       </w:r>
-      <w:bookmarkEnd w:id="32"/>
+      <w:bookmarkEnd w:id="33"/>
       <w:r>
         <w:rPr/>
         <w:t xml:space="preserve"> </w:t>
@@ -6573,6 +6962,102 @@
       <w:r>
         <w:rPr/>
         <w:t>:1–25.</w:t>
+      </w:r>
+    </w:p>
+    <w:p>
+      <w:pPr>
+        <w:pStyle w:val="Reference"/>
+        <w:rPr/>
+      </w:pPr>
+      <w:r>
+        <w:rPr/>
+        <w:t>Henderson, D</w:t>
+      </w:r>
+      <w:r>
+        <w:rPr/>
+        <w:t xml:space="preserve">onald </w:t>
+      </w:r>
+      <w:r>
+        <w:rPr/>
+        <w:t xml:space="preserve">M. 2013. Sauropod </w:t>
+      </w:r>
+      <w:r>
+        <w:rPr/>
+        <w:t>n</w:t>
+      </w:r>
+      <w:r>
+        <w:rPr/>
+        <w:t xml:space="preserve">ecks: </w:t>
+      </w:r>
+      <w:r>
+        <w:rPr/>
+        <w:t>a</w:t>
+      </w:r>
+      <w:r>
+        <w:rPr/>
+        <w:t xml:space="preserve">re </w:t>
+      </w:r>
+      <w:r>
+        <w:rPr/>
+        <w:t>t</w:t>
+      </w:r>
+      <w:r>
+        <w:rPr/>
+        <w:t xml:space="preserve">hey </w:t>
+      </w:r>
+      <w:r>
+        <w:rPr/>
+        <w:t>r</w:t>
+      </w:r>
+      <w:r>
+        <w:rPr/>
+        <w:t xml:space="preserve">eally for </w:t>
+      </w:r>
+      <w:r>
+        <w:rPr/>
+        <w:t>h</w:t>
+      </w:r>
+      <w:r>
+        <w:rPr/>
+        <w:t xml:space="preserve">eat </w:t>
+      </w:r>
+      <w:r>
+        <w:rPr/>
+        <w:t>l</w:t>
+      </w:r>
+      <w:r>
+        <w:rPr/>
+        <w:t xml:space="preserve">oss? </w:t>
+      </w:r>
+      <w:r>
+        <w:rPr>
+          <w:i/>
+          <w:iCs/>
+        </w:rPr>
+        <w:t>PLoS ONE</w:t>
+      </w:r>
+      <w:r>
+        <w:rPr/>
+        <w:t xml:space="preserve"> </w:t>
+      </w:r>
+      <w:r>
+        <w:rPr>
+          <w:b/>
+          <w:bCs/>
+        </w:rPr>
+        <w:t>8(10)</w:t>
+      </w:r>
+      <w:r>
+        <w:rPr/>
+        <w:t xml:space="preserve">: e77108. </w:t>
+      </w:r>
+      <w:r>
+        <w:rPr/>
+        <w:t>d</w:t>
+      </w:r>
+      <w:r>
+        <w:rPr/>
+        <w:t>oi:10.1371/journal.pone.0077108</w:t>
       </w:r>
     </w:p>
     <w:p>
@@ -7397,12 +7882,12 @@
         <w:pStyle w:val="Reference"/>
         <w:rPr/>
       </w:pPr>
-      <w:bookmarkStart w:id="33" w:name="__DdeLink__16582_68767826"/>
+      <w:bookmarkStart w:id="34" w:name="__DdeLink__16582_68767826"/>
       <w:r>
         <w:rPr/>
         <w:t>Nieuwland</w:t>
       </w:r>
-      <w:bookmarkEnd w:id="33"/>
+      <w:bookmarkEnd w:id="34"/>
       <w:r>
         <w:rPr/>
         <w:t xml:space="preserve">, Ilja. 2019. </w:t>
@@ -7801,8 +8286,16 @@
       </w:r>
       <w:r>
         <w:rPr/>
-        <w:t>:69–107. doi:10.1127/pala/284/2008/69</w:t>
-      </w:r>
+        <w:t xml:space="preserve">:69–107. </w:t>
+      </w:r>
+      <w:hyperlink r:id="rId12">
+        <w:r>
+          <w:rPr>
+            <w:rStyle w:val="Hyperlink"/>
+          </w:rPr>
+          <w:t>doi:10.1127/pala/284/2008/69</w:t>
+        </w:r>
+      </w:hyperlink>
     </w:p>
     <w:p>
       <w:pPr>
@@ -7811,9 +8304,41 @@
       </w:pPr>
       <w:r>
         <w:rPr/>
+        <w:t xml:space="preserve">Seebacher, Frank. 2001. A new method to calculate allometric length-mass relationships of dinosaurs. </w:t>
+      </w:r>
+      <w:r>
+        <w:rPr>
+          <w:i/>
+          <w:iCs/>
+        </w:rPr>
+        <w:t>Journal of Vertebrate Paleontology</w:t>
+      </w:r>
+      <w:r>
+        <w:rPr/>
+        <w:t xml:space="preserve"> </w:t>
+      </w:r>
+      <w:r>
+        <w:rPr>
+          <w:b/>
+          <w:bCs/>
+        </w:rPr>
+        <w:t>21</w:t>
+      </w:r>
+      <w:r>
+        <w:rPr/>
+        <w:t>:51–60. doi:10.1671/0272-4634(2001)021[0051:ANMTCA]2.0.CO;2</w:t>
+      </w:r>
+    </w:p>
+    <w:p>
+      <w:pPr>
+        <w:pStyle w:val="Reference"/>
+        <w:rPr/>
+      </w:pPr>
+      <w:r>
+        <w:rPr/>
         <w:t xml:space="preserve">Smith, Adam S. (with contributions from 20 other authors). 2007. Dinosaur Toy Blog. </w:t>
       </w:r>
-      <w:hyperlink r:id="rId12">
+      <w:hyperlink r:id="rId13">
         <w:r>
           <w:rPr>
             <w:rStyle w:val="Hyperlink"/>
@@ -7969,7 +8494,7 @@
         <w:rPr/>
         <w:t xml:space="preserve"> from Utah and Colorado, USA. </w:t>
       </w:r>
-      <w:hyperlink r:id="rId13">
+      <w:hyperlink r:id="rId14">
         <w:r>
           <w:rPr>
             <w:rStyle w:val="Hyperlink"/>
@@ -8138,7 +8663,7 @@
         <w:rPr/>
         <w:t xml:space="preserve">:e857. </w:t>
       </w:r>
-      <w:hyperlink r:id="rId14">
+      <w:hyperlink r:id="rId15">
         <w:r>
           <w:rPr>
             <w:rStyle w:val="Hyperlink"/>
@@ -8316,7 +8841,7 @@
         <w:rPr/>
         <w:t xml:space="preserve">]. Institute of Vertebrate Paleontology and Paleoanthropology Monograph Series I, No. 8:1–30. English translation by W. Downs. </w:t>
       </w:r>
-      <w:hyperlink r:id="rId15">
+      <w:hyperlink r:id="rId16">
         <w:r>
           <w:rPr>
             <w:rStyle w:val="Hyperlink"/>
@@ -8342,8 +8867,8 @@
         <w:spacing w:before="0" w:after="142"/>
         <w:rPr/>
       </w:pPr>
-      <w:bookmarkStart w:id="34" w:name="__RefHeading___Toc3407_68767826"/>
-      <w:bookmarkEnd w:id="34"/>
+      <w:bookmarkStart w:id="35" w:name="__RefHeading___Toc3407_68767826"/>
+      <w:bookmarkEnd w:id="35"/>
       <w:r>
         <w:rPr/>
         <w:t>Figure Captions</w:t>
@@ -9305,8 +9830,8 @@
         <w:spacing w:before="0" w:after="142"/>
         <w:rPr/>
       </w:pPr>
-      <w:bookmarkStart w:id="35" w:name="__RefHeading___Toc25858_1820571732"/>
-      <w:bookmarkEnd w:id="35"/>
+      <w:bookmarkStart w:id="36" w:name="__RefHeading___Toc25858_1820571732"/>
+      <w:bookmarkEnd w:id="36"/>
       <w:r>
         <w:rPr/>
         <w:t>Tables</w:t>
@@ -9317,8 +9842,8 @@
         <w:pStyle w:val="Heading2"/>
         <w:rPr/>
       </w:pPr>
-      <w:bookmarkStart w:id="36" w:name="__RefHeading___Toc25860_1820571732"/>
-      <w:bookmarkEnd w:id="36"/>
+      <w:bookmarkStart w:id="37" w:name="__RefHeading___Toc25860_1820571732"/>
+      <w:bookmarkEnd w:id="37"/>
       <w:r>
         <w:rPr/>
         <w:t>Table 1</w:t>
@@ -11206,9 +11731,9 @@
       </w:r>
     </w:p>
     <w:sectPr>
-      <w:headerReference w:type="even" r:id="rId16"/>
-      <w:headerReference w:type="default" r:id="rId17"/>
-      <w:headerReference w:type="first" r:id="rId18"/>
+      <w:headerReference w:type="even" r:id="rId17"/>
+      <w:headerReference w:type="default" r:id="rId18"/>
+      <w:headerReference w:type="first" r:id="rId19"/>
       <w:type w:val="nextPage"/>
       <w:pgSz w:w="11906" w:h="16838"/>
       <w:pgMar w:left="1134" w:right="1134" w:gutter="0" w:header="1134" w:top="1692" w:footer="0" w:bottom="1134"/>
@@ -11274,7 +11799,7 @@
     </w:r>
     <w:r>
       <w:rPr/>
-      <w:t>36</w:t>
+      <w:t>37</w:t>
     </w:r>
     <w:r>
       <w:rPr/>
@@ -11298,7 +11823,7 @@
     </w:r>
     <w:r>
       <w:rPr/>
-      <w:t>36</w:t>
+      <w:t>37</w:t>
     </w:r>
     <w:r>
       <w:rPr/>
@@ -11347,7 +11872,7 @@
     </w:r>
     <w:r>
       <w:rPr/>
-      <w:t>36</w:t>
+      <w:t>37</w:t>
     </w:r>
     <w:r>
       <w:rPr/>
@@ -11371,7 +11896,7 @@
     </w:r>
     <w:r>
       <w:rPr/>
-      <w:t>36</w:t>
+      <w:t>37</w:t>
     </w:r>
     <w:r>
       <w:rPr/>

</xml_diff>

<commit_message>
Fix typos in abstract
</commit_message>
<xml_diff>
--- a/TaylorEtAl-mounted-barosaurus.docx
+++ b/TaylorEtAl-mounted-barosaurus.docx
@@ -298,7 +298,35 @@
           <w:i w:val="false"/>
           <w:iCs w:val="false"/>
         </w:rPr>
-        <w:t xml:space="preserve"> habitually reared, but to provoke visitors to think about what fossils can and cannot tell us about extinct animals. About 80% of the material in the mount was cast from AMNH 6341. Most of the rest cast from second-generation molds of the Carnegie </w:t>
+        <w:t xml:space="preserve"> habitually reared, but to provoke visitors to think about what fossils can and cannot tell us about extinct animals. About 80% of the material in the mount was cast from AMNH 6341. </w:t>
+      </w:r>
+      <w:r>
+        <w:rPr>
+          <w:i w:val="false"/>
+          <w:iCs w:val="false"/>
+        </w:rPr>
+        <w:t>Almost all</w:t>
+      </w:r>
+      <w:r>
+        <w:rPr>
+          <w:i w:val="false"/>
+          <w:iCs w:val="false"/>
+        </w:rPr>
+        <w:t xml:space="preserve"> of the rest </w:t>
+      </w:r>
+      <w:r>
+        <w:rPr>
+          <w:i w:val="false"/>
+          <w:iCs w:val="false"/>
+        </w:rPr>
+        <w:t xml:space="preserve">was </w:t>
+      </w:r>
+      <w:r>
+        <w:rPr>
+          <w:i w:val="false"/>
+          <w:iCs w:val="false"/>
+        </w:rPr>
+        <w:t xml:space="preserve">cast from second-generation molds of the Carnegie </w:t>
       </w:r>
       <w:r>
         <w:rPr/>
@@ -387,16 +415,17 @@
             </w:rPr>
             <w:fldChar w:fldCharType="separate"/>
           </w:r>
-          <w:hyperlink w:anchor="__RefHeading___Toc3784_1986291683" w:tooltip="Introduction">
-            <w:r>
-              <w:rPr>
-                <w:rStyle w:val="IndexLink"/>
-              </w:rPr>
-              <w:t>Introduction</w:t>
-              <w:tab/>
-              <w:t>2</w:t>
-            </w:r>
-          </w:hyperlink>
+          <w:r>
+            <w:rPr>
+              <w:rStyle w:val="IndexLink"/>
+            </w:rPr>
+            <w:t>Introduction</w:t>
+          </w:r>
+          <w:r>
+            <w:rPr/>
+            <w:tab/>
+            <w:t>2</w:t>
+          </w:r>
         </w:p>
         <w:p>
           <w:pPr>
@@ -407,16 +436,12 @@
             </w:tabs>
             <w:rPr/>
           </w:pPr>
-          <w:hyperlink w:anchor="__RefHeading___Toc3323_2187837281" w:tooltip="Anatomical nomenclature">
-            <w:r>
-              <w:rPr>
-                <w:rStyle w:val="IndexLink"/>
-              </w:rPr>
-              <w:t>Anatomical nomenclature</w:t>
-              <w:tab/>
-              <w:t>3</w:t>
-            </w:r>
-          </w:hyperlink>
+          <w:r>
+            <w:rPr/>
+            <w:t>Anatomical nomenclature</w:t>
+            <w:tab/>
+            <w:t>3</w:t>
+          </w:r>
         </w:p>
         <w:p>
           <w:pPr>
@@ -427,16 +452,12 @@
             </w:tabs>
             <w:rPr/>
           </w:pPr>
-          <w:hyperlink w:anchor="__RefHeading___Toc5349_68767826" w:tooltip="Institutional abbreviations">
-            <w:r>
-              <w:rPr>
-                <w:rStyle w:val="IndexLink"/>
-              </w:rPr>
-              <w:t>Institutional abbreviations</w:t>
-              <w:tab/>
-              <w:t>3</w:t>
-            </w:r>
-          </w:hyperlink>
+          <w:r>
+            <w:rPr/>
+            <w:t>Institutional abbreviations</w:t>
+            <w:tab/>
+            <w:t>3</w:t>
+          </w:r>
         </w:p>
         <w:p>
           <w:pPr>
@@ -447,16 +468,12 @@
             </w:tabs>
             <w:rPr/>
           </w:pPr>
-          <w:hyperlink w:anchor="__RefHeading___Toc4316_68767826" w:tooltip="Historical background">
-            <w:r>
-              <w:rPr>
-                <w:rStyle w:val="IndexLink"/>
-              </w:rPr>
-              <w:t>Historical background</w:t>
-              <w:tab/>
-              <w:t>3</w:t>
-            </w:r>
-          </w:hyperlink>
+          <w:r>
+            <w:rPr/>
+            <w:t>Historical background</w:t>
+            <w:tab/>
+            <w:t>3</w:t>
+          </w:r>
         </w:p>
         <w:p>
           <w:pPr>
@@ -467,29 +484,22 @@
             </w:tabs>
             <w:rPr/>
           </w:pPr>
-          <w:hyperlink w:anchor="__RefHeading___Toc12350_68767826" w:tooltip="Early discoveries of Barosaurus">
-            <w:r>
-              <w:rPr>
-                <w:rStyle w:val="IndexLink"/>
-              </w:rPr>
-              <w:t xml:space="preserve">Early discoveries of </w:t>
-            </w:r>
-            <w:r>
-              <w:rPr>
-                <w:rStyle w:val="IndexLink"/>
-                <w:i/>
-                <w:iCs/>
-              </w:rPr>
-              <w:t>Barosaurus</w:t>
-            </w:r>
-            <w:r>
-              <w:rPr>
-                <w:rStyle w:val="IndexLink"/>
-              </w:rPr>
-              <w:tab/>
-              <w:t>3</w:t>
-            </w:r>
-          </w:hyperlink>
+          <w:r>
+            <w:rPr/>
+            <w:t xml:space="preserve">Early discoveries of </w:t>
+          </w:r>
+          <w:r>
+            <w:rPr>
+              <w:i/>
+              <w:iCs/>
+            </w:rPr>
+            <w:t>Barosaurus</w:t>
+          </w:r>
+          <w:r>
+            <w:rPr/>
+            <w:tab/>
+            <w:t>3</w:t>
+          </w:r>
         </w:p>
         <w:p>
           <w:pPr>
@@ -500,29 +510,22 @@
             </w:tabs>
             <w:rPr/>
           </w:pPr>
-          <w:hyperlink w:anchor="__RefHeading___Toc12352_68767826" w:tooltip="The AMNH specimen of Barosaurus">
-            <w:r>
-              <w:rPr>
-                <w:rStyle w:val="IndexLink"/>
-              </w:rPr>
-              <w:t xml:space="preserve">The AMNH specimen of </w:t>
-            </w:r>
-            <w:r>
-              <w:rPr>
-                <w:rStyle w:val="IndexLink"/>
-                <w:i/>
-                <w:iCs/>
-              </w:rPr>
-              <w:t>Barosaurus</w:t>
-            </w:r>
-            <w:r>
-              <w:rPr>
-                <w:rStyle w:val="IndexLink"/>
-              </w:rPr>
-              <w:tab/>
-              <w:t>4</w:t>
-            </w:r>
-          </w:hyperlink>
+          <w:r>
+            <w:rPr/>
+            <w:t xml:space="preserve">The AMNH specimen of </w:t>
+          </w:r>
+          <w:r>
+            <w:rPr>
+              <w:i/>
+              <w:iCs/>
+            </w:rPr>
+            <w:t>Barosaurus</w:t>
+          </w:r>
+          <w:r>
+            <w:rPr/>
+            <w:tab/>
+            <w:t>4</w:t>
+          </w:r>
         </w:p>
         <w:p>
           <w:pPr>
@@ -533,16 +536,12 @@
             </w:tabs>
             <w:rPr/>
           </w:pPr>
-          <w:hyperlink w:anchor="__RefHeading___Toc25848_1820571732" w:tooltip="The Carnegie Quarry at Dinosaur National Monument">
-            <w:r>
-              <w:rPr>
-                <w:rStyle w:val="IndexLink"/>
-              </w:rPr>
-              <w:t>The Carnegie Quarry at Dinosaur National Monument</w:t>
-              <w:tab/>
-              <w:t>4</w:t>
-            </w:r>
-          </w:hyperlink>
+          <w:r>
+            <w:rPr/>
+            <w:t>The Carnegie Quarry at Dinosaur National Monument</w:t>
+            <w:tab/>
+            <w:t>4</w:t>
+          </w:r>
         </w:p>
         <w:p>
           <w:pPr>
@@ -553,16 +552,12 @@
             </w:tabs>
             <w:rPr/>
           </w:pPr>
-          <w:hyperlink w:anchor="__RefHeading___Toc25850_1820571732" w:tooltip="USNM work at Dinosaur National Monument">
-            <w:r>
-              <w:rPr>
-                <w:rStyle w:val="IndexLink"/>
-              </w:rPr>
-              <w:t>USNM work at Dinosaur National Monument</w:t>
-              <w:tab/>
-              <w:t>5</w:t>
-            </w:r>
-          </w:hyperlink>
+          <w:r>
+            <w:rPr/>
+            <w:t>USNM work at Dinosaur National Monument</w:t>
+            <w:tab/>
+            <w:t>5</w:t>
+          </w:r>
         </w:p>
         <w:p>
           <w:pPr>
@@ -573,16 +568,12 @@
             </w:tabs>
             <w:rPr/>
           </w:pPr>
-          <w:hyperlink w:anchor="__RefHeading___Toc25852_1820571732" w:tooltip="The skeleton reunited">
-            <w:r>
-              <w:rPr>
-                <w:rStyle w:val="IndexLink"/>
-              </w:rPr>
-              <w:t>The skeleton reunited</w:t>
-              <w:tab/>
-              <w:t>6</w:t>
-            </w:r>
-          </w:hyperlink>
+          <w:r>
+            <w:rPr/>
+            <w:t>The skeleton reunited</w:t>
+            <w:tab/>
+            <w:t>6</w:t>
+          </w:r>
         </w:p>
         <w:p>
           <w:pPr>
@@ -593,29 +584,22 @@
             </w:tabs>
             <w:rPr/>
           </w:pPr>
-          <w:hyperlink w:anchor="__RefHeading___Toc5351_68767826" w:tooltip="The AMNH mounted Barosaurus">
-            <w:r>
-              <w:rPr>
-                <w:rStyle w:val="IndexLink"/>
-              </w:rPr>
-              <w:t xml:space="preserve">The AMNH mounted </w:t>
-            </w:r>
-            <w:r>
-              <w:rPr>
-                <w:rStyle w:val="IndexLink"/>
-                <w:i/>
-                <w:iCs/>
-              </w:rPr>
-              <w:t>Barosaurus</w:t>
-            </w:r>
-            <w:r>
-              <w:rPr>
-                <w:rStyle w:val="IndexLink"/>
-              </w:rPr>
-              <w:tab/>
-              <w:t>8</w:t>
-            </w:r>
-          </w:hyperlink>
+          <w:r>
+            <w:rPr/>
+            <w:t xml:space="preserve">The AMNH mounted </w:t>
+          </w:r>
+          <w:r>
+            <w:rPr>
+              <w:i/>
+              <w:iCs/>
+            </w:rPr>
+            <w:t>Barosaurus</w:t>
+          </w:r>
+          <w:r>
+            <w:rPr/>
+            <w:tab/>
+            <w:t>8</w:t>
+          </w:r>
         </w:p>
         <w:p>
           <w:pPr>
@@ -626,16 +610,12 @@
             </w:tabs>
             <w:rPr/>
           </w:pPr>
-          <w:hyperlink w:anchor="__RefHeading___Toc5354_68767826" w:tooltip="The conception of the mount">
-            <w:r>
-              <w:rPr>
-                <w:rStyle w:val="IndexLink"/>
-              </w:rPr>
-              <w:t>The conception of the mount</w:t>
-              <w:tab/>
-              <w:t>8</w:t>
-            </w:r>
-          </w:hyperlink>
+          <w:r>
+            <w:rPr/>
+            <w:t>The conception of the mount</w:t>
+            <w:tab/>
+            <w:t>8</w:t>
+          </w:r>
         </w:p>
         <w:p>
           <w:pPr>
@@ -646,16 +626,12 @@
             </w:tabs>
             <w:rPr/>
           </w:pPr>
-          <w:hyperlink w:anchor="__RefHeading___Toc1099_1709072779" w:tooltip="The purpose of the mount">
-            <w:r>
-              <w:rPr>
-                <w:rStyle w:val="IndexLink"/>
-              </w:rPr>
-              <w:t>The purpose of the mount</w:t>
-              <w:tab/>
-              <w:t>9</w:t>
-            </w:r>
-          </w:hyperlink>
+          <w:r>
+            <w:rPr/>
+            <w:t>The purpose of the mount</w:t>
+            <w:tab/>
+            <w:t>9</w:t>
+          </w:r>
         </w:p>
         <w:p>
           <w:pPr>
@@ -666,16 +642,12 @@
             </w:tabs>
             <w:rPr/>
           </w:pPr>
-          <w:hyperlink w:anchor="__RefHeading___Toc18297_68767826" w:tooltip="The creation of the mount">
-            <w:r>
-              <w:rPr>
-                <w:rStyle w:val="IndexLink"/>
-              </w:rPr>
-              <w:t>The creation of the mount</w:t>
-              <w:tab/>
-              <w:t>10</w:t>
-            </w:r>
-          </w:hyperlink>
+          <w:r>
+            <w:rPr/>
+            <w:t>The creation of the mount</w:t>
+            <w:tab/>
+            <w:t>10</w:t>
+          </w:r>
         </w:p>
         <w:p>
           <w:pPr>
@@ -686,16 +658,12 @@
             </w:tabs>
             <w:rPr/>
           </w:pPr>
-          <w:hyperlink w:anchor="__RefHeading___Toc5632_2187837281" w:tooltip="Photography of the mount">
-            <w:r>
-              <w:rPr>
-                <w:rStyle w:val="IndexLink"/>
-              </w:rPr>
-              <w:t>Photography of the mount</w:t>
-              <w:tab/>
-              <w:t>13</w:t>
-            </w:r>
-          </w:hyperlink>
+          <w:r>
+            <w:rPr/>
+            <w:t>Photography of the mount</w:t>
+            <w:tab/>
+            <w:t>13</w:t>
+          </w:r>
         </w:p>
         <w:p>
           <w:pPr>
@@ -706,16 +674,12 @@
             </w:tabs>
             <w:rPr/>
           </w:pPr>
-          <w:hyperlink w:anchor="__RefHeading___Toc5356_68767826" w:tooltip="The composition of the mount">
-            <w:r>
-              <w:rPr>
-                <w:rStyle w:val="IndexLink"/>
-              </w:rPr>
-              <w:t>The composition of the mount</w:t>
-              <w:tab/>
-              <w:t>13</w:t>
-            </w:r>
-          </w:hyperlink>
+          <w:r>
+            <w:rPr/>
+            <w:t>The composition of the mount</w:t>
+            <w:tab/>
+            <w:t>13</w:t>
+          </w:r>
         </w:p>
         <w:p>
           <w:pPr>
@@ -726,16 +690,12 @@
             </w:tabs>
             <w:rPr/>
           </w:pPr>
-          <w:hyperlink w:anchor="__RefHeading___Toc16585_68767826" w:tooltip="Overview">
-            <w:r>
-              <w:rPr>
-                <w:rStyle w:val="IndexLink"/>
-              </w:rPr>
-              <w:t>Overview</w:t>
-              <w:tab/>
-              <w:t>13</w:t>
-            </w:r>
-          </w:hyperlink>
+          <w:r>
+            <w:rPr/>
+            <w:t>Overview</w:t>
+            <w:tab/>
+            <w:t>13</w:t>
+          </w:r>
         </w:p>
         <w:p>
           <w:pPr>
@@ -746,24 +706,19 @@
             </w:tabs>
             <w:rPr/>
           </w:pPr>
-          <w:hyperlink w:anchor="__RefHeading___Toc4995_537823704" w:tooltip="Barosaurus material in the mount">
-            <w:r>
-              <w:rPr>
-                <w:rStyle w:val="IndexLink"/>
-                <w:i/>
-                <w:iCs/>
-              </w:rPr>
-              <w:t>Barosaurus</w:t>
-            </w:r>
-            <w:r>
-              <w:rPr>
-                <w:rStyle w:val="IndexLink"/>
-              </w:rPr>
-              <w:t xml:space="preserve"> material in the mount</w:t>
-              <w:tab/>
-              <w:t>14</w:t>
-            </w:r>
-          </w:hyperlink>
+          <w:r>
+            <w:rPr>
+              <w:i/>
+              <w:iCs/>
+            </w:rPr>
+            <w:t>Barosaurus</w:t>
+          </w:r>
+          <w:r>
+            <w:rPr/>
+            <w:t xml:space="preserve"> material in the mount</w:t>
+            <w:tab/>
+            <w:t>14</w:t>
+          </w:r>
         </w:p>
         <w:p>
           <w:pPr>
@@ -774,30 +729,23 @@
             </w:tabs>
             <w:rPr/>
           </w:pPr>
-          <w:hyperlink w:anchor="__RefHeading___Toc25854_1820571732" w:tooltip="Non-Barosaurus material in the mount">
-            <w:r>
-              <w:rPr>
-                <w:rStyle w:val="IndexLink"/>
-              </w:rPr>
-              <w:t>Non-</w:t>
-            </w:r>
-            <w:r>
-              <w:rPr>
-                <w:rStyle w:val="IndexLink"/>
-                <w:i/>
-                <w:iCs/>
-              </w:rPr>
-              <w:t>Barosaurus</w:t>
-            </w:r>
-            <w:r>
-              <w:rPr>
-                <w:rStyle w:val="IndexLink"/>
-              </w:rPr>
-              <w:t xml:space="preserve"> material in the mount</w:t>
-              <w:tab/>
-              <w:t>15</w:t>
-            </w:r>
-          </w:hyperlink>
+          <w:r>
+            <w:rPr/>
+            <w:t>Non-</w:t>
+          </w:r>
+          <w:r>
+            <w:rPr>
+              <w:i/>
+              <w:iCs/>
+            </w:rPr>
+            <w:t>Barosaurus</w:t>
+          </w:r>
+          <w:r>
+            <w:rPr/>
+            <w:t xml:space="preserve"> material in the mount</w:t>
+            <w:tab/>
+            <w:t>15</w:t>
+          </w:r>
         </w:p>
         <w:p>
           <w:pPr>
@@ -808,16 +756,12 @@
             </w:tabs>
             <w:rPr/>
           </w:pPr>
-          <w:hyperlink w:anchor="__RefHeading___Toc16587_68767826" w:tooltip="Skull">
-            <w:r>
-              <w:rPr>
-                <w:rStyle w:val="IndexLink"/>
-              </w:rPr>
-              <w:t>Skull</w:t>
-              <w:tab/>
-              <w:t>16</w:t>
-            </w:r>
-          </w:hyperlink>
+          <w:r>
+            <w:rPr/>
+            <w:t>Skull</w:t>
+            <w:tab/>
+            <w:t>16</w:t>
+          </w:r>
         </w:p>
         <w:p>
           <w:pPr>
@@ -828,16 +772,12 @@
             </w:tabs>
             <w:rPr/>
           </w:pPr>
-          <w:hyperlink w:anchor="__RefHeading___Toc16589_68767826" w:tooltip="Neck">
-            <w:r>
-              <w:rPr>
-                <w:rStyle w:val="IndexLink"/>
-              </w:rPr>
-              <w:t>Neck</w:t>
-              <w:tab/>
-              <w:t>16</w:t>
-            </w:r>
-          </w:hyperlink>
+          <w:r>
+            <w:rPr/>
+            <w:t>Neck</w:t>
+            <w:tab/>
+            <w:t>16</w:t>
+          </w:r>
         </w:p>
         <w:p>
           <w:pPr>
@@ -848,16 +788,12 @@
             </w:tabs>
             <w:rPr/>
           </w:pPr>
-          <w:hyperlink w:anchor="__RefHeading___Toc2466_2187837281" w:tooltip="Torso, sacrum and tail">
-            <w:r>
-              <w:rPr>
-                <w:rStyle w:val="IndexLink"/>
-              </w:rPr>
-              <w:t>Torso, sacrum and tail</w:t>
-              <w:tab/>
-              <w:t>17</w:t>
-            </w:r>
-          </w:hyperlink>
+          <w:r>
+            <w:rPr/>
+            <w:t>Torso, sacrum and tail</w:t>
+            <w:tab/>
+            <w:t>17</w:t>
+          </w:r>
         </w:p>
         <w:p>
           <w:pPr>
@@ -868,16 +804,12 @@
             </w:tabs>
             <w:rPr/>
           </w:pPr>
-          <w:hyperlink w:anchor="__RefHeading___Toc2470_2187837281" w:tooltip="Forelimbs and girdles">
-            <w:r>
-              <w:rPr>
-                <w:rStyle w:val="IndexLink"/>
-              </w:rPr>
-              <w:t>Forelimbs and girdles</w:t>
-              <w:tab/>
-              <w:t>17</w:t>
-            </w:r>
-          </w:hyperlink>
+          <w:r>
+            <w:rPr/>
+            <w:t>Forelimbs and girdles</w:t>
+            <w:tab/>
+            <w:t>17</w:t>
+          </w:r>
         </w:p>
         <w:p>
           <w:pPr>
@@ -888,16 +820,12 @@
             </w:tabs>
             <w:rPr/>
           </w:pPr>
-          <w:hyperlink w:anchor="__RefHeading___Toc25856_1820571732" w:tooltip="Hindlimbs and girdles">
-            <w:r>
-              <w:rPr>
-                <w:rStyle w:val="IndexLink"/>
-              </w:rPr>
-              <w:t>Hindlimbs and girdles</w:t>
-              <w:tab/>
-              <w:t>18</w:t>
-            </w:r>
-          </w:hyperlink>
+          <w:r>
+            <w:rPr/>
+            <w:t>Hindlimbs and girdles</w:t>
+            <w:tab/>
+            <w:t>18</w:t>
+          </w:r>
         </w:p>
         <w:p>
           <w:pPr>
@@ -908,16 +836,12 @@
             </w:tabs>
             <w:rPr/>
           </w:pPr>
-          <w:hyperlink w:anchor="__RefHeading___Toc3401_68767826" w:tooltip="Discussion">
-            <w:r>
-              <w:rPr>
-                <w:rStyle w:val="IndexLink"/>
-              </w:rPr>
-              <w:t>Discussion</w:t>
-              <w:tab/>
-              <w:t>18</w:t>
-            </w:r>
-          </w:hyperlink>
+          <w:r>
+            <w:rPr/>
+            <w:t>Discussion</w:t>
+            <w:tab/>
+            <w:t>18</w:t>
+          </w:r>
         </w:p>
         <w:p>
           <w:pPr>
@@ -928,16 +852,12 @@
             </w:tabs>
             <w:rPr/>
           </w:pPr>
-          <w:hyperlink w:anchor="__RefHeading___Toc21934_68767826" w:tooltip="Size of the AMNH 6341 animal">
-            <w:r>
-              <w:rPr>
-                <w:rStyle w:val="IndexLink"/>
-              </w:rPr>
-              <w:t>Size of the AMNH 6341 animal</w:t>
-              <w:tab/>
-              <w:t>18</w:t>
-            </w:r>
-          </w:hyperlink>
+          <w:r>
+            <w:rPr/>
+            <w:t>Size of the AMNH 6341 animal</w:t>
+            <w:tab/>
+            <w:t>18</w:t>
+          </w:r>
         </w:p>
         <w:p>
           <w:pPr>
@@ -948,16 +868,12 @@
             </w:tabs>
             <w:rPr/>
           </w:pPr>
-          <w:hyperlink w:anchor="__RefHeading___Toc7947_4188845286" w:tooltip="Rearing pose">
-            <w:r>
-              <w:rPr>
-                <w:rStyle w:val="IndexLink"/>
-              </w:rPr>
-              <w:t>Rearing pose</w:t>
-              <w:tab/>
-              <w:t>19</w:t>
-            </w:r>
-          </w:hyperlink>
+          <w:r>
+            <w:rPr/>
+            <w:t>Rearing pose</w:t>
+            <w:tab/>
+            <w:t>19</w:t>
+          </w:r>
         </w:p>
         <w:p>
           <w:pPr>
@@ -968,16 +884,12 @@
             </w:tabs>
             <w:rPr/>
           </w:pPr>
-          <w:hyperlink w:anchor="__RefHeading___Toc3786_1986291683" w:tooltip="A short history of rearing sauropods">
-            <w:r>
-              <w:rPr>
-                <w:rStyle w:val="IndexLink"/>
-              </w:rPr>
-              <w:t>A short history of rearing sauropods</w:t>
-              <w:tab/>
-              <w:t>20</w:t>
-            </w:r>
-          </w:hyperlink>
+          <w:r>
+            <w:rPr/>
+            <w:t>A short history of rearing sauropods</w:t>
+            <w:tab/>
+            <w:t>20</w:t>
+          </w:r>
         </w:p>
         <w:p>
           <w:pPr>
@@ -988,16 +900,12 @@
             </w:tabs>
             <w:rPr/>
           </w:pPr>
-          <w:hyperlink w:anchor="__RefHeading___Toc11689_675290491" w:tooltip="Cultural impact">
-            <w:r>
-              <w:rPr>
-                <w:rStyle w:val="IndexLink"/>
-              </w:rPr>
-              <w:t>Cultural impact</w:t>
-              <w:tab/>
-              <w:t>22</w:t>
-            </w:r>
-          </w:hyperlink>
+          <w:r>
+            <w:rPr/>
+            <w:t>Cultural impact</w:t>
+            <w:tab/>
+            <w:t>22</w:t>
+          </w:r>
         </w:p>
         <w:p>
           <w:pPr>
@@ -1008,16 +916,12 @@
             </w:tabs>
             <w:rPr/>
           </w:pPr>
-          <w:hyperlink w:anchor="__RefHeading___Toc8168_4188845286" w:tooltip="Conclusion">
-            <w:r>
-              <w:rPr>
-                <w:rStyle w:val="IndexLink"/>
-              </w:rPr>
-              <w:t>Conclusion</w:t>
-              <w:tab/>
-              <w:t>23</w:t>
-            </w:r>
-          </w:hyperlink>
+          <w:r>
+            <w:rPr/>
+            <w:t>Conclusion</w:t>
+            <w:tab/>
+            <w:t>23</w:t>
+          </w:r>
         </w:p>
         <w:p>
           <w:pPr>
@@ -1028,16 +932,12 @@
             </w:tabs>
             <w:rPr/>
           </w:pPr>
-          <w:hyperlink w:anchor="__RefHeading___Toc3403_68767826" w:tooltip="Acknowledgements">
-            <w:r>
-              <w:rPr>
-                <w:rStyle w:val="IndexLink"/>
-              </w:rPr>
-              <w:t>Acknowledgements</w:t>
-              <w:tab/>
-              <w:t>23</w:t>
-            </w:r>
-          </w:hyperlink>
+          <w:r>
+            <w:rPr/>
+            <w:t>Acknowledgements</w:t>
+            <w:tab/>
+            <w:t>23</w:t>
+          </w:r>
         </w:p>
         <w:p>
           <w:pPr>
@@ -1048,16 +948,12 @@
             </w:tabs>
             <w:rPr/>
           </w:pPr>
-          <w:hyperlink w:anchor="__RefHeading___Toc3405_68767826" w:tooltip="References">
-            <w:r>
-              <w:rPr>
-                <w:rStyle w:val="IndexLink"/>
-              </w:rPr>
-              <w:t>References</w:t>
-              <w:tab/>
-              <w:t>25</w:t>
-            </w:r>
-          </w:hyperlink>
+          <w:r>
+            <w:rPr/>
+            <w:t>References</w:t>
+            <w:tab/>
+            <w:t>25</w:t>
+          </w:r>
         </w:p>
         <w:p>
           <w:pPr>
@@ -1068,16 +964,12 @@
             </w:tabs>
             <w:rPr/>
           </w:pPr>
-          <w:hyperlink w:anchor="__RefHeading___Toc3407_68767826" w:tooltip="Figure Captions">
-            <w:r>
-              <w:rPr>
-                <w:rStyle w:val="IndexLink"/>
-              </w:rPr>
-              <w:t>Figure Captions</w:t>
-              <w:tab/>
-              <w:t>32</w:t>
-            </w:r>
-          </w:hyperlink>
+          <w:r>
+            <w:rPr/>
+            <w:t>Figure Captions</w:t>
+            <w:tab/>
+            <w:t>32</w:t>
+          </w:r>
         </w:p>
         <w:p>
           <w:pPr>
@@ -1088,16 +980,12 @@
             </w:tabs>
             <w:rPr/>
           </w:pPr>
-          <w:hyperlink w:anchor="__RefHeading___Toc25858_1820571732" w:tooltip="Tables">
-            <w:r>
-              <w:rPr>
-                <w:rStyle w:val="IndexLink"/>
-              </w:rPr>
-              <w:t>Tables</w:t>
-              <w:tab/>
-              <w:t>36</w:t>
-            </w:r>
-          </w:hyperlink>
+          <w:r>
+            <w:rPr/>
+            <w:t>Tables</w:t>
+            <w:tab/>
+            <w:t>36</w:t>
+          </w:r>
         </w:p>
         <w:p>
           <w:pPr>
@@ -1108,20 +996,14 @@
             </w:tabs>
             <w:rPr/>
           </w:pPr>
-          <w:hyperlink w:anchor="__RefHeading___Toc25860_1820571732" w:tooltip="Table 1">
-            <w:r>
-              <w:rPr>
-                <w:rStyle w:val="IndexLink"/>
-              </w:rPr>
-              <w:t>Table 1</w:t>
-              <w:tab/>
-              <w:t>36</w:t>
-            </w:r>
-          </w:hyperlink>
           <w:r>
-            <w:rPr>
-              <w:rStyle w:val="IndexLink"/>
-            </w:rPr>
+            <w:rPr/>
+            <w:t>Table 1</w:t>
+            <w:tab/>
+            <w:t>36</w:t>
+          </w:r>
+          <w:r>
+            <w:rPr/>
             <w:fldChar w:fldCharType="end"/>
           </w:r>
         </w:p>
@@ -2214,27 +2096,7 @@
       </w:r>
       <w:r>
         <w:rPr/>
-        <w:t xml:space="preserve"> material at the USNM rather different than that which Gilmore (1923b:3) had specified when sending the fossils there. Where Gilmore had listed 13 cervicals, three dorsals, right scapula, humerus and radius and a sternal plate, Brown listed 10 cervicals, three anterior dorsals, left scapula and humerus. The left/right differences for the appendicular material are simply errors on Brown’s part (see below). The radius and sternal plate mentioned by Gilmore seem to have gone missing: they are not included in the material list below. </w:t>
-      </w:r>
-      <w:r>
-        <w:rPr/>
-        <w:t>T</w:t>
-      </w:r>
-      <w:r>
-        <w:rPr/>
-        <w:t xml:space="preserve">hey </w:t>
-      </w:r>
-      <w:r>
-        <w:rPr/>
-        <w:t xml:space="preserve">may </w:t>
-      </w:r>
-      <w:r>
-        <w:rPr/>
-        <w:t xml:space="preserve">still lurk unrecognised in the USNM collections. </w:t>
-      </w:r>
-      <w:r>
-        <w:rPr/>
-        <w:t>Matt Caranno (pers. comm., 2026) thinks it is possible they are in the oversized collection at the remote storage facility, but a detailed search would be laborious.</w:t>
+        <w:t xml:space="preserve"> material at the USNM rather different than that which Gilmore (1923b:3) had specified when sending the fossils there. Where Gilmore had listed 13 cervicals, three dorsals, right scapula, humerus and radius and a sternal plate, Brown listed 10 cervicals, three anterior dorsals, left scapula and humerus. The left/right differences for the appendicular material are simply errors on Brown’s part (see below). The radius and sternal plate mentioned by Gilmore seem to have gone missing: they are not included in the material list below. They may still lurk unrecognised in the USNM collections. Matt Caranno (pers. comm., 2026) thinks it is possible they are in the oversized collection at the remote storage facility, but a detailed search would be laborious.</w:t>
       </w:r>
     </w:p>
     <w:p>
@@ -2617,7 +2479,7 @@
     </w:p>
     <w:p>
       <w:pPr>
-        <w:pStyle w:val="BlockQuotationuser"/>
+        <w:pStyle w:val="BlockQuotation"/>
         <w:rPr/>
       </w:pPr>
       <w:r>
@@ -2719,11 +2581,7 @@
       </w:r>
       <w:r>
         <w:rPr/>
-        <w:t xml:space="preserve"> can mass well over 100 kg, and supporting them in the rearing pose would have required a prohibitively strong armature. Furthermore, permanently mounting these scientifically significant fossils 10 m above ground level, even if logistically feasible, would effectively make them unavailable for study. For these reasons, while the mounted skeletons in the main Fossil Halls of the AMNH are mostly real bone, the Roosevelt Memorial Hall display consists entirely of replicas. </w:t>
-      </w:r>
-      <w:r>
-        <w:rPr/>
-        <w:t xml:space="preserve">(The real presacral vertebrae are on display under the glass walkway behind the mounted </w:t>
+        <w:t xml:space="preserve"> can mass well over 100 kg, and supporting them in the rearing pose would have required a prohibitively strong armature. Furthermore, permanently mounting these scientifically significant fossils 10 m above ground level, even if logistically feasible, would effectively make them unavailable for study. For these reasons, while the mounted skeletons in the main Fossil Halls of the AMNH are mostly real bone, the Roosevelt Memorial Hall display consists entirely of replicas. (The real presacral vertebrae are on display under the glass walkway behind the mounted </w:t>
       </w:r>
       <w:r>
         <w:rPr>
@@ -3199,7 +3057,7 @@
     </w:p>
     <w:p>
       <w:pPr>
-        <w:pStyle w:val="BlockQuotationuser"/>
+        <w:pStyle w:val="BlockQuotation"/>
         <w:rPr/>
       </w:pPr>
       <w:r>
@@ -3970,11 +3828,7 @@
       </w:pPr>
       <w:r>
         <w:rPr/>
-        <w:t xml:space="preserve">However, photos of the mounting process in the AMNH (e.g. Figure 13) show that the neck section used in the mount had only 14 cervical vertebrae — C3–16, not counting the atlas and axis which were not in place at that time but which, when added, would bring the total to 16. The assembly process was complex. The neck section containing the head and C1–16 was welded to the torso leaving a stretch of bare armature. The two halves of the seventeenth vertebra (visible on the right side of Figure 13) were then glued together around the armature, bridging the gap between the bones of the neck section and the torso. The special 17th vertebra can be seen in Figure 11B, distinctly darker than the cervicals above it and the dorsals below. Since there are no duplicate vertebrae in the neck, the special C17 must have come from elsewhere. Careful comparisons </w:t>
-      </w:r>
-      <w:r>
-        <w:rPr/>
-        <w:t xml:space="preserve">between photographs of the 17th cervical and 3D models of the Carnegie </w:t>
+        <w:t xml:space="preserve">However, photos of the mounting process in the AMNH (e.g. Figure 13) show that the neck section used in the mount had only 14 cervical vertebrae — C3–16, not counting the atlas and axis which were not in place at that time but which, when added, would bring the total to 16. The assembly process was complex. The neck section containing the head and C1–16 was welded to the torso leaving a stretch of bare armature. The two halves of the seventeenth vertebra (visible on the right side of Figure 13) were then glued together around the armature, bridging the gap between the bones of the neck section and the torso. The special 17th vertebra can be seen in Figure 11B, distinctly darker than the cervicals above it and the dorsals below. Since there are no duplicate vertebrae in the neck, the special C17 must have come from elsewhere. Careful comparisons between photographs of the 17th cervical and 3D models of the Carnegie </w:t>
       </w:r>
       <w:r>
         <w:rPr>
@@ -4253,15 +4107,7 @@
       </w:r>
       <w:r>
         <w:rPr/>
-        <w:t xml:space="preserve"> paratype CM 94 (which also furnished these bones on the right side o</w:t>
-      </w:r>
-      <w:r>
-        <w:rPr/>
-        <w:t>f</w:t>
-      </w:r>
-      <w:r>
-        <w:rPr/>
-        <w:t xml:space="preserve"> both the original mounted </w:t>
+        <w:t xml:space="preserve"> paratype CM 94 (which also furnished these bones on the right side of both the original mounted </w:t>
       </w:r>
       <w:r>
         <w:rPr>
@@ -4386,11 +4232,7 @@
       </w:r>
       <w:r>
         <w:rPr/>
-        <w:t xml:space="preserve"> is usually given rather inexactly as “fifty feet above the Rotunda floor” (Norell et al. 1991:39), “almost fifty feet” (Dingus 1996:25), “five-storey-high” (Gordy 1991:3) or “over 50 feet (15 m) from ground to head-level” (Lindsay 1992:26). Although vague, these measurements are enough to establish it as the tallest mounted skeleton of any animal anywhere in the world, about two meters taller than the Berlin brachiosaur which has “a skull located more than 13 m above the level of the feet” (Remes et al. 2011:309). </w:t>
-      </w:r>
-      <w:r>
-        <w:rPr/>
-        <w:t>(The Berlin brachiosaur was also mounted by RCI — or rather, remounted in 2005–2007, following the original mounting in 1938 under the direction of Werner Janensch.)</w:t>
+        <w:t xml:space="preserve"> is usually given rather inexactly as “fifty feet above the Rotunda floor” (Norell et al. 1991:39), “almost fifty feet” (Dingus 1996:25), “five-storey-high” (Gordy 1991:3) or “over 50 feet (15 m) from ground to head-level” (Lindsay 1992:26). Although vague, these measurements are enough to establish it as the tallest mounted skeleton of any animal anywhere in the world, about two meters taller than the Berlin brachiosaur which has “a skull located more than 13 m above the level of the feet” (Remes et al. 2011:309). (The Berlin brachiosaur was also mounted by RCI — or rather, remounted in 2005–2007, following the original mounting in 1938 under the direction of Werner Janensch.)</w:t>
       </w:r>
     </w:p>
     <w:p>
@@ -4412,37 +4254,14 @@
       </w:r>
       <w:r>
         <w:rPr/>
-        <w:t xml:space="preserve"> </w:t>
-      </w:r>
-      <w:r>
-        <w:rPr/>
-        <w:t xml:space="preserve">AMNH 6341 </w:t>
-      </w:r>
-      <w:r>
-        <w:rPr/>
-        <w:t xml:space="preserve">is generally considered to be </w:t>
-      </w:r>
-      <w:r>
-        <w:rPr/>
-        <w:t>similar to</w:t>
-      </w:r>
-      <w:r>
-        <w:rPr/>
-        <w:t xml:space="preserve"> that of </w:t>
-      </w:r>
-      <w:r>
-        <w:rPr>
-          <w:i/>
-          <w:iCs/>
-        </w:rPr>
-        <w:t xml:space="preserve">Diplodocus </w:t>
-      </w:r>
-      <w:r>
-        <w:rPr>
-          <w:i/>
-          <w:iCs/>
-        </w:rPr>
-        <w:t>carnegii</w:t>
+        <w:t xml:space="preserve"> AMNH 6341 is generally considered to be similar to that of </w:t>
+      </w:r>
+      <w:r>
+        <w:rPr>
+          <w:i/>
+          <w:iCs/>
+        </w:rPr>
+        <w:t>Diplodocus carnegii</w:t>
       </w:r>
       <w:r>
         <w:rPr/>
@@ -4457,19 +4276,7 @@
       </w:r>
       <w:r>
         <w:rPr/>
-        <w:t xml:space="preserve">’s longer tail. Seebacher (2001) gave a </w:t>
-      </w:r>
-      <w:r>
-        <w:rPr/>
-        <w:t>mass</w:t>
-      </w:r>
-      <w:r>
-        <w:rPr/>
-        <w:t xml:space="preserve"> estimate of 20,040 kg based on graphic double integration (</w:t>
-      </w:r>
-      <w:r>
-        <w:rPr/>
-        <w:t xml:space="preserve">compared with 19,655 kg for </w:t>
+        <w:t xml:space="preserve">’s longer tail. Seebacher (2001) gave a mass estimate of 20,040 kg based on graphic double integration (compared with 19,655 kg for </w:t>
       </w:r>
       <w:r>
         <w:rPr>
@@ -4480,11 +4287,7 @@
       </w:r>
       <w:r>
         <w:rPr/>
-        <w:t xml:space="preserve">). Henderson (2013) estimated 15,800 kg by slicing a digital model </w:t>
-      </w:r>
-      <w:r>
-        <w:rPr/>
-        <w:t xml:space="preserve">(compared with 11,900 kg for </w:t>
+        <w:t xml:space="preserve">). Henderson (2013) estimated 15,800 kg by slicing a digital model (compared with 11,900 kg for </w:t>
       </w:r>
       <w:r>
         <w:rPr>
@@ -4495,31 +4298,7 @@
       </w:r>
       <w:r>
         <w:rPr/>
-        <w:t>)</w:t>
-      </w:r>
-      <w:r>
-        <w:rPr/>
-        <w:t xml:space="preserve">. Benson et al. (2014), in supplementary information </w:t>
-      </w:r>
-      <w:r>
-        <w:rPr/>
-        <w:t>S1</w:t>
-      </w:r>
-      <w:r>
-        <w:rPr/>
-        <w:t>, gave an estimate of 13,16</w:t>
-      </w:r>
-      <w:r>
-        <w:rPr/>
-        <w:t>4</w:t>
-      </w:r>
-      <w:r>
-        <w:rPr/>
-        <w:t xml:space="preserve"> kg for AMNH 6341 based on limb-bone measurements </w:t>
-      </w:r>
-      <w:r>
-        <w:rPr/>
-        <w:t xml:space="preserve">(compared with 13,801 kg for </w:t>
+        <w:t xml:space="preserve">). Benson et al. (2014), in supplementary information S1, gave an estimate of 13,164 kg for AMNH 6341 based on limb-bone measurements (compared with 13,801 kg for </w:t>
       </w:r>
       <w:r>
         <w:rPr>
@@ -4531,11 +4310,7 @@
       </w:r>
       <w:r>
         <w:rPr/>
-        <w:t>)</w:t>
-      </w:r>
-      <w:r>
-        <w:rPr/>
-        <w:t>.</w:t>
+        <w:t>).</w:t>
       </w:r>
     </w:p>
     <w:p>
@@ -5790,15 +5565,7 @@
       </w:pPr>
       <w:r>
         <w:rPr/>
-        <w:t xml:space="preserve">Mai Reitmeyer (Department of Library Services, AMNH) helped us to obtain historical photographs. Kiana Clark (AMNH Vertebrate Paleontology Archives), provided numerous historical documents and photographs. Abby Telfer (United States National Museum), provided helpful documents in establish the early history of the AMNH 6341 material. ReBecca Hunt-Forster (Dinosaur National Monument) provided an invaluable archive of correspondence relating to the early years of the quarry. Amelia Zietlow (Richard Gilder Graduate School at the AMNH) provided helpful photographs and information about the present public exhibits (Figure 8). We thank Ray Wilhite (Auburn University College of Veterinary Medicine) and Brooks Britt and Rod Scheetz (both Brigham Young University) for help in accessing the archived notebooks of John S. McIntosh. Matt Wedel helped with the interpretation and identification of some vertebrae, </w:t>
-      </w:r>
-      <w:r>
-        <w:rPr/>
-        <w:t>and provided valuable feedback on the manuscript</w:t>
-      </w:r>
-      <w:r>
-        <w:rPr/>
-        <w:t>.</w:t>
+        <w:t>Mai Reitmeyer (Department of Library Services, AMNH) helped us to obtain historical photographs. Kiana Clark (AMNH Vertebrate Paleontology Archives), provided numerous historical documents and photographs. Abby Telfer (United States National Museum), provided helpful documents in establish the early history of the AMNH 6341 material. ReBecca Hunt-Forster (Dinosaur National Monument) provided an invaluable archive of correspondence relating to the early years of the quarry. Amelia Zietlow (Richard Gilder Graduate School at the AMNH) provided helpful photographs and information about the present public exhibits (Figure 8). We thank Ray Wilhite (Auburn University College of Veterinary Medicine) and Brooks Britt and Rod Scheetz (both Brigham Young University) for help in accessing the archived notebooks of John S. McIntosh. Matt Wedel helped with the interpretation and identification of some vertebrae, and provided valuable feedback on the manuscript.</w:t>
       </w:r>
     </w:p>
     <w:p>
@@ -5819,19 +5586,7 @@
       </w:r>
       <w:r>
         <w:rPr/>
-        <w:t xml:space="preserve">. </w:t>
-      </w:r>
-      <w:r>
-        <w:rPr/>
-        <w:t xml:space="preserve">Carl Mehling (AMNH) searched collections for the missing C7 and concluded it was absent. Matt Caranno </w:t>
-      </w:r>
-      <w:r>
-        <w:rPr/>
-        <w:t xml:space="preserve">(USNM), </w:t>
-      </w:r>
-      <w:r>
-        <w:rPr/>
-        <w:t>Mick Ellison, Lynton Gardiner, Jack Horner (Chapman University), Carl Mehling, Gregory S. Paul. Paul Sereno (University of Chicago), Adam Smith (Nottingham Natural History Museum) and Abby Telfer (USNM) allowed us to cite personal communications.</w:t>
+        <w:t>. Carl Mehling (AMNH) searched collections for the missing C7 and concluded it was absent. Matt Caranno (USNM), Mick Ellison, Lynton Gardiner, Jack Horner (Chapman University), Carl Mehling, Gregory S. Paul. Paul Sereno (University of Chicago), Adam Smith (Nottingham Natural History Museum) and Abby Telfer (USNM) allowed us to cite personal communications.</w:t>
       </w:r>
       <w:r>
         <w:br w:type="page"/>
@@ -6971,63 +6726,7 @@
       </w:pPr>
       <w:r>
         <w:rPr/>
-        <w:t>Henderson, D</w:t>
-      </w:r>
-      <w:r>
-        <w:rPr/>
-        <w:t xml:space="preserve">onald </w:t>
-      </w:r>
-      <w:r>
-        <w:rPr/>
-        <w:t xml:space="preserve">M. 2013. Sauropod </w:t>
-      </w:r>
-      <w:r>
-        <w:rPr/>
-        <w:t>n</w:t>
-      </w:r>
-      <w:r>
-        <w:rPr/>
-        <w:t xml:space="preserve">ecks: </w:t>
-      </w:r>
-      <w:r>
-        <w:rPr/>
-        <w:t>a</w:t>
-      </w:r>
-      <w:r>
-        <w:rPr/>
-        <w:t xml:space="preserve">re </w:t>
-      </w:r>
-      <w:r>
-        <w:rPr/>
-        <w:t>t</w:t>
-      </w:r>
-      <w:r>
-        <w:rPr/>
-        <w:t xml:space="preserve">hey </w:t>
-      </w:r>
-      <w:r>
-        <w:rPr/>
-        <w:t>r</w:t>
-      </w:r>
-      <w:r>
-        <w:rPr/>
-        <w:t xml:space="preserve">eally for </w:t>
-      </w:r>
-      <w:r>
-        <w:rPr/>
-        <w:t>h</w:t>
-      </w:r>
-      <w:r>
-        <w:rPr/>
-        <w:t xml:space="preserve">eat </w:t>
-      </w:r>
-      <w:r>
-        <w:rPr/>
-        <w:t>l</w:t>
-      </w:r>
-      <w:r>
-        <w:rPr/>
-        <w:t xml:space="preserve">oss? </w:t>
+        <w:t xml:space="preserve">Henderson, Donald M. 2013. Sauropod necks: are they really for heat loss? </w:t>
       </w:r>
       <w:r>
         <w:rPr>
@@ -7049,15 +6748,7 @@
       </w:r>
       <w:r>
         <w:rPr/>
-        <w:t xml:space="preserve">: e77108. </w:t>
-      </w:r>
-      <w:r>
-        <w:rPr/>
-        <w:t>d</w:t>
-      </w:r>
-      <w:r>
-        <w:rPr/>
-        <w:t>oi:10.1371/journal.pone.0077108</w:t>
+        <w:t>: e77108. doi:10.1371/journal.pone.0077108</w:t>
       </w:r>
     </w:p>
     <w:p>
@@ -9165,7 +8856,7 @@
     </w:p>
     <w:p>
       <w:pPr>
-        <w:pStyle w:val="BlockQuotationuser"/>
+        <w:pStyle w:val="BlockQuotation"/>
         <w:rPr/>
       </w:pPr>
       <w:r>
@@ -9196,7 +8887,7 @@
     <w:p>
       <w:pPr>
         <w:pStyle w:val="FigureCaption"/>
-        <w:ind w:hanging="0" w:start="283"/>
+        <w:ind w:hanging="0" w:left="283"/>
         <w:rPr/>
       </w:pPr>
       <w:r>
@@ -9873,14 +9564,14 @@
     <w:tbl>
       <w:tblPr>
         <w:tblW w:w="5000" w:type="pct"/>
-        <w:jc w:val="start"/>
+        <w:jc w:val="left"/>
         <w:tblInd w:w="0" w:type="dxa"/>
         <w:tblLayout w:type="fixed"/>
         <w:tblCellMar>
           <w:top w:w="0" w:type="dxa"/>
-          <w:start w:w="0" w:type="dxa"/>
+          <w:left w:w="0" w:type="dxa"/>
           <w:bottom w:w="0" w:type="dxa"/>
-          <w:end w:w="0" w:type="dxa"/>
+          <w:right w:w="0" w:type="dxa"/>
         </w:tblCellMar>
         <w:tblLook w:val="04a0" w:noVBand="1" w:noHBand="0" w:lastColumn="0" w:firstColumn="1" w:lastRow="0" w:firstRow="1"/>
       </w:tblPr>
@@ -11914,12 +11605,12 @@
       <w:numFmt w:val="none"/>
       <w:suff w:val="nothing"/>
       <w:lvlText w:val=""/>
-      <w:lvlJc w:val="start"/>
+      <w:lvlJc w:val="left"/>
       <w:pPr>
         <w:tabs>
           <w:tab w:val="num" w:pos="0"/>
         </w:tabs>
-        <w:ind w:start="0" w:hanging="0"/>
+        <w:ind w:left="0" w:hanging="0"/>
       </w:pPr>
       <w:rPr/>
     </w:lvl>
@@ -11928,12 +11619,12 @@
       <w:numFmt w:val="none"/>
       <w:suff w:val="nothing"/>
       <w:lvlText w:val=""/>
-      <w:lvlJc w:val="start"/>
+      <w:lvlJc w:val="left"/>
       <w:pPr>
         <w:tabs>
           <w:tab w:val="num" w:pos="0"/>
         </w:tabs>
-        <w:ind w:start="0" w:hanging="0"/>
+        <w:ind w:left="0" w:hanging="0"/>
       </w:pPr>
       <w:rPr/>
     </w:lvl>
@@ -11942,12 +11633,12 @@
       <w:numFmt w:val="none"/>
       <w:suff w:val="nothing"/>
       <w:lvlText w:val=""/>
-      <w:lvlJc w:val="start"/>
+      <w:lvlJc w:val="left"/>
       <w:pPr>
         <w:tabs>
           <w:tab w:val="num" w:pos="0"/>
         </w:tabs>
-        <w:ind w:start="0" w:hanging="0"/>
+        <w:ind w:left="0" w:hanging="0"/>
       </w:pPr>
       <w:rPr/>
     </w:lvl>
@@ -11956,12 +11647,12 @@
       <w:numFmt w:val="none"/>
       <w:suff w:val="nothing"/>
       <w:lvlText w:val=""/>
-      <w:lvlJc w:val="start"/>
+      <w:lvlJc w:val="left"/>
       <w:pPr>
         <w:tabs>
           <w:tab w:val="num" w:pos="0"/>
         </w:tabs>
-        <w:ind w:start="0" w:hanging="0"/>
+        <w:ind w:left="0" w:hanging="0"/>
       </w:pPr>
       <w:rPr/>
     </w:lvl>
@@ -11970,12 +11661,12 @@
       <w:numFmt w:val="none"/>
       <w:suff w:val="nothing"/>
       <w:lvlText w:val=""/>
-      <w:lvlJc w:val="start"/>
+      <w:lvlJc w:val="left"/>
       <w:pPr>
         <w:tabs>
           <w:tab w:val="num" w:pos="0"/>
         </w:tabs>
-        <w:ind w:start="0" w:hanging="0"/>
+        <w:ind w:left="0" w:hanging="0"/>
       </w:pPr>
       <w:rPr/>
     </w:lvl>
@@ -11984,12 +11675,12 @@
       <w:numFmt w:val="none"/>
       <w:suff w:val="nothing"/>
       <w:lvlText w:val=""/>
-      <w:lvlJc w:val="start"/>
+      <w:lvlJc w:val="left"/>
       <w:pPr>
         <w:tabs>
           <w:tab w:val="num" w:pos="0"/>
         </w:tabs>
-        <w:ind w:start="0" w:hanging="0"/>
+        <w:ind w:left="0" w:hanging="0"/>
       </w:pPr>
       <w:rPr/>
     </w:lvl>
@@ -11998,12 +11689,12 @@
       <w:numFmt w:val="none"/>
       <w:suff w:val="nothing"/>
       <w:lvlText w:val=""/>
-      <w:lvlJc w:val="start"/>
+      <w:lvlJc w:val="left"/>
       <w:pPr>
         <w:tabs>
           <w:tab w:val="num" w:pos="0"/>
         </w:tabs>
-        <w:ind w:start="0" w:hanging="0"/>
+        <w:ind w:left="0" w:hanging="0"/>
       </w:pPr>
       <w:rPr/>
     </w:lvl>
@@ -12012,12 +11703,12 @@
       <w:numFmt w:val="none"/>
       <w:suff w:val="nothing"/>
       <w:lvlText w:val=""/>
-      <w:lvlJc w:val="start"/>
+      <w:lvlJc w:val="left"/>
       <w:pPr>
         <w:tabs>
           <w:tab w:val="num" w:pos="0"/>
         </w:tabs>
-        <w:ind w:start="0" w:hanging="0"/>
+        <w:ind w:left="0" w:hanging="0"/>
       </w:pPr>
       <w:rPr/>
     </w:lvl>
@@ -12026,12 +11717,12 @@
       <w:numFmt w:val="none"/>
       <w:suff w:val="nothing"/>
       <w:lvlText w:val=""/>
-      <w:lvlJc w:val="start"/>
+      <w:lvlJc w:val="left"/>
       <w:pPr>
         <w:tabs>
           <w:tab w:val="num" w:pos="0"/>
         </w:tabs>
-        <w:ind w:start="0" w:hanging="0"/>
+        <w:ind w:left="0" w:hanging="0"/>
       </w:pPr>
       <w:rPr/>
     </w:lvl>
@@ -12042,12 +11733,12 @@
       <w:numFmt w:val="none"/>
       <w:suff w:val="nothing"/>
       <w:lvlText w:val=""/>
-      <w:lvlJc w:val="start"/>
+      <w:lvlJc w:val="left"/>
       <w:pPr>
         <w:tabs>
           <w:tab w:val="num" w:pos="0"/>
         </w:tabs>
-        <w:ind w:start="0" w:hanging="0"/>
+        <w:ind w:left="0" w:hanging="0"/>
       </w:pPr>
       <w:rPr/>
     </w:lvl>
@@ -12056,12 +11747,12 @@
       <w:numFmt w:val="none"/>
       <w:suff w:val="nothing"/>
       <w:lvlText w:val=""/>
-      <w:lvlJc w:val="start"/>
+      <w:lvlJc w:val="left"/>
       <w:pPr>
         <w:tabs>
           <w:tab w:val="num" w:pos="0"/>
         </w:tabs>
-        <w:ind w:start="0" w:hanging="0"/>
+        <w:ind w:left="0" w:hanging="0"/>
       </w:pPr>
       <w:rPr/>
     </w:lvl>
@@ -12070,12 +11761,12 @@
       <w:numFmt w:val="none"/>
       <w:suff w:val="nothing"/>
       <w:lvlText w:val=""/>
-      <w:lvlJc w:val="start"/>
+      <w:lvlJc w:val="left"/>
       <w:pPr>
         <w:tabs>
           <w:tab w:val="num" w:pos="0"/>
         </w:tabs>
-        <w:ind w:start="0" w:hanging="0"/>
+        <w:ind w:left="0" w:hanging="0"/>
       </w:pPr>
       <w:rPr/>
     </w:lvl>
@@ -12084,12 +11775,12 @@
       <w:numFmt w:val="none"/>
       <w:suff w:val="nothing"/>
       <w:lvlText w:val=""/>
-      <w:lvlJc w:val="start"/>
+      <w:lvlJc w:val="left"/>
       <w:pPr>
         <w:tabs>
           <w:tab w:val="num" w:pos="0"/>
         </w:tabs>
-        <w:ind w:start="0" w:hanging="0"/>
+        <w:ind w:left="0" w:hanging="0"/>
       </w:pPr>
       <w:rPr/>
     </w:lvl>
@@ -12098,12 +11789,12 @@
       <w:numFmt w:val="none"/>
       <w:suff w:val="nothing"/>
       <w:lvlText w:val=""/>
-      <w:lvlJc w:val="start"/>
+      <w:lvlJc w:val="left"/>
       <w:pPr>
         <w:tabs>
           <w:tab w:val="num" w:pos="0"/>
         </w:tabs>
-        <w:ind w:start="0" w:hanging="0"/>
+        <w:ind w:left="0" w:hanging="0"/>
       </w:pPr>
       <w:rPr/>
     </w:lvl>
@@ -12112,12 +11803,12 @@
       <w:numFmt w:val="none"/>
       <w:suff w:val="nothing"/>
       <w:lvlText w:val=""/>
-      <w:lvlJc w:val="start"/>
+      <w:lvlJc w:val="left"/>
       <w:pPr>
         <w:tabs>
           <w:tab w:val="num" w:pos="0"/>
         </w:tabs>
-        <w:ind w:start="0" w:hanging="0"/>
+        <w:ind w:left="0" w:hanging="0"/>
       </w:pPr>
       <w:rPr/>
     </w:lvl>
@@ -12126,12 +11817,12 @@
       <w:numFmt w:val="none"/>
       <w:suff w:val="nothing"/>
       <w:lvlText w:val=""/>
-      <w:lvlJc w:val="start"/>
+      <w:lvlJc w:val="left"/>
       <w:pPr>
         <w:tabs>
           <w:tab w:val="num" w:pos="0"/>
         </w:tabs>
-        <w:ind w:start="0" w:hanging="0"/>
+        <w:ind w:left="0" w:hanging="0"/>
       </w:pPr>
       <w:rPr/>
     </w:lvl>
@@ -12140,12 +11831,12 @@
       <w:numFmt w:val="none"/>
       <w:suff w:val="nothing"/>
       <w:lvlText w:val=""/>
-      <w:lvlJc w:val="start"/>
+      <w:lvlJc w:val="left"/>
       <w:pPr>
         <w:tabs>
           <w:tab w:val="num" w:pos="0"/>
         </w:tabs>
-        <w:ind w:start="0" w:hanging="0"/>
+        <w:ind w:left="0" w:hanging="0"/>
       </w:pPr>
       <w:rPr/>
     </w:lvl>
@@ -12154,12 +11845,12 @@
       <w:numFmt w:val="none"/>
       <w:suff w:val="nothing"/>
       <w:lvlText w:val=""/>
-      <w:lvlJc w:val="start"/>
+      <w:lvlJc w:val="left"/>
       <w:pPr>
         <w:tabs>
           <w:tab w:val="num" w:pos="0"/>
         </w:tabs>
-        <w:ind w:start="0" w:hanging="0"/>
+        <w:ind w:left="0" w:hanging="0"/>
       </w:pPr>
       <w:rPr/>
     </w:lvl>
@@ -12170,12 +11861,12 @@
       <w:numFmt w:val="none"/>
       <w:suff w:val="nothing"/>
       <w:lvlText w:val=""/>
-      <w:lvlJc w:val="start"/>
+      <w:lvlJc w:val="left"/>
       <w:pPr>
         <w:tabs>
           <w:tab w:val="num" w:pos="0"/>
         </w:tabs>
-        <w:ind w:start="0" w:hanging="0"/>
+        <w:ind w:left="0" w:hanging="0"/>
       </w:pPr>
       <w:rPr/>
     </w:lvl>
@@ -12184,12 +11875,12 @@
       <w:numFmt w:val="none"/>
       <w:suff w:val="nothing"/>
       <w:lvlText w:val=""/>
-      <w:lvlJc w:val="start"/>
+      <w:lvlJc w:val="left"/>
       <w:pPr>
         <w:tabs>
           <w:tab w:val="num" w:pos="0"/>
         </w:tabs>
-        <w:ind w:start="0" w:hanging="0"/>
+        <w:ind w:left="0" w:hanging="0"/>
       </w:pPr>
       <w:rPr/>
     </w:lvl>
@@ -12198,12 +11889,12 @@
       <w:numFmt w:val="none"/>
       <w:suff w:val="nothing"/>
       <w:lvlText w:val=""/>
-      <w:lvlJc w:val="start"/>
+      <w:lvlJc w:val="left"/>
       <w:pPr>
         <w:tabs>
           <w:tab w:val="num" w:pos="0"/>
         </w:tabs>
-        <w:ind w:start="0" w:hanging="0"/>
+        <w:ind w:left="0" w:hanging="0"/>
       </w:pPr>
       <w:rPr/>
     </w:lvl>
@@ -12212,12 +11903,12 @@
       <w:numFmt w:val="none"/>
       <w:suff w:val="nothing"/>
       <w:lvlText w:val=""/>
-      <w:lvlJc w:val="start"/>
+      <w:lvlJc w:val="left"/>
       <w:pPr>
         <w:tabs>
           <w:tab w:val="num" w:pos="0"/>
         </w:tabs>
-        <w:ind w:start="0" w:hanging="0"/>
+        <w:ind w:left="0" w:hanging="0"/>
       </w:pPr>
       <w:rPr/>
     </w:lvl>
@@ -12226,12 +11917,12 @@
       <w:numFmt w:val="none"/>
       <w:suff w:val="nothing"/>
       <w:lvlText w:val=""/>
-      <w:lvlJc w:val="start"/>
+      <w:lvlJc w:val="left"/>
       <w:pPr>
         <w:tabs>
           <w:tab w:val="num" w:pos="0"/>
         </w:tabs>
-        <w:ind w:start="0" w:hanging="0"/>
+        <w:ind w:left="0" w:hanging="0"/>
       </w:pPr>
       <w:rPr/>
     </w:lvl>
@@ -12240,12 +11931,12 @@
       <w:numFmt w:val="none"/>
       <w:suff w:val="nothing"/>
       <w:lvlText w:val=""/>
-      <w:lvlJc w:val="start"/>
+      <w:lvlJc w:val="left"/>
       <w:pPr>
         <w:tabs>
           <w:tab w:val="num" w:pos="0"/>
         </w:tabs>
-        <w:ind w:start="0" w:hanging="0"/>
+        <w:ind w:left="0" w:hanging="0"/>
       </w:pPr>
       <w:rPr/>
     </w:lvl>
@@ -12254,12 +11945,12 @@
       <w:numFmt w:val="none"/>
       <w:suff w:val="nothing"/>
       <w:lvlText w:val=""/>
-      <w:lvlJc w:val="start"/>
+      <w:lvlJc w:val="left"/>
       <w:pPr>
         <w:tabs>
           <w:tab w:val="num" w:pos="0"/>
         </w:tabs>
-        <w:ind w:start="0" w:hanging="0"/>
+        <w:ind w:left="0" w:hanging="0"/>
       </w:pPr>
       <w:rPr/>
     </w:lvl>
@@ -12268,12 +11959,12 @@
       <w:numFmt w:val="none"/>
       <w:suff w:val="nothing"/>
       <w:lvlText w:val=""/>
-      <w:lvlJc w:val="start"/>
+      <w:lvlJc w:val="left"/>
       <w:pPr>
         <w:tabs>
           <w:tab w:val="num" w:pos="0"/>
         </w:tabs>
-        <w:ind w:start="0" w:hanging="0"/>
+        <w:ind w:left="0" w:hanging="0"/>
       </w:pPr>
       <w:rPr/>
     </w:lvl>
@@ -12282,12 +11973,12 @@
       <w:numFmt w:val="none"/>
       <w:suff w:val="nothing"/>
       <w:lvlText w:val=""/>
-      <w:lvlJc w:val="start"/>
+      <w:lvlJc w:val="left"/>
       <w:pPr>
         <w:tabs>
           <w:tab w:val="num" w:pos="0"/>
         </w:tabs>
-        <w:ind w:start="0" w:hanging="0"/>
+        <w:ind w:left="0" w:hanging="0"/>
       </w:pPr>
       <w:rPr/>
     </w:lvl>
@@ -12297,12 +11988,12 @@
       <w:start w:val="1"/>
       <w:numFmt w:val="bullet"/>
       <w:lvlText w:val=""/>
-      <w:lvlJc w:val="start"/>
+      <w:lvlJc w:val="left"/>
       <w:pPr>
         <w:tabs>
           <w:tab w:val="num" w:pos="720"/>
         </w:tabs>
-        <w:ind w:start="720" w:hanging="360"/>
+        <w:ind w:left="720" w:hanging="360"/>
       </w:pPr>
       <w:rPr>
         <w:rFonts w:ascii="Symbol" w:hAnsi="Symbol" w:cs="Symbol" w:hint="default"/>
@@ -12312,12 +12003,12 @@
       <w:start w:val="1"/>
       <w:numFmt w:val="bullet"/>
       <w:lvlText w:val="◦"/>
-      <w:lvlJc w:val="start"/>
+      <w:lvlJc w:val="left"/>
       <w:pPr>
         <w:tabs>
           <w:tab w:val="num" w:pos="1080"/>
         </w:tabs>
-        <w:ind w:start="1080" w:hanging="360"/>
+        <w:ind w:left="1080" w:hanging="360"/>
       </w:pPr>
       <w:rPr>
         <w:rFonts w:ascii="OpenSymbol" w:hAnsi="OpenSymbol" w:cs="OpenSymbol" w:hint="default"/>
@@ -12327,12 +12018,12 @@
       <w:start w:val="1"/>
       <w:numFmt w:val="bullet"/>
       <w:lvlText w:val="▪"/>
-      <w:lvlJc w:val="start"/>
+      <w:lvlJc w:val="left"/>
       <w:pPr>
         <w:tabs>
           <w:tab w:val="num" w:pos="1440"/>
         </w:tabs>
-        <w:ind w:start="1440" w:hanging="360"/>
+        <w:ind w:left="1440" w:hanging="360"/>
       </w:pPr>
       <w:rPr>
         <w:rFonts w:ascii="OpenSymbol" w:hAnsi="OpenSymbol" w:cs="OpenSymbol" w:hint="default"/>
@@ -12342,12 +12033,12 @@
       <w:start w:val="1"/>
       <w:numFmt w:val="bullet"/>
       <w:lvlText w:val=""/>
-      <w:lvlJc w:val="start"/>
+      <w:lvlJc w:val="left"/>
       <w:pPr>
         <w:tabs>
           <w:tab w:val="num" w:pos="1800"/>
         </w:tabs>
-        <w:ind w:start="1800" w:hanging="360"/>
+        <w:ind w:left="1800" w:hanging="360"/>
       </w:pPr>
       <w:rPr>
         <w:rFonts w:ascii="Symbol" w:hAnsi="Symbol" w:cs="Symbol" w:hint="default"/>
@@ -12357,12 +12048,12 @@
       <w:start w:val="1"/>
       <w:numFmt w:val="bullet"/>
       <w:lvlText w:val="◦"/>
-      <w:lvlJc w:val="start"/>
+      <w:lvlJc w:val="left"/>
       <w:pPr>
         <w:tabs>
           <w:tab w:val="num" w:pos="2160"/>
         </w:tabs>
-        <w:ind w:start="2160" w:hanging="360"/>
+        <w:ind w:left="2160" w:hanging="360"/>
       </w:pPr>
       <w:rPr>
         <w:rFonts w:ascii="OpenSymbol" w:hAnsi="OpenSymbol" w:cs="OpenSymbol" w:hint="default"/>
@@ -12372,12 +12063,12 @@
       <w:start w:val="1"/>
       <w:numFmt w:val="bullet"/>
       <w:lvlText w:val="▪"/>
-      <w:lvlJc w:val="start"/>
+      <w:lvlJc w:val="left"/>
       <w:pPr>
         <w:tabs>
           <w:tab w:val="num" w:pos="2520"/>
         </w:tabs>
-        <w:ind w:start="2520" w:hanging="360"/>
+        <w:ind w:left="2520" w:hanging="360"/>
       </w:pPr>
       <w:rPr>
         <w:rFonts w:ascii="OpenSymbol" w:hAnsi="OpenSymbol" w:cs="OpenSymbol" w:hint="default"/>
@@ -12387,12 +12078,12 @@
       <w:start w:val="1"/>
       <w:numFmt w:val="bullet"/>
       <w:lvlText w:val=""/>
-      <w:lvlJc w:val="start"/>
+      <w:lvlJc w:val="left"/>
       <w:pPr>
         <w:tabs>
           <w:tab w:val="num" w:pos="2880"/>
         </w:tabs>
-        <w:ind w:start="2880" w:hanging="360"/>
+        <w:ind w:left="2880" w:hanging="360"/>
       </w:pPr>
       <w:rPr>
         <w:rFonts w:ascii="Symbol" w:hAnsi="Symbol" w:cs="Symbol" w:hint="default"/>
@@ -12402,12 +12093,12 @@
       <w:start w:val="1"/>
       <w:numFmt w:val="bullet"/>
       <w:lvlText w:val="◦"/>
-      <w:lvlJc w:val="start"/>
+      <w:lvlJc w:val="left"/>
       <w:pPr>
         <w:tabs>
           <w:tab w:val="num" w:pos="3240"/>
         </w:tabs>
-        <w:ind w:start="3240" w:hanging="360"/>
+        <w:ind w:left="3240" w:hanging="360"/>
       </w:pPr>
       <w:rPr>
         <w:rFonts w:ascii="OpenSymbol" w:hAnsi="OpenSymbol" w:cs="OpenSymbol" w:hint="default"/>
@@ -12417,12 +12108,12 @@
       <w:start w:val="1"/>
       <w:numFmt w:val="bullet"/>
       <w:lvlText w:val="▪"/>
-      <w:lvlJc w:val="start"/>
+      <w:lvlJc w:val="left"/>
       <w:pPr>
         <w:tabs>
           <w:tab w:val="num" w:pos="3600"/>
         </w:tabs>
-        <w:ind w:start="3600" w:hanging="360"/>
+        <w:ind w:left="3600" w:hanging="360"/>
       </w:pPr>
       <w:rPr>
         <w:rFonts w:ascii="OpenSymbol" w:hAnsi="OpenSymbol" w:cs="OpenSymbol" w:hint="default"/>
@@ -12435,12 +12126,12 @@
       <w:numFmt w:val="none"/>
       <w:suff w:val="nothing"/>
       <w:lvlText w:val=""/>
-      <w:lvlJc w:val="start"/>
+      <w:lvlJc w:val="left"/>
       <w:pPr>
         <w:tabs>
           <w:tab w:val="num" w:pos="0"/>
         </w:tabs>
-        <w:ind w:start="0" w:hanging="0"/>
+        <w:ind w:left="0" w:hanging="0"/>
       </w:pPr>
       <w:rPr/>
     </w:lvl>
@@ -12449,12 +12140,12 @@
       <w:numFmt w:val="none"/>
       <w:suff w:val="nothing"/>
       <w:lvlText w:val=""/>
-      <w:lvlJc w:val="start"/>
+      <w:lvlJc w:val="left"/>
       <w:pPr>
         <w:tabs>
           <w:tab w:val="num" w:pos="0"/>
         </w:tabs>
-        <w:ind w:start="0" w:hanging="0"/>
+        <w:ind w:left="0" w:hanging="0"/>
       </w:pPr>
       <w:rPr/>
     </w:lvl>
@@ -12463,12 +12154,12 @@
       <w:numFmt w:val="none"/>
       <w:suff w:val="nothing"/>
       <w:lvlText w:val=""/>
-      <w:lvlJc w:val="start"/>
+      <w:lvlJc w:val="left"/>
       <w:pPr>
         <w:tabs>
           <w:tab w:val="num" w:pos="0"/>
         </w:tabs>
-        <w:ind w:start="0" w:hanging="0"/>
+        <w:ind w:left="0" w:hanging="0"/>
       </w:pPr>
       <w:rPr/>
     </w:lvl>
@@ -12477,12 +12168,12 @@
       <w:numFmt w:val="none"/>
       <w:suff w:val="nothing"/>
       <w:lvlText w:val=""/>
-      <w:lvlJc w:val="start"/>
+      <w:lvlJc w:val="left"/>
       <w:pPr>
         <w:tabs>
           <w:tab w:val="num" w:pos="0"/>
         </w:tabs>
-        <w:ind w:start="0" w:hanging="0"/>
+        <w:ind w:left="0" w:hanging="0"/>
       </w:pPr>
       <w:rPr/>
     </w:lvl>
@@ -12491,12 +12182,12 @@
       <w:numFmt w:val="none"/>
       <w:suff w:val="nothing"/>
       <w:lvlText w:val=""/>
-      <w:lvlJc w:val="start"/>
+      <w:lvlJc w:val="left"/>
       <w:pPr>
         <w:tabs>
           <w:tab w:val="num" w:pos="0"/>
         </w:tabs>
-        <w:ind w:start="0" w:hanging="0"/>
+        <w:ind w:left="0" w:hanging="0"/>
       </w:pPr>
       <w:rPr/>
     </w:lvl>
@@ -12505,12 +12196,12 @@
       <w:numFmt w:val="none"/>
       <w:suff w:val="nothing"/>
       <w:lvlText w:val=""/>
-      <w:lvlJc w:val="start"/>
+      <w:lvlJc w:val="left"/>
       <w:pPr>
         <w:tabs>
           <w:tab w:val="num" w:pos="0"/>
         </w:tabs>
-        <w:ind w:start="0" w:hanging="0"/>
+        <w:ind w:left="0" w:hanging="0"/>
       </w:pPr>
       <w:rPr/>
     </w:lvl>
@@ -12519,12 +12210,12 @@
       <w:numFmt w:val="none"/>
       <w:suff w:val="nothing"/>
       <w:lvlText w:val=""/>
-      <w:lvlJc w:val="start"/>
+      <w:lvlJc w:val="left"/>
       <w:pPr>
         <w:tabs>
           <w:tab w:val="num" w:pos="0"/>
         </w:tabs>
-        <w:ind w:start="0" w:hanging="0"/>
+        <w:ind w:left="0" w:hanging="0"/>
       </w:pPr>
       <w:rPr/>
     </w:lvl>
@@ -12533,12 +12224,12 @@
       <w:numFmt w:val="none"/>
       <w:suff w:val="nothing"/>
       <w:lvlText w:val=""/>
-      <w:lvlJc w:val="start"/>
+      <w:lvlJc w:val="left"/>
       <w:pPr>
         <w:tabs>
           <w:tab w:val="num" w:pos="0"/>
         </w:tabs>
-        <w:ind w:start="0" w:hanging="0"/>
+        <w:ind w:left="0" w:hanging="0"/>
       </w:pPr>
       <w:rPr/>
     </w:lvl>
@@ -12547,12 +12238,12 @@
       <w:numFmt w:val="none"/>
       <w:suff w:val="nothing"/>
       <w:lvlText w:val=""/>
-      <w:lvlJc w:val="start"/>
+      <w:lvlJc w:val="left"/>
       <w:pPr>
         <w:tabs>
           <w:tab w:val="num" w:pos="0"/>
         </w:tabs>
-        <w:ind w:start="0" w:hanging="0"/>
+        <w:ind w:left="0" w:hanging="0"/>
       </w:pPr>
       <w:rPr/>
     </w:lvl>
@@ -12563,12 +12254,12 @@
       <w:numFmt w:val="none"/>
       <w:suff w:val="nothing"/>
       <w:lvlText w:val=""/>
-      <w:lvlJc w:val="start"/>
+      <w:lvlJc w:val="left"/>
       <w:pPr>
         <w:tabs>
           <w:tab w:val="num" w:pos="0"/>
         </w:tabs>
-        <w:ind w:start="0" w:hanging="0"/>
+        <w:ind w:left="0" w:hanging="0"/>
       </w:pPr>
       <w:rPr/>
     </w:lvl>
@@ -12577,12 +12268,12 @@
       <w:numFmt w:val="none"/>
       <w:suff w:val="nothing"/>
       <w:lvlText w:val=""/>
-      <w:lvlJc w:val="start"/>
+      <w:lvlJc w:val="left"/>
       <w:pPr>
         <w:tabs>
           <w:tab w:val="num" w:pos="0"/>
         </w:tabs>
-        <w:ind w:start="0" w:hanging="0"/>
+        <w:ind w:left="0" w:hanging="0"/>
       </w:pPr>
       <w:rPr/>
     </w:lvl>
@@ -12591,12 +12282,12 @@
       <w:numFmt w:val="none"/>
       <w:suff w:val="nothing"/>
       <w:lvlText w:val=""/>
-      <w:lvlJc w:val="start"/>
+      <w:lvlJc w:val="left"/>
       <w:pPr>
         <w:tabs>
           <w:tab w:val="num" w:pos="0"/>
         </w:tabs>
-        <w:ind w:start="0" w:hanging="0"/>
+        <w:ind w:left="0" w:hanging="0"/>
       </w:pPr>
       <w:rPr/>
     </w:lvl>
@@ -12605,12 +12296,12 @@
       <w:numFmt w:val="none"/>
       <w:suff w:val="nothing"/>
       <w:lvlText w:val=""/>
-      <w:lvlJc w:val="start"/>
+      <w:lvlJc w:val="left"/>
       <w:pPr>
         <w:tabs>
           <w:tab w:val="num" w:pos="0"/>
         </w:tabs>
-        <w:ind w:start="0" w:hanging="0"/>
+        <w:ind w:left="0" w:hanging="0"/>
       </w:pPr>
       <w:rPr/>
     </w:lvl>
@@ -12619,12 +12310,12 @@
       <w:numFmt w:val="none"/>
       <w:suff w:val="nothing"/>
       <w:lvlText w:val=""/>
-      <w:lvlJc w:val="start"/>
+      <w:lvlJc w:val="left"/>
       <w:pPr>
         <w:tabs>
           <w:tab w:val="num" w:pos="0"/>
         </w:tabs>
-        <w:ind w:start="0" w:hanging="0"/>
+        <w:ind w:left="0" w:hanging="0"/>
       </w:pPr>
       <w:rPr/>
     </w:lvl>
@@ -12633,12 +12324,12 @@
       <w:numFmt w:val="none"/>
       <w:suff w:val="nothing"/>
       <w:lvlText w:val=""/>
-      <w:lvlJc w:val="start"/>
+      <w:lvlJc w:val="left"/>
       <w:pPr>
         <w:tabs>
           <w:tab w:val="num" w:pos="0"/>
         </w:tabs>
-        <w:ind w:start="0" w:hanging="0"/>
+        <w:ind w:left="0" w:hanging="0"/>
       </w:pPr>
       <w:rPr/>
     </w:lvl>
@@ -12647,12 +12338,12 @@
       <w:numFmt w:val="none"/>
       <w:suff w:val="nothing"/>
       <w:lvlText w:val=""/>
-      <w:lvlJc w:val="start"/>
+      <w:lvlJc w:val="left"/>
       <w:pPr>
         <w:tabs>
           <w:tab w:val="num" w:pos="0"/>
         </w:tabs>
-        <w:ind w:start="0" w:hanging="0"/>
+        <w:ind w:left="0" w:hanging="0"/>
       </w:pPr>
       <w:rPr/>
     </w:lvl>
@@ -12661,12 +12352,12 @@
       <w:numFmt w:val="none"/>
       <w:suff w:val="nothing"/>
       <w:lvlText w:val=""/>
-      <w:lvlJc w:val="start"/>
+      <w:lvlJc w:val="left"/>
       <w:pPr>
         <w:tabs>
           <w:tab w:val="num" w:pos="0"/>
         </w:tabs>
-        <w:ind w:start="0" w:hanging="0"/>
+        <w:ind w:left="0" w:hanging="0"/>
       </w:pPr>
       <w:rPr/>
     </w:lvl>
@@ -12675,12 +12366,12 @@
       <w:numFmt w:val="none"/>
       <w:suff w:val="nothing"/>
       <w:lvlText w:val=""/>
-      <w:lvlJc w:val="start"/>
+      <w:lvlJc w:val="left"/>
       <w:pPr>
         <w:tabs>
           <w:tab w:val="num" w:pos="0"/>
         </w:tabs>
-        <w:ind w:start="0" w:hanging="0"/>
+        <w:ind w:left="0" w:hanging="0"/>
       </w:pPr>
       <w:rPr/>
     </w:lvl>
@@ -12691,12 +12382,12 @@
       <w:numFmt w:val="none"/>
       <w:suff w:val="nothing"/>
       <w:lvlText w:val=""/>
-      <w:lvlJc w:val="start"/>
+      <w:lvlJc w:val="left"/>
       <w:pPr>
         <w:tabs>
           <w:tab w:val="num" w:pos="0"/>
         </w:tabs>
-        <w:ind w:start="0" w:hanging="0"/>
+        <w:ind w:left="0" w:hanging="0"/>
       </w:pPr>
       <w:rPr/>
     </w:lvl>
@@ -12705,12 +12396,12 @@
       <w:numFmt w:val="none"/>
       <w:suff w:val="nothing"/>
       <w:lvlText w:val=""/>
-      <w:lvlJc w:val="start"/>
+      <w:lvlJc w:val="left"/>
       <w:pPr>
         <w:tabs>
           <w:tab w:val="num" w:pos="0"/>
         </w:tabs>
-        <w:ind w:start="0" w:hanging="0"/>
+        <w:ind w:left="0" w:hanging="0"/>
       </w:pPr>
       <w:rPr/>
     </w:lvl>
@@ -12719,12 +12410,12 @@
       <w:numFmt w:val="none"/>
       <w:suff w:val="nothing"/>
       <w:lvlText w:val=""/>
-      <w:lvlJc w:val="start"/>
+      <w:lvlJc w:val="left"/>
       <w:pPr>
         <w:tabs>
           <w:tab w:val="num" w:pos="0"/>
         </w:tabs>
-        <w:ind w:start="0" w:hanging="0"/>
+        <w:ind w:left="0" w:hanging="0"/>
       </w:pPr>
       <w:rPr/>
     </w:lvl>
@@ -12733,12 +12424,12 @@
       <w:numFmt w:val="none"/>
       <w:suff w:val="nothing"/>
       <w:lvlText w:val=""/>
-      <w:lvlJc w:val="start"/>
+      <w:lvlJc w:val="left"/>
       <w:pPr>
         <w:tabs>
           <w:tab w:val="num" w:pos="0"/>
         </w:tabs>
-        <w:ind w:start="0" w:hanging="0"/>
+        <w:ind w:left="0" w:hanging="0"/>
       </w:pPr>
       <w:rPr/>
     </w:lvl>
@@ -12747,12 +12438,12 @@
       <w:numFmt w:val="none"/>
       <w:suff w:val="nothing"/>
       <w:lvlText w:val=""/>
-      <w:lvlJc w:val="start"/>
+      <w:lvlJc w:val="left"/>
       <w:pPr>
         <w:tabs>
           <w:tab w:val="num" w:pos="0"/>
         </w:tabs>
-        <w:ind w:start="0" w:hanging="0"/>
+        <w:ind w:left="0" w:hanging="0"/>
       </w:pPr>
       <w:rPr/>
     </w:lvl>
@@ -12761,12 +12452,12 @@
       <w:numFmt w:val="none"/>
       <w:suff w:val="nothing"/>
       <w:lvlText w:val=""/>
-      <w:lvlJc w:val="start"/>
+      <w:lvlJc w:val="left"/>
       <w:pPr>
         <w:tabs>
           <w:tab w:val="num" w:pos="0"/>
         </w:tabs>
-        <w:ind w:start="0" w:hanging="0"/>
+        <w:ind w:left="0" w:hanging="0"/>
       </w:pPr>
       <w:rPr/>
     </w:lvl>
@@ -12775,12 +12466,12 @@
       <w:numFmt w:val="none"/>
       <w:suff w:val="nothing"/>
       <w:lvlText w:val=""/>
-      <w:lvlJc w:val="start"/>
+      <w:lvlJc w:val="left"/>
       <w:pPr>
         <w:tabs>
           <w:tab w:val="num" w:pos="0"/>
         </w:tabs>
-        <w:ind w:start="0" w:hanging="0"/>
+        <w:ind w:left="0" w:hanging="0"/>
       </w:pPr>
       <w:rPr/>
     </w:lvl>
@@ -12789,12 +12480,12 @@
       <w:numFmt w:val="none"/>
       <w:suff w:val="nothing"/>
       <w:lvlText w:val=""/>
-      <w:lvlJc w:val="start"/>
+      <w:lvlJc w:val="left"/>
       <w:pPr>
         <w:tabs>
           <w:tab w:val="num" w:pos="0"/>
         </w:tabs>
-        <w:ind w:start="0" w:hanging="0"/>
+        <w:ind w:left="0" w:hanging="0"/>
       </w:pPr>
       <w:rPr/>
     </w:lvl>
@@ -12803,12 +12494,12 @@
       <w:numFmt w:val="none"/>
       <w:suff w:val="nothing"/>
       <w:lvlText w:val=""/>
-      <w:lvlJc w:val="start"/>
+      <w:lvlJc w:val="left"/>
       <w:pPr>
         <w:tabs>
           <w:tab w:val="num" w:pos="0"/>
         </w:tabs>
-        <w:ind w:start="0" w:hanging="0"/>
+        <w:ind w:left="0" w:hanging="0"/>
       </w:pPr>
       <w:rPr/>
     </w:lvl>
@@ -12818,12 +12509,12 @@
       <w:start w:val="1"/>
       <w:numFmt w:val="bullet"/>
       <w:lvlText w:val=""/>
-      <w:lvlJc w:val="start"/>
+      <w:lvlJc w:val="left"/>
       <w:pPr>
         <w:tabs>
           <w:tab w:val="num" w:pos="720"/>
         </w:tabs>
-        <w:ind w:start="720" w:hanging="360"/>
+        <w:ind w:left="720" w:hanging="360"/>
       </w:pPr>
       <w:rPr>
         <w:rFonts w:ascii="Symbol" w:hAnsi="Symbol" w:cs="Symbol" w:hint="default"/>
@@ -12833,12 +12524,12 @@
       <w:start w:val="1"/>
       <w:numFmt w:val="bullet"/>
       <w:lvlText w:val="◦"/>
-      <w:lvlJc w:val="start"/>
+      <w:lvlJc w:val="left"/>
       <w:pPr>
         <w:tabs>
           <w:tab w:val="num" w:pos="1080"/>
         </w:tabs>
-        <w:ind w:start="1080" w:hanging="360"/>
+        <w:ind w:left="1080" w:hanging="360"/>
       </w:pPr>
       <w:rPr>
         <w:rFonts w:ascii="OpenSymbol" w:hAnsi="OpenSymbol" w:cs="OpenSymbol" w:hint="default"/>
@@ -12848,12 +12539,12 @@
       <w:start w:val="1"/>
       <w:numFmt w:val="bullet"/>
       <w:lvlText w:val="▪"/>
-      <w:lvlJc w:val="start"/>
+      <w:lvlJc w:val="left"/>
       <w:pPr>
         <w:tabs>
           <w:tab w:val="num" w:pos="1440"/>
         </w:tabs>
-        <w:ind w:start="1440" w:hanging="360"/>
+        <w:ind w:left="1440" w:hanging="360"/>
       </w:pPr>
       <w:rPr>
         <w:rFonts w:ascii="OpenSymbol" w:hAnsi="OpenSymbol" w:cs="OpenSymbol" w:hint="default"/>
@@ -12863,12 +12554,12 @@
       <w:start w:val="1"/>
       <w:numFmt w:val="bullet"/>
       <w:lvlText w:val=""/>
-      <w:lvlJc w:val="start"/>
+      <w:lvlJc w:val="left"/>
       <w:pPr>
         <w:tabs>
           <w:tab w:val="num" w:pos="1800"/>
         </w:tabs>
-        <w:ind w:start="1800" w:hanging="360"/>
+        <w:ind w:left="1800" w:hanging="360"/>
       </w:pPr>
       <w:rPr>
         <w:rFonts w:ascii="Symbol" w:hAnsi="Symbol" w:cs="Symbol" w:hint="default"/>
@@ -12878,12 +12569,12 @@
       <w:start w:val="1"/>
       <w:numFmt w:val="bullet"/>
       <w:lvlText w:val="◦"/>
-      <w:lvlJc w:val="start"/>
+      <w:lvlJc w:val="left"/>
       <w:pPr>
         <w:tabs>
           <w:tab w:val="num" w:pos="2160"/>
         </w:tabs>
-        <w:ind w:start="2160" w:hanging="360"/>
+        <w:ind w:left="2160" w:hanging="360"/>
       </w:pPr>
       <w:rPr>
         <w:rFonts w:ascii="OpenSymbol" w:hAnsi="OpenSymbol" w:cs="OpenSymbol" w:hint="default"/>
@@ -12893,12 +12584,12 @@
       <w:start w:val="1"/>
       <w:numFmt w:val="bullet"/>
       <w:lvlText w:val="▪"/>
-      <w:lvlJc w:val="start"/>
+      <w:lvlJc w:val="left"/>
       <w:pPr>
         <w:tabs>
           <w:tab w:val="num" w:pos="2520"/>
         </w:tabs>
-        <w:ind w:start="2520" w:hanging="360"/>
+        <w:ind w:left="2520" w:hanging="360"/>
       </w:pPr>
       <w:rPr>
         <w:rFonts w:ascii="OpenSymbol" w:hAnsi="OpenSymbol" w:cs="OpenSymbol" w:hint="default"/>
@@ -12908,12 +12599,12 @@
       <w:start w:val="1"/>
       <w:numFmt w:val="bullet"/>
       <w:lvlText w:val=""/>
-      <w:lvlJc w:val="start"/>
+      <w:lvlJc w:val="left"/>
       <w:pPr>
         <w:tabs>
           <w:tab w:val="num" w:pos="2880"/>
         </w:tabs>
-        <w:ind w:start="2880" w:hanging="360"/>
+        <w:ind w:left="2880" w:hanging="360"/>
       </w:pPr>
       <w:rPr>
         <w:rFonts w:ascii="Symbol" w:hAnsi="Symbol" w:cs="Symbol" w:hint="default"/>
@@ -12923,12 +12614,12 @@
       <w:start w:val="1"/>
       <w:numFmt w:val="bullet"/>
       <w:lvlText w:val="◦"/>
-      <w:lvlJc w:val="start"/>
+      <w:lvlJc w:val="left"/>
       <w:pPr>
         <w:tabs>
           <w:tab w:val="num" w:pos="3240"/>
         </w:tabs>
-        <w:ind w:start="3240" w:hanging="360"/>
+        <w:ind w:left="3240" w:hanging="360"/>
       </w:pPr>
       <w:rPr>
         <w:rFonts w:ascii="OpenSymbol" w:hAnsi="OpenSymbol" w:cs="OpenSymbol" w:hint="default"/>
@@ -12938,12 +12629,12 @@
       <w:start w:val="1"/>
       <w:numFmt w:val="bullet"/>
       <w:lvlText w:val="▪"/>
-      <w:lvlJc w:val="start"/>
+      <w:lvlJc w:val="left"/>
       <w:pPr>
         <w:tabs>
           <w:tab w:val="num" w:pos="3600"/>
         </w:tabs>
-        <w:ind w:start="3600" w:hanging="360"/>
+        <w:ind w:left="3600" w:hanging="360"/>
       </w:pPr>
       <w:rPr>
         <w:rFonts w:ascii="OpenSymbol" w:hAnsi="OpenSymbol" w:cs="OpenSymbol" w:hint="default"/>
@@ -12956,12 +12647,12 @@
       <w:numFmt w:val="none"/>
       <w:suff w:val="nothing"/>
       <w:lvlText w:val=""/>
-      <w:lvlJc w:val="start"/>
+      <w:lvlJc w:val="left"/>
       <w:pPr>
         <w:tabs>
           <w:tab w:val="num" w:pos="0"/>
         </w:tabs>
-        <w:ind w:start="0" w:hanging="0"/>
+        <w:ind w:left="0" w:hanging="0"/>
       </w:pPr>
     </w:lvl>
     <w:lvl w:ilvl="1">
@@ -12969,12 +12660,12 @@
       <w:numFmt w:val="none"/>
       <w:suff w:val="nothing"/>
       <w:lvlText w:val=""/>
-      <w:lvlJc w:val="start"/>
+      <w:lvlJc w:val="left"/>
       <w:pPr>
         <w:tabs>
           <w:tab w:val="num" w:pos="0"/>
         </w:tabs>
-        <w:ind w:start="0" w:hanging="0"/>
+        <w:ind w:left="0" w:hanging="0"/>
       </w:pPr>
     </w:lvl>
     <w:lvl w:ilvl="2">
@@ -12982,12 +12673,12 @@
       <w:numFmt w:val="none"/>
       <w:suff w:val="nothing"/>
       <w:lvlText w:val=""/>
-      <w:lvlJc w:val="start"/>
+      <w:lvlJc w:val="left"/>
       <w:pPr>
         <w:tabs>
           <w:tab w:val="num" w:pos="0"/>
         </w:tabs>
-        <w:ind w:start="0" w:hanging="0"/>
+        <w:ind w:left="0" w:hanging="0"/>
       </w:pPr>
     </w:lvl>
     <w:lvl w:ilvl="3">
@@ -12995,12 +12686,12 @@
       <w:numFmt w:val="none"/>
       <w:suff w:val="nothing"/>
       <w:lvlText w:val=""/>
-      <w:lvlJc w:val="start"/>
+      <w:lvlJc w:val="left"/>
       <w:pPr>
         <w:tabs>
           <w:tab w:val="num" w:pos="0"/>
         </w:tabs>
-        <w:ind w:start="0" w:hanging="0"/>
+        <w:ind w:left="0" w:hanging="0"/>
       </w:pPr>
     </w:lvl>
     <w:lvl w:ilvl="4">
@@ -13008,12 +12699,12 @@
       <w:numFmt w:val="none"/>
       <w:suff w:val="nothing"/>
       <w:lvlText w:val=""/>
-      <w:lvlJc w:val="start"/>
+      <w:lvlJc w:val="left"/>
       <w:pPr>
         <w:tabs>
           <w:tab w:val="num" w:pos="0"/>
         </w:tabs>
-        <w:ind w:start="0" w:hanging="0"/>
+        <w:ind w:left="0" w:hanging="0"/>
       </w:pPr>
     </w:lvl>
     <w:lvl w:ilvl="5">
@@ -13021,12 +12712,12 @@
       <w:numFmt w:val="none"/>
       <w:suff w:val="nothing"/>
       <w:lvlText w:val=""/>
-      <w:lvlJc w:val="start"/>
+      <w:lvlJc w:val="left"/>
       <w:pPr>
         <w:tabs>
           <w:tab w:val="num" w:pos="0"/>
         </w:tabs>
-        <w:ind w:start="0" w:hanging="0"/>
+        <w:ind w:left="0" w:hanging="0"/>
       </w:pPr>
     </w:lvl>
     <w:lvl w:ilvl="6">
@@ -13034,12 +12725,12 @@
       <w:numFmt w:val="none"/>
       <w:suff w:val="nothing"/>
       <w:lvlText w:val=""/>
-      <w:lvlJc w:val="start"/>
+      <w:lvlJc w:val="left"/>
       <w:pPr>
         <w:tabs>
           <w:tab w:val="num" w:pos="0"/>
         </w:tabs>
-        <w:ind w:start="0" w:hanging="0"/>
+        <w:ind w:left="0" w:hanging="0"/>
       </w:pPr>
     </w:lvl>
     <w:lvl w:ilvl="7">
@@ -13047,12 +12738,12 @@
       <w:numFmt w:val="none"/>
       <w:suff w:val="nothing"/>
       <w:lvlText w:val=""/>
-      <w:lvlJc w:val="start"/>
+      <w:lvlJc w:val="left"/>
       <w:pPr>
         <w:tabs>
           <w:tab w:val="num" w:pos="0"/>
         </w:tabs>
-        <w:ind w:start="0" w:hanging="0"/>
+        <w:ind w:left="0" w:hanging="0"/>
       </w:pPr>
     </w:lvl>
     <w:lvl w:ilvl="8">
@@ -13060,12 +12751,12 @@
       <w:numFmt w:val="none"/>
       <w:suff w:val="nothing"/>
       <w:lvlText w:val=""/>
-      <w:lvlJc w:val="start"/>
+      <w:lvlJc w:val="left"/>
       <w:pPr>
         <w:tabs>
           <w:tab w:val="num" w:pos="0"/>
         </w:tabs>
-        <w:ind w:start="0" w:hanging="0"/>
+        <w:ind w:left="0" w:hanging="0"/>
       </w:pPr>
     </w:lvl>
   </w:abstractNum>
@@ -13502,7 +13193,7 @@
       <w:suppressAutoHyphens w:val="true"/>
       <w:bidi w:val="0"/>
       <w:spacing w:before="0" w:after="0"/>
-      <w:jc w:val="start"/>
+      <w:jc w:val="left"/>
     </w:pPr>
     <w:rPr>
       <w:rFonts w:ascii="Baskerville" w:hAnsi="Baskerville" w:eastAsia="Songti SC" w:cs="Arial Unicode MS"/>
@@ -13615,8 +13306,8 @@
     <w:qFormat/>
     <w:rPr/>
   </w:style>
-  <w:style w:type="character" w:styleId="Bulletsuser" w:customStyle="1">
-    <w:name w:val="Bullets (user)"/>
+  <w:style w:type="character" w:styleId="Bullets" w:customStyle="1">
+    <w:name w:val="Bullets"/>
     <w:qFormat/>
     <w:rPr>
       <w:rFonts w:ascii="OpenSymbol" w:hAnsi="OpenSymbol" w:eastAsia="OpenSymbol" w:cs="OpenSymbol"/>
@@ -13762,19 +13453,19 @@
     <w:qFormat/>
     <w:pPr>
       <w:spacing w:before="0" w:after="142"/>
-      <w:ind w:hanging="283" w:start="283"/>
+      <w:ind w:hanging="283" w:left="283"/>
     </w:pPr>
     <w:rPr>
       <w:i/>
     </w:rPr>
   </w:style>
-  <w:style w:type="paragraph" w:styleId="BlockQuotationuser" w:customStyle="1">
-    <w:name w:val="Block Quotation (user)"/>
+  <w:style w:type="paragraph" w:styleId="BlockQuotation" w:customStyle="1">
+    <w:name w:val="Block Quotation"/>
     <w:basedOn w:val="Normal"/>
     <w:qFormat/>
     <w:pPr>
       <w:spacing w:lineRule="auto" w:line="276" w:before="0" w:after="283"/>
-      <w:ind w:start="567" w:end="567"/>
+      <w:ind w:left="567" w:right="567"/>
     </w:pPr>
     <w:rPr/>
   </w:style>
@@ -13784,7 +13475,7 @@
     <w:qFormat/>
     <w:pPr>
       <w:spacing w:before="0" w:after="142"/>
-      <w:ind w:start="567" w:end="567"/>
+      <w:ind w:left="567" w:right="567"/>
     </w:pPr>
     <w:rPr>
       <w:i/>
@@ -13822,7 +13513,7 @@
     <w:qFormat/>
     <w:pPr>
       <w:spacing w:before="0" w:after="142"/>
-      <w:ind w:hanging="283" w:start="283"/>
+      <w:ind w:hanging="283" w:left="283"/>
     </w:pPr>
     <w:rPr/>
   </w:style>
@@ -13834,7 +13525,7 @@
         <w:tab w:val="clear" w:pos="720"/>
         <w:tab w:val="right" w:pos="9355" w:leader="dot"/>
       </w:tabs>
-      <w:ind w:start="283"/>
+      <w:ind w:left="283"/>
     </w:pPr>
     <w:rPr/>
   </w:style>
@@ -13844,7 +13535,7 @@
     <w:qFormat/>
     <w:pPr>
       <w:spacing w:before="0" w:after="142"/>
-      <w:ind w:hanging="283" w:start="283"/>
+      <w:ind w:hanging="283" w:left="283"/>
     </w:pPr>
     <w:rPr/>
   </w:style>
@@ -13856,7 +13547,7 @@
         <w:tab w:val="clear" w:pos="720"/>
         <w:tab w:val="right" w:pos="9072" w:leader="dot"/>
       </w:tabs>
-      <w:ind w:start="566"/>
+      <w:ind w:left="566"/>
     </w:pPr>
     <w:rPr/>
   </w:style>
@@ -13950,7 +13641,7 @@
       <w:suppressAutoHyphens w:val="false"/>
       <w:bidi w:val="0"/>
       <w:spacing w:before="0" w:after="0"/>
-      <w:jc w:val="start"/>
+      <w:jc w:val="left"/>
     </w:pPr>
     <w:rPr>
       <w:rFonts w:ascii="Baskerville" w:hAnsi="Baskerville" w:eastAsia="Songti SC" w:cs="Mangal"/>

</xml_diff>